<commit_message>
redesigned the app state management with a centralized "modalManager.ts" file
</commit_message>
<xml_diff>
--- a/test plan.docx
+++ b/test plan.docx
@@ -82,6 +82,50 @@
       <w:pPr>
         <w:jc w:val="center"/>
         <w:rPr>
+          <w:sz w:val="15"/>
+          <w:szCs w:val="16"/>
+          <w:lang w:val="en-CA"/>
+        </w:rPr>
+      </w:pPr>
+      <w:r>
+        <w:rPr>
+          <w:rFonts w:hint="eastAsia"/>
+          <w:sz w:val="15"/>
+          <w:szCs w:val="16"/>
+          <w:lang w:val="en-CA"/>
+        </w:rPr>
+        <w:t>T</w:t>
+      </w:r>
+      <w:r>
+        <w:rPr>
+          <w:sz w:val="15"/>
+          <w:szCs w:val="16"/>
+          <w:lang w:val="en-CA"/>
+        </w:rPr>
+        <w:t xml:space="preserve">his test plan is non exhaustive and incomplete. </w:t>
+      </w:r>
+      <w:r>
+        <w:rPr>
+          <w:rFonts w:hint="eastAsia"/>
+          <w:sz w:val="15"/>
+          <w:szCs w:val="16"/>
+          <w:lang w:val="en-CA"/>
+        </w:rPr>
+        <w:t>I</w:t>
+      </w:r>
+      <w:r>
+        <w:rPr>
+          <w:sz w:val="15"/>
+          <w:szCs w:val="16"/>
+          <w:lang w:val="en-CA"/>
+        </w:rPr>
+        <w:t>t does not cover every single functionality. I’m not superman like chill making these tables takes time</w:t>
+      </w:r>
+    </w:p>
+    <w:p>
+      <w:pPr>
+        <w:jc w:val="center"/>
+        <w:rPr>
           <w:b/>
           <w:bCs/>
           <w:sz w:val="28"/>
@@ -1490,7 +1534,16 @@
                 <w:szCs w:val="18"/>
                 <w:lang w:val="en-CA"/>
               </w:rPr>
-              <w:t>lick the “x” button on the right side in a keybind box</w:t>
+              <w:t xml:space="preserve">lick the “x” button on the right </w:t>
+            </w:r>
+            <w:r>
+              <w:rPr>
+                <w:sz w:val="16"/>
+                <w:szCs w:val="18"/>
+                <w:lang w:val="en-CA"/>
+              </w:rPr>
+              <w:lastRenderedPageBreak/>
+              <w:t>side in a keybind box</w:t>
             </w:r>
           </w:p>
         </w:tc>
@@ -1513,6 +1566,7 @@
                 <w:szCs w:val="18"/>
                 <w:lang w:val="en-CA"/>
               </w:rPr>
+              <w:lastRenderedPageBreak/>
               <w:t>I</w:t>
             </w:r>
             <w:r>
@@ -1538,7 +1592,16 @@
                 <w:szCs w:val="18"/>
                 <w:lang w:val="en-CA"/>
               </w:rPr>
-              <w:t>f there is only one keybind, there should still be an X button</w:t>
+              <w:t xml:space="preserve">f there is </w:t>
+            </w:r>
+            <w:r>
+              <w:rPr>
+                <w:sz w:val="16"/>
+                <w:szCs w:val="18"/>
+                <w:lang w:val="en-CA"/>
+              </w:rPr>
+              <w:lastRenderedPageBreak/>
+              <w:t>only one keybind, there should still be an X button</w:t>
             </w:r>
           </w:p>
         </w:tc>
@@ -1561,6 +1624,7 @@
                 <w:szCs w:val="18"/>
                 <w:lang w:val="en-CA"/>
               </w:rPr>
+              <w:lastRenderedPageBreak/>
               <w:t>S</w:t>
             </w:r>
             <w:r>
@@ -1569,7 +1633,16 @@
                 <w:szCs w:val="18"/>
                 <w:lang w:val="en-CA"/>
               </w:rPr>
-              <w:t>ingle keybinds don’t have an X button</w:t>
+              <w:t xml:space="preserve">ingle keybinds don’t have an X </w:t>
+            </w:r>
+            <w:r>
+              <w:rPr>
+                <w:sz w:val="16"/>
+                <w:szCs w:val="18"/>
+                <w:lang w:val="en-CA"/>
+              </w:rPr>
+              <w:lastRenderedPageBreak/>
+              <w:t>button</w:t>
             </w:r>
           </w:p>
         </w:tc>
@@ -1633,16 +1706,7 @@
                 <w:szCs w:val="18"/>
                 <w:lang w:val="en-CA"/>
               </w:rPr>
-              <w:t xml:space="preserve">ettings: keyboard: </w:t>
-            </w:r>
-            <w:r>
-              <w:rPr>
-                <w:sz w:val="16"/>
-                <w:szCs w:val="18"/>
-                <w:lang w:val="en-CA"/>
-              </w:rPr>
-              <w:lastRenderedPageBreak/>
-              <w:t>undo</w:t>
+              <w:t>ettings: keyboard: undo</w:t>
             </w:r>
           </w:p>
         </w:tc>
@@ -1665,7 +1729,6 @@
                 <w:szCs w:val="18"/>
                 <w:lang w:val="en-CA"/>
               </w:rPr>
-              <w:lastRenderedPageBreak/>
               <w:t>M</w:t>
             </w:r>
             <w:r>
@@ -1674,16 +1737,7 @@
                 <w:szCs w:val="18"/>
                 <w:lang w:val="en-CA"/>
               </w:rPr>
-              <w:t xml:space="preserve">ake an adjustment to the clip </w:t>
-            </w:r>
-            <w:r>
-              <w:rPr>
-                <w:sz w:val="16"/>
-                <w:szCs w:val="18"/>
-                <w:lang w:val="en-CA"/>
-              </w:rPr>
-              <w:lastRenderedPageBreak/>
-              <w:t>in the timeline and press the undo keybind</w:t>
+              <w:t>ake an adjustment to the clip in the timeline and press the undo keybind</w:t>
             </w:r>
           </w:p>
         </w:tc>
@@ -1706,7 +1760,6 @@
                 <w:szCs w:val="18"/>
                 <w:lang w:val="en-CA"/>
               </w:rPr>
-              <w:lastRenderedPageBreak/>
               <w:t>I</w:t>
             </w:r>
             <w:r>
@@ -1794,19 +1847,20 @@
         <w:tblStyle w:val="ae"/>
         <w:tblW w:w="11624" w:type="dxa"/>
         <w:tblInd w:w="-1706" w:type="dxa"/>
+        <w:tblLayout w:type="fixed"/>
         <w:tblLook w:val="04A0" w:firstRow="1" w:lastRow="0" w:firstColumn="1" w:lastColumn="0" w:noHBand="0" w:noVBand="1"/>
       </w:tblPr>
       <w:tblGrid>
-        <w:gridCol w:w="1885"/>
-        <w:gridCol w:w="1761"/>
-        <w:gridCol w:w="2450"/>
+        <w:gridCol w:w="1667"/>
+        <w:gridCol w:w="2019"/>
+        <w:gridCol w:w="2410"/>
         <w:gridCol w:w="3118"/>
         <w:gridCol w:w="2410"/>
       </w:tblGrid>
       <w:tr>
         <w:tc>
           <w:tcPr>
-            <w:tcW w:w="1885" w:type="dxa"/>
+            <w:tcW w:w="1667" w:type="dxa"/>
           </w:tcPr>
           <w:p>
             <w:pPr>
@@ -1841,7 +1895,7 @@
         </w:tc>
         <w:tc>
           <w:tcPr>
-            <w:tcW w:w="1761" w:type="dxa"/>
+            <w:tcW w:w="2019" w:type="dxa"/>
           </w:tcPr>
           <w:p>
             <w:pPr>
@@ -1870,7 +1924,7 @@
         </w:tc>
         <w:tc>
           <w:tcPr>
-            <w:tcW w:w="2450" w:type="dxa"/>
+            <w:tcW w:w="2410" w:type="dxa"/>
           </w:tcPr>
           <w:p>
             <w:pPr>
@@ -1965,7 +2019,7 @@
       <w:tr>
         <w:tc>
           <w:tcPr>
-            <w:tcW w:w="1885" w:type="dxa"/>
+            <w:tcW w:w="1667" w:type="dxa"/>
           </w:tcPr>
           <w:p>
             <w:pPr>
@@ -1996,7 +2050,7 @@
         </w:tc>
         <w:tc>
           <w:tcPr>
-            <w:tcW w:w="1761" w:type="dxa"/>
+            <w:tcW w:w="2019" w:type="dxa"/>
           </w:tcPr>
           <w:p>
             <w:pPr>
@@ -2027,7 +2081,7 @@
         </w:tc>
         <w:tc>
           <w:tcPr>
-            <w:tcW w:w="2450" w:type="dxa"/>
+            <w:tcW w:w="2410" w:type="dxa"/>
           </w:tcPr>
           <w:p>
             <w:pPr>
@@ -2222,6 +2276,424 @@
               </w:rPr>
               <w:t>bsolutely NO NEW MENUS should open</w:t>
             </w:r>
+          </w:p>
+          <w:p>
+            <w:pPr>
+              <w:rPr>
+                <w:sz w:val="16"/>
+                <w:szCs w:val="18"/>
+                <w:lang w:val="en-CA"/>
+              </w:rPr>
+            </w:pPr>
+            <w:r>
+              <w:rPr>
+                <w:rFonts w:hint="eastAsia"/>
+                <w:sz w:val="16"/>
+                <w:szCs w:val="18"/>
+                <w:lang w:val="en-CA"/>
+              </w:rPr>
+              <w:t>E</w:t>
+            </w:r>
+            <w:r>
+              <w:rPr>
+                <w:sz w:val="16"/>
+                <w:szCs w:val="18"/>
+                <w:lang w:val="en-CA"/>
+              </w:rPr>
+              <w:t>ach menu you click on should open a small dialogue box saying “open multiple menus is disabled”</w:t>
+            </w:r>
+          </w:p>
+          <w:p>
+            <w:pPr>
+              <w:rPr>
+                <w:sz w:val="16"/>
+                <w:szCs w:val="18"/>
+                <w:lang w:val="en-CA"/>
+              </w:rPr>
+            </w:pPr>
+          </w:p>
+        </w:tc>
+        <w:tc>
+          <w:tcPr>
+            <w:tcW w:w="2410" w:type="dxa"/>
+          </w:tcPr>
+          <w:p>
+            <w:pPr>
+              <w:rPr>
+                <w:sz w:val="16"/>
+                <w:szCs w:val="18"/>
+                <w:lang w:val="en-CA"/>
+              </w:rPr>
+            </w:pPr>
+            <w:r>
+              <w:rPr>
+                <w:rFonts w:hint="eastAsia"/>
+                <w:sz w:val="16"/>
+                <w:szCs w:val="18"/>
+                <w:lang w:val="en-CA"/>
+              </w:rPr>
+              <w:t>W</w:t>
+            </w:r>
+            <w:r>
+              <w:rPr>
+                <w:sz w:val="16"/>
+                <w:szCs w:val="18"/>
+                <w:lang w:val="en-CA"/>
+              </w:rPr>
+              <w:t xml:space="preserve">orks as of </w:t>
+            </w:r>
+            <w:r>
+              <w:rPr>
+                <w:sz w:val="16"/>
+                <w:szCs w:val="18"/>
+                <w:lang w:val="en-CA"/>
+              </w:rPr>
+              <w:t>5bddf836872611033759d627746d8b4161bba22a</w:t>
+            </w:r>
+          </w:p>
+          <w:p>
+            <w:pPr>
+              <w:rPr>
+                <w:sz w:val="16"/>
+                <w:szCs w:val="18"/>
+                <w:lang w:val="en-CA"/>
+              </w:rPr>
+            </w:pPr>
+            <w:r>
+              <w:rPr>
+                <w:rFonts w:hint="eastAsia"/>
+                <w:sz w:val="16"/>
+                <w:szCs w:val="18"/>
+                <w:lang w:val="en-CA"/>
+              </w:rPr>
+              <w:t>H</w:t>
+            </w:r>
+            <w:r>
+              <w:rPr>
+                <w:sz w:val="16"/>
+                <w:szCs w:val="18"/>
+                <w:lang w:val="en-CA"/>
+              </w:rPr>
+              <w:t>aven’t implemented the dialogue box yet</w:t>
+            </w:r>
+          </w:p>
+        </w:tc>
+      </w:tr>
+      <w:tr>
+        <w:tc>
+          <w:tcPr>
+            <w:tcW w:w="1667" w:type="dxa"/>
+          </w:tcPr>
+          <w:p>
+            <w:pPr>
+              <w:rPr>
+                <w:sz w:val="16"/>
+                <w:szCs w:val="18"/>
+                <w:lang w:val="en-CA"/>
+              </w:rPr>
+            </w:pPr>
+            <w:r>
+              <w:rPr>
+                <w:rFonts w:hint="eastAsia"/>
+                <w:sz w:val="16"/>
+                <w:szCs w:val="18"/>
+                <w:lang w:val="en-CA"/>
+              </w:rPr>
+              <w:t>S</w:t>
+            </w:r>
+            <w:r>
+              <w:rPr>
+                <w:sz w:val="16"/>
+                <w:szCs w:val="18"/>
+                <w:lang w:val="en-CA"/>
+              </w:rPr>
+              <w:t>ettings.tsx</w:t>
+            </w:r>
+          </w:p>
+        </w:tc>
+        <w:tc>
+          <w:tcPr>
+            <w:tcW w:w="2019" w:type="dxa"/>
+          </w:tcPr>
+          <w:p>
+            <w:pPr>
+              <w:rPr>
+                <w:sz w:val="16"/>
+                <w:szCs w:val="18"/>
+                <w:lang w:val="en-CA"/>
+              </w:rPr>
+            </w:pPr>
+            <w:r>
+              <w:rPr>
+                <w:rFonts w:hint="eastAsia"/>
+                <w:sz w:val="16"/>
+                <w:szCs w:val="18"/>
+                <w:lang w:val="en-CA"/>
+              </w:rPr>
+              <w:t>S</w:t>
+            </w:r>
+            <w:r>
+              <w:rPr>
+                <w:sz w:val="16"/>
+                <w:szCs w:val="18"/>
+                <w:lang w:val="en-CA"/>
+              </w:rPr>
+              <w:t>ettings: checkboxes: allow open multiple menus: DISABLED (#2)</w:t>
+            </w:r>
+          </w:p>
+        </w:tc>
+        <w:tc>
+          <w:tcPr>
+            <w:tcW w:w="2410" w:type="dxa"/>
+          </w:tcPr>
+          <w:p>
+            <w:pPr>
+              <w:rPr>
+                <w:sz w:val="16"/>
+                <w:szCs w:val="18"/>
+                <w:lang w:val="en-CA"/>
+              </w:rPr>
+            </w:pPr>
+            <w:r>
+              <w:rPr>
+                <w:rFonts w:hint="eastAsia"/>
+                <w:sz w:val="16"/>
+                <w:szCs w:val="18"/>
+                <w:lang w:val="en-CA"/>
+              </w:rPr>
+              <w:t>H</w:t>
+            </w:r>
+            <w:r>
+              <w:rPr>
+                <w:sz w:val="16"/>
+                <w:szCs w:val="18"/>
+                <w:lang w:val="en-CA"/>
+              </w:rPr>
+              <w:t>over on the menu below it “allow open duplicate menus”</w:t>
+            </w:r>
+          </w:p>
+        </w:tc>
+        <w:tc>
+          <w:tcPr>
+            <w:tcW w:w="3118" w:type="dxa"/>
+          </w:tcPr>
+          <w:p>
+            <w:pPr>
+              <w:rPr>
+                <w:sz w:val="16"/>
+                <w:szCs w:val="18"/>
+                <w:lang w:val="en-CA"/>
+              </w:rPr>
+            </w:pPr>
+            <w:r>
+              <w:rPr>
+                <w:rFonts w:hint="eastAsia"/>
+                <w:sz w:val="16"/>
+                <w:szCs w:val="18"/>
+                <w:lang w:val="en-CA"/>
+              </w:rPr>
+              <w:t>I</w:t>
+            </w:r>
+            <w:r>
+              <w:rPr>
+                <w:sz w:val="16"/>
+                <w:szCs w:val="18"/>
+                <w:lang w:val="en-CA"/>
+              </w:rPr>
+              <w:t xml:space="preserve">t should change into text “requires “allow open multiple menus” to be enabled” </w:t>
+            </w:r>
+          </w:p>
+        </w:tc>
+        <w:tc>
+          <w:tcPr>
+            <w:tcW w:w="2410" w:type="dxa"/>
+          </w:tcPr>
+          <w:p>
+            <w:pPr>
+              <w:rPr>
+                <w:rFonts w:hint="eastAsia"/>
+                <w:sz w:val="16"/>
+                <w:szCs w:val="18"/>
+                <w:lang w:val="en-CA"/>
+              </w:rPr>
+            </w:pPr>
+          </w:p>
+        </w:tc>
+      </w:tr>
+      <w:tr>
+        <w:tc>
+          <w:tcPr>
+            <w:tcW w:w="1667" w:type="dxa"/>
+          </w:tcPr>
+          <w:p>
+            <w:pPr>
+              <w:rPr>
+                <w:sz w:val="16"/>
+                <w:szCs w:val="18"/>
+                <w:lang w:val="en-CA"/>
+              </w:rPr>
+            </w:pPr>
+            <w:r>
+              <w:rPr>
+                <w:rFonts w:hint="eastAsia"/>
+                <w:sz w:val="16"/>
+                <w:szCs w:val="18"/>
+                <w:lang w:val="en-CA"/>
+              </w:rPr>
+              <w:t>S</w:t>
+            </w:r>
+            <w:r>
+              <w:rPr>
+                <w:sz w:val="16"/>
+                <w:szCs w:val="18"/>
+                <w:lang w:val="en-CA"/>
+              </w:rPr>
+              <w:t>ettings.tsx</w:t>
+            </w:r>
+          </w:p>
+        </w:tc>
+        <w:tc>
+          <w:tcPr>
+            <w:tcW w:w="2019" w:type="dxa"/>
+          </w:tcPr>
+          <w:p>
+            <w:pPr>
+              <w:rPr>
+                <w:sz w:val="16"/>
+                <w:szCs w:val="18"/>
+                <w:lang w:val="en-CA"/>
+              </w:rPr>
+            </w:pPr>
+            <w:r>
+              <w:rPr>
+                <w:rFonts w:hint="eastAsia"/>
+                <w:sz w:val="16"/>
+                <w:szCs w:val="18"/>
+                <w:lang w:val="en-CA"/>
+              </w:rPr>
+              <w:t>S</w:t>
+            </w:r>
+            <w:r>
+              <w:rPr>
+                <w:sz w:val="16"/>
+                <w:szCs w:val="18"/>
+                <w:lang w:val="en-CA"/>
+              </w:rPr>
+              <w:t>ettings: checkboxes: allow open multiple menus: ENABLED</w:t>
+            </w:r>
+          </w:p>
+        </w:tc>
+        <w:tc>
+          <w:tcPr>
+            <w:tcW w:w="2410" w:type="dxa"/>
+          </w:tcPr>
+          <w:p>
+            <w:pPr>
+              <w:pStyle w:val="a9"/>
+              <w:numPr>
+                <w:ilvl w:val="0"/>
+                <w:numId w:val="2"/>
+              </w:numPr>
+              <w:rPr>
+                <w:sz w:val="16"/>
+                <w:szCs w:val="18"/>
+                <w:lang w:val="en-CA"/>
+              </w:rPr>
+            </w:pPr>
+            <w:r>
+              <w:rPr>
+                <w:rFonts w:hint="eastAsia"/>
+                <w:sz w:val="16"/>
+                <w:szCs w:val="18"/>
+                <w:lang w:val="en-CA"/>
+              </w:rPr>
+              <w:t>A</w:t>
+            </w:r>
+            <w:r>
+              <w:rPr>
+                <w:sz w:val="16"/>
+                <w:szCs w:val="18"/>
+                <w:lang w:val="en-CA"/>
+              </w:rPr>
+              <w:t>ttempt to open 2 or more settings pages</w:t>
+            </w:r>
+          </w:p>
+          <w:p>
+            <w:pPr>
+              <w:pStyle w:val="a9"/>
+              <w:numPr>
+                <w:ilvl w:val="0"/>
+                <w:numId w:val="2"/>
+              </w:numPr>
+              <w:rPr>
+                <w:sz w:val="16"/>
+                <w:szCs w:val="18"/>
+                <w:lang w:val="en-CA"/>
+              </w:rPr>
+            </w:pPr>
+            <w:r>
+              <w:rPr>
+                <w:rFonts w:hint="eastAsia"/>
+                <w:sz w:val="16"/>
+                <w:szCs w:val="18"/>
+                <w:lang w:val="en-CA"/>
+              </w:rPr>
+              <w:t>A</w:t>
+            </w:r>
+            <w:r>
+              <w:rPr>
+                <w:sz w:val="16"/>
+                <w:szCs w:val="18"/>
+                <w:lang w:val="en-CA"/>
+              </w:rPr>
+              <w:t>ttempt to open 2 or more styles pages</w:t>
+            </w:r>
+          </w:p>
+          <w:p>
+            <w:pPr>
+              <w:pStyle w:val="a9"/>
+              <w:numPr>
+                <w:ilvl w:val="0"/>
+                <w:numId w:val="2"/>
+              </w:numPr>
+              <w:rPr>
+                <w:sz w:val="16"/>
+                <w:szCs w:val="18"/>
+                <w:lang w:val="en-CA"/>
+              </w:rPr>
+            </w:pPr>
+            <w:r>
+              <w:rPr>
+                <w:rFonts w:hint="eastAsia"/>
+                <w:sz w:val="16"/>
+                <w:szCs w:val="18"/>
+                <w:lang w:val="en-CA"/>
+              </w:rPr>
+              <w:t>A</w:t>
+            </w:r>
+            <w:r>
+              <w:rPr>
+                <w:sz w:val="16"/>
+                <w:szCs w:val="18"/>
+                <w:lang w:val="en-CA"/>
+              </w:rPr>
+              <w:t>ttempt to open</w:t>
+            </w:r>
+          </w:p>
+        </w:tc>
+        <w:tc>
+          <w:tcPr>
+            <w:tcW w:w="3118" w:type="dxa"/>
+          </w:tcPr>
+          <w:p>
+            <w:pPr>
+              <w:rPr>
+                <w:rFonts w:hint="eastAsia"/>
+                <w:sz w:val="16"/>
+                <w:szCs w:val="18"/>
+                <w:lang w:val="en-CA"/>
+              </w:rPr>
+            </w:pPr>
           </w:p>
         </w:tc>
         <w:tc>
@@ -2263,6 +2735,95 @@
 <file path=word/numbering.xml><?xml version="1.0" encoding="utf-8"?>
 <w:numbering xmlns:wpc="http://schemas.microsoft.com/office/word/2010/wordprocessingCanvas" xmlns:cx="http://schemas.microsoft.com/office/drawing/2014/chartex" xmlns:cx1="http://schemas.microsoft.com/office/drawing/2015/9/8/chartex" xmlns:cx2="http://schemas.microsoft.com/office/drawing/2015/10/21/chartex" xmlns:cx3="http://schemas.microsoft.com/office/drawing/2016/5/9/chartex" xmlns:cx4="http://schemas.microsoft.com/office/drawing/2016/5/10/chartex" xmlns:cx5="http://schemas.microsoft.com/office/drawing/2016/5/11/chartex" xmlns:cx6="http://schemas.microsoft.com/office/drawing/2016/5/12/chartex" xmlns:cx7="http://schemas.microsoft.com/office/drawing/2016/5/13/chartex" xmlns:cx8="http://schemas.microsoft.com/office/drawing/2016/5/14/chartex" xmlns:mc="http://schemas.openxmlformats.org/markup-compatibility/2006" xmlns:aink="http://schemas.microsoft.com/office/drawing/2016/ink" xmlns:am3d="http://schemas.microsoft.com/office/drawing/2017/model3d" xmlns:o="urn:schemas-microsoft-com:office:office" xmlns:oel="http://schemas.microsoft.com/office/2019/extlst" xmlns:r="http://schemas.openxmlformats.org/officeDocument/2006/relationships" xmlns:m="http://schemas.openxmlformats.org/officeDocument/2006/math" xmlns:v="urn:schemas-microsoft-com:vml" xmlns:wp14="http://schemas.microsoft.com/office/word/2010/wordprocessingDrawing" xmlns:wp="http://schemas.openxmlformats.org/drawingml/2006/wordprocessingDrawing" xmlns:w10="urn:schemas-microsoft-com:office:word" xmlns:w="http://schemas.openxmlformats.org/wordprocessingml/2006/main" xmlns:w14="http://schemas.microsoft.com/office/word/2010/wordml" xmlns:w15="http://schemas.microsoft.com/office/word/2012/wordml" xmlns:w16cex="http://schemas.microsoft.com/office/word/2018/wordml/cex" xmlns:w16cid="http://schemas.microsoft.com/office/word/2016/wordml/cid" xmlns:w16="http://schemas.microsoft.com/office/word/2018/wordml" xmlns:w16du="http://schemas.microsoft.com/office/word/2023/wordml/word16du" xmlns:w16sdtdh="http://schemas.microsoft.com/office/word/2020/wordml/sdtdatahash" xmlns:w16sdtfl="http://schemas.microsoft.com/office/word/2024/wordml/sdtformatlock" xmlns:w16se="http://schemas.microsoft.com/office/word/2015/wordml/symex" xmlns:wpg="http://schemas.microsoft.com/office/word/2010/wordprocessingGroup" xmlns:wpi="http://schemas.microsoft.com/office/word/2010/wordprocessingInk" xmlns:wne="http://schemas.microsoft.com/office/word/2006/wordml" xmlns:wps="http://schemas.microsoft.com/office/word/2010/wordprocessingShape" mc:Ignorable="w14 w15 w16se w16cid w16 w16cex w16sdtdh w16sdtfl w16du wp14">
   <w:abstractNum w:abstractNumId="0" w15:restartNumberingAfterBreak="0">
+    <w:nsid w:val="214D3E39"/>
+    <w:multiLevelType w:val="hybridMultilevel"/>
+    <w:tmpl w:val="AD18E822"/>
+    <w:lvl w:ilvl="0" w:tplc="72D23B8A">
+      <w:start w:val="1"/>
+      <w:numFmt w:val="decimal"/>
+      <w:lvlText w:val="%1."/>
+      <w:lvlJc w:val="left"/>
+      <w:pPr>
+        <w:ind w:left="360" w:hanging="360"/>
+      </w:pPr>
+      <w:rPr>
+        <w:rFonts w:hint="default"/>
+      </w:rPr>
+    </w:lvl>
+    <w:lvl w:ilvl="1" w:tplc="04090019" w:tentative="1">
+      <w:start w:val="1"/>
+      <w:numFmt w:val="lowerLetter"/>
+      <w:lvlText w:val="%2)"/>
+      <w:lvlJc w:val="left"/>
+      <w:pPr>
+        <w:ind w:left="880" w:hanging="440"/>
+      </w:pPr>
+    </w:lvl>
+    <w:lvl w:ilvl="2" w:tplc="0409001B" w:tentative="1">
+      <w:start w:val="1"/>
+      <w:numFmt w:val="lowerRoman"/>
+      <w:lvlText w:val="%3."/>
+      <w:lvlJc w:val="right"/>
+      <w:pPr>
+        <w:ind w:left="1320" w:hanging="440"/>
+      </w:pPr>
+    </w:lvl>
+    <w:lvl w:ilvl="3" w:tplc="0409000F" w:tentative="1">
+      <w:start w:val="1"/>
+      <w:numFmt w:val="decimal"/>
+      <w:lvlText w:val="%4."/>
+      <w:lvlJc w:val="left"/>
+      <w:pPr>
+        <w:ind w:left="1760" w:hanging="440"/>
+      </w:pPr>
+    </w:lvl>
+    <w:lvl w:ilvl="4" w:tplc="04090019" w:tentative="1">
+      <w:start w:val="1"/>
+      <w:numFmt w:val="lowerLetter"/>
+      <w:lvlText w:val="%5)"/>
+      <w:lvlJc w:val="left"/>
+      <w:pPr>
+        <w:ind w:left="2200" w:hanging="440"/>
+      </w:pPr>
+    </w:lvl>
+    <w:lvl w:ilvl="5" w:tplc="0409001B" w:tentative="1">
+      <w:start w:val="1"/>
+      <w:numFmt w:val="lowerRoman"/>
+      <w:lvlText w:val="%6."/>
+      <w:lvlJc w:val="right"/>
+      <w:pPr>
+        <w:ind w:left="2640" w:hanging="440"/>
+      </w:pPr>
+    </w:lvl>
+    <w:lvl w:ilvl="6" w:tplc="0409000F" w:tentative="1">
+      <w:start w:val="1"/>
+      <w:numFmt w:val="decimal"/>
+      <w:lvlText w:val="%7."/>
+      <w:lvlJc w:val="left"/>
+      <w:pPr>
+        <w:ind w:left="3080" w:hanging="440"/>
+      </w:pPr>
+    </w:lvl>
+    <w:lvl w:ilvl="7" w:tplc="04090019" w:tentative="1">
+      <w:start w:val="1"/>
+      <w:numFmt w:val="lowerLetter"/>
+      <w:lvlText w:val="%8)"/>
+      <w:lvlJc w:val="left"/>
+      <w:pPr>
+        <w:ind w:left="3520" w:hanging="440"/>
+      </w:pPr>
+    </w:lvl>
+    <w:lvl w:ilvl="8" w:tplc="0409001B" w:tentative="1">
+      <w:start w:val="1"/>
+      <w:numFmt w:val="lowerRoman"/>
+      <w:lvlText w:val="%9."/>
+      <w:lvlJc w:val="right"/>
+      <w:pPr>
+        <w:ind w:left="3960" w:hanging="440"/>
+      </w:pPr>
+    </w:lvl>
+  </w:abstractNum>
+  <w:abstractNum w:abstractNumId="1" w15:restartNumberingAfterBreak="0">
     <w:nsid w:val="4A3C246F"/>
     <w:multiLevelType w:val="hybridMultilevel"/>
     <w:tmpl w:val="580ADD3E"/>
@@ -2352,6 +2913,9 @@
     </w:lvl>
   </w:abstractNum>
   <w:num w:numId="1" w16cid:durableId="1698657550">
+    <w:abstractNumId w:val="1"/>
+  </w:num>
+  <w:num w:numId="2" w16cid:durableId="1118180791">
     <w:abstractNumId w:val="0"/>
   </w:num>
 </w:numbering>

</xml_diff>

<commit_message>
added a toast that pops up when you try to click on a menu when "allow open multiple menus" is off
</commit_message>
<xml_diff>
--- a/test plan.docx
+++ b/test plan.docx
@@ -149,19 +149,20 @@
         <w:tblStyle w:val="ae"/>
         <w:tblW w:w="11624" w:type="dxa"/>
         <w:tblInd w:w="-1706" w:type="dxa"/>
+        <w:tblLayout w:type="fixed"/>
         <w:tblLook w:val="04A0" w:firstRow="1" w:lastRow="0" w:firstColumn="1" w:lastColumn="0" w:noHBand="0" w:noVBand="1"/>
       </w:tblPr>
       <w:tblGrid>
-        <w:gridCol w:w="1885"/>
-        <w:gridCol w:w="1761"/>
-        <w:gridCol w:w="2450"/>
+        <w:gridCol w:w="1843"/>
+        <w:gridCol w:w="1843"/>
+        <w:gridCol w:w="2410"/>
         <w:gridCol w:w="3118"/>
         <w:gridCol w:w="2410"/>
       </w:tblGrid>
       <w:tr>
         <w:tc>
           <w:tcPr>
-            <w:tcW w:w="1885" w:type="dxa"/>
+            <w:tcW w:w="1843" w:type="dxa"/>
           </w:tcPr>
           <w:p>
             <w:pPr>
@@ -196,7 +197,7 @@
         </w:tc>
         <w:tc>
           <w:tcPr>
-            <w:tcW w:w="1761" w:type="dxa"/>
+            <w:tcW w:w="1843" w:type="dxa"/>
           </w:tcPr>
           <w:p>
             <w:pPr>
@@ -225,7 +226,7 @@
         </w:tc>
         <w:tc>
           <w:tcPr>
-            <w:tcW w:w="2450" w:type="dxa"/>
+            <w:tcW w:w="2410" w:type="dxa"/>
           </w:tcPr>
           <w:p>
             <w:pPr>
@@ -320,35 +321,35 @@
       <w:tr>
         <w:tc>
           <w:tcPr>
-            <w:tcW w:w="1885" w:type="dxa"/>
-          </w:tcPr>
-          <w:p>
-            <w:pPr>
-              <w:rPr>
-                <w:sz w:val="16"/>
-                <w:szCs w:val="18"/>
-                <w:lang w:val="en-CA"/>
-              </w:rPr>
-            </w:pPr>
-          </w:p>
-        </w:tc>
-        <w:tc>
-          <w:tcPr>
-            <w:tcW w:w="1761" w:type="dxa"/>
-          </w:tcPr>
-          <w:p>
-            <w:pPr>
-              <w:rPr>
-                <w:sz w:val="16"/>
-                <w:szCs w:val="18"/>
-                <w:lang w:val="en-CA"/>
-              </w:rPr>
-            </w:pPr>
-          </w:p>
-        </w:tc>
-        <w:tc>
-          <w:tcPr>
-            <w:tcW w:w="2450" w:type="dxa"/>
+            <w:tcW w:w="1843" w:type="dxa"/>
+          </w:tcPr>
+          <w:p>
+            <w:pPr>
+              <w:rPr>
+                <w:sz w:val="16"/>
+                <w:szCs w:val="18"/>
+                <w:lang w:val="en-CA"/>
+              </w:rPr>
+            </w:pPr>
+          </w:p>
+        </w:tc>
+        <w:tc>
+          <w:tcPr>
+            <w:tcW w:w="1843" w:type="dxa"/>
+          </w:tcPr>
+          <w:p>
+            <w:pPr>
+              <w:rPr>
+                <w:sz w:val="16"/>
+                <w:szCs w:val="18"/>
+                <w:lang w:val="en-CA"/>
+              </w:rPr>
+            </w:pPr>
+          </w:p>
+        </w:tc>
+        <w:tc>
+          <w:tcPr>
+            <w:tcW w:w="2410" w:type="dxa"/>
           </w:tcPr>
           <w:p>
             <w:pPr>
@@ -387,6 +388,14 @@
                 <w:lang w:val="en-CA"/>
               </w:rPr>
             </w:pPr>
+            <w:r>
+              <w:rPr>
+                <w:sz w:val="16"/>
+                <w:szCs w:val="18"/>
+                <w:lang w:val="en-CA"/>
+              </w:rPr>
+              <w:t>5bddf836872611033759d627746d8b4161bba22a</w:t>
+            </w:r>
           </w:p>
         </w:tc>
       </w:tr>
@@ -1277,12 +1286,19 @@
           <w:p>
             <w:pPr>
               <w:rPr>
-                <w:rFonts w:hint="eastAsia"/>
-                <w:sz w:val="16"/>
-                <w:szCs w:val="18"/>
-                <w:lang w:val="en-CA"/>
-              </w:rPr>
-            </w:pPr>
+                <w:sz w:val="16"/>
+                <w:szCs w:val="18"/>
+                <w:lang w:val="en-CA"/>
+              </w:rPr>
+            </w:pPr>
+            <w:r>
+              <w:rPr>
+                <w:sz w:val="16"/>
+                <w:szCs w:val="18"/>
+                <w:lang w:val="en-CA"/>
+              </w:rPr>
+              <w:t>working</w:t>
+            </w:r>
           </w:p>
         </w:tc>
       </w:tr>
@@ -1435,12 +1451,19 @@
           <w:p>
             <w:pPr>
               <w:rPr>
-                <w:rFonts w:hint="eastAsia"/>
-                <w:sz w:val="16"/>
-                <w:szCs w:val="18"/>
-                <w:lang w:val="en-CA"/>
-              </w:rPr>
-            </w:pPr>
+                <w:sz w:val="16"/>
+                <w:szCs w:val="18"/>
+                <w:lang w:val="en-CA"/>
+              </w:rPr>
+            </w:pPr>
+            <w:r>
+              <w:rPr>
+                <w:sz w:val="16"/>
+                <w:szCs w:val="18"/>
+                <w:lang w:val="en-CA"/>
+              </w:rPr>
+              <w:t>working</w:t>
+            </w:r>
           </w:p>
         </w:tc>
       </w:tr>
@@ -1464,166 +1487,6 @@
                 <w:szCs w:val="18"/>
                 <w:lang w:val="en-CA"/>
               </w:rPr>
-              <w:t>S</w:t>
-            </w:r>
-            <w:r>
-              <w:rPr>
-                <w:sz w:val="16"/>
-                <w:szCs w:val="18"/>
-                <w:lang w:val="en-CA"/>
-              </w:rPr>
-              <w:t>ettings.tsx</w:t>
-            </w:r>
-          </w:p>
-        </w:tc>
-        <w:tc>
-          <w:tcPr>
-            <w:tcW w:w="1761" w:type="dxa"/>
-          </w:tcPr>
-          <w:p>
-            <w:pPr>
-              <w:rPr>
-                <w:sz w:val="16"/>
-                <w:szCs w:val="18"/>
-                <w:lang w:val="en-CA"/>
-              </w:rPr>
-            </w:pPr>
-            <w:r>
-              <w:rPr>
-                <w:rFonts w:hint="eastAsia"/>
-                <w:sz w:val="16"/>
-                <w:szCs w:val="18"/>
-                <w:lang w:val="en-CA"/>
-              </w:rPr>
-              <w:t>S</w:t>
-            </w:r>
-            <w:r>
-              <w:rPr>
-                <w:sz w:val="16"/>
-                <w:szCs w:val="18"/>
-                <w:lang w:val="en-CA"/>
-              </w:rPr>
-              <w:t>ettings: keyboard: all</w:t>
-            </w:r>
-          </w:p>
-        </w:tc>
-        <w:tc>
-          <w:tcPr>
-            <w:tcW w:w="2450" w:type="dxa"/>
-          </w:tcPr>
-          <w:p>
-            <w:pPr>
-              <w:rPr>
-                <w:sz w:val="16"/>
-                <w:szCs w:val="18"/>
-                <w:lang w:val="en-CA"/>
-              </w:rPr>
-            </w:pPr>
-            <w:r>
-              <w:rPr>
-                <w:rFonts w:hint="eastAsia"/>
-                <w:sz w:val="16"/>
-                <w:szCs w:val="18"/>
-                <w:lang w:val="en-CA"/>
-              </w:rPr>
-              <w:t>C</w:t>
-            </w:r>
-            <w:r>
-              <w:rPr>
-                <w:sz w:val="16"/>
-                <w:szCs w:val="18"/>
-                <w:lang w:val="en-CA"/>
-              </w:rPr>
-              <w:t xml:space="preserve">lick the “x” button on the right </w:t>
-            </w:r>
-            <w:r>
-              <w:rPr>
-                <w:sz w:val="16"/>
-                <w:szCs w:val="18"/>
-                <w:lang w:val="en-CA"/>
-              </w:rPr>
-              <w:lastRenderedPageBreak/>
-              <w:t>side in a keybind box</w:t>
-            </w:r>
-          </w:p>
-        </w:tc>
-        <w:tc>
-          <w:tcPr>
-            <w:tcW w:w="3118" w:type="dxa"/>
-          </w:tcPr>
-          <w:p>
-            <w:pPr>
-              <w:rPr>
-                <w:sz w:val="16"/>
-                <w:szCs w:val="18"/>
-                <w:lang w:val="en-CA"/>
-              </w:rPr>
-            </w:pPr>
-            <w:r>
-              <w:rPr>
-                <w:rFonts w:hint="eastAsia"/>
-                <w:sz w:val="16"/>
-                <w:szCs w:val="18"/>
-                <w:lang w:val="en-CA"/>
-              </w:rPr>
-              <w:lastRenderedPageBreak/>
-              <w:t>I</w:t>
-            </w:r>
-            <w:r>
-              <w:rPr>
-                <w:sz w:val="16"/>
-                <w:szCs w:val="18"/>
-                <w:lang w:val="en-CA"/>
-              </w:rPr>
-              <w:t xml:space="preserve">t should delete that keybind. </w:t>
-            </w:r>
-            <w:r>
-              <w:rPr>
-                <w:rFonts w:hint="eastAsia"/>
-                <w:sz w:val="16"/>
-                <w:szCs w:val="18"/>
-                <w:lang w:val="en-CA"/>
-              </w:rPr>
-              <w:t>I</w:t>
-            </w:r>
-            <w:r>
-              <w:rPr>
-                <w:sz w:val="16"/>
-                <w:szCs w:val="18"/>
-                <w:lang w:val="en-CA"/>
-              </w:rPr>
-              <w:t xml:space="preserve">f there is </w:t>
-            </w:r>
-            <w:r>
-              <w:rPr>
-                <w:sz w:val="16"/>
-                <w:szCs w:val="18"/>
-                <w:lang w:val="en-CA"/>
-              </w:rPr>
-              <w:lastRenderedPageBreak/>
-              <w:t>only one keybind, there should still be an X button</w:t>
-            </w:r>
-          </w:p>
-        </w:tc>
-        <w:tc>
-          <w:tcPr>
-            <w:tcW w:w="2410" w:type="dxa"/>
-          </w:tcPr>
-          <w:p>
-            <w:pPr>
-              <w:rPr>
-                <w:sz w:val="16"/>
-                <w:szCs w:val="18"/>
-                <w:lang w:val="en-CA"/>
-              </w:rPr>
-            </w:pPr>
-            <w:r>
-              <w:rPr>
-                <w:rFonts w:hint="eastAsia"/>
-                <w:sz w:val="16"/>
-                <w:szCs w:val="18"/>
-                <w:lang w:val="en-CA"/>
-              </w:rPr>
               <w:lastRenderedPageBreak/>
               <w:t>S</w:t>
             </w:r>
@@ -1633,16 +1496,173 @@
                 <w:szCs w:val="18"/>
                 <w:lang w:val="en-CA"/>
               </w:rPr>
-              <w:t xml:space="preserve">ingle keybinds don’t have an X </w:t>
-            </w:r>
-            <w:r>
-              <w:rPr>
-                <w:sz w:val="16"/>
-                <w:szCs w:val="18"/>
-                <w:lang w:val="en-CA"/>
-              </w:rPr>
-              <w:lastRenderedPageBreak/>
-              <w:t>button</w:t>
+              <w:t>ettings.tsx</w:t>
+            </w:r>
+          </w:p>
+        </w:tc>
+        <w:tc>
+          <w:tcPr>
+            <w:tcW w:w="1761" w:type="dxa"/>
+          </w:tcPr>
+          <w:p>
+            <w:pPr>
+              <w:rPr>
+                <w:sz w:val="16"/>
+                <w:szCs w:val="18"/>
+                <w:lang w:val="en-CA"/>
+              </w:rPr>
+            </w:pPr>
+            <w:r>
+              <w:rPr>
+                <w:rFonts w:hint="eastAsia"/>
+                <w:sz w:val="16"/>
+                <w:szCs w:val="18"/>
+                <w:lang w:val="en-CA"/>
+              </w:rPr>
+              <w:t>S</w:t>
+            </w:r>
+            <w:r>
+              <w:rPr>
+                <w:sz w:val="16"/>
+                <w:szCs w:val="18"/>
+                <w:lang w:val="en-CA"/>
+              </w:rPr>
+              <w:t>ettings: keyboard: all</w:t>
+            </w:r>
+          </w:p>
+        </w:tc>
+        <w:tc>
+          <w:tcPr>
+            <w:tcW w:w="2450" w:type="dxa"/>
+          </w:tcPr>
+          <w:p>
+            <w:pPr>
+              <w:rPr>
+                <w:sz w:val="16"/>
+                <w:szCs w:val="18"/>
+                <w:lang w:val="en-CA"/>
+              </w:rPr>
+            </w:pPr>
+            <w:r>
+              <w:rPr>
+                <w:rFonts w:hint="eastAsia"/>
+                <w:sz w:val="16"/>
+                <w:szCs w:val="18"/>
+                <w:lang w:val="en-CA"/>
+              </w:rPr>
+              <w:t>C</w:t>
+            </w:r>
+            <w:r>
+              <w:rPr>
+                <w:sz w:val="16"/>
+                <w:szCs w:val="18"/>
+                <w:lang w:val="en-CA"/>
+              </w:rPr>
+              <w:t>lick the “x” button on the right side in a keybind box</w:t>
+            </w:r>
+          </w:p>
+        </w:tc>
+        <w:tc>
+          <w:tcPr>
+            <w:tcW w:w="3118" w:type="dxa"/>
+          </w:tcPr>
+          <w:p>
+            <w:pPr>
+              <w:rPr>
+                <w:sz w:val="16"/>
+                <w:szCs w:val="18"/>
+                <w:lang w:val="en-CA"/>
+              </w:rPr>
+            </w:pPr>
+            <w:r>
+              <w:rPr>
+                <w:rFonts w:hint="eastAsia"/>
+                <w:sz w:val="16"/>
+                <w:szCs w:val="18"/>
+                <w:lang w:val="en-CA"/>
+              </w:rPr>
+              <w:t>I</w:t>
+            </w:r>
+            <w:r>
+              <w:rPr>
+                <w:sz w:val="16"/>
+                <w:szCs w:val="18"/>
+                <w:lang w:val="en-CA"/>
+              </w:rPr>
+              <w:t xml:space="preserve">t should delete that keybind. </w:t>
+            </w:r>
+            <w:r>
+              <w:rPr>
+                <w:rFonts w:hint="eastAsia"/>
+                <w:sz w:val="16"/>
+                <w:szCs w:val="18"/>
+                <w:lang w:val="en-CA"/>
+              </w:rPr>
+              <w:t>I</w:t>
+            </w:r>
+            <w:r>
+              <w:rPr>
+                <w:sz w:val="16"/>
+                <w:szCs w:val="18"/>
+                <w:lang w:val="en-CA"/>
+              </w:rPr>
+              <w:t>f there is only one keybind, there should still be an X button</w:t>
+            </w:r>
+          </w:p>
+        </w:tc>
+        <w:tc>
+          <w:tcPr>
+            <w:tcW w:w="2410" w:type="dxa"/>
+          </w:tcPr>
+          <w:p>
+            <w:pPr>
+              <w:rPr>
+                <w:sz w:val="16"/>
+                <w:szCs w:val="18"/>
+                <w:lang w:val="en-CA"/>
+              </w:rPr>
+            </w:pPr>
+            <w:r>
+              <w:rPr>
+                <w:rFonts w:hint="eastAsia"/>
+                <w:sz w:val="16"/>
+                <w:szCs w:val="18"/>
+                <w:lang w:val="en-CA"/>
+              </w:rPr>
+              <w:t>S</w:t>
+            </w:r>
+            <w:r>
+              <w:rPr>
+                <w:sz w:val="16"/>
+                <w:szCs w:val="18"/>
+                <w:lang w:val="en-CA"/>
+              </w:rPr>
+              <w:t>ingle keybinds don’t have an X button</w:t>
+            </w:r>
+            <w:r>
+              <w:rPr>
+                <w:sz w:val="16"/>
+                <w:szCs w:val="18"/>
+                <w:lang w:val="en-CA"/>
+              </w:rPr>
+              <w:t xml:space="preserve">. </w:t>
+            </w:r>
+            <w:r>
+              <w:rPr>
+                <w:rFonts w:hint="eastAsia"/>
+                <w:sz w:val="16"/>
+                <w:szCs w:val="18"/>
+                <w:lang w:val="en-CA"/>
+              </w:rPr>
+              <w:t>N</w:t>
+            </w:r>
+            <w:r>
+              <w:rPr>
+                <w:sz w:val="16"/>
+                <w:szCs w:val="18"/>
+                <w:lang w:val="en-CA"/>
+              </w:rPr>
+              <w:t>eeds fixing: allow single keybinds to have an X button</w:t>
             </w:r>
           </w:p>
         </w:tc>
@@ -1781,8 +1801,17 @@
               <w:rPr>
                 <w:sz w:val="16"/>
                 <w:szCs w:val="18"/>
-              </w:rPr>
-            </w:pPr>
+                <w:lang w:val="en-CA"/>
+              </w:rPr>
+            </w:pPr>
+            <w:r>
+              <w:rPr>
+                <w:sz w:val="16"/>
+                <w:szCs w:val="18"/>
+                <w:lang w:val="en-CA"/>
+              </w:rPr>
+              <w:t>works</w:t>
+            </w:r>
           </w:p>
         </w:tc>
       </w:tr>
@@ -2300,7 +2329,58 @@
                 <w:szCs w:val="18"/>
                 <w:lang w:val="en-CA"/>
               </w:rPr>
-              <w:t>ach menu you click on should open a small dialogue box saying “open multiple menus is disabled”</w:t>
+              <w:t>ach menu you click on should open a small dialogue box saying “</w:t>
+            </w:r>
+            <w:r>
+              <w:rPr>
+                <w:rFonts w:ascii="Segoe UI Symbol" w:hAnsi="Segoe UI Symbol" w:cs="Segoe UI Symbol"/>
+                <w:sz w:val="16"/>
+                <w:szCs w:val="18"/>
+                <w:lang w:val="en-CA"/>
+              </w:rPr>
+              <w:t>⚠</w:t>
+            </w:r>
+            <w:r>
+              <w:rPr>
+                <w:rFonts w:ascii="Segoe UI Symbol" w:hAnsi="Segoe UI Symbol" w:cs="Segoe UI Symbol"/>
+                <w:sz w:val="16"/>
+                <w:szCs w:val="18"/>
+                <w:lang w:val="en-CA"/>
+              </w:rPr>
+              <w:t xml:space="preserve"> </w:t>
+            </w:r>
+            <w:r>
+              <w:rPr>
+                <w:rFonts w:ascii="Segoe UI Symbol" w:hAnsi="Segoe UI Symbol" w:cs="Segoe UI Symbol"/>
+                <w:sz w:val="16"/>
+                <w:szCs w:val="18"/>
+                <w:lang w:val="en-CA"/>
+              </w:rPr>
+              <w:t>&lt;br\&gt;</w:t>
+            </w:r>
+            <w:r>
+              <w:rPr>
+                <w:sz w:val="16"/>
+                <w:szCs w:val="18"/>
+                <w:lang w:val="en-CA"/>
+              </w:rPr>
+              <w:t>open</w:t>
+            </w:r>
+            <w:r>
+              <w:rPr>
+                <w:sz w:val="16"/>
+                <w:szCs w:val="18"/>
+                <w:lang w:val="en-CA"/>
+              </w:rPr>
+              <w:t>ing</w:t>
+            </w:r>
+            <w:r>
+              <w:rPr>
+                <w:sz w:val="16"/>
+                <w:szCs w:val="18"/>
+                <w:lang w:val="en-CA"/>
+              </w:rPr>
+              <w:t xml:space="preserve"> multiple menus is disabled”</w:t>
             </w:r>
           </w:p>
           <w:p>
@@ -2511,12 +2591,28 @@
           <w:p>
             <w:pPr>
               <w:rPr>
-                <w:rFonts w:hint="eastAsia"/>
-                <w:sz w:val="16"/>
-                <w:szCs w:val="18"/>
-                <w:lang w:val="en-CA"/>
-              </w:rPr>
-            </w:pPr>
+                <w:sz w:val="16"/>
+                <w:szCs w:val="18"/>
+                <w:lang w:val="en-CA"/>
+              </w:rPr>
+            </w:pPr>
+            <w:r>
+              <w:rPr>
+                <w:rFonts w:hint="eastAsia"/>
+                <w:sz w:val="16"/>
+                <w:szCs w:val="18"/>
+                <w:lang w:val="en-CA"/>
+              </w:rPr>
+              <w:t>H</w:t>
+            </w:r>
+            <w:r>
+              <w:rPr>
+                <w:sz w:val="16"/>
+                <w:szCs w:val="18"/>
+                <w:lang w:val="en-CA"/>
+              </w:rPr>
+              <w:t>aven’t implemented the dependent slider yet</w:t>
+            </w:r>
           </w:p>
         </w:tc>
       </w:tr>
@@ -2607,15 +2703,15 @@
                 <w:szCs w:val="18"/>
                 <w:lang w:val="en-CA"/>
               </w:rPr>
-              <w:t>A</w:t>
-            </w:r>
-            <w:r>
-              <w:rPr>
-                <w:sz w:val="16"/>
-                <w:szCs w:val="18"/>
-                <w:lang w:val="en-CA"/>
-              </w:rPr>
-              <w:t>ttempt to open 2 or more settings pages</w:t>
+              <w:t>O</w:t>
+            </w:r>
+            <w:r>
+              <w:rPr>
+                <w:sz w:val="16"/>
+                <w:szCs w:val="18"/>
+                <w:lang w:val="en-CA"/>
+              </w:rPr>
+              <w:t>pen the settings page</w:t>
             </w:r>
           </w:p>
           <w:p>
@@ -2646,7 +2742,7 @@
                 <w:szCs w:val="18"/>
                 <w:lang w:val="en-CA"/>
               </w:rPr>
-              <w:t>ttempt to open 2 or more styles pages</w:t>
+              <w:t>ttempt to open the styles page</w:t>
             </w:r>
           </w:p>
           <w:p>
@@ -2677,7 +2773,38 @@
                 <w:szCs w:val="18"/>
                 <w:lang w:val="en-CA"/>
               </w:rPr>
-              <w:t>ttempt to open</w:t>
+              <w:t>ttempt to open the export video page</w:t>
+            </w:r>
+          </w:p>
+          <w:p>
+            <w:pPr>
+              <w:pStyle w:val="a9"/>
+              <w:numPr>
+                <w:ilvl w:val="0"/>
+                <w:numId w:val="2"/>
+              </w:numPr>
+              <w:rPr>
+                <w:sz w:val="16"/>
+                <w:szCs w:val="18"/>
+                <w:lang w:val="en-CA"/>
+              </w:rPr>
+            </w:pPr>
+            <w:r>
+              <w:rPr>
+                <w:rFonts w:hint="eastAsia"/>
+                <w:sz w:val="16"/>
+                <w:szCs w:val="18"/>
+                <w:lang w:val="en-CA"/>
+              </w:rPr>
+              <w:t>O</w:t>
+            </w:r>
+            <w:r>
+              <w:rPr>
+                <w:sz w:val="16"/>
+                <w:szCs w:val="18"/>
+                <w:lang w:val="en-CA"/>
+              </w:rPr>
+              <w:t>pen every other future implemented page once</w:t>
             </w:r>
           </w:p>
         </w:tc>
@@ -2688,12 +2815,54 @@
           <w:p>
             <w:pPr>
               <w:rPr>
-                <w:rFonts w:hint="eastAsia"/>
-                <w:sz w:val="16"/>
-                <w:szCs w:val="18"/>
-                <w:lang w:val="en-CA"/>
-              </w:rPr>
-            </w:pPr>
+                <w:sz w:val="16"/>
+                <w:szCs w:val="18"/>
+                <w:lang w:val="en-CA"/>
+              </w:rPr>
+            </w:pPr>
+            <w:r>
+              <w:rPr>
+                <w:rFonts w:hint="eastAsia"/>
+                <w:sz w:val="16"/>
+                <w:szCs w:val="18"/>
+                <w:lang w:val="en-CA"/>
+              </w:rPr>
+              <w:t>A</w:t>
+            </w:r>
+            <w:r>
+              <w:rPr>
+                <w:sz w:val="16"/>
+                <w:szCs w:val="18"/>
+                <w:lang w:val="en-CA"/>
+              </w:rPr>
+              <w:t>ll pages should open</w:t>
+            </w:r>
+          </w:p>
+          <w:p>
+            <w:pPr>
+              <w:rPr>
+                <w:sz w:val="16"/>
+                <w:szCs w:val="18"/>
+                <w:lang w:val="en-CA"/>
+              </w:rPr>
+            </w:pPr>
+            <w:r>
+              <w:rPr>
+                <w:rFonts w:hint="eastAsia"/>
+                <w:sz w:val="16"/>
+                <w:szCs w:val="18"/>
+                <w:lang w:val="en-CA"/>
+              </w:rPr>
+              <w:t>T</w:t>
+            </w:r>
+            <w:r>
+              <w:rPr>
+                <w:sz w:val="16"/>
+                <w:szCs w:val="18"/>
+                <w:lang w:val="en-CA"/>
+              </w:rPr>
+              <w:t xml:space="preserve">he dependent setting “allow open multiple menus” should not be greyed out. </w:t>
+            </w:r>
           </w:p>
         </w:tc>
         <w:tc>
@@ -2703,12 +2872,2345 @@
           <w:p>
             <w:pPr>
               <w:rPr>
-                <w:rFonts w:hint="eastAsia"/>
-                <w:sz w:val="16"/>
-                <w:szCs w:val="18"/>
-                <w:lang w:val="en-CA"/>
-              </w:rPr>
-            </w:pPr>
+                <w:sz w:val="16"/>
+                <w:szCs w:val="18"/>
+                <w:lang w:val="en-CA"/>
+              </w:rPr>
+            </w:pPr>
+            <w:r>
+              <w:rPr>
+                <w:rFonts w:hint="eastAsia"/>
+                <w:sz w:val="16"/>
+                <w:szCs w:val="18"/>
+                <w:lang w:val="en-CA"/>
+              </w:rPr>
+              <w:t>H</w:t>
+            </w:r>
+            <w:r>
+              <w:rPr>
+                <w:sz w:val="16"/>
+                <w:szCs w:val="18"/>
+                <w:lang w:val="en-CA"/>
+              </w:rPr>
+              <w:t>aven’t implemented yet</w:t>
+            </w:r>
+          </w:p>
+        </w:tc>
+      </w:tr>
+    </w:tbl>
+    <w:p>
+      <w:pPr>
+        <w:jc w:val="center"/>
+        <w:rPr>
+          <w:b/>
+          <w:bCs/>
+          <w:sz w:val="28"/>
+          <w:szCs w:val="32"/>
+          <w:lang w:val="en-CA"/>
+        </w:rPr>
+      </w:pPr>
+    </w:p>
+    <w:p>
+      <w:pPr>
+        <w:jc w:val="center"/>
+        <w:rPr>
+          <w:b/>
+          <w:bCs/>
+          <w:sz w:val="28"/>
+          <w:szCs w:val="32"/>
+          <w:lang w:val="en-CA"/>
+        </w:rPr>
+      </w:pPr>
+      <w:r>
+        <w:rPr>
+          <w:rFonts w:hint="eastAsia"/>
+          <w:b/>
+          <w:bCs/>
+          <w:sz w:val="28"/>
+          <w:szCs w:val="32"/>
+          <w:lang w:val="en-CA"/>
+        </w:rPr>
+        <w:t>T</w:t>
+      </w:r>
+      <w:r>
+        <w:rPr>
+          <w:b/>
+          <w:bCs/>
+          <w:sz w:val="28"/>
+          <w:szCs w:val="32"/>
+          <w:lang w:val="en-CA"/>
+        </w:rPr>
+        <w:t>orusMenuEditor.tsx</w:t>
+      </w:r>
+    </w:p>
+    <w:tbl>
+      <w:tblPr>
+        <w:tblStyle w:val="ae"/>
+        <w:tblW w:w="11624" w:type="dxa"/>
+        <w:tblInd w:w="-1706" w:type="dxa"/>
+        <w:tblLayout w:type="fixed"/>
+        <w:tblLook w:val="04A0" w:firstRow="1" w:lastRow="0" w:firstColumn="1" w:lastColumn="0" w:noHBand="0" w:noVBand="1"/>
+      </w:tblPr>
+      <w:tblGrid>
+        <w:gridCol w:w="1701"/>
+        <w:gridCol w:w="1985"/>
+        <w:gridCol w:w="2410"/>
+        <w:gridCol w:w="3118"/>
+        <w:gridCol w:w="2410"/>
+      </w:tblGrid>
+      <w:tr>
+        <w:tc>
+          <w:tcPr>
+            <w:tcW w:w="1701" w:type="dxa"/>
+          </w:tcPr>
+          <w:p>
+            <w:pPr>
+              <w:rPr>
+                <w:sz w:val="16"/>
+                <w:szCs w:val="18"/>
+              </w:rPr>
+            </w:pPr>
+            <w:r>
+              <w:rPr>
+                <w:sz w:val="16"/>
+                <w:szCs w:val="18"/>
+              </w:rPr>
+              <w:t>Relevant f</w:t>
+            </w:r>
+            <w:r>
+              <w:rPr>
+                <w:rFonts w:hint="eastAsia"/>
+                <w:sz w:val="16"/>
+                <w:szCs w:val="18"/>
+              </w:rPr>
+              <w:t>ile</w:t>
+            </w:r>
+            <w:r>
+              <w:rPr>
+                <w:sz w:val="16"/>
+                <w:szCs w:val="18"/>
+              </w:rPr>
+              <w:t>(s)</w:t>
+            </w:r>
+          </w:p>
+        </w:tc>
+        <w:tc>
+          <w:tcPr>
+            <w:tcW w:w="1985" w:type="dxa"/>
+          </w:tcPr>
+          <w:p>
+            <w:pPr>
+              <w:rPr>
+                <w:sz w:val="16"/>
+                <w:szCs w:val="18"/>
+                <w:lang w:val="en-CA"/>
+              </w:rPr>
+            </w:pPr>
+            <w:r>
+              <w:rPr>
+                <w:rFonts w:hint="eastAsia"/>
+                <w:sz w:val="16"/>
+                <w:szCs w:val="18"/>
+              </w:rPr>
+              <w:t>C</w:t>
+            </w:r>
+            <w:r>
+              <w:rPr>
+                <w:sz w:val="16"/>
+                <w:szCs w:val="18"/>
+              </w:rPr>
+              <w:t>omponent</w:t>
+            </w:r>
+          </w:p>
+        </w:tc>
+        <w:tc>
+          <w:tcPr>
+            <w:tcW w:w="2410" w:type="dxa"/>
+          </w:tcPr>
+          <w:p>
+            <w:pPr>
+              <w:rPr>
+                <w:sz w:val="16"/>
+                <w:szCs w:val="18"/>
+                <w:lang w:val="en-CA"/>
+              </w:rPr>
+            </w:pPr>
+            <w:r>
+              <w:rPr>
+                <w:rFonts w:hint="eastAsia"/>
+                <w:sz w:val="16"/>
+                <w:szCs w:val="18"/>
+                <w:lang w:val="en-CA"/>
+              </w:rPr>
+              <w:t>H</w:t>
+            </w:r>
+            <w:r>
+              <w:rPr>
+                <w:sz w:val="16"/>
+                <w:szCs w:val="18"/>
+                <w:lang w:val="en-CA"/>
+              </w:rPr>
+              <w:t>ow to test</w:t>
+            </w:r>
+          </w:p>
+        </w:tc>
+        <w:tc>
+          <w:tcPr>
+            <w:tcW w:w="3118" w:type="dxa"/>
+          </w:tcPr>
+          <w:p>
+            <w:pPr>
+              <w:rPr>
+                <w:sz w:val="16"/>
+                <w:szCs w:val="18"/>
+                <w:lang w:val="en-CA"/>
+              </w:rPr>
+            </w:pPr>
+            <w:r>
+              <w:rPr>
+                <w:rFonts w:hint="eastAsia"/>
+                <w:sz w:val="16"/>
+                <w:szCs w:val="18"/>
+                <w:lang w:val="en-CA"/>
+              </w:rPr>
+              <w:t>E</w:t>
+            </w:r>
+            <w:r>
+              <w:rPr>
+                <w:sz w:val="16"/>
+                <w:szCs w:val="18"/>
+                <w:lang w:val="en-CA"/>
+              </w:rPr>
+              <w:t>xpected outcome</w:t>
+            </w:r>
+          </w:p>
+        </w:tc>
+        <w:tc>
+          <w:tcPr>
+            <w:tcW w:w="2410" w:type="dxa"/>
+          </w:tcPr>
+          <w:p>
+            <w:pPr>
+              <w:rPr>
+                <w:sz w:val="16"/>
+                <w:szCs w:val="18"/>
+                <w:lang w:val="en-CA"/>
+              </w:rPr>
+            </w:pPr>
+            <w:r>
+              <w:rPr>
+                <w:rFonts w:hint="eastAsia"/>
+                <w:sz w:val="16"/>
+                <w:szCs w:val="18"/>
+                <w:lang w:val="en-CA"/>
+              </w:rPr>
+              <w:t>T</w:t>
+            </w:r>
+            <w:r>
+              <w:rPr>
+                <w:sz w:val="16"/>
+                <w:szCs w:val="18"/>
+                <w:lang w:val="en-CA"/>
+              </w:rPr>
+              <w:t>ested on (commit) and notes</w:t>
+            </w:r>
+          </w:p>
+        </w:tc>
+      </w:tr>
+      <w:tr>
+        <w:tc>
+          <w:tcPr>
+            <w:tcW w:w="1701" w:type="dxa"/>
+          </w:tcPr>
+          <w:p>
+            <w:pPr>
+              <w:rPr>
+                <w:sz w:val="16"/>
+                <w:szCs w:val="18"/>
+                <w:lang w:val="en-CA"/>
+              </w:rPr>
+            </w:pPr>
+            <w:r>
+              <w:rPr>
+                <w:rFonts w:hint="eastAsia"/>
+                <w:sz w:val="16"/>
+                <w:szCs w:val="18"/>
+                <w:lang w:val="en-CA"/>
+              </w:rPr>
+              <w:t>G</w:t>
+            </w:r>
+            <w:r>
+              <w:rPr>
+                <w:sz w:val="16"/>
+                <w:szCs w:val="18"/>
+                <w:lang w:val="en-CA"/>
+              </w:rPr>
+              <w:t xml:space="preserve">raph.tsx, </w:t>
+            </w:r>
+            <w:r>
+              <w:rPr>
+                <w:sz w:val="16"/>
+                <w:szCs w:val="18"/>
+                <w:lang w:val="en-CA"/>
+              </w:rPr>
+              <w:lastRenderedPageBreak/>
+              <w:t>TorusMenuEditor.tsx</w:t>
+            </w:r>
+          </w:p>
+        </w:tc>
+        <w:tc>
+          <w:tcPr>
+            <w:tcW w:w="1985" w:type="dxa"/>
+          </w:tcPr>
+          <w:p>
+            <w:pPr>
+              <w:rPr>
+                <w:sz w:val="16"/>
+                <w:szCs w:val="18"/>
+                <w:lang w:val="en-CA"/>
+              </w:rPr>
+            </w:pPr>
+            <w:r>
+              <w:rPr>
+                <w:rFonts w:hint="eastAsia"/>
+                <w:sz w:val="16"/>
+                <w:szCs w:val="18"/>
+                <w:lang w:val="en-CA"/>
+              </w:rPr>
+              <w:lastRenderedPageBreak/>
+              <w:t>S</w:t>
+            </w:r>
+            <w:r>
+              <w:rPr>
+                <w:sz w:val="16"/>
+                <w:szCs w:val="18"/>
+                <w:lang w:val="en-CA"/>
+              </w:rPr>
+              <w:t xml:space="preserve">ettings: components: </w:t>
+            </w:r>
+            <w:r>
+              <w:rPr>
+                <w:sz w:val="16"/>
+                <w:szCs w:val="18"/>
+                <w:lang w:val="en-CA"/>
+              </w:rPr>
+              <w:lastRenderedPageBreak/>
+              <w:t>torus menu editor: graph: easing</w:t>
+            </w:r>
+          </w:p>
+        </w:tc>
+        <w:tc>
+          <w:tcPr>
+            <w:tcW w:w="2410" w:type="dxa"/>
+          </w:tcPr>
+          <w:p>
+            <w:pPr>
+              <w:rPr>
+                <w:sz w:val="16"/>
+                <w:szCs w:val="18"/>
+                <w:lang w:val="en-CA"/>
+              </w:rPr>
+            </w:pPr>
+            <w:r>
+              <w:rPr>
+                <w:rFonts w:hint="eastAsia"/>
+                <w:sz w:val="16"/>
+                <w:szCs w:val="18"/>
+                <w:lang w:val="en-CA"/>
+              </w:rPr>
+              <w:lastRenderedPageBreak/>
+              <w:t>W</w:t>
+            </w:r>
+            <w:r>
+              <w:rPr>
+                <w:sz w:val="16"/>
+                <w:szCs w:val="18"/>
+                <w:lang w:val="en-CA"/>
+              </w:rPr>
+              <w:t xml:space="preserve">ith the default linear slider, </w:t>
+            </w:r>
+            <w:r>
+              <w:rPr>
+                <w:sz w:val="16"/>
+                <w:szCs w:val="18"/>
+                <w:lang w:val="en-CA"/>
+              </w:rPr>
+              <w:lastRenderedPageBreak/>
+              <w:t xml:space="preserve">click the open torus menu (…) button. </w:t>
+            </w:r>
+            <w:r>
+              <w:rPr>
+                <w:rFonts w:hint="eastAsia"/>
+                <w:sz w:val="16"/>
+                <w:szCs w:val="18"/>
+                <w:lang w:val="en-CA"/>
+              </w:rPr>
+              <w:t>T</w:t>
+            </w:r>
+            <w:r>
+              <w:rPr>
+                <w:sz w:val="16"/>
+                <w:szCs w:val="18"/>
+                <w:lang w:val="en-CA"/>
+              </w:rPr>
+              <w:t xml:space="preserve">hen, push the ease handle up, then reopen it again. </w:t>
+            </w:r>
+            <w:r>
+              <w:rPr>
+                <w:rFonts w:hint="eastAsia"/>
+                <w:sz w:val="16"/>
+                <w:szCs w:val="18"/>
+                <w:lang w:val="en-CA"/>
+              </w:rPr>
+              <w:t>P</w:t>
+            </w:r>
+            <w:r>
+              <w:rPr>
+                <w:sz w:val="16"/>
+                <w:szCs w:val="18"/>
+                <w:lang w:val="en-CA"/>
+              </w:rPr>
+              <w:t>ull the ease handle down, and reopen it again</w:t>
+            </w:r>
+          </w:p>
+        </w:tc>
+        <w:tc>
+          <w:tcPr>
+            <w:tcW w:w="3118" w:type="dxa"/>
+          </w:tcPr>
+          <w:p>
+            <w:pPr>
+              <w:rPr>
+                <w:sz w:val="16"/>
+                <w:szCs w:val="18"/>
+                <w:lang w:val="en-CA"/>
+              </w:rPr>
+            </w:pPr>
+            <w:r>
+              <w:rPr>
+                <w:rFonts w:hint="eastAsia"/>
+                <w:sz w:val="16"/>
+                <w:szCs w:val="18"/>
+                <w:lang w:val="en-CA"/>
+              </w:rPr>
+              <w:lastRenderedPageBreak/>
+              <w:t>T</w:t>
+            </w:r>
+            <w:r>
+              <w:rPr>
+                <w:sz w:val="16"/>
+                <w:szCs w:val="18"/>
+                <w:lang w:val="en-CA"/>
+              </w:rPr>
+              <w:t xml:space="preserve">he torus menu should open linearly the </w:t>
+            </w:r>
+            <w:r>
+              <w:rPr>
+                <w:sz w:val="16"/>
+                <w:szCs w:val="18"/>
+                <w:lang w:val="en-CA"/>
+              </w:rPr>
+              <w:lastRenderedPageBreak/>
+              <w:t xml:space="preserve">first time. </w:t>
+            </w:r>
+            <w:r>
+              <w:rPr>
+                <w:rFonts w:hint="eastAsia"/>
+                <w:sz w:val="16"/>
+                <w:szCs w:val="18"/>
+                <w:lang w:val="en-CA"/>
+              </w:rPr>
+              <w:t>T</w:t>
+            </w:r>
+            <w:r>
+              <w:rPr>
+                <w:sz w:val="16"/>
+                <w:szCs w:val="18"/>
+                <w:lang w:val="en-CA"/>
+              </w:rPr>
+              <w:t xml:space="preserve">he second time, it should quickly pop up and then gradually slow to a stop. </w:t>
+            </w:r>
+            <w:r>
+              <w:rPr>
+                <w:rFonts w:hint="eastAsia"/>
+                <w:sz w:val="16"/>
+                <w:szCs w:val="18"/>
+                <w:lang w:val="en-CA"/>
+              </w:rPr>
+              <w:t>T</w:t>
+            </w:r>
+            <w:r>
+              <w:rPr>
+                <w:sz w:val="16"/>
+                <w:szCs w:val="18"/>
+                <w:lang w:val="en-CA"/>
+              </w:rPr>
+              <w:t>he third time, it should wait and then quickly speed up and abruptly stop</w:t>
+            </w:r>
+          </w:p>
+        </w:tc>
+        <w:tc>
+          <w:tcPr>
+            <w:tcW w:w="2410" w:type="dxa"/>
+          </w:tcPr>
+          <w:p>
+            <w:pPr>
+              <w:rPr>
+                <w:sz w:val="16"/>
+                <w:szCs w:val="18"/>
+                <w:lang w:val="en-CA"/>
+              </w:rPr>
+            </w:pPr>
+            <w:r>
+              <w:rPr>
+                <w:rFonts w:hint="eastAsia"/>
+                <w:sz w:val="16"/>
+                <w:szCs w:val="18"/>
+                <w:lang w:val="en-CA"/>
+              </w:rPr>
+              <w:lastRenderedPageBreak/>
+              <w:t>W</w:t>
+            </w:r>
+            <w:r>
+              <w:rPr>
+                <w:sz w:val="16"/>
+                <w:szCs w:val="18"/>
+                <w:lang w:val="en-CA"/>
+              </w:rPr>
+              <w:t>orks</w:t>
+            </w:r>
+            <w:r>
+              <w:rPr>
+                <w:sz w:val="16"/>
+                <w:szCs w:val="18"/>
+                <w:lang w:val="en-CA"/>
+              </w:rPr>
+              <w:t xml:space="preserve">: </w:t>
+            </w:r>
+            <w:r>
+              <w:rPr>
+                <w:sz w:val="16"/>
+                <w:szCs w:val="18"/>
+                <w:lang w:val="en-CA"/>
+              </w:rPr>
+              <w:lastRenderedPageBreak/>
+              <w:t>5bddf836872611033759d627746d8b4161bba22a</w:t>
+            </w:r>
+            <w:r>
+              <w:rPr>
+                <w:sz w:val="16"/>
+                <w:szCs w:val="18"/>
+                <w:lang w:val="en-CA"/>
+              </w:rPr>
+              <w:br/>
+              <w:t>although the hitbox for the ease handler is kinda small and super annoying to click, in fact it’s smaller than the area in which your cursor turns into an arrow handle.</w:t>
+            </w:r>
+          </w:p>
+        </w:tc>
+      </w:tr>
+      <w:tr>
+        <w:tc>
+          <w:tcPr>
+            <w:tcW w:w="1701" w:type="dxa"/>
+          </w:tcPr>
+          <w:p>
+            <w:pPr>
+              <w:rPr>
+                <w:sz w:val="16"/>
+                <w:szCs w:val="18"/>
+                <w:lang w:val="en-CA"/>
+              </w:rPr>
+            </w:pPr>
+            <w:r>
+              <w:rPr>
+                <w:rFonts w:hint="eastAsia"/>
+                <w:sz w:val="16"/>
+                <w:szCs w:val="18"/>
+                <w:lang w:val="en-CA"/>
+              </w:rPr>
+              <w:t>G</w:t>
+            </w:r>
+            <w:r>
+              <w:rPr>
+                <w:sz w:val="16"/>
+                <w:szCs w:val="18"/>
+                <w:lang w:val="en-CA"/>
+              </w:rPr>
+              <w:t>raph.tsx, TorusMenuEditor.tsx</w:t>
+            </w:r>
+          </w:p>
+        </w:tc>
+        <w:tc>
+          <w:tcPr>
+            <w:tcW w:w="1985" w:type="dxa"/>
+          </w:tcPr>
+          <w:p>
+            <w:pPr>
+              <w:rPr>
+                <w:sz w:val="16"/>
+                <w:szCs w:val="18"/>
+                <w:lang w:val="en-CA"/>
+              </w:rPr>
+            </w:pPr>
+            <w:r>
+              <w:rPr>
+                <w:rFonts w:hint="eastAsia"/>
+                <w:sz w:val="16"/>
+                <w:szCs w:val="18"/>
+                <w:lang w:val="en-CA"/>
+              </w:rPr>
+              <w:t>S</w:t>
+            </w:r>
+            <w:r>
+              <w:rPr>
+                <w:sz w:val="16"/>
+                <w:szCs w:val="18"/>
+                <w:lang w:val="en-CA"/>
+              </w:rPr>
+              <w:t>ettings: components: torus menu editor: graph: multiple anchor points</w:t>
+            </w:r>
+          </w:p>
+        </w:tc>
+        <w:tc>
+          <w:tcPr>
+            <w:tcW w:w="2410" w:type="dxa"/>
+          </w:tcPr>
+          <w:p>
+            <w:pPr>
+              <w:rPr>
+                <w:sz w:val="16"/>
+                <w:szCs w:val="18"/>
+                <w:lang w:val="en-CA"/>
+              </w:rPr>
+            </w:pPr>
+            <w:r>
+              <w:rPr>
+                <w:rFonts w:hint="eastAsia"/>
+                <w:sz w:val="16"/>
+                <w:szCs w:val="18"/>
+                <w:lang w:val="en-CA"/>
+              </w:rPr>
+              <w:t>C</w:t>
+            </w:r>
+            <w:r>
+              <w:rPr>
+                <w:sz w:val="16"/>
+                <w:szCs w:val="18"/>
+                <w:lang w:val="en-CA"/>
+              </w:rPr>
+              <w:t xml:space="preserve">lick and drag a point and move it up and towards the beginning of the graph. </w:t>
+            </w:r>
+            <w:r>
+              <w:rPr>
+                <w:rFonts w:hint="eastAsia"/>
+                <w:sz w:val="16"/>
+                <w:szCs w:val="18"/>
+                <w:lang w:val="en-CA"/>
+              </w:rPr>
+              <w:t>A</w:t>
+            </w:r>
+            <w:r>
+              <w:rPr>
+                <w:sz w:val="16"/>
+                <w:szCs w:val="18"/>
+                <w:lang w:val="en-CA"/>
+              </w:rPr>
+              <w:t>fter that point, click and drag another point and bring it down</w:t>
+            </w:r>
+          </w:p>
+        </w:tc>
+        <w:tc>
+          <w:tcPr>
+            <w:tcW w:w="3118" w:type="dxa"/>
+          </w:tcPr>
+          <w:p>
+            <w:pPr>
+              <w:rPr>
+                <w:sz w:val="16"/>
+                <w:szCs w:val="18"/>
+                <w:lang w:val="en-CA"/>
+              </w:rPr>
+            </w:pPr>
+            <w:r>
+              <w:rPr>
+                <w:rFonts w:hint="eastAsia"/>
+                <w:sz w:val="16"/>
+                <w:szCs w:val="18"/>
+                <w:lang w:val="en-CA"/>
+              </w:rPr>
+              <w:t>T</w:t>
+            </w:r>
+            <w:r>
+              <w:rPr>
+                <w:sz w:val="16"/>
+                <w:szCs w:val="18"/>
+                <w:lang w:val="en-CA"/>
+              </w:rPr>
+              <w:t xml:space="preserve">he points should be immediately created as soon as you clicked your mouse button down, and the anchor point should’ve followed your mouse as you dragged it across the graph. </w:t>
+            </w:r>
+          </w:p>
+        </w:tc>
+        <w:tc>
+          <w:tcPr>
+            <w:tcW w:w="2410" w:type="dxa"/>
+          </w:tcPr>
+          <w:p>
+            <w:pPr>
+              <w:rPr>
+                <w:sz w:val="16"/>
+                <w:szCs w:val="18"/>
+                <w:lang w:val="en-CA"/>
+              </w:rPr>
+            </w:pPr>
+            <w:r>
+              <w:rPr>
+                <w:rFonts w:hint="eastAsia"/>
+                <w:sz w:val="16"/>
+                <w:szCs w:val="18"/>
+                <w:lang w:val="en-CA"/>
+              </w:rPr>
+              <w:t>W</w:t>
+            </w:r>
+            <w:r>
+              <w:rPr>
+                <w:sz w:val="16"/>
+                <w:szCs w:val="18"/>
+                <w:lang w:val="en-CA"/>
+              </w:rPr>
+              <w:t xml:space="preserve">orks as of </w:t>
+            </w:r>
+            <w:r>
+              <w:rPr>
+                <w:sz w:val="16"/>
+                <w:szCs w:val="18"/>
+                <w:lang w:val="en-CA"/>
+              </w:rPr>
+              <w:t>5bddf836872611033759d627746d8b4161bba22a</w:t>
+            </w:r>
+          </w:p>
+        </w:tc>
+      </w:tr>
+      <w:tr>
+        <w:tc>
+          <w:tcPr>
+            <w:tcW w:w="1701" w:type="dxa"/>
+          </w:tcPr>
+          <w:p>
+            <w:pPr>
+              <w:rPr>
+                <w:sz w:val="16"/>
+                <w:szCs w:val="18"/>
+                <w:lang w:val="en-CA"/>
+              </w:rPr>
+            </w:pPr>
+            <w:r>
+              <w:rPr>
+                <w:rFonts w:hint="eastAsia"/>
+                <w:sz w:val="16"/>
+                <w:szCs w:val="18"/>
+                <w:lang w:val="en-CA"/>
+              </w:rPr>
+              <w:t>G</w:t>
+            </w:r>
+            <w:r>
+              <w:rPr>
+                <w:sz w:val="16"/>
+                <w:szCs w:val="18"/>
+                <w:lang w:val="en-CA"/>
+              </w:rPr>
+              <w:t>raph.tsx, TorusMenuEditor.tsx</w:t>
+            </w:r>
+          </w:p>
+        </w:tc>
+        <w:tc>
+          <w:tcPr>
+            <w:tcW w:w="1985" w:type="dxa"/>
+          </w:tcPr>
+          <w:p>
+            <w:pPr>
+              <w:rPr>
+                <w:sz w:val="16"/>
+                <w:szCs w:val="18"/>
+                <w:lang w:val="en-CA"/>
+              </w:rPr>
+            </w:pPr>
+            <w:r>
+              <w:rPr>
+                <w:rFonts w:hint="eastAsia"/>
+                <w:sz w:val="16"/>
+                <w:szCs w:val="18"/>
+                <w:lang w:val="en-CA"/>
+              </w:rPr>
+              <w:t>S</w:t>
+            </w:r>
+            <w:r>
+              <w:rPr>
+                <w:sz w:val="16"/>
+                <w:szCs w:val="18"/>
+                <w:lang w:val="en-CA"/>
+              </w:rPr>
+              <w:t>ettings: components: torus menu editor: graph: multiple anchor points #2</w:t>
+            </w:r>
+          </w:p>
+        </w:tc>
+        <w:tc>
+          <w:tcPr>
+            <w:tcW w:w="2410" w:type="dxa"/>
+          </w:tcPr>
+          <w:p>
+            <w:pPr>
+              <w:rPr>
+                <w:rFonts w:hint="eastAsia"/>
+                <w:sz w:val="16"/>
+                <w:szCs w:val="18"/>
+                <w:lang w:val="en-CA"/>
+              </w:rPr>
+            </w:pPr>
+            <w:r>
+              <w:rPr>
+                <w:rFonts w:hint="eastAsia"/>
+                <w:sz w:val="16"/>
+                <w:szCs w:val="18"/>
+                <w:lang w:val="en-CA"/>
+              </w:rPr>
+              <w:t>C</w:t>
+            </w:r>
+            <w:r>
+              <w:rPr>
+                <w:sz w:val="16"/>
+                <w:szCs w:val="18"/>
+                <w:lang w:val="en-CA"/>
+              </w:rPr>
+              <w:t xml:space="preserve">lick and drag a point and move it up and towards the beginning of the graph. </w:t>
+            </w:r>
+            <w:r>
+              <w:rPr>
+                <w:rFonts w:hint="eastAsia"/>
+                <w:sz w:val="16"/>
+                <w:szCs w:val="18"/>
+                <w:lang w:val="en-CA"/>
+              </w:rPr>
+              <w:t>A</w:t>
+            </w:r>
+            <w:r>
+              <w:rPr>
+                <w:sz w:val="16"/>
+                <w:szCs w:val="18"/>
+                <w:lang w:val="en-CA"/>
+              </w:rPr>
+              <w:t>fter that point, click and drag another point and bring it down</w:t>
+            </w:r>
+            <w:r>
+              <w:rPr>
+                <w:sz w:val="16"/>
+                <w:szCs w:val="18"/>
+                <w:lang w:val="en-CA"/>
+              </w:rPr>
+              <w:t xml:space="preserve">. </w:t>
+            </w:r>
+            <w:r>
+              <w:rPr>
+                <w:rFonts w:hint="eastAsia"/>
+                <w:sz w:val="16"/>
+                <w:szCs w:val="18"/>
+                <w:lang w:val="en-CA"/>
+              </w:rPr>
+              <w:t>T</w:t>
+            </w:r>
+            <w:r>
+              <w:rPr>
+                <w:sz w:val="16"/>
+                <w:szCs w:val="18"/>
+                <w:lang w:val="en-CA"/>
+              </w:rPr>
+              <w:t>hen, click the open torus menu button (…)</w:t>
+            </w:r>
+          </w:p>
+        </w:tc>
+        <w:tc>
+          <w:tcPr>
+            <w:tcW w:w="3118" w:type="dxa"/>
+          </w:tcPr>
+          <w:p>
+            <w:pPr>
+              <w:rPr>
+                <w:sz w:val="16"/>
+                <w:szCs w:val="18"/>
+                <w:lang w:val="en-CA"/>
+              </w:rPr>
+            </w:pPr>
+            <w:r>
+              <w:rPr>
+                <w:rFonts w:hint="eastAsia"/>
+                <w:sz w:val="16"/>
+                <w:szCs w:val="18"/>
+                <w:lang w:val="en-CA"/>
+              </w:rPr>
+              <w:t>T</w:t>
+            </w:r>
+            <w:r>
+              <w:rPr>
+                <w:sz w:val="16"/>
+                <w:szCs w:val="18"/>
+                <w:lang w:val="en-CA"/>
+              </w:rPr>
+              <w:t>he torus menu should quickly enlarge, then contract, then enlarge again</w:t>
+            </w:r>
+          </w:p>
+        </w:tc>
+        <w:tc>
+          <w:tcPr>
+            <w:tcW w:w="2410" w:type="dxa"/>
+          </w:tcPr>
+          <w:p>
+            <w:pPr>
+              <w:rPr>
+                <w:sz w:val="16"/>
+                <w:szCs w:val="18"/>
+                <w:lang w:val="en-CA"/>
+              </w:rPr>
+            </w:pPr>
+            <w:r>
+              <w:rPr>
+                <w:rFonts w:hint="eastAsia"/>
+                <w:sz w:val="16"/>
+                <w:szCs w:val="18"/>
+                <w:lang w:val="en-CA"/>
+              </w:rPr>
+              <w:t>W</w:t>
+            </w:r>
+            <w:r>
+              <w:rPr>
+                <w:sz w:val="16"/>
+                <w:szCs w:val="18"/>
+                <w:lang w:val="en-CA"/>
+              </w:rPr>
+              <w:t>orks</w:t>
+            </w:r>
+            <w:r>
+              <w:rPr>
+                <w:sz w:val="16"/>
+                <w:szCs w:val="18"/>
+                <w:lang w:val="en-CA"/>
+              </w:rPr>
+              <w:t xml:space="preserve"> </w:t>
+            </w:r>
+            <w:r>
+              <w:rPr>
+                <w:sz w:val="16"/>
+                <w:szCs w:val="18"/>
+                <w:lang w:val="en-CA"/>
+              </w:rPr>
+              <w:t>5bddf836872611033759d627746d8b4161bba22a</w:t>
+            </w:r>
+          </w:p>
+        </w:tc>
+      </w:tr>
+      <w:tr>
+        <w:tc>
+          <w:tcPr>
+            <w:tcW w:w="1701" w:type="dxa"/>
+          </w:tcPr>
+          <w:p>
+            <w:pPr>
+              <w:rPr>
+                <w:sz w:val="16"/>
+                <w:szCs w:val="18"/>
+                <w:lang w:val="en-CA"/>
+              </w:rPr>
+            </w:pPr>
+            <w:r>
+              <w:rPr>
+                <w:sz w:val="16"/>
+                <w:szCs w:val="18"/>
+                <w:lang w:val="en-CA"/>
+              </w:rPr>
+              <w:t>TorusMenuEditor.tsx</w:t>
+            </w:r>
+          </w:p>
+        </w:tc>
+        <w:tc>
+          <w:tcPr>
+            <w:tcW w:w="1985" w:type="dxa"/>
+          </w:tcPr>
+          <w:p>
+            <w:pPr>
+              <w:rPr>
+                <w:sz w:val="16"/>
+                <w:szCs w:val="18"/>
+                <w:lang w:val="en-CA"/>
+              </w:rPr>
+            </w:pPr>
+            <w:r>
+              <w:rPr>
+                <w:rFonts w:hint="eastAsia"/>
+                <w:sz w:val="16"/>
+                <w:szCs w:val="18"/>
+                <w:lang w:val="en-CA"/>
+              </w:rPr>
+              <w:t>S</w:t>
+            </w:r>
+            <w:r>
+              <w:rPr>
+                <w:sz w:val="16"/>
+                <w:szCs w:val="18"/>
+                <w:lang w:val="en-CA"/>
+              </w:rPr>
+              <w:t>ettings: components: torus menu editor: delay slider</w:t>
+            </w:r>
+          </w:p>
+        </w:tc>
+        <w:tc>
+          <w:tcPr>
+            <w:tcW w:w="2410" w:type="dxa"/>
+          </w:tcPr>
+          <w:p>
+            <w:pPr>
+              <w:pStyle w:val="a9"/>
+              <w:numPr>
+                <w:ilvl w:val="0"/>
+                <w:numId w:val="3"/>
+              </w:numPr>
+              <w:rPr>
+                <w:sz w:val="16"/>
+                <w:szCs w:val="18"/>
+                <w:lang w:val="en-CA"/>
+              </w:rPr>
+            </w:pPr>
+            <w:r>
+              <w:rPr>
+                <w:rFonts w:hint="eastAsia"/>
+                <w:sz w:val="16"/>
+                <w:szCs w:val="18"/>
+                <w:lang w:val="en-CA"/>
+              </w:rPr>
+              <w:t>S</w:t>
+            </w:r>
+            <w:r>
+              <w:rPr>
+                <w:sz w:val="16"/>
+                <w:szCs w:val="18"/>
+                <w:lang w:val="en-CA"/>
+              </w:rPr>
+              <w:t>et the slider to 0</w:t>
+            </w:r>
+            <w:r>
+              <w:rPr>
+                <w:sz w:val="16"/>
+                <w:szCs w:val="18"/>
+                <w:lang w:val="en-CA"/>
+              </w:rPr>
+              <w:t>, click on the (…) open torus menu button</w:t>
+            </w:r>
+          </w:p>
+          <w:p>
+            <w:pPr>
+              <w:pStyle w:val="a9"/>
+              <w:numPr>
+                <w:ilvl w:val="0"/>
+                <w:numId w:val="3"/>
+              </w:numPr>
+              <w:rPr>
+                <w:sz w:val="16"/>
+                <w:szCs w:val="18"/>
+                <w:lang w:val="en-CA"/>
+              </w:rPr>
+            </w:pPr>
+            <w:r>
+              <w:rPr>
+                <w:rFonts w:hint="eastAsia"/>
+                <w:sz w:val="16"/>
+                <w:szCs w:val="18"/>
+                <w:lang w:val="en-CA"/>
+              </w:rPr>
+              <w:t>T</w:t>
+            </w:r>
+            <w:r>
+              <w:rPr>
+                <w:sz w:val="16"/>
+                <w:szCs w:val="18"/>
+                <w:lang w:val="en-CA"/>
+              </w:rPr>
+              <w:t>est the slider for different positive values and click (…) each time</w:t>
+            </w:r>
+          </w:p>
+          <w:p>
+            <w:pPr>
+              <w:pStyle w:val="a9"/>
+              <w:numPr>
+                <w:ilvl w:val="0"/>
+                <w:numId w:val="3"/>
+              </w:numPr>
+              <w:rPr>
+                <w:sz w:val="16"/>
+                <w:szCs w:val="18"/>
+                <w:lang w:val="en-CA"/>
+              </w:rPr>
+            </w:pPr>
+            <w:r>
+              <w:rPr>
+                <w:rFonts w:hint="eastAsia"/>
+                <w:sz w:val="16"/>
+                <w:szCs w:val="18"/>
+                <w:lang w:val="en-CA"/>
+              </w:rPr>
+              <w:t>T</w:t>
+            </w:r>
+            <w:r>
+              <w:rPr>
+                <w:sz w:val="16"/>
+                <w:szCs w:val="18"/>
+                <w:lang w:val="en-CA"/>
+              </w:rPr>
+              <w:t>est the slider for different negative values and click (…) each time</w:t>
+            </w:r>
+          </w:p>
+        </w:tc>
+        <w:tc>
+          <w:tcPr>
+            <w:tcW w:w="3118" w:type="dxa"/>
+          </w:tcPr>
+          <w:p>
+            <w:pPr>
+              <w:pStyle w:val="a9"/>
+              <w:numPr>
+                <w:ilvl w:val="0"/>
+                <w:numId w:val="4"/>
+              </w:numPr>
+              <w:rPr>
+                <w:sz w:val="16"/>
+                <w:szCs w:val="18"/>
+                <w:lang w:val="en-CA"/>
+              </w:rPr>
+            </w:pPr>
+            <w:r>
+              <w:rPr>
+                <w:rFonts w:hint="eastAsia"/>
+                <w:sz w:val="16"/>
+                <w:szCs w:val="18"/>
+                <w:lang w:val="en-CA"/>
+              </w:rPr>
+              <w:t>O</w:t>
+            </w:r>
+            <w:r>
+              <w:rPr>
+                <w:sz w:val="16"/>
+                <w:szCs w:val="18"/>
+                <w:lang w:val="en-CA"/>
+              </w:rPr>
+              <w:t>n test 1, the torus menu should open in one union, all annular sectors synchronized at the same time</w:t>
+            </w:r>
+          </w:p>
+          <w:p>
+            <w:pPr>
+              <w:pStyle w:val="a9"/>
+              <w:numPr>
+                <w:ilvl w:val="0"/>
+                <w:numId w:val="4"/>
+              </w:numPr>
+              <w:rPr>
+                <w:sz w:val="16"/>
+                <w:szCs w:val="18"/>
+                <w:lang w:val="en-CA"/>
+              </w:rPr>
+            </w:pPr>
+            <w:r>
+              <w:rPr>
+                <w:rFonts w:hint="eastAsia"/>
+                <w:sz w:val="16"/>
+                <w:szCs w:val="18"/>
+                <w:lang w:val="en-CA"/>
+              </w:rPr>
+              <w:t>O</w:t>
+            </w:r>
+            <w:r>
+              <w:rPr>
+                <w:sz w:val="16"/>
+                <w:szCs w:val="18"/>
+                <w:lang w:val="en-CA"/>
+              </w:rPr>
+              <w:t xml:space="preserve">n test 2, where the delay slider is positive, the annular sectors should open one by one in a clockwise motion. </w:t>
+            </w:r>
+            <w:r>
+              <w:rPr>
+                <w:rFonts w:hint="eastAsia"/>
+                <w:sz w:val="16"/>
+                <w:szCs w:val="18"/>
+                <w:lang w:val="en-CA"/>
+              </w:rPr>
+              <w:t>T</w:t>
+            </w:r>
+            <w:r>
+              <w:rPr>
+                <w:sz w:val="16"/>
+                <w:szCs w:val="18"/>
+                <w:lang w:val="en-CA"/>
+              </w:rPr>
+              <w:t>he longer the delay, the slower/longer interval between each annular sector</w:t>
+            </w:r>
+          </w:p>
+          <w:p>
+            <w:pPr>
+              <w:pStyle w:val="a9"/>
+              <w:numPr>
+                <w:ilvl w:val="0"/>
+                <w:numId w:val="4"/>
+              </w:numPr>
+              <w:rPr>
+                <w:sz w:val="16"/>
+                <w:szCs w:val="18"/>
+                <w:lang w:val="en-CA"/>
+              </w:rPr>
+            </w:pPr>
+            <w:r>
+              <w:rPr>
+                <w:rFonts w:hint="eastAsia"/>
+                <w:sz w:val="16"/>
+                <w:szCs w:val="18"/>
+                <w:lang w:val="en-CA"/>
+              </w:rPr>
+              <w:t>O</w:t>
+            </w:r>
+            <w:r>
+              <w:rPr>
+                <w:sz w:val="16"/>
+                <w:szCs w:val="18"/>
+                <w:lang w:val="en-CA"/>
+              </w:rPr>
+              <w:t xml:space="preserve">n test 3, the behavior should be the same but anti clockwise. </w:t>
+            </w:r>
+            <w:r>
+              <w:rPr>
+                <w:rFonts w:hint="eastAsia"/>
+                <w:sz w:val="16"/>
+                <w:szCs w:val="18"/>
+                <w:lang w:val="en-CA"/>
+              </w:rPr>
+              <w:t>T</w:t>
+            </w:r>
+            <w:r>
+              <w:rPr>
+                <w:sz w:val="16"/>
+                <w:szCs w:val="18"/>
+                <w:lang w:val="en-CA"/>
+              </w:rPr>
+              <w:t>he annular sectors should open anticlockwise fast when the delay slider is set to a small negative value, and they should open slowly when the delay slider is set to a large negative value.</w:t>
+            </w:r>
+          </w:p>
+        </w:tc>
+        <w:tc>
+          <w:tcPr>
+            <w:tcW w:w="2410" w:type="dxa"/>
+          </w:tcPr>
+          <w:p>
+            <w:pPr>
+              <w:rPr>
+                <w:sz w:val="16"/>
+                <w:szCs w:val="18"/>
+                <w:lang w:val="en-CA"/>
+              </w:rPr>
+            </w:pPr>
+            <w:r>
+              <w:rPr>
+                <w:rFonts w:hint="eastAsia"/>
+                <w:sz w:val="16"/>
+                <w:szCs w:val="18"/>
+                <w:lang w:val="en-CA"/>
+              </w:rPr>
+              <w:t>W</w:t>
+            </w:r>
+            <w:r>
+              <w:rPr>
+                <w:sz w:val="16"/>
+                <w:szCs w:val="18"/>
+                <w:lang w:val="en-CA"/>
+              </w:rPr>
+              <w:t xml:space="preserve">orks </w:t>
+            </w:r>
+            <w:r>
+              <w:rPr>
+                <w:sz w:val="16"/>
+                <w:szCs w:val="18"/>
+                <w:lang w:val="en-CA"/>
+              </w:rPr>
+              <w:t>5bddf836872611033759d627746d8b4161bba22a</w:t>
+            </w:r>
+          </w:p>
+        </w:tc>
+      </w:tr>
+      <w:tr>
+        <w:tc>
+          <w:tcPr>
+            <w:tcW w:w="1701" w:type="dxa"/>
+          </w:tcPr>
+          <w:p>
+            <w:pPr>
+              <w:rPr>
+                <w:sz w:val="16"/>
+                <w:szCs w:val="18"/>
+                <w:lang w:val="en-CA"/>
+              </w:rPr>
+            </w:pPr>
+            <w:r>
+              <w:rPr>
+                <w:sz w:val="16"/>
+                <w:szCs w:val="18"/>
+                <w:lang w:val="en-CA"/>
+              </w:rPr>
+              <w:t>TorusMenuEditor.tsx</w:t>
+            </w:r>
+          </w:p>
+        </w:tc>
+        <w:tc>
+          <w:tcPr>
+            <w:tcW w:w="1985" w:type="dxa"/>
+          </w:tcPr>
+          <w:p>
+            <w:pPr>
+              <w:rPr>
+                <w:sz w:val="16"/>
+                <w:szCs w:val="18"/>
+                <w:lang w:val="en-CA"/>
+              </w:rPr>
+            </w:pPr>
+            <w:r>
+              <w:rPr>
+                <w:rFonts w:hint="eastAsia"/>
+                <w:sz w:val="16"/>
+                <w:szCs w:val="18"/>
+                <w:lang w:val="en-CA"/>
+              </w:rPr>
+              <w:t>S</w:t>
+            </w:r>
+            <w:r>
+              <w:rPr>
+                <w:sz w:val="16"/>
+                <w:szCs w:val="18"/>
+                <w:lang w:val="en-CA"/>
+              </w:rPr>
+              <w:t>ettings: components: torus menu editor: graph: save state of ease handles</w:t>
+            </w:r>
+          </w:p>
+        </w:tc>
+        <w:tc>
+          <w:tcPr>
+            <w:tcW w:w="2410" w:type="dxa"/>
+          </w:tcPr>
+          <w:p>
+            <w:pPr>
+              <w:rPr>
+                <w:sz w:val="16"/>
+                <w:szCs w:val="18"/>
+                <w:lang w:val="en-CA"/>
+              </w:rPr>
+            </w:pPr>
+            <w:r>
+              <w:rPr>
+                <w:rFonts w:hint="eastAsia"/>
+                <w:sz w:val="16"/>
+                <w:szCs w:val="18"/>
+                <w:lang w:val="en-CA"/>
+              </w:rPr>
+              <w:t>O</w:t>
+            </w:r>
+            <w:r>
+              <w:rPr>
+                <w:sz w:val="16"/>
+                <w:szCs w:val="18"/>
+                <w:lang w:val="en-CA"/>
+              </w:rPr>
+              <w:t xml:space="preserve">pen the graph in the torus menu editor. </w:t>
+            </w:r>
+            <w:r>
+              <w:rPr>
+                <w:rFonts w:hint="eastAsia"/>
+                <w:sz w:val="16"/>
+                <w:szCs w:val="18"/>
+                <w:lang w:val="en-CA"/>
+              </w:rPr>
+              <w:t>C</w:t>
+            </w:r>
+            <w:r>
+              <w:rPr>
+                <w:sz w:val="16"/>
+                <w:szCs w:val="18"/>
+                <w:lang w:val="en-CA"/>
+              </w:rPr>
+              <w:t xml:space="preserve">hange the ease of some of the points. </w:t>
+            </w:r>
+            <w:r>
+              <w:rPr>
+                <w:rFonts w:hint="eastAsia"/>
+                <w:sz w:val="16"/>
+                <w:szCs w:val="18"/>
+                <w:lang w:val="en-CA"/>
+              </w:rPr>
+              <w:t>C</w:t>
+            </w:r>
+            <w:r>
+              <w:rPr>
+                <w:sz w:val="16"/>
+                <w:szCs w:val="18"/>
+                <w:lang w:val="en-CA"/>
+              </w:rPr>
+              <w:t>lose the torus menu editor and settings. open it again</w:t>
+            </w:r>
+          </w:p>
+        </w:tc>
+        <w:tc>
+          <w:tcPr>
+            <w:tcW w:w="3118" w:type="dxa"/>
+          </w:tcPr>
+          <w:p>
+            <w:pPr>
+              <w:rPr>
+                <w:sz w:val="16"/>
+                <w:szCs w:val="18"/>
+                <w:lang w:val="en-CA"/>
+              </w:rPr>
+            </w:pPr>
+            <w:r>
+              <w:rPr>
+                <w:rFonts w:hint="eastAsia"/>
+                <w:sz w:val="16"/>
+                <w:szCs w:val="18"/>
+                <w:lang w:val="en-CA"/>
+              </w:rPr>
+              <w:t>T</w:t>
+            </w:r>
+            <w:r>
+              <w:rPr>
+                <w:sz w:val="16"/>
+                <w:szCs w:val="18"/>
+                <w:lang w:val="en-CA"/>
+              </w:rPr>
+              <w:t>he ease handle’s position should be saved from last time</w:t>
+            </w:r>
+          </w:p>
+        </w:tc>
+        <w:tc>
+          <w:tcPr>
+            <w:tcW w:w="2410" w:type="dxa"/>
+          </w:tcPr>
+          <w:p>
+            <w:pPr>
+              <w:rPr>
+                <w:sz w:val="16"/>
+                <w:szCs w:val="18"/>
+                <w:lang w:val="en-CA"/>
+              </w:rPr>
+            </w:pPr>
+            <w:r>
+              <w:rPr>
+                <w:rFonts w:hint="eastAsia"/>
+                <w:sz w:val="16"/>
+                <w:szCs w:val="18"/>
+                <w:lang w:val="en-CA"/>
+              </w:rPr>
+              <w:t>N</w:t>
+            </w:r>
+            <w:r>
+              <w:rPr>
+                <w:sz w:val="16"/>
+                <w:szCs w:val="18"/>
+                <w:lang w:val="en-CA"/>
+              </w:rPr>
+              <w:t>ot working</w:t>
+            </w:r>
+          </w:p>
+        </w:tc>
+      </w:tr>
+      <w:tr>
+        <w:tc>
+          <w:tcPr>
+            <w:tcW w:w="1701" w:type="dxa"/>
+          </w:tcPr>
+          <w:p>
+            <w:pPr>
+              <w:rPr>
+                <w:sz w:val="16"/>
+                <w:szCs w:val="18"/>
+                <w:lang w:val="en-CA"/>
+              </w:rPr>
+            </w:pPr>
+            <w:r>
+              <w:rPr>
+                <w:sz w:val="16"/>
+                <w:szCs w:val="18"/>
+                <w:lang w:val="en-CA"/>
+              </w:rPr>
+              <w:lastRenderedPageBreak/>
+              <w:t>TorusMenuEditor.tsx</w:t>
+            </w:r>
+          </w:p>
+        </w:tc>
+        <w:tc>
+          <w:tcPr>
+            <w:tcW w:w="1985" w:type="dxa"/>
+          </w:tcPr>
+          <w:p>
+            <w:pPr>
+              <w:rPr>
+                <w:sz w:val="16"/>
+                <w:szCs w:val="18"/>
+                <w:lang w:val="en-CA"/>
+              </w:rPr>
+            </w:pPr>
+            <w:r>
+              <w:rPr>
+                <w:sz w:val="16"/>
+                <w:szCs w:val="18"/>
+                <w:lang w:val="en-CA"/>
+              </w:rPr>
+              <w:t>Settings: components: torus menu editor: graph: save state of ease handles #2</w:t>
+            </w:r>
+          </w:p>
+        </w:tc>
+        <w:tc>
+          <w:tcPr>
+            <w:tcW w:w="2410" w:type="dxa"/>
+          </w:tcPr>
+          <w:p>
+            <w:pPr>
+              <w:rPr>
+                <w:sz w:val="16"/>
+                <w:szCs w:val="18"/>
+                <w:lang w:val="en-CA"/>
+              </w:rPr>
+            </w:pPr>
+            <w:r>
+              <w:rPr>
+                <w:rFonts w:hint="eastAsia"/>
+                <w:sz w:val="16"/>
+                <w:szCs w:val="18"/>
+                <w:lang w:val="en-CA"/>
+              </w:rPr>
+              <w:t>O</w:t>
+            </w:r>
+            <w:r>
+              <w:rPr>
+                <w:sz w:val="16"/>
+                <w:szCs w:val="18"/>
+                <w:lang w:val="en-CA"/>
+              </w:rPr>
+              <w:t xml:space="preserve">pen the graph of the torus menu editor. </w:t>
+            </w:r>
+            <w:r>
+              <w:rPr>
+                <w:rFonts w:hint="eastAsia"/>
+                <w:sz w:val="16"/>
+                <w:szCs w:val="18"/>
+                <w:lang w:val="en-CA"/>
+              </w:rPr>
+              <w:t>A</w:t>
+            </w:r>
+            <w:r>
+              <w:rPr>
+                <w:sz w:val="16"/>
+                <w:szCs w:val="18"/>
+                <w:lang w:val="en-CA"/>
+              </w:rPr>
+              <w:t xml:space="preserve">dd a bunch of anchor points and adjust all of the ease handles to a non-default or non-linear position. </w:t>
+            </w:r>
+            <w:r>
+              <w:rPr>
+                <w:rFonts w:hint="eastAsia"/>
+                <w:sz w:val="16"/>
+                <w:szCs w:val="18"/>
+                <w:lang w:val="en-CA"/>
+              </w:rPr>
+              <w:t>D</w:t>
+            </w:r>
+            <w:r>
+              <w:rPr>
+                <w:sz w:val="16"/>
+                <w:szCs w:val="18"/>
+                <w:lang w:val="en-CA"/>
+              </w:rPr>
+              <w:t>elete one of the anchor points</w:t>
+            </w:r>
+          </w:p>
+        </w:tc>
+        <w:tc>
+          <w:tcPr>
+            <w:tcW w:w="3118" w:type="dxa"/>
+          </w:tcPr>
+          <w:p>
+            <w:pPr>
+              <w:rPr>
+                <w:sz w:val="16"/>
+                <w:szCs w:val="18"/>
+                <w:lang w:val="en-CA"/>
+              </w:rPr>
+            </w:pPr>
+            <w:r>
+              <w:rPr>
+                <w:rFonts w:hint="eastAsia"/>
+                <w:sz w:val="16"/>
+                <w:szCs w:val="18"/>
+                <w:lang w:val="en-CA"/>
+              </w:rPr>
+              <w:t>A</w:t>
+            </w:r>
+            <w:r>
+              <w:rPr>
+                <w:sz w:val="16"/>
+                <w:szCs w:val="18"/>
+                <w:lang w:val="en-CA"/>
+              </w:rPr>
+              <w:t>ll the ease handles should stay in the same position</w:t>
+            </w:r>
+          </w:p>
+        </w:tc>
+        <w:tc>
+          <w:tcPr>
+            <w:tcW w:w="2410" w:type="dxa"/>
+          </w:tcPr>
+          <w:p>
+            <w:pPr>
+              <w:rPr>
+                <w:sz w:val="16"/>
+                <w:szCs w:val="18"/>
+                <w:lang w:val="en-CA"/>
+              </w:rPr>
+            </w:pPr>
+            <w:r>
+              <w:rPr>
+                <w:rFonts w:hint="eastAsia"/>
+                <w:sz w:val="16"/>
+                <w:szCs w:val="18"/>
+                <w:lang w:val="en-CA"/>
+              </w:rPr>
+              <w:t>N</w:t>
+            </w:r>
+            <w:r>
+              <w:rPr>
+                <w:sz w:val="16"/>
+                <w:szCs w:val="18"/>
+                <w:lang w:val="en-CA"/>
+              </w:rPr>
+              <w:t>ot working</w:t>
+            </w:r>
+          </w:p>
+        </w:tc>
+      </w:tr>
+    </w:tbl>
+    <w:p>
+      <w:pPr>
+        <w:rPr>
+          <w:sz w:val="16"/>
+          <w:szCs w:val="18"/>
+          <w:lang w:val="en-CA"/>
+        </w:rPr>
+      </w:pPr>
+    </w:p>
+    <w:p>
+      <w:pPr>
+        <w:jc w:val="center"/>
+        <w:rPr>
+          <w:b/>
+          <w:bCs/>
+          <w:sz w:val="28"/>
+          <w:szCs w:val="32"/>
+          <w:lang w:val="en-CA"/>
+        </w:rPr>
+      </w:pPr>
+      <w:r>
+        <w:rPr>
+          <w:b/>
+          <w:bCs/>
+          <w:sz w:val="28"/>
+          <w:szCs w:val="32"/>
+          <w:lang w:val="en-CA"/>
+        </w:rPr>
+        <w:t>ColorPicker</w:t>
+      </w:r>
+      <w:r>
+        <w:rPr>
+          <w:b/>
+          <w:bCs/>
+          <w:sz w:val="28"/>
+          <w:szCs w:val="32"/>
+          <w:lang w:val="en-CA"/>
+        </w:rPr>
+        <w:t>.tsx</w:t>
+      </w:r>
+    </w:p>
+    <w:tbl>
+      <w:tblPr>
+        <w:tblStyle w:val="ae"/>
+        <w:tblW w:w="11624" w:type="dxa"/>
+        <w:tblInd w:w="-1706" w:type="dxa"/>
+        <w:tblLayout w:type="fixed"/>
+        <w:tblLook w:val="04A0" w:firstRow="1" w:lastRow="0" w:firstColumn="1" w:lastColumn="0" w:noHBand="0" w:noVBand="1"/>
+      </w:tblPr>
+      <w:tblGrid>
+        <w:gridCol w:w="1843"/>
+        <w:gridCol w:w="1843"/>
+        <w:gridCol w:w="2410"/>
+        <w:gridCol w:w="3118"/>
+        <w:gridCol w:w="2410"/>
+      </w:tblGrid>
+      <w:tr>
+        <w:tc>
+          <w:tcPr>
+            <w:tcW w:w="1843" w:type="dxa"/>
+          </w:tcPr>
+          <w:p>
+            <w:pPr>
+              <w:rPr>
+                <w:sz w:val="16"/>
+                <w:szCs w:val="18"/>
+              </w:rPr>
+            </w:pPr>
+            <w:r>
+              <w:rPr>
+                <w:sz w:val="16"/>
+                <w:szCs w:val="18"/>
+              </w:rPr>
+              <w:t>Relevant f</w:t>
+            </w:r>
+            <w:r>
+              <w:rPr>
+                <w:rFonts w:hint="eastAsia"/>
+                <w:sz w:val="16"/>
+                <w:szCs w:val="18"/>
+              </w:rPr>
+              <w:t>ile</w:t>
+            </w:r>
+            <w:r>
+              <w:rPr>
+                <w:sz w:val="16"/>
+                <w:szCs w:val="18"/>
+              </w:rPr>
+              <w:t>(s)</w:t>
+            </w:r>
+          </w:p>
+        </w:tc>
+        <w:tc>
+          <w:tcPr>
+            <w:tcW w:w="1843" w:type="dxa"/>
+          </w:tcPr>
+          <w:p>
+            <w:pPr>
+              <w:rPr>
+                <w:sz w:val="16"/>
+                <w:szCs w:val="18"/>
+                <w:lang w:val="en-CA"/>
+              </w:rPr>
+            </w:pPr>
+            <w:r>
+              <w:rPr>
+                <w:rFonts w:hint="eastAsia"/>
+                <w:sz w:val="16"/>
+                <w:szCs w:val="18"/>
+              </w:rPr>
+              <w:t>C</w:t>
+            </w:r>
+            <w:r>
+              <w:rPr>
+                <w:sz w:val="16"/>
+                <w:szCs w:val="18"/>
+              </w:rPr>
+              <w:t>omponent</w:t>
+            </w:r>
+          </w:p>
+        </w:tc>
+        <w:tc>
+          <w:tcPr>
+            <w:tcW w:w="2410" w:type="dxa"/>
+          </w:tcPr>
+          <w:p>
+            <w:pPr>
+              <w:rPr>
+                <w:sz w:val="16"/>
+                <w:szCs w:val="18"/>
+                <w:lang w:val="en-CA"/>
+              </w:rPr>
+            </w:pPr>
+            <w:r>
+              <w:rPr>
+                <w:rFonts w:hint="eastAsia"/>
+                <w:sz w:val="16"/>
+                <w:szCs w:val="18"/>
+                <w:lang w:val="en-CA"/>
+              </w:rPr>
+              <w:t>H</w:t>
+            </w:r>
+            <w:r>
+              <w:rPr>
+                <w:sz w:val="16"/>
+                <w:szCs w:val="18"/>
+                <w:lang w:val="en-CA"/>
+              </w:rPr>
+              <w:t>ow to test</w:t>
+            </w:r>
+          </w:p>
+        </w:tc>
+        <w:tc>
+          <w:tcPr>
+            <w:tcW w:w="3118" w:type="dxa"/>
+          </w:tcPr>
+          <w:p>
+            <w:pPr>
+              <w:rPr>
+                <w:sz w:val="16"/>
+                <w:szCs w:val="18"/>
+                <w:lang w:val="en-CA"/>
+              </w:rPr>
+            </w:pPr>
+            <w:r>
+              <w:rPr>
+                <w:rFonts w:hint="eastAsia"/>
+                <w:sz w:val="16"/>
+                <w:szCs w:val="18"/>
+                <w:lang w:val="en-CA"/>
+              </w:rPr>
+              <w:t>E</w:t>
+            </w:r>
+            <w:r>
+              <w:rPr>
+                <w:sz w:val="16"/>
+                <w:szCs w:val="18"/>
+                <w:lang w:val="en-CA"/>
+              </w:rPr>
+              <w:t>xpected outcome</w:t>
+            </w:r>
+          </w:p>
+        </w:tc>
+        <w:tc>
+          <w:tcPr>
+            <w:tcW w:w="2410" w:type="dxa"/>
+          </w:tcPr>
+          <w:p>
+            <w:pPr>
+              <w:rPr>
+                <w:sz w:val="16"/>
+                <w:szCs w:val="18"/>
+                <w:lang w:val="en-CA"/>
+              </w:rPr>
+            </w:pPr>
+            <w:r>
+              <w:rPr>
+                <w:rFonts w:hint="eastAsia"/>
+                <w:sz w:val="16"/>
+                <w:szCs w:val="18"/>
+                <w:lang w:val="en-CA"/>
+              </w:rPr>
+              <w:t>T</w:t>
+            </w:r>
+            <w:r>
+              <w:rPr>
+                <w:sz w:val="16"/>
+                <w:szCs w:val="18"/>
+                <w:lang w:val="en-CA"/>
+              </w:rPr>
+              <w:t>ested on (commit) and notes</w:t>
+            </w:r>
+          </w:p>
+        </w:tc>
+      </w:tr>
+      <w:tr>
+        <w:tc>
+          <w:tcPr>
+            <w:tcW w:w="1843" w:type="dxa"/>
+          </w:tcPr>
+          <w:p>
+            <w:pPr>
+              <w:rPr>
+                <w:sz w:val="16"/>
+                <w:szCs w:val="18"/>
+                <w:lang w:val="en-CA"/>
+              </w:rPr>
+            </w:pPr>
+            <w:r>
+              <w:rPr>
+                <w:sz w:val="16"/>
+                <w:szCs w:val="18"/>
+                <w:lang w:val="en-CA"/>
+              </w:rPr>
+              <w:t>ColorPicker.tsx, Styles.tsx, App.tsx</w:t>
+            </w:r>
+          </w:p>
+        </w:tc>
+        <w:tc>
+          <w:tcPr>
+            <w:tcW w:w="1843" w:type="dxa"/>
+          </w:tcPr>
+          <w:p>
+            <w:pPr>
+              <w:rPr>
+                <w:sz w:val="16"/>
+                <w:szCs w:val="18"/>
+                <w:lang w:val="en-CA"/>
+              </w:rPr>
+            </w:pPr>
+            <w:r>
+              <w:rPr>
+                <w:rFonts w:hint="eastAsia"/>
+                <w:sz w:val="16"/>
+                <w:szCs w:val="18"/>
+                <w:lang w:val="en-CA"/>
+              </w:rPr>
+              <w:t>S</w:t>
+            </w:r>
+            <w:r>
+              <w:rPr>
+                <w:sz w:val="16"/>
+                <w:szCs w:val="18"/>
+                <w:lang w:val="en-CA"/>
+              </w:rPr>
+              <w:t xml:space="preserve">tyles: color picker: live color updating test </w:t>
+            </w:r>
+          </w:p>
+        </w:tc>
+        <w:tc>
+          <w:tcPr>
+            <w:tcW w:w="2410" w:type="dxa"/>
+          </w:tcPr>
+          <w:p>
+            <w:pPr>
+              <w:rPr>
+                <w:sz w:val="16"/>
+                <w:szCs w:val="18"/>
+                <w:lang w:val="en-CA"/>
+              </w:rPr>
+            </w:pPr>
+            <w:r>
+              <w:rPr>
+                <w:rFonts w:hint="eastAsia"/>
+                <w:sz w:val="16"/>
+                <w:szCs w:val="18"/>
+                <w:lang w:val="en-CA"/>
+              </w:rPr>
+              <w:t>F</w:t>
+            </w:r>
+            <w:r>
+              <w:rPr>
+                <w:sz w:val="16"/>
+                <w:szCs w:val="18"/>
+                <w:lang w:val="en-CA"/>
+              </w:rPr>
+              <w:t>or any color, click on the color rectangle in the styles page and start dragging around the color picker in the color wheel</w:t>
+            </w:r>
+          </w:p>
+        </w:tc>
+        <w:tc>
+          <w:tcPr>
+            <w:tcW w:w="3118" w:type="dxa"/>
+          </w:tcPr>
+          <w:p>
+            <w:pPr>
+              <w:rPr>
+                <w:sz w:val="16"/>
+                <w:szCs w:val="18"/>
+                <w:lang w:val="en-CA"/>
+              </w:rPr>
+            </w:pPr>
+            <w:r>
+              <w:rPr>
+                <w:rFonts w:hint="eastAsia"/>
+                <w:sz w:val="16"/>
+                <w:szCs w:val="18"/>
+                <w:lang w:val="en-CA"/>
+              </w:rPr>
+              <w:t>T</w:t>
+            </w:r>
+            <w:r>
+              <w:rPr>
+                <w:sz w:val="16"/>
+                <w:szCs w:val="18"/>
+                <w:lang w:val="en-CA"/>
+              </w:rPr>
+              <w:t xml:space="preserve">he color should update in real time in the editor. </w:t>
+            </w:r>
+            <w:r>
+              <w:rPr>
+                <w:rFonts w:hint="eastAsia"/>
+                <w:sz w:val="16"/>
+                <w:szCs w:val="18"/>
+                <w:lang w:val="en-CA"/>
+              </w:rPr>
+              <w:t>E</w:t>
+            </w:r>
+            <w:r>
+              <w:rPr>
+                <w:sz w:val="16"/>
+                <w:szCs w:val="18"/>
+                <w:lang w:val="en-CA"/>
+              </w:rPr>
+              <w:t>very element using that color should change instantaneously with no lag</w:t>
+            </w:r>
+          </w:p>
+        </w:tc>
+        <w:tc>
+          <w:tcPr>
+            <w:tcW w:w="2410" w:type="dxa"/>
+          </w:tcPr>
+          <w:p>
+            <w:pPr>
+              <w:rPr>
+                <w:sz w:val="16"/>
+                <w:szCs w:val="18"/>
+                <w:lang w:val="en-CA"/>
+              </w:rPr>
+            </w:pPr>
+            <w:r>
+              <w:rPr>
+                <w:rFonts w:hint="eastAsia"/>
+                <w:sz w:val="16"/>
+                <w:szCs w:val="18"/>
+                <w:lang w:val="en-CA"/>
+              </w:rPr>
+              <w:t>P</w:t>
+            </w:r>
+            <w:r>
+              <w:rPr>
+                <w:sz w:val="16"/>
+                <w:szCs w:val="18"/>
+                <w:lang w:val="en-CA"/>
+              </w:rPr>
+              <w:t xml:space="preserve">artially working as of </w:t>
+            </w:r>
+            <w:r>
+              <w:rPr>
+                <w:sz w:val="16"/>
+                <w:szCs w:val="18"/>
+                <w:lang w:val="en-CA"/>
+              </w:rPr>
+              <w:t>5bddf836872611033759d627746d8b4161bba22a</w:t>
+            </w:r>
+            <w:r>
+              <w:rPr>
+                <w:sz w:val="16"/>
+                <w:szCs w:val="18"/>
+                <w:lang w:val="en-CA"/>
+              </w:rPr>
+              <w:t>.</w:t>
+            </w:r>
+          </w:p>
+          <w:p>
+            <w:pPr>
+              <w:rPr>
+                <w:rFonts w:hint="eastAsia"/>
+                <w:sz w:val="16"/>
+                <w:szCs w:val="18"/>
+                <w:lang w:val="en-CA"/>
+              </w:rPr>
+            </w:pPr>
+            <w:r>
+              <w:rPr>
+                <w:rFonts w:hint="eastAsia"/>
+                <w:sz w:val="16"/>
+                <w:szCs w:val="18"/>
+                <w:lang w:val="en-CA"/>
+              </w:rPr>
+              <w:t>C</w:t>
+            </w:r>
+            <w:r>
+              <w:rPr>
+                <w:sz w:val="16"/>
+                <w:szCs w:val="18"/>
+                <w:lang w:val="en-CA"/>
+              </w:rPr>
+              <w:t xml:space="preserve">olors are being updated, however the “color change transition duration” in milliseconds affects the lag of the real time color change. </w:t>
+            </w:r>
+            <w:r>
+              <w:rPr>
+                <w:rFonts w:hint="eastAsia"/>
+                <w:sz w:val="16"/>
+                <w:szCs w:val="18"/>
+                <w:lang w:val="en-CA"/>
+              </w:rPr>
+              <w:t>I</w:t>
+            </w:r>
+            <w:r>
+              <w:rPr>
+                <w:sz w:val="16"/>
+                <w:szCs w:val="18"/>
+                <w:lang w:val="en-CA"/>
+              </w:rPr>
+              <w:t xml:space="preserve">t like waits 500ms then changes. </w:t>
+            </w:r>
+            <w:r>
+              <w:rPr>
+                <w:rFonts w:hint="eastAsia"/>
+                <w:sz w:val="16"/>
+                <w:szCs w:val="18"/>
+                <w:lang w:val="en-CA"/>
+              </w:rPr>
+              <w:t>T</w:t>
+            </w:r>
+            <w:r>
+              <w:rPr>
+                <w:sz w:val="16"/>
+                <w:szCs w:val="18"/>
+                <w:lang w:val="en-CA"/>
+              </w:rPr>
+              <w:t xml:space="preserve">hat’s wrong. </w:t>
+            </w:r>
+            <w:r>
+              <w:rPr>
+                <w:rFonts w:hint="eastAsia"/>
+                <w:sz w:val="16"/>
+                <w:szCs w:val="18"/>
+                <w:lang w:val="en-CA"/>
+              </w:rPr>
+              <w:t>I</w:t>
+            </w:r>
+            <w:r>
+              <w:rPr>
+                <w:sz w:val="16"/>
+                <w:szCs w:val="18"/>
+                <w:lang w:val="en-CA"/>
+              </w:rPr>
+              <w:t xml:space="preserve">t should update in real time. </w:t>
+            </w:r>
+            <w:r>
+              <w:rPr>
+                <w:rFonts w:hint="eastAsia"/>
+                <w:sz w:val="16"/>
+                <w:szCs w:val="18"/>
+                <w:lang w:val="en-CA"/>
+              </w:rPr>
+              <w:t>I</w:t>
+            </w:r>
+            <w:r>
+              <w:rPr>
+                <w:sz w:val="16"/>
+                <w:szCs w:val="18"/>
+                <w:lang w:val="en-CA"/>
+              </w:rPr>
+              <w:t>t should only smoothly transition for 500ms when changing color themes by clicking on themes in the styles page.</w:t>
+            </w:r>
+          </w:p>
+        </w:tc>
+      </w:tr>
+      <w:tr>
+        <w:tc>
+          <w:tcPr>
+            <w:tcW w:w="1843" w:type="dxa"/>
+          </w:tcPr>
+          <w:p>
+            <w:pPr>
+              <w:rPr>
+                <w:sz w:val="16"/>
+                <w:szCs w:val="18"/>
+                <w:lang w:val="en-CA"/>
+              </w:rPr>
+            </w:pPr>
+            <w:r>
+              <w:rPr>
+                <w:sz w:val="16"/>
+                <w:szCs w:val="18"/>
+                <w:lang w:val="en-CA"/>
+              </w:rPr>
+              <w:t>Styles.tsx, App.tsx</w:t>
+            </w:r>
+          </w:p>
+        </w:tc>
+        <w:tc>
+          <w:tcPr>
+            <w:tcW w:w="1843" w:type="dxa"/>
+          </w:tcPr>
+          <w:p>
+            <w:pPr>
+              <w:rPr>
+                <w:sz w:val="16"/>
+                <w:szCs w:val="18"/>
+                <w:lang w:val="en-CA"/>
+              </w:rPr>
+            </w:pPr>
+            <w:r>
+              <w:rPr>
+                <w:rFonts w:hint="eastAsia"/>
+                <w:sz w:val="16"/>
+                <w:szCs w:val="18"/>
+                <w:lang w:val="en-CA"/>
+              </w:rPr>
+              <w:t>S</w:t>
+            </w:r>
+            <w:r>
+              <w:rPr>
+                <w:sz w:val="16"/>
+                <w:szCs w:val="18"/>
+                <w:lang w:val="en-CA"/>
+              </w:rPr>
+              <w:t>tyles: specific theme: reset button</w:t>
+            </w:r>
+          </w:p>
+        </w:tc>
+        <w:tc>
+          <w:tcPr>
+            <w:tcW w:w="2410" w:type="dxa"/>
+          </w:tcPr>
+          <w:p>
+            <w:pPr>
+              <w:pStyle w:val="a9"/>
+              <w:numPr>
+                <w:ilvl w:val="0"/>
+                <w:numId w:val="5"/>
+              </w:numPr>
+              <w:rPr>
+                <w:sz w:val="16"/>
+                <w:szCs w:val="18"/>
+                <w:lang w:val="en-CA"/>
+              </w:rPr>
+            </w:pPr>
+            <w:r>
+              <w:rPr>
+                <w:rFonts w:hint="eastAsia"/>
+                <w:sz w:val="16"/>
+                <w:szCs w:val="18"/>
+                <w:lang w:val="en-CA"/>
+              </w:rPr>
+              <w:t>O</w:t>
+            </w:r>
+            <w:r>
+              <w:rPr>
+                <w:sz w:val="16"/>
+                <w:szCs w:val="18"/>
+                <w:lang w:val="en-CA"/>
+              </w:rPr>
+              <w:t>pen a theme and change its color</w:t>
+            </w:r>
+          </w:p>
+          <w:p>
+            <w:pPr>
+              <w:pStyle w:val="a9"/>
+              <w:numPr>
+                <w:ilvl w:val="0"/>
+                <w:numId w:val="5"/>
+              </w:numPr>
+              <w:rPr>
+                <w:sz w:val="16"/>
+                <w:szCs w:val="18"/>
+                <w:lang w:val="en-CA"/>
+              </w:rPr>
+            </w:pPr>
+            <w:r>
+              <w:rPr>
+                <w:rFonts w:hint="eastAsia"/>
+                <w:sz w:val="16"/>
+                <w:szCs w:val="18"/>
+                <w:lang w:val="en-CA"/>
+              </w:rPr>
+              <w:t>C</w:t>
+            </w:r>
+            <w:r>
+              <w:rPr>
+                <w:sz w:val="16"/>
+                <w:szCs w:val="18"/>
+                <w:lang w:val="en-CA"/>
+              </w:rPr>
+              <w:t>lick on the reset button</w:t>
+            </w:r>
+          </w:p>
+        </w:tc>
+        <w:tc>
+          <w:tcPr>
+            <w:tcW w:w="3118" w:type="dxa"/>
+          </w:tcPr>
+          <w:p>
+            <w:pPr>
+              <w:pStyle w:val="a9"/>
+              <w:numPr>
+                <w:ilvl w:val="0"/>
+                <w:numId w:val="6"/>
+              </w:numPr>
+              <w:rPr>
+                <w:sz w:val="16"/>
+                <w:szCs w:val="18"/>
+                <w:lang w:val="en-CA"/>
+              </w:rPr>
+            </w:pPr>
+            <w:r>
+              <w:rPr>
+                <w:rFonts w:hint="eastAsia"/>
+                <w:sz w:val="16"/>
+                <w:szCs w:val="18"/>
+                <w:lang w:val="en-CA"/>
+              </w:rPr>
+              <w:t>T</w:t>
+            </w:r>
+            <w:r>
+              <w:rPr>
+                <w:sz w:val="16"/>
+                <w:szCs w:val="18"/>
+                <w:lang w:val="en-CA"/>
+              </w:rPr>
+              <w:t>he first test should create a new reset button next to the color rectangle</w:t>
+            </w:r>
+          </w:p>
+          <w:p>
+            <w:pPr>
+              <w:pStyle w:val="a9"/>
+              <w:numPr>
+                <w:ilvl w:val="0"/>
+                <w:numId w:val="6"/>
+              </w:numPr>
+              <w:rPr>
+                <w:sz w:val="16"/>
+                <w:szCs w:val="18"/>
+                <w:lang w:val="en-CA"/>
+              </w:rPr>
+            </w:pPr>
+            <w:r>
+              <w:rPr>
+                <w:rFonts w:hint="eastAsia"/>
+                <w:sz w:val="16"/>
+                <w:szCs w:val="18"/>
+                <w:lang w:val="en-CA"/>
+              </w:rPr>
+              <w:t>T</w:t>
+            </w:r>
+            <w:r>
+              <w:rPr>
+                <w:sz w:val="16"/>
+                <w:szCs w:val="18"/>
+                <w:lang w:val="en-CA"/>
+              </w:rPr>
+              <w:t>he second test should reset the color back to the theme’s default color.</w:t>
+            </w:r>
+          </w:p>
+        </w:tc>
+        <w:tc>
+          <w:tcPr>
+            <w:tcW w:w="2410" w:type="dxa"/>
+          </w:tcPr>
+          <w:p>
+            <w:pPr>
+              <w:rPr>
+                <w:sz w:val="16"/>
+                <w:szCs w:val="18"/>
+                <w:lang w:val="en-CA"/>
+              </w:rPr>
+            </w:pPr>
+            <w:r>
+              <w:rPr>
+                <w:rFonts w:hint="eastAsia"/>
+                <w:sz w:val="16"/>
+                <w:szCs w:val="18"/>
+                <w:lang w:val="en-CA"/>
+              </w:rPr>
+              <w:t>W</w:t>
+            </w:r>
+            <w:r>
+              <w:rPr>
+                <w:sz w:val="16"/>
+                <w:szCs w:val="18"/>
+                <w:lang w:val="en-CA"/>
+              </w:rPr>
+              <w:t xml:space="preserve">orks </w:t>
+            </w:r>
+            <w:r>
+              <w:rPr>
+                <w:sz w:val="16"/>
+                <w:szCs w:val="18"/>
+                <w:lang w:val="en-CA"/>
+              </w:rPr>
+              <w:t>5bddf836872611033759d627746d8b4161bba22a</w:t>
+            </w:r>
           </w:p>
         </w:tc>
       </w:tr>
@@ -2735,6 +5237,95 @@
 <file path=word/numbering.xml><?xml version="1.0" encoding="utf-8"?>
 <w:numbering xmlns:wpc="http://schemas.microsoft.com/office/word/2010/wordprocessingCanvas" xmlns:cx="http://schemas.microsoft.com/office/drawing/2014/chartex" xmlns:cx1="http://schemas.microsoft.com/office/drawing/2015/9/8/chartex" xmlns:cx2="http://schemas.microsoft.com/office/drawing/2015/10/21/chartex" xmlns:cx3="http://schemas.microsoft.com/office/drawing/2016/5/9/chartex" xmlns:cx4="http://schemas.microsoft.com/office/drawing/2016/5/10/chartex" xmlns:cx5="http://schemas.microsoft.com/office/drawing/2016/5/11/chartex" xmlns:cx6="http://schemas.microsoft.com/office/drawing/2016/5/12/chartex" xmlns:cx7="http://schemas.microsoft.com/office/drawing/2016/5/13/chartex" xmlns:cx8="http://schemas.microsoft.com/office/drawing/2016/5/14/chartex" xmlns:mc="http://schemas.openxmlformats.org/markup-compatibility/2006" xmlns:aink="http://schemas.microsoft.com/office/drawing/2016/ink" xmlns:am3d="http://schemas.microsoft.com/office/drawing/2017/model3d" xmlns:o="urn:schemas-microsoft-com:office:office" xmlns:oel="http://schemas.microsoft.com/office/2019/extlst" xmlns:r="http://schemas.openxmlformats.org/officeDocument/2006/relationships" xmlns:m="http://schemas.openxmlformats.org/officeDocument/2006/math" xmlns:v="urn:schemas-microsoft-com:vml" xmlns:wp14="http://schemas.microsoft.com/office/word/2010/wordprocessingDrawing" xmlns:wp="http://schemas.openxmlformats.org/drawingml/2006/wordprocessingDrawing" xmlns:w10="urn:schemas-microsoft-com:office:word" xmlns:w="http://schemas.openxmlformats.org/wordprocessingml/2006/main" xmlns:w14="http://schemas.microsoft.com/office/word/2010/wordml" xmlns:w15="http://schemas.microsoft.com/office/word/2012/wordml" xmlns:w16cex="http://schemas.microsoft.com/office/word/2018/wordml/cex" xmlns:w16cid="http://schemas.microsoft.com/office/word/2016/wordml/cid" xmlns:w16="http://schemas.microsoft.com/office/word/2018/wordml" xmlns:w16du="http://schemas.microsoft.com/office/word/2023/wordml/word16du" xmlns:w16sdtdh="http://schemas.microsoft.com/office/word/2020/wordml/sdtdatahash" xmlns:w16sdtfl="http://schemas.microsoft.com/office/word/2024/wordml/sdtformatlock" xmlns:w16se="http://schemas.microsoft.com/office/word/2015/wordml/symex" xmlns:wpg="http://schemas.microsoft.com/office/word/2010/wordprocessingGroup" xmlns:wpi="http://schemas.microsoft.com/office/word/2010/wordprocessingInk" xmlns:wne="http://schemas.microsoft.com/office/word/2006/wordml" xmlns:wps="http://schemas.microsoft.com/office/word/2010/wordprocessingShape" mc:Ignorable="w14 w15 w16se w16cid w16 w16cex w16sdtdh w16sdtfl w16du wp14">
   <w:abstractNum w:abstractNumId="0" w15:restartNumberingAfterBreak="0">
+    <w:nsid w:val="207E3F40"/>
+    <w:multiLevelType w:val="hybridMultilevel"/>
+    <w:tmpl w:val="CA8AADC6"/>
+    <w:lvl w:ilvl="0" w:tplc="2B445E0E">
+      <w:start w:val="1"/>
+      <w:numFmt w:val="decimal"/>
+      <w:lvlText w:val="%1."/>
+      <w:lvlJc w:val="left"/>
+      <w:pPr>
+        <w:ind w:left="360" w:hanging="360"/>
+      </w:pPr>
+      <w:rPr>
+        <w:rFonts w:hint="default"/>
+      </w:rPr>
+    </w:lvl>
+    <w:lvl w:ilvl="1" w:tplc="04090019" w:tentative="1">
+      <w:start w:val="1"/>
+      <w:numFmt w:val="lowerLetter"/>
+      <w:lvlText w:val="%2)"/>
+      <w:lvlJc w:val="left"/>
+      <w:pPr>
+        <w:ind w:left="880" w:hanging="440"/>
+      </w:pPr>
+    </w:lvl>
+    <w:lvl w:ilvl="2" w:tplc="0409001B" w:tentative="1">
+      <w:start w:val="1"/>
+      <w:numFmt w:val="lowerRoman"/>
+      <w:lvlText w:val="%3."/>
+      <w:lvlJc w:val="right"/>
+      <w:pPr>
+        <w:ind w:left="1320" w:hanging="440"/>
+      </w:pPr>
+    </w:lvl>
+    <w:lvl w:ilvl="3" w:tplc="0409000F" w:tentative="1">
+      <w:start w:val="1"/>
+      <w:numFmt w:val="decimal"/>
+      <w:lvlText w:val="%4."/>
+      <w:lvlJc w:val="left"/>
+      <w:pPr>
+        <w:ind w:left="1760" w:hanging="440"/>
+      </w:pPr>
+    </w:lvl>
+    <w:lvl w:ilvl="4" w:tplc="04090019" w:tentative="1">
+      <w:start w:val="1"/>
+      <w:numFmt w:val="lowerLetter"/>
+      <w:lvlText w:val="%5)"/>
+      <w:lvlJc w:val="left"/>
+      <w:pPr>
+        <w:ind w:left="2200" w:hanging="440"/>
+      </w:pPr>
+    </w:lvl>
+    <w:lvl w:ilvl="5" w:tplc="0409001B" w:tentative="1">
+      <w:start w:val="1"/>
+      <w:numFmt w:val="lowerRoman"/>
+      <w:lvlText w:val="%6."/>
+      <w:lvlJc w:val="right"/>
+      <w:pPr>
+        <w:ind w:left="2640" w:hanging="440"/>
+      </w:pPr>
+    </w:lvl>
+    <w:lvl w:ilvl="6" w:tplc="0409000F" w:tentative="1">
+      <w:start w:val="1"/>
+      <w:numFmt w:val="decimal"/>
+      <w:lvlText w:val="%7."/>
+      <w:lvlJc w:val="left"/>
+      <w:pPr>
+        <w:ind w:left="3080" w:hanging="440"/>
+      </w:pPr>
+    </w:lvl>
+    <w:lvl w:ilvl="7" w:tplc="04090019" w:tentative="1">
+      <w:start w:val="1"/>
+      <w:numFmt w:val="lowerLetter"/>
+      <w:lvlText w:val="%8)"/>
+      <w:lvlJc w:val="left"/>
+      <w:pPr>
+        <w:ind w:left="3520" w:hanging="440"/>
+      </w:pPr>
+    </w:lvl>
+    <w:lvl w:ilvl="8" w:tplc="0409001B" w:tentative="1">
+      <w:start w:val="1"/>
+      <w:numFmt w:val="lowerRoman"/>
+      <w:lvlText w:val="%9."/>
+      <w:lvlJc w:val="right"/>
+      <w:pPr>
+        <w:ind w:left="3960" w:hanging="440"/>
+      </w:pPr>
+    </w:lvl>
+  </w:abstractNum>
+  <w:abstractNum w:abstractNumId="1" w15:restartNumberingAfterBreak="0">
     <w:nsid w:val="214D3E39"/>
     <w:multiLevelType w:val="hybridMultilevel"/>
     <w:tmpl w:val="AD18E822"/>
@@ -2823,7 +5414,96 @@
       </w:pPr>
     </w:lvl>
   </w:abstractNum>
-  <w:abstractNum w:abstractNumId="1" w15:restartNumberingAfterBreak="0">
+  <w:abstractNum w:abstractNumId="2" w15:restartNumberingAfterBreak="0">
+    <w:nsid w:val="3E1455D0"/>
+    <w:multiLevelType w:val="hybridMultilevel"/>
+    <w:tmpl w:val="272E9B46"/>
+    <w:lvl w:ilvl="0" w:tplc="F35E102E">
+      <w:start w:val="1"/>
+      <w:numFmt w:val="decimal"/>
+      <w:lvlText w:val="%1."/>
+      <w:lvlJc w:val="left"/>
+      <w:pPr>
+        <w:ind w:left="360" w:hanging="360"/>
+      </w:pPr>
+      <w:rPr>
+        <w:rFonts w:hint="default"/>
+      </w:rPr>
+    </w:lvl>
+    <w:lvl w:ilvl="1" w:tplc="04090019" w:tentative="1">
+      <w:start w:val="1"/>
+      <w:numFmt w:val="lowerLetter"/>
+      <w:lvlText w:val="%2)"/>
+      <w:lvlJc w:val="left"/>
+      <w:pPr>
+        <w:ind w:left="880" w:hanging="440"/>
+      </w:pPr>
+    </w:lvl>
+    <w:lvl w:ilvl="2" w:tplc="0409001B" w:tentative="1">
+      <w:start w:val="1"/>
+      <w:numFmt w:val="lowerRoman"/>
+      <w:lvlText w:val="%3."/>
+      <w:lvlJc w:val="right"/>
+      <w:pPr>
+        <w:ind w:left="1320" w:hanging="440"/>
+      </w:pPr>
+    </w:lvl>
+    <w:lvl w:ilvl="3" w:tplc="0409000F" w:tentative="1">
+      <w:start w:val="1"/>
+      <w:numFmt w:val="decimal"/>
+      <w:lvlText w:val="%4."/>
+      <w:lvlJc w:val="left"/>
+      <w:pPr>
+        <w:ind w:left="1760" w:hanging="440"/>
+      </w:pPr>
+    </w:lvl>
+    <w:lvl w:ilvl="4" w:tplc="04090019" w:tentative="1">
+      <w:start w:val="1"/>
+      <w:numFmt w:val="lowerLetter"/>
+      <w:lvlText w:val="%5)"/>
+      <w:lvlJc w:val="left"/>
+      <w:pPr>
+        <w:ind w:left="2200" w:hanging="440"/>
+      </w:pPr>
+    </w:lvl>
+    <w:lvl w:ilvl="5" w:tplc="0409001B" w:tentative="1">
+      <w:start w:val="1"/>
+      <w:numFmt w:val="lowerRoman"/>
+      <w:lvlText w:val="%6."/>
+      <w:lvlJc w:val="right"/>
+      <w:pPr>
+        <w:ind w:left="2640" w:hanging="440"/>
+      </w:pPr>
+    </w:lvl>
+    <w:lvl w:ilvl="6" w:tplc="0409000F" w:tentative="1">
+      <w:start w:val="1"/>
+      <w:numFmt w:val="decimal"/>
+      <w:lvlText w:val="%7."/>
+      <w:lvlJc w:val="left"/>
+      <w:pPr>
+        <w:ind w:left="3080" w:hanging="440"/>
+      </w:pPr>
+    </w:lvl>
+    <w:lvl w:ilvl="7" w:tplc="04090019" w:tentative="1">
+      <w:start w:val="1"/>
+      <w:numFmt w:val="lowerLetter"/>
+      <w:lvlText w:val="%8)"/>
+      <w:lvlJc w:val="left"/>
+      <w:pPr>
+        <w:ind w:left="3520" w:hanging="440"/>
+      </w:pPr>
+    </w:lvl>
+    <w:lvl w:ilvl="8" w:tplc="0409001B" w:tentative="1">
+      <w:start w:val="1"/>
+      <w:numFmt w:val="lowerRoman"/>
+      <w:lvlText w:val="%9."/>
+      <w:lvlJc w:val="right"/>
+      <w:pPr>
+        <w:ind w:left="3960" w:hanging="440"/>
+      </w:pPr>
+    </w:lvl>
+  </w:abstractNum>
+  <w:abstractNum w:abstractNumId="3" w15:restartNumberingAfterBreak="0">
     <w:nsid w:val="4A3C246F"/>
     <w:multiLevelType w:val="hybridMultilevel"/>
     <w:tmpl w:val="580ADD3E"/>
@@ -2912,10 +5592,200 @@
       </w:pPr>
     </w:lvl>
   </w:abstractNum>
+  <w:abstractNum w:abstractNumId="4" w15:restartNumberingAfterBreak="0">
+    <w:nsid w:val="625C3C36"/>
+    <w:multiLevelType w:val="hybridMultilevel"/>
+    <w:tmpl w:val="AF62CBC8"/>
+    <w:lvl w:ilvl="0" w:tplc="916A16CA">
+      <w:start w:val="1"/>
+      <w:numFmt w:val="decimal"/>
+      <w:lvlText w:val="%1."/>
+      <w:lvlJc w:val="left"/>
+      <w:pPr>
+        <w:ind w:left="360" w:hanging="360"/>
+      </w:pPr>
+      <w:rPr>
+        <w:rFonts w:hint="default"/>
+      </w:rPr>
+    </w:lvl>
+    <w:lvl w:ilvl="1" w:tplc="04090019" w:tentative="1">
+      <w:start w:val="1"/>
+      <w:numFmt w:val="lowerLetter"/>
+      <w:lvlText w:val="%2)"/>
+      <w:lvlJc w:val="left"/>
+      <w:pPr>
+        <w:ind w:left="880" w:hanging="440"/>
+      </w:pPr>
+    </w:lvl>
+    <w:lvl w:ilvl="2" w:tplc="0409001B" w:tentative="1">
+      <w:start w:val="1"/>
+      <w:numFmt w:val="lowerRoman"/>
+      <w:lvlText w:val="%3."/>
+      <w:lvlJc w:val="right"/>
+      <w:pPr>
+        <w:ind w:left="1320" w:hanging="440"/>
+      </w:pPr>
+    </w:lvl>
+    <w:lvl w:ilvl="3" w:tplc="0409000F" w:tentative="1">
+      <w:start w:val="1"/>
+      <w:numFmt w:val="decimal"/>
+      <w:lvlText w:val="%4."/>
+      <w:lvlJc w:val="left"/>
+      <w:pPr>
+        <w:ind w:left="1760" w:hanging="440"/>
+      </w:pPr>
+    </w:lvl>
+    <w:lvl w:ilvl="4" w:tplc="04090019" w:tentative="1">
+      <w:start w:val="1"/>
+      <w:numFmt w:val="lowerLetter"/>
+      <w:lvlText w:val="%5)"/>
+      <w:lvlJc w:val="left"/>
+      <w:pPr>
+        <w:ind w:left="2200" w:hanging="440"/>
+      </w:pPr>
+    </w:lvl>
+    <w:lvl w:ilvl="5" w:tplc="0409001B" w:tentative="1">
+      <w:start w:val="1"/>
+      <w:numFmt w:val="lowerRoman"/>
+      <w:lvlText w:val="%6."/>
+      <w:lvlJc w:val="right"/>
+      <w:pPr>
+        <w:ind w:left="2640" w:hanging="440"/>
+      </w:pPr>
+    </w:lvl>
+    <w:lvl w:ilvl="6" w:tplc="0409000F" w:tentative="1">
+      <w:start w:val="1"/>
+      <w:numFmt w:val="decimal"/>
+      <w:lvlText w:val="%7."/>
+      <w:lvlJc w:val="left"/>
+      <w:pPr>
+        <w:ind w:left="3080" w:hanging="440"/>
+      </w:pPr>
+    </w:lvl>
+    <w:lvl w:ilvl="7" w:tplc="04090019" w:tentative="1">
+      <w:start w:val="1"/>
+      <w:numFmt w:val="lowerLetter"/>
+      <w:lvlText w:val="%8)"/>
+      <w:lvlJc w:val="left"/>
+      <w:pPr>
+        <w:ind w:left="3520" w:hanging="440"/>
+      </w:pPr>
+    </w:lvl>
+    <w:lvl w:ilvl="8" w:tplc="0409001B" w:tentative="1">
+      <w:start w:val="1"/>
+      <w:numFmt w:val="lowerRoman"/>
+      <w:lvlText w:val="%9."/>
+      <w:lvlJc w:val="right"/>
+      <w:pPr>
+        <w:ind w:left="3960" w:hanging="440"/>
+      </w:pPr>
+    </w:lvl>
+  </w:abstractNum>
+  <w:abstractNum w:abstractNumId="5" w15:restartNumberingAfterBreak="0">
+    <w:nsid w:val="71B75154"/>
+    <w:multiLevelType w:val="hybridMultilevel"/>
+    <w:tmpl w:val="BF268854"/>
+    <w:lvl w:ilvl="0" w:tplc="E32EE820">
+      <w:start w:val="1"/>
+      <w:numFmt w:val="decimal"/>
+      <w:lvlText w:val="%1."/>
+      <w:lvlJc w:val="left"/>
+      <w:pPr>
+        <w:ind w:left="360" w:hanging="360"/>
+      </w:pPr>
+      <w:rPr>
+        <w:rFonts w:hint="default"/>
+      </w:rPr>
+    </w:lvl>
+    <w:lvl w:ilvl="1" w:tplc="04090019" w:tentative="1">
+      <w:start w:val="1"/>
+      <w:numFmt w:val="lowerLetter"/>
+      <w:lvlText w:val="%2)"/>
+      <w:lvlJc w:val="left"/>
+      <w:pPr>
+        <w:ind w:left="880" w:hanging="440"/>
+      </w:pPr>
+    </w:lvl>
+    <w:lvl w:ilvl="2" w:tplc="0409001B" w:tentative="1">
+      <w:start w:val="1"/>
+      <w:numFmt w:val="lowerRoman"/>
+      <w:lvlText w:val="%3."/>
+      <w:lvlJc w:val="right"/>
+      <w:pPr>
+        <w:ind w:left="1320" w:hanging="440"/>
+      </w:pPr>
+    </w:lvl>
+    <w:lvl w:ilvl="3" w:tplc="0409000F" w:tentative="1">
+      <w:start w:val="1"/>
+      <w:numFmt w:val="decimal"/>
+      <w:lvlText w:val="%4."/>
+      <w:lvlJc w:val="left"/>
+      <w:pPr>
+        <w:ind w:left="1760" w:hanging="440"/>
+      </w:pPr>
+    </w:lvl>
+    <w:lvl w:ilvl="4" w:tplc="04090019" w:tentative="1">
+      <w:start w:val="1"/>
+      <w:numFmt w:val="lowerLetter"/>
+      <w:lvlText w:val="%5)"/>
+      <w:lvlJc w:val="left"/>
+      <w:pPr>
+        <w:ind w:left="2200" w:hanging="440"/>
+      </w:pPr>
+    </w:lvl>
+    <w:lvl w:ilvl="5" w:tplc="0409001B" w:tentative="1">
+      <w:start w:val="1"/>
+      <w:numFmt w:val="lowerRoman"/>
+      <w:lvlText w:val="%6."/>
+      <w:lvlJc w:val="right"/>
+      <w:pPr>
+        <w:ind w:left="2640" w:hanging="440"/>
+      </w:pPr>
+    </w:lvl>
+    <w:lvl w:ilvl="6" w:tplc="0409000F" w:tentative="1">
+      <w:start w:val="1"/>
+      <w:numFmt w:val="decimal"/>
+      <w:lvlText w:val="%7."/>
+      <w:lvlJc w:val="left"/>
+      <w:pPr>
+        <w:ind w:left="3080" w:hanging="440"/>
+      </w:pPr>
+    </w:lvl>
+    <w:lvl w:ilvl="7" w:tplc="04090019" w:tentative="1">
+      <w:start w:val="1"/>
+      <w:numFmt w:val="lowerLetter"/>
+      <w:lvlText w:val="%8)"/>
+      <w:lvlJc w:val="left"/>
+      <w:pPr>
+        <w:ind w:left="3520" w:hanging="440"/>
+      </w:pPr>
+    </w:lvl>
+    <w:lvl w:ilvl="8" w:tplc="0409001B" w:tentative="1">
+      <w:start w:val="1"/>
+      <w:numFmt w:val="lowerRoman"/>
+      <w:lvlText w:val="%9."/>
+      <w:lvlJc w:val="right"/>
+      <w:pPr>
+        <w:ind w:left="3960" w:hanging="440"/>
+      </w:pPr>
+    </w:lvl>
+  </w:abstractNum>
   <w:num w:numId="1" w16cid:durableId="1698657550">
+    <w:abstractNumId w:val="3"/>
+  </w:num>
+  <w:num w:numId="2" w16cid:durableId="1118180791">
     <w:abstractNumId w:val="1"/>
   </w:num>
-  <w:num w:numId="2" w16cid:durableId="1118180791">
+  <w:num w:numId="3" w16cid:durableId="733310846">
+    <w:abstractNumId w:val="2"/>
+  </w:num>
+  <w:num w:numId="4" w16cid:durableId="2070111241">
+    <w:abstractNumId w:val="5"/>
+  </w:num>
+  <w:num w:numId="5" w16cid:durableId="1999797778">
+    <w:abstractNumId w:val="4"/>
+  </w:num>
+  <w:num w:numId="6" w16cid:durableId="1636596120">
     <w:abstractNumId w:val="0"/>
   </w:num>
 </w:numbering>
@@ -3321,7 +6191,7 @@
   <w:style w:type="paragraph" w:default="1" w:styleId="a">
     <w:name w:val="Normal"/>
     <w:qFormat/>
-    <w:rsid w:val="00D97B29"/>
+    <w:rsid w:val="002E50DF"/>
     <w:pPr>
       <w:widowControl w:val="0"/>
     </w:pPr>
@@ -3864,6 +6734,29 @@
       </w:tblBorders>
     </w:tblPr>
   </w:style>
+  <w:style w:type="character" w:styleId="af">
+    <w:name w:val="Hyperlink"/>
+    <w:basedOn w:val="a0"/>
+    <w:uiPriority w:val="99"/>
+    <w:unhideWhenUsed/>
+    <w:rsid w:val="00E520D7"/>
+    <w:rPr>
+      <w:color w:val="467886" w:themeColor="hyperlink"/>
+      <w:u w:val="single"/>
+    </w:rPr>
+  </w:style>
+  <w:style w:type="character" w:styleId="af0">
+    <w:name w:val="Unresolved Mention"/>
+    <w:basedOn w:val="a0"/>
+    <w:uiPriority w:val="99"/>
+    <w:semiHidden/>
+    <w:unhideWhenUsed/>
+    <w:rsid w:val="00E520D7"/>
+    <w:rPr>
+      <w:color w:val="605E5C"/>
+      <w:shd w:val="clear" w:color="auto" w:fill="E1DFDD"/>
+    </w:rPr>
+  </w:style>
 </w:styles>
 </file>
 

</xml_diff>

<commit_message>
refactored the BlockedDialog.tsx into Toast.tsx, its now a class that can be instantiated everywhere
</commit_message>
<xml_diff>
--- a/test plan.docx
+++ b/test plan.docx
@@ -6,6 +6,7 @@
       <w:pPr>
         <w:jc w:val="center"/>
         <w:rPr>
+          <w:rFonts w:hint="eastAsia"/>
           <w:b/>
           <w:bCs/>
           <w:sz w:val="28"/>
@@ -38,6 +39,7 @@
       <w:pPr>
         <w:jc w:val="center"/>
         <w:rPr>
+          <w:rFonts w:hint="eastAsia"/>
           <w:sz w:val="15"/>
           <w:szCs w:val="16"/>
           <w:lang w:val="en-CA"/>
@@ -82,6 +84,7 @@
       <w:pPr>
         <w:jc w:val="center"/>
         <w:rPr>
+          <w:rFonts w:hint="eastAsia"/>
           <w:sz w:val="15"/>
           <w:szCs w:val="16"/>
           <w:lang w:val="en-CA"/>
@@ -126,6 +129,7 @@
       <w:pPr>
         <w:jc w:val="center"/>
         <w:rPr>
+          <w:rFonts w:hint="eastAsia"/>
           <w:b/>
           <w:bCs/>
           <w:sz w:val="28"/>
@@ -167,6 +171,7 @@
           <w:p>
             <w:pPr>
               <w:rPr>
+                <w:rFonts w:hint="eastAsia"/>
                 <w:sz w:val="16"/>
                 <w:szCs w:val="18"/>
               </w:rPr>
@@ -202,6 +207,7 @@
           <w:p>
             <w:pPr>
               <w:rPr>
+                <w:rFonts w:hint="eastAsia"/>
                 <w:sz w:val="16"/>
                 <w:szCs w:val="18"/>
                 <w:lang w:val="en-CA"/>
@@ -231,6 +237,7 @@
           <w:p>
             <w:pPr>
               <w:rPr>
+                <w:rFonts w:hint="eastAsia"/>
                 <w:sz w:val="16"/>
                 <w:szCs w:val="18"/>
                 <w:lang w:val="en-CA"/>
@@ -262,6 +269,7 @@
           <w:p>
             <w:pPr>
               <w:rPr>
+                <w:rFonts w:hint="eastAsia"/>
                 <w:sz w:val="16"/>
                 <w:szCs w:val="18"/>
                 <w:lang w:val="en-CA"/>
@@ -293,6 +301,7 @@
           <w:p>
             <w:pPr>
               <w:rPr>
+                <w:rFonts w:hint="eastAsia"/>
                 <w:sz w:val="16"/>
                 <w:szCs w:val="18"/>
                 <w:lang w:val="en-CA"/>
@@ -326,6 +335,7 @@
           <w:p>
             <w:pPr>
               <w:rPr>
+                <w:rFonts w:hint="eastAsia"/>
                 <w:sz w:val="16"/>
                 <w:szCs w:val="18"/>
                 <w:lang w:val="en-CA"/>
@@ -340,6 +350,7 @@
           <w:p>
             <w:pPr>
               <w:rPr>
+                <w:rFonts w:hint="eastAsia"/>
                 <w:sz w:val="16"/>
                 <w:szCs w:val="18"/>
                 <w:lang w:val="en-CA"/>
@@ -354,6 +365,7 @@
           <w:p>
             <w:pPr>
               <w:rPr>
+                <w:rFonts w:hint="eastAsia"/>
                 <w:sz w:val="16"/>
                 <w:szCs w:val="18"/>
                 <w:lang w:val="en-CA"/>
@@ -368,6 +380,7 @@
           <w:p>
             <w:pPr>
               <w:rPr>
+                <w:rFonts w:hint="eastAsia"/>
                 <w:sz w:val="16"/>
                 <w:szCs w:val="18"/>
                 <w:lang w:val="en-CA"/>
@@ -404,6 +417,7 @@
       <w:pPr>
         <w:jc w:val="center"/>
         <w:rPr>
+          <w:rFonts w:hint="eastAsia"/>
           <w:b/>
           <w:bCs/>
           <w:sz w:val="28"/>
@@ -416,6 +430,7 @@
       <w:pPr>
         <w:jc w:val="center"/>
         <w:rPr>
+          <w:rFonts w:hint="eastAsia"/>
           <w:b/>
           <w:bCs/>
           <w:sz w:val="28"/>
@@ -467,6 +482,7 @@
           <w:p>
             <w:pPr>
               <w:rPr>
+                <w:rFonts w:hint="eastAsia"/>
                 <w:sz w:val="16"/>
                 <w:szCs w:val="18"/>
               </w:rPr>
@@ -502,6 +518,7 @@
           <w:p>
             <w:pPr>
               <w:rPr>
+                <w:rFonts w:hint="eastAsia"/>
                 <w:sz w:val="16"/>
                 <w:szCs w:val="18"/>
                 <w:lang w:val="en-CA"/>
@@ -531,6 +548,7 @@
           <w:p>
             <w:pPr>
               <w:rPr>
+                <w:rFonts w:hint="eastAsia"/>
                 <w:sz w:val="16"/>
                 <w:szCs w:val="18"/>
                 <w:lang w:val="en-CA"/>
@@ -562,6 +580,7 @@
           <w:p>
             <w:pPr>
               <w:rPr>
+                <w:rFonts w:hint="eastAsia"/>
                 <w:sz w:val="16"/>
                 <w:szCs w:val="18"/>
                 <w:lang w:val="en-CA"/>
@@ -593,6 +612,7 @@
           <w:p>
             <w:pPr>
               <w:rPr>
+                <w:rFonts w:hint="eastAsia"/>
                 <w:sz w:val="16"/>
                 <w:szCs w:val="18"/>
                 <w:lang w:val="en-CA"/>
@@ -626,6 +646,7 @@
           <w:p>
             <w:pPr>
               <w:rPr>
+                <w:rFonts w:hint="eastAsia"/>
                 <w:sz w:val="16"/>
                 <w:szCs w:val="18"/>
                 <w:lang w:val="en-CA"/>
@@ -640,6 +661,7 @@
           <w:p>
             <w:pPr>
               <w:rPr>
+                <w:rFonts w:hint="eastAsia"/>
                 <w:sz w:val="16"/>
                 <w:szCs w:val="18"/>
                 <w:lang w:val="en-CA"/>
@@ -654,6 +676,7 @@
           <w:p>
             <w:pPr>
               <w:rPr>
+                <w:rFonts w:hint="eastAsia"/>
                 <w:sz w:val="16"/>
                 <w:szCs w:val="18"/>
                 <w:lang w:val="en-CA"/>
@@ -668,6 +691,7 @@
           <w:p>
             <w:pPr>
               <w:rPr>
+                <w:rFonts w:hint="eastAsia"/>
                 <w:sz w:val="16"/>
                 <w:szCs w:val="18"/>
                 <w:lang w:val="en-CA"/>
@@ -696,6 +720,7 @@
       <w:pPr>
         <w:jc w:val="center"/>
         <w:rPr>
+          <w:rFonts w:hint="eastAsia"/>
           <w:b/>
           <w:bCs/>
           <w:sz w:val="28"/>
@@ -708,6 +733,7 @@
       <w:pPr>
         <w:jc w:val="center"/>
         <w:rPr>
+          <w:rFonts w:hint="eastAsia"/>
           <w:b/>
           <w:bCs/>
           <w:sz w:val="28"/>
@@ -734,17 +760,7 @@
           <w:szCs w:val="32"/>
           <w:lang w:val="en-CA"/>
         </w:rPr>
-        <w:t>ettings</w:t>
-      </w:r>
-      <w:r>
-        <w:rPr>
-          <w:b/>
-          <w:bCs/>
-          <w:sz w:val="28"/>
-          <w:szCs w:val="32"/>
-          <w:lang w:val="en-CA"/>
-        </w:rPr>
-        <w:t>.tsx</w:t>
+        <w:t>ettings.tsx</w:t>
       </w:r>
       <w:r>
         <w:rPr>
@@ -779,6 +795,7 @@
           <w:p>
             <w:pPr>
               <w:rPr>
+                <w:rFonts w:hint="eastAsia"/>
                 <w:sz w:val="16"/>
                 <w:szCs w:val="18"/>
               </w:rPr>
@@ -814,6 +831,7 @@
           <w:p>
             <w:pPr>
               <w:rPr>
+                <w:rFonts w:hint="eastAsia"/>
                 <w:sz w:val="16"/>
                 <w:szCs w:val="18"/>
                 <w:lang w:val="en-CA"/>
@@ -843,6 +861,7 @@
           <w:p>
             <w:pPr>
               <w:rPr>
+                <w:rFonts w:hint="eastAsia"/>
                 <w:sz w:val="16"/>
                 <w:szCs w:val="18"/>
                 <w:lang w:val="en-CA"/>
@@ -874,6 +893,7 @@
           <w:p>
             <w:pPr>
               <w:rPr>
+                <w:rFonts w:hint="eastAsia"/>
                 <w:sz w:val="16"/>
                 <w:szCs w:val="18"/>
                 <w:lang w:val="en-CA"/>
@@ -905,6 +925,7 @@
           <w:p>
             <w:pPr>
               <w:rPr>
+                <w:rFonts w:hint="eastAsia"/>
                 <w:sz w:val="16"/>
                 <w:szCs w:val="18"/>
                 <w:lang w:val="en-CA"/>
@@ -946,6 +967,7 @@
           <w:p>
             <w:pPr>
               <w:rPr>
+                <w:rFonts w:hint="eastAsia"/>
                 <w:sz w:val="16"/>
                 <w:szCs w:val="18"/>
                 <w:lang w:val="en-CA"/>
@@ -968,6 +990,7 @@
           <w:p>
             <w:pPr>
               <w:rPr>
+                <w:rFonts w:hint="eastAsia"/>
                 <w:sz w:val="16"/>
                 <w:szCs w:val="18"/>
                 <w:lang w:val="en-CA"/>
@@ -999,6 +1022,7 @@
           <w:p>
             <w:pPr>
               <w:rPr>
+                <w:rFonts w:hint="eastAsia"/>
                 <w:sz w:val="16"/>
                 <w:szCs w:val="18"/>
                 <w:lang w:val="en-CA"/>
@@ -1030,6 +1054,7 @@
           <w:p>
             <w:pPr>
               <w:rPr>
+                <w:rFonts w:hint="eastAsia"/>
                 <w:sz w:val="16"/>
                 <w:szCs w:val="18"/>
                 <w:lang w:val="en-CA"/>
@@ -1061,6 +1086,7 @@
           <w:p>
             <w:pPr>
               <w:rPr>
+                <w:rFonts w:hint="eastAsia"/>
                 <w:sz w:val="16"/>
                 <w:szCs w:val="18"/>
                 <w:lang w:val="en-CA"/>
@@ -1128,6 +1154,7 @@
           <w:p>
             <w:pPr>
               <w:rPr>
+                <w:rFonts w:hint="eastAsia"/>
                 <w:sz w:val="16"/>
                 <w:szCs w:val="18"/>
                 <w:lang w:val="en-CA"/>
@@ -1159,6 +1186,7 @@
           <w:p>
             <w:pPr>
               <w:rPr>
+                <w:rFonts w:hint="eastAsia"/>
                 <w:sz w:val="16"/>
                 <w:szCs w:val="18"/>
                 <w:lang w:val="en-CA"/>
@@ -1190,6 +1218,7 @@
           <w:p>
             <w:pPr>
               <w:rPr>
+                <w:rFonts w:hint="eastAsia"/>
                 <w:sz w:val="16"/>
                 <w:szCs w:val="18"/>
                 <w:lang w:val="en-CA"/>
@@ -1221,6 +1250,7 @@
           <w:p>
             <w:pPr>
               <w:rPr>
+                <w:rFonts w:hint="eastAsia"/>
                 <w:sz w:val="16"/>
                 <w:szCs w:val="18"/>
                 <w:lang w:val="en-CA"/>
@@ -1286,6 +1316,7 @@
           <w:p>
             <w:pPr>
               <w:rPr>
+                <w:rFonts w:hint="eastAsia"/>
                 <w:sz w:val="16"/>
                 <w:szCs w:val="18"/>
                 <w:lang w:val="en-CA"/>
@@ -1310,6 +1341,7 @@
           <w:p>
             <w:pPr>
               <w:rPr>
+                <w:rFonts w:hint="eastAsia"/>
                 <w:sz w:val="16"/>
                 <w:szCs w:val="18"/>
                 <w:lang w:val="en-CA"/>
@@ -1341,6 +1373,7 @@
           <w:p>
             <w:pPr>
               <w:rPr>
+                <w:rFonts w:hint="eastAsia"/>
                 <w:sz w:val="16"/>
                 <w:szCs w:val="18"/>
                 <w:lang w:val="en-CA"/>
@@ -1372,6 +1405,7 @@
           <w:p>
             <w:pPr>
               <w:rPr>
+                <w:rFonts w:hint="eastAsia"/>
                 <w:sz w:val="16"/>
                 <w:szCs w:val="18"/>
                 <w:lang w:val="en-CA"/>
@@ -1403,6 +1437,7 @@
           <w:p>
             <w:pPr>
               <w:rPr>
+                <w:rFonts w:hint="eastAsia"/>
                 <w:sz w:val="16"/>
                 <w:szCs w:val="18"/>
                 <w:lang w:val="en-CA"/>
@@ -1451,6 +1486,7 @@
           <w:p>
             <w:pPr>
               <w:rPr>
+                <w:rFonts w:hint="eastAsia"/>
                 <w:sz w:val="16"/>
                 <w:szCs w:val="18"/>
                 <w:lang w:val="en-CA"/>
@@ -1475,6 +1511,7 @@
           <w:p>
             <w:pPr>
               <w:rPr>
+                <w:rFonts w:hint="eastAsia"/>
                 <w:sz w:val="16"/>
                 <w:szCs w:val="18"/>
                 <w:lang w:val="en-CA"/>
@@ -1507,6 +1544,7 @@
           <w:p>
             <w:pPr>
               <w:rPr>
+                <w:rFonts w:hint="eastAsia"/>
                 <w:sz w:val="16"/>
                 <w:szCs w:val="18"/>
                 <w:lang w:val="en-CA"/>
@@ -1538,6 +1576,7 @@
           <w:p>
             <w:pPr>
               <w:rPr>
+                <w:rFonts w:hint="eastAsia"/>
                 <w:sz w:val="16"/>
                 <w:szCs w:val="18"/>
                 <w:lang w:val="en-CA"/>
@@ -1569,6 +1608,7 @@
           <w:p>
             <w:pPr>
               <w:rPr>
+                <w:rFonts w:hint="eastAsia"/>
                 <w:sz w:val="16"/>
                 <w:szCs w:val="18"/>
                 <w:lang w:val="en-CA"/>
@@ -1617,6 +1657,7 @@
           <w:p>
             <w:pPr>
               <w:rPr>
+                <w:rFonts w:hint="eastAsia"/>
                 <w:sz w:val="16"/>
                 <w:szCs w:val="18"/>
                 <w:lang w:val="en-CA"/>
@@ -1675,6 +1716,7 @@
           <w:p>
             <w:pPr>
               <w:rPr>
+                <w:rFonts w:hint="eastAsia"/>
                 <w:sz w:val="16"/>
                 <w:szCs w:val="18"/>
                 <w:lang w:val="en-CA"/>
@@ -1706,6 +1748,7 @@
           <w:p>
             <w:pPr>
               <w:rPr>
+                <w:rFonts w:hint="eastAsia"/>
                 <w:sz w:val="16"/>
                 <w:szCs w:val="18"/>
                 <w:lang w:val="en-CA"/>
@@ -1737,6 +1780,7 @@
           <w:p>
             <w:pPr>
               <w:rPr>
+                <w:rFonts w:hint="eastAsia"/>
                 <w:sz w:val="16"/>
                 <w:szCs w:val="18"/>
                 <w:lang w:val="en-CA"/>
@@ -1768,6 +1812,7 @@
           <w:p>
             <w:pPr>
               <w:rPr>
+                <w:rFonts w:hint="eastAsia"/>
                 <w:sz w:val="16"/>
                 <w:szCs w:val="18"/>
                 <w:lang w:val="en-CA"/>
@@ -1799,6 +1844,7 @@
           <w:p>
             <w:pPr>
               <w:rPr>
+                <w:rFonts w:hint="eastAsia"/>
                 <w:sz w:val="16"/>
                 <w:szCs w:val="18"/>
                 <w:lang w:val="en-CA"/>
@@ -1820,6 +1866,7 @@
       <w:pPr>
         <w:jc w:val="center"/>
         <w:rPr>
+          <w:rFonts w:hint="eastAsia"/>
           <w:b/>
           <w:bCs/>
           <w:sz w:val="28"/>
@@ -1832,6 +1879,7 @@
       <w:pPr>
         <w:jc w:val="center"/>
         <w:rPr>
+          <w:rFonts w:hint="eastAsia"/>
           <w:b/>
           <w:bCs/>
           <w:sz w:val="28"/>
@@ -1858,17 +1906,7 @@
           <w:szCs w:val="32"/>
           <w:lang w:val="en-CA"/>
         </w:rPr>
-        <w:t xml:space="preserve">ettings.tsx: </w:t>
-      </w:r>
-      <w:r>
-        <w:rPr>
-          <w:b/>
-          <w:bCs/>
-          <w:sz w:val="28"/>
-          <w:szCs w:val="32"/>
-          <w:lang w:val="en-CA"/>
-        </w:rPr>
-        <w:t>checkboxes</w:t>
+        <w:t>ettings.tsx: checkboxes</w:t>
       </w:r>
     </w:p>
     <w:tbl>
@@ -1894,6 +1932,7 @@
           <w:p>
             <w:pPr>
               <w:rPr>
+                <w:rFonts w:hint="eastAsia"/>
                 <w:sz w:val="16"/>
                 <w:szCs w:val="18"/>
               </w:rPr>
@@ -1929,6 +1968,7 @@
           <w:p>
             <w:pPr>
               <w:rPr>
+                <w:rFonts w:hint="eastAsia"/>
                 <w:sz w:val="16"/>
                 <w:szCs w:val="18"/>
                 <w:lang w:val="en-CA"/>
@@ -1958,6 +1998,7 @@
           <w:p>
             <w:pPr>
               <w:rPr>
+                <w:rFonts w:hint="eastAsia"/>
                 <w:sz w:val="16"/>
                 <w:szCs w:val="18"/>
                 <w:lang w:val="en-CA"/>
@@ -1989,6 +2030,7 @@
           <w:p>
             <w:pPr>
               <w:rPr>
+                <w:rFonts w:hint="eastAsia"/>
                 <w:sz w:val="16"/>
                 <w:szCs w:val="18"/>
                 <w:lang w:val="en-CA"/>
@@ -2020,6 +2062,7 @@
           <w:p>
             <w:pPr>
               <w:rPr>
+                <w:rFonts w:hint="eastAsia"/>
                 <w:sz w:val="16"/>
                 <w:szCs w:val="18"/>
                 <w:lang w:val="en-CA"/>
@@ -2053,6 +2096,7 @@
           <w:p>
             <w:pPr>
               <w:rPr>
+                <w:rFonts w:hint="eastAsia"/>
                 <w:sz w:val="16"/>
                 <w:szCs w:val="18"/>
                 <w:lang w:val="en-CA"/>
@@ -2084,6 +2128,7 @@
           <w:p>
             <w:pPr>
               <w:rPr>
+                <w:rFonts w:hint="eastAsia"/>
                 <w:sz w:val="16"/>
                 <w:szCs w:val="18"/>
                 <w:lang w:val="en-CA"/>
@@ -2120,6 +2165,7 @@
                 <w:numId w:val="1"/>
               </w:numPr>
               <w:rPr>
+                <w:rFonts w:hint="eastAsia"/>
                 <w:sz w:val="16"/>
                 <w:szCs w:val="18"/>
                 <w:lang w:val="en-CA"/>
@@ -2151,6 +2197,7 @@
                 <w:numId w:val="1"/>
               </w:numPr>
               <w:rPr>
+                <w:rFonts w:hint="eastAsia"/>
                 <w:sz w:val="16"/>
                 <w:szCs w:val="18"/>
                 <w:lang w:val="en-CA"/>
@@ -2190,6 +2237,7 @@
                 <w:numId w:val="1"/>
               </w:numPr>
               <w:rPr>
+                <w:rFonts w:hint="eastAsia"/>
                 <w:sz w:val="16"/>
                 <w:szCs w:val="18"/>
                 <w:lang w:val="en-CA"/>
@@ -2221,6 +2269,7 @@
                 <w:numId w:val="1"/>
               </w:numPr>
               <w:rPr>
+                <w:rFonts w:hint="eastAsia"/>
                 <w:sz w:val="16"/>
                 <w:szCs w:val="18"/>
                 <w:lang w:val="en-CA"/>
@@ -2252,6 +2301,7 @@
                 <w:numId w:val="1"/>
               </w:numPr>
               <w:rPr>
+                <w:rFonts w:hint="eastAsia"/>
                 <w:sz w:val="16"/>
                 <w:szCs w:val="18"/>
                 <w:lang w:val="en-CA"/>
@@ -2283,6 +2333,7 @@
           <w:p>
             <w:pPr>
               <w:rPr>
+                <w:rFonts w:hint="eastAsia"/>
                 <w:sz w:val="16"/>
                 <w:szCs w:val="18"/>
                 <w:lang w:val="en-CA"/>
@@ -2309,6 +2360,7 @@
           <w:p>
             <w:pPr>
               <w:rPr>
+                <w:rFonts w:hint="eastAsia"/>
                 <w:sz w:val="16"/>
                 <w:szCs w:val="18"/>
                 <w:lang w:val="en-CA"/>
@@ -2386,6 +2438,7 @@
           <w:p>
             <w:pPr>
               <w:rPr>
+                <w:rFonts w:hint="eastAsia"/>
                 <w:sz w:val="16"/>
                 <w:szCs w:val="18"/>
                 <w:lang w:val="en-CA"/>
@@ -2400,6 +2453,7 @@
           <w:p>
             <w:pPr>
               <w:rPr>
+                <w:rFonts w:hint="eastAsia"/>
                 <w:sz w:val="16"/>
                 <w:szCs w:val="18"/>
                 <w:lang w:val="en-CA"/>
@@ -2434,6 +2488,7 @@
           <w:p>
             <w:pPr>
               <w:rPr>
+                <w:rFonts w:hint="eastAsia"/>
                 <w:sz w:val="16"/>
                 <w:szCs w:val="18"/>
                 <w:lang w:val="en-CA"/>
@@ -2467,6 +2522,7 @@
           <w:p>
             <w:pPr>
               <w:rPr>
+                <w:rFonts w:hint="eastAsia"/>
                 <w:sz w:val="16"/>
                 <w:szCs w:val="18"/>
                 <w:lang w:val="en-CA"/>
@@ -2498,6 +2554,7 @@
           <w:p>
             <w:pPr>
               <w:rPr>
+                <w:rFonts w:hint="eastAsia"/>
                 <w:sz w:val="16"/>
                 <w:szCs w:val="18"/>
                 <w:lang w:val="en-CA"/>
@@ -2529,6 +2586,7 @@
           <w:p>
             <w:pPr>
               <w:rPr>
+                <w:rFonts w:hint="eastAsia"/>
                 <w:sz w:val="16"/>
                 <w:szCs w:val="18"/>
                 <w:lang w:val="en-CA"/>
@@ -2560,6 +2618,7 @@
           <w:p>
             <w:pPr>
               <w:rPr>
+                <w:rFonts w:hint="eastAsia"/>
                 <w:sz w:val="16"/>
                 <w:szCs w:val="18"/>
                 <w:lang w:val="en-CA"/>
@@ -2591,6 +2650,7 @@
           <w:p>
             <w:pPr>
               <w:rPr>
+                <w:rFonts w:hint="eastAsia"/>
                 <w:sz w:val="16"/>
                 <w:szCs w:val="18"/>
                 <w:lang w:val="en-CA"/>
@@ -2624,6 +2684,7 @@
           <w:p>
             <w:pPr>
               <w:rPr>
+                <w:rFonts w:hint="eastAsia"/>
                 <w:sz w:val="16"/>
                 <w:szCs w:val="18"/>
                 <w:lang w:val="en-CA"/>
@@ -2655,6 +2716,7 @@
           <w:p>
             <w:pPr>
               <w:rPr>
+                <w:rFonts w:hint="eastAsia"/>
                 <w:sz w:val="16"/>
                 <w:szCs w:val="18"/>
                 <w:lang w:val="en-CA"/>
@@ -2691,6 +2753,7 @@
                 <w:numId w:val="2"/>
               </w:numPr>
               <w:rPr>
+                <w:rFonts w:hint="eastAsia"/>
                 <w:sz w:val="16"/>
                 <w:szCs w:val="18"/>
                 <w:lang w:val="en-CA"/>
@@ -2722,6 +2785,7 @@
                 <w:numId w:val="2"/>
               </w:numPr>
               <w:rPr>
+                <w:rFonts w:hint="eastAsia"/>
                 <w:sz w:val="16"/>
                 <w:szCs w:val="18"/>
                 <w:lang w:val="en-CA"/>
@@ -2753,6 +2817,7 @@
                 <w:numId w:val="2"/>
               </w:numPr>
               <w:rPr>
+                <w:rFonts w:hint="eastAsia"/>
                 <w:sz w:val="16"/>
                 <w:szCs w:val="18"/>
                 <w:lang w:val="en-CA"/>
@@ -2784,6 +2849,7 @@
                 <w:numId w:val="2"/>
               </w:numPr>
               <w:rPr>
+                <w:rFonts w:hint="eastAsia"/>
                 <w:sz w:val="16"/>
                 <w:szCs w:val="18"/>
                 <w:lang w:val="en-CA"/>
@@ -2815,6 +2881,7 @@
           <w:p>
             <w:pPr>
               <w:rPr>
+                <w:rFonts w:hint="eastAsia"/>
                 <w:sz w:val="16"/>
                 <w:szCs w:val="18"/>
                 <w:lang w:val="en-CA"/>
@@ -2841,6 +2908,7 @@
           <w:p>
             <w:pPr>
               <w:rPr>
+                <w:rFonts w:hint="eastAsia"/>
                 <w:sz w:val="16"/>
                 <w:szCs w:val="18"/>
                 <w:lang w:val="en-CA"/>
@@ -2872,6 +2940,7 @@
           <w:p>
             <w:pPr>
               <w:rPr>
+                <w:rFonts w:hint="eastAsia"/>
                 <w:sz w:val="16"/>
                 <w:szCs w:val="18"/>
                 <w:lang w:val="en-CA"/>
@@ -2902,6 +2971,7 @@
       <w:pPr>
         <w:jc w:val="center"/>
         <w:rPr>
+          <w:rFonts w:hint="eastAsia"/>
           <w:b/>
           <w:bCs/>
           <w:sz w:val="28"/>
@@ -2914,6 +2984,7 @@
       <w:pPr>
         <w:jc w:val="center"/>
         <w:rPr>
+          <w:rFonts w:hint="eastAsia"/>
           <w:b/>
           <w:bCs/>
           <w:sz w:val="28"/>
@@ -2966,6 +3037,7 @@
           <w:p>
             <w:pPr>
               <w:rPr>
+                <w:rFonts w:hint="eastAsia"/>
                 <w:sz w:val="16"/>
                 <w:szCs w:val="18"/>
               </w:rPr>
@@ -3001,6 +3073,7 @@
           <w:p>
             <w:pPr>
               <w:rPr>
+                <w:rFonts w:hint="eastAsia"/>
                 <w:sz w:val="16"/>
                 <w:szCs w:val="18"/>
                 <w:lang w:val="en-CA"/>
@@ -3030,6 +3103,7 @@
           <w:p>
             <w:pPr>
               <w:rPr>
+                <w:rFonts w:hint="eastAsia"/>
                 <w:sz w:val="16"/>
                 <w:szCs w:val="18"/>
                 <w:lang w:val="en-CA"/>
@@ -3061,6 +3135,7 @@
           <w:p>
             <w:pPr>
               <w:rPr>
+                <w:rFonts w:hint="eastAsia"/>
                 <w:sz w:val="16"/>
                 <w:szCs w:val="18"/>
                 <w:lang w:val="en-CA"/>
@@ -3092,6 +3167,7 @@
           <w:p>
             <w:pPr>
               <w:rPr>
+                <w:rFonts w:hint="eastAsia"/>
                 <w:sz w:val="16"/>
                 <w:szCs w:val="18"/>
                 <w:lang w:val="en-CA"/>
@@ -3125,6 +3201,7 @@
           <w:p>
             <w:pPr>
               <w:rPr>
+                <w:rFonts w:hint="eastAsia"/>
                 <w:sz w:val="16"/>
                 <w:szCs w:val="18"/>
                 <w:lang w:val="en-CA"/>
@@ -3165,6 +3242,7 @@
           <w:p>
             <w:pPr>
               <w:rPr>
+                <w:rFonts w:hint="eastAsia"/>
                 <w:sz w:val="16"/>
                 <w:szCs w:val="18"/>
                 <w:lang w:val="en-CA"/>
@@ -3206,6 +3284,7 @@
           <w:p>
             <w:pPr>
               <w:rPr>
+                <w:rFonts w:hint="eastAsia"/>
                 <w:sz w:val="16"/>
                 <w:szCs w:val="18"/>
                 <w:lang w:val="en-CA"/>
@@ -3281,6 +3360,7 @@
           <w:p>
             <w:pPr>
               <w:rPr>
+                <w:rFonts w:hint="eastAsia"/>
                 <w:sz w:val="16"/>
                 <w:szCs w:val="18"/>
                 <w:lang w:val="en-CA"/>
@@ -3356,6 +3436,7 @@
           <w:p>
             <w:pPr>
               <w:rPr>
+                <w:rFonts w:hint="eastAsia"/>
                 <w:sz w:val="16"/>
                 <w:szCs w:val="18"/>
                 <w:lang w:val="en-CA"/>
@@ -3416,18 +3497,20 @@
           <w:p>
             <w:pPr>
               <w:rPr>
-                <w:sz w:val="16"/>
-                <w:szCs w:val="18"/>
-                <w:lang w:val="en-CA"/>
-              </w:rPr>
-            </w:pPr>
-            <w:r>
-              <w:rPr>
-                <w:rFonts w:hint="eastAsia"/>
-                <w:sz w:val="16"/>
-                <w:szCs w:val="18"/>
-                <w:lang w:val="en-CA"/>
-              </w:rPr>
+                <w:rFonts w:hint="eastAsia"/>
+                <w:sz w:val="16"/>
+                <w:szCs w:val="18"/>
+                <w:lang w:val="en-CA"/>
+              </w:rPr>
+            </w:pPr>
+            <w:r>
+              <w:rPr>
+                <w:rFonts w:hint="eastAsia"/>
+                <w:sz w:val="16"/>
+                <w:szCs w:val="18"/>
+                <w:lang w:val="en-CA"/>
+              </w:rPr>
+              <w:lastRenderedPageBreak/>
               <w:t>G</w:t>
             </w:r>
             <w:r>
@@ -3447,6 +3530,7 @@
           <w:p>
             <w:pPr>
               <w:rPr>
+                <w:rFonts w:hint="eastAsia"/>
                 <w:sz w:val="16"/>
                 <w:szCs w:val="18"/>
                 <w:lang w:val="en-CA"/>
@@ -3478,6 +3562,7 @@
           <w:p>
             <w:pPr>
               <w:rPr>
+                <w:rFonts w:hint="eastAsia"/>
                 <w:sz w:val="16"/>
                 <w:szCs w:val="18"/>
                 <w:lang w:val="en-CA"/>
@@ -3526,6 +3611,7 @@
           <w:p>
             <w:pPr>
               <w:rPr>
+                <w:rFonts w:hint="eastAsia"/>
                 <w:sz w:val="16"/>
                 <w:szCs w:val="18"/>
                 <w:lang w:val="en-CA"/>
@@ -3557,6 +3643,7 @@
           <w:p>
             <w:pPr>
               <w:rPr>
+                <w:rFonts w:hint="eastAsia"/>
                 <w:sz w:val="16"/>
                 <w:szCs w:val="18"/>
                 <w:lang w:val="en-CA"/>
@@ -3598,6 +3685,7 @@
           <w:p>
             <w:pPr>
               <w:rPr>
+                <w:rFonts w:hint="eastAsia"/>
                 <w:sz w:val="16"/>
                 <w:szCs w:val="18"/>
                 <w:lang w:val="en-CA"/>
@@ -3629,6 +3717,7 @@
           <w:p>
             <w:pPr>
               <w:rPr>
+                <w:rFonts w:hint="eastAsia"/>
                 <w:sz w:val="16"/>
                 <w:szCs w:val="18"/>
                 <w:lang w:val="en-CA"/>
@@ -3698,15 +3787,7 @@
                 <w:szCs w:val="18"/>
                 <w:lang w:val="en-CA"/>
               </w:rPr>
-              <w:t>fter that point, click and drag another point and bring it down</w:t>
-            </w:r>
-            <w:r>
-              <w:rPr>
-                <w:sz w:val="16"/>
-                <w:szCs w:val="18"/>
-                <w:lang w:val="en-CA"/>
-              </w:rPr>
-              <w:t xml:space="preserve">. </w:t>
+              <w:t xml:space="preserve">fter that point, click and drag another point and bring it down. </w:t>
             </w:r>
             <w:r>
               <w:rPr>
@@ -3734,6 +3815,7 @@
           <w:p>
             <w:pPr>
               <w:rPr>
+                <w:rFonts w:hint="eastAsia"/>
                 <w:sz w:val="16"/>
                 <w:szCs w:val="18"/>
                 <w:lang w:val="en-CA"/>
@@ -3765,6 +3847,7 @@
           <w:p>
             <w:pPr>
               <w:rPr>
+                <w:rFonts w:hint="eastAsia"/>
                 <w:sz w:val="16"/>
                 <w:szCs w:val="18"/>
                 <w:lang w:val="en-CA"/>
@@ -3814,6 +3897,7 @@
           <w:p>
             <w:pPr>
               <w:rPr>
+                <w:rFonts w:hint="eastAsia"/>
                 <w:sz w:val="16"/>
                 <w:szCs w:val="18"/>
                 <w:lang w:val="en-CA"/>
@@ -3836,6 +3920,7 @@
           <w:p>
             <w:pPr>
               <w:rPr>
+                <w:rFonts w:hint="eastAsia"/>
                 <w:sz w:val="16"/>
                 <w:szCs w:val="18"/>
                 <w:lang w:val="en-CA"/>
@@ -3872,6 +3957,7 @@
                 <w:numId w:val="3"/>
               </w:numPr>
               <w:rPr>
+                <w:rFonts w:hint="eastAsia"/>
                 <w:sz w:val="16"/>
                 <w:szCs w:val="18"/>
                 <w:lang w:val="en-CA"/>
@@ -3911,6 +3997,7 @@
                 <w:numId w:val="3"/>
               </w:numPr>
               <w:rPr>
+                <w:rFonts w:hint="eastAsia"/>
                 <w:sz w:val="16"/>
                 <w:szCs w:val="18"/>
                 <w:lang w:val="en-CA"/>
@@ -3942,6 +4029,7 @@
                 <w:numId w:val="3"/>
               </w:numPr>
               <w:rPr>
+                <w:rFonts w:hint="eastAsia"/>
                 <w:sz w:val="16"/>
                 <w:szCs w:val="18"/>
                 <w:lang w:val="en-CA"/>
@@ -3978,6 +4066,7 @@
                 <w:numId w:val="4"/>
               </w:numPr>
               <w:rPr>
+                <w:rFonts w:hint="eastAsia"/>
                 <w:sz w:val="16"/>
                 <w:szCs w:val="18"/>
                 <w:lang w:val="en-CA"/>
@@ -4009,6 +4098,7 @@
                 <w:numId w:val="4"/>
               </w:numPr>
               <w:rPr>
+                <w:rFonts w:hint="eastAsia"/>
                 <w:sz w:val="16"/>
                 <w:szCs w:val="18"/>
                 <w:lang w:val="en-CA"/>
@@ -4057,6 +4147,7 @@
                 <w:numId w:val="4"/>
               </w:numPr>
               <w:rPr>
+                <w:rFonts w:hint="eastAsia"/>
                 <w:sz w:val="16"/>
                 <w:szCs w:val="18"/>
                 <w:lang w:val="en-CA"/>
@@ -4105,6 +4196,7 @@
           <w:p>
             <w:pPr>
               <w:rPr>
+                <w:rFonts w:hint="eastAsia"/>
                 <w:sz w:val="16"/>
                 <w:szCs w:val="18"/>
                 <w:lang w:val="en-CA"/>
@@ -4146,6 +4238,7 @@
           <w:p>
             <w:pPr>
               <w:rPr>
+                <w:rFonts w:hint="eastAsia"/>
                 <w:sz w:val="16"/>
                 <w:szCs w:val="18"/>
                 <w:lang w:val="en-CA"/>
@@ -4168,6 +4261,7 @@
           <w:p>
             <w:pPr>
               <w:rPr>
+                <w:rFonts w:hint="eastAsia"/>
                 <w:sz w:val="16"/>
                 <w:szCs w:val="18"/>
                 <w:lang w:val="en-CA"/>
@@ -4199,6 +4293,7 @@
           <w:p>
             <w:pPr>
               <w:rPr>
+                <w:rFonts w:hint="eastAsia"/>
                 <w:sz w:val="16"/>
                 <w:szCs w:val="18"/>
                 <w:lang w:val="en-CA"/>
@@ -4264,6 +4359,7 @@
           <w:p>
             <w:pPr>
               <w:rPr>
+                <w:rFonts w:hint="eastAsia"/>
                 <w:sz w:val="16"/>
                 <w:szCs w:val="18"/>
                 <w:lang w:val="en-CA"/>
@@ -4295,6 +4391,7 @@
           <w:p>
             <w:pPr>
               <w:rPr>
+                <w:rFonts w:hint="eastAsia"/>
                 <w:sz w:val="16"/>
                 <w:szCs w:val="18"/>
                 <w:lang w:val="en-CA"/>
@@ -4328,6 +4425,7 @@
           <w:p>
             <w:pPr>
               <w:rPr>
+                <w:rFonts w:hint="eastAsia"/>
                 <w:sz w:val="16"/>
                 <w:szCs w:val="18"/>
                 <w:lang w:val="en-CA"/>
@@ -4351,6 +4449,7 @@
           <w:p>
             <w:pPr>
               <w:rPr>
+                <w:rFonts w:hint="eastAsia"/>
                 <w:sz w:val="16"/>
                 <w:szCs w:val="18"/>
                 <w:lang w:val="en-CA"/>
@@ -4373,6 +4472,7 @@
           <w:p>
             <w:pPr>
               <w:rPr>
+                <w:rFonts w:hint="eastAsia"/>
                 <w:sz w:val="16"/>
                 <w:szCs w:val="18"/>
                 <w:lang w:val="en-CA"/>
@@ -4438,6 +4538,7 @@
           <w:p>
             <w:pPr>
               <w:rPr>
+                <w:rFonts w:hint="eastAsia"/>
                 <w:sz w:val="16"/>
                 <w:szCs w:val="18"/>
                 <w:lang w:val="en-CA"/>
@@ -4469,6 +4570,7 @@
           <w:p>
             <w:pPr>
               <w:rPr>
+                <w:rFonts w:hint="eastAsia"/>
                 <w:sz w:val="16"/>
                 <w:szCs w:val="18"/>
                 <w:lang w:val="en-CA"/>
@@ -4495,15 +4597,6 @@
         </w:tc>
       </w:tr>
     </w:tbl>
-    <w:p>
-      <w:pPr>
-        <w:rPr>
-          <w:sz w:val="16"/>
-          <w:szCs w:val="18"/>
-          <w:lang w:val="en-CA"/>
-        </w:rPr>
-      </w:pPr>
-    </w:p>
     <w:p>
       <w:pPr>
         <w:jc w:val="center"/>
@@ -4515,6 +4608,18 @@
           <w:lang w:val="en-CA"/>
         </w:rPr>
       </w:pPr>
+    </w:p>
+    <w:p>
+      <w:pPr>
+        <w:jc w:val="center"/>
+        <w:rPr>
+          <w:b/>
+          <w:bCs/>
+          <w:sz w:val="28"/>
+          <w:szCs w:val="32"/>
+          <w:lang w:val="en-CA"/>
+        </w:rPr>
+      </w:pPr>
       <w:r>
         <w:rPr>
           <w:b/>
@@ -4523,7 +4628,7 @@
           <w:szCs w:val="32"/>
           <w:lang w:val="en-CA"/>
         </w:rPr>
-        <w:t>ColorPicker</w:t>
+        <w:t>TorusMenu</w:t>
       </w:r>
       <w:r>
         <w:rPr>
@@ -4559,6 +4664,7 @@
           <w:p>
             <w:pPr>
               <w:rPr>
+                <w:rFonts w:hint="eastAsia"/>
                 <w:sz w:val="16"/>
                 <w:szCs w:val="18"/>
               </w:rPr>
@@ -4594,6 +4700,7 @@
           <w:p>
             <w:pPr>
               <w:rPr>
+                <w:rFonts w:hint="eastAsia"/>
                 <w:sz w:val="16"/>
                 <w:szCs w:val="18"/>
                 <w:lang w:val="en-CA"/>
@@ -4623,6 +4730,7 @@
           <w:p>
             <w:pPr>
               <w:rPr>
+                <w:rFonts w:hint="eastAsia"/>
                 <w:sz w:val="16"/>
                 <w:szCs w:val="18"/>
                 <w:lang w:val="en-CA"/>
@@ -4654,6 +4762,7 @@
           <w:p>
             <w:pPr>
               <w:rPr>
+                <w:rFonts w:hint="eastAsia"/>
                 <w:sz w:val="16"/>
                 <w:szCs w:val="18"/>
                 <w:lang w:val="en-CA"/>
@@ -4685,6 +4794,7 @@
           <w:p>
             <w:pPr>
               <w:rPr>
+                <w:rFonts w:hint="eastAsia"/>
                 <w:sz w:val="16"/>
                 <w:szCs w:val="18"/>
                 <w:lang w:val="en-CA"/>
@@ -4729,7 +4839,7 @@
                 <w:szCs w:val="18"/>
                 <w:lang w:val="en-CA"/>
               </w:rPr>
-              <w:t>ColorPicker.tsx, Styles.tsx, App.tsx</w:t>
+              <w:t xml:space="preserve"> TorusMenu.tsx</w:t>
             </w:r>
           </w:p>
         </w:tc>
@@ -4747,20 +4857,11 @@
             </w:pPr>
             <w:r>
               <w:rPr>
-                <w:rFonts w:hint="eastAsia"/>
-                <w:sz w:val="16"/>
-                <w:szCs w:val="18"/>
-                <w:lang w:val="en-CA"/>
-              </w:rPr>
-              <w:t>S</w:t>
-            </w:r>
-            <w:r>
-              <w:rPr>
-                <w:sz w:val="16"/>
-                <w:szCs w:val="18"/>
-                <w:lang w:val="en-CA"/>
-              </w:rPr>
-              <w:t xml:space="preserve">tyles: color picker: live color updating test </w:t>
+                <w:sz w:val="16"/>
+                <w:szCs w:val="18"/>
+                <w:lang w:val="en-CA"/>
+              </w:rPr>
+              <w:t>torus menu: hitbox check</w:t>
             </w:r>
           </w:p>
         </w:tc>
@@ -4783,15 +4884,32 @@
                 <w:szCs w:val="18"/>
                 <w:lang w:val="en-CA"/>
               </w:rPr>
-              <w:t>F</w:t>
-            </w:r>
-            <w:r>
-              <w:rPr>
-                <w:sz w:val="16"/>
-                <w:szCs w:val="18"/>
-                <w:lang w:val="en-CA"/>
-              </w:rPr>
-              <w:t>or any color, click on the color rectangle in the styles page and start dragging around the color picker in the color wheel</w:t>
+              <w:t>O</w:t>
+            </w:r>
+            <w:r>
+              <w:rPr>
+                <w:sz w:val="16"/>
+                <w:szCs w:val="18"/>
+                <w:lang w:val="en-CA"/>
+              </w:rPr>
+              <w:t xml:space="preserve">n the timeline, open the torus menu. </w:t>
+            </w:r>
+            <w:r>
+              <w:rPr>
+                <w:rFonts w:hint="eastAsia"/>
+                <w:sz w:val="16"/>
+                <w:szCs w:val="18"/>
+                <w:lang w:val="en-CA"/>
+              </w:rPr>
+              <w:t>T</w:t>
+            </w:r>
+            <w:r>
+              <w:rPr>
+                <w:sz w:val="16"/>
+                <w:szCs w:val="18"/>
+                <w:lang w:val="en-CA"/>
+              </w:rPr>
+              <w:t>hen, on a 45 degree angle right outside the circle, click.</w:t>
             </w:r>
           </w:p>
         </w:tc>
@@ -4822,8 +4940,211 @@
                 <w:szCs w:val="18"/>
                 <w:lang w:val="en-CA"/>
               </w:rPr>
-              <w:t xml:space="preserve">he color should update in real time in the editor. </w:t>
-            </w:r>
+              <w:t xml:space="preserve">he torus menu should close. </w:t>
+            </w:r>
+            <w:r>
+              <w:rPr>
+                <w:rFonts w:hint="eastAsia"/>
+                <w:sz w:val="16"/>
+                <w:szCs w:val="18"/>
+                <w:lang w:val="en-CA"/>
+              </w:rPr>
+              <w:t>I</w:t>
+            </w:r>
+            <w:r>
+              <w:rPr>
+                <w:sz w:val="16"/>
+                <w:szCs w:val="18"/>
+                <w:lang w:val="en-CA"/>
+              </w:rPr>
+              <w:t>f it doesn’t, that means it’s using a square hitbox instead of a round one</w:t>
+            </w:r>
+          </w:p>
+        </w:tc>
+        <w:tc>
+          <w:tcPr>
+            <w:tcW w:w="2410" w:type="dxa"/>
+          </w:tcPr>
+          <w:p>
+            <w:pPr>
+              <w:rPr>
+                <w:rFonts w:hint="eastAsia"/>
+                <w:sz w:val="16"/>
+                <w:szCs w:val="18"/>
+                <w:lang w:val="en-CA"/>
+              </w:rPr>
+            </w:pPr>
+            <w:r>
+              <w:rPr>
+                <w:sz w:val="16"/>
+                <w:szCs w:val="18"/>
+                <w:lang w:val="en-CA"/>
+              </w:rPr>
+              <w:t>5bddf836872611033759d627746d8b4161bba22a</w:t>
+            </w:r>
+          </w:p>
+        </w:tc>
+      </w:tr>
+    </w:tbl>
+    <w:p>
+      <w:pPr>
+        <w:rPr>
+          <w:sz w:val="16"/>
+          <w:szCs w:val="18"/>
+          <w:lang w:val="en-CA"/>
+        </w:rPr>
+      </w:pPr>
+    </w:p>
+    <w:p>
+      <w:pPr>
+        <w:jc w:val="center"/>
+        <w:rPr>
+          <w:rFonts w:hint="eastAsia"/>
+          <w:b/>
+          <w:bCs/>
+          <w:sz w:val="28"/>
+          <w:szCs w:val="32"/>
+          <w:lang w:val="en-CA"/>
+        </w:rPr>
+      </w:pPr>
+      <w:r>
+        <w:rPr>
+          <w:b/>
+          <w:bCs/>
+          <w:sz w:val="28"/>
+          <w:szCs w:val="32"/>
+          <w:lang w:val="en-CA"/>
+        </w:rPr>
+        <w:t>ColorPicker.tsx</w:t>
+      </w:r>
+    </w:p>
+    <w:tbl>
+      <w:tblPr>
+        <w:tblStyle w:val="ae"/>
+        <w:tblW w:w="11624" w:type="dxa"/>
+        <w:tblInd w:w="-1706" w:type="dxa"/>
+        <w:tblLayout w:type="fixed"/>
+        <w:tblLook w:val="04A0" w:firstRow="1" w:lastRow="0" w:firstColumn="1" w:lastColumn="0" w:noHBand="0" w:noVBand="1"/>
+      </w:tblPr>
+      <w:tblGrid>
+        <w:gridCol w:w="1843"/>
+        <w:gridCol w:w="1843"/>
+        <w:gridCol w:w="2410"/>
+        <w:gridCol w:w="3118"/>
+        <w:gridCol w:w="2410"/>
+      </w:tblGrid>
+      <w:tr>
+        <w:tc>
+          <w:tcPr>
+            <w:tcW w:w="1843" w:type="dxa"/>
+          </w:tcPr>
+          <w:p>
+            <w:pPr>
+              <w:rPr>
+                <w:rFonts w:hint="eastAsia"/>
+                <w:sz w:val="16"/>
+                <w:szCs w:val="18"/>
+              </w:rPr>
+            </w:pPr>
+            <w:r>
+              <w:rPr>
+                <w:sz w:val="16"/>
+                <w:szCs w:val="18"/>
+              </w:rPr>
+              <w:t>Relevant f</w:t>
+            </w:r>
+            <w:r>
+              <w:rPr>
+                <w:rFonts w:hint="eastAsia"/>
+                <w:sz w:val="16"/>
+                <w:szCs w:val="18"/>
+              </w:rPr>
+              <w:t>ile</w:t>
+            </w:r>
+            <w:r>
+              <w:rPr>
+                <w:sz w:val="16"/>
+                <w:szCs w:val="18"/>
+              </w:rPr>
+              <w:t>(s)</w:t>
+            </w:r>
+          </w:p>
+        </w:tc>
+        <w:tc>
+          <w:tcPr>
+            <w:tcW w:w="1843" w:type="dxa"/>
+          </w:tcPr>
+          <w:p>
+            <w:pPr>
+              <w:rPr>
+                <w:rFonts w:hint="eastAsia"/>
+                <w:sz w:val="16"/>
+                <w:szCs w:val="18"/>
+                <w:lang w:val="en-CA"/>
+              </w:rPr>
+            </w:pPr>
+            <w:r>
+              <w:rPr>
+                <w:rFonts w:hint="eastAsia"/>
+                <w:sz w:val="16"/>
+                <w:szCs w:val="18"/>
+              </w:rPr>
+              <w:t>C</w:t>
+            </w:r>
+            <w:r>
+              <w:rPr>
+                <w:sz w:val="16"/>
+                <w:szCs w:val="18"/>
+              </w:rPr>
+              <w:t>omponent</w:t>
+            </w:r>
+          </w:p>
+        </w:tc>
+        <w:tc>
+          <w:tcPr>
+            <w:tcW w:w="2410" w:type="dxa"/>
+          </w:tcPr>
+          <w:p>
+            <w:pPr>
+              <w:rPr>
+                <w:rFonts w:hint="eastAsia"/>
+                <w:sz w:val="16"/>
+                <w:szCs w:val="18"/>
+                <w:lang w:val="en-CA"/>
+              </w:rPr>
+            </w:pPr>
+            <w:r>
+              <w:rPr>
+                <w:rFonts w:hint="eastAsia"/>
+                <w:sz w:val="16"/>
+                <w:szCs w:val="18"/>
+                <w:lang w:val="en-CA"/>
+              </w:rPr>
+              <w:t>H</w:t>
+            </w:r>
+            <w:r>
+              <w:rPr>
+                <w:sz w:val="16"/>
+                <w:szCs w:val="18"/>
+                <w:lang w:val="en-CA"/>
+              </w:rPr>
+              <w:t>ow to test</w:t>
+            </w:r>
+          </w:p>
+        </w:tc>
+        <w:tc>
+          <w:tcPr>
+            <w:tcW w:w="3118" w:type="dxa"/>
+          </w:tcPr>
+          <w:p>
+            <w:pPr>
+              <w:rPr>
+                <w:rFonts w:hint="eastAsia"/>
+                <w:sz w:val="16"/>
+                <w:szCs w:val="18"/>
+                <w:lang w:val="en-CA"/>
+              </w:rPr>
+            </w:pPr>
             <w:r>
               <w:rPr>
                 <w:rFonts w:hint="eastAsia"/>
@@ -4839,7 +5160,7 @@
                 <w:szCs w:val="18"/>
                 <w:lang w:val="en-CA"/>
               </w:rPr>
-              <w:t>very element using that color should change instantaneously with no lag</w:t>
+              <w:t>xpected outcome</w:t>
             </w:r>
           </w:p>
         </w:tc>
@@ -4850,88 +5171,12 @@
           <w:p>
             <w:pPr>
               <w:rPr>
-                <w:sz w:val="16"/>
-                <w:szCs w:val="18"/>
-                <w:lang w:val="en-CA"/>
-              </w:rPr>
-            </w:pPr>
-            <w:r>
-              <w:rPr>
-                <w:rFonts w:hint="eastAsia"/>
-                <w:sz w:val="16"/>
-                <w:szCs w:val="18"/>
-                <w:lang w:val="en-CA"/>
-              </w:rPr>
-              <w:t>P</w:t>
-            </w:r>
-            <w:r>
-              <w:rPr>
-                <w:sz w:val="16"/>
-                <w:szCs w:val="18"/>
-                <w:lang w:val="en-CA"/>
-              </w:rPr>
-              <w:t xml:space="preserve">artially working as of </w:t>
-            </w:r>
-            <w:r>
-              <w:rPr>
-                <w:sz w:val="16"/>
-                <w:szCs w:val="18"/>
-                <w:lang w:val="en-CA"/>
-              </w:rPr>
-              <w:t>5bddf836872611033759d627746d8b4161bba22a</w:t>
-            </w:r>
-            <w:r>
-              <w:rPr>
-                <w:sz w:val="16"/>
-                <w:szCs w:val="18"/>
-                <w:lang w:val="en-CA"/>
-              </w:rPr>
-              <w:t>.</w:t>
-            </w:r>
-          </w:p>
-          <w:p>
-            <w:pPr>
-              <w:rPr>
-                <w:rFonts w:hint="eastAsia"/>
-                <w:sz w:val="16"/>
-                <w:szCs w:val="18"/>
-                <w:lang w:val="en-CA"/>
-              </w:rPr>
-            </w:pPr>
-            <w:r>
-              <w:rPr>
-                <w:rFonts w:hint="eastAsia"/>
-                <w:sz w:val="16"/>
-                <w:szCs w:val="18"/>
-                <w:lang w:val="en-CA"/>
-              </w:rPr>
-              <w:t>C</w:t>
-            </w:r>
-            <w:r>
-              <w:rPr>
-                <w:sz w:val="16"/>
-                <w:szCs w:val="18"/>
-                <w:lang w:val="en-CA"/>
-              </w:rPr>
-              <w:t xml:space="preserve">olors are being updated, however the “color change transition duration” in milliseconds affects the lag of the real time color change. </w:t>
-            </w:r>
-            <w:r>
-              <w:rPr>
-                <w:rFonts w:hint="eastAsia"/>
-                <w:sz w:val="16"/>
-                <w:szCs w:val="18"/>
-                <w:lang w:val="en-CA"/>
-              </w:rPr>
-              <w:t>I</w:t>
-            </w:r>
-            <w:r>
-              <w:rPr>
-                <w:sz w:val="16"/>
-                <w:szCs w:val="18"/>
-                <w:lang w:val="en-CA"/>
-              </w:rPr>
-              <w:t xml:space="preserve">t like waits 500ms then changes. </w:t>
-            </w:r>
+                <w:rFonts w:hint="eastAsia"/>
+                <w:sz w:val="16"/>
+                <w:szCs w:val="18"/>
+                <w:lang w:val="en-CA"/>
+              </w:rPr>
+            </w:pPr>
             <w:r>
               <w:rPr>
                 <w:rFonts w:hint="eastAsia"/>
@@ -4947,41 +5192,7 @@
                 <w:szCs w:val="18"/>
                 <w:lang w:val="en-CA"/>
               </w:rPr>
-              <w:t xml:space="preserve">hat’s wrong. </w:t>
-            </w:r>
-            <w:r>
-              <w:rPr>
-                <w:rFonts w:hint="eastAsia"/>
-                <w:sz w:val="16"/>
-                <w:szCs w:val="18"/>
-                <w:lang w:val="en-CA"/>
-              </w:rPr>
-              <w:t>I</w:t>
-            </w:r>
-            <w:r>
-              <w:rPr>
-                <w:sz w:val="16"/>
-                <w:szCs w:val="18"/>
-                <w:lang w:val="en-CA"/>
-              </w:rPr>
-              <w:t xml:space="preserve">t should update in real time. </w:t>
-            </w:r>
-            <w:r>
-              <w:rPr>
-                <w:rFonts w:hint="eastAsia"/>
-                <w:sz w:val="16"/>
-                <w:szCs w:val="18"/>
-                <w:lang w:val="en-CA"/>
-              </w:rPr>
-              <w:t>I</w:t>
-            </w:r>
-            <w:r>
-              <w:rPr>
-                <w:sz w:val="16"/>
-                <w:szCs w:val="18"/>
-                <w:lang w:val="en-CA"/>
-              </w:rPr>
-              <w:t>t should only smoothly transition for 500ms when changing color themes by clicking on themes in the styles page.</w:t>
+              <w:t>ested on (commit) and notes</w:t>
             </w:r>
           </w:p>
         </w:tc>
@@ -4994,6 +5205,288 @@
           <w:p>
             <w:pPr>
               <w:rPr>
+                <w:rFonts w:hint="eastAsia"/>
+                <w:sz w:val="16"/>
+                <w:szCs w:val="18"/>
+                <w:lang w:val="en-CA"/>
+              </w:rPr>
+            </w:pPr>
+            <w:r>
+              <w:rPr>
+                <w:sz w:val="16"/>
+                <w:szCs w:val="18"/>
+                <w:lang w:val="en-CA"/>
+              </w:rPr>
+              <w:t>ColorPicker.tsx, Styles.tsx, App.tsx</w:t>
+            </w:r>
+          </w:p>
+        </w:tc>
+        <w:tc>
+          <w:tcPr>
+            <w:tcW w:w="1843" w:type="dxa"/>
+          </w:tcPr>
+          <w:p>
+            <w:pPr>
+              <w:rPr>
+                <w:rFonts w:hint="eastAsia"/>
+                <w:sz w:val="16"/>
+                <w:szCs w:val="18"/>
+                <w:lang w:val="en-CA"/>
+              </w:rPr>
+            </w:pPr>
+            <w:r>
+              <w:rPr>
+                <w:rFonts w:hint="eastAsia"/>
+                <w:sz w:val="16"/>
+                <w:szCs w:val="18"/>
+                <w:lang w:val="en-CA"/>
+              </w:rPr>
+              <w:t>S</w:t>
+            </w:r>
+            <w:r>
+              <w:rPr>
+                <w:sz w:val="16"/>
+                <w:szCs w:val="18"/>
+                <w:lang w:val="en-CA"/>
+              </w:rPr>
+              <w:t xml:space="preserve">tyles: color picker: live color updating test </w:t>
+            </w:r>
+          </w:p>
+        </w:tc>
+        <w:tc>
+          <w:tcPr>
+            <w:tcW w:w="2410" w:type="dxa"/>
+          </w:tcPr>
+          <w:p>
+            <w:pPr>
+              <w:rPr>
+                <w:rFonts w:hint="eastAsia"/>
+                <w:sz w:val="16"/>
+                <w:szCs w:val="18"/>
+                <w:lang w:val="en-CA"/>
+              </w:rPr>
+            </w:pPr>
+            <w:r>
+              <w:rPr>
+                <w:rFonts w:hint="eastAsia"/>
+                <w:sz w:val="16"/>
+                <w:szCs w:val="18"/>
+                <w:lang w:val="en-CA"/>
+              </w:rPr>
+              <w:t>F</w:t>
+            </w:r>
+            <w:r>
+              <w:rPr>
+                <w:sz w:val="16"/>
+                <w:szCs w:val="18"/>
+                <w:lang w:val="en-CA"/>
+              </w:rPr>
+              <w:t>or any color, click on the color rectangle in the styles page and start dragging around the color picker in the color wheel</w:t>
+            </w:r>
+          </w:p>
+        </w:tc>
+        <w:tc>
+          <w:tcPr>
+            <w:tcW w:w="3118" w:type="dxa"/>
+          </w:tcPr>
+          <w:p>
+            <w:pPr>
+              <w:rPr>
+                <w:rFonts w:hint="eastAsia"/>
+                <w:sz w:val="16"/>
+                <w:szCs w:val="18"/>
+                <w:lang w:val="en-CA"/>
+              </w:rPr>
+            </w:pPr>
+            <w:r>
+              <w:rPr>
+                <w:rFonts w:hint="eastAsia"/>
+                <w:sz w:val="16"/>
+                <w:szCs w:val="18"/>
+                <w:lang w:val="en-CA"/>
+              </w:rPr>
+              <w:t>T</w:t>
+            </w:r>
+            <w:r>
+              <w:rPr>
+                <w:sz w:val="16"/>
+                <w:szCs w:val="18"/>
+                <w:lang w:val="en-CA"/>
+              </w:rPr>
+              <w:t xml:space="preserve">he color should update in real time in the editor. </w:t>
+            </w:r>
+            <w:r>
+              <w:rPr>
+                <w:rFonts w:hint="eastAsia"/>
+                <w:sz w:val="16"/>
+                <w:szCs w:val="18"/>
+                <w:lang w:val="en-CA"/>
+              </w:rPr>
+              <w:t>E</w:t>
+            </w:r>
+            <w:r>
+              <w:rPr>
+                <w:sz w:val="16"/>
+                <w:szCs w:val="18"/>
+                <w:lang w:val="en-CA"/>
+              </w:rPr>
+              <w:t>very element using that color should change instantaneously with no lag</w:t>
+            </w:r>
+          </w:p>
+        </w:tc>
+        <w:tc>
+          <w:tcPr>
+            <w:tcW w:w="2410" w:type="dxa"/>
+          </w:tcPr>
+          <w:p>
+            <w:pPr>
+              <w:rPr>
+                <w:rFonts w:hint="eastAsia"/>
+                <w:sz w:val="16"/>
+                <w:szCs w:val="18"/>
+                <w:lang w:val="en-CA"/>
+              </w:rPr>
+            </w:pPr>
+            <w:r>
+              <w:rPr>
+                <w:rFonts w:hint="eastAsia"/>
+                <w:sz w:val="16"/>
+                <w:szCs w:val="18"/>
+                <w:lang w:val="en-CA"/>
+              </w:rPr>
+              <w:t>P</w:t>
+            </w:r>
+            <w:r>
+              <w:rPr>
+                <w:sz w:val="16"/>
+                <w:szCs w:val="18"/>
+                <w:lang w:val="en-CA"/>
+              </w:rPr>
+              <w:t xml:space="preserve">artially working as of </w:t>
+            </w:r>
+            <w:r>
+              <w:rPr>
+                <w:sz w:val="16"/>
+                <w:szCs w:val="18"/>
+                <w:lang w:val="en-CA"/>
+              </w:rPr>
+              <w:t>5bddf836872611033759d627746d8b4161bba22a</w:t>
+            </w:r>
+            <w:r>
+              <w:rPr>
+                <w:sz w:val="16"/>
+                <w:szCs w:val="18"/>
+                <w:lang w:val="en-CA"/>
+              </w:rPr>
+              <w:t>.</w:t>
+            </w:r>
+          </w:p>
+          <w:p>
+            <w:pPr>
+              <w:rPr>
+                <w:rFonts w:hint="eastAsia"/>
+                <w:sz w:val="16"/>
+                <w:szCs w:val="18"/>
+                <w:lang w:val="en-CA"/>
+              </w:rPr>
+            </w:pPr>
+            <w:r>
+              <w:rPr>
+                <w:rFonts w:hint="eastAsia"/>
+                <w:sz w:val="16"/>
+                <w:szCs w:val="18"/>
+                <w:lang w:val="en-CA"/>
+              </w:rPr>
+              <w:t>C</w:t>
+            </w:r>
+            <w:r>
+              <w:rPr>
+                <w:sz w:val="16"/>
+                <w:szCs w:val="18"/>
+                <w:lang w:val="en-CA"/>
+              </w:rPr>
+              <w:t xml:space="preserve">olors are being updated, however the “color change transition duration” in milliseconds affects the lag of the real time color change. </w:t>
+            </w:r>
+            <w:r>
+              <w:rPr>
+                <w:rFonts w:hint="eastAsia"/>
+                <w:sz w:val="16"/>
+                <w:szCs w:val="18"/>
+                <w:lang w:val="en-CA"/>
+              </w:rPr>
+              <w:t>I</w:t>
+            </w:r>
+            <w:r>
+              <w:rPr>
+                <w:sz w:val="16"/>
+                <w:szCs w:val="18"/>
+                <w:lang w:val="en-CA"/>
+              </w:rPr>
+              <w:t xml:space="preserve">t like waits 500ms then changes. </w:t>
+            </w:r>
+            <w:r>
+              <w:rPr>
+                <w:rFonts w:hint="eastAsia"/>
+                <w:sz w:val="16"/>
+                <w:szCs w:val="18"/>
+                <w:lang w:val="en-CA"/>
+              </w:rPr>
+              <w:t>T</w:t>
+            </w:r>
+            <w:r>
+              <w:rPr>
+                <w:sz w:val="16"/>
+                <w:szCs w:val="18"/>
+                <w:lang w:val="en-CA"/>
+              </w:rPr>
+              <w:t xml:space="preserve">hat’s wrong. </w:t>
+            </w:r>
+            <w:r>
+              <w:rPr>
+                <w:rFonts w:hint="eastAsia"/>
+                <w:sz w:val="16"/>
+                <w:szCs w:val="18"/>
+                <w:lang w:val="en-CA"/>
+              </w:rPr>
+              <w:t>I</w:t>
+            </w:r>
+            <w:r>
+              <w:rPr>
+                <w:sz w:val="16"/>
+                <w:szCs w:val="18"/>
+                <w:lang w:val="en-CA"/>
+              </w:rPr>
+              <w:t xml:space="preserve">t should update in real time. </w:t>
+            </w:r>
+            <w:r>
+              <w:rPr>
+                <w:rFonts w:hint="eastAsia"/>
+                <w:sz w:val="16"/>
+                <w:szCs w:val="18"/>
+                <w:lang w:val="en-CA"/>
+              </w:rPr>
+              <w:t>I</w:t>
+            </w:r>
+            <w:r>
+              <w:rPr>
+                <w:sz w:val="16"/>
+                <w:szCs w:val="18"/>
+                <w:lang w:val="en-CA"/>
+              </w:rPr>
+              <w:t>t should only smoothly transition for 500ms when changing color themes by clicking on themes in the styles page.</w:t>
+            </w:r>
+          </w:p>
+        </w:tc>
+      </w:tr>
+      <w:tr>
+        <w:tc>
+          <w:tcPr>
+            <w:tcW w:w="1843" w:type="dxa"/>
+          </w:tcPr>
+          <w:p>
+            <w:pPr>
+              <w:rPr>
+                <w:rFonts w:hint="eastAsia"/>
                 <w:sz w:val="16"/>
                 <w:szCs w:val="18"/>
                 <w:lang w:val="en-CA"/>
@@ -5016,6 +5509,7 @@
           <w:p>
             <w:pPr>
               <w:rPr>
+                <w:rFonts w:hint="eastAsia"/>
                 <w:sz w:val="16"/>
                 <w:szCs w:val="18"/>
                 <w:lang w:val="en-CA"/>
@@ -5052,6 +5546,7 @@
                 <w:numId w:val="5"/>
               </w:numPr>
               <w:rPr>
+                <w:rFonts w:hint="eastAsia"/>
                 <w:sz w:val="16"/>
                 <w:szCs w:val="18"/>
                 <w:lang w:val="en-CA"/>
@@ -5083,6 +5578,7 @@
                 <w:numId w:val="5"/>
               </w:numPr>
               <w:rPr>
+                <w:rFonts w:hint="eastAsia"/>
                 <w:sz w:val="16"/>
                 <w:szCs w:val="18"/>
                 <w:lang w:val="en-CA"/>
@@ -5119,6 +5615,7 @@
                 <w:numId w:val="6"/>
               </w:numPr>
               <w:rPr>
+                <w:rFonts w:hint="eastAsia"/>
                 <w:sz w:val="16"/>
                 <w:szCs w:val="18"/>
                 <w:lang w:val="en-CA"/>
@@ -5150,6 +5647,7 @@
                 <w:numId w:val="6"/>
               </w:numPr>
               <w:rPr>
+                <w:rFonts w:hint="eastAsia"/>
                 <w:sz w:val="16"/>
                 <w:szCs w:val="18"/>
                 <w:lang w:val="en-CA"/>
@@ -5181,6 +5679,7 @@
           <w:p>
             <w:pPr>
               <w:rPr>
+                <w:rFonts w:hint="eastAsia"/>
                 <w:sz w:val="16"/>
                 <w:szCs w:val="18"/>
                 <w:lang w:val="en-CA"/>
@@ -5211,6 +5710,215 @@
               </w:rPr>
               <w:t>5bddf836872611033759d627746d8b4161bba22a</w:t>
             </w:r>
+          </w:p>
+        </w:tc>
+      </w:tr>
+      <w:tr>
+        <w:tc>
+          <w:tcPr>
+            <w:tcW w:w="1843" w:type="dxa"/>
+          </w:tcPr>
+          <w:p>
+            <w:pPr>
+              <w:rPr>
+                <w:rFonts w:hint="eastAsia"/>
+                <w:sz w:val="16"/>
+                <w:szCs w:val="18"/>
+                <w:lang w:val="en-CA"/>
+              </w:rPr>
+            </w:pPr>
+            <w:r>
+              <w:rPr>
+                <w:sz w:val="16"/>
+                <w:szCs w:val="18"/>
+                <w:lang w:val="en-CA"/>
+              </w:rPr>
+              <w:t>ColorPicker.tsx</w:t>
+            </w:r>
+          </w:p>
+        </w:tc>
+        <w:tc>
+          <w:tcPr>
+            <w:tcW w:w="1843" w:type="dxa"/>
+          </w:tcPr>
+          <w:p>
+            <w:pPr>
+              <w:rPr>
+                <w:rFonts w:hint="eastAsia"/>
+                <w:sz w:val="16"/>
+                <w:szCs w:val="18"/>
+                <w:lang w:val="en-CA"/>
+              </w:rPr>
+            </w:pPr>
+            <w:r>
+              <w:rPr>
+                <w:rFonts w:hint="eastAsia"/>
+                <w:sz w:val="16"/>
+                <w:szCs w:val="18"/>
+                <w:lang w:val="en-CA"/>
+              </w:rPr>
+              <w:t>C</w:t>
+            </w:r>
+            <w:r>
+              <w:rPr>
+                <w:sz w:val="16"/>
+                <w:szCs w:val="18"/>
+                <w:lang w:val="en-CA"/>
+              </w:rPr>
+              <w:t>olor picker: enter hex code</w:t>
+            </w:r>
+          </w:p>
+        </w:tc>
+        <w:tc>
+          <w:tcPr>
+            <w:tcW w:w="2410" w:type="dxa"/>
+          </w:tcPr>
+          <w:p>
+            <w:pPr>
+              <w:pStyle w:val="a9"/>
+              <w:numPr>
+                <w:ilvl w:val="0"/>
+                <w:numId w:val="7"/>
+              </w:numPr>
+              <w:rPr>
+                <w:rFonts w:hint="eastAsia"/>
+                <w:sz w:val="16"/>
+                <w:szCs w:val="18"/>
+                <w:lang w:val="en-CA"/>
+              </w:rPr>
+            </w:pPr>
+            <w:r>
+              <w:rPr>
+                <w:rFonts w:hint="eastAsia"/>
+                <w:sz w:val="16"/>
+                <w:szCs w:val="18"/>
+                <w:lang w:val="en-CA"/>
+              </w:rPr>
+              <w:t>I</w:t>
+            </w:r>
+            <w:r>
+              <w:rPr>
+                <w:sz w:val="16"/>
+                <w:szCs w:val="18"/>
+                <w:lang w:val="en-CA"/>
+              </w:rPr>
+              <w:t xml:space="preserve">n the color picker, try to delete the hex code </w:t>
+            </w:r>
+            <w:r>
+              <w:rPr>
+                <w:sz w:val="16"/>
+                <w:szCs w:val="18"/>
+                <w:lang w:val="en-CA"/>
+              </w:rPr>
+              <w:lastRenderedPageBreak/>
+              <w:t>completely</w:t>
+            </w:r>
+          </w:p>
+          <w:p>
+            <w:pPr>
+              <w:pStyle w:val="a9"/>
+              <w:numPr>
+                <w:ilvl w:val="0"/>
+                <w:numId w:val="7"/>
+              </w:numPr>
+              <w:rPr>
+                <w:rFonts w:hint="eastAsia"/>
+                <w:sz w:val="16"/>
+                <w:szCs w:val="18"/>
+                <w:lang w:val="en-CA"/>
+              </w:rPr>
+            </w:pPr>
+            <w:r>
+              <w:rPr>
+                <w:rFonts w:hint="eastAsia"/>
+                <w:sz w:val="16"/>
+                <w:szCs w:val="18"/>
+                <w:lang w:val="en-CA"/>
+              </w:rPr>
+              <w:t>T</w:t>
+            </w:r>
+            <w:r>
+              <w:rPr>
+                <w:sz w:val="16"/>
+                <w:szCs w:val="18"/>
+                <w:lang w:val="en-CA"/>
+              </w:rPr>
+              <w:t>ry to type in a new hex code</w:t>
+            </w:r>
+          </w:p>
+        </w:tc>
+        <w:tc>
+          <w:tcPr>
+            <w:tcW w:w="3118" w:type="dxa"/>
+          </w:tcPr>
+          <w:p>
+            <w:pPr>
+              <w:rPr>
+                <w:rFonts w:hint="eastAsia"/>
+                <w:sz w:val="16"/>
+                <w:szCs w:val="18"/>
+                <w:lang w:val="en-CA"/>
+              </w:rPr>
+            </w:pPr>
+            <w:r>
+              <w:rPr>
+                <w:rFonts w:hint="eastAsia"/>
+                <w:sz w:val="16"/>
+                <w:szCs w:val="18"/>
+                <w:lang w:val="en-CA"/>
+              </w:rPr>
+              <w:lastRenderedPageBreak/>
+              <w:t>Y</w:t>
+            </w:r>
+            <w:r>
+              <w:rPr>
+                <w:sz w:val="16"/>
+                <w:szCs w:val="18"/>
+                <w:lang w:val="en-CA"/>
+              </w:rPr>
+              <w:t xml:space="preserve">ou should be able to delete and type in the hex code perfectly with no </w:t>
+            </w:r>
+            <w:r>
+              <w:rPr>
+                <w:sz w:val="16"/>
+                <w:szCs w:val="18"/>
+                <w:lang w:val="en-CA"/>
+              </w:rPr>
+              <w:lastRenderedPageBreak/>
+              <w:t xml:space="preserve">interruptions. </w:t>
+            </w:r>
+            <w:r>
+              <w:rPr>
+                <w:rFonts w:hint="eastAsia"/>
+                <w:sz w:val="16"/>
+                <w:szCs w:val="18"/>
+                <w:lang w:val="en-CA"/>
+              </w:rPr>
+              <w:t>A</w:t>
+            </w:r>
+            <w:r>
+              <w:rPr>
+                <w:sz w:val="16"/>
+                <w:szCs w:val="18"/>
+                <w:lang w:val="en-CA"/>
+              </w:rPr>
+              <w:t>fter you finished typing in your new hex code, the new color should update both in the color picker (the color wheel and the lightness slider) and in the color of the component that your editing</w:t>
+            </w:r>
+          </w:p>
+        </w:tc>
+        <w:tc>
+          <w:tcPr>
+            <w:tcW w:w="2410" w:type="dxa"/>
+          </w:tcPr>
+          <w:p>
+            <w:pPr>
+              <w:rPr>
+                <w:rFonts w:hint="eastAsia"/>
+                <w:sz w:val="16"/>
+                <w:szCs w:val="18"/>
+                <w:lang w:val="en-CA"/>
+              </w:rPr>
+            </w:pPr>
           </w:p>
         </w:tc>
       </w:tr>
@@ -5218,6 +5926,7 @@
     <w:p>
       <w:pPr>
         <w:rPr>
+          <w:rFonts w:hint="eastAsia"/>
           <w:sz w:val="16"/>
           <w:szCs w:val="18"/>
           <w:lang w:val="en-CA"/>
@@ -5770,6 +6479,95 @@
       </w:pPr>
     </w:lvl>
   </w:abstractNum>
+  <w:abstractNum w:abstractNumId="6" w15:restartNumberingAfterBreak="0">
+    <w:nsid w:val="764038CC"/>
+    <w:multiLevelType w:val="hybridMultilevel"/>
+    <w:tmpl w:val="E96EE288"/>
+    <w:lvl w:ilvl="0" w:tplc="F6C45032">
+      <w:start w:val="1"/>
+      <w:numFmt w:val="decimal"/>
+      <w:lvlText w:val="%1."/>
+      <w:lvlJc w:val="left"/>
+      <w:pPr>
+        <w:ind w:left="360" w:hanging="360"/>
+      </w:pPr>
+      <w:rPr>
+        <w:rFonts w:hint="default"/>
+      </w:rPr>
+    </w:lvl>
+    <w:lvl w:ilvl="1" w:tplc="04090019" w:tentative="1">
+      <w:start w:val="1"/>
+      <w:numFmt w:val="lowerLetter"/>
+      <w:lvlText w:val="%2)"/>
+      <w:lvlJc w:val="left"/>
+      <w:pPr>
+        <w:ind w:left="880" w:hanging="440"/>
+      </w:pPr>
+    </w:lvl>
+    <w:lvl w:ilvl="2" w:tplc="0409001B" w:tentative="1">
+      <w:start w:val="1"/>
+      <w:numFmt w:val="lowerRoman"/>
+      <w:lvlText w:val="%3."/>
+      <w:lvlJc w:val="right"/>
+      <w:pPr>
+        <w:ind w:left="1320" w:hanging="440"/>
+      </w:pPr>
+    </w:lvl>
+    <w:lvl w:ilvl="3" w:tplc="0409000F" w:tentative="1">
+      <w:start w:val="1"/>
+      <w:numFmt w:val="decimal"/>
+      <w:lvlText w:val="%4."/>
+      <w:lvlJc w:val="left"/>
+      <w:pPr>
+        <w:ind w:left="1760" w:hanging="440"/>
+      </w:pPr>
+    </w:lvl>
+    <w:lvl w:ilvl="4" w:tplc="04090019" w:tentative="1">
+      <w:start w:val="1"/>
+      <w:numFmt w:val="lowerLetter"/>
+      <w:lvlText w:val="%5)"/>
+      <w:lvlJc w:val="left"/>
+      <w:pPr>
+        <w:ind w:left="2200" w:hanging="440"/>
+      </w:pPr>
+    </w:lvl>
+    <w:lvl w:ilvl="5" w:tplc="0409001B" w:tentative="1">
+      <w:start w:val="1"/>
+      <w:numFmt w:val="lowerRoman"/>
+      <w:lvlText w:val="%6."/>
+      <w:lvlJc w:val="right"/>
+      <w:pPr>
+        <w:ind w:left="2640" w:hanging="440"/>
+      </w:pPr>
+    </w:lvl>
+    <w:lvl w:ilvl="6" w:tplc="0409000F" w:tentative="1">
+      <w:start w:val="1"/>
+      <w:numFmt w:val="decimal"/>
+      <w:lvlText w:val="%7."/>
+      <w:lvlJc w:val="left"/>
+      <w:pPr>
+        <w:ind w:left="3080" w:hanging="440"/>
+      </w:pPr>
+    </w:lvl>
+    <w:lvl w:ilvl="7" w:tplc="04090019" w:tentative="1">
+      <w:start w:val="1"/>
+      <w:numFmt w:val="lowerLetter"/>
+      <w:lvlText w:val="%8)"/>
+      <w:lvlJc w:val="left"/>
+      <w:pPr>
+        <w:ind w:left="3520" w:hanging="440"/>
+      </w:pPr>
+    </w:lvl>
+    <w:lvl w:ilvl="8" w:tplc="0409001B" w:tentative="1">
+      <w:start w:val="1"/>
+      <w:numFmt w:val="lowerRoman"/>
+      <w:lvlText w:val="%9."/>
+      <w:lvlJc w:val="right"/>
+      <w:pPr>
+        <w:ind w:left="3960" w:hanging="440"/>
+      </w:pPr>
+    </w:lvl>
+  </w:abstractNum>
   <w:num w:numId="1" w16cid:durableId="1698657550">
     <w:abstractNumId w:val="3"/>
   </w:num>
@@ -5787,6 +6585,9 @@
   </w:num>
   <w:num w:numId="6" w16cid:durableId="1636596120">
     <w:abstractNumId w:val="0"/>
+  </w:num>
+  <w:num w:numId="7" w16cid:durableId="1920017102">
+    <w:abstractNumId w:val="6"/>
   </w:num>
 </w:numbering>
 </file>
@@ -6191,7 +6992,7 @@
   <w:style w:type="paragraph" w:default="1" w:styleId="a">
     <w:name w:val="Normal"/>
     <w:qFormat/>
-    <w:rsid w:val="002E50DF"/>
+    <w:rsid w:val="00351A6C"/>
     <w:pPr>
       <w:widowControl w:val="0"/>
     </w:pPr>
@@ -6399,6 +7200,7 @@
   <w:style w:type="character" w:default="1" w:styleId="a0">
     <w:name w:val="Default Paragraph Font"/>
     <w:uiPriority w:val="1"/>
+    <w:semiHidden/>
     <w:unhideWhenUsed/>
   </w:style>
   <w:style w:type="table" w:default="1" w:styleId="a1">

</xml_diff>

<commit_message>
allowed menus to open again (finally can see the updated checkbox)
</commit_message>
<xml_diff>
--- a/test plan.docx
+++ b/test plan.docx
@@ -460,262 +460,6 @@
         <w:t>pp.tsx</w:t>
       </w:r>
     </w:p>
-    <w:tbl>
-      <w:tblPr>
-        <w:tblStyle w:val="ae"/>
-        <w:tblW w:w="11624" w:type="dxa"/>
-        <w:tblInd w:w="-1706" w:type="dxa"/>
-        <w:tblLook w:val="04A0" w:firstRow="1" w:lastRow="0" w:firstColumn="1" w:lastColumn="0" w:noHBand="0" w:noVBand="1"/>
-      </w:tblPr>
-      <w:tblGrid>
-        <w:gridCol w:w="1885"/>
-        <w:gridCol w:w="1761"/>
-        <w:gridCol w:w="2450"/>
-        <w:gridCol w:w="3118"/>
-        <w:gridCol w:w="2410"/>
-      </w:tblGrid>
-      <w:tr>
-        <w:tc>
-          <w:tcPr>
-            <w:tcW w:w="1885" w:type="dxa"/>
-          </w:tcPr>
-          <w:p>
-            <w:pPr>
-              <w:rPr>
-                <w:rFonts w:hint="eastAsia"/>
-                <w:sz w:val="16"/>
-                <w:szCs w:val="18"/>
-              </w:rPr>
-            </w:pPr>
-            <w:r>
-              <w:rPr>
-                <w:sz w:val="16"/>
-                <w:szCs w:val="18"/>
-              </w:rPr>
-              <w:t>Relevant f</w:t>
-            </w:r>
-            <w:r>
-              <w:rPr>
-                <w:rFonts w:hint="eastAsia"/>
-                <w:sz w:val="16"/>
-                <w:szCs w:val="18"/>
-              </w:rPr>
-              <w:t>ile</w:t>
-            </w:r>
-            <w:r>
-              <w:rPr>
-                <w:sz w:val="16"/>
-                <w:szCs w:val="18"/>
-              </w:rPr>
-              <w:t>(s)</w:t>
-            </w:r>
-          </w:p>
-        </w:tc>
-        <w:tc>
-          <w:tcPr>
-            <w:tcW w:w="1761" w:type="dxa"/>
-          </w:tcPr>
-          <w:p>
-            <w:pPr>
-              <w:rPr>
-                <w:rFonts w:hint="eastAsia"/>
-                <w:sz w:val="16"/>
-                <w:szCs w:val="18"/>
-                <w:lang w:val="en-CA"/>
-              </w:rPr>
-            </w:pPr>
-            <w:r>
-              <w:rPr>
-                <w:rFonts w:hint="eastAsia"/>
-                <w:sz w:val="16"/>
-                <w:szCs w:val="18"/>
-              </w:rPr>
-              <w:t>C</w:t>
-            </w:r>
-            <w:r>
-              <w:rPr>
-                <w:sz w:val="16"/>
-                <w:szCs w:val="18"/>
-              </w:rPr>
-              <w:t>omponent</w:t>
-            </w:r>
-          </w:p>
-        </w:tc>
-        <w:tc>
-          <w:tcPr>
-            <w:tcW w:w="2450" w:type="dxa"/>
-          </w:tcPr>
-          <w:p>
-            <w:pPr>
-              <w:rPr>
-                <w:rFonts w:hint="eastAsia"/>
-                <w:sz w:val="16"/>
-                <w:szCs w:val="18"/>
-                <w:lang w:val="en-CA"/>
-              </w:rPr>
-            </w:pPr>
-            <w:r>
-              <w:rPr>
-                <w:rFonts w:hint="eastAsia"/>
-                <w:sz w:val="16"/>
-                <w:szCs w:val="18"/>
-                <w:lang w:val="en-CA"/>
-              </w:rPr>
-              <w:t>H</w:t>
-            </w:r>
-            <w:r>
-              <w:rPr>
-                <w:sz w:val="16"/>
-                <w:szCs w:val="18"/>
-                <w:lang w:val="en-CA"/>
-              </w:rPr>
-              <w:t>ow to test</w:t>
-            </w:r>
-          </w:p>
-        </w:tc>
-        <w:tc>
-          <w:tcPr>
-            <w:tcW w:w="3118" w:type="dxa"/>
-          </w:tcPr>
-          <w:p>
-            <w:pPr>
-              <w:rPr>
-                <w:rFonts w:hint="eastAsia"/>
-                <w:sz w:val="16"/>
-                <w:szCs w:val="18"/>
-                <w:lang w:val="en-CA"/>
-              </w:rPr>
-            </w:pPr>
-            <w:r>
-              <w:rPr>
-                <w:rFonts w:hint="eastAsia"/>
-                <w:sz w:val="16"/>
-                <w:szCs w:val="18"/>
-                <w:lang w:val="en-CA"/>
-              </w:rPr>
-              <w:t>E</w:t>
-            </w:r>
-            <w:r>
-              <w:rPr>
-                <w:sz w:val="16"/>
-                <w:szCs w:val="18"/>
-                <w:lang w:val="en-CA"/>
-              </w:rPr>
-              <w:t>xpected outcome</w:t>
-            </w:r>
-          </w:p>
-        </w:tc>
-        <w:tc>
-          <w:tcPr>
-            <w:tcW w:w="2410" w:type="dxa"/>
-          </w:tcPr>
-          <w:p>
-            <w:pPr>
-              <w:rPr>
-                <w:rFonts w:hint="eastAsia"/>
-                <w:sz w:val="16"/>
-                <w:szCs w:val="18"/>
-                <w:lang w:val="en-CA"/>
-              </w:rPr>
-            </w:pPr>
-            <w:r>
-              <w:rPr>
-                <w:rFonts w:hint="eastAsia"/>
-                <w:sz w:val="16"/>
-                <w:szCs w:val="18"/>
-                <w:lang w:val="en-CA"/>
-              </w:rPr>
-              <w:t>T</w:t>
-            </w:r>
-            <w:r>
-              <w:rPr>
-                <w:sz w:val="16"/>
-                <w:szCs w:val="18"/>
-                <w:lang w:val="en-CA"/>
-              </w:rPr>
-              <w:t>ested on (commit) and notes</w:t>
-            </w:r>
-          </w:p>
-        </w:tc>
-      </w:tr>
-      <w:tr>
-        <w:tc>
-          <w:tcPr>
-            <w:tcW w:w="1885" w:type="dxa"/>
-          </w:tcPr>
-          <w:p>
-            <w:pPr>
-              <w:rPr>
-                <w:rFonts w:hint="eastAsia"/>
-                <w:sz w:val="16"/>
-                <w:szCs w:val="18"/>
-                <w:lang w:val="en-CA"/>
-              </w:rPr>
-            </w:pPr>
-          </w:p>
-        </w:tc>
-        <w:tc>
-          <w:tcPr>
-            <w:tcW w:w="1761" w:type="dxa"/>
-          </w:tcPr>
-          <w:p>
-            <w:pPr>
-              <w:rPr>
-                <w:rFonts w:hint="eastAsia"/>
-                <w:sz w:val="16"/>
-                <w:szCs w:val="18"/>
-                <w:lang w:val="en-CA"/>
-              </w:rPr>
-            </w:pPr>
-          </w:p>
-        </w:tc>
-        <w:tc>
-          <w:tcPr>
-            <w:tcW w:w="2450" w:type="dxa"/>
-          </w:tcPr>
-          <w:p>
-            <w:pPr>
-              <w:rPr>
-                <w:rFonts w:hint="eastAsia"/>
-                <w:sz w:val="16"/>
-                <w:szCs w:val="18"/>
-                <w:lang w:val="en-CA"/>
-              </w:rPr>
-            </w:pPr>
-          </w:p>
-        </w:tc>
-        <w:tc>
-          <w:tcPr>
-            <w:tcW w:w="3118" w:type="dxa"/>
-          </w:tcPr>
-          <w:p>
-            <w:pPr>
-              <w:rPr>
-                <w:rFonts w:hint="eastAsia"/>
-                <w:sz w:val="16"/>
-                <w:szCs w:val="18"/>
-                <w:lang w:val="en-CA"/>
-              </w:rPr>
-            </w:pPr>
-          </w:p>
-        </w:tc>
-        <w:tc>
-          <w:tcPr>
-            <w:tcW w:w="2410" w:type="dxa"/>
-          </w:tcPr>
-          <w:p>
-            <w:pPr>
-              <w:rPr>
-                <w:rFonts w:hint="eastAsia"/>
-                <w:sz w:val="16"/>
-                <w:szCs w:val="18"/>
-                <w:lang w:val="en-CA"/>
-              </w:rPr>
-            </w:pPr>
-          </w:p>
-        </w:tc>
-      </w:tr>
-    </w:tbl>
     <w:p>
       <w:pPr>
         <w:jc w:val="center"/>
@@ -1524,6 +1268,160 @@
                 <w:szCs w:val="18"/>
                 <w:lang w:val="en-CA"/>
               </w:rPr>
+              <w:t>S</w:t>
+            </w:r>
+            <w:r>
+              <w:rPr>
+                <w:sz w:val="16"/>
+                <w:szCs w:val="18"/>
+                <w:lang w:val="en-CA"/>
+              </w:rPr>
+              <w:t>ettings.tsx</w:t>
+            </w:r>
+          </w:p>
+        </w:tc>
+        <w:tc>
+          <w:tcPr>
+            <w:tcW w:w="1761" w:type="dxa"/>
+          </w:tcPr>
+          <w:p>
+            <w:pPr>
+              <w:rPr>
+                <w:rFonts w:hint="eastAsia"/>
+                <w:sz w:val="16"/>
+                <w:szCs w:val="18"/>
+                <w:lang w:val="en-CA"/>
+              </w:rPr>
+            </w:pPr>
+            <w:r>
+              <w:rPr>
+                <w:rFonts w:hint="eastAsia"/>
+                <w:sz w:val="16"/>
+                <w:szCs w:val="18"/>
+                <w:lang w:val="en-CA"/>
+              </w:rPr>
+              <w:t>S</w:t>
+            </w:r>
+            <w:r>
+              <w:rPr>
+                <w:sz w:val="16"/>
+                <w:szCs w:val="18"/>
+                <w:lang w:val="en-CA"/>
+              </w:rPr>
+              <w:t>ettings: keyboard: all</w:t>
+            </w:r>
+          </w:p>
+        </w:tc>
+        <w:tc>
+          <w:tcPr>
+            <w:tcW w:w="2450" w:type="dxa"/>
+          </w:tcPr>
+          <w:p>
+            <w:pPr>
+              <w:rPr>
+                <w:rFonts w:hint="eastAsia"/>
+                <w:sz w:val="16"/>
+                <w:szCs w:val="18"/>
+                <w:lang w:val="en-CA"/>
+              </w:rPr>
+            </w:pPr>
+            <w:r>
+              <w:rPr>
+                <w:rFonts w:hint="eastAsia"/>
+                <w:sz w:val="16"/>
+                <w:szCs w:val="18"/>
+                <w:lang w:val="en-CA"/>
+              </w:rPr>
+              <w:t>C</w:t>
+            </w:r>
+            <w:r>
+              <w:rPr>
+                <w:sz w:val="16"/>
+                <w:szCs w:val="18"/>
+                <w:lang w:val="en-CA"/>
+              </w:rPr>
+              <w:t>lick the “x” button on the right side in a keybind box</w:t>
+            </w:r>
+          </w:p>
+        </w:tc>
+        <w:tc>
+          <w:tcPr>
+            <w:tcW w:w="3118" w:type="dxa"/>
+          </w:tcPr>
+          <w:p>
+            <w:pPr>
+              <w:rPr>
+                <w:rFonts w:hint="eastAsia"/>
+                <w:sz w:val="16"/>
+                <w:szCs w:val="18"/>
+                <w:lang w:val="en-CA"/>
+              </w:rPr>
+            </w:pPr>
+            <w:r>
+              <w:rPr>
+                <w:rFonts w:hint="eastAsia"/>
+                <w:sz w:val="16"/>
+                <w:szCs w:val="18"/>
+                <w:lang w:val="en-CA"/>
+              </w:rPr>
+              <w:t>I</w:t>
+            </w:r>
+            <w:r>
+              <w:rPr>
+                <w:sz w:val="16"/>
+                <w:szCs w:val="18"/>
+                <w:lang w:val="en-CA"/>
+              </w:rPr>
+              <w:t xml:space="preserve">t should delete that keybind. </w:t>
+            </w:r>
+            <w:r>
+              <w:rPr>
+                <w:rFonts w:hint="eastAsia"/>
+                <w:sz w:val="16"/>
+                <w:szCs w:val="18"/>
+                <w:lang w:val="en-CA"/>
+              </w:rPr>
+              <w:t>I</w:t>
+            </w:r>
+            <w:r>
+              <w:rPr>
+                <w:sz w:val="16"/>
+                <w:szCs w:val="18"/>
+                <w:lang w:val="en-CA"/>
+              </w:rPr>
+              <w:t xml:space="preserve">f there is only one keybind, there should still be an </w:t>
+            </w:r>
+            <w:r>
+              <w:rPr>
+                <w:sz w:val="16"/>
+                <w:szCs w:val="18"/>
+                <w:lang w:val="en-CA"/>
+              </w:rPr>
+              <w:lastRenderedPageBreak/>
+              <w:t>X button</w:t>
+            </w:r>
+          </w:p>
+        </w:tc>
+        <w:tc>
+          <w:tcPr>
+            <w:tcW w:w="2410" w:type="dxa"/>
+          </w:tcPr>
+          <w:p>
+            <w:pPr>
+              <w:rPr>
+                <w:rFonts w:hint="eastAsia"/>
+                <w:sz w:val="16"/>
+                <w:szCs w:val="18"/>
+                <w:lang w:val="en-CA"/>
+              </w:rPr>
+            </w:pPr>
+            <w:r>
+              <w:rPr>
+                <w:rFonts w:hint="eastAsia"/>
+                <w:sz w:val="16"/>
+                <w:szCs w:val="18"/>
+                <w:lang w:val="en-CA"/>
+              </w:rPr>
               <w:lastRenderedPageBreak/>
               <w:t>S</w:t>
             </w:r>
@@ -1533,151 +1431,6 @@
                 <w:szCs w:val="18"/>
                 <w:lang w:val="en-CA"/>
               </w:rPr>
-              <w:t>ettings.tsx</w:t>
-            </w:r>
-          </w:p>
-        </w:tc>
-        <w:tc>
-          <w:tcPr>
-            <w:tcW w:w="1761" w:type="dxa"/>
-          </w:tcPr>
-          <w:p>
-            <w:pPr>
-              <w:rPr>
-                <w:rFonts w:hint="eastAsia"/>
-                <w:sz w:val="16"/>
-                <w:szCs w:val="18"/>
-                <w:lang w:val="en-CA"/>
-              </w:rPr>
-            </w:pPr>
-            <w:r>
-              <w:rPr>
-                <w:rFonts w:hint="eastAsia"/>
-                <w:sz w:val="16"/>
-                <w:szCs w:val="18"/>
-                <w:lang w:val="en-CA"/>
-              </w:rPr>
-              <w:t>S</w:t>
-            </w:r>
-            <w:r>
-              <w:rPr>
-                <w:sz w:val="16"/>
-                <w:szCs w:val="18"/>
-                <w:lang w:val="en-CA"/>
-              </w:rPr>
-              <w:t>ettings: keyboard: all</w:t>
-            </w:r>
-          </w:p>
-        </w:tc>
-        <w:tc>
-          <w:tcPr>
-            <w:tcW w:w="2450" w:type="dxa"/>
-          </w:tcPr>
-          <w:p>
-            <w:pPr>
-              <w:rPr>
-                <w:rFonts w:hint="eastAsia"/>
-                <w:sz w:val="16"/>
-                <w:szCs w:val="18"/>
-                <w:lang w:val="en-CA"/>
-              </w:rPr>
-            </w:pPr>
-            <w:r>
-              <w:rPr>
-                <w:rFonts w:hint="eastAsia"/>
-                <w:sz w:val="16"/>
-                <w:szCs w:val="18"/>
-                <w:lang w:val="en-CA"/>
-              </w:rPr>
-              <w:t>C</w:t>
-            </w:r>
-            <w:r>
-              <w:rPr>
-                <w:sz w:val="16"/>
-                <w:szCs w:val="18"/>
-                <w:lang w:val="en-CA"/>
-              </w:rPr>
-              <w:t>lick the “x” button on the right side in a keybind box</w:t>
-            </w:r>
-          </w:p>
-        </w:tc>
-        <w:tc>
-          <w:tcPr>
-            <w:tcW w:w="3118" w:type="dxa"/>
-          </w:tcPr>
-          <w:p>
-            <w:pPr>
-              <w:rPr>
-                <w:rFonts w:hint="eastAsia"/>
-                <w:sz w:val="16"/>
-                <w:szCs w:val="18"/>
-                <w:lang w:val="en-CA"/>
-              </w:rPr>
-            </w:pPr>
-            <w:r>
-              <w:rPr>
-                <w:rFonts w:hint="eastAsia"/>
-                <w:sz w:val="16"/>
-                <w:szCs w:val="18"/>
-                <w:lang w:val="en-CA"/>
-              </w:rPr>
-              <w:t>I</w:t>
-            </w:r>
-            <w:r>
-              <w:rPr>
-                <w:sz w:val="16"/>
-                <w:szCs w:val="18"/>
-                <w:lang w:val="en-CA"/>
-              </w:rPr>
-              <w:t xml:space="preserve">t should delete that keybind. </w:t>
-            </w:r>
-            <w:r>
-              <w:rPr>
-                <w:rFonts w:hint="eastAsia"/>
-                <w:sz w:val="16"/>
-                <w:szCs w:val="18"/>
-                <w:lang w:val="en-CA"/>
-              </w:rPr>
-              <w:t>I</w:t>
-            </w:r>
-            <w:r>
-              <w:rPr>
-                <w:sz w:val="16"/>
-                <w:szCs w:val="18"/>
-                <w:lang w:val="en-CA"/>
-              </w:rPr>
-              <w:t>f there is only one keybind, there should still be an X button</w:t>
-            </w:r>
-          </w:p>
-        </w:tc>
-        <w:tc>
-          <w:tcPr>
-            <w:tcW w:w="2410" w:type="dxa"/>
-          </w:tcPr>
-          <w:p>
-            <w:pPr>
-              <w:rPr>
-                <w:rFonts w:hint="eastAsia"/>
-                <w:sz w:val="16"/>
-                <w:szCs w:val="18"/>
-                <w:lang w:val="en-CA"/>
-              </w:rPr>
-            </w:pPr>
-            <w:r>
-              <w:rPr>
-                <w:rFonts w:hint="eastAsia"/>
-                <w:sz w:val="16"/>
-                <w:szCs w:val="18"/>
-                <w:lang w:val="en-CA"/>
-              </w:rPr>
-              <w:t>S</w:t>
-            </w:r>
-            <w:r>
-              <w:rPr>
-                <w:sz w:val="16"/>
-                <w:szCs w:val="18"/>
-                <w:lang w:val="en-CA"/>
-              </w:rPr>
               <w:t>ingle keybinds don’t have an X button</w:t>
             </w:r>
             <w:r>
@@ -1703,7 +1456,16 @@
                 <w:szCs w:val="18"/>
                 <w:lang w:val="en-CA"/>
               </w:rPr>
-              <w:t>eeds fixing: allow single keybinds to have an X button</w:t>
+              <w:t xml:space="preserve">eeds fixing: allow </w:t>
+            </w:r>
+            <w:r>
+              <w:rPr>
+                <w:sz w:val="16"/>
+                <w:szCs w:val="18"/>
+                <w:lang w:val="en-CA"/>
+              </w:rPr>
+              <w:lastRenderedPageBreak/>
+              <w:t>single keybinds to have an X button</w:t>
             </w:r>
           </w:p>
         </w:tc>
@@ -1729,6 +1491,7 @@
                 <w:szCs w:val="18"/>
                 <w:lang w:val="en-CA"/>
               </w:rPr>
+              <w:lastRenderedPageBreak/>
               <w:t>S</w:t>
             </w:r>
             <w:r>
@@ -2119,6 +1882,14 @@
               </w:rPr>
               <w:t>ettings.tsx</w:t>
             </w:r>
+            <w:r>
+              <w:rPr>
+                <w:sz w:val="16"/>
+                <w:szCs w:val="18"/>
+                <w:lang w:val="en-CA"/>
+              </w:rPr>
+              <w:t>, draggableModal.tsx, Toast.tsx, modalManager.ts, modalPermissions.ts</w:t>
+            </w:r>
           </w:p>
         </w:tc>
         <w:tc>
@@ -2165,28 +1936,27 @@
                 <w:numId w:val="1"/>
               </w:numPr>
               <w:rPr>
-                <w:rFonts w:hint="eastAsia"/>
-                <w:sz w:val="16"/>
-                <w:szCs w:val="18"/>
-                <w:lang w:val="en-CA"/>
-              </w:rPr>
-            </w:pPr>
-            <w:r>
-              <w:rPr>
-                <w:rFonts w:hint="eastAsia"/>
-                <w:sz w:val="16"/>
-                <w:szCs w:val="18"/>
-                <w:lang w:val="en-CA"/>
-              </w:rPr>
-              <w:t>S</w:t>
-            </w:r>
-            <w:r>
-              <w:rPr>
-                <w:sz w:val="16"/>
-                <w:szCs w:val="18"/>
-                <w:lang w:val="en-CA"/>
-              </w:rPr>
-              <w:t>pam click on the settings icon in the top windows dashbar.</w:t>
+                <w:sz w:val="16"/>
+                <w:szCs w:val="18"/>
+                <w:lang w:val="en-CA"/>
+              </w:rPr>
+            </w:pPr>
+            <w:r>
+              <w:rPr>
+                <w:rFonts w:hint="eastAsia"/>
+                <w:sz w:val="16"/>
+                <w:szCs w:val="18"/>
+                <w:lang w:val="en-CA"/>
+              </w:rPr>
+              <w:t>I</w:t>
+            </w:r>
+            <w:r>
+              <w:rPr>
+                <w:sz w:val="16"/>
+                <w:szCs w:val="18"/>
+                <w:lang w:val="en-CA"/>
+              </w:rPr>
+              <w:t>n the editor interface, open a draggable modal (settings, styles, etc)</w:t>
             </w:r>
           </w:p>
           <w:p>
@@ -2218,15 +1988,7 @@
                 <w:szCs w:val="18"/>
                 <w:lang w:val="en-CA"/>
               </w:rPr>
-              <w:t xml:space="preserve">pam click </w:t>
-            </w:r>
-            <w:r>
-              <w:rPr>
-                <w:sz w:val="16"/>
-                <w:szCs w:val="18"/>
-                <w:lang w:val="en-CA"/>
-              </w:rPr>
-              <w:t>on the styles icon</w:t>
+              <w:t>pam click on the settings icon in the top windows dashbar.</w:t>
             </w:r>
           </w:p>
           <w:p>
@@ -2258,7 +2020,15 @@
                 <w:szCs w:val="18"/>
                 <w:lang w:val="en-CA"/>
               </w:rPr>
-              <w:t>pam click the export video icon</w:t>
+              <w:t xml:space="preserve">pam click </w:t>
+            </w:r>
+            <w:r>
+              <w:rPr>
+                <w:sz w:val="16"/>
+                <w:szCs w:val="18"/>
+                <w:lang w:val="en-CA"/>
+              </w:rPr>
+              <w:t>on the styles icon</w:t>
             </w:r>
           </w:p>
           <w:p>
@@ -2290,7 +2060,7 @@
                 <w:szCs w:val="18"/>
                 <w:lang w:val="en-CA"/>
               </w:rPr>
-              <w:t>pam click on any future menus I implement in the future</w:t>
+              <w:t>pam click the export video icon</w:t>
             </w:r>
           </w:p>
           <w:p>
@@ -2314,6 +2084,38 @@
                 <w:szCs w:val="18"/>
                 <w:lang w:val="en-CA"/>
               </w:rPr>
+              <w:t>S</w:t>
+            </w:r>
+            <w:r>
+              <w:rPr>
+                <w:sz w:val="16"/>
+                <w:szCs w:val="18"/>
+                <w:lang w:val="en-CA"/>
+              </w:rPr>
+              <w:t>pam click on any future menus I implement in the future</w:t>
+            </w:r>
+          </w:p>
+          <w:p>
+            <w:pPr>
+              <w:pStyle w:val="a9"/>
+              <w:numPr>
+                <w:ilvl w:val="0"/>
+                <w:numId w:val="1"/>
+              </w:numPr>
+              <w:rPr>
+                <w:rFonts w:hint="eastAsia"/>
+                <w:sz w:val="16"/>
+                <w:szCs w:val="18"/>
+                <w:lang w:val="en-CA"/>
+              </w:rPr>
+            </w:pPr>
+            <w:r>
+              <w:rPr>
+                <w:rFonts w:hint="eastAsia"/>
+                <w:sz w:val="16"/>
+                <w:szCs w:val="18"/>
+                <w:lang w:val="en-CA"/>
+              </w:rPr>
               <w:t>C</w:t>
             </w:r>
             <w:r>
@@ -2333,12 +2135,37 @@
           <w:p>
             <w:pPr>
               <w:rPr>
-                <w:rFonts w:hint="eastAsia"/>
-                <w:sz w:val="16"/>
-                <w:szCs w:val="18"/>
-                <w:lang w:val="en-CA"/>
-              </w:rPr>
-            </w:pPr>
+                <w:sz w:val="16"/>
+                <w:szCs w:val="18"/>
+                <w:lang w:val="en-CA"/>
+              </w:rPr>
+            </w:pPr>
+            <w:r>
+              <w:rPr>
+                <w:sz w:val="16"/>
+                <w:szCs w:val="18"/>
+                <w:lang w:val="en-CA"/>
+              </w:rPr>
+              <w:t>1. the modal should open if there are no previous modals open.</w:t>
+            </w:r>
+          </w:p>
+          <w:p>
+            <w:pPr>
+              <w:rPr>
+                <w:rFonts w:hint="eastAsia"/>
+                <w:sz w:val="16"/>
+                <w:szCs w:val="18"/>
+                <w:lang w:val="en-CA"/>
+              </w:rPr>
+            </w:pPr>
+            <w:r>
+              <w:rPr>
+                <w:sz w:val="16"/>
+                <w:szCs w:val="18"/>
+                <w:lang w:val="en-CA"/>
+              </w:rPr>
+              <w:t xml:space="preserve">2. </w:t>
+            </w:r>
             <w:r>
               <w:rPr>
                 <w:rFonts w:hint="eastAsia"/>
@@ -2368,82 +2195,12 @@
             </w:pPr>
             <w:r>
               <w:rPr>
-                <w:rFonts w:hint="eastAsia"/>
-                <w:sz w:val="16"/>
-                <w:szCs w:val="18"/>
-                <w:lang w:val="en-CA"/>
-              </w:rPr>
-              <w:t>E</w:t>
-            </w:r>
-            <w:r>
-              <w:rPr>
-                <w:sz w:val="16"/>
-                <w:szCs w:val="18"/>
-                <w:lang w:val="en-CA"/>
-              </w:rPr>
-              <w:t>ach menu you click on should open a small dialogue box saying “</w:t>
-            </w:r>
-            <w:r>
-              <w:rPr>
-                <w:rFonts w:ascii="Segoe UI Symbol" w:hAnsi="Segoe UI Symbol" w:cs="Segoe UI Symbol"/>
-                <w:sz w:val="16"/>
-                <w:szCs w:val="18"/>
-                <w:lang w:val="en-CA"/>
-              </w:rPr>
-              <w:t>⚠</w:t>
-            </w:r>
-            <w:r>
-              <w:rPr>
-                <w:rFonts w:ascii="Segoe UI Symbol" w:hAnsi="Segoe UI Symbol" w:cs="Segoe UI Symbol"/>
-                <w:sz w:val="16"/>
-                <w:szCs w:val="18"/>
-                <w:lang w:val="en-CA"/>
-              </w:rPr>
-              <w:t xml:space="preserve"> </w:t>
-            </w:r>
-            <w:r>
-              <w:rPr>
-                <w:rFonts w:ascii="Segoe UI Symbol" w:hAnsi="Segoe UI Symbol" w:cs="Segoe UI Symbol"/>
-                <w:sz w:val="16"/>
-                <w:szCs w:val="18"/>
-                <w:lang w:val="en-CA"/>
-              </w:rPr>
-              <w:t>&lt;br\&gt;</w:t>
-            </w:r>
-            <w:r>
-              <w:rPr>
-                <w:sz w:val="16"/>
-                <w:szCs w:val="18"/>
-                <w:lang w:val="en-CA"/>
-              </w:rPr>
-              <w:t>open</w:t>
-            </w:r>
-            <w:r>
-              <w:rPr>
-                <w:sz w:val="16"/>
-                <w:szCs w:val="18"/>
-                <w:lang w:val="en-CA"/>
-              </w:rPr>
-              <w:t>ing</w:t>
-            </w:r>
-            <w:r>
-              <w:rPr>
-                <w:sz w:val="16"/>
-                <w:szCs w:val="18"/>
-                <w:lang w:val="en-CA"/>
-              </w:rPr>
-              <w:t xml:space="preserve"> multiple menus is disabled”</w:t>
-            </w:r>
-          </w:p>
-          <w:p>
-            <w:pPr>
-              <w:rPr>
-                <w:rFonts w:hint="eastAsia"/>
-                <w:sz w:val="16"/>
-                <w:szCs w:val="18"/>
-                <w:lang w:val="en-CA"/>
-              </w:rPr>
-            </w:pPr>
+                <w:sz w:val="16"/>
+                <w:szCs w:val="18"/>
+                <w:lang w:val="en-CA"/>
+              </w:rPr>
+              <w:t>3. when there’s already one menu open, clicking on another menu should open a small toast dialogue box saying “opening multiple menus is disabled!</w:t>
+            </w:r>
           </w:p>
         </w:tc>
         <w:tc>
@@ -2453,47 +2210,28 @@
           <w:p>
             <w:pPr>
               <w:rPr>
-                <w:rFonts w:hint="eastAsia"/>
-                <w:sz w:val="16"/>
-                <w:szCs w:val="18"/>
-                <w:lang w:val="en-CA"/>
-              </w:rPr>
-            </w:pPr>
-            <w:r>
-              <w:rPr>
-                <w:rFonts w:hint="eastAsia"/>
-                <w:sz w:val="16"/>
-                <w:szCs w:val="18"/>
-                <w:lang w:val="en-CA"/>
-              </w:rPr>
-              <w:t>W</w:t>
-            </w:r>
-            <w:r>
-              <w:rPr>
-                <w:sz w:val="16"/>
-                <w:szCs w:val="18"/>
-                <w:lang w:val="en-CA"/>
-              </w:rPr>
-              <w:t xml:space="preserve">orks as of </w:t>
-            </w:r>
-            <w:r>
-              <w:rPr>
-                <w:sz w:val="16"/>
-                <w:szCs w:val="18"/>
-                <w:lang w:val="en-CA"/>
-              </w:rPr>
-              <w:t>5bddf836872611033759d627746d8b4161bba22a</w:t>
-            </w:r>
-          </w:p>
-          <w:p>
-            <w:pPr>
-              <w:rPr>
-                <w:rFonts w:hint="eastAsia"/>
-                <w:sz w:val="16"/>
-                <w:szCs w:val="18"/>
-                <w:lang w:val="en-CA"/>
-              </w:rPr>
-            </w:pPr>
+                <w:sz w:val="16"/>
+                <w:szCs w:val="18"/>
+                <w:lang w:val="en-CA"/>
+              </w:rPr>
+            </w:pPr>
+            <w:r>
+              <w:rPr>
+                <w:rFonts w:hint="eastAsia"/>
+                <w:sz w:val="16"/>
+                <w:szCs w:val="18"/>
+                <w:lang w:val="en-CA"/>
+              </w:rPr>
+              <w:t>P</w:t>
+            </w:r>
+            <w:r>
+              <w:rPr>
+                <w:sz w:val="16"/>
+                <w:szCs w:val="18"/>
+                <w:lang w:val="en-CA"/>
+              </w:rPr>
+              <w:t xml:space="preserve">artially working. I can open settings, click it again, the toast shows up. </w:t>
+            </w:r>
             <w:r>
               <w:rPr>
                 <w:rFonts w:hint="eastAsia"/>
@@ -2509,7 +2247,24 @@
                 <w:szCs w:val="18"/>
                 <w:lang w:val="en-CA"/>
               </w:rPr>
-              <w:t>aven’t implemented the dialogue box yet</w:t>
+              <w:t xml:space="preserve">owever, I can still open styles once. </w:t>
+            </w:r>
+            <w:r>
+              <w:rPr>
+                <w:rFonts w:hint="eastAsia"/>
+                <w:sz w:val="16"/>
+                <w:szCs w:val="18"/>
+                <w:lang w:val="en-CA"/>
+              </w:rPr>
+              <w:t>O</w:t>
+            </w:r>
+            <w:r>
+              <w:rPr>
+                <w:sz w:val="16"/>
+                <w:szCs w:val="18"/>
+                <w:lang w:val="en-CA"/>
+              </w:rPr>
+              <w:t>pening styles twice doesn’t open the styles page, but it also doesn’t display the toast</w:t>
             </w:r>
           </w:p>
         </w:tc>
@@ -2929,7 +2684,31 @@
                 <w:szCs w:val="18"/>
                 <w:lang w:val="en-CA"/>
               </w:rPr>
-              <w:t xml:space="preserve">he dependent setting “allow open multiple menus” should not be greyed out. </w:t>
+              <w:t>he dependent setting “allow open</w:t>
+            </w:r>
+            <w:r>
+              <w:rPr>
+                <w:sz w:val="16"/>
+                <w:szCs w:val="18"/>
+                <w:lang w:val="en-CA"/>
+              </w:rPr>
+              <w:t xml:space="preserve"> duplicate menus</w:t>
+            </w:r>
+            <w:r>
+              <w:rPr>
+                <w:sz w:val="16"/>
+                <w:szCs w:val="18"/>
+                <w:lang w:val="en-CA"/>
+              </w:rPr>
+              <w:t>” should not be greyed out</w:t>
+            </w:r>
+            <w:r>
+              <w:rPr>
+                <w:sz w:val="16"/>
+                <w:szCs w:val="18"/>
+                <w:lang w:val="en-CA"/>
+              </w:rPr>
+              <w:t xml:space="preserve"> anymore</w:t>
             </w:r>
           </w:p>
         </w:tc>
@@ -2961,7 +2740,15 @@
                 <w:szCs w:val="18"/>
                 <w:lang w:val="en-CA"/>
               </w:rPr>
-              <w:t>aven’t implemented yet</w:t>
+              <w:t xml:space="preserve">aven’t implemented </w:t>
+            </w:r>
+            <w:r>
+              <w:rPr>
+                <w:sz w:val="16"/>
+                <w:szCs w:val="18"/>
+                <w:lang w:val="en-CA"/>
+              </w:rPr>
+              <w:t>the duplicate menu dependent setting yet.</w:t>
             </w:r>
           </w:p>
         </w:tc>
@@ -3214,6 +3001,7 @@
                 <w:szCs w:val="18"/>
                 <w:lang w:val="en-CA"/>
               </w:rPr>
+              <w:lastRenderedPageBreak/>
               <w:t>G</w:t>
             </w:r>
             <w:r>
@@ -3222,16 +3010,7 @@
                 <w:szCs w:val="18"/>
                 <w:lang w:val="en-CA"/>
               </w:rPr>
-              <w:t xml:space="preserve">raph.tsx, </w:t>
-            </w:r>
-            <w:r>
-              <w:rPr>
-                <w:sz w:val="16"/>
-                <w:szCs w:val="18"/>
-                <w:lang w:val="en-CA"/>
-              </w:rPr>
-              <w:lastRenderedPageBreak/>
-              <w:t>TorusMenuEditor.tsx</w:t>
+              <w:t>raph.tsx, TorusMenuEditor.tsx</w:t>
             </w:r>
           </w:p>
         </w:tc>
@@ -3255,7 +3034,6 @@
                 <w:szCs w:val="18"/>
                 <w:lang w:val="en-CA"/>
               </w:rPr>
-              <w:lastRenderedPageBreak/>
               <w:t>S</w:t>
             </w:r>
             <w:r>
@@ -3264,16 +3042,7 @@
                 <w:szCs w:val="18"/>
                 <w:lang w:val="en-CA"/>
               </w:rPr>
-              <w:t xml:space="preserve">ettings: components: </w:t>
-            </w:r>
-            <w:r>
-              <w:rPr>
-                <w:sz w:val="16"/>
-                <w:szCs w:val="18"/>
-                <w:lang w:val="en-CA"/>
-              </w:rPr>
-              <w:lastRenderedPageBreak/>
-              <w:t>torus menu editor: graph: easing</w:t>
+              <w:t>ettings: components: torus menu editor: graph: easing</w:t>
             </w:r>
           </w:p>
         </w:tc>
@@ -3297,7 +3066,6 @@
                 <w:szCs w:val="18"/>
                 <w:lang w:val="en-CA"/>
               </w:rPr>
-              <w:lastRenderedPageBreak/>
               <w:t>W</w:t>
             </w:r>
             <w:r>
@@ -3306,16 +3074,7 @@
                 <w:szCs w:val="18"/>
                 <w:lang w:val="en-CA"/>
               </w:rPr>
-              <w:t xml:space="preserve">ith the default linear slider, </w:t>
-            </w:r>
-            <w:r>
-              <w:rPr>
-                <w:sz w:val="16"/>
-                <w:szCs w:val="18"/>
-                <w:lang w:val="en-CA"/>
-              </w:rPr>
-              <w:lastRenderedPageBreak/>
-              <w:t xml:space="preserve">click the open torus menu (…) button. </w:t>
+              <w:t xml:space="preserve">ith the default linear slider, click the open torus menu (…) button. </w:t>
             </w:r>
             <w:r>
               <w:rPr>
@@ -3373,7 +3132,6 @@
                 <w:szCs w:val="18"/>
                 <w:lang w:val="en-CA"/>
               </w:rPr>
-              <w:lastRenderedPageBreak/>
               <w:t>T</w:t>
             </w:r>
             <w:r>
@@ -3382,16 +3140,7 @@
                 <w:szCs w:val="18"/>
                 <w:lang w:val="en-CA"/>
               </w:rPr>
-              <w:t xml:space="preserve">he torus menu should open linearly the </w:t>
-            </w:r>
-            <w:r>
-              <w:rPr>
-                <w:sz w:val="16"/>
-                <w:szCs w:val="18"/>
-                <w:lang w:val="en-CA"/>
-              </w:rPr>
-              <w:lastRenderedPageBreak/>
-              <w:t xml:space="preserve">first time. </w:t>
+              <w:t xml:space="preserve">he torus menu should open linearly the first time. </w:t>
             </w:r>
             <w:r>
               <w:rPr>
@@ -3449,7 +3198,6 @@
                 <w:szCs w:val="18"/>
                 <w:lang w:val="en-CA"/>
               </w:rPr>
-              <w:lastRenderedPageBreak/>
               <w:t>W</w:t>
             </w:r>
             <w:r>
@@ -3474,7 +3222,6 @@
                 <w:szCs w:val="18"/>
                 <w:lang w:val="en-CA"/>
               </w:rPr>
-              <w:lastRenderedPageBreak/>
               <w:t>5bddf836872611033759d627746d8b4161bba22a</w:t>
             </w:r>
             <w:r>
@@ -3510,7 +3257,6 @@
                 <w:szCs w:val="18"/>
                 <w:lang w:val="en-CA"/>
               </w:rPr>
-              <w:lastRenderedPageBreak/>
               <w:t>G</w:t>
             </w:r>
             <w:r>
@@ -4348,7 +4094,16 @@
                 <w:szCs w:val="18"/>
                 <w:lang w:val="en-CA"/>
               </w:rPr>
-              <w:t>lose the torus menu editor and settings. open it again</w:t>
+              <w:t xml:space="preserve">lose the torus menu editor and settings. </w:t>
+            </w:r>
+            <w:r>
+              <w:rPr>
+                <w:sz w:val="16"/>
+                <w:szCs w:val="18"/>
+                <w:lang w:val="en-CA"/>
+              </w:rPr>
+              <w:lastRenderedPageBreak/>
+              <w:t>open it again</w:t>
             </w:r>
           </w:p>
         </w:tc>
@@ -4372,6 +4127,7 @@
                 <w:szCs w:val="18"/>
                 <w:lang w:val="en-CA"/>
               </w:rPr>
+              <w:lastRenderedPageBreak/>
               <w:t>T</w:t>
             </w:r>
             <w:r>
@@ -4437,7 +4193,6 @@
                 <w:szCs w:val="18"/>
                 <w:lang w:val="en-CA"/>
               </w:rPr>
-              <w:lastRenderedPageBreak/>
               <w:t>TorusMenuEditor.tsx</w:t>
             </w:r>
           </w:p>
@@ -5765,7 +5520,16 @@
                 <w:szCs w:val="18"/>
                 <w:lang w:val="en-CA"/>
               </w:rPr>
-              <w:t>olor picker: enter hex code</w:t>
+              <w:t xml:space="preserve">olor picker: enter hex </w:t>
+            </w:r>
+            <w:r>
+              <w:rPr>
+                <w:sz w:val="16"/>
+                <w:szCs w:val="18"/>
+                <w:lang w:val="en-CA"/>
+              </w:rPr>
+              <w:lastRenderedPageBreak/>
+              <w:t>code</w:t>
             </w:r>
           </w:p>
         </w:tc>
@@ -5794,6 +5558,7 @@
                 <w:szCs w:val="18"/>
                 <w:lang w:val="en-CA"/>
               </w:rPr>
+              <w:lastRenderedPageBreak/>
               <w:t>I</w:t>
             </w:r>
             <w:r>
@@ -5802,7 +5567,7 @@
                 <w:szCs w:val="18"/>
                 <w:lang w:val="en-CA"/>
               </w:rPr>
-              <w:t xml:space="preserve">n the color picker, try to delete the hex code </w:t>
+              <w:t xml:space="preserve">n the color picker, try to </w:t>
             </w:r>
             <w:r>
               <w:rPr>
@@ -5811,7 +5576,7 @@
                 <w:lang w:val="en-CA"/>
               </w:rPr>
               <w:lastRenderedPageBreak/>
-              <w:t>completely</w:t>
+              <w:t>delete the hex code completely</w:t>
             </w:r>
           </w:p>
           <w:p>
@@ -5876,7 +5641,7 @@
                 <w:szCs w:val="18"/>
                 <w:lang w:val="en-CA"/>
               </w:rPr>
-              <w:t xml:space="preserve">ou should be able to delete and type in the hex code perfectly with no </w:t>
+              <w:t xml:space="preserve">ou should be able to delete and type in </w:t>
             </w:r>
             <w:r>
               <w:rPr>
@@ -5885,7 +5650,7 @@
                 <w:lang w:val="en-CA"/>
               </w:rPr>
               <w:lastRenderedPageBreak/>
-              <w:t xml:space="preserve">interruptions. </w:t>
+              <w:t xml:space="preserve">the hex code perfectly with no interruptions. </w:t>
             </w:r>
             <w:r>
               <w:rPr>
@@ -5925,8 +5690,990 @@
     </w:tbl>
     <w:p>
       <w:pPr>
+        <w:jc w:val="center"/>
+        <w:rPr>
+          <w:b/>
+          <w:bCs/>
+          <w:sz w:val="28"/>
+          <w:szCs w:val="32"/>
+          <w:lang w:val="en-CA"/>
+        </w:rPr>
+      </w:pPr>
+    </w:p>
+    <w:p>
+      <w:pPr>
+        <w:jc w:val="center"/>
         <w:rPr>
           <w:rFonts w:hint="eastAsia"/>
+          <w:b/>
+          <w:bCs/>
+          <w:sz w:val="28"/>
+          <w:szCs w:val="32"/>
+          <w:lang w:val="en-CA"/>
+        </w:rPr>
+      </w:pPr>
+      <w:r>
+        <w:rPr>
+          <w:b/>
+          <w:bCs/>
+          <w:sz w:val="28"/>
+          <w:szCs w:val="32"/>
+          <w:lang w:val="en-CA"/>
+        </w:rPr>
+        <w:t>Toast</w:t>
+      </w:r>
+      <w:r>
+        <w:rPr>
+          <w:b/>
+          <w:bCs/>
+          <w:sz w:val="28"/>
+          <w:szCs w:val="32"/>
+          <w:lang w:val="en-CA"/>
+        </w:rPr>
+        <w:t>.tsx</w:t>
+      </w:r>
+    </w:p>
+    <w:tbl>
+      <w:tblPr>
+        <w:tblStyle w:val="ae"/>
+        <w:tblW w:w="11624" w:type="dxa"/>
+        <w:tblInd w:w="-1706" w:type="dxa"/>
+        <w:tblLayout w:type="fixed"/>
+        <w:tblLook w:val="04A0" w:firstRow="1" w:lastRow="0" w:firstColumn="1" w:lastColumn="0" w:noHBand="0" w:noVBand="1"/>
+      </w:tblPr>
+      <w:tblGrid>
+        <w:gridCol w:w="1843"/>
+        <w:gridCol w:w="1843"/>
+        <w:gridCol w:w="2410"/>
+        <w:gridCol w:w="3118"/>
+        <w:gridCol w:w="2410"/>
+      </w:tblGrid>
+      <w:tr>
+        <w:tc>
+          <w:tcPr>
+            <w:tcW w:w="1843" w:type="dxa"/>
+          </w:tcPr>
+          <w:p>
+            <w:pPr>
+              <w:rPr>
+                <w:rFonts w:hint="eastAsia"/>
+                <w:sz w:val="16"/>
+                <w:szCs w:val="18"/>
+              </w:rPr>
+            </w:pPr>
+            <w:r>
+              <w:rPr>
+                <w:sz w:val="16"/>
+                <w:szCs w:val="18"/>
+              </w:rPr>
+              <w:t>Relevant f</w:t>
+            </w:r>
+            <w:r>
+              <w:rPr>
+                <w:rFonts w:hint="eastAsia"/>
+                <w:sz w:val="16"/>
+                <w:szCs w:val="18"/>
+              </w:rPr>
+              <w:t>ile</w:t>
+            </w:r>
+            <w:r>
+              <w:rPr>
+                <w:sz w:val="16"/>
+                <w:szCs w:val="18"/>
+              </w:rPr>
+              <w:t>(s)</w:t>
+            </w:r>
+          </w:p>
+        </w:tc>
+        <w:tc>
+          <w:tcPr>
+            <w:tcW w:w="1843" w:type="dxa"/>
+          </w:tcPr>
+          <w:p>
+            <w:pPr>
+              <w:rPr>
+                <w:rFonts w:hint="eastAsia"/>
+                <w:sz w:val="16"/>
+                <w:szCs w:val="18"/>
+                <w:lang w:val="en-CA"/>
+              </w:rPr>
+            </w:pPr>
+            <w:r>
+              <w:rPr>
+                <w:rFonts w:hint="eastAsia"/>
+                <w:sz w:val="16"/>
+                <w:szCs w:val="18"/>
+              </w:rPr>
+              <w:t>C</w:t>
+            </w:r>
+            <w:r>
+              <w:rPr>
+                <w:sz w:val="16"/>
+                <w:szCs w:val="18"/>
+              </w:rPr>
+              <w:t>omponent</w:t>
+            </w:r>
+          </w:p>
+        </w:tc>
+        <w:tc>
+          <w:tcPr>
+            <w:tcW w:w="2410" w:type="dxa"/>
+          </w:tcPr>
+          <w:p>
+            <w:pPr>
+              <w:rPr>
+                <w:rFonts w:hint="eastAsia"/>
+                <w:sz w:val="16"/>
+                <w:szCs w:val="18"/>
+                <w:lang w:val="en-CA"/>
+              </w:rPr>
+            </w:pPr>
+            <w:r>
+              <w:rPr>
+                <w:rFonts w:hint="eastAsia"/>
+                <w:sz w:val="16"/>
+                <w:szCs w:val="18"/>
+                <w:lang w:val="en-CA"/>
+              </w:rPr>
+              <w:t>H</w:t>
+            </w:r>
+            <w:r>
+              <w:rPr>
+                <w:sz w:val="16"/>
+                <w:szCs w:val="18"/>
+                <w:lang w:val="en-CA"/>
+              </w:rPr>
+              <w:t>ow to test</w:t>
+            </w:r>
+          </w:p>
+        </w:tc>
+        <w:tc>
+          <w:tcPr>
+            <w:tcW w:w="3118" w:type="dxa"/>
+          </w:tcPr>
+          <w:p>
+            <w:pPr>
+              <w:rPr>
+                <w:rFonts w:hint="eastAsia"/>
+                <w:sz w:val="16"/>
+                <w:szCs w:val="18"/>
+                <w:lang w:val="en-CA"/>
+              </w:rPr>
+            </w:pPr>
+            <w:r>
+              <w:rPr>
+                <w:rFonts w:hint="eastAsia"/>
+                <w:sz w:val="16"/>
+                <w:szCs w:val="18"/>
+                <w:lang w:val="en-CA"/>
+              </w:rPr>
+              <w:t>E</w:t>
+            </w:r>
+            <w:r>
+              <w:rPr>
+                <w:sz w:val="16"/>
+                <w:szCs w:val="18"/>
+                <w:lang w:val="en-CA"/>
+              </w:rPr>
+              <w:t>xpected outcome</w:t>
+            </w:r>
+          </w:p>
+        </w:tc>
+        <w:tc>
+          <w:tcPr>
+            <w:tcW w:w="2410" w:type="dxa"/>
+          </w:tcPr>
+          <w:p>
+            <w:pPr>
+              <w:rPr>
+                <w:rFonts w:hint="eastAsia"/>
+                <w:sz w:val="16"/>
+                <w:szCs w:val="18"/>
+                <w:lang w:val="en-CA"/>
+              </w:rPr>
+            </w:pPr>
+            <w:r>
+              <w:rPr>
+                <w:rFonts w:hint="eastAsia"/>
+                <w:sz w:val="16"/>
+                <w:szCs w:val="18"/>
+                <w:lang w:val="en-CA"/>
+              </w:rPr>
+              <w:t>T</w:t>
+            </w:r>
+            <w:r>
+              <w:rPr>
+                <w:sz w:val="16"/>
+                <w:szCs w:val="18"/>
+                <w:lang w:val="en-CA"/>
+              </w:rPr>
+              <w:t>ested on (commit) and notes</w:t>
+            </w:r>
+          </w:p>
+        </w:tc>
+      </w:tr>
+      <w:tr>
+        <w:tc>
+          <w:tcPr>
+            <w:tcW w:w="1843" w:type="dxa"/>
+          </w:tcPr>
+          <w:p>
+            <w:pPr>
+              <w:rPr>
+                <w:sz w:val="16"/>
+                <w:szCs w:val="18"/>
+                <w:lang w:val="en-CA"/>
+              </w:rPr>
+            </w:pPr>
+            <w:r>
+              <w:rPr>
+                <w:rFonts w:hint="eastAsia"/>
+                <w:sz w:val="16"/>
+                <w:szCs w:val="18"/>
+                <w:lang w:val="en-CA"/>
+              </w:rPr>
+              <w:t>A</w:t>
+            </w:r>
+            <w:r>
+              <w:rPr>
+                <w:sz w:val="16"/>
+                <w:szCs w:val="18"/>
+                <w:lang w:val="en-CA"/>
+              </w:rPr>
+              <w:t>pp.tsx, toast.tsx</w:t>
+            </w:r>
+          </w:p>
+        </w:tc>
+        <w:tc>
+          <w:tcPr>
+            <w:tcW w:w="1843" w:type="dxa"/>
+          </w:tcPr>
+          <w:p>
+            <w:pPr>
+              <w:rPr>
+                <w:sz w:val="16"/>
+                <w:szCs w:val="18"/>
+                <w:lang w:val="en-CA"/>
+              </w:rPr>
+            </w:pPr>
+            <w:r>
+              <w:rPr>
+                <w:rFonts w:hint="eastAsia"/>
+                <w:sz w:val="16"/>
+                <w:szCs w:val="18"/>
+                <w:lang w:val="en-CA"/>
+              </w:rPr>
+              <w:t>T</w:t>
+            </w:r>
+            <w:r>
+              <w:rPr>
+                <w:sz w:val="16"/>
+                <w:szCs w:val="18"/>
+                <w:lang w:val="en-CA"/>
+              </w:rPr>
+              <w:t>oast: all: width wrap</w:t>
+            </w:r>
+          </w:p>
+        </w:tc>
+        <w:tc>
+          <w:tcPr>
+            <w:tcW w:w="2410" w:type="dxa"/>
+          </w:tcPr>
+          <w:p>
+            <w:pPr>
+              <w:rPr>
+                <w:sz w:val="16"/>
+                <w:szCs w:val="18"/>
+                <w:lang w:val="en-CA"/>
+              </w:rPr>
+            </w:pPr>
+            <w:r>
+              <w:rPr>
+                <w:rFonts w:hint="eastAsia"/>
+                <w:sz w:val="16"/>
+                <w:szCs w:val="18"/>
+                <w:lang w:val="en-CA"/>
+              </w:rPr>
+              <w:t>G</w:t>
+            </w:r>
+            <w:r>
+              <w:rPr>
+                <w:sz w:val="16"/>
+                <w:szCs w:val="18"/>
+                <w:lang w:val="en-CA"/>
+              </w:rPr>
+              <w:t xml:space="preserve">o into app.tsx wherever there is a toast instantiation. </w:t>
+            </w:r>
+            <w:r>
+              <w:rPr>
+                <w:rFonts w:hint="eastAsia"/>
+                <w:sz w:val="16"/>
+                <w:szCs w:val="18"/>
+                <w:lang w:val="en-CA"/>
+              </w:rPr>
+              <w:t>I</w:t>
+            </w:r>
+            <w:r>
+              <w:rPr>
+                <w:sz w:val="16"/>
+                <w:szCs w:val="18"/>
+                <w:lang w:val="en-CA"/>
+              </w:rPr>
+              <w:t xml:space="preserve">n its message, add a line break. </w:t>
+            </w:r>
+            <w:r>
+              <w:rPr>
+                <w:rFonts w:hint="eastAsia"/>
+                <w:sz w:val="16"/>
+                <w:szCs w:val="18"/>
+                <w:lang w:val="en-CA"/>
+              </w:rPr>
+              <w:t>G</w:t>
+            </w:r>
+            <w:r>
+              <w:rPr>
+                <w:sz w:val="16"/>
+                <w:szCs w:val="18"/>
+                <w:lang w:val="en-CA"/>
+              </w:rPr>
+              <w:t xml:space="preserve">o into the editor and trigger that toast. </w:t>
+            </w:r>
+            <w:r>
+              <w:rPr>
+                <w:rFonts w:hint="eastAsia"/>
+                <w:sz w:val="16"/>
+                <w:szCs w:val="18"/>
+                <w:lang w:val="en-CA"/>
+              </w:rPr>
+              <w:t>T</w:t>
+            </w:r>
+            <w:r>
+              <w:rPr>
+                <w:sz w:val="16"/>
+                <w:szCs w:val="18"/>
+                <w:lang w:val="en-CA"/>
+              </w:rPr>
+              <w:t>hen, delete the line break, save the file, and trigger that toast in the editor again</w:t>
+            </w:r>
+          </w:p>
+        </w:tc>
+        <w:tc>
+          <w:tcPr>
+            <w:tcW w:w="3118" w:type="dxa"/>
+          </w:tcPr>
+          <w:p>
+            <w:pPr>
+              <w:rPr>
+                <w:sz w:val="16"/>
+                <w:szCs w:val="18"/>
+                <w:lang w:val="en-CA"/>
+              </w:rPr>
+            </w:pPr>
+            <w:r>
+              <w:rPr>
+                <w:rFonts w:hint="eastAsia"/>
+                <w:sz w:val="16"/>
+                <w:szCs w:val="18"/>
+                <w:lang w:val="en-CA"/>
+              </w:rPr>
+              <w:t>T</w:t>
+            </w:r>
+            <w:r>
+              <w:rPr>
+                <w:sz w:val="16"/>
+                <w:szCs w:val="18"/>
+                <w:lang w:val="en-CA"/>
+              </w:rPr>
+              <w:t xml:space="preserve">he width of the toast should wrap around the text. </w:t>
+            </w:r>
+            <w:r>
+              <w:rPr>
+                <w:rFonts w:hint="eastAsia"/>
+                <w:sz w:val="16"/>
+                <w:szCs w:val="18"/>
+                <w:lang w:val="en-CA"/>
+              </w:rPr>
+              <w:t>M</w:t>
+            </w:r>
+            <w:r>
+              <w:rPr>
+                <w:sz w:val="16"/>
+                <w:szCs w:val="18"/>
+                <w:lang w:val="en-CA"/>
+              </w:rPr>
+              <w:t xml:space="preserve">eaning, when you triggered the toast with the line break, the width of the toast should be shorter and wrap around the text. </w:t>
+            </w:r>
+            <w:r>
+              <w:rPr>
+                <w:rFonts w:hint="eastAsia"/>
+                <w:sz w:val="16"/>
+                <w:szCs w:val="18"/>
+                <w:lang w:val="en-CA"/>
+              </w:rPr>
+              <w:t>W</w:t>
+            </w:r>
+            <w:r>
+              <w:rPr>
+                <w:sz w:val="16"/>
+                <w:szCs w:val="18"/>
+                <w:lang w:val="en-CA"/>
+              </w:rPr>
+              <w:t xml:space="preserve">ithout the line break, it should be longer. </w:t>
+            </w:r>
+            <w:r>
+              <w:rPr>
+                <w:rFonts w:hint="eastAsia"/>
+                <w:sz w:val="16"/>
+                <w:szCs w:val="18"/>
+                <w:lang w:val="en-CA"/>
+              </w:rPr>
+              <w:t>B</w:t>
+            </w:r>
+            <w:r>
+              <w:rPr>
+                <w:sz w:val="16"/>
+                <w:szCs w:val="18"/>
+                <w:lang w:val="en-CA"/>
+              </w:rPr>
+              <w:t>asically, the toast shouldn’t be longer than it needs to be.</w:t>
+            </w:r>
+          </w:p>
+        </w:tc>
+        <w:tc>
+          <w:tcPr>
+            <w:tcW w:w="2410" w:type="dxa"/>
+          </w:tcPr>
+          <w:p>
+            <w:pPr>
+              <w:rPr>
+                <w:rFonts w:hint="eastAsia"/>
+                <w:sz w:val="16"/>
+                <w:szCs w:val="18"/>
+                <w:lang w:val="en-CA"/>
+              </w:rPr>
+            </w:pPr>
+            <w:r>
+              <w:rPr>
+                <w:rFonts w:hint="eastAsia"/>
+                <w:sz w:val="16"/>
+                <w:szCs w:val="18"/>
+                <w:lang w:val="en-CA"/>
+              </w:rPr>
+              <w:t>W</w:t>
+            </w:r>
+            <w:r>
+              <w:rPr>
+                <w:sz w:val="16"/>
+                <w:szCs w:val="18"/>
+                <w:lang w:val="en-CA"/>
+              </w:rPr>
+              <w:t xml:space="preserve">orking as of </w:t>
+            </w:r>
+            <w:r>
+              <w:rPr>
+                <w:sz w:val="16"/>
+                <w:szCs w:val="18"/>
+                <w:lang w:val="en-CA"/>
+              </w:rPr>
+              <w:t>067b44dd917b163ba79b5362cfbd05c485b350d9</w:t>
+            </w:r>
+          </w:p>
+        </w:tc>
+      </w:tr>
+      <w:tr>
+        <w:tc>
+          <w:tcPr>
+            <w:tcW w:w="1843" w:type="dxa"/>
+          </w:tcPr>
+          <w:p>
+            <w:pPr>
+              <w:rPr>
+                <w:rFonts w:hint="eastAsia"/>
+                <w:sz w:val="16"/>
+                <w:szCs w:val="18"/>
+                <w:lang w:val="en-CA"/>
+              </w:rPr>
+            </w:pPr>
+          </w:p>
+        </w:tc>
+        <w:tc>
+          <w:tcPr>
+            <w:tcW w:w="1843" w:type="dxa"/>
+          </w:tcPr>
+          <w:p>
+            <w:pPr>
+              <w:rPr>
+                <w:rFonts w:hint="eastAsia"/>
+                <w:sz w:val="16"/>
+                <w:szCs w:val="18"/>
+                <w:lang w:val="en-CA"/>
+              </w:rPr>
+            </w:pPr>
+          </w:p>
+        </w:tc>
+        <w:tc>
+          <w:tcPr>
+            <w:tcW w:w="2410" w:type="dxa"/>
+          </w:tcPr>
+          <w:p>
+            <w:pPr>
+              <w:rPr>
+                <w:rFonts w:hint="eastAsia"/>
+                <w:sz w:val="16"/>
+                <w:szCs w:val="18"/>
+                <w:lang w:val="en-CA"/>
+              </w:rPr>
+            </w:pPr>
+          </w:p>
+        </w:tc>
+        <w:tc>
+          <w:tcPr>
+            <w:tcW w:w="3118" w:type="dxa"/>
+          </w:tcPr>
+          <w:p>
+            <w:pPr>
+              <w:rPr>
+                <w:rFonts w:hint="eastAsia"/>
+                <w:sz w:val="16"/>
+                <w:szCs w:val="18"/>
+                <w:lang w:val="en-CA"/>
+              </w:rPr>
+            </w:pPr>
+          </w:p>
+        </w:tc>
+        <w:tc>
+          <w:tcPr>
+            <w:tcW w:w="2410" w:type="dxa"/>
+          </w:tcPr>
+          <w:p>
+            <w:pPr>
+              <w:rPr>
+                <w:rFonts w:hint="eastAsia"/>
+                <w:sz w:val="16"/>
+                <w:szCs w:val="18"/>
+                <w:lang w:val="en-CA"/>
+              </w:rPr>
+            </w:pPr>
+          </w:p>
+        </w:tc>
+      </w:tr>
+    </w:tbl>
+    <w:p>
+      <w:pPr>
+        <w:jc w:val="center"/>
+        <w:rPr>
+          <w:b/>
+          <w:bCs/>
+          <w:sz w:val="28"/>
+          <w:szCs w:val="32"/>
+          <w:lang w:val="en-CA"/>
+        </w:rPr>
+      </w:pPr>
+      <w:r>
+        <w:rPr>
+          <w:b/>
+          <w:bCs/>
+          <w:sz w:val="28"/>
+          <w:szCs w:val="32"/>
+          <w:lang w:val="en-CA"/>
+        </w:rPr>
+        <w:t>PlayneedleEditor.tsx</w:t>
+      </w:r>
+    </w:p>
+    <w:tbl>
+      <w:tblPr>
+        <w:tblStyle w:val="ae"/>
+        <w:tblW w:w="11624" w:type="dxa"/>
+        <w:tblInd w:w="-1706" w:type="dxa"/>
+        <w:tblLayout w:type="fixed"/>
+        <w:tblLook w:val="04A0" w:firstRow="1" w:lastRow="0" w:firstColumn="1" w:lastColumn="0" w:noHBand="0" w:noVBand="1"/>
+      </w:tblPr>
+      <w:tblGrid>
+        <w:gridCol w:w="1843"/>
+        <w:gridCol w:w="1843"/>
+        <w:gridCol w:w="2410"/>
+        <w:gridCol w:w="3118"/>
+        <w:gridCol w:w="2410"/>
+      </w:tblGrid>
+      <w:tr>
+        <w:tc>
+          <w:tcPr>
+            <w:tcW w:w="1843" w:type="dxa"/>
+          </w:tcPr>
+          <w:p>
+            <w:pPr>
+              <w:rPr>
+                <w:rFonts w:hint="eastAsia"/>
+                <w:sz w:val="16"/>
+                <w:szCs w:val="18"/>
+              </w:rPr>
+            </w:pPr>
+            <w:r>
+              <w:rPr>
+                <w:sz w:val="16"/>
+                <w:szCs w:val="18"/>
+              </w:rPr>
+              <w:t>Relevant f</w:t>
+            </w:r>
+            <w:r>
+              <w:rPr>
+                <w:rFonts w:hint="eastAsia"/>
+                <w:sz w:val="16"/>
+                <w:szCs w:val="18"/>
+              </w:rPr>
+              <w:t>ile</w:t>
+            </w:r>
+            <w:r>
+              <w:rPr>
+                <w:sz w:val="16"/>
+                <w:szCs w:val="18"/>
+              </w:rPr>
+              <w:t>(s)</w:t>
+            </w:r>
+          </w:p>
+        </w:tc>
+        <w:tc>
+          <w:tcPr>
+            <w:tcW w:w="1843" w:type="dxa"/>
+          </w:tcPr>
+          <w:p>
+            <w:pPr>
+              <w:rPr>
+                <w:rFonts w:hint="eastAsia"/>
+                <w:sz w:val="16"/>
+                <w:szCs w:val="18"/>
+                <w:lang w:val="en-CA"/>
+              </w:rPr>
+            </w:pPr>
+            <w:r>
+              <w:rPr>
+                <w:rFonts w:hint="eastAsia"/>
+                <w:sz w:val="16"/>
+                <w:szCs w:val="18"/>
+              </w:rPr>
+              <w:t>C</w:t>
+            </w:r>
+            <w:r>
+              <w:rPr>
+                <w:sz w:val="16"/>
+                <w:szCs w:val="18"/>
+              </w:rPr>
+              <w:t>omponent</w:t>
+            </w:r>
+          </w:p>
+        </w:tc>
+        <w:tc>
+          <w:tcPr>
+            <w:tcW w:w="2410" w:type="dxa"/>
+          </w:tcPr>
+          <w:p>
+            <w:pPr>
+              <w:rPr>
+                <w:rFonts w:hint="eastAsia"/>
+                <w:sz w:val="16"/>
+                <w:szCs w:val="18"/>
+                <w:lang w:val="en-CA"/>
+              </w:rPr>
+            </w:pPr>
+            <w:r>
+              <w:rPr>
+                <w:rFonts w:hint="eastAsia"/>
+                <w:sz w:val="16"/>
+                <w:szCs w:val="18"/>
+                <w:lang w:val="en-CA"/>
+              </w:rPr>
+              <w:t>H</w:t>
+            </w:r>
+            <w:r>
+              <w:rPr>
+                <w:sz w:val="16"/>
+                <w:szCs w:val="18"/>
+                <w:lang w:val="en-CA"/>
+              </w:rPr>
+              <w:t>ow to test</w:t>
+            </w:r>
+          </w:p>
+        </w:tc>
+        <w:tc>
+          <w:tcPr>
+            <w:tcW w:w="3118" w:type="dxa"/>
+          </w:tcPr>
+          <w:p>
+            <w:pPr>
+              <w:rPr>
+                <w:rFonts w:hint="eastAsia"/>
+                <w:sz w:val="16"/>
+                <w:szCs w:val="18"/>
+                <w:lang w:val="en-CA"/>
+              </w:rPr>
+            </w:pPr>
+            <w:r>
+              <w:rPr>
+                <w:rFonts w:hint="eastAsia"/>
+                <w:sz w:val="16"/>
+                <w:szCs w:val="18"/>
+                <w:lang w:val="en-CA"/>
+              </w:rPr>
+              <w:t>E</w:t>
+            </w:r>
+            <w:r>
+              <w:rPr>
+                <w:sz w:val="16"/>
+                <w:szCs w:val="18"/>
+                <w:lang w:val="en-CA"/>
+              </w:rPr>
+              <w:t>xpected outcome</w:t>
+            </w:r>
+          </w:p>
+        </w:tc>
+        <w:tc>
+          <w:tcPr>
+            <w:tcW w:w="2410" w:type="dxa"/>
+          </w:tcPr>
+          <w:p>
+            <w:pPr>
+              <w:rPr>
+                <w:rFonts w:hint="eastAsia"/>
+                <w:sz w:val="16"/>
+                <w:szCs w:val="18"/>
+                <w:lang w:val="en-CA"/>
+              </w:rPr>
+            </w:pPr>
+            <w:r>
+              <w:rPr>
+                <w:rFonts w:hint="eastAsia"/>
+                <w:sz w:val="16"/>
+                <w:szCs w:val="18"/>
+                <w:lang w:val="en-CA"/>
+              </w:rPr>
+              <w:t>T</w:t>
+            </w:r>
+            <w:r>
+              <w:rPr>
+                <w:sz w:val="16"/>
+                <w:szCs w:val="18"/>
+                <w:lang w:val="en-CA"/>
+              </w:rPr>
+              <w:t>ested on (commit) and notes</w:t>
+            </w:r>
+          </w:p>
+        </w:tc>
+      </w:tr>
+      <w:tr>
+        <w:tc>
+          <w:tcPr>
+            <w:tcW w:w="1843" w:type="dxa"/>
+          </w:tcPr>
+          <w:p>
+            <w:pPr>
+              <w:rPr>
+                <w:sz w:val="16"/>
+                <w:szCs w:val="18"/>
+                <w:lang w:val="en-CA"/>
+              </w:rPr>
+            </w:pPr>
+            <w:r>
+              <w:rPr>
+                <w:sz w:val="16"/>
+                <w:szCs w:val="18"/>
+                <w:lang w:val="en-CA"/>
+              </w:rPr>
+              <w:t>PlayneedleEditor.tsx</w:t>
+            </w:r>
+          </w:p>
+        </w:tc>
+        <w:tc>
+          <w:tcPr>
+            <w:tcW w:w="1843" w:type="dxa"/>
+          </w:tcPr>
+          <w:p>
+            <w:pPr>
+              <w:rPr>
+                <w:sz w:val="16"/>
+                <w:szCs w:val="18"/>
+                <w:lang w:val="en-CA"/>
+              </w:rPr>
+            </w:pPr>
+            <w:r>
+              <w:rPr>
+                <w:rFonts w:hint="eastAsia"/>
+                <w:sz w:val="16"/>
+                <w:szCs w:val="18"/>
+                <w:lang w:val="en-CA"/>
+              </w:rPr>
+              <w:t>S</w:t>
+            </w:r>
+            <w:r>
+              <w:rPr>
+                <w:sz w:val="16"/>
+                <w:szCs w:val="18"/>
+                <w:lang w:val="en-CA"/>
+              </w:rPr>
+              <w:t>ettings: components: playneedle editor: width slider</w:t>
+            </w:r>
+          </w:p>
+        </w:tc>
+        <w:tc>
+          <w:tcPr>
+            <w:tcW w:w="2410" w:type="dxa"/>
+          </w:tcPr>
+          <w:p>
+            <w:pPr>
+              <w:rPr>
+                <w:sz w:val="16"/>
+                <w:szCs w:val="18"/>
+                <w:lang w:val="en-CA"/>
+              </w:rPr>
+            </w:pPr>
+            <w:r>
+              <w:rPr>
+                <w:rFonts w:hint="eastAsia"/>
+                <w:sz w:val="16"/>
+                <w:szCs w:val="18"/>
+                <w:lang w:val="en-CA"/>
+              </w:rPr>
+              <w:t>C</w:t>
+            </w:r>
+            <w:r>
+              <w:rPr>
+                <w:sz w:val="16"/>
+                <w:szCs w:val="18"/>
+                <w:lang w:val="en-CA"/>
+              </w:rPr>
+              <w:t>hange the playneedle width (px) slider</w:t>
+            </w:r>
+          </w:p>
+        </w:tc>
+        <w:tc>
+          <w:tcPr>
+            <w:tcW w:w="3118" w:type="dxa"/>
+          </w:tcPr>
+          <w:p>
+            <w:pPr>
+              <w:rPr>
+                <w:sz w:val="16"/>
+                <w:szCs w:val="18"/>
+                <w:lang w:val="en-CA"/>
+              </w:rPr>
+            </w:pPr>
+            <w:r>
+              <w:rPr>
+                <w:rFonts w:hint="eastAsia"/>
+                <w:sz w:val="16"/>
+                <w:szCs w:val="18"/>
+                <w:lang w:val="en-CA"/>
+              </w:rPr>
+              <w:t>I</w:t>
+            </w:r>
+            <w:r>
+              <w:rPr>
+                <w:sz w:val="16"/>
+                <w:szCs w:val="18"/>
+                <w:lang w:val="en-CA"/>
+              </w:rPr>
+              <w:t>t should change the width of the playneedle both inside the editor and in the timeline.</w:t>
+            </w:r>
+          </w:p>
+        </w:tc>
+        <w:tc>
+          <w:tcPr>
+            <w:tcW w:w="2410" w:type="dxa"/>
+          </w:tcPr>
+          <w:p>
+            <w:pPr>
+              <w:rPr>
+                <w:rFonts w:hint="eastAsia"/>
+                <w:sz w:val="16"/>
+                <w:szCs w:val="18"/>
+                <w:lang w:val="en-CA"/>
+              </w:rPr>
+            </w:pPr>
+            <w:r>
+              <w:rPr>
+                <w:rFonts w:hint="eastAsia"/>
+                <w:sz w:val="16"/>
+                <w:szCs w:val="18"/>
+                <w:lang w:val="en-CA"/>
+              </w:rPr>
+              <w:t>W</w:t>
+            </w:r>
+            <w:r>
+              <w:rPr>
+                <w:sz w:val="16"/>
+                <w:szCs w:val="18"/>
+                <w:lang w:val="en-CA"/>
+              </w:rPr>
+              <w:t xml:space="preserve">orking as of </w:t>
+            </w:r>
+            <w:r>
+              <w:rPr>
+                <w:sz w:val="16"/>
+                <w:szCs w:val="18"/>
+                <w:lang w:val="en-CA"/>
+              </w:rPr>
+              <w:t>067b44dd917b163ba79b5362cfbd05c485b350d9</w:t>
+            </w:r>
+          </w:p>
+        </w:tc>
+      </w:tr>
+    </w:tbl>
+    <w:p>
+      <w:pPr>
+        <w:jc w:val="center"/>
+        <w:rPr>
+          <w:b/>
+          <w:bCs/>
+          <w:sz w:val="28"/>
+          <w:szCs w:val="32"/>
+          <w:lang w:val="en-CA"/>
+        </w:rPr>
+      </w:pPr>
+    </w:p>
+    <w:p>
+      <w:pPr>
+        <w:jc w:val="center"/>
+        <w:rPr>
+          <w:b/>
+          <w:bCs/>
+          <w:sz w:val="28"/>
+          <w:szCs w:val="32"/>
+          <w:lang w:val="en-CA"/>
+        </w:rPr>
+      </w:pPr>
+      <w:r>
+        <w:rPr>
+          <w:b/>
+          <w:bCs/>
+          <w:sz w:val="28"/>
+          <w:szCs w:val="32"/>
+          <w:lang w:val="en-CA"/>
+        </w:rPr>
+        <w:t>modalManager</w:t>
+      </w:r>
+      <w:r>
+        <w:rPr>
+          <w:b/>
+          <w:bCs/>
+          <w:sz w:val="28"/>
+          <w:szCs w:val="32"/>
+          <w:lang w:val="en-CA"/>
+        </w:rPr>
+        <w:t>.ts</w:t>
+      </w:r>
+      <w:r>
+        <w:rPr>
+          <w:b/>
+          <w:bCs/>
+          <w:sz w:val="28"/>
+          <w:szCs w:val="32"/>
+          <w:lang w:val="en-CA"/>
+        </w:rPr>
+        <w:t xml:space="preserve"> &amp; modalPermissions.ts</w:t>
+      </w:r>
+    </w:p>
+    <w:p>
+      <w:pPr>
+        <w:rPr>
           <w:sz w:val="16"/>
           <w:szCs w:val="18"/>
           <w:lang w:val="en-CA"/>
@@ -6992,7 +7739,7 @@
   <w:style w:type="paragraph" w:default="1" w:styleId="a">
     <w:name w:val="Normal"/>
     <w:qFormat/>
-    <w:rsid w:val="00351A6C"/>
+    <w:rsid w:val="00EC153A"/>
     <w:pPr>
       <w:widowControl w:val="0"/>
     </w:pPr>
@@ -7200,7 +7947,6 @@
   <w:style w:type="character" w:default="1" w:styleId="a0">
     <w:name w:val="Default Paragraph Font"/>
     <w:uiPriority w:val="1"/>
-    <w:semiHidden/>
     <w:unhideWhenUsed/>
   </w:style>
   <w:style w:type="table" w:default="1" w:styleId="a1">

</xml_diff>

<commit_message>
changed "color change transition duration" slider to "global transition duration" and moved it to the top just under gui scale
</commit_message>
<xml_diff>
--- a/test plan.docx
+++ b/test plan.docx
@@ -2753,6 +2753,233 @@
           </w:p>
         </w:tc>
       </w:tr>
+      <w:tr>
+        <w:tc>
+          <w:tcPr>
+            <w:tcW w:w="1667" w:type="dxa"/>
+          </w:tcPr>
+          <w:p>
+            <w:pPr>
+              <w:rPr>
+                <w:sz w:val="16"/>
+                <w:szCs w:val="18"/>
+                <w:lang w:val="en-CA"/>
+              </w:rPr>
+            </w:pPr>
+            <w:r>
+              <w:rPr>
+                <w:rFonts w:hint="eastAsia"/>
+                <w:sz w:val="16"/>
+                <w:szCs w:val="18"/>
+                <w:lang w:val="en-CA"/>
+              </w:rPr>
+              <w:t>S</w:t>
+            </w:r>
+            <w:r>
+              <w:rPr>
+                <w:sz w:val="16"/>
+                <w:szCs w:val="18"/>
+                <w:lang w:val="en-CA"/>
+              </w:rPr>
+              <w:t>ettings.tsx, index.css</w:t>
+            </w:r>
+          </w:p>
+        </w:tc>
+        <w:tc>
+          <w:tcPr>
+            <w:tcW w:w="2019" w:type="dxa"/>
+          </w:tcPr>
+          <w:p>
+            <w:pPr>
+              <w:rPr>
+                <w:sz w:val="16"/>
+                <w:szCs w:val="18"/>
+                <w:lang w:val="en-CA"/>
+              </w:rPr>
+            </w:pPr>
+            <w:r>
+              <w:rPr>
+                <w:rFonts w:hint="eastAsia"/>
+                <w:sz w:val="16"/>
+                <w:szCs w:val="18"/>
+                <w:lang w:val="en-CA"/>
+              </w:rPr>
+              <w:t>S</w:t>
+            </w:r>
+            <w:r>
+              <w:rPr>
+                <w:sz w:val="16"/>
+                <w:szCs w:val="18"/>
+                <w:lang w:val="en-CA"/>
+              </w:rPr>
+              <w:t>ettings: sliders: color change transition duration</w:t>
+            </w:r>
+          </w:p>
+        </w:tc>
+        <w:tc>
+          <w:tcPr>
+            <w:tcW w:w="2410" w:type="dxa"/>
+          </w:tcPr>
+          <w:p>
+            <w:pPr>
+              <w:rPr>
+                <w:sz w:val="16"/>
+                <w:szCs w:val="18"/>
+                <w:lang w:val="en-CA"/>
+              </w:rPr>
+            </w:pPr>
+            <w:r>
+              <w:rPr>
+                <w:rFonts w:hint="eastAsia"/>
+                <w:sz w:val="16"/>
+                <w:szCs w:val="18"/>
+                <w:lang w:val="en-CA"/>
+              </w:rPr>
+              <w:t>S</w:t>
+            </w:r>
+            <w:r>
+              <w:rPr>
+                <w:sz w:val="16"/>
+                <w:szCs w:val="18"/>
+                <w:lang w:val="en-CA"/>
+              </w:rPr>
+              <w:t xml:space="preserve">lide the slider to 0ms, go to styles page and change to different color themes. </w:t>
+            </w:r>
+            <w:r>
+              <w:rPr>
+                <w:rFonts w:hint="eastAsia"/>
+                <w:sz w:val="16"/>
+                <w:szCs w:val="18"/>
+                <w:lang w:val="en-CA"/>
+              </w:rPr>
+              <w:t>T</w:t>
+            </w:r>
+            <w:r>
+              <w:rPr>
+                <w:sz w:val="16"/>
+                <w:szCs w:val="18"/>
+                <w:lang w:val="en-CA"/>
+              </w:rPr>
+              <w:t>hen slide the slider to 500ms, try again, 1000ms, try again</w:t>
+            </w:r>
+          </w:p>
+        </w:tc>
+        <w:tc>
+          <w:tcPr>
+            <w:tcW w:w="3118" w:type="dxa"/>
+          </w:tcPr>
+          <w:p>
+            <w:pPr>
+              <w:pStyle w:val="a9"/>
+              <w:numPr>
+                <w:ilvl w:val="0"/>
+                <w:numId w:val="8"/>
+              </w:numPr>
+              <w:rPr>
+                <w:sz w:val="16"/>
+                <w:szCs w:val="18"/>
+                <w:lang w:val="en-CA"/>
+              </w:rPr>
+            </w:pPr>
+            <w:r>
+              <w:rPr>
+                <w:rFonts w:hint="eastAsia"/>
+                <w:sz w:val="16"/>
+                <w:szCs w:val="18"/>
+                <w:lang w:val="en-CA"/>
+              </w:rPr>
+              <w:t>E</w:t>
+            </w:r>
+            <w:r>
+              <w:rPr>
+                <w:sz w:val="16"/>
+                <w:szCs w:val="18"/>
+                <w:lang w:val="en-CA"/>
+              </w:rPr>
+              <w:t>nsure that the smooth transition is applied to EVERY SINGLE COLOR</w:t>
+            </w:r>
+          </w:p>
+          <w:p>
+            <w:pPr>
+              <w:pStyle w:val="a9"/>
+              <w:numPr>
+                <w:ilvl w:val="0"/>
+                <w:numId w:val="8"/>
+              </w:numPr>
+              <w:rPr>
+                <w:sz w:val="16"/>
+                <w:szCs w:val="18"/>
+                <w:lang w:val="en-CA"/>
+              </w:rPr>
+            </w:pPr>
+            <w:r>
+              <w:rPr>
+                <w:rFonts w:hint="eastAsia"/>
+                <w:sz w:val="16"/>
+                <w:szCs w:val="18"/>
+                <w:lang w:val="en-CA"/>
+              </w:rPr>
+              <w:t>E</w:t>
+            </w:r>
+            <w:r>
+              <w:rPr>
+                <w:sz w:val="16"/>
+                <w:szCs w:val="18"/>
+                <w:lang w:val="en-CA"/>
+              </w:rPr>
+              <w:t>nsure that the timing is correlated to the slider, so the longer the slider’s set duration time, the longer the transition should feel</w:t>
+            </w:r>
+          </w:p>
+        </w:tc>
+        <w:tc>
+          <w:tcPr>
+            <w:tcW w:w="2410" w:type="dxa"/>
+          </w:tcPr>
+          <w:p>
+            <w:pPr>
+              <w:rPr>
+                <w:sz w:val="16"/>
+                <w:szCs w:val="18"/>
+                <w:lang w:val="en-CA"/>
+              </w:rPr>
+            </w:pPr>
+            <w:r>
+              <w:rPr>
+                <w:rFonts w:hint="eastAsia"/>
+                <w:sz w:val="16"/>
+                <w:szCs w:val="18"/>
+                <w:lang w:val="en-CA"/>
+              </w:rPr>
+              <w:t>N</w:t>
+            </w:r>
+            <w:r>
+              <w:rPr>
+                <w:sz w:val="16"/>
+                <w:szCs w:val="18"/>
+                <w:lang w:val="en-CA"/>
+              </w:rPr>
+              <w:t xml:space="preserve">ot every single color is being transitioned properly. </w:t>
+            </w:r>
+            <w:r>
+              <w:rPr>
+                <w:rFonts w:hint="eastAsia"/>
+                <w:sz w:val="16"/>
+                <w:szCs w:val="18"/>
+                <w:lang w:val="en-CA"/>
+              </w:rPr>
+              <w:t>E</w:t>
+            </w:r>
+            <w:r>
+              <w:rPr>
+                <w:sz w:val="16"/>
+                <w:szCs w:val="18"/>
+                <w:lang w:val="en-CA"/>
+              </w:rPr>
+              <w:t>g the color of the icons in the styles page, whatever that color is</w:t>
+            </w:r>
+          </w:p>
+        </w:tc>
+      </w:tr>
     </w:tbl>
     <w:p>
       <w:pPr>
@@ -3001,7 +3228,6 @@
                 <w:szCs w:val="18"/>
                 <w:lang w:val="en-CA"/>
               </w:rPr>
-              <w:lastRenderedPageBreak/>
               <w:t>G</w:t>
             </w:r>
             <w:r>
@@ -3931,7 +4157,16 @@
                 <w:szCs w:val="18"/>
                 <w:lang w:val="en-CA"/>
               </w:rPr>
-              <w:t>he annular sectors should open anticlockwise fast when the delay slider is set to a small negative value, and they should open slowly when the delay slider is set to a large negative value.</w:t>
+              <w:t xml:space="preserve">he annular sectors should open anticlockwise fast when the delay slider is set to a small negative value, and they should open slowly when </w:t>
+            </w:r>
+            <w:r>
+              <w:rPr>
+                <w:sz w:val="16"/>
+                <w:szCs w:val="18"/>
+                <w:lang w:val="en-CA"/>
+              </w:rPr>
+              <w:lastRenderedPageBreak/>
+              <w:t>the delay slider is set to a large negative value.</w:t>
             </w:r>
           </w:p>
         </w:tc>
@@ -3955,6 +4190,7 @@
                 <w:szCs w:val="18"/>
                 <w:lang w:val="en-CA"/>
               </w:rPr>
+              <w:lastRenderedPageBreak/>
               <w:t>W</w:t>
             </w:r>
             <w:r>
@@ -4094,16 +4330,7 @@
                 <w:szCs w:val="18"/>
                 <w:lang w:val="en-CA"/>
               </w:rPr>
-              <w:t xml:space="preserve">lose the torus menu editor and settings. </w:t>
-            </w:r>
-            <w:r>
-              <w:rPr>
-                <w:sz w:val="16"/>
-                <w:szCs w:val="18"/>
-                <w:lang w:val="en-CA"/>
-              </w:rPr>
-              <w:lastRenderedPageBreak/>
-              <w:t>open it again</w:t>
+              <w:t>lose the torus menu editor and settings. open it again</w:t>
             </w:r>
           </w:p>
         </w:tc>
@@ -4127,7 +4354,6 @@
                 <w:szCs w:val="18"/>
                 <w:lang w:val="en-CA"/>
               </w:rPr>
-              <w:lastRenderedPageBreak/>
               <w:t>T</w:t>
             </w:r>
             <w:r>
@@ -5285,7 +5511,16 @@
                 <w:szCs w:val="18"/>
                 <w:lang w:val="en-CA"/>
               </w:rPr>
-              <w:t>tyles: specific theme: reset button</w:t>
+              <w:t xml:space="preserve">tyles: specific theme: </w:t>
+            </w:r>
+            <w:r>
+              <w:rPr>
+                <w:sz w:val="16"/>
+                <w:szCs w:val="18"/>
+                <w:lang w:val="en-CA"/>
+              </w:rPr>
+              <w:lastRenderedPageBreak/>
+              <w:t>reset button</w:t>
             </w:r>
           </w:p>
         </w:tc>
@@ -5314,6 +5549,7 @@
                 <w:szCs w:val="18"/>
                 <w:lang w:val="en-CA"/>
               </w:rPr>
+              <w:lastRenderedPageBreak/>
               <w:t>O</w:t>
             </w:r>
             <w:r>
@@ -5322,7 +5558,16 @@
                 <w:szCs w:val="18"/>
                 <w:lang w:val="en-CA"/>
               </w:rPr>
-              <w:t>pen a theme and change its color</w:t>
+              <w:t xml:space="preserve">pen a theme and </w:t>
+            </w:r>
+            <w:r>
+              <w:rPr>
+                <w:sz w:val="16"/>
+                <w:szCs w:val="18"/>
+                <w:lang w:val="en-CA"/>
+              </w:rPr>
+              <w:lastRenderedPageBreak/>
+              <w:t>change its color</w:t>
             </w:r>
           </w:p>
           <w:p>
@@ -5383,6 +5628,7 @@
                 <w:szCs w:val="18"/>
                 <w:lang w:val="en-CA"/>
               </w:rPr>
+              <w:lastRenderedPageBreak/>
               <w:t>T</w:t>
             </w:r>
             <w:r>
@@ -5391,7 +5637,16 @@
                 <w:szCs w:val="18"/>
                 <w:lang w:val="en-CA"/>
               </w:rPr>
-              <w:t>he first test should create a new reset button next to the color rectangle</w:t>
+              <w:t xml:space="preserve">he first test should create a new </w:t>
+            </w:r>
+            <w:r>
+              <w:rPr>
+                <w:sz w:val="16"/>
+                <w:szCs w:val="18"/>
+                <w:lang w:val="en-CA"/>
+              </w:rPr>
+              <w:lastRenderedPageBreak/>
+              <w:t>reset button next to the color rectangle</w:t>
             </w:r>
           </w:p>
           <w:p>
@@ -5447,6 +5702,7 @@
                 <w:szCs w:val="18"/>
                 <w:lang w:val="en-CA"/>
               </w:rPr>
+              <w:lastRenderedPageBreak/>
               <w:t>W</w:t>
             </w:r>
             <w:r>
@@ -5463,6 +5719,7 @@
                 <w:szCs w:val="18"/>
                 <w:lang w:val="en-CA"/>
               </w:rPr>
+              <w:lastRenderedPageBreak/>
               <w:t>5bddf836872611033759d627746d8b4161bba22a</w:t>
             </w:r>
           </w:p>
@@ -5520,16 +5777,7 @@
                 <w:szCs w:val="18"/>
                 <w:lang w:val="en-CA"/>
               </w:rPr>
-              <w:t xml:space="preserve">olor picker: enter hex </w:t>
-            </w:r>
-            <w:r>
-              <w:rPr>
-                <w:sz w:val="16"/>
-                <w:szCs w:val="18"/>
-                <w:lang w:val="en-CA"/>
-              </w:rPr>
-              <w:lastRenderedPageBreak/>
-              <w:t>code</w:t>
+              <w:t>olor picker: enter hex code</w:t>
             </w:r>
           </w:p>
         </w:tc>
@@ -5558,7 +5806,6 @@
                 <w:szCs w:val="18"/>
                 <w:lang w:val="en-CA"/>
               </w:rPr>
-              <w:lastRenderedPageBreak/>
               <w:t>I</w:t>
             </w:r>
             <w:r>
@@ -5567,16 +5814,7 @@
                 <w:szCs w:val="18"/>
                 <w:lang w:val="en-CA"/>
               </w:rPr>
-              <w:t xml:space="preserve">n the color picker, try to </w:t>
-            </w:r>
-            <w:r>
-              <w:rPr>
-                <w:sz w:val="16"/>
-                <w:szCs w:val="18"/>
-                <w:lang w:val="en-CA"/>
-              </w:rPr>
-              <w:lastRenderedPageBreak/>
-              <w:t>delete the hex code completely</w:t>
+              <w:t>n the color picker, try to delete the hex code completely</w:t>
             </w:r>
           </w:p>
           <w:p>
@@ -5632,7 +5870,6 @@
                 <w:szCs w:val="18"/>
                 <w:lang w:val="en-CA"/>
               </w:rPr>
-              <w:lastRenderedPageBreak/>
               <w:t>Y</w:t>
             </w:r>
             <w:r>
@@ -5641,16 +5878,7 @@
                 <w:szCs w:val="18"/>
                 <w:lang w:val="en-CA"/>
               </w:rPr>
-              <w:t xml:space="preserve">ou should be able to delete and type in </w:t>
-            </w:r>
-            <w:r>
-              <w:rPr>
-                <w:sz w:val="16"/>
-                <w:szCs w:val="18"/>
-                <w:lang w:val="en-CA"/>
-              </w:rPr>
-              <w:lastRenderedPageBreak/>
-              <w:t xml:space="preserve">the hex code perfectly with no interruptions. </w:t>
+              <w:t xml:space="preserve">ou should be able to delete and type in the hex code perfectly with no interruptions. </w:t>
             </w:r>
             <w:r>
               <w:rPr>
@@ -7138,10 +7366,10 @@
     </w:lvl>
   </w:abstractNum>
   <w:abstractNum w:abstractNumId="5" w15:restartNumberingAfterBreak="0">
-    <w:nsid w:val="71B75154"/>
+    <w:nsid w:val="6CF7025C"/>
     <w:multiLevelType w:val="hybridMultilevel"/>
-    <w:tmpl w:val="BF268854"/>
-    <w:lvl w:ilvl="0" w:tplc="E32EE820">
+    <w:tmpl w:val="67A2521A"/>
+    <w:lvl w:ilvl="0" w:tplc="5DD8928C">
       <w:start w:val="1"/>
       <w:numFmt w:val="decimal"/>
       <w:lvlText w:val="%1."/>
@@ -7227,6 +7455,95 @@
     </w:lvl>
   </w:abstractNum>
   <w:abstractNum w:abstractNumId="6" w15:restartNumberingAfterBreak="0">
+    <w:nsid w:val="71B75154"/>
+    <w:multiLevelType w:val="hybridMultilevel"/>
+    <w:tmpl w:val="BF268854"/>
+    <w:lvl w:ilvl="0" w:tplc="E32EE820">
+      <w:start w:val="1"/>
+      <w:numFmt w:val="decimal"/>
+      <w:lvlText w:val="%1."/>
+      <w:lvlJc w:val="left"/>
+      <w:pPr>
+        <w:ind w:left="360" w:hanging="360"/>
+      </w:pPr>
+      <w:rPr>
+        <w:rFonts w:hint="default"/>
+      </w:rPr>
+    </w:lvl>
+    <w:lvl w:ilvl="1" w:tplc="04090019" w:tentative="1">
+      <w:start w:val="1"/>
+      <w:numFmt w:val="lowerLetter"/>
+      <w:lvlText w:val="%2)"/>
+      <w:lvlJc w:val="left"/>
+      <w:pPr>
+        <w:ind w:left="880" w:hanging="440"/>
+      </w:pPr>
+    </w:lvl>
+    <w:lvl w:ilvl="2" w:tplc="0409001B" w:tentative="1">
+      <w:start w:val="1"/>
+      <w:numFmt w:val="lowerRoman"/>
+      <w:lvlText w:val="%3."/>
+      <w:lvlJc w:val="right"/>
+      <w:pPr>
+        <w:ind w:left="1320" w:hanging="440"/>
+      </w:pPr>
+    </w:lvl>
+    <w:lvl w:ilvl="3" w:tplc="0409000F" w:tentative="1">
+      <w:start w:val="1"/>
+      <w:numFmt w:val="decimal"/>
+      <w:lvlText w:val="%4."/>
+      <w:lvlJc w:val="left"/>
+      <w:pPr>
+        <w:ind w:left="1760" w:hanging="440"/>
+      </w:pPr>
+    </w:lvl>
+    <w:lvl w:ilvl="4" w:tplc="04090019" w:tentative="1">
+      <w:start w:val="1"/>
+      <w:numFmt w:val="lowerLetter"/>
+      <w:lvlText w:val="%5)"/>
+      <w:lvlJc w:val="left"/>
+      <w:pPr>
+        <w:ind w:left="2200" w:hanging="440"/>
+      </w:pPr>
+    </w:lvl>
+    <w:lvl w:ilvl="5" w:tplc="0409001B" w:tentative="1">
+      <w:start w:val="1"/>
+      <w:numFmt w:val="lowerRoman"/>
+      <w:lvlText w:val="%6."/>
+      <w:lvlJc w:val="right"/>
+      <w:pPr>
+        <w:ind w:left="2640" w:hanging="440"/>
+      </w:pPr>
+    </w:lvl>
+    <w:lvl w:ilvl="6" w:tplc="0409000F" w:tentative="1">
+      <w:start w:val="1"/>
+      <w:numFmt w:val="decimal"/>
+      <w:lvlText w:val="%7."/>
+      <w:lvlJc w:val="left"/>
+      <w:pPr>
+        <w:ind w:left="3080" w:hanging="440"/>
+      </w:pPr>
+    </w:lvl>
+    <w:lvl w:ilvl="7" w:tplc="04090019" w:tentative="1">
+      <w:start w:val="1"/>
+      <w:numFmt w:val="lowerLetter"/>
+      <w:lvlText w:val="%8)"/>
+      <w:lvlJc w:val="left"/>
+      <w:pPr>
+        <w:ind w:left="3520" w:hanging="440"/>
+      </w:pPr>
+    </w:lvl>
+    <w:lvl w:ilvl="8" w:tplc="0409001B" w:tentative="1">
+      <w:start w:val="1"/>
+      <w:numFmt w:val="lowerRoman"/>
+      <w:lvlText w:val="%9."/>
+      <w:lvlJc w:val="right"/>
+      <w:pPr>
+        <w:ind w:left="3960" w:hanging="440"/>
+      </w:pPr>
+    </w:lvl>
+  </w:abstractNum>
+  <w:abstractNum w:abstractNumId="7" w15:restartNumberingAfterBreak="0">
     <w:nsid w:val="764038CC"/>
     <w:multiLevelType w:val="hybridMultilevel"/>
     <w:tmpl w:val="E96EE288"/>
@@ -7325,7 +7642,7 @@
     <w:abstractNumId w:val="2"/>
   </w:num>
   <w:num w:numId="4" w16cid:durableId="2070111241">
-    <w:abstractNumId w:val="5"/>
+    <w:abstractNumId w:val="6"/>
   </w:num>
   <w:num w:numId="5" w16cid:durableId="1999797778">
     <w:abstractNumId w:val="4"/>
@@ -7334,7 +7651,10 @@
     <w:abstractNumId w:val="0"/>
   </w:num>
   <w:num w:numId="7" w16cid:durableId="1920017102">
-    <w:abstractNumId w:val="6"/>
+    <w:abstractNumId w:val="7"/>
+  </w:num>
+  <w:num w:numId="8" w16cid:durableId="1672415786">
+    <w:abstractNumId w:val="5"/>
   </w:num>
 </w:numbering>
 </file>

</xml_diff>

<commit_message>
added a TAB_NAMES dictionary to easily control the names of the tabs in settings
</commit_message>
<xml_diff>
--- a/test plan.docx
+++ b/test plan.docx
@@ -2781,6 +2781,302 @@
                 <w:szCs w:val="18"/>
                 <w:lang w:val="en-CA"/>
               </w:rPr>
+              <w:t>ettings.tsx</w:t>
+            </w:r>
+          </w:p>
+        </w:tc>
+        <w:tc>
+          <w:tcPr>
+            <w:tcW w:w="2019" w:type="dxa"/>
+          </w:tcPr>
+          <w:p>
+            <w:pPr>
+              <w:rPr>
+                <w:sz w:val="16"/>
+                <w:szCs w:val="18"/>
+                <w:lang w:val="en-CA"/>
+              </w:rPr>
+            </w:pPr>
+            <w:r>
+              <w:rPr>
+                <w:rFonts w:hint="eastAsia"/>
+                <w:sz w:val="16"/>
+                <w:szCs w:val="18"/>
+                <w:lang w:val="en-CA"/>
+              </w:rPr>
+              <w:t>S</w:t>
+            </w:r>
+            <w:r>
+              <w:rPr>
+                <w:sz w:val="16"/>
+                <w:szCs w:val="18"/>
+                <w:lang w:val="en-CA"/>
+              </w:rPr>
+              <w:t>ettings: TAB_NAMES (dictionary)</w:t>
+            </w:r>
+          </w:p>
+        </w:tc>
+        <w:tc>
+          <w:tcPr>
+            <w:tcW w:w="2410" w:type="dxa"/>
+          </w:tcPr>
+          <w:p>
+            <w:pPr>
+              <w:rPr>
+                <w:sz w:val="16"/>
+                <w:szCs w:val="18"/>
+                <w:lang w:val="en-CA"/>
+              </w:rPr>
+            </w:pPr>
+            <w:r>
+              <w:rPr>
+                <w:rFonts w:hint="eastAsia"/>
+                <w:sz w:val="16"/>
+                <w:szCs w:val="18"/>
+                <w:lang w:val="en-CA"/>
+              </w:rPr>
+              <w:t>S</w:t>
+            </w:r>
+            <w:r>
+              <w:rPr>
+                <w:sz w:val="16"/>
+                <w:szCs w:val="18"/>
+                <w:lang w:val="en-CA"/>
+              </w:rPr>
+              <w:t xml:space="preserve">earch for TAB_NAMES in settings.tsx. change any one of the names in quotation marks. </w:t>
+            </w:r>
+            <w:r>
+              <w:rPr>
+                <w:rFonts w:hint="eastAsia"/>
+                <w:sz w:val="16"/>
+                <w:szCs w:val="18"/>
+                <w:lang w:val="en-CA"/>
+              </w:rPr>
+              <w:t>C</w:t>
+            </w:r>
+            <w:r>
+              <w:rPr>
+                <w:sz w:val="16"/>
+                <w:szCs w:val="18"/>
+                <w:lang w:val="en-CA"/>
+              </w:rPr>
+              <w:t>heck settings</w:t>
+            </w:r>
+          </w:p>
+          <w:p>
+            <w:pPr>
+              <w:rPr>
+                <w:sz w:val="16"/>
+                <w:szCs w:val="18"/>
+                <w:lang w:val="en-CA"/>
+              </w:rPr>
+            </w:pPr>
+            <w:r>
+              <w:rPr>
+                <w:sz w:val="16"/>
+                <w:szCs w:val="18"/>
+                <w:lang w:val="en-CA"/>
+              </w:rPr>
+              <w:lastRenderedPageBreak/>
+              <w:drawing>
+                <wp:inline distT="0" distB="0" distL="0" distR="0" wp14:anchorId="3CCDCEE8" wp14:editId="6F35D7C6">
+                  <wp:extent cx="1370594" cy="442913"/>
+                  <wp:effectExtent l="0" t="0" r="1270" b="0"/>
+                  <wp:docPr id="1034294335" name="图片 1"/>
+                  <wp:cNvGraphicFramePr>
+                    <a:graphicFrameLocks xmlns:a="http://schemas.openxmlformats.org/drawingml/2006/main" noChangeAspect="1"/>
+                  </wp:cNvGraphicFramePr>
+                  <a:graphic xmlns:a="http://schemas.openxmlformats.org/drawingml/2006/main">
+                    <a:graphicData uri="http://schemas.openxmlformats.org/drawingml/2006/picture">
+                      <pic:pic xmlns:pic="http://schemas.openxmlformats.org/drawingml/2006/picture">
+                        <pic:nvPicPr>
+                          <pic:cNvPr id="1034294335" name=""/>
+                          <pic:cNvPicPr/>
+                        </pic:nvPicPr>
+                        <pic:blipFill>
+                          <a:blip r:embed="rId5"/>
+                          <a:stretch>
+                            <a:fillRect/>
+                          </a:stretch>
+                        </pic:blipFill>
+                        <pic:spPr>
+                          <a:xfrm>
+                            <a:off x="0" y="0"/>
+                            <a:ext cx="1385198" cy="447632"/>
+                          </a:xfrm>
+                          <a:prstGeom prst="rect">
+                            <a:avLst/>
+                          </a:prstGeom>
+                        </pic:spPr>
+                      </pic:pic>
+                    </a:graphicData>
+                  </a:graphic>
+                </wp:inline>
+              </w:drawing>
+            </w:r>
+          </w:p>
+        </w:tc>
+        <w:tc>
+          <w:tcPr>
+            <w:tcW w:w="3118" w:type="dxa"/>
+          </w:tcPr>
+          <w:p>
+            <w:pPr>
+              <w:rPr>
+                <w:sz w:val="16"/>
+                <w:szCs w:val="18"/>
+                <w:lang w:val="en-CA"/>
+              </w:rPr>
+            </w:pPr>
+            <w:r>
+              <w:rPr>
+                <w:rFonts w:hint="eastAsia"/>
+                <w:sz w:val="16"/>
+                <w:szCs w:val="18"/>
+                <w:lang w:val="en-CA"/>
+              </w:rPr>
+              <w:lastRenderedPageBreak/>
+              <w:t>T</w:t>
+            </w:r>
+            <w:r>
+              <w:rPr>
+                <w:sz w:val="16"/>
+                <w:szCs w:val="18"/>
+                <w:lang w:val="en-CA"/>
+              </w:rPr>
+              <w:t>he tab name should be changed to whatever you just typed in the quotation marks</w:t>
+            </w:r>
+          </w:p>
+          <w:p>
+            <w:pPr>
+              <w:rPr>
+                <w:sz w:val="16"/>
+                <w:szCs w:val="18"/>
+                <w:lang w:val="en-CA"/>
+              </w:rPr>
+            </w:pPr>
+            <w:r>
+              <w:rPr>
+                <w:sz w:val="16"/>
+                <w:szCs w:val="18"/>
+                <w:lang w:val="en-CA"/>
+              </w:rPr>
+              <w:lastRenderedPageBreak/>
+              <w:drawing>
+                <wp:inline distT="0" distB="0" distL="0" distR="0" wp14:anchorId="1E64C17F" wp14:editId="24B69076">
+                  <wp:extent cx="869505" cy="1465897"/>
+                  <wp:effectExtent l="0" t="0" r="6985" b="1270"/>
+                  <wp:docPr id="1640263732" name="图片 1"/>
+                  <wp:cNvGraphicFramePr>
+                    <a:graphicFrameLocks xmlns:a="http://schemas.openxmlformats.org/drawingml/2006/main" noChangeAspect="1"/>
+                  </wp:cNvGraphicFramePr>
+                  <a:graphic xmlns:a="http://schemas.openxmlformats.org/drawingml/2006/main">
+                    <a:graphicData uri="http://schemas.openxmlformats.org/drawingml/2006/picture">
+                      <pic:pic xmlns:pic="http://schemas.openxmlformats.org/drawingml/2006/picture">
+                        <pic:nvPicPr>
+                          <pic:cNvPr id="1640263732" name=""/>
+                          <pic:cNvPicPr/>
+                        </pic:nvPicPr>
+                        <pic:blipFill>
+                          <a:blip r:embed="rId6"/>
+                          <a:stretch>
+                            <a:fillRect/>
+                          </a:stretch>
+                        </pic:blipFill>
+                        <pic:spPr>
+                          <a:xfrm>
+                            <a:off x="0" y="0"/>
+                            <a:ext cx="873982" cy="1473445"/>
+                          </a:xfrm>
+                          <a:prstGeom prst="rect">
+                            <a:avLst/>
+                          </a:prstGeom>
+                        </pic:spPr>
+                      </pic:pic>
+                    </a:graphicData>
+                  </a:graphic>
+                </wp:inline>
+              </w:drawing>
+            </w:r>
+          </w:p>
+        </w:tc>
+        <w:tc>
+          <w:tcPr>
+            <w:tcW w:w="2410" w:type="dxa"/>
+          </w:tcPr>
+          <w:p>
+            <w:pPr>
+              <w:rPr>
+                <w:sz w:val="16"/>
+                <w:szCs w:val="18"/>
+                <w:lang w:val="en-CA"/>
+              </w:rPr>
+            </w:pPr>
+            <w:r>
+              <w:rPr>
+                <w:rFonts w:hint="eastAsia"/>
+                <w:sz w:val="16"/>
+                <w:szCs w:val="18"/>
+                <w:lang w:val="en-CA"/>
+              </w:rPr>
+              <w:lastRenderedPageBreak/>
+              <w:t>W</w:t>
+            </w:r>
+            <w:r>
+              <w:rPr>
+                <w:sz w:val="16"/>
+                <w:szCs w:val="18"/>
+                <w:lang w:val="en-CA"/>
+              </w:rPr>
+              <w:t xml:space="preserve">orking as of </w:t>
+            </w:r>
+            <w:r>
+              <w:rPr>
+                <w:sz w:val="16"/>
+                <w:szCs w:val="18"/>
+                <w:lang w:val="en-CA"/>
+              </w:rPr>
+              <w:t>067b44dd917b163ba79b5362cfbd05c485b350d9</w:t>
+            </w:r>
+            <w:r>
+              <w:rPr>
+                <w:sz w:val="16"/>
+                <w:szCs w:val="18"/>
+                <w:lang w:val="en-CA"/>
+              </w:rPr>
+              <w:t xml:space="preserve"> + 1</w:t>
+            </w:r>
+          </w:p>
+        </w:tc>
+      </w:tr>
+      <w:tr>
+        <w:tc>
+          <w:tcPr>
+            <w:tcW w:w="1667" w:type="dxa"/>
+          </w:tcPr>
+          <w:p>
+            <w:pPr>
+              <w:rPr>
+                <w:sz w:val="16"/>
+                <w:szCs w:val="18"/>
+                <w:lang w:val="en-CA"/>
+              </w:rPr>
+            </w:pPr>
+            <w:r>
+              <w:rPr>
+                <w:rFonts w:hint="eastAsia"/>
+                <w:sz w:val="16"/>
+                <w:szCs w:val="18"/>
+                <w:lang w:val="en-CA"/>
+              </w:rPr>
+              <w:t>S</w:t>
+            </w:r>
+            <w:r>
+              <w:rPr>
+                <w:sz w:val="16"/>
+                <w:szCs w:val="18"/>
+                <w:lang w:val="en-CA"/>
+              </w:rPr>
               <w:t>ettings.tsx, index.css</w:t>
             </w:r>
           </w:p>
@@ -2812,7 +3108,15 @@
                 <w:szCs w:val="18"/>
                 <w:lang w:val="en-CA"/>
               </w:rPr>
-              <w:t>ettings: sliders: color change transition duration</w:t>
+              <w:t xml:space="preserve">ettings: sliders: </w:t>
+            </w:r>
+            <w:r>
+              <w:rPr>
+                <w:sz w:val="16"/>
+                <w:szCs w:val="18"/>
+                <w:lang w:val="en-CA"/>
+              </w:rPr>
+              <w:t>global transition duration</w:t>
             </w:r>
           </w:p>
         </w:tc>
@@ -2977,6 +3281,275 @@
               </w:rPr>
               <w:t>g the color of the icons in the styles page, whatever that color is</w:t>
             </w:r>
+          </w:p>
+        </w:tc>
+      </w:tr>
+      <w:tr>
+        <w:tc>
+          <w:tcPr>
+            <w:tcW w:w="1667" w:type="dxa"/>
+          </w:tcPr>
+          <w:p>
+            <w:pPr>
+              <w:rPr>
+                <w:sz w:val="16"/>
+                <w:szCs w:val="18"/>
+                <w:lang w:val="en-CA"/>
+              </w:rPr>
+            </w:pPr>
+            <w:r>
+              <w:rPr>
+                <w:rFonts w:hint="eastAsia"/>
+                <w:sz w:val="16"/>
+                <w:szCs w:val="18"/>
+                <w:lang w:val="en-CA"/>
+              </w:rPr>
+              <w:t>S</w:t>
+            </w:r>
+            <w:r>
+              <w:rPr>
+                <w:sz w:val="16"/>
+                <w:szCs w:val="18"/>
+                <w:lang w:val="en-CA"/>
+              </w:rPr>
+              <w:t>ettings.tsx</w:t>
+            </w:r>
+          </w:p>
+        </w:tc>
+        <w:tc>
+          <w:tcPr>
+            <w:tcW w:w="2019" w:type="dxa"/>
+          </w:tcPr>
+          <w:p>
+            <w:pPr>
+              <w:rPr>
+                <w:sz w:val="16"/>
+                <w:szCs w:val="18"/>
+                <w:lang w:val="en-CA"/>
+              </w:rPr>
+            </w:pPr>
+            <w:r>
+              <w:rPr>
+                <w:rFonts w:hint="eastAsia"/>
+                <w:sz w:val="16"/>
+                <w:szCs w:val="18"/>
+                <w:lang w:val="en-CA"/>
+              </w:rPr>
+              <w:t>S</w:t>
+            </w:r>
+            <w:r>
+              <w:rPr>
+                <w:sz w:val="16"/>
+                <w:szCs w:val="18"/>
+                <w:lang w:val="en-CA"/>
+              </w:rPr>
+              <w:t>ettings: sliders: global transition duration</w:t>
+            </w:r>
+          </w:p>
+        </w:tc>
+        <w:tc>
+          <w:tcPr>
+            <w:tcW w:w="2410" w:type="dxa"/>
+          </w:tcPr>
+          <w:p>
+            <w:pPr>
+              <w:rPr>
+                <w:sz w:val="16"/>
+                <w:szCs w:val="18"/>
+                <w:lang w:val="en-CA"/>
+              </w:rPr>
+            </w:pPr>
+            <w:r>
+              <w:rPr>
+                <w:rFonts w:hint="eastAsia"/>
+                <w:sz w:val="16"/>
+                <w:szCs w:val="18"/>
+                <w:lang w:val="en-CA"/>
+              </w:rPr>
+              <w:t>C</w:t>
+            </w:r>
+            <w:r>
+              <w:rPr>
+                <w:sz w:val="16"/>
+                <w:szCs w:val="18"/>
+                <w:lang w:val="en-CA"/>
+              </w:rPr>
+              <w:t xml:space="preserve">lick on any switch (the updated checkbox version with a circle that moves from left to right. </w:t>
+            </w:r>
+            <w:r>
+              <w:rPr>
+                <w:rFonts w:hint="eastAsia"/>
+                <w:sz w:val="16"/>
+                <w:szCs w:val="18"/>
+                <w:lang w:val="en-CA"/>
+              </w:rPr>
+              <w:t>U</w:t>
+            </w:r>
+            <w:r>
+              <w:rPr>
+                <w:sz w:val="16"/>
+                <w:szCs w:val="18"/>
+                <w:lang w:val="en-CA"/>
+              </w:rPr>
+              <w:t>gh let me just screenshot it real quick)</w:t>
+            </w:r>
+          </w:p>
+          <w:p>
+            <w:pPr>
+              <w:rPr>
+                <w:sz w:val="16"/>
+                <w:szCs w:val="18"/>
+                <w:lang w:val="en-CA"/>
+              </w:rPr>
+            </w:pPr>
+            <w:r>
+              <w:rPr>
+                <w:sz w:val="16"/>
+                <w:szCs w:val="18"/>
+                <w:lang w:val="en-CA"/>
+              </w:rPr>
+              <w:drawing>
+                <wp:inline distT="0" distB="0" distL="0" distR="0" wp14:anchorId="78D08D55" wp14:editId="73CAFEEB">
+                  <wp:extent cx="1393190" cy="1348105"/>
+                  <wp:effectExtent l="0" t="0" r="0" b="4445"/>
+                  <wp:docPr id="1449275522" name="图片 1"/>
+                  <wp:cNvGraphicFramePr>
+                    <a:graphicFrameLocks xmlns:a="http://schemas.openxmlformats.org/drawingml/2006/main" noChangeAspect="1"/>
+                  </wp:cNvGraphicFramePr>
+                  <a:graphic xmlns:a="http://schemas.openxmlformats.org/drawingml/2006/main">
+                    <a:graphicData uri="http://schemas.openxmlformats.org/drawingml/2006/picture">
+                      <pic:pic xmlns:pic="http://schemas.openxmlformats.org/drawingml/2006/picture">
+                        <pic:nvPicPr>
+                          <pic:cNvPr id="1449275522" name=""/>
+                          <pic:cNvPicPr/>
+                        </pic:nvPicPr>
+                        <pic:blipFill>
+                          <a:blip r:embed="rId7"/>
+                          <a:stretch>
+                            <a:fillRect/>
+                          </a:stretch>
+                        </pic:blipFill>
+                        <pic:spPr>
+                          <a:xfrm>
+                            <a:off x="0" y="0"/>
+                            <a:ext cx="1393190" cy="1348105"/>
+                          </a:xfrm>
+                          <a:prstGeom prst="rect">
+                            <a:avLst/>
+                          </a:prstGeom>
+                        </pic:spPr>
+                      </pic:pic>
+                    </a:graphicData>
+                  </a:graphic>
+                </wp:inline>
+              </w:drawing>
+            </w:r>
+          </w:p>
+          <w:p>
+            <w:pPr>
+              <w:rPr>
+                <w:sz w:val="16"/>
+                <w:szCs w:val="18"/>
+                <w:lang w:val="en-CA"/>
+              </w:rPr>
+            </w:pPr>
+            <w:r>
+              <w:rPr>
+                <w:rFonts w:hint="eastAsia"/>
+                <w:sz w:val="16"/>
+                <w:szCs w:val="18"/>
+                <w:lang w:val="en-CA"/>
+              </w:rPr>
+              <w:t>T</w:t>
+            </w:r>
+            <w:r>
+              <w:rPr>
+                <w:sz w:val="16"/>
+                <w:szCs w:val="18"/>
+                <w:lang w:val="en-CA"/>
+              </w:rPr>
+              <w:t xml:space="preserve">hat. </w:t>
+            </w:r>
+            <w:r>
+              <w:rPr>
+                <w:rFonts w:hint="eastAsia"/>
+                <w:sz w:val="16"/>
+                <w:szCs w:val="18"/>
+                <w:lang w:val="en-CA"/>
+              </w:rPr>
+              <w:t>S</w:t>
+            </w:r>
+            <w:r>
+              <w:rPr>
+                <w:sz w:val="16"/>
+                <w:szCs w:val="18"/>
+                <w:lang w:val="en-CA"/>
+              </w:rPr>
+              <w:t>witch.</w:t>
+            </w:r>
+          </w:p>
+        </w:tc>
+        <w:tc>
+          <w:tcPr>
+            <w:tcW w:w="3118" w:type="dxa"/>
+          </w:tcPr>
+          <w:p>
+            <w:pPr>
+              <w:rPr>
+                <w:sz w:val="16"/>
+                <w:szCs w:val="18"/>
+                <w:lang w:val="en-CA"/>
+              </w:rPr>
+            </w:pPr>
+            <w:r>
+              <w:rPr>
+                <w:rFonts w:hint="eastAsia"/>
+                <w:sz w:val="16"/>
+                <w:szCs w:val="18"/>
+                <w:lang w:val="en-CA"/>
+              </w:rPr>
+              <w:t>T</w:t>
+            </w:r>
+            <w:r>
+              <w:rPr>
+                <w:sz w:val="16"/>
+                <w:szCs w:val="18"/>
+                <w:lang w:val="en-CA"/>
+              </w:rPr>
+              <w:t xml:space="preserve">he switch’s motion should exactly be the duration set in the global transition duration. </w:t>
+            </w:r>
+            <w:r>
+              <w:rPr>
+                <w:rFonts w:hint="eastAsia"/>
+                <w:sz w:val="16"/>
+                <w:szCs w:val="18"/>
+                <w:lang w:val="en-CA"/>
+              </w:rPr>
+              <w:t>T</w:t>
+            </w:r>
+            <w:r>
+              <w:rPr>
+                <w:sz w:val="16"/>
+                <w:szCs w:val="18"/>
+                <w:lang w:val="en-CA"/>
+              </w:rPr>
+              <w:t>he color change should also be the same as global transition duration.</w:t>
+            </w:r>
+          </w:p>
+        </w:tc>
+        <w:tc>
+          <w:tcPr>
+            <w:tcW w:w="2410" w:type="dxa"/>
+          </w:tcPr>
+          <w:p>
+            <w:pPr>
+              <w:rPr>
+                <w:rFonts w:hint="eastAsia"/>
+                <w:sz w:val="16"/>
+                <w:szCs w:val="18"/>
+                <w:lang w:val="en-CA"/>
+              </w:rPr>
+            </w:pPr>
           </w:p>
         </w:tc>
       </w:tr>
@@ -3523,7 +4096,16 @@
                 <w:szCs w:val="18"/>
                 <w:lang w:val="en-CA"/>
               </w:rPr>
-              <w:t>ettings: components: torus menu editor: graph: multiple anchor points</w:t>
+              <w:t xml:space="preserve">ettings: components: torus menu editor: graph: </w:t>
+            </w:r>
+            <w:r>
+              <w:rPr>
+                <w:sz w:val="16"/>
+                <w:szCs w:val="18"/>
+                <w:lang w:val="en-CA"/>
+              </w:rPr>
+              <w:lastRenderedPageBreak/>
+              <w:t>multiple anchor points</w:t>
             </w:r>
           </w:p>
         </w:tc>
@@ -3547,6 +4129,7 @@
                 <w:szCs w:val="18"/>
                 <w:lang w:val="en-CA"/>
               </w:rPr>
+              <w:lastRenderedPageBreak/>
               <w:t>C</w:t>
             </w:r>
             <w:r>
@@ -3555,7 +4138,16 @@
                 <w:szCs w:val="18"/>
                 <w:lang w:val="en-CA"/>
               </w:rPr>
-              <w:t xml:space="preserve">lick and drag a point and move it up and towards the beginning of the graph. </w:t>
+              <w:t xml:space="preserve">lick and drag a point and move it up and towards the </w:t>
+            </w:r>
+            <w:r>
+              <w:rPr>
+                <w:sz w:val="16"/>
+                <w:szCs w:val="18"/>
+                <w:lang w:val="en-CA"/>
+              </w:rPr>
+              <w:lastRenderedPageBreak/>
+              <w:t xml:space="preserve">beginning of the graph. </w:t>
             </w:r>
             <w:r>
               <w:rPr>
@@ -3596,6 +4188,7 @@
                 <w:szCs w:val="18"/>
                 <w:lang w:val="en-CA"/>
               </w:rPr>
+              <w:lastRenderedPageBreak/>
               <w:t>T</w:t>
             </w:r>
             <w:r>
@@ -3604,7 +4197,16 @@
                 <w:szCs w:val="18"/>
                 <w:lang w:val="en-CA"/>
               </w:rPr>
-              <w:t xml:space="preserve">he points should be immediately created as soon as you clicked your mouse button down, and the anchor point should’ve followed your mouse as you dragged it across the graph. </w:t>
+              <w:t xml:space="preserve">he points should be immediately created as soon as you clicked your mouse button </w:t>
+            </w:r>
+            <w:r>
+              <w:rPr>
+                <w:sz w:val="16"/>
+                <w:szCs w:val="18"/>
+                <w:lang w:val="en-CA"/>
+              </w:rPr>
+              <w:lastRenderedPageBreak/>
+              <w:t xml:space="preserve">down, and the anchor point should’ve followed your mouse as you dragged it across the graph. </w:t>
             </w:r>
           </w:p>
         </w:tc>
@@ -3628,6 +4230,7 @@
                 <w:szCs w:val="18"/>
                 <w:lang w:val="en-CA"/>
               </w:rPr>
+              <w:lastRenderedPageBreak/>
               <w:t>W</w:t>
             </w:r>
             <w:r>
@@ -3644,7 +4247,16 @@
                 <w:szCs w:val="18"/>
                 <w:lang w:val="en-CA"/>
               </w:rPr>
-              <w:t>5bddf836872611033759d627746d8b4161bba22a</w:t>
+              <w:t>5bddf836872611033759d62774</w:t>
+            </w:r>
+            <w:r>
+              <w:rPr>
+                <w:sz w:val="16"/>
+                <w:szCs w:val="18"/>
+                <w:lang w:val="en-CA"/>
+              </w:rPr>
+              <w:lastRenderedPageBreak/>
+              <w:t>6d8b4161bba22a</w:t>
             </w:r>
           </w:p>
         </w:tc>
@@ -3670,6 +4282,7 @@
                 <w:szCs w:val="18"/>
                 <w:lang w:val="en-CA"/>
               </w:rPr>
+              <w:lastRenderedPageBreak/>
               <w:t>G</w:t>
             </w:r>
             <w:r>
@@ -4157,16 +4770,7 @@
                 <w:szCs w:val="18"/>
                 <w:lang w:val="en-CA"/>
               </w:rPr>
-              <w:t xml:space="preserve">he annular sectors should open anticlockwise fast when the delay slider is set to a small negative value, and they should open slowly when </w:t>
-            </w:r>
-            <w:r>
-              <w:rPr>
-                <w:sz w:val="16"/>
-                <w:szCs w:val="18"/>
-                <w:lang w:val="en-CA"/>
-              </w:rPr>
-              <w:lastRenderedPageBreak/>
-              <w:t>the delay slider is set to a large negative value.</w:t>
+              <w:t>he annular sectors should open anticlockwise fast when the delay slider is set to a small negative value, and they should open slowly when the delay slider is set to a large negative value.</w:t>
             </w:r>
           </w:p>
         </w:tc>
@@ -4190,7 +4794,6 @@
                 <w:szCs w:val="18"/>
                 <w:lang w:val="en-CA"/>
               </w:rPr>
-              <w:lastRenderedPageBreak/>
               <w:t>W</w:t>
             </w:r>
             <w:r>
@@ -4655,6 +5258,7 @@
                 <w:sz w:val="16"/>
                 <w:szCs w:val="18"/>
               </w:rPr>
+              <w:lastRenderedPageBreak/>
               <w:t>Relevant f</w:t>
             </w:r>
             <w:r>
@@ -5511,16 +6115,7 @@
                 <w:szCs w:val="18"/>
                 <w:lang w:val="en-CA"/>
               </w:rPr>
-              <w:t xml:space="preserve">tyles: specific theme: </w:t>
-            </w:r>
-            <w:r>
-              <w:rPr>
-                <w:sz w:val="16"/>
-                <w:szCs w:val="18"/>
-                <w:lang w:val="en-CA"/>
-              </w:rPr>
-              <w:lastRenderedPageBreak/>
-              <w:t>reset button</w:t>
+              <w:t>tyles: specific theme: reset button</w:t>
             </w:r>
           </w:p>
         </w:tc>
@@ -5549,7 +6144,6 @@
                 <w:szCs w:val="18"/>
                 <w:lang w:val="en-CA"/>
               </w:rPr>
-              <w:lastRenderedPageBreak/>
               <w:t>O</w:t>
             </w:r>
             <w:r>
@@ -5558,16 +6152,7 @@
                 <w:szCs w:val="18"/>
                 <w:lang w:val="en-CA"/>
               </w:rPr>
-              <w:t xml:space="preserve">pen a theme and </w:t>
-            </w:r>
-            <w:r>
-              <w:rPr>
-                <w:sz w:val="16"/>
-                <w:szCs w:val="18"/>
-                <w:lang w:val="en-CA"/>
-              </w:rPr>
-              <w:lastRenderedPageBreak/>
-              <w:t>change its color</w:t>
+              <w:t>pen a theme and change its color</w:t>
             </w:r>
           </w:p>
           <w:p>
@@ -5628,7 +6213,6 @@
                 <w:szCs w:val="18"/>
                 <w:lang w:val="en-CA"/>
               </w:rPr>
-              <w:lastRenderedPageBreak/>
               <w:t>T</w:t>
             </w:r>
             <w:r>
@@ -5637,16 +6221,7 @@
                 <w:szCs w:val="18"/>
                 <w:lang w:val="en-CA"/>
               </w:rPr>
-              <w:t xml:space="preserve">he first test should create a new </w:t>
-            </w:r>
-            <w:r>
-              <w:rPr>
-                <w:sz w:val="16"/>
-                <w:szCs w:val="18"/>
-                <w:lang w:val="en-CA"/>
-              </w:rPr>
-              <w:lastRenderedPageBreak/>
-              <w:t>reset button next to the color rectangle</w:t>
+              <w:t>he first test should create a new reset button next to the color rectangle</w:t>
             </w:r>
           </w:p>
           <w:p>
@@ -5702,7 +6277,6 @@
                 <w:szCs w:val="18"/>
                 <w:lang w:val="en-CA"/>
               </w:rPr>
-              <w:lastRenderedPageBreak/>
               <w:t>W</w:t>
             </w:r>
             <w:r>
@@ -5719,7 +6293,6 @@
                 <w:szCs w:val="18"/>
                 <w:lang w:val="en-CA"/>
               </w:rPr>
-              <w:lastRenderedPageBreak/>
               <w:t>5bddf836872611033759d627746d8b4161bba22a</w:t>
             </w:r>
           </w:p>
@@ -6160,6 +6733,7 @@
                 <w:szCs w:val="18"/>
                 <w:lang w:val="en-CA"/>
               </w:rPr>
+              <w:lastRenderedPageBreak/>
               <w:t>A</w:t>
             </w:r>
             <w:r>

</xml_diff>

<commit_message>
changed "checkboxes" to "switches" (settings tab name) and made the dependent switch setting "execute header action buttons when dragging" not greyed out anymore when "Allow ×, -, and ← buttons" switch setting is enabled
</commit_message>
<xml_diff>
--- a/test plan.docx
+++ b/test plan.docx
@@ -1859,6 +1859,1613 @@
           <w:p>
             <w:pPr>
               <w:rPr>
+                <w:sz w:val="16"/>
+                <w:szCs w:val="18"/>
+                <w:lang w:val="en-CA"/>
+              </w:rPr>
+            </w:pPr>
+            <w:r>
+              <w:rPr>
+                <w:rFonts w:hint="eastAsia"/>
+                <w:sz w:val="16"/>
+                <w:szCs w:val="18"/>
+                <w:lang w:val="en-CA"/>
+              </w:rPr>
+              <w:t>S</w:t>
+            </w:r>
+            <w:r>
+              <w:rPr>
+                <w:sz w:val="16"/>
+                <w:szCs w:val="18"/>
+                <w:lang w:val="en-CA"/>
+              </w:rPr>
+              <w:t>ettings.tsx</w:t>
+            </w:r>
+          </w:p>
+        </w:tc>
+        <w:tc>
+          <w:tcPr>
+            <w:tcW w:w="2019" w:type="dxa"/>
+          </w:tcPr>
+          <w:p>
+            <w:pPr>
+              <w:rPr>
+                <w:sz w:val="16"/>
+                <w:szCs w:val="18"/>
+                <w:lang w:val="en-CA"/>
+              </w:rPr>
+            </w:pPr>
+            <w:r>
+              <w:rPr>
+                <w:rFonts w:hint="eastAsia"/>
+                <w:sz w:val="16"/>
+                <w:szCs w:val="18"/>
+                <w:lang w:val="en-CA"/>
+              </w:rPr>
+              <w:t>S</w:t>
+            </w:r>
+            <w:r>
+              <w:rPr>
+                <w:sz w:val="16"/>
+                <w:szCs w:val="18"/>
+                <w:lang w:val="en-CA"/>
+              </w:rPr>
+              <w:t xml:space="preserve">ettings: switches: </w:t>
+            </w:r>
+            <w:r>
+              <w:rPr>
+                <w:sz w:val="16"/>
+                <w:szCs w:val="18"/>
+              </w:rPr>
+              <w:t>Allow ×, -, and ← buttons in modals' header bar to be draggable</w:t>
+            </w:r>
+            <w:r>
+              <w:rPr>
+                <w:sz w:val="16"/>
+                <w:szCs w:val="18"/>
+              </w:rPr>
+              <w:t>: DISABLED</w:t>
+            </w:r>
+          </w:p>
+        </w:tc>
+        <w:tc>
+          <w:tcPr>
+            <w:tcW w:w="2410" w:type="dxa"/>
+          </w:tcPr>
+          <w:p>
+            <w:pPr>
+              <w:rPr>
+                <w:sz w:val="16"/>
+                <w:szCs w:val="18"/>
+                <w:lang w:val="en-CA"/>
+              </w:rPr>
+            </w:pPr>
+            <w:r>
+              <w:rPr>
+                <w:rFonts w:hint="eastAsia"/>
+                <w:sz w:val="16"/>
+                <w:szCs w:val="18"/>
+                <w:lang w:val="en-CA"/>
+              </w:rPr>
+              <w:t>T</w:t>
+            </w:r>
+            <w:r>
+              <w:rPr>
+                <w:sz w:val="16"/>
+                <w:szCs w:val="18"/>
+                <w:lang w:val="en-CA"/>
+              </w:rPr>
+              <w:t>ry dragging the x button, - button, and back button.</w:t>
+            </w:r>
+          </w:p>
+        </w:tc>
+        <w:tc>
+          <w:tcPr>
+            <w:tcW w:w="3118" w:type="dxa"/>
+          </w:tcPr>
+          <w:p>
+            <w:pPr>
+              <w:rPr>
+                <w:sz w:val="16"/>
+                <w:szCs w:val="18"/>
+                <w:lang w:val="en-CA"/>
+              </w:rPr>
+            </w:pPr>
+            <w:r>
+              <w:rPr>
+                <w:rFonts w:hint="eastAsia"/>
+                <w:sz w:val="16"/>
+                <w:szCs w:val="18"/>
+                <w:lang w:val="en-CA"/>
+              </w:rPr>
+              <w:t>I</w:t>
+            </w:r>
+            <w:r>
+              <w:rPr>
+                <w:sz w:val="16"/>
+                <w:szCs w:val="18"/>
+                <w:lang w:val="en-CA"/>
+              </w:rPr>
+              <w:t>t shouldn’t drag the modal</w:t>
+            </w:r>
+          </w:p>
+        </w:tc>
+        <w:tc>
+          <w:tcPr>
+            <w:tcW w:w="2410" w:type="dxa"/>
+          </w:tcPr>
+          <w:p>
+            <w:pPr>
+              <w:rPr>
+                <w:sz w:val="16"/>
+                <w:szCs w:val="18"/>
+                <w:lang w:val="en-CA"/>
+              </w:rPr>
+            </w:pPr>
+            <w:r>
+              <w:rPr>
+                <w:rFonts w:hint="eastAsia"/>
+                <w:sz w:val="16"/>
+                <w:szCs w:val="18"/>
+                <w:lang w:val="en-CA"/>
+              </w:rPr>
+              <w:t>W</w:t>
+            </w:r>
+            <w:r>
+              <w:rPr>
+                <w:sz w:val="16"/>
+                <w:szCs w:val="18"/>
+                <w:lang w:val="en-CA"/>
+              </w:rPr>
+              <w:t xml:space="preserve">orks as of </w:t>
+            </w:r>
+            <w:r>
+              <w:rPr>
+                <w:sz w:val="16"/>
+                <w:szCs w:val="18"/>
+                <w:lang w:val="en-CA"/>
+              </w:rPr>
+              <w:t>9577b4626ef83978b054f3200592ec63f9a356f2</w:t>
+            </w:r>
+          </w:p>
+        </w:tc>
+      </w:tr>
+      <w:tr>
+        <w:tc>
+          <w:tcPr>
+            <w:tcW w:w="1667" w:type="dxa"/>
+          </w:tcPr>
+          <w:p>
+            <w:pPr>
+              <w:rPr>
+                <w:sz w:val="16"/>
+                <w:szCs w:val="18"/>
+                <w:lang w:val="en-CA"/>
+              </w:rPr>
+            </w:pPr>
+            <w:r>
+              <w:rPr>
+                <w:rFonts w:hint="eastAsia"/>
+                <w:sz w:val="16"/>
+                <w:szCs w:val="18"/>
+                <w:lang w:val="en-CA"/>
+              </w:rPr>
+              <w:t>S</w:t>
+            </w:r>
+            <w:r>
+              <w:rPr>
+                <w:sz w:val="16"/>
+                <w:szCs w:val="18"/>
+                <w:lang w:val="en-CA"/>
+              </w:rPr>
+              <w:t>ettings.tsx</w:t>
+            </w:r>
+          </w:p>
+        </w:tc>
+        <w:tc>
+          <w:tcPr>
+            <w:tcW w:w="2019" w:type="dxa"/>
+          </w:tcPr>
+          <w:p>
+            <w:pPr>
+              <w:rPr>
+                <w:rFonts w:hint="eastAsia"/>
+                <w:sz w:val="16"/>
+                <w:szCs w:val="18"/>
+                <w:lang w:val="en-CA"/>
+              </w:rPr>
+            </w:pPr>
+            <w:r>
+              <w:rPr>
+                <w:rFonts w:hint="eastAsia"/>
+                <w:sz w:val="16"/>
+                <w:szCs w:val="18"/>
+                <w:lang w:val="en-CA"/>
+              </w:rPr>
+              <w:t>S</w:t>
+            </w:r>
+            <w:r>
+              <w:rPr>
+                <w:sz w:val="16"/>
+                <w:szCs w:val="18"/>
+                <w:lang w:val="en-CA"/>
+              </w:rPr>
+              <w:t xml:space="preserve">ettings: switches: </w:t>
+            </w:r>
+            <w:r>
+              <w:rPr>
+                <w:sz w:val="16"/>
+                <w:szCs w:val="18"/>
+              </w:rPr>
+              <w:t>Allow ×, -, and ← buttons in modals' header bar to be draggable</w:t>
+            </w:r>
+            <w:r>
+              <w:rPr>
+                <w:sz w:val="16"/>
+                <w:szCs w:val="18"/>
+              </w:rPr>
+              <w:t>: DISABLED</w:t>
+            </w:r>
+            <w:r>
+              <w:rPr>
+                <w:sz w:val="16"/>
+                <w:szCs w:val="18"/>
+              </w:rPr>
+              <w:t xml:space="preserve"> #2</w:t>
+            </w:r>
+          </w:p>
+        </w:tc>
+        <w:tc>
+          <w:tcPr>
+            <w:tcW w:w="2410" w:type="dxa"/>
+          </w:tcPr>
+          <w:p>
+            <w:pPr>
+              <w:rPr>
+                <w:sz w:val="16"/>
+                <w:szCs w:val="18"/>
+                <w:lang w:val="en-CA"/>
+              </w:rPr>
+            </w:pPr>
+            <w:r>
+              <w:rPr>
+                <w:rFonts w:hint="eastAsia"/>
+                <w:sz w:val="16"/>
+                <w:szCs w:val="18"/>
+                <w:lang w:val="en-CA"/>
+              </w:rPr>
+              <w:t>L</w:t>
+            </w:r>
+            <w:r>
+              <w:rPr>
+                <w:sz w:val="16"/>
+                <w:szCs w:val="18"/>
+                <w:lang w:val="en-CA"/>
+              </w:rPr>
+              <w:t xml:space="preserve">ook at the dependent setting beneath it. </w:t>
+            </w:r>
+            <w:r>
+              <w:rPr>
+                <w:rFonts w:hint="eastAsia"/>
+                <w:sz w:val="16"/>
+                <w:szCs w:val="18"/>
+                <w:lang w:val="en-CA"/>
+              </w:rPr>
+              <w:t>T</w:t>
+            </w:r>
+            <w:r>
+              <w:rPr>
+                <w:sz w:val="16"/>
+                <w:szCs w:val="18"/>
+                <w:lang w:val="en-CA"/>
+              </w:rPr>
+              <w:t>he setting “execute header button actions when dragging”</w:t>
+            </w:r>
+          </w:p>
+        </w:tc>
+        <w:tc>
+          <w:tcPr>
+            <w:tcW w:w="3118" w:type="dxa"/>
+          </w:tcPr>
+          <w:p>
+            <w:pPr>
+              <w:rPr>
+                <w:sz w:val="16"/>
+                <w:szCs w:val="18"/>
+                <w:lang w:val="en-CA"/>
+              </w:rPr>
+            </w:pPr>
+            <w:r>
+              <w:rPr>
+                <w:rFonts w:hint="eastAsia"/>
+                <w:sz w:val="16"/>
+                <w:szCs w:val="18"/>
+                <w:lang w:val="en-CA"/>
+              </w:rPr>
+              <w:t>T</w:t>
+            </w:r>
+            <w:r>
+              <w:rPr>
+                <w:sz w:val="16"/>
+                <w:szCs w:val="18"/>
+                <w:lang w:val="en-CA"/>
+              </w:rPr>
+              <w:t>he dependent setting should be greyed out</w:t>
+            </w:r>
+          </w:p>
+        </w:tc>
+        <w:tc>
+          <w:tcPr>
+            <w:tcW w:w="2410" w:type="dxa"/>
+          </w:tcPr>
+          <w:p>
+            <w:pPr>
+              <w:rPr>
+                <w:sz w:val="16"/>
+                <w:szCs w:val="18"/>
+                <w:lang w:val="en-CA"/>
+              </w:rPr>
+            </w:pPr>
+            <w:r>
+              <w:rPr>
+                <w:rFonts w:hint="eastAsia"/>
+                <w:sz w:val="16"/>
+                <w:szCs w:val="18"/>
+                <w:lang w:val="en-CA"/>
+              </w:rPr>
+              <w:t>W</w:t>
+            </w:r>
+            <w:r>
+              <w:rPr>
+                <w:sz w:val="16"/>
+                <w:szCs w:val="18"/>
+                <w:lang w:val="en-CA"/>
+              </w:rPr>
+              <w:t xml:space="preserve">orking as of </w:t>
+            </w:r>
+            <w:r>
+              <w:rPr>
+                <w:sz w:val="16"/>
+                <w:szCs w:val="18"/>
+                <w:lang w:val="en-CA"/>
+              </w:rPr>
+              <w:t>9577b4626ef83978b054f3200592ec63f9a356f2</w:t>
+            </w:r>
+          </w:p>
+        </w:tc>
+      </w:tr>
+      <w:tr>
+        <w:tc>
+          <w:tcPr>
+            <w:tcW w:w="1667" w:type="dxa"/>
+          </w:tcPr>
+          <w:p>
+            <w:pPr>
+              <w:rPr>
+                <w:sz w:val="16"/>
+                <w:szCs w:val="18"/>
+                <w:lang w:val="en-CA"/>
+              </w:rPr>
+            </w:pPr>
+            <w:r>
+              <w:rPr>
+                <w:rFonts w:hint="eastAsia"/>
+                <w:sz w:val="16"/>
+                <w:szCs w:val="18"/>
+                <w:lang w:val="en-CA"/>
+              </w:rPr>
+              <w:t>S</w:t>
+            </w:r>
+            <w:r>
+              <w:rPr>
+                <w:sz w:val="16"/>
+                <w:szCs w:val="18"/>
+                <w:lang w:val="en-CA"/>
+              </w:rPr>
+              <w:t>ettings.tsx</w:t>
+            </w:r>
+          </w:p>
+        </w:tc>
+        <w:tc>
+          <w:tcPr>
+            <w:tcW w:w="2019" w:type="dxa"/>
+          </w:tcPr>
+          <w:p>
+            <w:pPr>
+              <w:rPr>
+                <w:rFonts w:hint="eastAsia"/>
+                <w:sz w:val="16"/>
+                <w:szCs w:val="18"/>
+                <w:lang w:val="en-CA"/>
+              </w:rPr>
+            </w:pPr>
+            <w:r>
+              <w:rPr>
+                <w:rFonts w:hint="eastAsia"/>
+                <w:sz w:val="16"/>
+                <w:szCs w:val="18"/>
+                <w:lang w:val="en-CA"/>
+              </w:rPr>
+              <w:t>S</w:t>
+            </w:r>
+            <w:r>
+              <w:rPr>
+                <w:sz w:val="16"/>
+                <w:szCs w:val="18"/>
+                <w:lang w:val="en-CA"/>
+              </w:rPr>
+              <w:t xml:space="preserve">ettings: switches: </w:t>
+            </w:r>
+            <w:r>
+              <w:rPr>
+                <w:sz w:val="16"/>
+                <w:szCs w:val="18"/>
+              </w:rPr>
+              <w:t>Allow ×, -, and ← buttons in modals' header bar to be draggable</w:t>
+            </w:r>
+            <w:r>
+              <w:rPr>
+                <w:sz w:val="16"/>
+                <w:szCs w:val="18"/>
+              </w:rPr>
+              <w:t>: DISABLED #2</w:t>
+            </w:r>
+          </w:p>
+        </w:tc>
+        <w:tc>
+          <w:tcPr>
+            <w:tcW w:w="2410" w:type="dxa"/>
+          </w:tcPr>
+          <w:p>
+            <w:pPr>
+              <w:rPr>
+                <w:sz w:val="16"/>
+                <w:szCs w:val="18"/>
+                <w:lang w:val="en-CA"/>
+              </w:rPr>
+            </w:pPr>
+            <w:r>
+              <w:rPr>
+                <w:rFonts w:hint="eastAsia"/>
+                <w:sz w:val="16"/>
+                <w:szCs w:val="18"/>
+                <w:lang w:val="en-CA"/>
+              </w:rPr>
+              <w:t>H</w:t>
+            </w:r>
+            <w:r>
+              <w:rPr>
+                <w:sz w:val="16"/>
+                <w:szCs w:val="18"/>
+                <w:lang w:val="en-CA"/>
+              </w:rPr>
+              <w:t>over on the dependent setting beneath it</w:t>
+            </w:r>
+          </w:p>
+        </w:tc>
+        <w:tc>
+          <w:tcPr>
+            <w:tcW w:w="3118" w:type="dxa"/>
+          </w:tcPr>
+          <w:p>
+            <w:pPr>
+              <w:rPr>
+                <w:sz w:val="16"/>
+                <w:szCs w:val="18"/>
+                <w:lang w:val="en-CA"/>
+              </w:rPr>
+            </w:pPr>
+            <w:r>
+              <w:rPr>
+                <w:rFonts w:hint="eastAsia"/>
+                <w:sz w:val="16"/>
+                <w:szCs w:val="18"/>
+                <w:lang w:val="en-CA"/>
+              </w:rPr>
+              <w:t>I</w:t>
+            </w:r>
+            <w:r>
+              <w:rPr>
+                <w:sz w:val="16"/>
+                <w:szCs w:val="18"/>
+                <w:lang w:val="en-CA"/>
+              </w:rPr>
+              <w:t>ts text should say “requires “</w:t>
+            </w:r>
+            <w:r>
+              <w:rPr>
+                <w:sz w:val="16"/>
+                <w:szCs w:val="18"/>
+              </w:rPr>
+              <w:t>Allow ×, -, and ←</w:t>
+            </w:r>
+            <w:r>
+              <w:rPr>
+                <w:sz w:val="16"/>
+                <w:szCs w:val="18"/>
+              </w:rPr>
+              <w:t>” switch to be enabled”</w:t>
+            </w:r>
+            <w:r>
+              <w:rPr>
+                <w:sz w:val="16"/>
+                <w:szCs w:val="18"/>
+              </w:rPr>
+              <w:t xml:space="preserve">. </w:t>
+            </w:r>
+            <w:r>
+              <w:rPr>
+                <w:rFonts w:hint="eastAsia"/>
+                <w:sz w:val="16"/>
+                <w:szCs w:val="18"/>
+              </w:rPr>
+              <w:t>I</w:t>
+            </w:r>
+            <w:r>
+              <w:rPr>
+                <w:sz w:val="16"/>
+                <w:szCs w:val="18"/>
+              </w:rPr>
+              <w:t>t should only say that when your mouse is hovering on it</w:t>
+            </w:r>
+          </w:p>
+        </w:tc>
+        <w:tc>
+          <w:tcPr>
+            <w:tcW w:w="2410" w:type="dxa"/>
+          </w:tcPr>
+          <w:p>
+            <w:pPr>
+              <w:rPr>
+                <w:sz w:val="16"/>
+                <w:szCs w:val="18"/>
+                <w:lang w:val="en-CA"/>
+              </w:rPr>
+            </w:pPr>
+            <w:r>
+              <w:rPr>
+                <w:rFonts w:hint="eastAsia"/>
+                <w:sz w:val="16"/>
+                <w:szCs w:val="18"/>
+                <w:lang w:val="en-CA"/>
+              </w:rPr>
+              <w:t>W</w:t>
+            </w:r>
+            <w:r>
+              <w:rPr>
+                <w:sz w:val="16"/>
+                <w:szCs w:val="18"/>
+                <w:lang w:val="en-CA"/>
+              </w:rPr>
+              <w:t xml:space="preserve">orking as of </w:t>
+            </w:r>
+            <w:r>
+              <w:rPr>
+                <w:sz w:val="16"/>
+                <w:szCs w:val="18"/>
+                <w:lang w:val="en-CA"/>
+              </w:rPr>
+              <w:t>9577b4626ef83978b054f3200592ec63f9a356f2</w:t>
+            </w:r>
+            <w:r>
+              <w:rPr>
+                <w:sz w:val="16"/>
+                <w:szCs w:val="18"/>
+                <w:lang w:val="en-CA"/>
+              </w:rPr>
+              <w:t>.</w:t>
+            </w:r>
+          </w:p>
+        </w:tc>
+      </w:tr>
+      <w:tr>
+        <w:tc>
+          <w:tcPr>
+            <w:tcW w:w="1667" w:type="dxa"/>
+          </w:tcPr>
+          <w:p>
+            <w:pPr>
+              <w:rPr>
+                <w:sz w:val="16"/>
+                <w:szCs w:val="18"/>
+                <w:lang w:val="en-CA"/>
+              </w:rPr>
+            </w:pPr>
+            <w:r>
+              <w:rPr>
+                <w:rFonts w:hint="eastAsia"/>
+                <w:sz w:val="16"/>
+                <w:szCs w:val="18"/>
+                <w:lang w:val="en-CA"/>
+              </w:rPr>
+              <w:t>S</w:t>
+            </w:r>
+            <w:r>
+              <w:rPr>
+                <w:sz w:val="16"/>
+                <w:szCs w:val="18"/>
+                <w:lang w:val="en-CA"/>
+              </w:rPr>
+              <w:t>ettings.tsx</w:t>
+            </w:r>
+          </w:p>
+        </w:tc>
+        <w:tc>
+          <w:tcPr>
+            <w:tcW w:w="2019" w:type="dxa"/>
+          </w:tcPr>
+          <w:p>
+            <w:pPr>
+              <w:rPr>
+                <w:rFonts w:hint="eastAsia"/>
+                <w:sz w:val="16"/>
+                <w:szCs w:val="18"/>
+                <w:lang w:val="en-CA"/>
+              </w:rPr>
+            </w:pPr>
+            <w:r>
+              <w:rPr>
+                <w:rFonts w:hint="eastAsia"/>
+                <w:sz w:val="16"/>
+                <w:szCs w:val="18"/>
+                <w:lang w:val="en-CA"/>
+              </w:rPr>
+              <w:t>S</w:t>
+            </w:r>
+            <w:r>
+              <w:rPr>
+                <w:sz w:val="16"/>
+                <w:szCs w:val="18"/>
+                <w:lang w:val="en-CA"/>
+              </w:rPr>
+              <w:t xml:space="preserve">ettings: switches: </w:t>
+            </w:r>
+            <w:r>
+              <w:rPr>
+                <w:sz w:val="16"/>
+                <w:szCs w:val="18"/>
+              </w:rPr>
+              <w:t>Allow ×, -, and ← buttons in modals' header bar to be draggable</w:t>
+            </w:r>
+            <w:r>
+              <w:rPr>
+                <w:sz w:val="16"/>
+                <w:szCs w:val="18"/>
+              </w:rPr>
+              <w:t>: DISABLED #2</w:t>
+            </w:r>
+          </w:p>
+        </w:tc>
+        <w:tc>
+          <w:tcPr>
+            <w:tcW w:w="2410" w:type="dxa"/>
+          </w:tcPr>
+          <w:p>
+            <w:pPr>
+              <w:rPr>
+                <w:sz w:val="16"/>
+                <w:szCs w:val="18"/>
+                <w:lang w:val="en-CA"/>
+              </w:rPr>
+            </w:pPr>
+            <w:r>
+              <w:rPr>
+                <w:rFonts w:hint="eastAsia"/>
+                <w:sz w:val="16"/>
+                <w:szCs w:val="18"/>
+                <w:lang w:val="en-CA"/>
+              </w:rPr>
+              <w:t>T</w:t>
+            </w:r>
+            <w:r>
+              <w:rPr>
+                <w:sz w:val="16"/>
+                <w:szCs w:val="18"/>
+                <w:lang w:val="en-CA"/>
+              </w:rPr>
+              <w:t>ry clicking/toggling the dependent setting beneath it “execute header button actions when dragging”</w:t>
+            </w:r>
+          </w:p>
+        </w:tc>
+        <w:tc>
+          <w:tcPr>
+            <w:tcW w:w="3118" w:type="dxa"/>
+          </w:tcPr>
+          <w:p>
+            <w:pPr>
+              <w:rPr>
+                <w:sz w:val="16"/>
+                <w:szCs w:val="18"/>
+                <w:lang w:val="en-CA"/>
+              </w:rPr>
+            </w:pPr>
+            <w:r>
+              <w:rPr>
+                <w:rFonts w:hint="eastAsia"/>
+                <w:sz w:val="16"/>
+                <w:szCs w:val="18"/>
+                <w:lang w:val="en-CA"/>
+              </w:rPr>
+              <w:t>T</w:t>
+            </w:r>
+            <w:r>
+              <w:rPr>
+                <w:sz w:val="16"/>
+                <w:szCs w:val="18"/>
+                <w:lang w:val="en-CA"/>
+              </w:rPr>
+              <w:t>he switch shouldn’t click</w:t>
+            </w:r>
+          </w:p>
+        </w:tc>
+        <w:tc>
+          <w:tcPr>
+            <w:tcW w:w="2410" w:type="dxa"/>
+          </w:tcPr>
+          <w:p>
+            <w:pPr>
+              <w:rPr>
+                <w:sz w:val="16"/>
+                <w:szCs w:val="18"/>
+                <w:lang w:val="en-CA"/>
+              </w:rPr>
+            </w:pPr>
+            <w:r>
+              <w:rPr>
+                <w:rFonts w:hint="eastAsia"/>
+                <w:sz w:val="16"/>
+                <w:szCs w:val="18"/>
+                <w:lang w:val="en-CA"/>
+              </w:rPr>
+              <w:t>W</w:t>
+            </w:r>
+            <w:r>
+              <w:rPr>
+                <w:sz w:val="16"/>
+                <w:szCs w:val="18"/>
+                <w:lang w:val="en-CA"/>
+              </w:rPr>
+              <w:t xml:space="preserve">orking as of </w:t>
+            </w:r>
+            <w:r>
+              <w:rPr>
+                <w:sz w:val="16"/>
+                <w:szCs w:val="18"/>
+                <w:lang w:val="en-CA"/>
+              </w:rPr>
+              <w:t>9577b4626ef83978b054f3200592ec63f9a356f2</w:t>
+            </w:r>
+            <w:r>
+              <w:rPr>
+                <w:sz w:val="16"/>
+                <w:szCs w:val="18"/>
+                <w:lang w:val="en-CA"/>
+              </w:rPr>
+              <w:t>.</w:t>
+            </w:r>
+          </w:p>
+        </w:tc>
+      </w:tr>
+      <w:tr>
+        <w:tc>
+          <w:tcPr>
+            <w:tcW w:w="1667" w:type="dxa"/>
+          </w:tcPr>
+          <w:p>
+            <w:pPr>
+              <w:rPr>
+                <w:sz w:val="16"/>
+                <w:szCs w:val="18"/>
+                <w:lang w:val="en-CA"/>
+              </w:rPr>
+            </w:pPr>
+            <w:r>
+              <w:rPr>
+                <w:rFonts w:hint="eastAsia"/>
+                <w:sz w:val="16"/>
+                <w:szCs w:val="18"/>
+                <w:lang w:val="en-CA"/>
+              </w:rPr>
+              <w:t>S</w:t>
+            </w:r>
+            <w:r>
+              <w:rPr>
+                <w:sz w:val="16"/>
+                <w:szCs w:val="18"/>
+                <w:lang w:val="en-CA"/>
+              </w:rPr>
+              <w:t>ettings.tsx</w:t>
+            </w:r>
+          </w:p>
+        </w:tc>
+        <w:tc>
+          <w:tcPr>
+            <w:tcW w:w="2019" w:type="dxa"/>
+          </w:tcPr>
+          <w:p>
+            <w:pPr>
+              <w:rPr>
+                <w:sz w:val="16"/>
+                <w:szCs w:val="18"/>
+                <w:lang w:val="en-CA"/>
+              </w:rPr>
+            </w:pPr>
+            <w:r>
+              <w:rPr>
+                <w:rFonts w:hint="eastAsia"/>
+                <w:sz w:val="16"/>
+                <w:szCs w:val="18"/>
+                <w:lang w:val="en-CA"/>
+              </w:rPr>
+              <w:t>S</w:t>
+            </w:r>
+            <w:r>
+              <w:rPr>
+                <w:sz w:val="16"/>
+                <w:szCs w:val="18"/>
+                <w:lang w:val="en-CA"/>
+              </w:rPr>
+              <w:t xml:space="preserve">ettings: switches: </w:t>
+            </w:r>
+            <w:r>
+              <w:rPr>
+                <w:sz w:val="16"/>
+                <w:szCs w:val="18"/>
+              </w:rPr>
+              <w:t>Allow ×, -, and ← buttons in modals' header bar to be draggable</w:t>
+            </w:r>
+            <w:r>
+              <w:rPr>
+                <w:sz w:val="16"/>
+                <w:szCs w:val="18"/>
+              </w:rPr>
+              <w:t xml:space="preserve">: </w:t>
+            </w:r>
+            <w:r>
+              <w:rPr>
+                <w:sz w:val="16"/>
+                <w:szCs w:val="18"/>
+              </w:rPr>
+              <w:t>ENABLED</w:t>
+            </w:r>
+          </w:p>
+        </w:tc>
+        <w:tc>
+          <w:tcPr>
+            <w:tcW w:w="2410" w:type="dxa"/>
+          </w:tcPr>
+          <w:p>
+            <w:pPr>
+              <w:rPr>
+                <w:sz w:val="16"/>
+                <w:szCs w:val="18"/>
+                <w:lang w:val="en-CA"/>
+              </w:rPr>
+            </w:pPr>
+            <w:r>
+              <w:rPr>
+                <w:rFonts w:hint="eastAsia"/>
+                <w:sz w:val="16"/>
+                <w:szCs w:val="18"/>
+                <w:lang w:val="en-CA"/>
+              </w:rPr>
+              <w:t>T</w:t>
+            </w:r>
+            <w:r>
+              <w:rPr>
+                <w:sz w:val="16"/>
+                <w:szCs w:val="18"/>
+                <w:lang w:val="en-CA"/>
+              </w:rPr>
+              <w:t>ry dragging the x, -, and back buttons in styles.</w:t>
+            </w:r>
+          </w:p>
+        </w:tc>
+        <w:tc>
+          <w:tcPr>
+            <w:tcW w:w="3118" w:type="dxa"/>
+          </w:tcPr>
+          <w:p>
+            <w:pPr>
+              <w:rPr>
+                <w:rFonts w:hint="eastAsia"/>
+                <w:sz w:val="16"/>
+                <w:szCs w:val="18"/>
+                <w:lang w:val="en-CA"/>
+              </w:rPr>
+            </w:pPr>
+            <w:r>
+              <w:rPr>
+                <w:rFonts w:hint="eastAsia"/>
+                <w:sz w:val="16"/>
+                <w:szCs w:val="18"/>
+                <w:lang w:val="en-CA"/>
+              </w:rPr>
+              <w:t>A</w:t>
+            </w:r>
+            <w:r>
+              <w:rPr>
+                <w:sz w:val="16"/>
+                <w:szCs w:val="18"/>
+                <w:lang w:val="en-CA"/>
+              </w:rPr>
+              <w:t>ll of them should drag</w:t>
+            </w:r>
+            <w:r>
+              <w:rPr>
+                <w:sz w:val="16"/>
+                <w:szCs w:val="18"/>
+                <w:lang w:val="en-CA"/>
+              </w:rPr>
+              <w:t xml:space="preserve"> the modal</w:t>
+            </w:r>
+          </w:p>
+        </w:tc>
+        <w:tc>
+          <w:tcPr>
+            <w:tcW w:w="2410" w:type="dxa"/>
+          </w:tcPr>
+          <w:p>
+            <w:pPr>
+              <w:rPr>
+                <w:sz w:val="16"/>
+                <w:szCs w:val="18"/>
+                <w:lang w:val="en-CA"/>
+              </w:rPr>
+            </w:pPr>
+            <w:r>
+              <w:rPr>
+                <w:rFonts w:hint="eastAsia"/>
+                <w:sz w:val="16"/>
+                <w:szCs w:val="18"/>
+                <w:lang w:val="en-CA"/>
+              </w:rPr>
+              <w:t>W</w:t>
+            </w:r>
+            <w:r>
+              <w:rPr>
+                <w:sz w:val="16"/>
+                <w:szCs w:val="18"/>
+                <w:lang w:val="en-CA"/>
+              </w:rPr>
+              <w:t xml:space="preserve">orking as of </w:t>
+            </w:r>
+            <w:r>
+              <w:rPr>
+                <w:sz w:val="16"/>
+                <w:szCs w:val="18"/>
+                <w:lang w:val="en-CA"/>
+              </w:rPr>
+              <w:t>9577b4626ef83978b054f3200592ec63f9a356f2</w:t>
+            </w:r>
+            <w:r>
+              <w:rPr>
+                <w:sz w:val="16"/>
+                <w:szCs w:val="18"/>
+                <w:lang w:val="en-CA"/>
+              </w:rPr>
+              <w:t>.</w:t>
+            </w:r>
+          </w:p>
+        </w:tc>
+      </w:tr>
+      <w:tr>
+        <w:tc>
+          <w:tcPr>
+            <w:tcW w:w="1667" w:type="dxa"/>
+          </w:tcPr>
+          <w:p>
+            <w:pPr>
+              <w:rPr>
+                <w:sz w:val="16"/>
+                <w:szCs w:val="18"/>
+                <w:lang w:val="en-CA"/>
+              </w:rPr>
+            </w:pPr>
+            <w:r>
+              <w:rPr>
+                <w:rFonts w:hint="eastAsia"/>
+                <w:sz w:val="16"/>
+                <w:szCs w:val="18"/>
+                <w:lang w:val="en-CA"/>
+              </w:rPr>
+              <w:t>S</w:t>
+            </w:r>
+            <w:r>
+              <w:rPr>
+                <w:sz w:val="16"/>
+                <w:szCs w:val="18"/>
+                <w:lang w:val="en-CA"/>
+              </w:rPr>
+              <w:t>ettings.tsx</w:t>
+            </w:r>
+          </w:p>
+        </w:tc>
+        <w:tc>
+          <w:tcPr>
+            <w:tcW w:w="2019" w:type="dxa"/>
+          </w:tcPr>
+          <w:p>
+            <w:pPr>
+              <w:rPr>
+                <w:sz w:val="16"/>
+                <w:szCs w:val="18"/>
+                <w:lang w:val="en-CA"/>
+              </w:rPr>
+            </w:pPr>
+            <w:r>
+              <w:rPr>
+                <w:rFonts w:hint="eastAsia"/>
+                <w:sz w:val="16"/>
+                <w:szCs w:val="18"/>
+                <w:lang w:val="en-CA"/>
+              </w:rPr>
+              <w:t>S</w:t>
+            </w:r>
+            <w:r>
+              <w:rPr>
+                <w:sz w:val="16"/>
+                <w:szCs w:val="18"/>
+                <w:lang w:val="en-CA"/>
+              </w:rPr>
+              <w:t xml:space="preserve">ettings: switches: </w:t>
+            </w:r>
+            <w:r>
+              <w:rPr>
+                <w:sz w:val="16"/>
+                <w:szCs w:val="18"/>
+              </w:rPr>
+              <w:t>Allow ×, -, and ← buttons in modals' header bar to be draggable</w:t>
+            </w:r>
+            <w:r>
+              <w:rPr>
+                <w:sz w:val="16"/>
+                <w:szCs w:val="18"/>
+              </w:rPr>
+              <w:t>: ENABLED</w:t>
+            </w:r>
+            <w:r>
+              <w:rPr>
+                <w:sz w:val="16"/>
+                <w:szCs w:val="18"/>
+              </w:rPr>
+              <w:t xml:space="preserve"> #2</w:t>
+            </w:r>
+          </w:p>
+        </w:tc>
+        <w:tc>
+          <w:tcPr>
+            <w:tcW w:w="2410" w:type="dxa"/>
+          </w:tcPr>
+          <w:p>
+            <w:pPr>
+              <w:rPr>
+                <w:sz w:val="16"/>
+                <w:szCs w:val="18"/>
+                <w:lang w:val="en-CA"/>
+              </w:rPr>
+            </w:pPr>
+            <w:r>
+              <w:rPr>
+                <w:rFonts w:hint="eastAsia"/>
+                <w:sz w:val="16"/>
+                <w:szCs w:val="18"/>
+                <w:lang w:val="en-CA"/>
+              </w:rPr>
+              <w:t>T</w:t>
+            </w:r>
+            <w:r>
+              <w:rPr>
+                <w:sz w:val="16"/>
+                <w:szCs w:val="18"/>
+                <w:lang w:val="en-CA"/>
+              </w:rPr>
+              <w:t>ry clicking on the x, -, and back buttons in styles or settings, any of the components editors, or any other modal.</w:t>
+            </w:r>
+          </w:p>
+        </w:tc>
+        <w:tc>
+          <w:tcPr>
+            <w:tcW w:w="3118" w:type="dxa"/>
+          </w:tcPr>
+          <w:p>
+            <w:pPr>
+              <w:rPr>
+                <w:sz w:val="16"/>
+                <w:szCs w:val="18"/>
+                <w:lang w:val="en-CA"/>
+              </w:rPr>
+            </w:pPr>
+            <w:r>
+              <w:rPr>
+                <w:rFonts w:hint="eastAsia"/>
+                <w:sz w:val="16"/>
+                <w:szCs w:val="18"/>
+                <w:lang w:val="en-CA"/>
+              </w:rPr>
+              <w:t>I</w:t>
+            </w:r>
+            <w:r>
+              <w:rPr>
+                <w:sz w:val="16"/>
+                <w:szCs w:val="18"/>
+                <w:lang w:val="en-CA"/>
+              </w:rPr>
+              <w:t xml:space="preserve">f you simply click and don’t drag, it should execute the button no matter what. </w:t>
+            </w:r>
+            <w:r>
+              <w:rPr>
+                <w:rFonts w:hint="eastAsia"/>
+                <w:sz w:val="16"/>
+                <w:szCs w:val="18"/>
+                <w:lang w:val="en-CA"/>
+              </w:rPr>
+              <w:t>C</w:t>
+            </w:r>
+            <w:r>
+              <w:rPr>
+                <w:sz w:val="16"/>
+                <w:szCs w:val="18"/>
+                <w:lang w:val="en-CA"/>
+              </w:rPr>
+              <w:t>licking – should minimize, clicking x should close, and clicking the back button should return to the previous page</w:t>
+            </w:r>
+            <w:r>
+              <w:rPr>
+                <w:sz w:val="16"/>
+                <w:szCs w:val="18"/>
+                <w:lang w:val="en-CA"/>
+              </w:rPr>
+              <w:t>.</w:t>
+            </w:r>
+          </w:p>
+        </w:tc>
+        <w:tc>
+          <w:tcPr>
+            <w:tcW w:w="2410" w:type="dxa"/>
+          </w:tcPr>
+          <w:p>
+            <w:pPr>
+              <w:rPr>
+                <w:sz w:val="16"/>
+                <w:szCs w:val="18"/>
+                <w:lang w:val="en-CA"/>
+              </w:rPr>
+            </w:pPr>
+            <w:r>
+              <w:rPr>
+                <w:rFonts w:hint="eastAsia"/>
+                <w:sz w:val="16"/>
+                <w:szCs w:val="18"/>
+                <w:lang w:val="en-CA"/>
+              </w:rPr>
+              <w:t>W</w:t>
+            </w:r>
+            <w:r>
+              <w:rPr>
+                <w:sz w:val="16"/>
+                <w:szCs w:val="18"/>
+                <w:lang w:val="en-CA"/>
+              </w:rPr>
+              <w:t xml:space="preserve">orking as of </w:t>
+            </w:r>
+            <w:r>
+              <w:rPr>
+                <w:sz w:val="16"/>
+                <w:szCs w:val="18"/>
+                <w:lang w:val="en-CA"/>
+              </w:rPr>
+              <w:t>9577b4626ef83978b054f3200592ec63f9a356f2</w:t>
+            </w:r>
+            <w:r>
+              <w:rPr>
+                <w:sz w:val="16"/>
+                <w:szCs w:val="18"/>
+                <w:lang w:val="en-CA"/>
+              </w:rPr>
+              <w:t>.</w:t>
+            </w:r>
+          </w:p>
+        </w:tc>
+      </w:tr>
+      <w:tr>
+        <w:tc>
+          <w:tcPr>
+            <w:tcW w:w="1667" w:type="dxa"/>
+          </w:tcPr>
+          <w:p>
+            <w:pPr>
+              <w:rPr>
+                <w:sz w:val="16"/>
+                <w:szCs w:val="18"/>
+                <w:lang w:val="en-CA"/>
+              </w:rPr>
+            </w:pPr>
+            <w:r>
+              <w:rPr>
+                <w:rFonts w:hint="eastAsia"/>
+                <w:sz w:val="16"/>
+                <w:szCs w:val="18"/>
+                <w:lang w:val="en-CA"/>
+              </w:rPr>
+              <w:t>S</w:t>
+            </w:r>
+            <w:r>
+              <w:rPr>
+                <w:sz w:val="16"/>
+                <w:szCs w:val="18"/>
+                <w:lang w:val="en-CA"/>
+              </w:rPr>
+              <w:t>ettings.tsx</w:t>
+            </w:r>
+          </w:p>
+        </w:tc>
+        <w:tc>
+          <w:tcPr>
+            <w:tcW w:w="2019" w:type="dxa"/>
+          </w:tcPr>
+          <w:p>
+            <w:pPr>
+              <w:rPr>
+                <w:sz w:val="16"/>
+                <w:szCs w:val="18"/>
+                <w:lang w:val="en-CA"/>
+              </w:rPr>
+            </w:pPr>
+            <w:r>
+              <w:rPr>
+                <w:rFonts w:hint="eastAsia"/>
+                <w:sz w:val="16"/>
+                <w:szCs w:val="18"/>
+                <w:lang w:val="en-CA"/>
+              </w:rPr>
+              <w:t>S</w:t>
+            </w:r>
+            <w:r>
+              <w:rPr>
+                <w:sz w:val="16"/>
+                <w:szCs w:val="18"/>
+                <w:lang w:val="en-CA"/>
+              </w:rPr>
+              <w:t xml:space="preserve">ettings: switches: </w:t>
+            </w:r>
+            <w:r>
+              <w:rPr>
+                <w:sz w:val="16"/>
+                <w:szCs w:val="18"/>
+              </w:rPr>
+              <w:t>Allow ×, -, and ← buttons in modals' header bar to be draggable</w:t>
+            </w:r>
+            <w:r>
+              <w:rPr>
+                <w:sz w:val="16"/>
+                <w:szCs w:val="18"/>
+              </w:rPr>
+              <w:t>: ENABLED #</w:t>
+            </w:r>
+            <w:r>
+              <w:rPr>
+                <w:sz w:val="16"/>
+                <w:szCs w:val="18"/>
+              </w:rPr>
+              <w:t>3</w:t>
+            </w:r>
+          </w:p>
+        </w:tc>
+        <w:tc>
+          <w:tcPr>
+            <w:tcW w:w="2410" w:type="dxa"/>
+          </w:tcPr>
+          <w:p>
+            <w:pPr>
+              <w:rPr>
+                <w:sz w:val="16"/>
+                <w:szCs w:val="18"/>
+                <w:lang w:val="en-CA"/>
+              </w:rPr>
+            </w:pPr>
+            <w:r>
+              <w:rPr>
+                <w:rFonts w:hint="eastAsia"/>
+                <w:sz w:val="16"/>
+                <w:szCs w:val="18"/>
+                <w:lang w:val="en-CA"/>
+              </w:rPr>
+              <w:t>L</w:t>
+            </w:r>
+            <w:r>
+              <w:rPr>
+                <w:sz w:val="16"/>
+                <w:szCs w:val="18"/>
+                <w:lang w:val="en-CA"/>
+              </w:rPr>
+              <w:t>ook at the dependent setting beneath it: “execute header action buttons when dragging”</w:t>
+            </w:r>
+          </w:p>
+        </w:tc>
+        <w:tc>
+          <w:tcPr>
+            <w:tcW w:w="3118" w:type="dxa"/>
+          </w:tcPr>
+          <w:p>
+            <w:pPr>
+              <w:rPr>
+                <w:sz w:val="16"/>
+                <w:szCs w:val="18"/>
+                <w:lang w:val="en-CA"/>
+              </w:rPr>
+            </w:pPr>
+            <w:r>
+              <w:rPr>
+                <w:rFonts w:hint="eastAsia"/>
+                <w:sz w:val="16"/>
+                <w:szCs w:val="18"/>
+                <w:lang w:val="en-CA"/>
+              </w:rPr>
+              <w:t>I</w:t>
+            </w:r>
+            <w:r>
+              <w:rPr>
+                <w:sz w:val="16"/>
+                <w:szCs w:val="18"/>
+                <w:lang w:val="en-CA"/>
+              </w:rPr>
+              <w:t>t shouldn’t be greyed out</w:t>
+            </w:r>
+          </w:p>
+        </w:tc>
+        <w:tc>
+          <w:tcPr>
+            <w:tcW w:w="2410" w:type="dxa"/>
+          </w:tcPr>
+          <w:p>
+            <w:pPr>
+              <w:rPr>
+                <w:sz w:val="16"/>
+                <w:szCs w:val="18"/>
+                <w:lang w:val="en-CA"/>
+              </w:rPr>
+            </w:pPr>
+            <w:r>
+              <w:rPr>
+                <w:rFonts w:hint="eastAsia"/>
+                <w:sz w:val="16"/>
+                <w:szCs w:val="18"/>
+                <w:lang w:val="en-CA"/>
+              </w:rPr>
+              <w:t>W</w:t>
+            </w:r>
+            <w:r>
+              <w:rPr>
+                <w:sz w:val="16"/>
+                <w:szCs w:val="18"/>
+                <w:lang w:val="en-CA"/>
+              </w:rPr>
+              <w:t xml:space="preserve">orking as of </w:t>
+            </w:r>
+            <w:r>
+              <w:rPr>
+                <w:sz w:val="16"/>
+                <w:szCs w:val="18"/>
+                <w:lang w:val="en-CA"/>
+              </w:rPr>
+              <w:t>9577b4626ef83978b054f3200592ec63f9a356f2</w:t>
+            </w:r>
+            <w:r>
+              <w:rPr>
+                <w:sz w:val="16"/>
+                <w:szCs w:val="18"/>
+                <w:lang w:val="en-CA"/>
+              </w:rPr>
+              <w:t>.</w:t>
+            </w:r>
+          </w:p>
+        </w:tc>
+      </w:tr>
+      <w:tr>
+        <w:tc>
+          <w:tcPr>
+            <w:tcW w:w="1667" w:type="dxa"/>
+          </w:tcPr>
+          <w:p>
+            <w:pPr>
+              <w:rPr>
+                <w:sz w:val="16"/>
+                <w:szCs w:val="18"/>
+                <w:lang w:val="en-CA"/>
+              </w:rPr>
+            </w:pPr>
+            <w:r>
+              <w:rPr>
+                <w:rFonts w:hint="eastAsia"/>
+                <w:sz w:val="16"/>
+                <w:szCs w:val="18"/>
+                <w:lang w:val="en-CA"/>
+              </w:rPr>
+              <w:t>S</w:t>
+            </w:r>
+            <w:r>
+              <w:rPr>
+                <w:sz w:val="16"/>
+                <w:szCs w:val="18"/>
+                <w:lang w:val="en-CA"/>
+              </w:rPr>
+              <w:t>ettings.tsx</w:t>
+            </w:r>
+          </w:p>
+        </w:tc>
+        <w:tc>
+          <w:tcPr>
+            <w:tcW w:w="2019" w:type="dxa"/>
+          </w:tcPr>
+          <w:p>
+            <w:pPr>
+              <w:rPr>
+                <w:sz w:val="16"/>
+                <w:szCs w:val="18"/>
+                <w:lang w:val="en-CA"/>
+              </w:rPr>
+            </w:pPr>
+            <w:r>
+              <w:rPr>
+                <w:rFonts w:hint="eastAsia"/>
+                <w:sz w:val="16"/>
+                <w:szCs w:val="18"/>
+                <w:lang w:val="en-CA"/>
+              </w:rPr>
+              <w:t>S</w:t>
+            </w:r>
+            <w:r>
+              <w:rPr>
+                <w:sz w:val="16"/>
+                <w:szCs w:val="18"/>
+                <w:lang w:val="en-CA"/>
+              </w:rPr>
+              <w:t xml:space="preserve">ettings: switches: </w:t>
+            </w:r>
+            <w:r>
+              <w:rPr>
+                <w:sz w:val="16"/>
+                <w:szCs w:val="18"/>
+              </w:rPr>
+              <w:t xml:space="preserve">Allow ×, -, and ← buttons in modals' header bar to be </w:t>
+            </w:r>
+            <w:r>
+              <w:rPr>
+                <w:sz w:val="16"/>
+                <w:szCs w:val="18"/>
+              </w:rPr>
+              <w:lastRenderedPageBreak/>
+              <w:t>draggable</w:t>
+            </w:r>
+            <w:r>
+              <w:rPr>
+                <w:sz w:val="16"/>
+                <w:szCs w:val="18"/>
+              </w:rPr>
+              <w:t>: ENABLED #3</w:t>
+            </w:r>
+          </w:p>
+        </w:tc>
+        <w:tc>
+          <w:tcPr>
+            <w:tcW w:w="2410" w:type="dxa"/>
+          </w:tcPr>
+          <w:p>
+            <w:pPr>
+              <w:rPr>
+                <w:sz w:val="16"/>
+                <w:szCs w:val="18"/>
+                <w:lang w:val="en-CA"/>
+              </w:rPr>
+            </w:pPr>
+            <w:r>
+              <w:rPr>
+                <w:rFonts w:hint="eastAsia"/>
+                <w:sz w:val="16"/>
+                <w:szCs w:val="18"/>
+                <w:lang w:val="en-CA"/>
+              </w:rPr>
+              <w:lastRenderedPageBreak/>
+              <w:t>T</w:t>
+            </w:r>
+            <w:r>
+              <w:rPr>
+                <w:sz w:val="16"/>
+                <w:szCs w:val="18"/>
+                <w:lang w:val="en-CA"/>
+              </w:rPr>
+              <w:t>ry clicking on the dependent setting “execute header action buttons when dragging”</w:t>
+            </w:r>
+          </w:p>
+        </w:tc>
+        <w:tc>
+          <w:tcPr>
+            <w:tcW w:w="3118" w:type="dxa"/>
+          </w:tcPr>
+          <w:p>
+            <w:pPr>
+              <w:rPr>
+                <w:sz w:val="16"/>
+                <w:szCs w:val="18"/>
+                <w:lang w:val="en-CA"/>
+              </w:rPr>
+            </w:pPr>
+            <w:r>
+              <w:rPr>
+                <w:rFonts w:hint="eastAsia"/>
+                <w:sz w:val="16"/>
+                <w:szCs w:val="18"/>
+                <w:lang w:val="en-CA"/>
+              </w:rPr>
+              <w:t>T</w:t>
+            </w:r>
+            <w:r>
+              <w:rPr>
+                <w:sz w:val="16"/>
+                <w:szCs w:val="18"/>
+                <w:lang w:val="en-CA"/>
+              </w:rPr>
+              <w:t>he switch should now be clickable</w:t>
+            </w:r>
+          </w:p>
+        </w:tc>
+        <w:tc>
+          <w:tcPr>
+            <w:tcW w:w="2410" w:type="dxa"/>
+          </w:tcPr>
+          <w:p>
+            <w:pPr>
+              <w:rPr>
+                <w:sz w:val="16"/>
+                <w:szCs w:val="18"/>
+                <w:lang w:val="en-CA"/>
+              </w:rPr>
+            </w:pPr>
+            <w:r>
+              <w:rPr>
+                <w:rFonts w:hint="eastAsia"/>
+                <w:sz w:val="16"/>
+                <w:szCs w:val="18"/>
+                <w:lang w:val="en-CA"/>
+              </w:rPr>
+              <w:t>W</w:t>
+            </w:r>
+            <w:r>
+              <w:rPr>
+                <w:sz w:val="16"/>
+                <w:szCs w:val="18"/>
+                <w:lang w:val="en-CA"/>
+              </w:rPr>
+              <w:t xml:space="preserve">orking as of </w:t>
+            </w:r>
+            <w:r>
+              <w:rPr>
+                <w:sz w:val="16"/>
+                <w:szCs w:val="18"/>
+                <w:lang w:val="en-CA"/>
+              </w:rPr>
+              <w:t>9577b4626ef83978b054f3200592ec63f9a356f2</w:t>
+            </w:r>
+            <w:r>
+              <w:rPr>
+                <w:sz w:val="16"/>
+                <w:szCs w:val="18"/>
+                <w:lang w:val="en-CA"/>
+              </w:rPr>
+              <w:t>.</w:t>
+            </w:r>
+          </w:p>
+        </w:tc>
+      </w:tr>
+      <w:tr>
+        <w:tc>
+          <w:tcPr>
+            <w:tcW w:w="1667" w:type="dxa"/>
+          </w:tcPr>
+          <w:p>
+            <w:pPr>
+              <w:rPr>
                 <w:rFonts w:hint="eastAsia"/>
                 <w:sz w:val="16"/>
                 <w:szCs w:val="18"/>
@@ -2877,7 +4484,6 @@
                 <w:szCs w:val="18"/>
                 <w:lang w:val="en-CA"/>
               </w:rPr>
-              <w:lastRenderedPageBreak/>
               <w:drawing>
                 <wp:inline distT="0" distB="0" distL="0" distR="0" wp14:anchorId="3CCDCEE8" wp14:editId="6F35D7C6">
                   <wp:extent cx="1370594" cy="442913"/>
@@ -2935,7 +4541,6 @@
                 <w:szCs w:val="18"/>
                 <w:lang w:val="en-CA"/>
               </w:rPr>
-              <w:lastRenderedPageBreak/>
               <w:t>T</w:t>
             </w:r>
             <w:r>
@@ -2961,7 +4566,6 @@
                 <w:szCs w:val="18"/>
                 <w:lang w:val="en-CA"/>
               </w:rPr>
-              <w:lastRenderedPageBreak/>
               <w:drawing>
                 <wp:inline distT="0" distB="0" distL="0" distR="0" wp14:anchorId="1E64C17F" wp14:editId="24B69076">
                   <wp:extent cx="869505" cy="1465897"/>
@@ -3019,7 +4623,6 @@
                 <w:szCs w:val="18"/>
                 <w:lang w:val="en-CA"/>
               </w:rPr>
-              <w:lastRenderedPageBreak/>
               <w:t>W</w:t>
             </w:r>
             <w:r>
@@ -3231,7 +4834,16 @@
                 <w:szCs w:val="18"/>
                 <w:lang w:val="en-CA"/>
               </w:rPr>
-              <w:t>nsure that the timing is correlated to the slider, so the longer the slider’s set duration time, the longer the transition should feel</w:t>
+              <w:t xml:space="preserve">nsure that the timing is correlated to the slider, so the longer the slider’s set duration time, the longer </w:t>
+            </w:r>
+            <w:r>
+              <w:rPr>
+                <w:sz w:val="16"/>
+                <w:szCs w:val="18"/>
+                <w:lang w:val="en-CA"/>
+              </w:rPr>
+              <w:lastRenderedPageBreak/>
+              <w:t>the transition should feel</w:t>
             </w:r>
           </w:p>
         </w:tc>
@@ -3254,6 +4866,7 @@
                 <w:szCs w:val="18"/>
                 <w:lang w:val="en-CA"/>
               </w:rPr>
+              <w:lastRenderedPageBreak/>
               <w:t>N</w:t>
             </w:r>
             <w:r>
@@ -4096,16 +5709,7 @@
                 <w:szCs w:val="18"/>
                 <w:lang w:val="en-CA"/>
               </w:rPr>
-              <w:t xml:space="preserve">ettings: components: torus menu editor: graph: </w:t>
-            </w:r>
-            <w:r>
-              <w:rPr>
-                <w:sz w:val="16"/>
-                <w:szCs w:val="18"/>
-                <w:lang w:val="en-CA"/>
-              </w:rPr>
-              <w:lastRenderedPageBreak/>
-              <w:t>multiple anchor points</w:t>
+              <w:t>ettings: components: torus menu editor: graph: multiple anchor points</w:t>
             </w:r>
           </w:p>
         </w:tc>
@@ -4129,7 +5733,6 @@
                 <w:szCs w:val="18"/>
                 <w:lang w:val="en-CA"/>
               </w:rPr>
-              <w:lastRenderedPageBreak/>
               <w:t>C</w:t>
             </w:r>
             <w:r>
@@ -4138,16 +5741,7 @@
                 <w:szCs w:val="18"/>
                 <w:lang w:val="en-CA"/>
               </w:rPr>
-              <w:t xml:space="preserve">lick and drag a point and move it up and towards the </w:t>
-            </w:r>
-            <w:r>
-              <w:rPr>
-                <w:sz w:val="16"/>
-                <w:szCs w:val="18"/>
-                <w:lang w:val="en-CA"/>
-              </w:rPr>
-              <w:lastRenderedPageBreak/>
-              <w:t xml:space="preserve">beginning of the graph. </w:t>
+              <w:t xml:space="preserve">lick and drag a point and move it up and towards the beginning of the graph. </w:t>
             </w:r>
             <w:r>
               <w:rPr>
@@ -4188,7 +5782,6 @@
                 <w:szCs w:val="18"/>
                 <w:lang w:val="en-CA"/>
               </w:rPr>
-              <w:lastRenderedPageBreak/>
               <w:t>T</w:t>
             </w:r>
             <w:r>
@@ -4197,16 +5790,7 @@
                 <w:szCs w:val="18"/>
                 <w:lang w:val="en-CA"/>
               </w:rPr>
-              <w:t xml:space="preserve">he points should be immediately created as soon as you clicked your mouse button </w:t>
-            </w:r>
-            <w:r>
-              <w:rPr>
-                <w:sz w:val="16"/>
-                <w:szCs w:val="18"/>
-                <w:lang w:val="en-CA"/>
-              </w:rPr>
-              <w:lastRenderedPageBreak/>
-              <w:t xml:space="preserve">down, and the anchor point should’ve followed your mouse as you dragged it across the graph. </w:t>
+              <w:t xml:space="preserve">he points should be immediately created as soon as you clicked your mouse button down, and the anchor point should’ve followed your mouse as you dragged it across the graph. </w:t>
             </w:r>
           </w:p>
         </w:tc>
@@ -4230,7 +5814,6 @@
                 <w:szCs w:val="18"/>
                 <w:lang w:val="en-CA"/>
               </w:rPr>
-              <w:lastRenderedPageBreak/>
               <w:t>W</w:t>
             </w:r>
             <w:r>
@@ -4247,16 +5830,7 @@
                 <w:szCs w:val="18"/>
                 <w:lang w:val="en-CA"/>
               </w:rPr>
-              <w:t>5bddf836872611033759d62774</w:t>
-            </w:r>
-            <w:r>
-              <w:rPr>
-                <w:sz w:val="16"/>
-                <w:szCs w:val="18"/>
-                <w:lang w:val="en-CA"/>
-              </w:rPr>
-              <w:lastRenderedPageBreak/>
-              <w:t>6d8b4161bba22a</w:t>
+              <w:t>5bddf836872611033759d627746d8b4161bba22a</w:t>
             </w:r>
           </w:p>
         </w:tc>
@@ -4282,7 +5856,6 @@
                 <w:szCs w:val="18"/>
                 <w:lang w:val="en-CA"/>
               </w:rPr>
-              <w:lastRenderedPageBreak/>
               <w:t>G</w:t>
             </w:r>
             <w:r>
@@ -4526,7 +6099,16 @@
                 <w:szCs w:val="18"/>
                 <w:lang w:val="en-CA"/>
               </w:rPr>
-              <w:t>ettings: components: torus menu editor: delay slider</w:t>
+              <w:t xml:space="preserve">ettings: components: torus menu editor: delay </w:t>
+            </w:r>
+            <w:r>
+              <w:rPr>
+                <w:sz w:val="16"/>
+                <w:szCs w:val="18"/>
+                <w:lang w:val="en-CA"/>
+              </w:rPr>
+              <w:lastRenderedPageBreak/>
+              <w:t>slider</w:t>
             </w:r>
           </w:p>
         </w:tc>
@@ -4555,6 +6137,7 @@
                 <w:szCs w:val="18"/>
                 <w:lang w:val="en-CA"/>
               </w:rPr>
+              <w:lastRenderedPageBreak/>
               <w:t>S</w:t>
             </w:r>
             <w:r>
@@ -4571,7 +6154,16 @@
                 <w:szCs w:val="18"/>
                 <w:lang w:val="en-CA"/>
               </w:rPr>
-              <w:t>, click on the (…) open torus menu button</w:t>
+              <w:t xml:space="preserve">, click on the (…) open torus menu </w:t>
+            </w:r>
+            <w:r>
+              <w:rPr>
+                <w:sz w:val="16"/>
+                <w:szCs w:val="18"/>
+                <w:lang w:val="en-CA"/>
+              </w:rPr>
+              <w:lastRenderedPageBreak/>
+              <w:t>button</w:t>
             </w:r>
           </w:p>
           <w:p>
@@ -4664,6 +6256,7 @@
                 <w:szCs w:val="18"/>
                 <w:lang w:val="en-CA"/>
               </w:rPr>
+              <w:lastRenderedPageBreak/>
               <w:t>O</w:t>
             </w:r>
             <w:r>
@@ -4672,7 +6265,16 @@
                 <w:szCs w:val="18"/>
                 <w:lang w:val="en-CA"/>
               </w:rPr>
-              <w:t>n test 1, the torus menu should open in one union, all annular sectors synchronized at the same time</w:t>
+              <w:t xml:space="preserve">n test 1, the torus menu should open in one union, all annular </w:t>
+            </w:r>
+            <w:r>
+              <w:rPr>
+                <w:sz w:val="16"/>
+                <w:szCs w:val="18"/>
+                <w:lang w:val="en-CA"/>
+              </w:rPr>
+              <w:lastRenderedPageBreak/>
+              <w:t>sectors synchronized at the same time</w:t>
             </w:r>
           </w:p>
           <w:p>
@@ -4794,6 +6396,7 @@
                 <w:szCs w:val="18"/>
                 <w:lang w:val="en-CA"/>
               </w:rPr>
+              <w:lastRenderedPageBreak/>
               <w:t>W</w:t>
             </w:r>
             <w:r>
@@ -4810,7 +6413,16 @@
                 <w:szCs w:val="18"/>
                 <w:lang w:val="en-CA"/>
               </w:rPr>
-              <w:t>5bddf836872611033759d627746d8b4161bba22a</w:t>
+              <w:t>5bddf836872611033759d62774</w:t>
+            </w:r>
+            <w:r>
+              <w:rPr>
+                <w:sz w:val="16"/>
+                <w:szCs w:val="18"/>
+                <w:lang w:val="en-CA"/>
+              </w:rPr>
+              <w:lastRenderedPageBreak/>
+              <w:t>6d8b4161bba22a</w:t>
             </w:r>
           </w:p>
         </w:tc>
@@ -5258,7 +6870,6 @@
                 <w:sz w:val="16"/>
                 <w:szCs w:val="18"/>
               </w:rPr>
-              <w:lastRenderedPageBreak/>
               <w:t>Relevant f</w:t>
             </w:r>
             <w:r>
@@ -5866,7 +7477,16 @@
                 <w:szCs w:val="18"/>
                 <w:lang w:val="en-CA"/>
               </w:rPr>
-              <w:t>or any color, click on the color rectangle in the styles page and start dragging around the color picker in the color wheel</w:t>
+              <w:t xml:space="preserve">or any color, click on the color rectangle in the styles page and </w:t>
+            </w:r>
+            <w:r>
+              <w:rPr>
+                <w:sz w:val="16"/>
+                <w:szCs w:val="18"/>
+                <w:lang w:val="en-CA"/>
+              </w:rPr>
+              <w:lastRenderedPageBreak/>
+              <w:t>start dragging around the color picker in the color wheel</w:t>
             </w:r>
           </w:p>
         </w:tc>
@@ -5890,6 +7510,7 @@
                 <w:szCs w:val="18"/>
                 <w:lang w:val="en-CA"/>
               </w:rPr>
+              <w:lastRenderedPageBreak/>
               <w:t>T</w:t>
             </w:r>
             <w:r>
@@ -5915,7 +7536,16 @@
                 <w:szCs w:val="18"/>
                 <w:lang w:val="en-CA"/>
               </w:rPr>
-              <w:t>very element using that color should change instantaneously with no lag</w:t>
+              <w:t xml:space="preserve">very element using that color </w:t>
+            </w:r>
+            <w:r>
+              <w:rPr>
+                <w:sz w:val="16"/>
+                <w:szCs w:val="18"/>
+                <w:lang w:val="en-CA"/>
+              </w:rPr>
+              <w:lastRenderedPageBreak/>
+              <w:t>should change instantaneously with no lag</w:t>
             </w:r>
           </w:p>
         </w:tc>
@@ -5939,6 +7569,7 @@
                 <w:szCs w:val="18"/>
                 <w:lang w:val="en-CA"/>
               </w:rPr>
+              <w:lastRenderedPageBreak/>
               <w:t>P</w:t>
             </w:r>
             <w:r>
@@ -5955,7 +7586,16 @@
                 <w:szCs w:val="18"/>
                 <w:lang w:val="en-CA"/>
               </w:rPr>
-              <w:t>5bddf836872611033759d627746d8b4161bba22a</w:t>
+              <w:t>5bddf836872611033759d62774</w:t>
+            </w:r>
+            <w:r>
+              <w:rPr>
+                <w:sz w:val="16"/>
+                <w:szCs w:val="18"/>
+                <w:lang w:val="en-CA"/>
+              </w:rPr>
+              <w:lastRenderedPageBreak/>
+              <w:t>6d8b4161bba22a</w:t>
             </w:r>
             <w:r>
               <w:rPr>
@@ -6083,6 +7723,7 @@
                 <w:szCs w:val="18"/>
                 <w:lang w:val="en-CA"/>
               </w:rPr>
+              <w:lastRenderedPageBreak/>
               <w:t>Styles.tsx, App.tsx</w:t>
             </w:r>
           </w:p>
@@ -6733,7 +8374,6 @@
                 <w:szCs w:val="18"/>
                 <w:lang w:val="en-CA"/>
               </w:rPr>
-              <w:lastRenderedPageBreak/>
               <w:t>A</w:t>
             </w:r>
             <w:r>
@@ -7115,6 +8755,7 @@
                 <w:sz w:val="16"/>
                 <w:szCs w:val="18"/>
               </w:rPr>
+              <w:lastRenderedPageBreak/>
               <w:t>Relevant f</w:t>
             </w:r>
             <w:r>

</xml_diff>

<commit_message>
fixed TEST_PLAN: settings: switches: allow open multiple menus: DISABLED (#2) (can open, close, and reopen the same modal with no trouble)
</commit_message>
<xml_diff>
--- a/test plan.docx
+++ b/test plan.docx
@@ -1669,7 +1669,17 @@
           <w:szCs w:val="32"/>
           <w:lang w:val="en-CA"/>
         </w:rPr>
-        <w:t>ettings.tsx: checkboxes</w:t>
+        <w:t xml:space="preserve">ettings.tsx: </w:t>
+      </w:r>
+      <w:r>
+        <w:rPr>
+          <w:b/>
+          <w:bCs/>
+          <w:sz w:val="28"/>
+          <w:szCs w:val="32"/>
+          <w:lang w:val="en-CA"/>
+        </w:rPr>
+        <w:t>switches</w:t>
       </w:r>
     </w:p>
     <w:tbl>
@@ -3527,7 +3537,23 @@
                 <w:szCs w:val="18"/>
                 <w:lang w:val="en-CA"/>
               </w:rPr>
-              <w:t>ettings: checkboxes: allow open multiple menus: DISABLED</w:t>
+              <w:t>ettings:</w:t>
+            </w:r>
+            <w:r>
+              <w:rPr>
+                <w:sz w:val="16"/>
+                <w:szCs w:val="18"/>
+                <w:lang w:val="en-CA"/>
+              </w:rPr>
+              <w:t xml:space="preserve"> switches</w:t>
+            </w:r>
+            <w:r>
+              <w:rPr>
+                <w:sz w:val="16"/>
+                <w:szCs w:val="18"/>
+                <w:lang w:val="en-CA"/>
+              </w:rPr>
+              <w:t>: allow open multiple menus: DISABLED</w:t>
             </w:r>
           </w:p>
         </w:tc>
@@ -3537,11 +3563,6 @@
           </w:tcPr>
           <w:p>
             <w:pPr>
-              <w:pStyle w:val="a9"/>
-              <w:numPr>
-                <w:ilvl w:val="0"/>
-                <w:numId w:val="1"/>
-              </w:numPr>
               <w:rPr>
                 <w:sz w:val="16"/>
                 <w:szCs w:val="18"/>
@@ -3563,175 +3584,24 @@
                 <w:szCs w:val="18"/>
                 <w:lang w:val="en-CA"/>
               </w:rPr>
-              <w:t>n the editor interface, open a draggable modal (settings, styles, etc)</w:t>
-            </w:r>
-          </w:p>
-          <w:p>
-            <w:pPr>
-              <w:pStyle w:val="a9"/>
-              <w:numPr>
-                <w:ilvl w:val="0"/>
-                <w:numId w:val="1"/>
-              </w:numPr>
-              <w:rPr>
-                <w:rFonts w:hint="eastAsia"/>
-                <w:sz w:val="16"/>
-                <w:szCs w:val="18"/>
-                <w:lang w:val="en-CA"/>
-              </w:rPr>
-            </w:pPr>
-            <w:r>
-              <w:rPr>
-                <w:rFonts w:hint="eastAsia"/>
-                <w:sz w:val="16"/>
-                <w:szCs w:val="18"/>
-                <w:lang w:val="en-CA"/>
-              </w:rPr>
-              <w:t>S</w:t>
-            </w:r>
-            <w:r>
-              <w:rPr>
-                <w:sz w:val="16"/>
-                <w:szCs w:val="18"/>
-                <w:lang w:val="en-CA"/>
-              </w:rPr>
-              <w:t>pam click on the settings icon in the top windows dashbar.</w:t>
-            </w:r>
-          </w:p>
-          <w:p>
-            <w:pPr>
-              <w:pStyle w:val="a9"/>
-              <w:numPr>
-                <w:ilvl w:val="0"/>
-                <w:numId w:val="1"/>
-              </w:numPr>
-              <w:rPr>
-                <w:rFonts w:hint="eastAsia"/>
-                <w:sz w:val="16"/>
-                <w:szCs w:val="18"/>
-                <w:lang w:val="en-CA"/>
-              </w:rPr>
-            </w:pPr>
-            <w:r>
-              <w:rPr>
-                <w:rFonts w:hint="eastAsia"/>
-                <w:sz w:val="16"/>
-                <w:szCs w:val="18"/>
-                <w:lang w:val="en-CA"/>
-              </w:rPr>
-              <w:t>S</w:t>
-            </w:r>
-            <w:r>
-              <w:rPr>
-                <w:sz w:val="16"/>
-                <w:szCs w:val="18"/>
-                <w:lang w:val="en-CA"/>
-              </w:rPr>
-              <w:t xml:space="preserve">pam click </w:t>
-            </w:r>
-            <w:r>
-              <w:rPr>
-                <w:sz w:val="16"/>
-                <w:szCs w:val="18"/>
-                <w:lang w:val="en-CA"/>
-              </w:rPr>
-              <w:t>on the styles icon</w:t>
-            </w:r>
-          </w:p>
-          <w:p>
-            <w:pPr>
-              <w:pStyle w:val="a9"/>
-              <w:numPr>
-                <w:ilvl w:val="0"/>
-                <w:numId w:val="1"/>
-              </w:numPr>
-              <w:rPr>
-                <w:rFonts w:hint="eastAsia"/>
-                <w:sz w:val="16"/>
-                <w:szCs w:val="18"/>
-                <w:lang w:val="en-CA"/>
-              </w:rPr>
-            </w:pPr>
-            <w:r>
-              <w:rPr>
-                <w:rFonts w:hint="eastAsia"/>
-                <w:sz w:val="16"/>
-                <w:szCs w:val="18"/>
-                <w:lang w:val="en-CA"/>
-              </w:rPr>
-              <w:t>S</w:t>
-            </w:r>
-            <w:r>
-              <w:rPr>
-                <w:sz w:val="16"/>
-                <w:szCs w:val="18"/>
-                <w:lang w:val="en-CA"/>
-              </w:rPr>
-              <w:t>pam click the export video icon</w:t>
-            </w:r>
-          </w:p>
-          <w:p>
-            <w:pPr>
-              <w:pStyle w:val="a9"/>
-              <w:numPr>
-                <w:ilvl w:val="0"/>
-                <w:numId w:val="1"/>
-              </w:numPr>
-              <w:rPr>
-                <w:rFonts w:hint="eastAsia"/>
-                <w:sz w:val="16"/>
-                <w:szCs w:val="18"/>
-                <w:lang w:val="en-CA"/>
-              </w:rPr>
-            </w:pPr>
-            <w:r>
-              <w:rPr>
-                <w:rFonts w:hint="eastAsia"/>
-                <w:sz w:val="16"/>
-                <w:szCs w:val="18"/>
-                <w:lang w:val="en-CA"/>
-              </w:rPr>
-              <w:t>S</w:t>
-            </w:r>
-            <w:r>
-              <w:rPr>
-                <w:sz w:val="16"/>
-                <w:szCs w:val="18"/>
-                <w:lang w:val="en-CA"/>
-              </w:rPr>
-              <w:t>pam click on any future menus I implement in the future</w:t>
-            </w:r>
-          </w:p>
-          <w:p>
-            <w:pPr>
-              <w:pStyle w:val="a9"/>
-              <w:numPr>
-                <w:ilvl w:val="0"/>
-                <w:numId w:val="1"/>
-              </w:numPr>
-              <w:rPr>
-                <w:rFonts w:hint="eastAsia"/>
-                <w:sz w:val="16"/>
-                <w:szCs w:val="18"/>
-                <w:lang w:val="en-CA"/>
-              </w:rPr>
-            </w:pPr>
-            <w:r>
-              <w:rPr>
-                <w:rFonts w:hint="eastAsia"/>
-                <w:sz w:val="16"/>
-                <w:szCs w:val="18"/>
-                <w:lang w:val="en-CA"/>
-              </w:rPr>
-              <w:t>C</w:t>
-            </w:r>
-            <w:r>
-              <w:rPr>
-                <w:sz w:val="16"/>
-                <w:szCs w:val="18"/>
-                <w:lang w:val="en-CA"/>
-              </w:rPr>
-              <w:t>lose the settings page, open a different page (eg styles) and spam click every other page again</w:t>
+              <w:t xml:space="preserve">n the editor interface with no modals open, try to open the same modal twice. </w:t>
+            </w:r>
+            <w:r>
+              <w:rPr>
+                <w:rFonts w:hint="eastAsia"/>
+                <w:sz w:val="16"/>
+                <w:szCs w:val="18"/>
+                <w:lang w:val="en-CA"/>
+              </w:rPr>
+              <w:t>T</w:t>
+            </w:r>
+            <w:r>
+              <w:rPr>
+                <w:sz w:val="16"/>
+                <w:szCs w:val="18"/>
+                <w:lang w:val="en-CA"/>
+              </w:rPr>
+              <w:t>est this on all modals</w:t>
             </w:r>
           </w:p>
         </w:tc>
@@ -3749,64 +3619,20 @@
             </w:pPr>
             <w:r>
               <w:rPr>
-                <w:sz w:val="16"/>
-                <w:szCs w:val="18"/>
-                <w:lang w:val="en-CA"/>
-              </w:rPr>
-              <w:t>1. the modal should open if there are no previous modals open.</w:t>
-            </w:r>
-          </w:p>
-          <w:p>
-            <w:pPr>
-              <w:rPr>
-                <w:rFonts w:hint="eastAsia"/>
-                <w:sz w:val="16"/>
-                <w:szCs w:val="18"/>
-                <w:lang w:val="en-CA"/>
-              </w:rPr>
-            </w:pPr>
-            <w:r>
-              <w:rPr>
-                <w:sz w:val="16"/>
-                <w:szCs w:val="18"/>
-                <w:lang w:val="en-CA"/>
-              </w:rPr>
-              <w:t xml:space="preserve">2. </w:t>
-            </w:r>
-            <w:r>
-              <w:rPr>
-                <w:rFonts w:hint="eastAsia"/>
-                <w:sz w:val="16"/>
-                <w:szCs w:val="18"/>
-                <w:lang w:val="en-CA"/>
-              </w:rPr>
-              <w:t>A</w:t>
-            </w:r>
-            <w:r>
-              <w:rPr>
-                <w:sz w:val="16"/>
-                <w:szCs w:val="18"/>
-                <w:lang w:val="en-CA"/>
-              </w:rPr>
-              <w:t>bsolutely NO NEW MENUS should open</w:t>
-            </w:r>
-          </w:p>
-          <w:p>
-            <w:pPr>
-              <w:rPr>
-                <w:rFonts w:hint="eastAsia"/>
-                <w:sz w:val="16"/>
-                <w:szCs w:val="18"/>
-                <w:lang w:val="en-CA"/>
-              </w:rPr>
-            </w:pPr>
-            <w:r>
-              <w:rPr>
-                <w:sz w:val="16"/>
-                <w:szCs w:val="18"/>
-                <w:lang w:val="en-CA"/>
-              </w:rPr>
-              <w:t>3. when there’s already one menu open, clicking on another menu should open a small toast dialogue box saying “opening multiple menus is disabled!</w:t>
+                <w:rFonts w:hint="eastAsia"/>
+                <w:sz w:val="16"/>
+                <w:szCs w:val="18"/>
+                <w:lang w:val="en-CA"/>
+              </w:rPr>
+              <w:t>E</w:t>
+            </w:r>
+            <w:r>
+              <w:rPr>
+                <w:sz w:val="16"/>
+                <w:szCs w:val="18"/>
+                <w:lang w:val="en-CA"/>
+              </w:rPr>
+              <w:t>very modal you try to open twice, it should open the first time, then it shouldn’t open the second time, and on the second time it should display a toast saying you can’t open it because open multiple menus is disabled</w:t>
             </w:r>
           </w:p>
         </w:tc>
@@ -3837,41 +3663,82 @@
                 <w:szCs w:val="18"/>
                 <w:lang w:val="en-CA"/>
               </w:rPr>
-              <w:t xml:space="preserve">artially working. I can open settings, click it again, the toast shows up. </w:t>
-            </w:r>
-            <w:r>
-              <w:rPr>
-                <w:rFonts w:hint="eastAsia"/>
-                <w:sz w:val="16"/>
-                <w:szCs w:val="18"/>
-                <w:lang w:val="en-CA"/>
-              </w:rPr>
-              <w:t>H</w:t>
-            </w:r>
-            <w:r>
-              <w:rPr>
-                <w:sz w:val="16"/>
-                <w:szCs w:val="18"/>
-                <w:lang w:val="en-CA"/>
-              </w:rPr>
-              <w:t xml:space="preserve">owever, I can still open styles once. </w:t>
-            </w:r>
-            <w:r>
-              <w:rPr>
-                <w:rFonts w:hint="eastAsia"/>
-                <w:sz w:val="16"/>
-                <w:szCs w:val="18"/>
-                <w:lang w:val="en-CA"/>
-              </w:rPr>
-              <w:t>O</w:t>
-            </w:r>
-            <w:r>
-              <w:rPr>
-                <w:sz w:val="16"/>
-                <w:szCs w:val="18"/>
-                <w:lang w:val="en-CA"/>
-              </w:rPr>
-              <w:t>pening styles twice doesn’t open the styles page, but it also doesn’t display the toast</w:t>
+              <w:t>artially working</w:t>
+            </w:r>
+            <w:r>
+              <w:rPr>
+                <w:sz w:val="16"/>
+                <w:szCs w:val="18"/>
+                <w:lang w:val="en-CA"/>
+              </w:rPr>
+              <w:t xml:space="preserve"> as of </w:t>
+            </w:r>
+            <w:r>
+              <w:rPr>
+                <w:sz w:val="16"/>
+                <w:szCs w:val="18"/>
+                <w:lang w:val="en-CA"/>
+              </w:rPr>
+              <w:t>72353571f3d02393a601e5c151529df37aea6b30</w:t>
+            </w:r>
+            <w:r>
+              <w:rPr>
+                <w:sz w:val="16"/>
+                <w:szCs w:val="18"/>
+                <w:lang w:val="en-CA"/>
+              </w:rPr>
+              <w:t xml:space="preserve"> + 1</w:t>
+            </w:r>
+          </w:p>
+          <w:p>
+            <w:pPr>
+              <w:rPr>
+                <w:sz w:val="16"/>
+                <w:szCs w:val="18"/>
+                <w:lang w:val="en-CA"/>
+              </w:rPr>
+            </w:pPr>
+            <w:r>
+              <w:rPr>
+                <w:sz w:val="16"/>
+                <w:szCs w:val="18"/>
+                <w:lang w:val="en-CA"/>
+              </w:rPr>
+              <w:t xml:space="preserve">I can do this with settings, but I can’t do this with styles. </w:t>
+            </w:r>
+            <w:r>
+              <w:rPr>
+                <w:rFonts w:hint="eastAsia"/>
+                <w:sz w:val="16"/>
+                <w:szCs w:val="18"/>
+                <w:lang w:val="en-CA"/>
+              </w:rPr>
+              <w:t>T</w:t>
+            </w:r>
+            <w:r>
+              <w:rPr>
+                <w:sz w:val="16"/>
+                <w:szCs w:val="18"/>
+                <w:lang w:val="en-CA"/>
+              </w:rPr>
+              <w:t xml:space="preserve">he toast doesn’t pop up for styles. </w:t>
+            </w:r>
+            <w:r>
+              <w:rPr>
+                <w:rFonts w:hint="eastAsia"/>
+                <w:sz w:val="16"/>
+                <w:szCs w:val="18"/>
+                <w:lang w:val="en-CA"/>
+              </w:rPr>
+              <w:t>T</w:t>
+            </w:r>
+            <w:r>
+              <w:rPr>
+                <w:sz w:val="16"/>
+                <w:szCs w:val="18"/>
+                <w:lang w:val="en-CA"/>
+              </w:rPr>
+              <w:t>he styles doesn’t open twice which is good</w:t>
             </w:r>
           </w:p>
         </w:tc>
@@ -3884,7 +3751,6 @@
           <w:p>
             <w:pPr>
               <w:rPr>
-                <w:rFonts w:hint="eastAsia"/>
                 <w:sz w:val="16"/>
                 <w:szCs w:val="18"/>
                 <w:lang w:val="en-CA"/>
@@ -3905,6 +3771,394 @@
                 <w:szCs w:val="18"/>
                 <w:lang w:val="en-CA"/>
               </w:rPr>
+              <w:t>ettings.tsx, draggableModal.tsx, Toast.tsx, modalManager.ts, modalPermissions.ts</w:t>
+            </w:r>
+          </w:p>
+        </w:tc>
+        <w:tc>
+          <w:tcPr>
+            <w:tcW w:w="2019" w:type="dxa"/>
+          </w:tcPr>
+          <w:p>
+            <w:pPr>
+              <w:rPr>
+                <w:sz w:val="16"/>
+                <w:szCs w:val="18"/>
+                <w:lang w:val="en-CA"/>
+              </w:rPr>
+            </w:pPr>
+            <w:r>
+              <w:rPr>
+                <w:rFonts w:hint="eastAsia"/>
+                <w:sz w:val="16"/>
+                <w:szCs w:val="18"/>
+                <w:lang w:val="en-CA"/>
+              </w:rPr>
+              <w:t>S</w:t>
+            </w:r>
+            <w:r>
+              <w:rPr>
+                <w:sz w:val="16"/>
+                <w:szCs w:val="18"/>
+                <w:lang w:val="en-CA"/>
+              </w:rPr>
+              <w:t>ettings: switches: allow open multiple menus: DISABLED (#2)</w:t>
+            </w:r>
+          </w:p>
+        </w:tc>
+        <w:tc>
+          <w:tcPr>
+            <w:tcW w:w="2410" w:type="dxa"/>
+          </w:tcPr>
+          <w:p>
+            <w:pPr>
+              <w:rPr>
+                <w:sz w:val="16"/>
+                <w:szCs w:val="18"/>
+                <w:lang w:val="en-CA"/>
+              </w:rPr>
+            </w:pPr>
+            <w:r>
+              <w:rPr>
+                <w:rFonts w:hint="eastAsia"/>
+                <w:sz w:val="16"/>
+                <w:szCs w:val="18"/>
+                <w:lang w:val="en-CA"/>
+              </w:rPr>
+              <w:t>O</w:t>
+            </w:r>
+            <w:r>
+              <w:rPr>
+                <w:sz w:val="16"/>
+                <w:szCs w:val="18"/>
+                <w:lang w:val="en-CA"/>
+              </w:rPr>
+              <w:t xml:space="preserve">pen a modal and then close it again, then reopen </w:t>
+            </w:r>
+            <w:r>
+              <w:rPr>
+                <w:sz w:val="16"/>
+                <w:szCs w:val="18"/>
+                <w:lang w:val="en-CA"/>
+              </w:rPr>
+              <w:t>the same modal again</w:t>
+            </w:r>
+          </w:p>
+        </w:tc>
+        <w:tc>
+          <w:tcPr>
+            <w:tcW w:w="3118" w:type="dxa"/>
+          </w:tcPr>
+          <w:p>
+            <w:pPr>
+              <w:rPr>
+                <w:sz w:val="16"/>
+                <w:szCs w:val="18"/>
+                <w:lang w:val="en-CA"/>
+              </w:rPr>
+            </w:pPr>
+            <w:r>
+              <w:rPr>
+                <w:rFonts w:hint="eastAsia"/>
+                <w:sz w:val="16"/>
+                <w:szCs w:val="18"/>
+                <w:lang w:val="en-CA"/>
+              </w:rPr>
+              <w:t>Y</w:t>
+            </w:r>
+            <w:r>
+              <w:rPr>
+                <w:sz w:val="16"/>
+                <w:szCs w:val="18"/>
+                <w:lang w:val="en-CA"/>
+              </w:rPr>
+              <w:t>ou should be able to reopen</w:t>
+            </w:r>
+            <w:r>
+              <w:rPr>
+                <w:sz w:val="16"/>
+                <w:szCs w:val="18"/>
+                <w:lang w:val="en-CA"/>
+              </w:rPr>
+              <w:t xml:space="preserve"> the same</w:t>
+            </w:r>
+            <w:r>
+              <w:rPr>
+                <w:sz w:val="16"/>
+                <w:szCs w:val="18"/>
+                <w:lang w:val="en-CA"/>
+              </w:rPr>
+              <w:t xml:space="preserve"> modal </w:t>
+            </w:r>
+            <w:r>
+              <w:rPr>
+                <w:sz w:val="16"/>
+                <w:szCs w:val="18"/>
+                <w:lang w:val="en-CA"/>
+              </w:rPr>
+              <w:t xml:space="preserve">after </w:t>
+            </w:r>
+            <w:r>
+              <w:rPr>
+                <w:sz w:val="16"/>
+                <w:szCs w:val="18"/>
+                <w:lang w:val="en-CA"/>
+              </w:rPr>
+              <w:t xml:space="preserve">you’ve closed </w:t>
+            </w:r>
+            <w:r>
+              <w:rPr>
+                <w:sz w:val="16"/>
+                <w:szCs w:val="18"/>
+                <w:lang w:val="en-CA"/>
+              </w:rPr>
+              <w:t xml:space="preserve">that </w:t>
+            </w:r>
+            <w:r>
+              <w:rPr>
+                <w:sz w:val="16"/>
+                <w:szCs w:val="18"/>
+                <w:lang w:val="en-CA"/>
+              </w:rPr>
+              <w:t>modal</w:t>
+            </w:r>
+          </w:p>
+        </w:tc>
+        <w:tc>
+          <w:tcPr>
+            <w:tcW w:w="2410" w:type="dxa"/>
+          </w:tcPr>
+          <w:p>
+            <w:pPr>
+              <w:rPr>
+                <w:sz w:val="16"/>
+                <w:szCs w:val="18"/>
+                <w:lang w:val="en-CA"/>
+              </w:rPr>
+            </w:pPr>
+            <w:r>
+              <w:rPr>
+                <w:rFonts w:hint="eastAsia"/>
+                <w:sz w:val="16"/>
+                <w:szCs w:val="18"/>
+                <w:lang w:val="en-CA"/>
+              </w:rPr>
+              <w:t>W</w:t>
+            </w:r>
+            <w:r>
+              <w:rPr>
+                <w:sz w:val="16"/>
+                <w:szCs w:val="18"/>
+                <w:lang w:val="en-CA"/>
+              </w:rPr>
+              <w:t xml:space="preserve">orking as of </w:t>
+            </w:r>
+            <w:r>
+              <w:rPr>
+                <w:sz w:val="16"/>
+                <w:szCs w:val="18"/>
+                <w:lang w:val="en-CA"/>
+              </w:rPr>
+              <w:t>72353571f3d02393a601e5c151529df37aea6b30</w:t>
+            </w:r>
+            <w:r>
+              <w:rPr>
+                <w:sz w:val="16"/>
+                <w:szCs w:val="18"/>
+                <w:lang w:val="en-CA"/>
+              </w:rPr>
+              <w:t xml:space="preserve"> + 1</w:t>
+            </w:r>
+          </w:p>
+          <w:p>
+            <w:pPr>
+              <w:rPr>
+                <w:sz w:val="16"/>
+                <w:szCs w:val="18"/>
+                <w:lang w:val="en-CA"/>
+              </w:rPr>
+            </w:pPr>
+            <w:r>
+              <w:rPr>
+                <w:sz w:val="16"/>
+                <w:szCs w:val="18"/>
+                <w:lang w:val="en-CA"/>
+              </w:rPr>
+              <w:t>I can open the same modal and close the same modal and reopen the same modal.</w:t>
+            </w:r>
+          </w:p>
+        </w:tc>
+      </w:tr>
+      <w:tr>
+        <w:tc>
+          <w:tcPr>
+            <w:tcW w:w="1667" w:type="dxa"/>
+          </w:tcPr>
+          <w:p>
+            <w:pPr>
+              <w:rPr>
+                <w:sz w:val="16"/>
+                <w:szCs w:val="18"/>
+                <w:lang w:val="en-CA"/>
+              </w:rPr>
+            </w:pPr>
+            <w:r>
+              <w:rPr>
+                <w:rFonts w:hint="eastAsia"/>
+                <w:sz w:val="16"/>
+                <w:szCs w:val="18"/>
+                <w:lang w:val="en-CA"/>
+              </w:rPr>
+              <w:t>S</w:t>
+            </w:r>
+            <w:r>
+              <w:rPr>
+                <w:sz w:val="16"/>
+                <w:szCs w:val="18"/>
+                <w:lang w:val="en-CA"/>
+              </w:rPr>
+              <w:t>ettings.tsx, draggableModal.tsx, Toast.tsx, modalManager.ts, modalPermissions.ts</w:t>
+            </w:r>
+          </w:p>
+        </w:tc>
+        <w:tc>
+          <w:tcPr>
+            <w:tcW w:w="2019" w:type="dxa"/>
+          </w:tcPr>
+          <w:p>
+            <w:pPr>
+              <w:rPr>
+                <w:sz w:val="16"/>
+                <w:szCs w:val="18"/>
+                <w:lang w:val="en-CA"/>
+              </w:rPr>
+            </w:pPr>
+            <w:r>
+              <w:rPr>
+                <w:rFonts w:hint="eastAsia"/>
+                <w:sz w:val="16"/>
+                <w:szCs w:val="18"/>
+                <w:lang w:val="en-CA"/>
+              </w:rPr>
+              <w:t>S</w:t>
+            </w:r>
+            <w:r>
+              <w:rPr>
+                <w:sz w:val="16"/>
+                <w:szCs w:val="18"/>
+                <w:lang w:val="en-CA"/>
+              </w:rPr>
+              <w:t>ettings: switches: allow open multiple menus: DISABLED (#3)</w:t>
+            </w:r>
+          </w:p>
+        </w:tc>
+        <w:tc>
+          <w:tcPr>
+            <w:tcW w:w="2410" w:type="dxa"/>
+          </w:tcPr>
+          <w:p>
+            <w:pPr>
+              <w:rPr>
+                <w:sz w:val="16"/>
+                <w:szCs w:val="18"/>
+                <w:lang w:val="en-CA"/>
+              </w:rPr>
+            </w:pPr>
+            <w:r>
+              <w:rPr>
+                <w:rFonts w:hint="eastAsia"/>
+                <w:sz w:val="16"/>
+                <w:szCs w:val="18"/>
+                <w:lang w:val="en-CA"/>
+              </w:rPr>
+              <w:t>O</w:t>
+            </w:r>
+            <w:r>
+              <w:rPr>
+                <w:sz w:val="16"/>
+                <w:szCs w:val="18"/>
+                <w:lang w:val="en-CA"/>
+              </w:rPr>
+              <w:t>pen a modal, then try opening a different modal</w:t>
+            </w:r>
+          </w:p>
+        </w:tc>
+        <w:tc>
+          <w:tcPr>
+            <w:tcW w:w="3118" w:type="dxa"/>
+          </w:tcPr>
+          <w:p>
+            <w:pPr>
+              <w:rPr>
+                <w:sz w:val="16"/>
+                <w:szCs w:val="18"/>
+                <w:lang w:val="en-CA"/>
+              </w:rPr>
+            </w:pPr>
+            <w:r>
+              <w:rPr>
+                <w:rFonts w:hint="eastAsia"/>
+                <w:sz w:val="16"/>
+                <w:szCs w:val="18"/>
+                <w:lang w:val="en-CA"/>
+              </w:rPr>
+              <w:t>Y</w:t>
+            </w:r>
+            <w:r>
+              <w:rPr>
+                <w:sz w:val="16"/>
+                <w:szCs w:val="18"/>
+                <w:lang w:val="en-CA"/>
+              </w:rPr>
+              <w:t>ou shouldn’t be able to open the different modal</w:t>
+            </w:r>
+          </w:p>
+        </w:tc>
+        <w:tc>
+          <w:tcPr>
+            <w:tcW w:w="2410" w:type="dxa"/>
+          </w:tcPr>
+          <w:p>
+            <w:pPr>
+              <w:rPr>
+                <w:rFonts w:hint="eastAsia"/>
+                <w:sz w:val="16"/>
+                <w:szCs w:val="18"/>
+                <w:lang w:val="en-CA"/>
+              </w:rPr>
+            </w:pPr>
+          </w:p>
+        </w:tc>
+      </w:tr>
+      <w:tr>
+        <w:tc>
+          <w:tcPr>
+            <w:tcW w:w="1667" w:type="dxa"/>
+          </w:tcPr>
+          <w:p>
+            <w:pPr>
+              <w:rPr>
+                <w:rFonts w:hint="eastAsia"/>
+                <w:sz w:val="16"/>
+                <w:szCs w:val="18"/>
+                <w:lang w:val="en-CA"/>
+              </w:rPr>
+            </w:pPr>
+            <w:r>
+              <w:rPr>
+                <w:rFonts w:hint="eastAsia"/>
+                <w:sz w:val="16"/>
+                <w:szCs w:val="18"/>
+                <w:lang w:val="en-CA"/>
+              </w:rPr>
+              <w:t>S</w:t>
+            </w:r>
+            <w:r>
+              <w:rPr>
+                <w:sz w:val="16"/>
+                <w:szCs w:val="18"/>
+                <w:lang w:val="en-CA"/>
+              </w:rPr>
               <w:t>ettings.tsx</w:t>
             </w:r>
           </w:p>
@@ -3937,7 +4191,23 @@
                 <w:szCs w:val="18"/>
                 <w:lang w:val="en-CA"/>
               </w:rPr>
-              <w:t>ettings: checkboxes: allow open multiple menus: DISABLED (#2)</w:t>
+              <w:t>ettings: checkboxes: allow open multiple menus: DISABLED (#</w:t>
+            </w:r>
+            <w:r>
+              <w:rPr>
+                <w:sz w:val="16"/>
+                <w:szCs w:val="18"/>
+                <w:lang w:val="en-CA"/>
+              </w:rPr>
+              <w:t>3</w:t>
+            </w:r>
+            <w:r>
+              <w:rPr>
+                <w:sz w:val="16"/>
+                <w:szCs w:val="18"/>
+                <w:lang w:val="en-CA"/>
+              </w:rPr>
+              <w:t>)</w:t>
             </w:r>
           </w:p>
         </w:tc>
@@ -4033,7 +4303,23 @@
                 <w:szCs w:val="18"/>
                 <w:lang w:val="en-CA"/>
               </w:rPr>
-              <w:t>aven’t implemented the dependent slider yet</w:t>
+              <w:t>aven’t implemented the dependent</w:t>
+            </w:r>
+            <w:r>
+              <w:rPr>
+                <w:sz w:val="16"/>
+                <w:szCs w:val="18"/>
+                <w:lang w:val="en-CA"/>
+              </w:rPr>
+              <w:t xml:space="preserve"> switch</w:t>
+            </w:r>
+            <w:r>
+              <w:rPr>
+                <w:sz w:val="16"/>
+                <w:szCs w:val="18"/>
+                <w:lang w:val="en-CA"/>
+              </w:rPr>
+              <w:t xml:space="preserve"> yet</w:t>
             </w:r>
           </w:p>
         </w:tc>
@@ -4767,7 +5053,16 @@
                 <w:szCs w:val="18"/>
                 <w:lang w:val="en-CA"/>
               </w:rPr>
-              <w:t>hen slide the slider to 500ms, try again, 1000ms, try again</w:t>
+              <w:t xml:space="preserve">hen </w:t>
+            </w:r>
+            <w:r>
+              <w:rPr>
+                <w:sz w:val="16"/>
+                <w:szCs w:val="18"/>
+                <w:lang w:val="en-CA"/>
+              </w:rPr>
+              <w:lastRenderedPageBreak/>
+              <w:t>slide the slider to 500ms, try again, 1000ms, try again</w:t>
             </w:r>
           </w:p>
         </w:tc>
@@ -4795,6 +5090,7 @@
                 <w:szCs w:val="18"/>
                 <w:lang w:val="en-CA"/>
               </w:rPr>
+              <w:lastRenderedPageBreak/>
               <w:t>E</w:t>
             </w:r>
             <w:r>
@@ -4834,7 +5130,7 @@
                 <w:szCs w:val="18"/>
                 <w:lang w:val="en-CA"/>
               </w:rPr>
-              <w:t xml:space="preserve">nsure that the timing is correlated to the slider, so the longer the slider’s set duration time, the longer </w:t>
+              <w:t xml:space="preserve">nsure that the timing is correlated </w:t>
             </w:r>
             <w:r>
               <w:rPr>
@@ -4843,7 +5139,7 @@
                 <w:lang w:val="en-CA"/>
               </w:rPr>
               <w:lastRenderedPageBreak/>
-              <w:t>the transition should feel</w:t>
+              <w:t>to the slider, so the longer the slider’s set duration time, the longer the transition should feel</w:t>
             </w:r>
           </w:p>
         </w:tc>
@@ -4892,7 +5188,16 @@
                 <w:szCs w:val="18"/>
                 <w:lang w:val="en-CA"/>
               </w:rPr>
-              <w:t>g the color of the icons in the styles page, whatever that color is</w:t>
+              <w:t xml:space="preserve">g the color of the icons in the styles </w:t>
+            </w:r>
+            <w:r>
+              <w:rPr>
+                <w:sz w:val="16"/>
+                <w:szCs w:val="18"/>
+                <w:lang w:val="en-CA"/>
+              </w:rPr>
+              <w:lastRenderedPageBreak/>
+              <w:t>page, whatever that color is</w:t>
             </w:r>
           </w:p>
         </w:tc>
@@ -4917,6 +5222,7 @@
                 <w:szCs w:val="18"/>
                 <w:lang w:val="en-CA"/>
               </w:rPr>
+              <w:lastRenderedPageBreak/>
               <w:t>S</w:t>
             </w:r>
             <w:r>
@@ -6067,6 +6373,7 @@
                 <w:szCs w:val="18"/>
                 <w:lang w:val="en-CA"/>
               </w:rPr>
+              <w:lastRenderedPageBreak/>
               <w:t>TorusMenuEditor.tsx</w:t>
             </w:r>
           </w:p>
@@ -6099,16 +6406,7 @@
                 <w:szCs w:val="18"/>
                 <w:lang w:val="en-CA"/>
               </w:rPr>
-              <w:t xml:space="preserve">ettings: components: torus menu editor: delay </w:t>
-            </w:r>
-            <w:r>
-              <w:rPr>
-                <w:sz w:val="16"/>
-                <w:szCs w:val="18"/>
-                <w:lang w:val="en-CA"/>
-              </w:rPr>
-              <w:lastRenderedPageBreak/>
-              <w:t>slider</w:t>
+              <w:t>ettings: components: torus menu editor: delay slider</w:t>
             </w:r>
           </w:p>
         </w:tc>
@@ -6137,7 +6435,6 @@
                 <w:szCs w:val="18"/>
                 <w:lang w:val="en-CA"/>
               </w:rPr>
-              <w:lastRenderedPageBreak/>
               <w:t>S</w:t>
             </w:r>
             <w:r>
@@ -6154,16 +6451,7 @@
                 <w:szCs w:val="18"/>
                 <w:lang w:val="en-CA"/>
               </w:rPr>
-              <w:t xml:space="preserve">, click on the (…) open torus menu </w:t>
-            </w:r>
-            <w:r>
-              <w:rPr>
-                <w:sz w:val="16"/>
-                <w:szCs w:val="18"/>
-                <w:lang w:val="en-CA"/>
-              </w:rPr>
-              <w:lastRenderedPageBreak/>
-              <w:t>button</w:t>
+              <w:t>, click on the (…) open torus menu button</w:t>
             </w:r>
           </w:p>
           <w:p>
@@ -6256,7 +6544,6 @@
                 <w:szCs w:val="18"/>
                 <w:lang w:val="en-CA"/>
               </w:rPr>
-              <w:lastRenderedPageBreak/>
               <w:t>O</w:t>
             </w:r>
             <w:r>
@@ -6265,16 +6552,7 @@
                 <w:szCs w:val="18"/>
                 <w:lang w:val="en-CA"/>
               </w:rPr>
-              <w:t xml:space="preserve">n test 1, the torus menu should open in one union, all annular </w:t>
-            </w:r>
-            <w:r>
-              <w:rPr>
-                <w:sz w:val="16"/>
-                <w:szCs w:val="18"/>
-                <w:lang w:val="en-CA"/>
-              </w:rPr>
-              <w:lastRenderedPageBreak/>
-              <w:t>sectors synchronized at the same time</w:t>
+              <w:t>n test 1, the torus menu should open in one union, all annular sectors synchronized at the same time</w:t>
             </w:r>
           </w:p>
           <w:p>
@@ -6396,7 +6674,6 @@
                 <w:szCs w:val="18"/>
                 <w:lang w:val="en-CA"/>
               </w:rPr>
-              <w:lastRenderedPageBreak/>
               <w:t>W</w:t>
             </w:r>
             <w:r>
@@ -6413,16 +6690,7 @@
                 <w:szCs w:val="18"/>
                 <w:lang w:val="en-CA"/>
               </w:rPr>
-              <w:t>5bddf836872611033759d62774</w:t>
-            </w:r>
-            <w:r>
-              <w:rPr>
-                <w:sz w:val="16"/>
-                <w:szCs w:val="18"/>
-                <w:lang w:val="en-CA"/>
-              </w:rPr>
-              <w:lastRenderedPageBreak/>
-              <w:t>6d8b4161bba22a</w:t>
+              <w:t>5bddf836872611033759d627746d8b4161bba22a</w:t>
             </w:r>
           </w:p>
         </w:tc>
@@ -7413,6 +7681,7 @@
                 <w:szCs w:val="18"/>
                 <w:lang w:val="en-CA"/>
               </w:rPr>
+              <w:lastRenderedPageBreak/>
               <w:t>ColorPicker.tsx, Styles.tsx, App.tsx</w:t>
             </w:r>
           </w:p>
@@ -7477,16 +7746,7 @@
                 <w:szCs w:val="18"/>
                 <w:lang w:val="en-CA"/>
               </w:rPr>
-              <w:t xml:space="preserve">or any color, click on the color rectangle in the styles page and </w:t>
-            </w:r>
-            <w:r>
-              <w:rPr>
-                <w:sz w:val="16"/>
-                <w:szCs w:val="18"/>
-                <w:lang w:val="en-CA"/>
-              </w:rPr>
-              <w:lastRenderedPageBreak/>
-              <w:t>start dragging around the color picker in the color wheel</w:t>
+              <w:t>or any color, click on the color rectangle in the styles page and start dragging around the color picker in the color wheel</w:t>
             </w:r>
           </w:p>
         </w:tc>
@@ -7510,7 +7770,6 @@
                 <w:szCs w:val="18"/>
                 <w:lang w:val="en-CA"/>
               </w:rPr>
-              <w:lastRenderedPageBreak/>
               <w:t>T</w:t>
             </w:r>
             <w:r>
@@ -7536,16 +7795,7 @@
                 <w:szCs w:val="18"/>
                 <w:lang w:val="en-CA"/>
               </w:rPr>
-              <w:t xml:space="preserve">very element using that color </w:t>
-            </w:r>
-            <w:r>
-              <w:rPr>
-                <w:sz w:val="16"/>
-                <w:szCs w:val="18"/>
-                <w:lang w:val="en-CA"/>
-              </w:rPr>
-              <w:lastRenderedPageBreak/>
-              <w:t>should change instantaneously with no lag</w:t>
+              <w:t>very element using that color should change instantaneously with no lag</w:t>
             </w:r>
           </w:p>
         </w:tc>
@@ -7569,7 +7819,6 @@
                 <w:szCs w:val="18"/>
                 <w:lang w:val="en-CA"/>
               </w:rPr>
-              <w:lastRenderedPageBreak/>
               <w:t>P</w:t>
             </w:r>
             <w:r>
@@ -7586,16 +7835,7 @@
                 <w:szCs w:val="18"/>
                 <w:lang w:val="en-CA"/>
               </w:rPr>
-              <w:t>5bddf836872611033759d62774</w:t>
-            </w:r>
-            <w:r>
-              <w:rPr>
-                <w:sz w:val="16"/>
-                <w:szCs w:val="18"/>
-                <w:lang w:val="en-CA"/>
-              </w:rPr>
-              <w:lastRenderedPageBreak/>
-              <w:t>6d8b4161bba22a</w:t>
+              <w:t>5bddf836872611033759d627746d8b4161bba22a</w:t>
             </w:r>
             <w:r>
               <w:rPr>
@@ -7723,7 +7963,6 @@
                 <w:szCs w:val="18"/>
                 <w:lang w:val="en-CA"/>
               </w:rPr>
-              <w:lastRenderedPageBreak/>
               <w:t>Styles.tsx, App.tsx</w:t>
             </w:r>
           </w:p>
@@ -8588,36 +8827,60 @@
           <w:p>
             <w:pPr>
               <w:rPr>
-                <w:rFonts w:hint="eastAsia"/>
-                <w:sz w:val="16"/>
-                <w:szCs w:val="18"/>
-                <w:lang w:val="en-CA"/>
-              </w:rPr>
-            </w:pPr>
-            <w:r>
-              <w:rPr>
-                <w:rFonts w:hint="eastAsia"/>
-                <w:sz w:val="16"/>
-                <w:szCs w:val="18"/>
-                <w:lang w:val="en-CA"/>
-              </w:rPr>
-              <w:t>W</w:t>
-            </w:r>
-            <w:r>
-              <w:rPr>
-                <w:sz w:val="16"/>
-                <w:szCs w:val="18"/>
-                <w:lang w:val="en-CA"/>
-              </w:rPr>
-              <w:t xml:space="preserve">orking as of </w:t>
-            </w:r>
-            <w:r>
-              <w:rPr>
-                <w:sz w:val="16"/>
-                <w:szCs w:val="18"/>
-                <w:lang w:val="en-CA"/>
-              </w:rPr>
-              <w:t>067b44dd917b163ba79b5362cfbd05c485b350d9</w:t>
+                <w:sz w:val="16"/>
+                <w:szCs w:val="18"/>
+                <w:lang w:val="en-CA"/>
+              </w:rPr>
+            </w:pPr>
+            <w:r>
+              <w:rPr>
+                <w:rFonts w:hint="eastAsia"/>
+                <w:sz w:val="16"/>
+                <w:szCs w:val="18"/>
+                <w:lang w:val="en-CA"/>
+              </w:rPr>
+              <w:t>B</w:t>
+            </w:r>
+            <w:r>
+              <w:rPr>
+                <w:sz w:val="16"/>
+                <w:szCs w:val="18"/>
+                <w:lang w:val="en-CA"/>
+              </w:rPr>
+              <w:t xml:space="preserve">roken as of </w:t>
+            </w:r>
+            <w:r>
+              <w:rPr>
+                <w:sz w:val="16"/>
+                <w:szCs w:val="18"/>
+                <w:lang w:val="en-CA"/>
+              </w:rPr>
+              <w:t>72353571f3d02393a601e5c151529df37aea6b30</w:t>
+            </w:r>
+            <w:r>
+              <w:rPr>
+                <w:sz w:val="16"/>
+                <w:szCs w:val="18"/>
+                <w:lang w:val="en-CA"/>
+              </w:rPr>
+              <w:t xml:space="preserve">. </w:t>
+            </w:r>
+            <w:r>
+              <w:rPr>
+                <w:rFonts w:hint="eastAsia"/>
+                <w:sz w:val="16"/>
+                <w:szCs w:val="18"/>
+                <w:lang w:val="en-CA"/>
+              </w:rPr>
+              <w:t>C</w:t>
+            </w:r>
+            <w:r>
+              <w:rPr>
+                <w:sz w:val="16"/>
+                <w:szCs w:val="18"/>
+                <w:lang w:val="en-CA"/>
+              </w:rPr>
+              <w:t>licking on the settings page gives just one long line of text despite the toast message being declared as being split across two lines</w:t>
             </w:r>
           </w:p>
         </w:tc>
@@ -8630,12 +8893,28 @@
           <w:p>
             <w:pPr>
               <w:rPr>
-                <w:rFonts w:hint="eastAsia"/>
-                <w:sz w:val="16"/>
-                <w:szCs w:val="18"/>
-                <w:lang w:val="en-CA"/>
-              </w:rPr>
-            </w:pPr>
+                <w:sz w:val="16"/>
+                <w:szCs w:val="18"/>
+                <w:lang w:val="en-CA"/>
+              </w:rPr>
+            </w:pPr>
+            <w:r>
+              <w:rPr>
+                <w:rFonts w:hint="eastAsia"/>
+                <w:sz w:val="16"/>
+                <w:szCs w:val="18"/>
+                <w:lang w:val="en-CA"/>
+              </w:rPr>
+              <w:t>A</w:t>
+            </w:r>
+            <w:r>
+              <w:rPr>
+                <w:sz w:val="16"/>
+                <w:szCs w:val="18"/>
+                <w:lang w:val="en-CA"/>
+              </w:rPr>
+              <w:t>pp.tsx, toast.tsx</w:t>
+            </w:r>
           </w:p>
         </w:tc>
         <w:tc>
@@ -8645,12 +8924,37 @@
           <w:p>
             <w:pPr>
               <w:rPr>
-                <w:rFonts w:hint="eastAsia"/>
-                <w:sz w:val="16"/>
-                <w:szCs w:val="18"/>
-                <w:lang w:val="en-CA"/>
-              </w:rPr>
-            </w:pPr>
+                <w:sz w:val="16"/>
+                <w:szCs w:val="18"/>
+                <w:lang w:val="en-CA"/>
+              </w:rPr>
+            </w:pPr>
+            <w:r>
+              <w:rPr>
+                <w:rFonts w:hint="eastAsia"/>
+                <w:sz w:val="16"/>
+                <w:szCs w:val="18"/>
+                <w:lang w:val="en-CA"/>
+              </w:rPr>
+              <w:t>T</w:t>
+            </w:r>
+            <w:r>
+              <w:rPr>
+                <w:sz w:val="16"/>
+                <w:szCs w:val="18"/>
+                <w:lang w:val="en-CA"/>
+              </w:rPr>
+              <w:t xml:space="preserve">oast: “open multiple menus is disabled!” </w:t>
+            </w:r>
+            <w:r>
+              <w:rPr>
+                <w:sz w:val="16"/>
+                <w:szCs w:val="18"/>
+                <w:lang w:val="en-CA"/>
+              </w:rPr>
+              <w:lastRenderedPageBreak/>
+              <w:t>toast: correct positioning</w:t>
+            </w:r>
           </w:p>
         </w:tc>
         <w:tc>
@@ -8660,12 +8964,38 @@
           <w:p>
             <w:pPr>
               <w:rPr>
-                <w:rFonts w:hint="eastAsia"/>
-                <w:sz w:val="16"/>
-                <w:szCs w:val="18"/>
-                <w:lang w:val="en-CA"/>
-              </w:rPr>
-            </w:pPr>
+                <w:sz w:val="16"/>
+                <w:szCs w:val="18"/>
+                <w:lang w:val="en-CA"/>
+              </w:rPr>
+            </w:pPr>
+            <w:r>
+              <w:rPr>
+                <w:rFonts w:hint="eastAsia"/>
+                <w:sz w:val="16"/>
+                <w:szCs w:val="18"/>
+                <w:lang w:val="en-CA"/>
+              </w:rPr>
+              <w:lastRenderedPageBreak/>
+              <w:t>T</w:t>
+            </w:r>
+            <w:r>
+              <w:rPr>
+                <w:sz w:val="16"/>
+                <w:szCs w:val="18"/>
+                <w:lang w:val="en-CA"/>
+              </w:rPr>
+              <w:t xml:space="preserve">rigger the “open multiple menus is disabled!” toast by </w:t>
+            </w:r>
+            <w:r>
+              <w:rPr>
+                <w:sz w:val="16"/>
+                <w:szCs w:val="18"/>
+                <w:lang w:val="en-CA"/>
+              </w:rPr>
+              <w:lastRenderedPageBreak/>
+              <w:t xml:space="preserve">turning off allow open multiple menus and attempting to open multiple menus. </w:t>
+            </w:r>
           </w:p>
         </w:tc>
         <w:tc>
@@ -8681,6 +9011,33 @@
                 <w:lang w:val="en-CA"/>
               </w:rPr>
             </w:pPr>
+            <w:r>
+              <w:rPr>
+                <w:rFonts w:hint="eastAsia"/>
+                <w:sz w:val="16"/>
+                <w:szCs w:val="18"/>
+                <w:lang w:val="en-CA"/>
+              </w:rPr>
+              <w:lastRenderedPageBreak/>
+              <w:t>T</w:t>
+            </w:r>
+            <w:r>
+              <w:rPr>
+                <w:sz w:val="16"/>
+                <w:szCs w:val="18"/>
+                <w:lang w:val="en-CA"/>
+              </w:rPr>
+              <w:t xml:space="preserve">he toast should appear adjacent to the icon/button, and the arrow should be </w:t>
+            </w:r>
+            <w:r>
+              <w:rPr>
+                <w:sz w:val="16"/>
+                <w:szCs w:val="18"/>
+                <w:lang w:val="en-CA"/>
+              </w:rPr>
+              <w:lastRenderedPageBreak/>
+              <w:t>pointing at it</w:t>
+            </w:r>
           </w:p>
         </w:tc>
         <w:tc>
@@ -8690,12 +9047,71 @@
           <w:p>
             <w:pPr>
               <w:rPr>
-                <w:rFonts w:hint="eastAsia"/>
-                <w:sz w:val="16"/>
-                <w:szCs w:val="18"/>
-                <w:lang w:val="en-CA"/>
-              </w:rPr>
-            </w:pPr>
+                <w:sz w:val="16"/>
+                <w:szCs w:val="18"/>
+                <w:lang w:val="en-CA"/>
+              </w:rPr>
+            </w:pPr>
+            <w:r>
+              <w:rPr>
+                <w:rFonts w:hint="eastAsia"/>
+                <w:sz w:val="16"/>
+                <w:szCs w:val="18"/>
+                <w:lang w:val="en-CA"/>
+              </w:rPr>
+              <w:lastRenderedPageBreak/>
+              <w:t>N</w:t>
+            </w:r>
+            <w:r>
+              <w:rPr>
+                <w:sz w:val="16"/>
+                <w:szCs w:val="18"/>
+                <w:lang w:val="en-CA"/>
+              </w:rPr>
+              <w:t xml:space="preserve">ot working as of </w:t>
+            </w:r>
+            <w:r>
+              <w:rPr>
+                <w:sz w:val="16"/>
+                <w:szCs w:val="18"/>
+                <w:lang w:val="en-CA"/>
+              </w:rPr>
+              <w:t>72353571f3d02393a601e5c151</w:t>
+            </w:r>
+            <w:r>
+              <w:rPr>
+                <w:sz w:val="16"/>
+                <w:szCs w:val="18"/>
+                <w:lang w:val="en-CA"/>
+              </w:rPr>
+              <w:lastRenderedPageBreak/>
+              <w:t>529df37aea6b30</w:t>
+            </w:r>
+            <w:r>
+              <w:rPr>
+                <w:sz w:val="16"/>
+                <w:szCs w:val="18"/>
+                <w:lang w:val="en-CA"/>
+              </w:rPr>
+              <w:t xml:space="preserve">. </w:t>
+            </w:r>
+            <w:r>
+              <w:rPr>
+                <w:rFonts w:hint="eastAsia"/>
+                <w:sz w:val="16"/>
+                <w:szCs w:val="18"/>
+                <w:lang w:val="en-CA"/>
+              </w:rPr>
+              <w:t>T</w:t>
+            </w:r>
+            <w:r>
+              <w:rPr>
+                <w:sz w:val="16"/>
+                <w:szCs w:val="18"/>
+                <w:lang w:val="en-CA"/>
+              </w:rPr>
+              <w:t>he toast for the settings button appears on top of it and in one fat line.</w:t>
+            </w:r>
           </w:p>
         </w:tc>
       </w:tr>
@@ -8719,6 +9135,7 @@
           <w:szCs w:val="32"/>
           <w:lang w:val="en-CA"/>
         </w:rPr>
+        <w:lastRenderedPageBreak/>
         <w:t>PlayneedleEditor.tsx</w:t>
       </w:r>
     </w:p>
@@ -8755,7 +9172,6 @@
                 <w:sz w:val="16"/>
                 <w:szCs w:val="18"/>
               </w:rPr>
-              <w:lastRenderedPageBreak/>
               <w:t>Relevant f</w:t>
             </w:r>
             <w:r>

</xml_diff>

<commit_message>
extricated switch setting "execute header action buttons when dragging" from being dependent on "Allow ×, -, and ← buttons in modals' header bar to be draggable" switch setting being enabled
</commit_message>
<xml_diff>
--- a/test plan.docx
+++ b/test plan.docx
@@ -438,6 +438,7 @@
           <w:lang w:val="en-CA"/>
         </w:rPr>
       </w:pPr>
+      <w:proofErr w:type="spellStart"/>
       <w:r>
         <w:rPr>
           <w:rFonts w:hint="eastAsia"/>
@@ -459,6 +460,7 @@
         </w:rPr>
         <w:t>pp.tsx</w:t>
       </w:r>
+      <w:proofErr w:type="spellEnd"/>
     </w:p>
     <w:p>
       <w:pPr>
@@ -485,6 +487,7 @@
           <w:lang w:val="en-CA"/>
         </w:rPr>
       </w:pPr>
+      <w:proofErr w:type="spellStart"/>
       <w:r>
         <w:rPr>
           <w:rFonts w:hint="eastAsia"/>
@@ -506,6 +509,7 @@
         </w:rPr>
         <w:t>ettings.tsx</w:t>
       </w:r>
+      <w:proofErr w:type="spellEnd"/>
       <w:r>
         <w:rPr>
           <w:b/>
@@ -717,6 +721,7 @@
                 <w:lang w:val="en-CA"/>
               </w:rPr>
             </w:pPr>
+            <w:proofErr w:type="spellStart"/>
             <w:r>
               <w:rPr>
                 <w:sz w:val="16"/>
@@ -725,6 +730,7 @@
               </w:rPr>
               <w:t>Settings.tsx</w:t>
             </w:r>
+            <w:proofErr w:type="spellEnd"/>
           </w:p>
         </w:tc>
         <w:tc>
@@ -851,7 +857,25 @@
                 <w:szCs w:val="18"/>
                 <w:lang w:val="en-CA"/>
               </w:rPr>
-              <w:t xml:space="preserve">he keybind box keeps registering your keys until you click away from the box. </w:t>
+              <w:t xml:space="preserve">he </w:t>
+            </w:r>
+            <w:proofErr w:type="spellStart"/>
+            <w:r>
+              <w:rPr>
+                <w:sz w:val="16"/>
+                <w:szCs w:val="18"/>
+                <w:lang w:val="en-CA"/>
+              </w:rPr>
+              <w:t>keybind</w:t>
+            </w:r>
+            <w:proofErr w:type="spellEnd"/>
+            <w:r>
+              <w:rPr>
+                <w:sz w:val="16"/>
+                <w:szCs w:val="18"/>
+                <w:lang w:val="en-CA"/>
+              </w:rPr>
+              <w:t xml:space="preserve"> box keeps registering your keys until you click away from the box. </w:t>
             </w:r>
             <w:r>
               <w:rPr>
@@ -868,7 +892,43 @@
                 <w:szCs w:val="18"/>
                 <w:lang w:val="en-CA"/>
               </w:rPr>
-              <w:t xml:space="preserve">his behavior may be ambiguous to users because there’s no visual indicator as to which keybind box is selected or that you have to click away to apply the keybind. </w:t>
+              <w:t xml:space="preserve">his behavior may be ambiguous to users because there’s no visual indicator as to which </w:t>
+            </w:r>
+            <w:proofErr w:type="spellStart"/>
+            <w:r>
+              <w:rPr>
+                <w:sz w:val="16"/>
+                <w:szCs w:val="18"/>
+                <w:lang w:val="en-CA"/>
+              </w:rPr>
+              <w:t>keybind</w:t>
+            </w:r>
+            <w:proofErr w:type="spellEnd"/>
+            <w:r>
+              <w:rPr>
+                <w:sz w:val="16"/>
+                <w:szCs w:val="18"/>
+                <w:lang w:val="en-CA"/>
+              </w:rPr>
+              <w:t xml:space="preserve"> box is selected or that you have to click away to apply the </w:t>
+            </w:r>
+            <w:proofErr w:type="spellStart"/>
+            <w:r>
+              <w:rPr>
+                <w:sz w:val="16"/>
+                <w:szCs w:val="18"/>
+                <w:lang w:val="en-CA"/>
+              </w:rPr>
+              <w:t>keybind</w:t>
+            </w:r>
+            <w:proofErr w:type="spellEnd"/>
+            <w:r>
+              <w:rPr>
+                <w:sz w:val="16"/>
+                <w:szCs w:val="18"/>
+                <w:lang w:val="en-CA"/>
+              </w:rPr>
+              <w:t xml:space="preserve">. </w:t>
             </w:r>
             <w:r>
               <w:rPr>
@@ -885,7 +945,25 @@
                 <w:szCs w:val="18"/>
                 <w:lang w:val="en-CA"/>
               </w:rPr>
-              <w:t>ither add a visual indicator or accept the keybind after 1 keypress.</w:t>
+              <w:t xml:space="preserve">ither add a visual indicator or accept the </w:t>
+            </w:r>
+            <w:proofErr w:type="spellStart"/>
+            <w:r>
+              <w:rPr>
+                <w:sz w:val="16"/>
+                <w:szCs w:val="18"/>
+                <w:lang w:val="en-CA"/>
+              </w:rPr>
+              <w:t>keybind</w:t>
+            </w:r>
+            <w:proofErr w:type="spellEnd"/>
+            <w:r>
+              <w:rPr>
+                <w:sz w:val="16"/>
+                <w:szCs w:val="18"/>
+                <w:lang w:val="en-CA"/>
+              </w:rPr>
+              <w:t xml:space="preserve"> after 1 keypress.</w:t>
             </w:r>
           </w:p>
         </w:tc>
@@ -904,6 +982,7 @@
                 <w:lang w:val="en-CA"/>
               </w:rPr>
             </w:pPr>
+            <w:proofErr w:type="spellStart"/>
             <w:r>
               <w:rPr>
                 <w:rFonts w:hint="eastAsia"/>
@@ -921,6 +1000,7 @@
               </w:rPr>
               <w:t>ettings.tsx</w:t>
             </w:r>
+            <w:proofErr w:type="spellEnd"/>
           </w:p>
         </w:tc>
         <w:tc>
@@ -1015,7 +1095,25 @@
                 <w:szCs w:val="18"/>
                 <w:lang w:val="en-CA"/>
               </w:rPr>
-              <w:t xml:space="preserve">ny modified keybinds should reset to default. </w:t>
+              <w:t xml:space="preserve">ny modified </w:t>
+            </w:r>
+            <w:proofErr w:type="spellStart"/>
+            <w:r>
+              <w:rPr>
+                <w:sz w:val="16"/>
+                <w:szCs w:val="18"/>
+                <w:lang w:val="en-CA"/>
+              </w:rPr>
+              <w:t>keybinds</w:t>
+            </w:r>
+            <w:proofErr w:type="spellEnd"/>
+            <w:r>
+              <w:rPr>
+                <w:sz w:val="16"/>
+                <w:szCs w:val="18"/>
+                <w:lang w:val="en-CA"/>
+              </w:rPr>
+              <w:t xml:space="preserve"> should reset to default. </w:t>
             </w:r>
             <w:r>
               <w:rPr>
@@ -1032,7 +1130,25 @@
                 <w:szCs w:val="18"/>
                 <w:lang w:val="en-CA"/>
               </w:rPr>
-              <w:t xml:space="preserve">ny non default additional keybinds should be gone. </w:t>
+              <w:t xml:space="preserve">ny non default additional </w:t>
+            </w:r>
+            <w:proofErr w:type="spellStart"/>
+            <w:r>
+              <w:rPr>
+                <w:sz w:val="16"/>
+                <w:szCs w:val="18"/>
+                <w:lang w:val="en-CA"/>
+              </w:rPr>
+              <w:t>keybinds</w:t>
+            </w:r>
+            <w:proofErr w:type="spellEnd"/>
+            <w:r>
+              <w:rPr>
+                <w:sz w:val="16"/>
+                <w:szCs w:val="18"/>
+                <w:lang w:val="en-CA"/>
+              </w:rPr>
+              <w:t xml:space="preserve"> should be gone. </w:t>
             </w:r>
             <w:r>
               <w:rPr>
@@ -1049,7 +1165,25 @@
                 <w:szCs w:val="18"/>
                 <w:lang w:val="en-CA"/>
               </w:rPr>
-              <w:t>ny removed keybinds from the default setting should be added back</w:t>
+              <w:t xml:space="preserve">ny removed </w:t>
+            </w:r>
+            <w:proofErr w:type="spellStart"/>
+            <w:r>
+              <w:rPr>
+                <w:sz w:val="16"/>
+                <w:szCs w:val="18"/>
+                <w:lang w:val="en-CA"/>
+              </w:rPr>
+              <w:t>keybinds</w:t>
+            </w:r>
+            <w:proofErr w:type="spellEnd"/>
+            <w:r>
+              <w:rPr>
+                <w:sz w:val="16"/>
+                <w:szCs w:val="18"/>
+                <w:lang w:val="en-CA"/>
+              </w:rPr>
+              <w:t xml:space="preserve"> from the default setting should be added back</w:t>
             </w:r>
           </w:p>
         </w:tc>
@@ -1091,6 +1225,7 @@
                 <w:lang w:val="en-CA"/>
               </w:rPr>
             </w:pPr>
+            <w:proofErr w:type="spellStart"/>
             <w:r>
               <w:rPr>
                 <w:rFonts w:hint="eastAsia"/>
@@ -1108,6 +1243,7 @@
               </w:rPr>
               <w:t>ettings.tsx</w:t>
             </w:r>
+            <w:proofErr w:type="spellEnd"/>
           </w:p>
         </w:tc>
         <w:tc>
@@ -1202,7 +1338,25 @@
                 <w:szCs w:val="18"/>
                 <w:lang w:val="en-CA"/>
               </w:rPr>
-              <w:t xml:space="preserve">t should add a new keybind box. </w:t>
+              <w:t xml:space="preserve">t should add a new </w:t>
+            </w:r>
+            <w:proofErr w:type="spellStart"/>
+            <w:r>
+              <w:rPr>
+                <w:sz w:val="16"/>
+                <w:szCs w:val="18"/>
+                <w:lang w:val="en-CA"/>
+              </w:rPr>
+              <w:t>keybind</w:t>
+            </w:r>
+            <w:proofErr w:type="spellEnd"/>
+            <w:r>
+              <w:rPr>
+                <w:sz w:val="16"/>
+                <w:szCs w:val="18"/>
+                <w:lang w:val="en-CA"/>
+              </w:rPr>
+              <w:t xml:space="preserve"> box. </w:t>
             </w:r>
             <w:r>
               <w:rPr>
@@ -1219,7 +1373,25 @@
                 <w:szCs w:val="18"/>
                 <w:lang w:val="en-CA"/>
               </w:rPr>
-              <w:t>oth keybind boxes should have an “x” button</w:t>
+              <w:t xml:space="preserve">oth </w:t>
+            </w:r>
+            <w:proofErr w:type="spellStart"/>
+            <w:r>
+              <w:rPr>
+                <w:sz w:val="16"/>
+                <w:szCs w:val="18"/>
+                <w:lang w:val="en-CA"/>
+              </w:rPr>
+              <w:t>keybind</w:t>
+            </w:r>
+            <w:proofErr w:type="spellEnd"/>
+            <w:r>
+              <w:rPr>
+                <w:sz w:val="16"/>
+                <w:szCs w:val="18"/>
+                <w:lang w:val="en-CA"/>
+              </w:rPr>
+              <w:t xml:space="preserve"> boxes should have an “x” button</w:t>
             </w:r>
           </w:p>
         </w:tc>
@@ -1261,6 +1433,7 @@
                 <w:lang w:val="en-CA"/>
               </w:rPr>
             </w:pPr>
+            <w:proofErr w:type="spellStart"/>
             <w:r>
               <w:rPr>
                 <w:rFonts w:hint="eastAsia"/>
@@ -1278,6 +1451,7 @@
               </w:rPr>
               <w:t>ettings.tsx</w:t>
             </w:r>
+            <w:proofErr w:type="spellEnd"/>
           </w:p>
         </w:tc>
         <w:tc>
@@ -1340,7 +1514,25 @@
                 <w:szCs w:val="18"/>
                 <w:lang w:val="en-CA"/>
               </w:rPr>
-              <w:t>lick the “x” button on the right side in a keybind box</w:t>
+              <w:t xml:space="preserve">lick the “x” button on the right side in a </w:t>
+            </w:r>
+            <w:proofErr w:type="spellStart"/>
+            <w:r>
+              <w:rPr>
+                <w:sz w:val="16"/>
+                <w:szCs w:val="18"/>
+                <w:lang w:val="en-CA"/>
+              </w:rPr>
+              <w:t>keybind</w:t>
+            </w:r>
+            <w:proofErr w:type="spellEnd"/>
+            <w:r>
+              <w:rPr>
+                <w:sz w:val="16"/>
+                <w:szCs w:val="18"/>
+                <w:lang w:val="en-CA"/>
+              </w:rPr>
+              <w:t xml:space="preserve"> box</w:t>
             </w:r>
           </w:p>
         </w:tc>
@@ -1372,7 +1564,25 @@
                 <w:szCs w:val="18"/>
                 <w:lang w:val="en-CA"/>
               </w:rPr>
-              <w:t xml:space="preserve">t should delete that keybind. </w:t>
+              <w:t xml:space="preserve">t should delete that </w:t>
+            </w:r>
+            <w:proofErr w:type="spellStart"/>
+            <w:r>
+              <w:rPr>
+                <w:sz w:val="16"/>
+                <w:szCs w:val="18"/>
+                <w:lang w:val="en-CA"/>
+              </w:rPr>
+              <w:t>keybind</w:t>
+            </w:r>
+            <w:proofErr w:type="spellEnd"/>
+            <w:r>
+              <w:rPr>
+                <w:sz w:val="16"/>
+                <w:szCs w:val="18"/>
+                <w:lang w:val="en-CA"/>
+              </w:rPr>
+              <w:t xml:space="preserve">. </w:t>
             </w:r>
             <w:r>
               <w:rPr>
@@ -1389,7 +1599,25 @@
                 <w:szCs w:val="18"/>
                 <w:lang w:val="en-CA"/>
               </w:rPr>
-              <w:t xml:space="preserve">f there is only one keybind, there should still be an </w:t>
+              <w:t xml:space="preserve">f there is only one </w:t>
+            </w:r>
+            <w:proofErr w:type="spellStart"/>
+            <w:r>
+              <w:rPr>
+                <w:sz w:val="16"/>
+                <w:szCs w:val="18"/>
+                <w:lang w:val="en-CA"/>
+              </w:rPr>
+              <w:t>keybind</w:t>
+            </w:r>
+            <w:proofErr w:type="spellEnd"/>
+            <w:r>
+              <w:rPr>
+                <w:sz w:val="16"/>
+                <w:szCs w:val="18"/>
+                <w:lang w:val="en-CA"/>
+              </w:rPr>
+              <w:t xml:space="preserve">, there should still be an </w:t>
             </w:r>
             <w:r>
               <w:rPr>
@@ -1431,7 +1659,25 @@
                 <w:szCs w:val="18"/>
                 <w:lang w:val="en-CA"/>
               </w:rPr>
-              <w:t>ingle keybinds don’t have an X button</w:t>
+              <w:t xml:space="preserve">ingle </w:t>
+            </w:r>
+            <w:proofErr w:type="spellStart"/>
+            <w:r>
+              <w:rPr>
+                <w:sz w:val="16"/>
+                <w:szCs w:val="18"/>
+                <w:lang w:val="en-CA"/>
+              </w:rPr>
+              <w:t>keybinds</w:t>
+            </w:r>
+            <w:proofErr w:type="spellEnd"/>
+            <w:r>
+              <w:rPr>
+                <w:sz w:val="16"/>
+                <w:szCs w:val="18"/>
+                <w:lang w:val="en-CA"/>
+              </w:rPr>
+              <w:t xml:space="preserve"> don’t have an X button</w:t>
             </w:r>
             <w:r>
               <w:rPr>
@@ -1465,7 +1711,25 @@
                 <w:lang w:val="en-CA"/>
               </w:rPr>
               <w:lastRenderedPageBreak/>
-              <w:t>single keybinds to have an X button</w:t>
+              <w:t xml:space="preserve">single </w:t>
+            </w:r>
+            <w:proofErr w:type="spellStart"/>
+            <w:r>
+              <w:rPr>
+                <w:sz w:val="16"/>
+                <w:szCs w:val="18"/>
+                <w:lang w:val="en-CA"/>
+              </w:rPr>
+              <w:t>keybinds</w:t>
+            </w:r>
+            <w:proofErr w:type="spellEnd"/>
+            <w:r>
+              <w:rPr>
+                <w:sz w:val="16"/>
+                <w:szCs w:val="18"/>
+                <w:lang w:val="en-CA"/>
+              </w:rPr>
+              <w:t xml:space="preserve"> to have an X button</w:t>
             </w:r>
           </w:p>
         </w:tc>
@@ -1484,6 +1748,7 @@
                 <w:lang w:val="en-CA"/>
               </w:rPr>
             </w:pPr>
+            <w:proofErr w:type="spellStart"/>
             <w:r>
               <w:rPr>
                 <w:rFonts w:hint="eastAsia"/>
@@ -1502,6 +1767,7 @@
               </w:rPr>
               <w:t>ettings.tsx</w:t>
             </w:r>
+            <w:proofErr w:type="spellEnd"/>
           </w:p>
         </w:tc>
         <w:tc>
@@ -1564,8 +1830,18 @@
                 <w:szCs w:val="18"/>
                 <w:lang w:val="en-CA"/>
               </w:rPr>
-              <w:t>ake an adjustment to the clip in the timeline and press the undo keybind</w:t>
-            </w:r>
+              <w:t xml:space="preserve">ake an adjustment to the clip in the timeline and press the undo </w:t>
+            </w:r>
+            <w:proofErr w:type="spellStart"/>
+            <w:r>
+              <w:rPr>
+                <w:sz w:val="16"/>
+                <w:szCs w:val="18"/>
+                <w:lang w:val="en-CA"/>
+              </w:rPr>
+              <w:t>keybind</w:t>
+            </w:r>
+            <w:proofErr w:type="spellEnd"/>
           </w:p>
         </w:tc>
         <w:tc>
@@ -1650,6 +1926,7 @@
           <w:lang w:val="en-CA"/>
         </w:rPr>
       </w:pPr>
+      <w:proofErr w:type="spellStart"/>
       <w:r>
         <w:rPr>
           <w:rFonts w:hint="eastAsia"/>
@@ -1669,7 +1946,18 @@
           <w:szCs w:val="32"/>
           <w:lang w:val="en-CA"/>
         </w:rPr>
-        <w:t xml:space="preserve">ettings.tsx: </w:t>
+        <w:t>ettings.tsx</w:t>
+      </w:r>
+      <w:proofErr w:type="spellEnd"/>
+      <w:r>
+        <w:rPr>
+          <w:b/>
+          <w:bCs/>
+          <w:sz w:val="28"/>
+          <w:szCs w:val="32"/>
+          <w:lang w:val="en-CA"/>
+        </w:rPr>
+        <w:t xml:space="preserve">: </w:t>
       </w:r>
       <w:r>
         <w:rPr>
@@ -1874,6 +2162,7 @@
                 <w:lang w:val="en-CA"/>
               </w:rPr>
             </w:pPr>
+            <w:proofErr w:type="spellStart"/>
             <w:r>
               <w:rPr>
                 <w:rFonts w:hint="eastAsia"/>
@@ -1891,6 +2180,25 @@
               </w:rPr>
               <w:t>ettings.tsx</w:t>
             </w:r>
+            <w:proofErr w:type="spellEnd"/>
+            <w:r>
+              <w:rPr>
+                <w:sz w:val="16"/>
+                <w:szCs w:val="18"/>
+                <w:lang w:val="en-CA"/>
+              </w:rPr>
+              <w:t xml:space="preserve"> </w:t>
+            </w:r>
+            <w:proofErr w:type="spellStart"/>
+            <w:r>
+              <w:rPr>
+                <w:sz w:val="16"/>
+                <w:szCs w:val="18"/>
+                <w:lang w:val="en-CA"/>
+              </w:rPr>
+              <w:t>DraggableModal.tsx</w:t>
+            </w:r>
+            <w:proofErr w:type="spellEnd"/>
           </w:p>
         </w:tc>
         <w:tc>
@@ -1950,6 +2258,23 @@
                 <w:lang w:val="en-CA"/>
               </w:rPr>
             </w:pPr>
+            <w:r>
+              <w:rPr>
+                <w:rFonts w:hint="eastAsia"/>
+                <w:sz w:val="16"/>
+                <w:szCs w:val="18"/>
+                <w:lang w:val="en-CA"/>
+              </w:rPr>
+              <w:t>O</w:t>
+            </w:r>
+            <w:r>
+              <w:rPr>
+                <w:sz w:val="16"/>
+                <w:szCs w:val="18"/>
+                <w:lang w:val="en-CA"/>
+              </w:rPr>
+              <w:t xml:space="preserve">pen a modal, </w:t>
+            </w:r>
             <w:r>
               <w:rPr>
                 <w:rFonts w:hint="eastAsia"/>
@@ -2053,6 +2378,7 @@
                 <w:lang w:val="en-CA"/>
               </w:rPr>
             </w:pPr>
+            <w:proofErr w:type="spellStart"/>
             <w:r>
               <w:rPr>
                 <w:rFonts w:hint="eastAsia"/>
@@ -2070,6 +2396,25 @@
               </w:rPr>
               <w:t>ettings.tsx</w:t>
             </w:r>
+            <w:proofErr w:type="spellEnd"/>
+            <w:r>
+              <w:rPr>
+                <w:sz w:val="16"/>
+                <w:szCs w:val="18"/>
+                <w:lang w:val="en-CA"/>
+              </w:rPr>
+              <w:t xml:space="preserve"> </w:t>
+            </w:r>
+            <w:proofErr w:type="spellStart"/>
+            <w:r>
+              <w:rPr>
+                <w:sz w:val="16"/>
+                <w:szCs w:val="18"/>
+                <w:lang w:val="en-CA"/>
+              </w:rPr>
+              <w:t>DraggableModal.tsx</w:t>
+            </w:r>
+            <w:proofErr w:type="spellEnd"/>
           </w:p>
         </w:tc>
         <w:tc>
@@ -2114,14 +2459,14 @@
                 <w:sz w:val="16"/>
                 <w:szCs w:val="18"/>
               </w:rPr>
-              <w:t>: DISABLED</w:t>
-            </w:r>
-            <w:r>
-              <w:rPr>
-                <w:sz w:val="16"/>
-                <w:szCs w:val="18"/>
-              </w:rPr>
-              <w:t xml:space="preserve"> #2</w:t>
+              <w:t>. ENABLED</w:t>
+            </w:r>
+            <w:r>
+              <w:rPr>
+                <w:sz w:val="16"/>
+                <w:szCs w:val="18"/>
+              </w:rPr>
+              <w:t xml:space="preserve"> </w:t>
             </w:r>
           </w:p>
         </w:tc>
@@ -2144,32 +2489,23 @@
                 <w:szCs w:val="18"/>
                 <w:lang w:val="en-CA"/>
               </w:rPr>
-              <w:t>L</w:t>
-            </w:r>
-            <w:r>
-              <w:rPr>
-                <w:sz w:val="16"/>
-                <w:szCs w:val="18"/>
-                <w:lang w:val="en-CA"/>
-              </w:rPr>
-              <w:t xml:space="preserve">ook at the dependent setting beneath it. </w:t>
-            </w:r>
-            <w:r>
-              <w:rPr>
-                <w:rFonts w:hint="eastAsia"/>
-                <w:sz w:val="16"/>
-                <w:szCs w:val="18"/>
-                <w:lang w:val="en-CA"/>
-              </w:rPr>
-              <w:t>T</w:t>
-            </w:r>
-            <w:r>
-              <w:rPr>
-                <w:sz w:val="16"/>
-                <w:szCs w:val="18"/>
-                <w:lang w:val="en-CA"/>
-              </w:rPr>
-              <w:t>he setting “execute header button actions when dragging”</w:t>
+              <w:t>O</w:t>
+            </w:r>
+            <w:r>
+              <w:rPr>
+                <w:sz w:val="16"/>
+                <w:szCs w:val="18"/>
+                <w:lang w:val="en-CA"/>
+              </w:rPr>
+              <w:t>pen a modal, t</w:t>
+            </w:r>
+            <w:r>
+              <w:rPr>
+                <w:sz w:val="16"/>
+                <w:szCs w:val="18"/>
+                <w:lang w:val="en-CA"/>
+              </w:rPr>
+              <w:t>ry dragging the x button, - button and back button</w:t>
             </w:r>
           </w:p>
         </w:tc>
@@ -2192,15 +2528,15 @@
                 <w:szCs w:val="18"/>
                 <w:lang w:val="en-CA"/>
               </w:rPr>
-              <w:t>T</w:t>
-            </w:r>
-            <w:r>
-              <w:rPr>
-                <w:sz w:val="16"/>
-                <w:szCs w:val="18"/>
-                <w:lang w:val="en-CA"/>
-              </w:rPr>
-              <w:t>he dependent setting should be greyed out</w:t>
+              <w:t>I</w:t>
+            </w:r>
+            <w:r>
+              <w:rPr>
+                <w:sz w:val="16"/>
+                <w:szCs w:val="18"/>
+                <w:lang w:val="en-CA"/>
+              </w:rPr>
+              <w:t>t should drag</w:t>
             </w:r>
           </w:p>
         </w:tc>
@@ -2257,6 +2593,7 @@
                 <w:lang w:val="en-CA"/>
               </w:rPr>
             </w:pPr>
+            <w:proofErr w:type="spellStart"/>
             <w:r>
               <w:rPr>
                 <w:rFonts w:hint="eastAsia"/>
@@ -2274,6 +2611,25 @@
               </w:rPr>
               <w:t>ettings.tsx</w:t>
             </w:r>
+            <w:proofErr w:type="spellEnd"/>
+            <w:r>
+              <w:rPr>
+                <w:sz w:val="16"/>
+                <w:szCs w:val="18"/>
+                <w:lang w:val="en-CA"/>
+              </w:rPr>
+              <w:t xml:space="preserve">, </w:t>
+            </w:r>
+            <w:proofErr w:type="spellStart"/>
+            <w:r>
+              <w:rPr>
+                <w:sz w:val="16"/>
+                <w:szCs w:val="18"/>
+                <w:lang w:val="en-CA"/>
+              </w:rPr>
+              <w:t>DraggableModal.tsx</w:t>
+            </w:r>
+            <w:proofErr w:type="spellEnd"/>
           </w:p>
         </w:tc>
         <w:tc>
@@ -2318,7 +2674,7 @@
                 <w:sz w:val="16"/>
                 <w:szCs w:val="18"/>
               </w:rPr>
-              <w:t>: DISABLED #2</w:t>
+              <w:t>: ENABLED/DISABLED</w:t>
             </w:r>
           </w:p>
         </w:tc>
@@ -2341,15 +2697,32 @@
                 <w:szCs w:val="18"/>
                 <w:lang w:val="en-CA"/>
               </w:rPr>
-              <w:t>H</w:t>
-            </w:r>
-            <w:r>
-              <w:rPr>
-                <w:sz w:val="16"/>
-                <w:szCs w:val="18"/>
-                <w:lang w:val="en-CA"/>
-              </w:rPr>
-              <w:t>over on the dependent setting beneath it</w:t>
+              <w:t>O</w:t>
+            </w:r>
+            <w:r>
+              <w:rPr>
+                <w:sz w:val="16"/>
+                <w:szCs w:val="18"/>
+                <w:lang w:val="en-CA"/>
+              </w:rPr>
+              <w:t xml:space="preserve">pen a modal, </w:t>
+            </w:r>
+            <w:r>
+              <w:rPr>
+                <w:rFonts w:hint="eastAsia"/>
+                <w:sz w:val="16"/>
+                <w:szCs w:val="18"/>
+                <w:lang w:val="en-CA"/>
+              </w:rPr>
+              <w:t>T</w:t>
+            </w:r>
+            <w:r>
+              <w:rPr>
+                <w:sz w:val="16"/>
+                <w:szCs w:val="18"/>
+                <w:lang w:val="en-CA"/>
+              </w:rPr>
+              <w:t>ry clicking on the x button, - button, or back button</w:t>
             </w:r>
           </w:p>
         </w:tc>
@@ -2372,51 +2745,15 @@
                 <w:szCs w:val="18"/>
                 <w:lang w:val="en-CA"/>
               </w:rPr>
-              <w:t>I</w:t>
-            </w:r>
-            <w:r>
-              <w:rPr>
-                <w:sz w:val="16"/>
-                <w:szCs w:val="18"/>
-                <w:lang w:val="en-CA"/>
-              </w:rPr>
-              <w:t>ts text should say “requires “</w:t>
-            </w:r>
-            <w:r>
-              <w:rPr>
-                <w:sz w:val="16"/>
-                <w:szCs w:val="18"/>
-              </w:rPr>
-              <w:t>Allow ×, -, and ←</w:t>
-            </w:r>
-            <w:r>
-              <w:rPr>
-                <w:sz w:val="16"/>
-                <w:szCs w:val="18"/>
-              </w:rPr>
-              <w:t>” switch to be enabled”</w:t>
-            </w:r>
-            <w:r>
-              <w:rPr>
-                <w:sz w:val="16"/>
-                <w:szCs w:val="18"/>
-              </w:rPr>
-              <w:t xml:space="preserve">. </w:t>
-            </w:r>
-            <w:r>
-              <w:rPr>
-                <w:rFonts w:hint="eastAsia"/>
-                <w:sz w:val="16"/>
-                <w:szCs w:val="18"/>
-              </w:rPr>
-              <w:t>I</w:t>
-            </w:r>
-            <w:r>
-              <w:rPr>
-                <w:sz w:val="16"/>
-                <w:szCs w:val="18"/>
-              </w:rPr>
-              <w:t>t should only say that when your mouse is hovering on it</w:t>
+              <w:t>A</w:t>
+            </w:r>
+            <w:r>
+              <w:rPr>
+                <w:sz w:val="16"/>
+                <w:szCs w:val="18"/>
+                <w:lang w:val="en-CA"/>
+              </w:rPr>
+              <w:t>ll 3 buttons should execute</w:t>
             </w:r>
           </w:p>
         </w:tc>
@@ -2427,44 +2764,12 @@
           <w:p>
             <w:pPr>
               <w:rPr>
-                <w:sz w:val="16"/>
-                <w:szCs w:val="18"/>
-                <w:lang w:val="en-CA"/>
-              </w:rPr>
-            </w:pPr>
-            <w:r>
-              <w:rPr>
-                <w:rFonts w:hint="eastAsia"/>
-                <w:sz w:val="16"/>
-                <w:szCs w:val="18"/>
-                <w:lang w:val="en-CA"/>
-              </w:rPr>
-              <w:t>W</w:t>
-            </w:r>
-            <w:r>
-              <w:rPr>
-                <w:sz w:val="16"/>
-                <w:szCs w:val="18"/>
-                <w:lang w:val="en-CA"/>
-              </w:rPr>
-              <w:t xml:space="preserve">orking as of </w:t>
-            </w:r>
-            <w:r>
-              <w:rPr>
-                <w:sz w:val="16"/>
-                <w:szCs w:val="18"/>
-                <w:lang w:val="en-CA"/>
-              </w:rPr>
-              <w:t>9577b4626ef83978b054f3200592ec63f9a356f2</w:t>
-            </w:r>
-            <w:r>
-              <w:rPr>
-                <w:sz w:val="16"/>
-                <w:szCs w:val="18"/>
-                <w:lang w:val="en-CA"/>
-              </w:rPr>
-              <w:t>.</w:t>
-            </w:r>
+                <w:rFonts w:hint="eastAsia"/>
+                <w:sz w:val="16"/>
+                <w:szCs w:val="18"/>
+                <w:lang w:val="en-CA"/>
+              </w:rPr>
+            </w:pPr>
           </w:p>
         </w:tc>
       </w:tr>
@@ -2481,6 +2786,7 @@
                 <w:lang w:val="en-CA"/>
               </w:rPr>
             </w:pPr>
+            <w:proofErr w:type="spellStart"/>
             <w:r>
               <w:rPr>
                 <w:rFonts w:hint="eastAsia"/>
@@ -2498,6 +2804,25 @@
               </w:rPr>
               <w:t>ettings.tsx</w:t>
             </w:r>
+            <w:proofErr w:type="spellEnd"/>
+            <w:r>
+              <w:rPr>
+                <w:sz w:val="16"/>
+                <w:szCs w:val="18"/>
+                <w:lang w:val="en-CA"/>
+              </w:rPr>
+              <w:t xml:space="preserve"> </w:t>
+            </w:r>
+            <w:proofErr w:type="spellStart"/>
+            <w:r>
+              <w:rPr>
+                <w:sz w:val="16"/>
+                <w:szCs w:val="18"/>
+                <w:lang w:val="en-CA"/>
+              </w:rPr>
+              <w:t>DraggableModal.tsx</w:t>
+            </w:r>
+            <w:proofErr w:type="spellEnd"/>
           </w:p>
         </w:tc>
         <w:tc>
@@ -2535,14 +2860,14 @@
                 <w:sz w:val="16"/>
                 <w:szCs w:val="18"/>
               </w:rPr>
-              <w:t>Allow ×, -, and ← buttons in modals' header bar to be draggable</w:t>
-            </w:r>
-            <w:r>
-              <w:rPr>
-                <w:sz w:val="16"/>
-                <w:szCs w:val="18"/>
-              </w:rPr>
-              <w:t>: DISABLED #2</w:t>
+              <w:t>execute header action buttons when dragging</w:t>
+            </w:r>
+            <w:r>
+              <w:rPr>
+                <w:sz w:val="16"/>
+                <w:szCs w:val="18"/>
+              </w:rPr>
+              <w:t>: DISABLED</w:t>
             </w:r>
           </w:p>
         </w:tc>
@@ -2565,15 +2890,31 @@
                 <w:szCs w:val="18"/>
                 <w:lang w:val="en-CA"/>
               </w:rPr>
-              <w:t>T</w:t>
-            </w:r>
-            <w:r>
-              <w:rPr>
-                <w:sz w:val="16"/>
-                <w:szCs w:val="18"/>
-                <w:lang w:val="en-CA"/>
-              </w:rPr>
-              <w:t>ry clicking/toggling the dependent setting beneath it “execute header button actions when dragging”</w:t>
+              <w:t>O</w:t>
+            </w:r>
+            <w:r>
+              <w:rPr>
+                <w:sz w:val="16"/>
+                <w:szCs w:val="18"/>
+                <w:lang w:val="en-CA"/>
+              </w:rPr>
+              <w:t>pen a modal, t</w:t>
+            </w:r>
+            <w:r>
+              <w:rPr>
+                <w:sz w:val="16"/>
+                <w:szCs w:val="18"/>
+                <w:lang w:val="en-CA"/>
+              </w:rPr>
+              <w:t xml:space="preserve">ry </w:t>
+            </w:r>
+            <w:r>
+              <w:rPr>
+                <w:sz w:val="16"/>
+                <w:szCs w:val="18"/>
+                <w:lang w:val="en-CA"/>
+              </w:rPr>
+              <w:t>dragging on the x button, - button, or back button</w:t>
             </w:r>
           </w:p>
         </w:tc>
@@ -2596,15 +2937,15 @@
                 <w:szCs w:val="18"/>
                 <w:lang w:val="en-CA"/>
               </w:rPr>
-              <w:t>T</w:t>
-            </w:r>
-            <w:r>
-              <w:rPr>
-                <w:sz w:val="16"/>
-                <w:szCs w:val="18"/>
-                <w:lang w:val="en-CA"/>
-              </w:rPr>
-              <w:t>he switch shouldn’t click</w:t>
+              <w:t>I</w:t>
+            </w:r>
+            <w:r>
+              <w:rPr>
+                <w:sz w:val="16"/>
+                <w:szCs w:val="18"/>
+                <w:lang w:val="en-CA"/>
+              </w:rPr>
+              <w:t>t shouldn’t execute the button you’re dragging</w:t>
             </w:r>
           </w:p>
         </w:tc>
@@ -2669,6 +3010,7 @@
                 <w:lang w:val="en-CA"/>
               </w:rPr>
             </w:pPr>
+            <w:proofErr w:type="spellStart"/>
             <w:r>
               <w:rPr>
                 <w:rFonts w:hint="eastAsia"/>
@@ -2686,6 +3028,25 @@
               </w:rPr>
               <w:t>ettings.tsx</w:t>
             </w:r>
+            <w:proofErr w:type="spellEnd"/>
+            <w:r>
+              <w:rPr>
+                <w:sz w:val="16"/>
+                <w:szCs w:val="18"/>
+                <w:lang w:val="en-CA"/>
+              </w:rPr>
+              <w:t xml:space="preserve">, </w:t>
+            </w:r>
+            <w:proofErr w:type="spellStart"/>
+            <w:r>
+              <w:rPr>
+                <w:sz w:val="16"/>
+                <w:szCs w:val="18"/>
+                <w:lang w:val="en-CA"/>
+              </w:rPr>
+              <w:t>DraggableModal.tsx</w:t>
+            </w:r>
+            <w:proofErr w:type="spellEnd"/>
           </w:p>
         </w:tc>
         <w:tc>
@@ -2715,28 +3076,7 @@
                 <w:szCs w:val="18"/>
                 <w:lang w:val="en-CA"/>
               </w:rPr>
-              <w:t xml:space="preserve">ettings: switches: </w:t>
-            </w:r>
-            <w:r>
-              <w:rPr>
-                <w:sz w:val="16"/>
-                <w:szCs w:val="18"/>
-              </w:rPr>
-              <w:t>Allow ×, -, and ← buttons in modals' header bar to be draggable</w:t>
-            </w:r>
-            <w:r>
-              <w:rPr>
-                <w:sz w:val="16"/>
-                <w:szCs w:val="18"/>
-              </w:rPr>
-              <w:t xml:space="preserve">: </w:t>
-            </w:r>
-            <w:r>
-              <w:rPr>
-                <w:sz w:val="16"/>
-                <w:szCs w:val="18"/>
-              </w:rPr>
-              <w:t>ENABLED</w:t>
+              <w:t>ettings: switches: execute header action buttons when dragging: ENABLED</w:t>
             </w:r>
           </w:p>
         </w:tc>
@@ -2759,6 +3099,37 @@
                 <w:szCs w:val="18"/>
                 <w:lang w:val="en-CA"/>
               </w:rPr>
+              <w:t>O</w:t>
+            </w:r>
+            <w:r>
+              <w:rPr>
+                <w:sz w:val="16"/>
+                <w:szCs w:val="18"/>
+                <w:lang w:val="en-CA"/>
+              </w:rPr>
+              <w:t>pen a modal, try dragging on the x button, - button, or back button</w:t>
+            </w:r>
+          </w:p>
+        </w:tc>
+        <w:tc>
+          <w:tcPr>
+            <w:tcW w:w="3118" w:type="dxa"/>
+          </w:tcPr>
+          <w:p>
+            <w:pPr>
+              <w:rPr>
+                <w:sz w:val="16"/>
+                <w:szCs w:val="18"/>
+                <w:lang w:val="en-CA"/>
+              </w:rPr>
+            </w:pPr>
+            <w:r>
+              <w:rPr>
+                <w:rFonts w:hint="eastAsia"/>
+                <w:sz w:val="16"/>
+                <w:szCs w:val="18"/>
+                <w:lang w:val="en-CA"/>
+              </w:rPr>
               <w:t>T</w:t>
             </w:r>
             <w:r>
@@ -2767,47 +3138,7 @@
                 <w:szCs w:val="18"/>
                 <w:lang w:val="en-CA"/>
               </w:rPr>
-              <w:t>ry dragging the x, -, and back buttons in styles.</w:t>
-            </w:r>
-          </w:p>
-        </w:tc>
-        <w:tc>
-          <w:tcPr>
-            <w:tcW w:w="3118" w:type="dxa"/>
-          </w:tcPr>
-          <w:p>
-            <w:pPr>
-              <w:rPr>
-                <w:rFonts w:hint="eastAsia"/>
-                <w:sz w:val="16"/>
-                <w:szCs w:val="18"/>
-                <w:lang w:val="en-CA"/>
-              </w:rPr>
-            </w:pPr>
-            <w:r>
-              <w:rPr>
-                <w:rFonts w:hint="eastAsia"/>
-                <w:sz w:val="16"/>
-                <w:szCs w:val="18"/>
-                <w:lang w:val="en-CA"/>
-              </w:rPr>
-              <w:t>A</w:t>
-            </w:r>
-            <w:r>
-              <w:rPr>
-                <w:sz w:val="16"/>
-                <w:szCs w:val="18"/>
-                <w:lang w:val="en-CA"/>
-              </w:rPr>
-              <w:t>ll of them should drag</w:t>
-            </w:r>
-            <w:r>
-              <w:rPr>
-                <w:sz w:val="16"/>
-                <w:szCs w:val="18"/>
-                <w:lang w:val="en-CA"/>
-              </w:rPr>
-              <w:t xml:space="preserve"> the modal</w:t>
+              <w:t>he buttons should execute as soon as you release the drag.</w:t>
             </w:r>
           </w:p>
         </w:tc>
@@ -2823,39 +3154,6 @@
                 <w:lang w:val="en-CA"/>
               </w:rPr>
             </w:pPr>
-            <w:r>
-              <w:rPr>
-                <w:rFonts w:hint="eastAsia"/>
-                <w:sz w:val="16"/>
-                <w:szCs w:val="18"/>
-                <w:lang w:val="en-CA"/>
-              </w:rPr>
-              <w:t>W</w:t>
-            </w:r>
-            <w:r>
-              <w:rPr>
-                <w:sz w:val="16"/>
-                <w:szCs w:val="18"/>
-                <w:lang w:val="en-CA"/>
-              </w:rPr>
-              <w:t xml:space="preserve">orking as of </w:t>
-            </w:r>
-            <w:r>
-              <w:rPr>
-                <w:sz w:val="16"/>
-                <w:szCs w:val="18"/>
-                <w:lang w:val="en-CA"/>
-              </w:rPr>
-              <w:t>9577b4626ef83978b054f3200592ec63f9a356f2</w:t>
-            </w:r>
-            <w:r>
-              <w:rPr>
-                <w:sz w:val="16"/>
-                <w:szCs w:val="18"/>
-                <w:lang w:val="en-CA"/>
-              </w:rPr>
-              <w:t>.</w:t>
-            </w:r>
           </w:p>
         </w:tc>
       </w:tr>
@@ -2863,15 +3161,18 @@
         <w:tc>
           <w:tcPr>
             <w:tcW w:w="1667" w:type="dxa"/>
-          </w:tcPr>
-          <w:p>
-            <w:pPr>
-              <w:rPr>
-                <w:sz w:val="16"/>
-                <w:szCs w:val="18"/>
-                <w:lang w:val="en-CA"/>
-              </w:rPr>
-            </w:pPr>
+            <w:shd w:val="clear" w:color="auto" w:fill="D9F2D0" w:themeFill="accent6" w:themeFillTint="33"/>
+          </w:tcPr>
+          <w:p>
+            <w:pPr>
+              <w:rPr>
+                <w:rFonts w:hint="eastAsia"/>
+                <w:sz w:val="16"/>
+                <w:szCs w:val="18"/>
+                <w:lang w:val="en-CA"/>
+              </w:rPr>
+            </w:pPr>
+            <w:proofErr w:type="spellStart"/>
             <w:r>
               <w:rPr>
                 <w:rFonts w:hint="eastAsia"/>
@@ -2889,15 +3190,90 @@
               </w:rPr>
               <w:t>ettings.tsx</w:t>
             </w:r>
+            <w:proofErr w:type="spellEnd"/>
+            <w:r>
+              <w:rPr>
+                <w:sz w:val="16"/>
+                <w:szCs w:val="18"/>
+                <w:lang w:val="en-CA"/>
+              </w:rPr>
+              <w:t xml:space="preserve">, </w:t>
+            </w:r>
+            <w:proofErr w:type="spellStart"/>
+            <w:r>
+              <w:rPr>
+                <w:sz w:val="16"/>
+                <w:szCs w:val="18"/>
+                <w:lang w:val="en-CA"/>
+              </w:rPr>
+              <w:t>draggableModal.tsx</w:t>
+            </w:r>
+            <w:proofErr w:type="spellEnd"/>
+            <w:r>
+              <w:rPr>
+                <w:sz w:val="16"/>
+                <w:szCs w:val="18"/>
+                <w:lang w:val="en-CA"/>
+              </w:rPr>
+              <w:t xml:space="preserve">, </w:t>
+            </w:r>
+            <w:proofErr w:type="spellStart"/>
+            <w:r>
+              <w:rPr>
+                <w:sz w:val="16"/>
+                <w:szCs w:val="18"/>
+                <w:lang w:val="en-CA"/>
+              </w:rPr>
+              <w:t>Toast.tsx</w:t>
+            </w:r>
+            <w:proofErr w:type="spellEnd"/>
+            <w:r>
+              <w:rPr>
+                <w:sz w:val="16"/>
+                <w:szCs w:val="18"/>
+                <w:lang w:val="en-CA"/>
+              </w:rPr>
+              <w:t xml:space="preserve">, </w:t>
+            </w:r>
+            <w:proofErr w:type="spellStart"/>
+            <w:r>
+              <w:rPr>
+                <w:sz w:val="16"/>
+                <w:szCs w:val="18"/>
+                <w:lang w:val="en-CA"/>
+              </w:rPr>
+              <w:t>modalManager.ts</w:t>
+            </w:r>
+            <w:proofErr w:type="spellEnd"/>
+            <w:r>
+              <w:rPr>
+                <w:sz w:val="16"/>
+                <w:szCs w:val="18"/>
+                <w:lang w:val="en-CA"/>
+              </w:rPr>
+              <w:t xml:space="preserve">, </w:t>
+            </w:r>
+            <w:proofErr w:type="spellStart"/>
+            <w:r>
+              <w:rPr>
+                <w:sz w:val="16"/>
+                <w:szCs w:val="18"/>
+                <w:lang w:val="en-CA"/>
+              </w:rPr>
+              <w:t>modalPermissions.ts</w:t>
+            </w:r>
+            <w:proofErr w:type="spellEnd"/>
           </w:p>
         </w:tc>
         <w:tc>
           <w:tcPr>
             <w:tcW w:w="2019" w:type="dxa"/>
-          </w:tcPr>
-          <w:p>
-            <w:pPr>
-              <w:rPr>
+            <w:shd w:val="clear" w:color="auto" w:fill="D9F2D0" w:themeFill="accent6" w:themeFillTint="33"/>
+          </w:tcPr>
+          <w:p>
+            <w:pPr>
+              <w:rPr>
+                <w:rFonts w:hint="eastAsia"/>
                 <w:sz w:val="16"/>
                 <w:szCs w:val="18"/>
                 <w:lang w:val="en-CA"/>
@@ -2918,43 +3294,56 @@
                 <w:szCs w:val="18"/>
                 <w:lang w:val="en-CA"/>
               </w:rPr>
-              <w:t xml:space="preserve">ettings: switches: </w:t>
-            </w:r>
-            <w:r>
-              <w:rPr>
-                <w:sz w:val="16"/>
-                <w:szCs w:val="18"/>
-              </w:rPr>
-              <w:t>Allow ×, -, and ← buttons in modals' header bar to be draggable</w:t>
-            </w:r>
-            <w:r>
-              <w:rPr>
-                <w:sz w:val="16"/>
-                <w:szCs w:val="18"/>
-              </w:rPr>
-              <w:t>: ENABLED</w:t>
-            </w:r>
-            <w:r>
-              <w:rPr>
-                <w:sz w:val="16"/>
-                <w:szCs w:val="18"/>
-              </w:rPr>
-              <w:t xml:space="preserve"> #2</w:t>
+              <w:t>ettings:</w:t>
+            </w:r>
+            <w:r>
+              <w:rPr>
+                <w:sz w:val="16"/>
+                <w:szCs w:val="18"/>
+                <w:lang w:val="en-CA"/>
+              </w:rPr>
+              <w:t xml:space="preserve"> switches</w:t>
+            </w:r>
+            <w:r>
+              <w:rPr>
+                <w:sz w:val="16"/>
+                <w:szCs w:val="18"/>
+                <w:lang w:val="en-CA"/>
+              </w:rPr>
+              <w:t>: allow open multiple menus: DISABLED</w:t>
             </w:r>
           </w:p>
         </w:tc>
         <w:tc>
           <w:tcPr>
             <w:tcW w:w="2410" w:type="dxa"/>
-          </w:tcPr>
-          <w:p>
-            <w:pPr>
-              <w:rPr>
-                <w:sz w:val="16"/>
-                <w:szCs w:val="18"/>
-                <w:lang w:val="en-CA"/>
-              </w:rPr>
-            </w:pPr>
+            <w:shd w:val="clear" w:color="auto" w:fill="D9F2D0" w:themeFill="accent6" w:themeFillTint="33"/>
+          </w:tcPr>
+          <w:p>
+            <w:pPr>
+              <w:rPr>
+                <w:sz w:val="16"/>
+                <w:szCs w:val="18"/>
+                <w:lang w:val="en-CA"/>
+              </w:rPr>
+            </w:pPr>
+            <w:r>
+              <w:rPr>
+                <w:rFonts w:hint="eastAsia"/>
+                <w:sz w:val="16"/>
+                <w:szCs w:val="18"/>
+                <w:lang w:val="en-CA"/>
+              </w:rPr>
+              <w:t>I</w:t>
+            </w:r>
+            <w:r>
+              <w:rPr>
+                <w:sz w:val="16"/>
+                <w:szCs w:val="18"/>
+                <w:lang w:val="en-CA"/>
+              </w:rPr>
+              <w:t xml:space="preserve">n the editor interface with no modals open, try to open the same modal twice. </w:t>
+            </w:r>
             <w:r>
               <w:rPr>
                 <w:rFonts w:hint="eastAsia"/>
@@ -2970,110 +3359,103 @@
                 <w:szCs w:val="18"/>
                 <w:lang w:val="en-CA"/>
               </w:rPr>
-              <w:t>ry clicking on the x, -, and back buttons in styles or settings, any of the components editors, or any other modal.</w:t>
+              <w:t>est this on all modals</w:t>
             </w:r>
           </w:p>
         </w:tc>
         <w:tc>
           <w:tcPr>
             <w:tcW w:w="3118" w:type="dxa"/>
-          </w:tcPr>
-          <w:p>
-            <w:pPr>
-              <w:rPr>
-                <w:sz w:val="16"/>
-                <w:szCs w:val="18"/>
-                <w:lang w:val="en-CA"/>
-              </w:rPr>
-            </w:pPr>
-            <w:r>
-              <w:rPr>
-                <w:rFonts w:hint="eastAsia"/>
-                <w:sz w:val="16"/>
-                <w:szCs w:val="18"/>
-                <w:lang w:val="en-CA"/>
-              </w:rPr>
-              <w:t>I</w:t>
-            </w:r>
-            <w:r>
-              <w:rPr>
-                <w:sz w:val="16"/>
-                <w:szCs w:val="18"/>
-                <w:lang w:val="en-CA"/>
-              </w:rPr>
-              <w:t xml:space="preserve">f you simply click and don’t drag, it should execute the button no matter what. </w:t>
-            </w:r>
-            <w:r>
-              <w:rPr>
-                <w:rFonts w:hint="eastAsia"/>
-                <w:sz w:val="16"/>
-                <w:szCs w:val="18"/>
-                <w:lang w:val="en-CA"/>
-              </w:rPr>
-              <w:t>C</w:t>
-            </w:r>
-            <w:r>
-              <w:rPr>
-                <w:sz w:val="16"/>
-                <w:szCs w:val="18"/>
-                <w:lang w:val="en-CA"/>
-              </w:rPr>
-              <w:t>licking – should minimize, clicking x should close, and clicking the back button should return to the previous page</w:t>
-            </w:r>
-            <w:r>
-              <w:rPr>
-                <w:sz w:val="16"/>
-                <w:szCs w:val="18"/>
-                <w:lang w:val="en-CA"/>
-              </w:rPr>
-              <w:t>.</w:t>
+            <w:shd w:val="clear" w:color="auto" w:fill="D9F2D0" w:themeFill="accent6" w:themeFillTint="33"/>
+          </w:tcPr>
+          <w:p>
+            <w:pPr>
+              <w:rPr>
+                <w:sz w:val="16"/>
+                <w:szCs w:val="18"/>
+                <w:lang w:val="en-CA"/>
+              </w:rPr>
+            </w:pPr>
+            <w:r>
+              <w:rPr>
+                <w:rFonts w:hint="eastAsia"/>
+                <w:sz w:val="16"/>
+                <w:szCs w:val="18"/>
+                <w:lang w:val="en-CA"/>
+              </w:rPr>
+              <w:t>E</w:t>
+            </w:r>
+            <w:r>
+              <w:rPr>
+                <w:sz w:val="16"/>
+                <w:szCs w:val="18"/>
+                <w:lang w:val="en-CA"/>
+              </w:rPr>
+              <w:t>very modal you try to open twice, it should open the first time, then it shouldn’t open the second time, and on the second time it should display a toast saying you can’t open it because open multiple menus is disabled</w:t>
             </w:r>
           </w:p>
         </w:tc>
         <w:tc>
           <w:tcPr>
             <w:tcW w:w="2410" w:type="dxa"/>
-          </w:tcPr>
-          <w:p>
-            <w:pPr>
-              <w:rPr>
-                <w:sz w:val="16"/>
-                <w:szCs w:val="18"/>
-                <w:lang w:val="en-CA"/>
-              </w:rPr>
-            </w:pPr>
-            <w:r>
-              <w:rPr>
-                <w:rFonts w:hint="eastAsia"/>
-                <w:sz w:val="16"/>
-                <w:szCs w:val="18"/>
-                <w:lang w:val="en-CA"/>
-              </w:rPr>
-              <w:t>W</w:t>
-            </w:r>
-            <w:r>
-              <w:rPr>
-                <w:sz w:val="16"/>
-                <w:szCs w:val="18"/>
-                <w:lang w:val="en-CA"/>
-              </w:rPr>
-              <w:t xml:space="preserve">orking as of </w:t>
-            </w:r>
-            <w:r>
-              <w:rPr>
-                <w:sz w:val="16"/>
-                <w:szCs w:val="18"/>
-                <w:lang w:val="en-CA"/>
-              </w:rPr>
-              <w:t>9577b4626ef83978b054f3200592ec63f9a356f2</w:t>
-            </w:r>
-            <w:r>
-              <w:rPr>
-                <w:sz w:val="16"/>
-                <w:szCs w:val="18"/>
-                <w:lang w:val="en-CA"/>
-              </w:rPr>
-              <w:t>.</w:t>
+            <w:shd w:val="clear" w:color="auto" w:fill="D9F2D0" w:themeFill="accent6" w:themeFillTint="33"/>
+          </w:tcPr>
+          <w:p>
+            <w:pPr>
+              <w:rPr>
+                <w:sz w:val="16"/>
+                <w:szCs w:val="18"/>
+                <w:lang w:val="en-CA"/>
+              </w:rPr>
+            </w:pPr>
+            <w:r>
+              <w:rPr>
+                <w:sz w:val="16"/>
+                <w:szCs w:val="18"/>
+                <w:lang w:val="en-CA"/>
+              </w:rPr>
+              <w:t>working</w:t>
+            </w:r>
+            <w:r>
+              <w:rPr>
+                <w:sz w:val="16"/>
+                <w:szCs w:val="18"/>
+                <w:lang w:val="en-CA"/>
+              </w:rPr>
+              <w:t xml:space="preserve"> as of </w:t>
+            </w:r>
+            <w:r>
+              <w:rPr>
+                <w:sz w:val="16"/>
+                <w:szCs w:val="18"/>
+                <w:lang w:val="en-CA"/>
+              </w:rPr>
+              <w:t>1a64fa6d1fcb02eea0da88cea9cb8390ddaf9bc4</w:t>
+            </w:r>
+            <w:r>
+              <w:rPr>
+                <w:sz w:val="16"/>
+                <w:szCs w:val="18"/>
+                <w:lang w:val="en-CA"/>
+              </w:rPr>
+              <w:t xml:space="preserve"> + 1</w:t>
+            </w:r>
+          </w:p>
+          <w:p>
+            <w:pPr>
+              <w:rPr>
+                <w:sz w:val="16"/>
+                <w:szCs w:val="18"/>
+                <w:lang w:val="en-CA"/>
+              </w:rPr>
+            </w:pPr>
+            <w:r>
+              <w:rPr>
+                <w:sz w:val="16"/>
+                <w:szCs w:val="18"/>
+                <w:lang w:val="en-CA"/>
+              </w:rPr>
+              <w:t>I can do this with both the styles page and the settings page</w:t>
             </w:r>
           </w:p>
         </w:tc>
@@ -3082,15 +3464,17 @@
         <w:tc>
           <w:tcPr>
             <w:tcW w:w="1667" w:type="dxa"/>
-          </w:tcPr>
-          <w:p>
-            <w:pPr>
-              <w:rPr>
-                <w:sz w:val="16"/>
-                <w:szCs w:val="18"/>
-                <w:lang w:val="en-CA"/>
-              </w:rPr>
-            </w:pPr>
+            <w:shd w:val="clear" w:color="auto" w:fill="D9F2D0" w:themeFill="accent6" w:themeFillTint="33"/>
+          </w:tcPr>
+          <w:p>
+            <w:pPr>
+              <w:rPr>
+                <w:sz w:val="16"/>
+                <w:szCs w:val="18"/>
+                <w:lang w:val="en-CA"/>
+              </w:rPr>
+            </w:pPr>
+            <w:proofErr w:type="spellStart"/>
             <w:r>
               <w:rPr>
                 <w:rFonts w:hint="eastAsia"/>
@@ -3108,11 +3492,85 @@
               </w:rPr>
               <w:t>ettings.tsx</w:t>
             </w:r>
+            <w:proofErr w:type="spellEnd"/>
+            <w:r>
+              <w:rPr>
+                <w:sz w:val="16"/>
+                <w:szCs w:val="18"/>
+                <w:lang w:val="en-CA"/>
+              </w:rPr>
+              <w:t xml:space="preserve">, </w:t>
+            </w:r>
+            <w:proofErr w:type="spellStart"/>
+            <w:r>
+              <w:rPr>
+                <w:sz w:val="16"/>
+                <w:szCs w:val="18"/>
+                <w:lang w:val="en-CA"/>
+              </w:rPr>
+              <w:t>draggableModal.tsx</w:t>
+            </w:r>
+            <w:proofErr w:type="spellEnd"/>
+            <w:r>
+              <w:rPr>
+                <w:sz w:val="16"/>
+                <w:szCs w:val="18"/>
+                <w:lang w:val="en-CA"/>
+              </w:rPr>
+              <w:t xml:space="preserve">, </w:t>
+            </w:r>
+            <w:proofErr w:type="spellStart"/>
+            <w:r>
+              <w:rPr>
+                <w:sz w:val="16"/>
+                <w:szCs w:val="18"/>
+                <w:lang w:val="en-CA"/>
+              </w:rPr>
+              <w:t>Toast.tsx</w:t>
+            </w:r>
+            <w:proofErr w:type="spellEnd"/>
+            <w:r>
+              <w:rPr>
+                <w:sz w:val="16"/>
+                <w:szCs w:val="18"/>
+                <w:lang w:val="en-CA"/>
+              </w:rPr>
+              <w:t xml:space="preserve">, </w:t>
+            </w:r>
+            <w:proofErr w:type="spellStart"/>
+            <w:r>
+              <w:rPr>
+                <w:sz w:val="16"/>
+                <w:szCs w:val="18"/>
+                <w:lang w:val="en-CA"/>
+              </w:rPr>
+              <w:t>modalManager.ts</w:t>
+            </w:r>
+            <w:proofErr w:type="spellEnd"/>
+            <w:r>
+              <w:rPr>
+                <w:sz w:val="16"/>
+                <w:szCs w:val="18"/>
+                <w:lang w:val="en-CA"/>
+              </w:rPr>
+              <w:t xml:space="preserve">, </w:t>
+            </w:r>
+            <w:proofErr w:type="spellStart"/>
+            <w:r>
+              <w:rPr>
+                <w:sz w:val="16"/>
+                <w:szCs w:val="18"/>
+                <w:lang w:val="en-CA"/>
+              </w:rPr>
+              <w:t>modalPermissions.ts</w:t>
+            </w:r>
+            <w:proofErr w:type="spellEnd"/>
           </w:p>
         </w:tc>
         <w:tc>
           <w:tcPr>
             <w:tcW w:w="2019" w:type="dxa"/>
+            <w:shd w:val="clear" w:color="auto" w:fill="D9F2D0" w:themeFill="accent6" w:themeFillTint="33"/>
           </w:tcPr>
           <w:p>
             <w:pPr>
@@ -3137,96 +3595,134 @@
                 <w:szCs w:val="18"/>
                 <w:lang w:val="en-CA"/>
               </w:rPr>
-              <w:t xml:space="preserve">ettings: switches: </w:t>
-            </w:r>
-            <w:r>
-              <w:rPr>
-                <w:sz w:val="16"/>
-                <w:szCs w:val="18"/>
-              </w:rPr>
-              <w:t>Allow ×, -, and ← buttons in modals' header bar to be draggable</w:t>
-            </w:r>
-            <w:r>
-              <w:rPr>
-                <w:sz w:val="16"/>
-                <w:szCs w:val="18"/>
-              </w:rPr>
-              <w:t>: ENABLED #</w:t>
-            </w:r>
-            <w:r>
-              <w:rPr>
-                <w:sz w:val="16"/>
-                <w:szCs w:val="18"/>
-              </w:rPr>
-              <w:t>3</w:t>
+              <w:t>ettings: switches: allow open multiple menus: DISABLED (#2)</w:t>
             </w:r>
           </w:p>
         </w:tc>
         <w:tc>
           <w:tcPr>
             <w:tcW w:w="2410" w:type="dxa"/>
-          </w:tcPr>
-          <w:p>
-            <w:pPr>
-              <w:rPr>
-                <w:sz w:val="16"/>
-                <w:szCs w:val="18"/>
-                <w:lang w:val="en-CA"/>
-              </w:rPr>
-            </w:pPr>
-            <w:r>
-              <w:rPr>
-                <w:rFonts w:hint="eastAsia"/>
-                <w:sz w:val="16"/>
-                <w:szCs w:val="18"/>
-                <w:lang w:val="en-CA"/>
-              </w:rPr>
-              <w:t>L</w:t>
-            </w:r>
-            <w:r>
-              <w:rPr>
-                <w:sz w:val="16"/>
-                <w:szCs w:val="18"/>
-                <w:lang w:val="en-CA"/>
-              </w:rPr>
-              <w:t>ook at the dependent setting beneath it: “execute header action buttons when dragging”</w:t>
+            <w:shd w:val="clear" w:color="auto" w:fill="D9F2D0" w:themeFill="accent6" w:themeFillTint="33"/>
+          </w:tcPr>
+          <w:p>
+            <w:pPr>
+              <w:rPr>
+                <w:sz w:val="16"/>
+                <w:szCs w:val="18"/>
+                <w:lang w:val="en-CA"/>
+              </w:rPr>
+            </w:pPr>
+            <w:r>
+              <w:rPr>
+                <w:rFonts w:hint="eastAsia"/>
+                <w:sz w:val="16"/>
+                <w:szCs w:val="18"/>
+                <w:lang w:val="en-CA"/>
+              </w:rPr>
+              <w:t>O</w:t>
+            </w:r>
+            <w:r>
+              <w:rPr>
+                <w:sz w:val="16"/>
+                <w:szCs w:val="18"/>
+                <w:lang w:val="en-CA"/>
+              </w:rPr>
+              <w:t xml:space="preserve">pen a modal and then close it again, then reopen </w:t>
+            </w:r>
+            <w:r>
+              <w:rPr>
+                <w:sz w:val="16"/>
+                <w:szCs w:val="18"/>
+                <w:lang w:val="en-CA"/>
+              </w:rPr>
+              <w:t>the same modal again</w:t>
             </w:r>
           </w:p>
         </w:tc>
         <w:tc>
           <w:tcPr>
             <w:tcW w:w="3118" w:type="dxa"/>
-          </w:tcPr>
-          <w:p>
-            <w:pPr>
-              <w:rPr>
-                <w:sz w:val="16"/>
-                <w:szCs w:val="18"/>
-                <w:lang w:val="en-CA"/>
-              </w:rPr>
-            </w:pPr>
-            <w:r>
-              <w:rPr>
-                <w:rFonts w:hint="eastAsia"/>
-                <w:sz w:val="16"/>
-                <w:szCs w:val="18"/>
-                <w:lang w:val="en-CA"/>
-              </w:rPr>
-              <w:t>I</w:t>
-            </w:r>
-            <w:r>
-              <w:rPr>
-                <w:sz w:val="16"/>
-                <w:szCs w:val="18"/>
-                <w:lang w:val="en-CA"/>
-              </w:rPr>
-              <w:t>t shouldn’t be greyed out</w:t>
+            <w:shd w:val="clear" w:color="auto" w:fill="D9F2D0" w:themeFill="accent6" w:themeFillTint="33"/>
+          </w:tcPr>
+          <w:p>
+            <w:pPr>
+              <w:rPr>
+                <w:sz w:val="16"/>
+                <w:szCs w:val="18"/>
+                <w:lang w:val="en-CA"/>
+              </w:rPr>
+            </w:pPr>
+            <w:r>
+              <w:rPr>
+                <w:rFonts w:hint="eastAsia"/>
+                <w:sz w:val="16"/>
+                <w:szCs w:val="18"/>
+                <w:lang w:val="en-CA"/>
+              </w:rPr>
+              <w:t>Y</w:t>
+            </w:r>
+            <w:r>
+              <w:rPr>
+                <w:sz w:val="16"/>
+                <w:szCs w:val="18"/>
+                <w:lang w:val="en-CA"/>
+              </w:rPr>
+              <w:t>ou should be able to reopen</w:t>
+            </w:r>
+            <w:r>
+              <w:rPr>
+                <w:sz w:val="16"/>
+                <w:szCs w:val="18"/>
+                <w:lang w:val="en-CA"/>
+              </w:rPr>
+              <w:t xml:space="preserve"> the same</w:t>
+            </w:r>
+            <w:r>
+              <w:rPr>
+                <w:sz w:val="16"/>
+                <w:szCs w:val="18"/>
+                <w:lang w:val="en-CA"/>
+              </w:rPr>
+              <w:t xml:space="preserve"> modal </w:t>
+            </w:r>
+            <w:r>
+              <w:rPr>
+                <w:sz w:val="16"/>
+                <w:szCs w:val="18"/>
+                <w:lang w:val="en-CA"/>
+              </w:rPr>
+              <w:t xml:space="preserve">after </w:t>
+            </w:r>
+            <w:r>
+              <w:rPr>
+                <w:sz w:val="16"/>
+                <w:szCs w:val="18"/>
+                <w:lang w:val="en-CA"/>
+              </w:rPr>
+              <w:t xml:space="preserve">you’ve closed </w:t>
+            </w:r>
+            <w:r>
+              <w:rPr>
+                <w:sz w:val="16"/>
+                <w:szCs w:val="18"/>
+                <w:lang w:val="en-CA"/>
+              </w:rPr>
+              <w:t xml:space="preserve">that </w:t>
+            </w:r>
+            <w:r>
+              <w:rPr>
+                <w:sz w:val="16"/>
+                <w:szCs w:val="18"/>
+                <w:lang w:val="en-CA"/>
+              </w:rPr>
+              <w:t>modal</w:t>
             </w:r>
           </w:p>
         </w:tc>
         <w:tc>
           <w:tcPr>
             <w:tcW w:w="2410" w:type="dxa"/>
+            <w:shd w:val="clear" w:color="auto" w:fill="D9F2D0" w:themeFill="accent6" w:themeFillTint="33"/>
           </w:tcPr>
           <w:p>
             <w:pPr>
@@ -3259,15 +3755,32 @@
                 <w:szCs w:val="18"/>
                 <w:lang w:val="en-CA"/>
               </w:rPr>
-              <w:t>9577b4626ef83978b054f3200592ec63f9a356f2</w:t>
-            </w:r>
-            <w:r>
-              <w:rPr>
-                <w:sz w:val="16"/>
-                <w:szCs w:val="18"/>
-                <w:lang w:val="en-CA"/>
-              </w:rPr>
-              <w:t>.</w:t>
+              <w:t>72353571f3d02393a601e5c151529df37aea6b30</w:t>
+            </w:r>
+            <w:r>
+              <w:rPr>
+                <w:sz w:val="16"/>
+                <w:szCs w:val="18"/>
+                <w:lang w:val="en-CA"/>
+              </w:rPr>
+              <w:t xml:space="preserve"> + 1</w:t>
+            </w:r>
+          </w:p>
+          <w:p>
+            <w:pPr>
+              <w:rPr>
+                <w:sz w:val="16"/>
+                <w:szCs w:val="18"/>
+                <w:lang w:val="en-CA"/>
+              </w:rPr>
+            </w:pPr>
+            <w:r>
+              <w:rPr>
+                <w:sz w:val="16"/>
+                <w:szCs w:val="18"/>
+                <w:lang w:val="en-CA"/>
+              </w:rPr>
+              <w:t>I can open the same modal and close the same modal and reopen the same modal.</w:t>
             </w:r>
           </w:p>
         </w:tc>
@@ -3276,22 +3789,25 @@
         <w:tc>
           <w:tcPr>
             <w:tcW w:w="1667" w:type="dxa"/>
-          </w:tcPr>
-          <w:p>
-            <w:pPr>
-              <w:rPr>
-                <w:sz w:val="16"/>
-                <w:szCs w:val="18"/>
-                <w:lang w:val="en-CA"/>
-              </w:rPr>
-            </w:pPr>
-            <w:r>
-              <w:rPr>
-                <w:rFonts w:hint="eastAsia"/>
-                <w:sz w:val="16"/>
-                <w:szCs w:val="18"/>
-                <w:lang w:val="en-CA"/>
-              </w:rPr>
+            <w:shd w:val="clear" w:color="auto" w:fill="D9F2D0" w:themeFill="accent6" w:themeFillTint="33"/>
+          </w:tcPr>
+          <w:p>
+            <w:pPr>
+              <w:rPr>
+                <w:sz w:val="16"/>
+                <w:szCs w:val="18"/>
+                <w:lang w:val="en-CA"/>
+              </w:rPr>
+            </w:pPr>
+            <w:proofErr w:type="spellStart"/>
+            <w:r>
+              <w:rPr>
+                <w:rFonts w:hint="eastAsia"/>
+                <w:sz w:val="16"/>
+                <w:szCs w:val="18"/>
+                <w:lang w:val="en-CA"/>
+              </w:rPr>
+              <w:lastRenderedPageBreak/>
               <w:t>S</w:t>
             </w:r>
             <w:r>
@@ -3302,11 +3818,85 @@
               </w:rPr>
               <w:t>ettings.tsx</w:t>
             </w:r>
+            <w:proofErr w:type="spellEnd"/>
+            <w:r>
+              <w:rPr>
+                <w:sz w:val="16"/>
+                <w:szCs w:val="18"/>
+                <w:lang w:val="en-CA"/>
+              </w:rPr>
+              <w:t xml:space="preserve">, </w:t>
+            </w:r>
+            <w:proofErr w:type="spellStart"/>
+            <w:r>
+              <w:rPr>
+                <w:sz w:val="16"/>
+                <w:szCs w:val="18"/>
+                <w:lang w:val="en-CA"/>
+              </w:rPr>
+              <w:t>draggableModal.tsx</w:t>
+            </w:r>
+            <w:proofErr w:type="spellEnd"/>
+            <w:r>
+              <w:rPr>
+                <w:sz w:val="16"/>
+                <w:szCs w:val="18"/>
+                <w:lang w:val="en-CA"/>
+              </w:rPr>
+              <w:t xml:space="preserve">, </w:t>
+            </w:r>
+            <w:proofErr w:type="spellStart"/>
+            <w:r>
+              <w:rPr>
+                <w:sz w:val="16"/>
+                <w:szCs w:val="18"/>
+                <w:lang w:val="en-CA"/>
+              </w:rPr>
+              <w:t>Toast.tsx</w:t>
+            </w:r>
+            <w:proofErr w:type="spellEnd"/>
+            <w:r>
+              <w:rPr>
+                <w:sz w:val="16"/>
+                <w:szCs w:val="18"/>
+                <w:lang w:val="en-CA"/>
+              </w:rPr>
+              <w:t xml:space="preserve">, </w:t>
+            </w:r>
+            <w:proofErr w:type="spellStart"/>
+            <w:r>
+              <w:rPr>
+                <w:sz w:val="16"/>
+                <w:szCs w:val="18"/>
+                <w:lang w:val="en-CA"/>
+              </w:rPr>
+              <w:t>modalManager.ts</w:t>
+            </w:r>
+            <w:proofErr w:type="spellEnd"/>
+            <w:r>
+              <w:rPr>
+                <w:sz w:val="16"/>
+                <w:szCs w:val="18"/>
+                <w:lang w:val="en-CA"/>
+              </w:rPr>
+              <w:t xml:space="preserve">, </w:t>
+            </w:r>
+            <w:proofErr w:type="spellStart"/>
+            <w:r>
+              <w:rPr>
+                <w:sz w:val="16"/>
+                <w:szCs w:val="18"/>
+                <w:lang w:val="en-CA"/>
+              </w:rPr>
+              <w:t>modalPermissions.ts</w:t>
+            </w:r>
+            <w:proofErr w:type="spellEnd"/>
           </w:p>
         </w:tc>
         <w:tc>
           <w:tcPr>
             <w:tcW w:w="2019" w:type="dxa"/>
+            <w:shd w:val="clear" w:color="auto" w:fill="D9F2D0" w:themeFill="accent6" w:themeFillTint="33"/>
           </w:tcPr>
           <w:p>
             <w:pPr>
@@ -3331,104 +3921,82 @@
                 <w:szCs w:val="18"/>
                 <w:lang w:val="en-CA"/>
               </w:rPr>
-              <w:t xml:space="preserve">ettings: switches: </w:t>
-            </w:r>
-            <w:r>
-              <w:rPr>
-                <w:sz w:val="16"/>
-                <w:szCs w:val="18"/>
-              </w:rPr>
-              <w:t xml:space="preserve">Allow ×, -, and ← buttons in modals' header bar to be </w:t>
-            </w:r>
-            <w:r>
-              <w:rPr>
-                <w:sz w:val="16"/>
-                <w:szCs w:val="18"/>
-              </w:rPr>
-              <w:lastRenderedPageBreak/>
-              <w:t>draggable</w:t>
-            </w:r>
-            <w:r>
-              <w:rPr>
-                <w:sz w:val="16"/>
-                <w:szCs w:val="18"/>
-              </w:rPr>
-              <w:t>: ENABLED #3</w:t>
+              <w:t>ettings: switches: allow open multiple menus: DISABLED (#3)</w:t>
             </w:r>
           </w:p>
         </w:tc>
         <w:tc>
           <w:tcPr>
             <w:tcW w:w="2410" w:type="dxa"/>
-          </w:tcPr>
-          <w:p>
-            <w:pPr>
-              <w:rPr>
-                <w:sz w:val="16"/>
-                <w:szCs w:val="18"/>
-                <w:lang w:val="en-CA"/>
-              </w:rPr>
-            </w:pPr>
-            <w:r>
-              <w:rPr>
-                <w:rFonts w:hint="eastAsia"/>
-                <w:sz w:val="16"/>
-                <w:szCs w:val="18"/>
-                <w:lang w:val="en-CA"/>
-              </w:rPr>
-              <w:lastRenderedPageBreak/>
-              <w:t>T</w:t>
-            </w:r>
-            <w:r>
-              <w:rPr>
-                <w:sz w:val="16"/>
-                <w:szCs w:val="18"/>
-                <w:lang w:val="en-CA"/>
-              </w:rPr>
-              <w:t>ry clicking on the dependent setting “execute header action buttons when dragging”</w:t>
+            <w:shd w:val="clear" w:color="auto" w:fill="D9F2D0" w:themeFill="accent6" w:themeFillTint="33"/>
+          </w:tcPr>
+          <w:p>
+            <w:pPr>
+              <w:rPr>
+                <w:sz w:val="16"/>
+                <w:szCs w:val="18"/>
+                <w:lang w:val="en-CA"/>
+              </w:rPr>
+            </w:pPr>
+            <w:r>
+              <w:rPr>
+                <w:rFonts w:hint="eastAsia"/>
+                <w:sz w:val="16"/>
+                <w:szCs w:val="18"/>
+                <w:lang w:val="en-CA"/>
+              </w:rPr>
+              <w:t>O</w:t>
+            </w:r>
+            <w:r>
+              <w:rPr>
+                <w:sz w:val="16"/>
+                <w:szCs w:val="18"/>
+                <w:lang w:val="en-CA"/>
+              </w:rPr>
+              <w:t>pen a modal, then try opening a different modal</w:t>
             </w:r>
           </w:p>
         </w:tc>
         <w:tc>
           <w:tcPr>
             <w:tcW w:w="3118" w:type="dxa"/>
-          </w:tcPr>
-          <w:p>
-            <w:pPr>
-              <w:rPr>
-                <w:sz w:val="16"/>
-                <w:szCs w:val="18"/>
-                <w:lang w:val="en-CA"/>
-              </w:rPr>
-            </w:pPr>
-            <w:r>
-              <w:rPr>
-                <w:rFonts w:hint="eastAsia"/>
-                <w:sz w:val="16"/>
-                <w:szCs w:val="18"/>
-                <w:lang w:val="en-CA"/>
-              </w:rPr>
-              <w:t>T</w:t>
-            </w:r>
-            <w:r>
-              <w:rPr>
-                <w:sz w:val="16"/>
-                <w:szCs w:val="18"/>
-                <w:lang w:val="en-CA"/>
-              </w:rPr>
-              <w:t>he switch should now be clickable</w:t>
+            <w:shd w:val="clear" w:color="auto" w:fill="D9F2D0" w:themeFill="accent6" w:themeFillTint="33"/>
+          </w:tcPr>
+          <w:p>
+            <w:pPr>
+              <w:rPr>
+                <w:sz w:val="16"/>
+                <w:szCs w:val="18"/>
+                <w:lang w:val="en-CA"/>
+              </w:rPr>
+            </w:pPr>
+            <w:r>
+              <w:rPr>
+                <w:rFonts w:hint="eastAsia"/>
+                <w:sz w:val="16"/>
+                <w:szCs w:val="18"/>
+                <w:lang w:val="en-CA"/>
+              </w:rPr>
+              <w:t>Y</w:t>
+            </w:r>
+            <w:r>
+              <w:rPr>
+                <w:sz w:val="16"/>
+                <w:szCs w:val="18"/>
+                <w:lang w:val="en-CA"/>
+              </w:rPr>
+              <w:t>ou shouldn’t be able to open the different modal</w:t>
             </w:r>
           </w:p>
         </w:tc>
         <w:tc>
           <w:tcPr>
             <w:tcW w:w="2410" w:type="dxa"/>
-          </w:tcPr>
-          <w:p>
-            <w:pPr>
-              <w:rPr>
-                <w:sz w:val="16"/>
-                <w:szCs w:val="18"/>
+            <w:shd w:val="clear" w:color="auto" w:fill="D9F2D0" w:themeFill="accent6" w:themeFillTint="33"/>
+          </w:tcPr>
+          <w:p>
+            <w:pPr>
+              <w:rPr>
                 <w:lang w:val="en-CA"/>
               </w:rPr>
             </w:pPr>
@@ -3455,15 +4023,7 @@
                 <w:szCs w:val="18"/>
                 <w:lang w:val="en-CA"/>
               </w:rPr>
-              <w:t>9577b4626ef83978b054f3200592ec63f9a356f2</w:t>
-            </w:r>
-            <w:r>
-              <w:rPr>
-                <w:sz w:val="16"/>
-                <w:szCs w:val="18"/>
-                <w:lang w:val="en-CA"/>
-              </w:rPr>
-              <w:t>.</w:t>
+              <w:t>04759671c4f9a8483bb87745f9cab428b067d1f4</w:t>
             </w:r>
           </w:p>
         </w:tc>
@@ -3482,6 +4042,7 @@
                 <w:lang w:val="en-CA"/>
               </w:rPr>
             </w:pPr>
+            <w:proofErr w:type="spellStart"/>
             <w:r>
               <w:rPr>
                 <w:rFonts w:hint="eastAsia"/>
@@ -3499,14 +4060,7 @@
               </w:rPr>
               <w:t>ettings.tsx</w:t>
             </w:r>
-            <w:r>
-              <w:rPr>
-                <w:sz w:val="16"/>
-                <w:szCs w:val="18"/>
-                <w:lang w:val="en-CA"/>
-              </w:rPr>
-              <w:t>, draggableModal.tsx, Toast.tsx, modalManager.ts, modalPermissions.ts</w:t>
-            </w:r>
+            <w:proofErr w:type="spellEnd"/>
           </w:p>
         </w:tc>
         <w:tc>
@@ -3537,23 +4091,23 @@
                 <w:szCs w:val="18"/>
                 <w:lang w:val="en-CA"/>
               </w:rPr>
-              <w:t>ettings:</w:t>
-            </w:r>
-            <w:r>
-              <w:rPr>
-                <w:sz w:val="16"/>
-                <w:szCs w:val="18"/>
-                <w:lang w:val="en-CA"/>
-              </w:rPr>
-              <w:t xml:space="preserve"> switches</w:t>
-            </w:r>
-            <w:r>
-              <w:rPr>
-                <w:sz w:val="16"/>
-                <w:szCs w:val="18"/>
-                <w:lang w:val="en-CA"/>
-              </w:rPr>
-              <w:t>: allow open multiple menus: DISABLED</w:t>
+              <w:t>ettings: checkboxes: allow open multiple menus: DISABLED (#</w:t>
+            </w:r>
+            <w:r>
+              <w:rPr>
+                <w:sz w:val="16"/>
+                <w:szCs w:val="18"/>
+                <w:lang w:val="en-CA"/>
+              </w:rPr>
+              <w:t>3</w:t>
+            </w:r>
+            <w:r>
+              <w:rPr>
+                <w:sz w:val="16"/>
+                <w:szCs w:val="18"/>
+                <w:lang w:val="en-CA"/>
+              </w:rPr>
+              <w:t>)</w:t>
             </w:r>
           </w:p>
         </w:tc>
@@ -3564,6 +4118,39 @@
           <w:p>
             <w:pPr>
               <w:rPr>
+                <w:rFonts w:hint="eastAsia"/>
+                <w:sz w:val="16"/>
+                <w:szCs w:val="18"/>
+                <w:lang w:val="en-CA"/>
+              </w:rPr>
+            </w:pPr>
+            <w:r>
+              <w:rPr>
+                <w:rFonts w:hint="eastAsia"/>
+                <w:sz w:val="16"/>
+                <w:szCs w:val="18"/>
+                <w:lang w:val="en-CA"/>
+              </w:rPr>
+              <w:t>H</w:t>
+            </w:r>
+            <w:r>
+              <w:rPr>
+                <w:sz w:val="16"/>
+                <w:szCs w:val="18"/>
+                <w:lang w:val="en-CA"/>
+              </w:rPr>
+              <w:t>over on the menu below it “allow open duplicate menus”</w:t>
+            </w:r>
+          </w:p>
+        </w:tc>
+        <w:tc>
+          <w:tcPr>
+            <w:tcW w:w="3118" w:type="dxa"/>
+          </w:tcPr>
+          <w:p>
+            <w:pPr>
+              <w:rPr>
+                <w:rFonts w:hint="eastAsia"/>
                 <w:sz w:val="16"/>
                 <w:szCs w:val="18"/>
                 <w:lang w:val="en-CA"/>
@@ -3584,55 +4171,7 @@
                 <w:szCs w:val="18"/>
                 <w:lang w:val="en-CA"/>
               </w:rPr>
-              <w:t xml:space="preserve">n the editor interface with no modals open, try to open the same modal twice. </w:t>
-            </w:r>
-            <w:r>
-              <w:rPr>
-                <w:rFonts w:hint="eastAsia"/>
-                <w:sz w:val="16"/>
-                <w:szCs w:val="18"/>
-                <w:lang w:val="en-CA"/>
-              </w:rPr>
-              <w:t>T</w:t>
-            </w:r>
-            <w:r>
-              <w:rPr>
-                <w:sz w:val="16"/>
-                <w:szCs w:val="18"/>
-                <w:lang w:val="en-CA"/>
-              </w:rPr>
-              <w:t>est this on all modals</w:t>
-            </w:r>
-          </w:p>
-        </w:tc>
-        <w:tc>
-          <w:tcPr>
-            <w:tcW w:w="3118" w:type="dxa"/>
-          </w:tcPr>
-          <w:p>
-            <w:pPr>
-              <w:rPr>
-                <w:sz w:val="16"/>
-                <w:szCs w:val="18"/>
-                <w:lang w:val="en-CA"/>
-              </w:rPr>
-            </w:pPr>
-            <w:r>
-              <w:rPr>
-                <w:rFonts w:hint="eastAsia"/>
-                <w:sz w:val="16"/>
-                <w:szCs w:val="18"/>
-                <w:lang w:val="en-CA"/>
-              </w:rPr>
-              <w:t>E</w:t>
-            </w:r>
-            <w:r>
-              <w:rPr>
-                <w:sz w:val="16"/>
-                <w:szCs w:val="18"/>
-                <w:lang w:val="en-CA"/>
-              </w:rPr>
-              <w:t>very modal you try to open twice, it should open the first time, then it shouldn’t open the second time, and on the second time it should display a toast saying you can’t open it because open multiple menus is disabled</w:t>
+              <w:t xml:space="preserve">t should change into text “requires “allow open multiple menus” to be enabled” </w:t>
             </w:r>
           </w:p>
         </w:tc>
@@ -3643,102 +4182,44 @@
           <w:p>
             <w:pPr>
               <w:rPr>
-                <w:sz w:val="16"/>
-                <w:szCs w:val="18"/>
-                <w:lang w:val="en-CA"/>
-              </w:rPr>
-            </w:pPr>
-            <w:r>
-              <w:rPr>
-                <w:rFonts w:hint="eastAsia"/>
-                <w:sz w:val="16"/>
-                <w:szCs w:val="18"/>
-                <w:lang w:val="en-CA"/>
-              </w:rPr>
-              <w:t>P</w:t>
-            </w:r>
-            <w:r>
-              <w:rPr>
-                <w:sz w:val="16"/>
-                <w:szCs w:val="18"/>
-                <w:lang w:val="en-CA"/>
-              </w:rPr>
-              <w:t>artially working</w:t>
-            </w:r>
-            <w:r>
-              <w:rPr>
-                <w:sz w:val="16"/>
-                <w:szCs w:val="18"/>
-                <w:lang w:val="en-CA"/>
-              </w:rPr>
-              <w:t xml:space="preserve"> as of </w:t>
-            </w:r>
-            <w:r>
-              <w:rPr>
-                <w:sz w:val="16"/>
-                <w:szCs w:val="18"/>
-                <w:lang w:val="en-CA"/>
-              </w:rPr>
-              <w:t>72353571f3d02393a601e5c151529df37aea6b30</w:t>
-            </w:r>
-            <w:r>
-              <w:rPr>
-                <w:sz w:val="16"/>
-                <w:szCs w:val="18"/>
-                <w:lang w:val="en-CA"/>
-              </w:rPr>
-              <w:t xml:space="preserve"> + 1</w:t>
-            </w:r>
-          </w:p>
-          <w:p>
-            <w:pPr>
-              <w:rPr>
-                <w:sz w:val="16"/>
-                <w:szCs w:val="18"/>
-                <w:lang w:val="en-CA"/>
-              </w:rPr>
-            </w:pPr>
-            <w:r>
-              <w:rPr>
-                <w:sz w:val="16"/>
-                <w:szCs w:val="18"/>
-                <w:lang w:val="en-CA"/>
-              </w:rPr>
-              <w:t xml:space="preserve">I can do this with settings, but I can’t do this with styles. </w:t>
-            </w:r>
-            <w:r>
-              <w:rPr>
-                <w:rFonts w:hint="eastAsia"/>
-                <w:sz w:val="16"/>
-                <w:szCs w:val="18"/>
-                <w:lang w:val="en-CA"/>
-              </w:rPr>
-              <w:t>T</w:t>
-            </w:r>
-            <w:r>
-              <w:rPr>
-                <w:sz w:val="16"/>
-                <w:szCs w:val="18"/>
-                <w:lang w:val="en-CA"/>
-              </w:rPr>
-              <w:t xml:space="preserve">he toast doesn’t pop up for styles. </w:t>
-            </w:r>
-            <w:r>
-              <w:rPr>
-                <w:rFonts w:hint="eastAsia"/>
-                <w:sz w:val="16"/>
-                <w:szCs w:val="18"/>
-                <w:lang w:val="en-CA"/>
-              </w:rPr>
-              <w:t>T</w:t>
-            </w:r>
-            <w:r>
-              <w:rPr>
-                <w:sz w:val="16"/>
-                <w:szCs w:val="18"/>
-                <w:lang w:val="en-CA"/>
-              </w:rPr>
-              <w:t>he styles doesn’t open twice which is good</w:t>
+                <w:rFonts w:hint="eastAsia"/>
+                <w:sz w:val="16"/>
+                <w:szCs w:val="18"/>
+                <w:lang w:val="en-CA"/>
+              </w:rPr>
+            </w:pPr>
+            <w:r>
+              <w:rPr>
+                <w:rFonts w:hint="eastAsia"/>
+                <w:sz w:val="16"/>
+                <w:szCs w:val="18"/>
+                <w:lang w:val="en-CA"/>
+              </w:rPr>
+              <w:t>H</w:t>
+            </w:r>
+            <w:r>
+              <w:rPr>
+                <w:sz w:val="16"/>
+                <w:szCs w:val="18"/>
+                <w:lang w:val="en-CA"/>
+              </w:rPr>
+              <w:t>aven’t implemented the dependent</w:t>
+            </w:r>
+            <w:r>
+              <w:rPr>
+                <w:sz w:val="16"/>
+                <w:szCs w:val="18"/>
+                <w:lang w:val="en-CA"/>
+              </w:rPr>
+              <w:t xml:space="preserve"> switch</w:t>
+            </w:r>
+            <w:r>
+              <w:rPr>
+                <w:sz w:val="16"/>
+                <w:szCs w:val="18"/>
+                <w:lang w:val="en-CA"/>
+              </w:rPr>
+              <w:t xml:space="preserve"> yet</w:t>
             </w:r>
           </w:p>
         </w:tc>
@@ -3751,11 +4232,13 @@
           <w:p>
             <w:pPr>
               <w:rPr>
-                <w:sz w:val="16"/>
-                <w:szCs w:val="18"/>
-                <w:lang w:val="en-CA"/>
-              </w:rPr>
-            </w:pPr>
+                <w:rFonts w:hint="eastAsia"/>
+                <w:sz w:val="16"/>
+                <w:szCs w:val="18"/>
+                <w:lang w:val="en-CA"/>
+              </w:rPr>
+            </w:pPr>
+            <w:proofErr w:type="spellStart"/>
             <w:r>
               <w:rPr>
                 <w:rFonts w:hint="eastAsia"/>
@@ -3771,590 +4254,9 @@
                 <w:szCs w:val="18"/>
                 <w:lang w:val="en-CA"/>
               </w:rPr>
-              <w:t>ettings.tsx, draggableModal.tsx, Toast.tsx, modalManager.ts, modalPermissions.ts</w:t>
-            </w:r>
-          </w:p>
-        </w:tc>
-        <w:tc>
-          <w:tcPr>
-            <w:tcW w:w="2019" w:type="dxa"/>
-          </w:tcPr>
-          <w:p>
-            <w:pPr>
-              <w:rPr>
-                <w:sz w:val="16"/>
-                <w:szCs w:val="18"/>
-                <w:lang w:val="en-CA"/>
-              </w:rPr>
-            </w:pPr>
-            <w:r>
-              <w:rPr>
-                <w:rFonts w:hint="eastAsia"/>
-                <w:sz w:val="16"/>
-                <w:szCs w:val="18"/>
-                <w:lang w:val="en-CA"/>
-              </w:rPr>
-              <w:t>S</w:t>
-            </w:r>
-            <w:r>
-              <w:rPr>
-                <w:sz w:val="16"/>
-                <w:szCs w:val="18"/>
-                <w:lang w:val="en-CA"/>
-              </w:rPr>
-              <w:t>ettings: switches: allow open multiple menus: DISABLED (#2)</w:t>
-            </w:r>
-          </w:p>
-        </w:tc>
-        <w:tc>
-          <w:tcPr>
-            <w:tcW w:w="2410" w:type="dxa"/>
-          </w:tcPr>
-          <w:p>
-            <w:pPr>
-              <w:rPr>
-                <w:sz w:val="16"/>
-                <w:szCs w:val="18"/>
-                <w:lang w:val="en-CA"/>
-              </w:rPr>
-            </w:pPr>
-            <w:r>
-              <w:rPr>
-                <w:rFonts w:hint="eastAsia"/>
-                <w:sz w:val="16"/>
-                <w:szCs w:val="18"/>
-                <w:lang w:val="en-CA"/>
-              </w:rPr>
-              <w:t>O</w:t>
-            </w:r>
-            <w:r>
-              <w:rPr>
-                <w:sz w:val="16"/>
-                <w:szCs w:val="18"/>
-                <w:lang w:val="en-CA"/>
-              </w:rPr>
-              <w:t xml:space="preserve">pen a modal and then close it again, then reopen </w:t>
-            </w:r>
-            <w:r>
-              <w:rPr>
-                <w:sz w:val="16"/>
-                <w:szCs w:val="18"/>
-                <w:lang w:val="en-CA"/>
-              </w:rPr>
-              <w:t>the same modal again</w:t>
-            </w:r>
-          </w:p>
-        </w:tc>
-        <w:tc>
-          <w:tcPr>
-            <w:tcW w:w="3118" w:type="dxa"/>
-          </w:tcPr>
-          <w:p>
-            <w:pPr>
-              <w:rPr>
-                <w:sz w:val="16"/>
-                <w:szCs w:val="18"/>
-                <w:lang w:val="en-CA"/>
-              </w:rPr>
-            </w:pPr>
-            <w:r>
-              <w:rPr>
-                <w:rFonts w:hint="eastAsia"/>
-                <w:sz w:val="16"/>
-                <w:szCs w:val="18"/>
-                <w:lang w:val="en-CA"/>
-              </w:rPr>
-              <w:t>Y</w:t>
-            </w:r>
-            <w:r>
-              <w:rPr>
-                <w:sz w:val="16"/>
-                <w:szCs w:val="18"/>
-                <w:lang w:val="en-CA"/>
-              </w:rPr>
-              <w:t>ou should be able to reopen</w:t>
-            </w:r>
-            <w:r>
-              <w:rPr>
-                <w:sz w:val="16"/>
-                <w:szCs w:val="18"/>
-                <w:lang w:val="en-CA"/>
-              </w:rPr>
-              <w:t xml:space="preserve"> the same</w:t>
-            </w:r>
-            <w:r>
-              <w:rPr>
-                <w:sz w:val="16"/>
-                <w:szCs w:val="18"/>
-                <w:lang w:val="en-CA"/>
-              </w:rPr>
-              <w:t xml:space="preserve"> modal </w:t>
-            </w:r>
-            <w:r>
-              <w:rPr>
-                <w:sz w:val="16"/>
-                <w:szCs w:val="18"/>
-                <w:lang w:val="en-CA"/>
-              </w:rPr>
-              <w:t xml:space="preserve">after </w:t>
-            </w:r>
-            <w:r>
-              <w:rPr>
-                <w:sz w:val="16"/>
-                <w:szCs w:val="18"/>
-                <w:lang w:val="en-CA"/>
-              </w:rPr>
-              <w:t xml:space="preserve">you’ve closed </w:t>
-            </w:r>
-            <w:r>
-              <w:rPr>
-                <w:sz w:val="16"/>
-                <w:szCs w:val="18"/>
-                <w:lang w:val="en-CA"/>
-              </w:rPr>
-              <w:t xml:space="preserve">that </w:t>
-            </w:r>
-            <w:r>
-              <w:rPr>
-                <w:sz w:val="16"/>
-                <w:szCs w:val="18"/>
-                <w:lang w:val="en-CA"/>
-              </w:rPr>
-              <w:t>modal</w:t>
-            </w:r>
-          </w:p>
-        </w:tc>
-        <w:tc>
-          <w:tcPr>
-            <w:tcW w:w="2410" w:type="dxa"/>
-          </w:tcPr>
-          <w:p>
-            <w:pPr>
-              <w:rPr>
-                <w:sz w:val="16"/>
-                <w:szCs w:val="18"/>
-                <w:lang w:val="en-CA"/>
-              </w:rPr>
-            </w:pPr>
-            <w:r>
-              <w:rPr>
-                <w:rFonts w:hint="eastAsia"/>
-                <w:sz w:val="16"/>
-                <w:szCs w:val="18"/>
-                <w:lang w:val="en-CA"/>
-              </w:rPr>
-              <w:t>W</w:t>
-            </w:r>
-            <w:r>
-              <w:rPr>
-                <w:sz w:val="16"/>
-                <w:szCs w:val="18"/>
-                <w:lang w:val="en-CA"/>
-              </w:rPr>
-              <w:t xml:space="preserve">orking as of </w:t>
-            </w:r>
-            <w:r>
-              <w:rPr>
-                <w:sz w:val="16"/>
-                <w:szCs w:val="18"/>
-                <w:lang w:val="en-CA"/>
-              </w:rPr>
-              <w:t>72353571f3d02393a601e5c151529df37aea6b30</w:t>
-            </w:r>
-            <w:r>
-              <w:rPr>
-                <w:sz w:val="16"/>
-                <w:szCs w:val="18"/>
-                <w:lang w:val="en-CA"/>
-              </w:rPr>
-              <w:t xml:space="preserve"> + 1</w:t>
-            </w:r>
-          </w:p>
-          <w:p>
-            <w:pPr>
-              <w:rPr>
-                <w:sz w:val="16"/>
-                <w:szCs w:val="18"/>
-                <w:lang w:val="en-CA"/>
-              </w:rPr>
-            </w:pPr>
-            <w:r>
-              <w:rPr>
-                <w:sz w:val="16"/>
-                <w:szCs w:val="18"/>
-                <w:lang w:val="en-CA"/>
-              </w:rPr>
-              <w:t>I can open the same modal and close the same modal and reopen the same modal.</w:t>
-            </w:r>
-          </w:p>
-        </w:tc>
-      </w:tr>
-      <w:tr>
-        <w:tc>
-          <w:tcPr>
-            <w:tcW w:w="1667" w:type="dxa"/>
-          </w:tcPr>
-          <w:p>
-            <w:pPr>
-              <w:rPr>
-                <w:sz w:val="16"/>
-                <w:szCs w:val="18"/>
-                <w:lang w:val="en-CA"/>
-              </w:rPr>
-            </w:pPr>
-            <w:r>
-              <w:rPr>
-                <w:rFonts w:hint="eastAsia"/>
-                <w:sz w:val="16"/>
-                <w:szCs w:val="18"/>
-                <w:lang w:val="en-CA"/>
-              </w:rPr>
-              <w:t>S</w:t>
-            </w:r>
-            <w:r>
-              <w:rPr>
-                <w:sz w:val="16"/>
-                <w:szCs w:val="18"/>
-                <w:lang w:val="en-CA"/>
-              </w:rPr>
-              <w:t>ettings.tsx, draggableModal.tsx, Toast.tsx, modalManager.ts, modalPermissions.ts</w:t>
-            </w:r>
-          </w:p>
-        </w:tc>
-        <w:tc>
-          <w:tcPr>
-            <w:tcW w:w="2019" w:type="dxa"/>
-          </w:tcPr>
-          <w:p>
-            <w:pPr>
-              <w:rPr>
-                <w:sz w:val="16"/>
-                <w:szCs w:val="18"/>
-                <w:lang w:val="en-CA"/>
-              </w:rPr>
-            </w:pPr>
-            <w:r>
-              <w:rPr>
-                <w:rFonts w:hint="eastAsia"/>
-                <w:sz w:val="16"/>
-                <w:szCs w:val="18"/>
-                <w:lang w:val="en-CA"/>
-              </w:rPr>
-              <w:t>S</w:t>
-            </w:r>
-            <w:r>
-              <w:rPr>
-                <w:sz w:val="16"/>
-                <w:szCs w:val="18"/>
-                <w:lang w:val="en-CA"/>
-              </w:rPr>
-              <w:t>ettings: switches: allow open multiple menus: DISABLED (#3)</w:t>
-            </w:r>
-          </w:p>
-        </w:tc>
-        <w:tc>
-          <w:tcPr>
-            <w:tcW w:w="2410" w:type="dxa"/>
-          </w:tcPr>
-          <w:p>
-            <w:pPr>
-              <w:rPr>
-                <w:sz w:val="16"/>
-                <w:szCs w:val="18"/>
-                <w:lang w:val="en-CA"/>
-              </w:rPr>
-            </w:pPr>
-            <w:r>
-              <w:rPr>
-                <w:rFonts w:hint="eastAsia"/>
-                <w:sz w:val="16"/>
-                <w:szCs w:val="18"/>
-                <w:lang w:val="en-CA"/>
-              </w:rPr>
-              <w:t>O</w:t>
-            </w:r>
-            <w:r>
-              <w:rPr>
-                <w:sz w:val="16"/>
-                <w:szCs w:val="18"/>
-                <w:lang w:val="en-CA"/>
-              </w:rPr>
-              <w:t>pen a modal, then try opening a different modal</w:t>
-            </w:r>
-          </w:p>
-        </w:tc>
-        <w:tc>
-          <w:tcPr>
-            <w:tcW w:w="3118" w:type="dxa"/>
-          </w:tcPr>
-          <w:p>
-            <w:pPr>
-              <w:rPr>
-                <w:sz w:val="16"/>
-                <w:szCs w:val="18"/>
-                <w:lang w:val="en-CA"/>
-              </w:rPr>
-            </w:pPr>
-            <w:r>
-              <w:rPr>
-                <w:rFonts w:hint="eastAsia"/>
-                <w:sz w:val="16"/>
-                <w:szCs w:val="18"/>
-                <w:lang w:val="en-CA"/>
-              </w:rPr>
-              <w:t>Y</w:t>
-            </w:r>
-            <w:r>
-              <w:rPr>
-                <w:sz w:val="16"/>
-                <w:szCs w:val="18"/>
-                <w:lang w:val="en-CA"/>
-              </w:rPr>
-              <w:t>ou shouldn’t be able to open the different modal</w:t>
-            </w:r>
-          </w:p>
-        </w:tc>
-        <w:tc>
-          <w:tcPr>
-            <w:tcW w:w="2410" w:type="dxa"/>
-          </w:tcPr>
-          <w:p>
-            <w:pPr>
-              <w:rPr>
-                <w:rFonts w:hint="eastAsia"/>
-                <w:sz w:val="16"/>
-                <w:szCs w:val="18"/>
-                <w:lang w:val="en-CA"/>
-              </w:rPr>
-            </w:pPr>
-          </w:p>
-        </w:tc>
-      </w:tr>
-      <w:tr>
-        <w:tc>
-          <w:tcPr>
-            <w:tcW w:w="1667" w:type="dxa"/>
-          </w:tcPr>
-          <w:p>
-            <w:pPr>
-              <w:rPr>
-                <w:rFonts w:hint="eastAsia"/>
-                <w:sz w:val="16"/>
-                <w:szCs w:val="18"/>
-                <w:lang w:val="en-CA"/>
-              </w:rPr>
-            </w:pPr>
-            <w:r>
-              <w:rPr>
-                <w:rFonts w:hint="eastAsia"/>
-                <w:sz w:val="16"/>
-                <w:szCs w:val="18"/>
-                <w:lang w:val="en-CA"/>
-              </w:rPr>
-              <w:t>S</w:t>
-            </w:r>
-            <w:r>
-              <w:rPr>
-                <w:sz w:val="16"/>
-                <w:szCs w:val="18"/>
-                <w:lang w:val="en-CA"/>
-              </w:rPr>
               <w:t>ettings.tsx</w:t>
             </w:r>
-          </w:p>
-        </w:tc>
-        <w:tc>
-          <w:tcPr>
-            <w:tcW w:w="2019" w:type="dxa"/>
-          </w:tcPr>
-          <w:p>
-            <w:pPr>
-              <w:rPr>
-                <w:rFonts w:hint="eastAsia"/>
-                <w:sz w:val="16"/>
-                <w:szCs w:val="18"/>
-                <w:lang w:val="en-CA"/>
-              </w:rPr>
-            </w:pPr>
-            <w:r>
-              <w:rPr>
-                <w:rFonts w:hint="eastAsia"/>
-                <w:sz w:val="16"/>
-                <w:szCs w:val="18"/>
-                <w:lang w:val="en-CA"/>
-              </w:rPr>
-              <w:t>S</w:t>
-            </w:r>
-            <w:r>
-              <w:rPr>
-                <w:sz w:val="16"/>
-                <w:szCs w:val="18"/>
-                <w:lang w:val="en-CA"/>
-              </w:rPr>
-              <w:t>ettings: checkboxes: allow open multiple menus: DISABLED (#</w:t>
-            </w:r>
-            <w:r>
-              <w:rPr>
-                <w:sz w:val="16"/>
-                <w:szCs w:val="18"/>
-                <w:lang w:val="en-CA"/>
-              </w:rPr>
-              <w:t>3</w:t>
-            </w:r>
-            <w:r>
-              <w:rPr>
-                <w:sz w:val="16"/>
-                <w:szCs w:val="18"/>
-                <w:lang w:val="en-CA"/>
-              </w:rPr>
-              <w:t>)</w:t>
-            </w:r>
-          </w:p>
-        </w:tc>
-        <w:tc>
-          <w:tcPr>
-            <w:tcW w:w="2410" w:type="dxa"/>
-          </w:tcPr>
-          <w:p>
-            <w:pPr>
-              <w:rPr>
-                <w:rFonts w:hint="eastAsia"/>
-                <w:sz w:val="16"/>
-                <w:szCs w:val="18"/>
-                <w:lang w:val="en-CA"/>
-              </w:rPr>
-            </w:pPr>
-            <w:r>
-              <w:rPr>
-                <w:rFonts w:hint="eastAsia"/>
-                <w:sz w:val="16"/>
-                <w:szCs w:val="18"/>
-                <w:lang w:val="en-CA"/>
-              </w:rPr>
-              <w:t>H</w:t>
-            </w:r>
-            <w:r>
-              <w:rPr>
-                <w:sz w:val="16"/>
-                <w:szCs w:val="18"/>
-                <w:lang w:val="en-CA"/>
-              </w:rPr>
-              <w:t>over on the menu below it “allow open duplicate menus”</w:t>
-            </w:r>
-          </w:p>
-        </w:tc>
-        <w:tc>
-          <w:tcPr>
-            <w:tcW w:w="3118" w:type="dxa"/>
-          </w:tcPr>
-          <w:p>
-            <w:pPr>
-              <w:rPr>
-                <w:rFonts w:hint="eastAsia"/>
-                <w:sz w:val="16"/>
-                <w:szCs w:val="18"/>
-                <w:lang w:val="en-CA"/>
-              </w:rPr>
-            </w:pPr>
-            <w:r>
-              <w:rPr>
-                <w:rFonts w:hint="eastAsia"/>
-                <w:sz w:val="16"/>
-                <w:szCs w:val="18"/>
-                <w:lang w:val="en-CA"/>
-              </w:rPr>
-              <w:t>I</w:t>
-            </w:r>
-            <w:r>
-              <w:rPr>
-                <w:sz w:val="16"/>
-                <w:szCs w:val="18"/>
-                <w:lang w:val="en-CA"/>
-              </w:rPr>
-              <w:t xml:space="preserve">t should change into text “requires “allow open multiple menus” to be enabled” </w:t>
-            </w:r>
-          </w:p>
-        </w:tc>
-        <w:tc>
-          <w:tcPr>
-            <w:tcW w:w="2410" w:type="dxa"/>
-          </w:tcPr>
-          <w:p>
-            <w:pPr>
-              <w:rPr>
-                <w:rFonts w:hint="eastAsia"/>
-                <w:sz w:val="16"/>
-                <w:szCs w:val="18"/>
-                <w:lang w:val="en-CA"/>
-              </w:rPr>
-            </w:pPr>
-            <w:r>
-              <w:rPr>
-                <w:rFonts w:hint="eastAsia"/>
-                <w:sz w:val="16"/>
-                <w:szCs w:val="18"/>
-                <w:lang w:val="en-CA"/>
-              </w:rPr>
-              <w:t>H</w:t>
-            </w:r>
-            <w:r>
-              <w:rPr>
-                <w:sz w:val="16"/>
-                <w:szCs w:val="18"/>
-                <w:lang w:val="en-CA"/>
-              </w:rPr>
-              <w:t>aven’t implemented the dependent</w:t>
-            </w:r>
-            <w:r>
-              <w:rPr>
-                <w:sz w:val="16"/>
-                <w:szCs w:val="18"/>
-                <w:lang w:val="en-CA"/>
-              </w:rPr>
-              <w:t xml:space="preserve"> switch</w:t>
-            </w:r>
-            <w:r>
-              <w:rPr>
-                <w:sz w:val="16"/>
-                <w:szCs w:val="18"/>
-                <w:lang w:val="en-CA"/>
-              </w:rPr>
-              <w:t xml:space="preserve"> yet</w:t>
-            </w:r>
-          </w:p>
-        </w:tc>
-      </w:tr>
-      <w:tr>
-        <w:tc>
-          <w:tcPr>
-            <w:tcW w:w="1667" w:type="dxa"/>
-          </w:tcPr>
-          <w:p>
-            <w:pPr>
-              <w:rPr>
-                <w:rFonts w:hint="eastAsia"/>
-                <w:sz w:val="16"/>
-                <w:szCs w:val="18"/>
-                <w:lang w:val="en-CA"/>
-              </w:rPr>
-            </w:pPr>
-            <w:r>
-              <w:rPr>
-                <w:rFonts w:hint="eastAsia"/>
-                <w:sz w:val="16"/>
-                <w:szCs w:val="18"/>
-                <w:lang w:val="en-CA"/>
-              </w:rPr>
-              <w:t>S</w:t>
-            </w:r>
-            <w:r>
-              <w:rPr>
-                <w:sz w:val="16"/>
-                <w:szCs w:val="18"/>
-                <w:lang w:val="en-CA"/>
-              </w:rPr>
-              <w:t>ettings.tsx</w:t>
-            </w:r>
+            <w:proofErr w:type="spellEnd"/>
           </w:p>
         </w:tc>
         <w:tc>
@@ -4659,6 +4561,7 @@
                 <w:lang w:val="en-CA"/>
               </w:rPr>
             </w:pPr>
+            <w:proofErr w:type="spellStart"/>
             <w:r>
               <w:rPr>
                 <w:rFonts w:hint="eastAsia"/>
@@ -4676,6 +4579,7 @@
               </w:rPr>
               <w:t>ettings.tsx</w:t>
             </w:r>
+            <w:proofErr w:type="spellEnd"/>
           </w:p>
         </w:tc>
         <w:tc>
@@ -4736,7 +4640,25 @@
                 <w:szCs w:val="18"/>
                 <w:lang w:val="en-CA"/>
               </w:rPr>
-              <w:t xml:space="preserve">earch for TAB_NAMES in settings.tsx. change any one of the names in quotation marks. </w:t>
+              <w:t xml:space="preserve">earch for TAB_NAMES in </w:t>
+            </w:r>
+            <w:proofErr w:type="spellStart"/>
+            <w:r>
+              <w:rPr>
+                <w:sz w:val="16"/>
+                <w:szCs w:val="18"/>
+                <w:lang w:val="en-CA"/>
+              </w:rPr>
+              <w:t>settings.tsx</w:t>
+            </w:r>
+            <w:proofErr w:type="spellEnd"/>
+            <w:r>
+              <w:rPr>
+                <w:sz w:val="16"/>
+                <w:szCs w:val="18"/>
+                <w:lang w:val="en-CA"/>
+              </w:rPr>
+              <w:t xml:space="preserve">. change any one of the names in quotation marks. </w:t>
             </w:r>
             <w:r>
               <w:rPr>
@@ -4951,6 +4873,7 @@
                 <w:lang w:val="en-CA"/>
               </w:rPr>
             </w:pPr>
+            <w:proofErr w:type="spellStart"/>
             <w:r>
               <w:rPr>
                 <w:rFonts w:hint="eastAsia"/>
@@ -4966,7 +4889,16 @@
                 <w:szCs w:val="18"/>
                 <w:lang w:val="en-CA"/>
               </w:rPr>
-              <w:t>ettings.tsx, index.css</w:t>
+              <w:t>ettings.tsx</w:t>
+            </w:r>
+            <w:proofErr w:type="spellEnd"/>
+            <w:r>
+              <w:rPr>
+                <w:sz w:val="16"/>
+                <w:szCs w:val="18"/>
+                <w:lang w:val="en-CA"/>
+              </w:rPr>
+              <w:t>, index.css</w:t>
             </w:r>
           </w:p>
         </w:tc>
@@ -5053,16 +4985,7 @@
                 <w:szCs w:val="18"/>
                 <w:lang w:val="en-CA"/>
               </w:rPr>
-              <w:t xml:space="preserve">hen </w:t>
-            </w:r>
-            <w:r>
-              <w:rPr>
-                <w:sz w:val="16"/>
-                <w:szCs w:val="18"/>
-                <w:lang w:val="en-CA"/>
-              </w:rPr>
-              <w:lastRenderedPageBreak/>
-              <w:t>slide the slider to 500ms, try again, 1000ms, try again</w:t>
+              <w:t>hen slide the slider to 500ms, try again, 1000ms, try again</w:t>
             </w:r>
           </w:p>
         </w:tc>
@@ -5090,7 +5013,6 @@
                 <w:szCs w:val="18"/>
                 <w:lang w:val="en-CA"/>
               </w:rPr>
-              <w:lastRenderedPageBreak/>
               <w:t>E</w:t>
             </w:r>
             <w:r>
@@ -5130,16 +5052,7 @@
                 <w:szCs w:val="18"/>
                 <w:lang w:val="en-CA"/>
               </w:rPr>
-              <w:t xml:space="preserve">nsure that the timing is correlated </w:t>
-            </w:r>
-            <w:r>
-              <w:rPr>
-                <w:sz w:val="16"/>
-                <w:szCs w:val="18"/>
-                <w:lang w:val="en-CA"/>
-              </w:rPr>
-              <w:lastRenderedPageBreak/>
-              <w:t>to the slider, so the longer the slider’s set duration time, the longer the transition should feel</w:t>
+              <w:t>nsure that the timing is correlated to the slider, so the longer the slider’s set duration time, the longer the transition should feel</w:t>
             </w:r>
           </w:p>
         </w:tc>
@@ -5162,7 +5075,6 @@
                 <w:szCs w:val="18"/>
                 <w:lang w:val="en-CA"/>
               </w:rPr>
-              <w:lastRenderedPageBreak/>
               <w:t>N</w:t>
             </w:r>
             <w:r>
@@ -5188,16 +5100,7 @@
                 <w:szCs w:val="18"/>
                 <w:lang w:val="en-CA"/>
               </w:rPr>
-              <w:t xml:space="preserve">g the color of the icons in the styles </w:t>
-            </w:r>
-            <w:r>
-              <w:rPr>
-                <w:sz w:val="16"/>
-                <w:szCs w:val="18"/>
-                <w:lang w:val="en-CA"/>
-              </w:rPr>
-              <w:lastRenderedPageBreak/>
-              <w:t>page, whatever that color is</w:t>
+              <w:t>g the color of the icons in the styles page, whatever that color is</w:t>
             </w:r>
           </w:p>
         </w:tc>
@@ -5215,14 +5118,14 @@
                 <w:lang w:val="en-CA"/>
               </w:rPr>
             </w:pPr>
-            <w:r>
-              <w:rPr>
-                <w:rFonts w:hint="eastAsia"/>
-                <w:sz w:val="16"/>
-                <w:szCs w:val="18"/>
-                <w:lang w:val="en-CA"/>
-              </w:rPr>
-              <w:lastRenderedPageBreak/>
+            <w:proofErr w:type="spellStart"/>
+            <w:r>
+              <w:rPr>
+                <w:rFonts w:hint="eastAsia"/>
+                <w:sz w:val="16"/>
+                <w:szCs w:val="18"/>
+                <w:lang w:val="en-CA"/>
+              </w:rPr>
               <w:t>S</w:t>
             </w:r>
             <w:r>
@@ -5233,6 +5136,7 @@
               </w:rPr>
               <w:t>ettings.tsx</w:t>
             </w:r>
+            <w:proofErr w:type="spellEnd"/>
           </w:p>
         </w:tc>
         <w:tc>
@@ -5379,6 +5283,7 @@
                 <w:szCs w:val="18"/>
                 <w:lang w:val="en-CA"/>
               </w:rPr>
+              <w:lastRenderedPageBreak/>
               <w:t>T</w:t>
             </w:r>
             <w:r>
@@ -5427,6 +5332,7 @@
                 <w:szCs w:val="18"/>
                 <w:lang w:val="en-CA"/>
               </w:rPr>
+              <w:lastRenderedPageBreak/>
               <w:t>T</w:t>
             </w:r>
             <w:r>
@@ -5498,6 +5404,7 @@
           <w:lang w:val="en-CA"/>
         </w:rPr>
       </w:pPr>
+      <w:proofErr w:type="spellStart"/>
       <w:r>
         <w:rPr>
           <w:rFonts w:hint="eastAsia"/>
@@ -5519,6 +5426,7 @@
         </w:rPr>
         <w:t>orusMenuEditor.tsx</w:t>
       </w:r>
+      <w:proofErr w:type="spellEnd"/>
     </w:p>
     <w:tbl>
       <w:tblPr>
@@ -5713,6 +5621,7 @@
                 <w:lang w:val="en-CA"/>
               </w:rPr>
             </w:pPr>
+            <w:proofErr w:type="spellStart"/>
             <w:r>
               <w:rPr>
                 <w:rFonts w:hint="eastAsia"/>
@@ -5728,8 +5637,27 @@
                 <w:szCs w:val="18"/>
                 <w:lang w:val="en-CA"/>
               </w:rPr>
-              <w:t>raph.tsx, TorusMenuEditor.tsx</w:t>
-            </w:r>
+              <w:t>raph.tsx</w:t>
+            </w:r>
+            <w:proofErr w:type="spellEnd"/>
+            <w:r>
+              <w:rPr>
+                <w:sz w:val="16"/>
+                <w:szCs w:val="18"/>
+                <w:lang w:val="en-CA"/>
+              </w:rPr>
+              <w:t xml:space="preserve">, </w:t>
+            </w:r>
+            <w:proofErr w:type="spellStart"/>
+            <w:r>
+              <w:rPr>
+                <w:sz w:val="16"/>
+                <w:szCs w:val="18"/>
+                <w:lang w:val="en-CA"/>
+              </w:rPr>
+              <w:t>TorusMenuEditor.tsx</w:t>
+            </w:r>
+            <w:proofErr w:type="spellEnd"/>
           </w:p>
         </w:tc>
         <w:tc>
@@ -5949,7 +5877,25 @@
                 <w:lang w:val="en-CA"/>
               </w:rPr>
               <w:br/>
-              <w:t>although the hitbox for the ease handler is kinda small and super annoying to click, in fact it’s smaller than the area in which your cursor turns into an arrow handle.</w:t>
+              <w:t xml:space="preserve">although the hitbox for the ease handler is </w:t>
+            </w:r>
+            <w:proofErr w:type="spellStart"/>
+            <w:r>
+              <w:rPr>
+                <w:sz w:val="16"/>
+                <w:szCs w:val="18"/>
+                <w:lang w:val="en-CA"/>
+              </w:rPr>
+              <w:t>kinda</w:t>
+            </w:r>
+            <w:proofErr w:type="spellEnd"/>
+            <w:r>
+              <w:rPr>
+                <w:sz w:val="16"/>
+                <w:szCs w:val="18"/>
+                <w:lang w:val="en-CA"/>
+              </w:rPr>
+              <w:t xml:space="preserve"> small and super annoying to click, in fact it’s smaller than the area in which your cursor turns into an arrow handle.</w:t>
             </w:r>
           </w:p>
         </w:tc>
@@ -5968,6 +5914,7 @@
                 <w:lang w:val="en-CA"/>
               </w:rPr>
             </w:pPr>
+            <w:proofErr w:type="spellStart"/>
             <w:r>
               <w:rPr>
                 <w:rFonts w:hint="eastAsia"/>
@@ -5983,8 +5930,27 @@
                 <w:szCs w:val="18"/>
                 <w:lang w:val="en-CA"/>
               </w:rPr>
-              <w:t>raph.tsx, TorusMenuEditor.tsx</w:t>
-            </w:r>
+              <w:t>raph.tsx</w:t>
+            </w:r>
+            <w:proofErr w:type="spellEnd"/>
+            <w:r>
+              <w:rPr>
+                <w:sz w:val="16"/>
+                <w:szCs w:val="18"/>
+                <w:lang w:val="en-CA"/>
+              </w:rPr>
+              <w:t xml:space="preserve">, </w:t>
+            </w:r>
+            <w:proofErr w:type="spellStart"/>
+            <w:r>
+              <w:rPr>
+                <w:sz w:val="16"/>
+                <w:szCs w:val="18"/>
+                <w:lang w:val="en-CA"/>
+              </w:rPr>
+              <w:t>TorusMenuEditor.tsx</w:t>
+            </w:r>
+            <w:proofErr w:type="spellEnd"/>
           </w:p>
         </w:tc>
         <w:tc>
@@ -6155,6 +6121,7 @@
                 <w:lang w:val="en-CA"/>
               </w:rPr>
             </w:pPr>
+            <w:proofErr w:type="spellStart"/>
             <w:r>
               <w:rPr>
                 <w:rFonts w:hint="eastAsia"/>
@@ -6170,8 +6137,27 @@
                 <w:szCs w:val="18"/>
                 <w:lang w:val="en-CA"/>
               </w:rPr>
-              <w:t>raph.tsx, TorusMenuEditor.tsx</w:t>
-            </w:r>
+              <w:t>raph.tsx</w:t>
+            </w:r>
+            <w:proofErr w:type="spellEnd"/>
+            <w:r>
+              <w:rPr>
+                <w:sz w:val="16"/>
+                <w:szCs w:val="18"/>
+                <w:lang w:val="en-CA"/>
+              </w:rPr>
+              <w:t xml:space="preserve">, </w:t>
+            </w:r>
+            <w:proofErr w:type="spellStart"/>
+            <w:r>
+              <w:rPr>
+                <w:sz w:val="16"/>
+                <w:szCs w:val="18"/>
+                <w:lang w:val="en-CA"/>
+              </w:rPr>
+              <w:t>TorusMenuEditor.tsx</w:t>
+            </w:r>
+            <w:proofErr w:type="spellEnd"/>
           </w:p>
         </w:tc>
         <w:tc>
@@ -6367,15 +6353,16 @@
                 <w:lang w:val="en-CA"/>
               </w:rPr>
             </w:pPr>
-            <w:r>
-              <w:rPr>
-                <w:sz w:val="16"/>
-                <w:szCs w:val="18"/>
-                <w:lang w:val="en-CA"/>
-              </w:rPr>
-              <w:lastRenderedPageBreak/>
+            <w:proofErr w:type="spellStart"/>
+            <w:r>
+              <w:rPr>
+                <w:sz w:val="16"/>
+                <w:szCs w:val="18"/>
+                <w:lang w:val="en-CA"/>
+              </w:rPr>
               <w:t>TorusMenuEditor.tsx</w:t>
             </w:r>
+            <w:proofErr w:type="spellEnd"/>
           </w:p>
         </w:tc>
         <w:tc>
@@ -6650,7 +6637,16 @@
                 <w:szCs w:val="18"/>
                 <w:lang w:val="en-CA"/>
               </w:rPr>
-              <w:t>he annular sectors should open anticlockwise fast when the delay slider is set to a small negative value, and they should open slowly when the delay slider is set to a large negative value.</w:t>
+              <w:t xml:space="preserve">he annular sectors should open anticlockwise fast when the delay slider is set to a small negative value, </w:t>
+            </w:r>
+            <w:r>
+              <w:rPr>
+                <w:sz w:val="16"/>
+                <w:szCs w:val="18"/>
+                <w:lang w:val="en-CA"/>
+              </w:rPr>
+              <w:lastRenderedPageBreak/>
+              <w:t>and they should open slowly when the delay slider is set to a large negative value.</w:t>
             </w:r>
           </w:p>
         </w:tc>
@@ -6674,6 +6670,7 @@
                 <w:szCs w:val="18"/>
                 <w:lang w:val="en-CA"/>
               </w:rPr>
+              <w:lastRenderedPageBreak/>
               <w:t>W</w:t>
             </w:r>
             <w:r>
@@ -6709,6 +6706,7 @@
                 <w:lang w:val="en-CA"/>
               </w:rPr>
             </w:pPr>
+            <w:proofErr w:type="spellStart"/>
             <w:r>
               <w:rPr>
                 <w:sz w:val="16"/>
@@ -6717,6 +6715,7 @@
               </w:rPr>
               <w:t>TorusMenuEditor.tsx</w:t>
             </w:r>
+            <w:proofErr w:type="spellEnd"/>
           </w:p>
         </w:tc>
         <w:tc>
@@ -6896,6 +6895,7 @@
                 <w:lang w:val="en-CA"/>
               </w:rPr>
             </w:pPr>
+            <w:proofErr w:type="spellStart"/>
             <w:r>
               <w:rPr>
                 <w:sz w:val="16"/>
@@ -6904,6 +6904,7 @@
               </w:rPr>
               <w:t>TorusMenuEditor.tsx</w:t>
             </w:r>
+            <w:proofErr w:type="spellEnd"/>
           </w:p>
         </w:tc>
         <w:tc>
@@ -7084,6 +7085,7 @@
           <w:lang w:val="en-CA"/>
         </w:rPr>
       </w:pPr>
+      <w:proofErr w:type="spellStart"/>
       <w:r>
         <w:rPr>
           <w:b/>
@@ -7104,6 +7106,7 @@
         </w:rPr>
         <w:t>.tsx</w:t>
       </w:r>
+      <w:proofErr w:type="spellEnd"/>
     </w:p>
     <w:tbl>
       <w:tblPr>
@@ -7303,8 +7306,18 @@
                 <w:szCs w:val="18"/>
                 <w:lang w:val="en-CA"/>
               </w:rPr>
-              <w:t xml:space="preserve"> TorusMenu.tsx</w:t>
-            </w:r>
+              <w:t xml:space="preserve"> </w:t>
+            </w:r>
+            <w:proofErr w:type="spellStart"/>
+            <w:r>
+              <w:rPr>
+                <w:sz w:val="16"/>
+                <w:szCs w:val="18"/>
+                <w:lang w:val="en-CA"/>
+              </w:rPr>
+              <w:t>TorusMenu.tsx</w:t>
+            </w:r>
+            <w:proofErr w:type="spellEnd"/>
           </w:p>
         </w:tc>
         <w:tc>
@@ -7471,6 +7484,7 @@
           <w:lang w:val="en-CA"/>
         </w:rPr>
       </w:pPr>
+      <w:proofErr w:type="spellStart"/>
       <w:r>
         <w:rPr>
           <w:b/>
@@ -7481,6 +7495,7 @@
         </w:rPr>
         <w:t>ColorPicker.tsx</w:t>
       </w:r>
+      <w:proofErr w:type="spellEnd"/>
     </w:p>
     <w:tbl>
       <w:tblPr>
@@ -7675,15 +7690,52 @@
                 <w:lang w:val="en-CA"/>
               </w:rPr>
             </w:pPr>
-            <w:r>
-              <w:rPr>
-                <w:sz w:val="16"/>
-                <w:szCs w:val="18"/>
-                <w:lang w:val="en-CA"/>
-              </w:rPr>
-              <w:lastRenderedPageBreak/>
-              <w:t>ColorPicker.tsx, Styles.tsx, App.tsx</w:t>
-            </w:r>
+            <w:proofErr w:type="spellStart"/>
+            <w:r>
+              <w:rPr>
+                <w:sz w:val="16"/>
+                <w:szCs w:val="18"/>
+                <w:lang w:val="en-CA"/>
+              </w:rPr>
+              <w:t>ColorPicker.tsx</w:t>
+            </w:r>
+            <w:proofErr w:type="spellEnd"/>
+            <w:r>
+              <w:rPr>
+                <w:sz w:val="16"/>
+                <w:szCs w:val="18"/>
+                <w:lang w:val="en-CA"/>
+              </w:rPr>
+              <w:t xml:space="preserve">, </w:t>
+            </w:r>
+            <w:proofErr w:type="spellStart"/>
+            <w:r>
+              <w:rPr>
+                <w:sz w:val="16"/>
+                <w:szCs w:val="18"/>
+                <w:lang w:val="en-CA"/>
+              </w:rPr>
+              <w:t>Styles.tsx</w:t>
+            </w:r>
+            <w:proofErr w:type="spellEnd"/>
+            <w:r>
+              <w:rPr>
+                <w:sz w:val="16"/>
+                <w:szCs w:val="18"/>
+                <w:lang w:val="en-CA"/>
+              </w:rPr>
+              <w:t xml:space="preserve">, </w:t>
+            </w:r>
+            <w:proofErr w:type="spellStart"/>
+            <w:r>
+              <w:rPr>
+                <w:sz w:val="16"/>
+                <w:szCs w:val="18"/>
+                <w:lang w:val="en-CA"/>
+              </w:rPr>
+              <w:t>App.tsx</w:t>
+            </w:r>
+            <w:proofErr w:type="spellEnd"/>
           </w:p>
         </w:tc>
         <w:tc>
@@ -7957,14 +8009,35 @@
                 <w:lang w:val="en-CA"/>
               </w:rPr>
             </w:pPr>
-            <w:r>
-              <w:rPr>
-                <w:sz w:val="16"/>
-                <w:szCs w:val="18"/>
-                <w:lang w:val="en-CA"/>
-              </w:rPr>
-              <w:t>Styles.tsx, App.tsx</w:t>
-            </w:r>
+            <w:proofErr w:type="spellStart"/>
+            <w:r>
+              <w:rPr>
+                <w:sz w:val="16"/>
+                <w:szCs w:val="18"/>
+                <w:lang w:val="en-CA"/>
+              </w:rPr>
+              <w:lastRenderedPageBreak/>
+              <w:t>Styles.tsx</w:t>
+            </w:r>
+            <w:proofErr w:type="spellEnd"/>
+            <w:r>
+              <w:rPr>
+                <w:sz w:val="16"/>
+                <w:szCs w:val="18"/>
+                <w:lang w:val="en-CA"/>
+              </w:rPr>
+              <w:t xml:space="preserve">, </w:t>
+            </w:r>
+            <w:proofErr w:type="spellStart"/>
+            <w:r>
+              <w:rPr>
+                <w:sz w:val="16"/>
+                <w:szCs w:val="18"/>
+                <w:lang w:val="en-CA"/>
+              </w:rPr>
+              <w:t>App.tsx</w:t>
+            </w:r>
+            <w:proofErr w:type="spellEnd"/>
           </w:p>
         </w:tc>
         <w:tc>
@@ -8192,6 +8265,7 @@
                 <w:lang w:val="en-CA"/>
               </w:rPr>
             </w:pPr>
+            <w:proofErr w:type="spellStart"/>
             <w:r>
               <w:rPr>
                 <w:sz w:val="16"/>
@@ -8200,6 +8274,7 @@
               </w:rPr>
               <w:t>ColorPicker.tsx</w:t>
             </w:r>
+            <w:proofErr w:type="spellEnd"/>
           </w:p>
         </w:tc>
         <w:tc>
@@ -8393,6 +8468,7 @@
           <w:lang w:val="en-CA"/>
         </w:rPr>
       </w:pPr>
+      <w:proofErr w:type="spellStart"/>
       <w:r>
         <w:rPr>
           <w:b/>
@@ -8413,6 +8489,7 @@
         </w:rPr>
         <w:t>.tsx</w:t>
       </w:r>
+      <w:proofErr w:type="spellEnd"/>
     </w:p>
     <w:tbl>
       <w:tblPr>
@@ -8606,6 +8683,7 @@
                 <w:lang w:val="en-CA"/>
               </w:rPr>
             </w:pPr>
+            <w:proofErr w:type="spellStart"/>
             <w:r>
               <w:rPr>
                 <w:rFonts w:hint="eastAsia"/>
@@ -8621,8 +8699,27 @@
                 <w:szCs w:val="18"/>
                 <w:lang w:val="en-CA"/>
               </w:rPr>
-              <w:t>pp.tsx, toast.tsx</w:t>
-            </w:r>
+              <w:t>pp.tsx</w:t>
+            </w:r>
+            <w:proofErr w:type="spellEnd"/>
+            <w:r>
+              <w:rPr>
+                <w:sz w:val="16"/>
+                <w:szCs w:val="18"/>
+                <w:lang w:val="en-CA"/>
+              </w:rPr>
+              <w:t xml:space="preserve">, </w:t>
+            </w:r>
+            <w:proofErr w:type="spellStart"/>
+            <w:r>
+              <w:rPr>
+                <w:sz w:val="16"/>
+                <w:szCs w:val="18"/>
+                <w:lang w:val="en-CA"/>
+              </w:rPr>
+              <w:t>toast.tsx</w:t>
+            </w:r>
+            <w:proofErr w:type="spellEnd"/>
           </w:p>
         </w:tc>
         <w:tc>
@@ -8683,7 +8780,25 @@
                 <w:szCs w:val="18"/>
                 <w:lang w:val="en-CA"/>
               </w:rPr>
-              <w:t xml:space="preserve">o into app.tsx wherever there is a toast instantiation. </w:t>
+              <w:t xml:space="preserve">o into </w:t>
+            </w:r>
+            <w:proofErr w:type="spellStart"/>
+            <w:r>
+              <w:rPr>
+                <w:sz w:val="16"/>
+                <w:szCs w:val="18"/>
+                <w:lang w:val="en-CA"/>
+              </w:rPr>
+              <w:t>app.tsx</w:t>
+            </w:r>
+            <w:proofErr w:type="spellEnd"/>
+            <w:r>
+              <w:rPr>
+                <w:sz w:val="16"/>
+                <w:szCs w:val="18"/>
+                <w:lang w:val="en-CA"/>
+              </w:rPr>
+              <w:t xml:space="preserve"> wherever there is a toast instantiation. </w:t>
             </w:r>
             <w:r>
               <w:rPr>
@@ -8898,6 +9013,7 @@
                 <w:lang w:val="en-CA"/>
               </w:rPr>
             </w:pPr>
+            <w:proofErr w:type="spellStart"/>
             <w:r>
               <w:rPr>
                 <w:rFonts w:hint="eastAsia"/>
@@ -8913,8 +9029,27 @@
                 <w:szCs w:val="18"/>
                 <w:lang w:val="en-CA"/>
               </w:rPr>
-              <w:t>pp.tsx, toast.tsx</w:t>
-            </w:r>
+              <w:t>pp.tsx</w:t>
+            </w:r>
+            <w:proofErr w:type="spellEnd"/>
+            <w:r>
+              <w:rPr>
+                <w:sz w:val="16"/>
+                <w:szCs w:val="18"/>
+                <w:lang w:val="en-CA"/>
+              </w:rPr>
+              <w:t xml:space="preserve">, </w:t>
+            </w:r>
+            <w:proofErr w:type="spellStart"/>
+            <w:r>
+              <w:rPr>
+                <w:sz w:val="16"/>
+                <w:szCs w:val="18"/>
+                <w:lang w:val="en-CA"/>
+              </w:rPr>
+              <w:t>toast.tsx</w:t>
+            </w:r>
+            <w:proofErr w:type="spellEnd"/>
           </w:p>
         </w:tc>
         <w:tc>
@@ -8944,16 +9079,7 @@
                 <w:szCs w:val="18"/>
                 <w:lang w:val="en-CA"/>
               </w:rPr>
-              <w:t xml:space="preserve">oast: “open multiple menus is disabled!” </w:t>
-            </w:r>
-            <w:r>
-              <w:rPr>
-                <w:sz w:val="16"/>
-                <w:szCs w:val="18"/>
-                <w:lang w:val="en-CA"/>
-              </w:rPr>
-              <w:lastRenderedPageBreak/>
-              <w:t>toast: correct positioning</w:t>
+              <w:t>oast: “open multiple menus is disabled!” toast: correct positioning</w:t>
             </w:r>
           </w:p>
         </w:tc>
@@ -8976,7 +9102,6 @@
                 <w:szCs w:val="18"/>
                 <w:lang w:val="en-CA"/>
               </w:rPr>
-              <w:lastRenderedPageBreak/>
               <w:t>T</w:t>
             </w:r>
             <w:r>
@@ -8985,16 +9110,7 @@
                 <w:szCs w:val="18"/>
                 <w:lang w:val="en-CA"/>
               </w:rPr>
-              <w:t xml:space="preserve">rigger the “open multiple menus is disabled!” toast by </w:t>
-            </w:r>
-            <w:r>
-              <w:rPr>
-                <w:sz w:val="16"/>
-                <w:szCs w:val="18"/>
-                <w:lang w:val="en-CA"/>
-              </w:rPr>
-              <w:lastRenderedPageBreak/>
-              <w:t xml:space="preserve">turning off allow open multiple menus and attempting to open multiple menus. </w:t>
+              <w:t xml:space="preserve">rigger the “open multiple menus is disabled!” toast by turning off allow open multiple menus and attempting to open multiple menus. </w:t>
             </w:r>
           </w:p>
         </w:tc>
@@ -9018,7 +9134,6 @@
                 <w:szCs w:val="18"/>
                 <w:lang w:val="en-CA"/>
               </w:rPr>
-              <w:lastRenderedPageBreak/>
               <w:t>T</w:t>
             </w:r>
             <w:r>
@@ -9027,16 +9142,7 @@
                 <w:szCs w:val="18"/>
                 <w:lang w:val="en-CA"/>
               </w:rPr>
-              <w:t xml:space="preserve">he toast should appear adjacent to the icon/button, and the arrow should be </w:t>
-            </w:r>
-            <w:r>
-              <w:rPr>
-                <w:sz w:val="16"/>
-                <w:szCs w:val="18"/>
-                <w:lang w:val="en-CA"/>
-              </w:rPr>
-              <w:lastRenderedPageBreak/>
-              <w:t>pointing at it</w:t>
+              <w:t>he toast should appear adjacent to the icon/button, and the arrow should be pointing at it</w:t>
             </w:r>
           </w:p>
         </w:tc>
@@ -9059,7 +9165,6 @@
                 <w:szCs w:val="18"/>
                 <w:lang w:val="en-CA"/>
               </w:rPr>
-              <w:lastRenderedPageBreak/>
               <w:t>N</w:t>
             </w:r>
             <w:r>
@@ -9076,16 +9181,7 @@
                 <w:szCs w:val="18"/>
                 <w:lang w:val="en-CA"/>
               </w:rPr>
-              <w:t>72353571f3d02393a601e5c151</w:t>
-            </w:r>
-            <w:r>
-              <w:rPr>
-                <w:sz w:val="16"/>
-                <w:szCs w:val="18"/>
-                <w:lang w:val="en-CA"/>
-              </w:rPr>
-              <w:lastRenderedPageBreak/>
-              <w:t>529df37aea6b30</w:t>
+              <w:t>72353571f3d02393a601e5c151529df37aea6b30</w:t>
             </w:r>
             <w:r>
               <w:rPr>
@@ -9127,6 +9223,7 @@
           <w:lang w:val="en-CA"/>
         </w:rPr>
       </w:pPr>
+      <w:proofErr w:type="spellStart"/>
       <w:r>
         <w:rPr>
           <w:b/>
@@ -9135,9 +9232,9 @@
           <w:szCs w:val="32"/>
           <w:lang w:val="en-CA"/>
         </w:rPr>
-        <w:lastRenderedPageBreak/>
         <w:t>PlayneedleEditor.tsx</w:t>
       </w:r>
+      <w:proofErr w:type="spellEnd"/>
     </w:p>
     <w:tbl>
       <w:tblPr>
@@ -9331,6 +9428,7 @@
                 <w:lang w:val="en-CA"/>
               </w:rPr>
             </w:pPr>
+            <w:proofErr w:type="spellStart"/>
             <w:r>
               <w:rPr>
                 <w:sz w:val="16"/>
@@ -9339,6 +9437,7 @@
               </w:rPr>
               <w:t>PlayneedleEditor.tsx</w:t>
             </w:r>
+            <w:proofErr w:type="spellEnd"/>
           </w:p>
         </w:tc>
         <w:tc>
@@ -9368,7 +9467,25 @@
                 <w:szCs w:val="18"/>
                 <w:lang w:val="en-CA"/>
               </w:rPr>
-              <w:t>ettings: components: playneedle editor: width slider</w:t>
+              <w:t xml:space="preserve">ettings: components: </w:t>
+            </w:r>
+            <w:proofErr w:type="spellStart"/>
+            <w:r>
+              <w:rPr>
+                <w:sz w:val="16"/>
+                <w:szCs w:val="18"/>
+                <w:lang w:val="en-CA"/>
+              </w:rPr>
+              <w:t>playneedle</w:t>
+            </w:r>
+            <w:proofErr w:type="spellEnd"/>
+            <w:r>
+              <w:rPr>
+                <w:sz w:val="16"/>
+                <w:szCs w:val="18"/>
+                <w:lang w:val="en-CA"/>
+              </w:rPr>
+              <w:t xml:space="preserve"> editor: width slider</w:t>
             </w:r>
           </w:p>
         </w:tc>
@@ -9399,7 +9516,43 @@
                 <w:szCs w:val="18"/>
                 <w:lang w:val="en-CA"/>
               </w:rPr>
-              <w:t>hange the playneedle width (px) slider</w:t>
+              <w:t xml:space="preserve">hange the </w:t>
+            </w:r>
+            <w:proofErr w:type="spellStart"/>
+            <w:r>
+              <w:rPr>
+                <w:sz w:val="16"/>
+                <w:szCs w:val="18"/>
+                <w:lang w:val="en-CA"/>
+              </w:rPr>
+              <w:t>playneedle</w:t>
+            </w:r>
+            <w:proofErr w:type="spellEnd"/>
+            <w:r>
+              <w:rPr>
+                <w:sz w:val="16"/>
+                <w:szCs w:val="18"/>
+                <w:lang w:val="en-CA"/>
+              </w:rPr>
+              <w:t xml:space="preserve"> width (</w:t>
+            </w:r>
+            <w:proofErr w:type="spellStart"/>
+            <w:r>
+              <w:rPr>
+                <w:sz w:val="16"/>
+                <w:szCs w:val="18"/>
+                <w:lang w:val="en-CA"/>
+              </w:rPr>
+              <w:t>px</w:t>
+            </w:r>
+            <w:proofErr w:type="spellEnd"/>
+            <w:r>
+              <w:rPr>
+                <w:sz w:val="16"/>
+                <w:szCs w:val="18"/>
+                <w:lang w:val="en-CA"/>
+              </w:rPr>
+              <w:t>) slider</w:t>
             </w:r>
           </w:p>
         </w:tc>
@@ -9430,7 +9583,25 @@
                 <w:szCs w:val="18"/>
                 <w:lang w:val="en-CA"/>
               </w:rPr>
-              <w:t>t should change the width of the playneedle both inside the editor and in the timeline.</w:t>
+              <w:t xml:space="preserve">t should change the width of the </w:t>
+            </w:r>
+            <w:proofErr w:type="spellStart"/>
+            <w:r>
+              <w:rPr>
+                <w:sz w:val="16"/>
+                <w:szCs w:val="18"/>
+                <w:lang w:val="en-CA"/>
+              </w:rPr>
+              <w:t>playneedle</w:t>
+            </w:r>
+            <w:proofErr w:type="spellEnd"/>
+            <w:r>
+              <w:rPr>
+                <w:sz w:val="16"/>
+                <w:szCs w:val="18"/>
+                <w:lang w:val="en-CA"/>
+              </w:rPr>
+              <w:t xml:space="preserve"> both inside the editor and in the timeline.</w:t>
             </w:r>
           </w:p>
         </w:tc>
@@ -9499,6 +9670,7 @@
           <w:lang w:val="en-CA"/>
         </w:rPr>
       </w:pPr>
+      <w:proofErr w:type="spellStart"/>
       <w:r>
         <w:rPr>
           <w:b/>
@@ -9519,6 +9691,7 @@
         </w:rPr>
         <w:t>.ts</w:t>
       </w:r>
+      <w:proofErr w:type="spellEnd"/>
       <w:r>
         <w:rPr>
           <w:b/>
@@ -9527,8 +9700,20 @@
           <w:szCs w:val="32"/>
           <w:lang w:val="en-CA"/>
         </w:rPr>
-        <w:t xml:space="preserve"> &amp; modalPermissions.ts</w:t>
+        <w:t xml:space="preserve"> &amp; </w:t>
       </w:r>
+      <w:proofErr w:type="spellStart"/>
+      <w:r>
+        <w:rPr>
+          <w:b/>
+          <w:bCs/>
+          <w:sz w:val="28"/>
+          <w:szCs w:val="32"/>
+          <w:lang w:val="en-CA"/>
+        </w:rPr>
+        <w:t>modalPermissions.ts</w:t>
+      </w:r>
+      <w:proofErr w:type="spellEnd"/>
     </w:p>
     <w:p>
       <w:pPr>

</xml_diff>

<commit_message>
fixed TEST_PLAN: Settings: switches: Allow ×, -, and ← buttons in modals' header bar to be draggable: ENABLED/DISABLED (you can click header buttons and it'll work regardless of the setting enabled or disabled)
</commit_message>
<xml_diff>
--- a/test plan.docx
+++ b/test plan.docx
@@ -910,7 +910,25 @@
                 <w:szCs w:val="18"/>
                 <w:lang w:val="en-CA"/>
               </w:rPr>
-              <w:t xml:space="preserve"> box is selected or that you have to click away to apply the </w:t>
+              <w:t xml:space="preserve"> box is selected or that you </w:t>
+            </w:r>
+            <w:proofErr w:type="gramStart"/>
+            <w:r>
+              <w:rPr>
+                <w:sz w:val="16"/>
+                <w:szCs w:val="18"/>
+                <w:lang w:val="en-CA"/>
+              </w:rPr>
+              <w:t>have to</w:t>
+            </w:r>
+            <w:proofErr w:type="gramEnd"/>
+            <w:r>
+              <w:rPr>
+                <w:sz w:val="16"/>
+                <w:szCs w:val="18"/>
+                <w:lang w:val="en-CA"/>
+              </w:rPr>
+              <w:t xml:space="preserve"> click away to apply the </w:t>
             </w:r>
             <w:proofErr w:type="spellStart"/>
             <w:r>
@@ -2153,6 +2171,7 @@
         <w:tc>
           <w:tcPr>
             <w:tcW w:w="1667" w:type="dxa"/>
+            <w:shd w:val="clear" w:color="auto" w:fill="D9F2D0" w:themeFill="accent6" w:themeFillTint="33"/>
           </w:tcPr>
           <w:p>
             <w:pPr>
@@ -2204,6 +2223,7 @@
         <w:tc>
           <w:tcPr>
             <w:tcW w:w="2019" w:type="dxa"/>
+            <w:shd w:val="clear" w:color="auto" w:fill="D9F2D0" w:themeFill="accent6" w:themeFillTint="33"/>
           </w:tcPr>
           <w:p>
             <w:pPr>
@@ -2249,6 +2269,7 @@
         <w:tc>
           <w:tcPr>
             <w:tcW w:w="2410" w:type="dxa"/>
+            <w:shd w:val="clear" w:color="auto" w:fill="D9F2D0" w:themeFill="accent6" w:themeFillTint="33"/>
           </w:tcPr>
           <w:p>
             <w:pPr>
@@ -2275,6 +2296,7 @@
               </w:rPr>
               <w:t xml:space="preserve">pen a modal, </w:t>
             </w:r>
+            <w:proofErr w:type="gramStart"/>
             <w:r>
               <w:rPr>
                 <w:rFonts w:hint="eastAsia"/>
@@ -2290,13 +2312,23 @@
                 <w:szCs w:val="18"/>
                 <w:lang w:val="en-CA"/>
               </w:rPr>
-              <w:t>ry dragging the x button, - button, and back button.</w:t>
+              <w:t>ry</w:t>
+            </w:r>
+            <w:proofErr w:type="gramEnd"/>
+            <w:r>
+              <w:rPr>
+                <w:sz w:val="16"/>
+                <w:szCs w:val="18"/>
+                <w:lang w:val="en-CA"/>
+              </w:rPr>
+              <w:t xml:space="preserve"> dragging the x button, - button, and back button.</w:t>
             </w:r>
           </w:p>
         </w:tc>
         <w:tc>
           <w:tcPr>
             <w:tcW w:w="3118" w:type="dxa"/>
+            <w:shd w:val="clear" w:color="auto" w:fill="D9F2D0" w:themeFill="accent6" w:themeFillTint="33"/>
           </w:tcPr>
           <w:p>
             <w:pPr>
@@ -2328,6 +2360,7 @@
         <w:tc>
           <w:tcPr>
             <w:tcW w:w="2410" w:type="dxa"/>
+            <w:shd w:val="clear" w:color="auto" w:fill="D9F2D0" w:themeFill="accent6" w:themeFillTint="33"/>
           </w:tcPr>
           <w:p>
             <w:pPr>
@@ -2369,6 +2402,7 @@
         <w:tc>
           <w:tcPr>
             <w:tcW w:w="1667" w:type="dxa"/>
+            <w:shd w:val="clear" w:color="auto" w:fill="D9F2D0" w:themeFill="accent6" w:themeFillTint="33"/>
           </w:tcPr>
           <w:p>
             <w:pPr>
@@ -2420,6 +2454,7 @@
         <w:tc>
           <w:tcPr>
             <w:tcW w:w="2019" w:type="dxa"/>
+            <w:shd w:val="clear" w:color="auto" w:fill="D9F2D0" w:themeFill="accent6" w:themeFillTint="33"/>
           </w:tcPr>
           <w:p>
             <w:pPr>
@@ -2473,6 +2508,7 @@
         <w:tc>
           <w:tcPr>
             <w:tcW w:w="2410" w:type="dxa"/>
+            <w:shd w:val="clear" w:color="auto" w:fill="D9F2D0" w:themeFill="accent6" w:themeFillTint="33"/>
           </w:tcPr>
           <w:p>
             <w:pPr>
@@ -2512,6 +2548,7 @@
         <w:tc>
           <w:tcPr>
             <w:tcW w:w="3118" w:type="dxa"/>
+            <w:shd w:val="clear" w:color="auto" w:fill="D9F2D0" w:themeFill="accent6" w:themeFillTint="33"/>
           </w:tcPr>
           <w:p>
             <w:pPr>
@@ -2543,6 +2580,7 @@
         <w:tc>
           <w:tcPr>
             <w:tcW w:w="2410" w:type="dxa"/>
+            <w:shd w:val="clear" w:color="auto" w:fill="D9F2D0" w:themeFill="accent6" w:themeFillTint="33"/>
           </w:tcPr>
           <w:p>
             <w:pPr>
@@ -2707,6 +2745,7 @@
               </w:rPr>
               <w:t xml:space="preserve">pen a modal, </w:t>
             </w:r>
+            <w:proofErr w:type="gramStart"/>
             <w:r>
               <w:rPr>
                 <w:rFonts w:hint="eastAsia"/>
@@ -2722,7 +2761,16 @@
                 <w:szCs w:val="18"/>
                 <w:lang w:val="en-CA"/>
               </w:rPr>
-              <w:t>ry clicking on the x button, - button, or back button</w:t>
+              <w:t>ry</w:t>
+            </w:r>
+            <w:proofErr w:type="gramEnd"/>
+            <w:r>
+              <w:rPr>
+                <w:sz w:val="16"/>
+                <w:szCs w:val="18"/>
+                <w:lang w:val="en-CA"/>
+              </w:rPr>
+              <w:t xml:space="preserve"> clicking on the x button, - button, or back button</w:t>
             </w:r>
           </w:p>
         </w:tc>
@@ -2764,12 +2812,45 @@
           <w:p>
             <w:pPr>
               <w:rPr>
-                <w:rFonts w:hint="eastAsia"/>
-                <w:sz w:val="16"/>
-                <w:szCs w:val="18"/>
-                <w:lang w:val="en-CA"/>
-              </w:rPr>
-            </w:pPr>
+                <w:sz w:val="16"/>
+                <w:szCs w:val="18"/>
+                <w:lang w:val="en-CA"/>
+              </w:rPr>
+            </w:pPr>
+            <w:r>
+              <w:rPr>
+                <w:rFonts w:hint="eastAsia"/>
+                <w:sz w:val="16"/>
+                <w:szCs w:val="18"/>
+                <w:lang w:val="en-CA"/>
+              </w:rPr>
+              <w:t>N</w:t>
+            </w:r>
+            <w:r>
+              <w:rPr>
+                <w:sz w:val="16"/>
+                <w:szCs w:val="18"/>
+                <w:lang w:val="en-CA"/>
+              </w:rPr>
+              <w:t xml:space="preserve">ot working. </w:t>
+            </w:r>
+            <w:r>
+              <w:rPr>
+                <w:rFonts w:hint="eastAsia"/>
+                <w:sz w:val="16"/>
+                <w:szCs w:val="18"/>
+                <w:lang w:val="en-CA"/>
+              </w:rPr>
+              <w:t>C</w:t>
+            </w:r>
+            <w:r>
+              <w:rPr>
+                <w:sz w:val="16"/>
+                <w:szCs w:val="18"/>
+                <w:lang w:val="en-CA"/>
+              </w:rPr>
+              <w:t>licking does not close the modal.</w:t>
+            </w:r>
           </w:p>
         </w:tc>
       </w:tr>
@@ -2915,6 +2996,14 @@
                 <w:lang w:val="en-CA"/>
               </w:rPr>
               <w:t>dragging on the x button, - button, or back button</w:t>
+            </w:r>
+            <w:r>
+              <w:rPr>
+                <w:sz w:val="16"/>
+                <w:szCs w:val="18"/>
+                <w:lang w:val="en-CA"/>
+              </w:rPr>
+              <w:t xml:space="preserve">. </w:t>
             </w:r>
           </w:p>
         </w:tc>
@@ -5214,7 +5303,25 @@
                 <w:szCs w:val="18"/>
                 <w:lang w:val="en-CA"/>
               </w:rPr>
-              <w:t>gh let me just screenshot it real quick)</w:t>
+              <w:t xml:space="preserve">gh let me just screenshot it </w:t>
+            </w:r>
+            <w:proofErr w:type="gramStart"/>
+            <w:r>
+              <w:rPr>
+                <w:sz w:val="16"/>
+                <w:szCs w:val="18"/>
+                <w:lang w:val="en-CA"/>
+              </w:rPr>
+              <w:t>real</w:t>
+            </w:r>
+            <w:proofErr w:type="gramEnd"/>
+            <w:r>
+              <w:rPr>
+                <w:sz w:val="16"/>
+                <w:szCs w:val="18"/>
+                <w:lang w:val="en-CA"/>
+              </w:rPr>
+              <w:t xml:space="preserve"> quick)</w:t>
             </w:r>
           </w:p>
           <w:p>
@@ -6975,7 +7082,25 @@
                 <w:szCs w:val="18"/>
                 <w:lang w:val="en-CA"/>
               </w:rPr>
-              <w:t xml:space="preserve">dd a bunch of anchor points and adjust all of the ease handles to a non-default or non-linear position. </w:t>
+              <w:t xml:space="preserve">dd a bunch of anchor points and adjust </w:t>
+            </w:r>
+            <w:proofErr w:type="gramStart"/>
+            <w:r>
+              <w:rPr>
+                <w:sz w:val="16"/>
+                <w:szCs w:val="18"/>
+                <w:lang w:val="en-CA"/>
+              </w:rPr>
+              <w:t>all of</w:t>
+            </w:r>
+            <w:proofErr w:type="gramEnd"/>
+            <w:r>
+              <w:rPr>
+                <w:sz w:val="16"/>
+                <w:szCs w:val="18"/>
+                <w:lang w:val="en-CA"/>
+              </w:rPr>
+              <w:t xml:space="preserve"> the ease handles to a non-default or non-linear position. </w:t>
             </w:r>
             <w:r>
               <w:rPr>
@@ -7386,7 +7511,25 @@
                 <w:szCs w:val="18"/>
                 <w:lang w:val="en-CA"/>
               </w:rPr>
-              <w:t>hen, on a 45 degree angle right outside the circle, click.</w:t>
+              <w:t xml:space="preserve">hen, on a </w:t>
+            </w:r>
+            <w:proofErr w:type="gramStart"/>
+            <w:r>
+              <w:rPr>
+                <w:sz w:val="16"/>
+                <w:szCs w:val="18"/>
+                <w:lang w:val="en-CA"/>
+              </w:rPr>
+              <w:t>45 degree</w:t>
+            </w:r>
+            <w:proofErr w:type="gramEnd"/>
+            <w:r>
+              <w:rPr>
+                <w:sz w:val="16"/>
+                <w:szCs w:val="18"/>
+                <w:lang w:val="en-CA"/>
+              </w:rPr>
+              <w:t xml:space="preserve"> angle right outside the circle, click.</w:t>
             </w:r>
           </w:p>
         </w:tc>
@@ -9110,7 +9253,25 @@
                 <w:szCs w:val="18"/>
                 <w:lang w:val="en-CA"/>
               </w:rPr>
-              <w:t xml:space="preserve">rigger the “open multiple menus is disabled!” toast by turning off allow open multiple menus and attempting to open multiple menus. </w:t>
+              <w:t xml:space="preserve">rigger the “open multiple menus </w:t>
+            </w:r>
+            <w:proofErr w:type="gramStart"/>
+            <w:r>
+              <w:rPr>
+                <w:sz w:val="16"/>
+                <w:szCs w:val="18"/>
+                <w:lang w:val="en-CA"/>
+              </w:rPr>
+              <w:t>is</w:t>
+            </w:r>
+            <w:proofErr w:type="gramEnd"/>
+            <w:r>
+              <w:rPr>
+                <w:sz w:val="16"/>
+                <w:szCs w:val="18"/>
+                <w:lang w:val="en-CA"/>
+              </w:rPr>
+              <w:t xml:space="preserve"> disabled!” toast by turning off allow open multiple menus and attempting to open multiple menus. </w:t>
             </w:r>
           </w:p>
         </w:tc>

</xml_diff>

<commit_message>
fixed TEST_PLAN: DraggableModal: remember the page state next time you open it (#1: settings): settings now remembers the previous tab you were on before you closed it
</commit_message>
<xml_diff>
--- a/test plan.docx
+++ b/test plan.docx
@@ -460,6 +460,597 @@
         <w:t>pp.tsx</w:t>
       </w:r>
     </w:p>
+    <w:tbl>
+      <w:tblPr>
+        <w:tblStyle w:val="ae"/>
+        <w:tblW w:w="11624" w:type="dxa"/>
+        <w:tblInd w:w="-1706" w:type="dxa"/>
+        <w:tblLayout w:type="fixed"/>
+        <w:tblLook w:val="04A0" w:firstRow="1" w:lastRow="0" w:firstColumn="1" w:lastColumn="0" w:noHBand="0" w:noVBand="1"/>
+      </w:tblPr>
+      <w:tblGrid>
+        <w:gridCol w:w="1843"/>
+        <w:gridCol w:w="1843"/>
+        <w:gridCol w:w="2410"/>
+        <w:gridCol w:w="3118"/>
+        <w:gridCol w:w="2410"/>
+      </w:tblGrid>
+      <w:tr>
+        <w:tc>
+          <w:tcPr>
+            <w:tcW w:w="1843" w:type="dxa"/>
+          </w:tcPr>
+          <w:p>
+            <w:pPr>
+              <w:rPr>
+                <w:rFonts w:hint="eastAsia"/>
+                <w:sz w:val="16"/>
+                <w:szCs w:val="18"/>
+              </w:rPr>
+            </w:pPr>
+            <w:r>
+              <w:rPr>
+                <w:sz w:val="16"/>
+                <w:szCs w:val="18"/>
+              </w:rPr>
+              <w:t>Relevant f</w:t>
+            </w:r>
+            <w:r>
+              <w:rPr>
+                <w:rFonts w:hint="eastAsia"/>
+                <w:sz w:val="16"/>
+                <w:szCs w:val="18"/>
+              </w:rPr>
+              <w:t>ile</w:t>
+            </w:r>
+            <w:r>
+              <w:rPr>
+                <w:sz w:val="16"/>
+                <w:szCs w:val="18"/>
+              </w:rPr>
+              <w:t>(s)</w:t>
+            </w:r>
+          </w:p>
+        </w:tc>
+        <w:tc>
+          <w:tcPr>
+            <w:tcW w:w="1843" w:type="dxa"/>
+          </w:tcPr>
+          <w:p>
+            <w:pPr>
+              <w:rPr>
+                <w:rFonts w:hint="eastAsia"/>
+                <w:sz w:val="16"/>
+                <w:szCs w:val="18"/>
+                <w:lang w:val="en-CA"/>
+              </w:rPr>
+            </w:pPr>
+            <w:r>
+              <w:rPr>
+                <w:rFonts w:hint="eastAsia"/>
+                <w:sz w:val="16"/>
+                <w:szCs w:val="18"/>
+              </w:rPr>
+              <w:t>C</w:t>
+            </w:r>
+            <w:r>
+              <w:rPr>
+                <w:sz w:val="16"/>
+                <w:szCs w:val="18"/>
+              </w:rPr>
+              <w:t>omponent</w:t>
+            </w:r>
+          </w:p>
+        </w:tc>
+        <w:tc>
+          <w:tcPr>
+            <w:tcW w:w="2410" w:type="dxa"/>
+          </w:tcPr>
+          <w:p>
+            <w:pPr>
+              <w:rPr>
+                <w:rFonts w:hint="eastAsia"/>
+                <w:sz w:val="16"/>
+                <w:szCs w:val="18"/>
+                <w:lang w:val="en-CA"/>
+              </w:rPr>
+            </w:pPr>
+            <w:r>
+              <w:rPr>
+                <w:rFonts w:hint="eastAsia"/>
+                <w:sz w:val="16"/>
+                <w:szCs w:val="18"/>
+                <w:lang w:val="en-CA"/>
+              </w:rPr>
+              <w:t>H</w:t>
+            </w:r>
+            <w:r>
+              <w:rPr>
+                <w:sz w:val="16"/>
+                <w:szCs w:val="18"/>
+                <w:lang w:val="en-CA"/>
+              </w:rPr>
+              <w:t>ow to test</w:t>
+            </w:r>
+          </w:p>
+        </w:tc>
+        <w:tc>
+          <w:tcPr>
+            <w:tcW w:w="3118" w:type="dxa"/>
+          </w:tcPr>
+          <w:p>
+            <w:pPr>
+              <w:rPr>
+                <w:rFonts w:hint="eastAsia"/>
+                <w:sz w:val="16"/>
+                <w:szCs w:val="18"/>
+                <w:lang w:val="en-CA"/>
+              </w:rPr>
+            </w:pPr>
+            <w:r>
+              <w:rPr>
+                <w:rFonts w:hint="eastAsia"/>
+                <w:sz w:val="16"/>
+                <w:szCs w:val="18"/>
+                <w:lang w:val="en-CA"/>
+              </w:rPr>
+              <w:t>E</w:t>
+            </w:r>
+            <w:r>
+              <w:rPr>
+                <w:sz w:val="16"/>
+                <w:szCs w:val="18"/>
+                <w:lang w:val="en-CA"/>
+              </w:rPr>
+              <w:t>xpected outcome</w:t>
+            </w:r>
+          </w:p>
+        </w:tc>
+        <w:tc>
+          <w:tcPr>
+            <w:tcW w:w="2410" w:type="dxa"/>
+          </w:tcPr>
+          <w:p>
+            <w:pPr>
+              <w:rPr>
+                <w:rFonts w:hint="eastAsia"/>
+                <w:sz w:val="16"/>
+                <w:szCs w:val="18"/>
+                <w:lang w:val="en-CA"/>
+              </w:rPr>
+            </w:pPr>
+            <w:r>
+              <w:rPr>
+                <w:rFonts w:hint="eastAsia"/>
+                <w:sz w:val="16"/>
+                <w:szCs w:val="18"/>
+                <w:lang w:val="en-CA"/>
+              </w:rPr>
+              <w:t>T</w:t>
+            </w:r>
+            <w:r>
+              <w:rPr>
+                <w:sz w:val="16"/>
+                <w:szCs w:val="18"/>
+                <w:lang w:val="en-CA"/>
+              </w:rPr>
+              <w:t>ested on (commit) and notes</w:t>
+            </w:r>
+          </w:p>
+        </w:tc>
+      </w:tr>
+      <w:tr>
+        <w:tc>
+          <w:tcPr>
+            <w:tcW w:w="1843" w:type="dxa"/>
+          </w:tcPr>
+          <w:p>
+            <w:pPr>
+              <w:rPr>
+                <w:sz w:val="16"/>
+                <w:szCs w:val="18"/>
+                <w:lang w:val="en-CA"/>
+              </w:rPr>
+            </w:pPr>
+            <w:r>
+              <w:rPr>
+                <w:sz w:val="16"/>
+                <w:szCs w:val="18"/>
+                <w:lang w:val="en-CA"/>
+              </w:rPr>
+              <w:t>settings.tsx,</w:t>
+            </w:r>
+            <w:r>
+              <w:rPr>
+                <w:sz w:val="16"/>
+                <w:szCs w:val="18"/>
+                <w:lang w:val="en-CA"/>
+              </w:rPr>
+              <w:t xml:space="preserve"> </w:t>
+            </w:r>
+            <w:r>
+              <w:rPr>
+                <w:sz w:val="16"/>
+                <w:szCs w:val="18"/>
+                <w:lang w:val="en-CA"/>
+              </w:rPr>
+              <w:t>DraggableModal.tsx</w:t>
+            </w:r>
+          </w:p>
+        </w:tc>
+        <w:tc>
+          <w:tcPr>
+            <w:tcW w:w="1843" w:type="dxa"/>
+          </w:tcPr>
+          <w:p>
+            <w:pPr>
+              <w:rPr>
+                <w:sz w:val="16"/>
+                <w:szCs w:val="18"/>
+                <w:lang w:val="en-CA"/>
+              </w:rPr>
+            </w:pPr>
+            <w:r>
+              <w:rPr>
+                <w:sz w:val="16"/>
+                <w:szCs w:val="18"/>
+                <w:lang w:val="en-CA"/>
+              </w:rPr>
+              <w:t>DraggableModal:</w:t>
+            </w:r>
+            <w:r>
+              <w:rPr>
+                <w:sz w:val="16"/>
+                <w:szCs w:val="18"/>
+                <w:lang w:val="en-CA"/>
+              </w:rPr>
+              <w:t xml:space="preserve"> </w:t>
+            </w:r>
+            <w:r>
+              <w:rPr>
+                <w:sz w:val="16"/>
+                <w:szCs w:val="18"/>
+                <w:lang w:val="en-CA"/>
+              </w:rPr>
+              <w:t>remember the page state next time you open it</w:t>
+            </w:r>
+            <w:r>
+              <w:rPr>
+                <w:sz w:val="16"/>
+                <w:szCs w:val="18"/>
+                <w:lang w:val="en-CA"/>
+              </w:rPr>
+              <w:t xml:space="preserve"> (#1: settings)</w:t>
+            </w:r>
+          </w:p>
+        </w:tc>
+        <w:tc>
+          <w:tcPr>
+            <w:tcW w:w="2410" w:type="dxa"/>
+          </w:tcPr>
+          <w:p>
+            <w:pPr>
+              <w:rPr>
+                <w:sz w:val="16"/>
+                <w:szCs w:val="18"/>
+                <w:lang w:val="en-CA"/>
+              </w:rPr>
+            </w:pPr>
+            <w:r>
+              <w:rPr>
+                <w:rFonts w:hint="eastAsia"/>
+                <w:sz w:val="16"/>
+                <w:szCs w:val="18"/>
+                <w:lang w:val="en-CA"/>
+              </w:rPr>
+              <w:t>O</w:t>
+            </w:r>
+            <w:r>
+              <w:rPr>
+                <w:sz w:val="16"/>
+                <w:szCs w:val="18"/>
+                <w:lang w:val="en-CA"/>
+              </w:rPr>
+              <w:t xml:space="preserve">pen settings. click on a different tab than the one you started with. </w:t>
+            </w:r>
+            <w:r>
+              <w:rPr>
+                <w:rFonts w:hint="eastAsia"/>
+                <w:sz w:val="16"/>
+                <w:szCs w:val="18"/>
+                <w:lang w:val="en-CA"/>
+              </w:rPr>
+              <w:t>C</w:t>
+            </w:r>
+            <w:r>
+              <w:rPr>
+                <w:sz w:val="16"/>
+                <w:szCs w:val="18"/>
+                <w:lang w:val="en-CA"/>
+              </w:rPr>
+              <w:t>lose settings. reopen it</w:t>
+            </w:r>
+          </w:p>
+        </w:tc>
+        <w:tc>
+          <w:tcPr>
+            <w:tcW w:w="3118" w:type="dxa"/>
+          </w:tcPr>
+          <w:p>
+            <w:pPr>
+              <w:rPr>
+                <w:sz w:val="16"/>
+                <w:szCs w:val="18"/>
+                <w:lang w:val="en-CA"/>
+              </w:rPr>
+            </w:pPr>
+            <w:r>
+              <w:rPr>
+                <w:rFonts w:hint="eastAsia"/>
+                <w:sz w:val="16"/>
+                <w:szCs w:val="18"/>
+                <w:lang w:val="en-CA"/>
+              </w:rPr>
+              <w:t>W</w:t>
+            </w:r>
+            <w:r>
+              <w:rPr>
+                <w:sz w:val="16"/>
+                <w:szCs w:val="18"/>
+                <w:lang w:val="en-CA"/>
+              </w:rPr>
+              <w:t>hen you reopen settings, it should reopen on the tab you previously were on before you closed.</w:t>
+            </w:r>
+          </w:p>
+        </w:tc>
+        <w:tc>
+          <w:tcPr>
+            <w:tcW w:w="2410" w:type="dxa"/>
+          </w:tcPr>
+          <w:p>
+            <w:pPr>
+              <w:rPr>
+                <w:sz w:val="16"/>
+                <w:szCs w:val="18"/>
+                <w:lang w:val="en-CA"/>
+              </w:rPr>
+            </w:pPr>
+            <w:r>
+              <w:rPr>
+                <w:rFonts w:hint="eastAsia"/>
+                <w:sz w:val="16"/>
+                <w:szCs w:val="18"/>
+                <w:lang w:val="en-CA"/>
+              </w:rPr>
+              <w:t>I</w:t>
+            </w:r>
+            <w:r>
+              <w:rPr>
+                <w:sz w:val="16"/>
+                <w:szCs w:val="18"/>
+                <w:lang w:val="en-CA"/>
+              </w:rPr>
+              <w:t xml:space="preserve">mplemented as of </w:t>
+            </w:r>
+            <w:r>
+              <w:rPr>
+                <w:sz w:val="16"/>
+                <w:szCs w:val="18"/>
+                <w:lang w:val="en-CA"/>
+              </w:rPr>
+              <w:t>1d0238597f37bde11d1e6104a2cd19ec89778495</w:t>
+            </w:r>
+            <w:r>
+              <w:rPr>
+                <w:sz w:val="16"/>
+                <w:szCs w:val="18"/>
+                <w:lang w:val="en-CA"/>
+              </w:rPr>
+              <w:t xml:space="preserve"> + 1</w:t>
+            </w:r>
+          </w:p>
+        </w:tc>
+      </w:tr>
+      <w:tr>
+        <w:tc>
+          <w:tcPr>
+            <w:tcW w:w="1843" w:type="dxa"/>
+          </w:tcPr>
+          <w:p>
+            <w:pPr>
+              <w:jc w:val="both"/>
+              <w:rPr>
+                <w:sz w:val="16"/>
+                <w:szCs w:val="18"/>
+                <w:lang w:val="en-CA"/>
+              </w:rPr>
+            </w:pPr>
+            <w:r>
+              <w:rPr>
+                <w:sz w:val="16"/>
+                <w:szCs w:val="18"/>
+                <w:lang w:val="en-CA"/>
+              </w:rPr>
+              <w:t xml:space="preserve">styles.tsx. </w:t>
+            </w:r>
+            <w:r>
+              <w:rPr>
+                <w:sz w:val="16"/>
+                <w:szCs w:val="18"/>
+                <w:lang w:val="en-CA"/>
+              </w:rPr>
+              <w:t>DraggableModal.tsx</w:t>
+            </w:r>
+          </w:p>
+        </w:tc>
+        <w:tc>
+          <w:tcPr>
+            <w:tcW w:w="1843" w:type="dxa"/>
+          </w:tcPr>
+          <w:p>
+            <w:pPr>
+              <w:rPr>
+                <w:sz w:val="16"/>
+                <w:szCs w:val="18"/>
+                <w:lang w:val="en-CA"/>
+              </w:rPr>
+            </w:pPr>
+            <w:r>
+              <w:rPr>
+                <w:sz w:val="16"/>
+                <w:szCs w:val="18"/>
+                <w:lang w:val="en-CA"/>
+              </w:rPr>
+              <w:t>DraggableModal: remember the page state next time you open it (#2 styles)</w:t>
+            </w:r>
+          </w:p>
+        </w:tc>
+        <w:tc>
+          <w:tcPr>
+            <w:tcW w:w="2410" w:type="dxa"/>
+          </w:tcPr>
+          <w:p>
+            <w:pPr>
+              <w:rPr>
+                <w:sz w:val="16"/>
+                <w:szCs w:val="18"/>
+                <w:lang w:val="en-CA"/>
+              </w:rPr>
+            </w:pPr>
+            <w:r>
+              <w:rPr>
+                <w:rFonts w:hint="eastAsia"/>
+                <w:sz w:val="16"/>
+                <w:szCs w:val="18"/>
+                <w:lang w:val="en-CA"/>
+              </w:rPr>
+              <w:t>O</w:t>
+            </w:r>
+            <w:r>
+              <w:rPr>
+                <w:sz w:val="16"/>
+                <w:szCs w:val="18"/>
+                <w:lang w:val="en-CA"/>
+              </w:rPr>
+              <w:t xml:space="preserve">pen styles. </w:t>
+            </w:r>
+            <w:r>
+              <w:rPr>
+                <w:rFonts w:hint="eastAsia"/>
+                <w:sz w:val="16"/>
+                <w:szCs w:val="18"/>
+                <w:lang w:val="en-CA"/>
+              </w:rPr>
+              <w:t>C</w:t>
+            </w:r>
+            <w:r>
+              <w:rPr>
+                <w:sz w:val="16"/>
+                <w:szCs w:val="18"/>
+                <w:lang w:val="en-CA"/>
+              </w:rPr>
+              <w:t xml:space="preserve">lick into a random theme or a random folder. </w:t>
+            </w:r>
+            <w:r>
+              <w:rPr>
+                <w:rFonts w:hint="eastAsia"/>
+                <w:sz w:val="16"/>
+                <w:szCs w:val="18"/>
+                <w:lang w:val="en-CA"/>
+              </w:rPr>
+              <w:t>D</w:t>
+            </w:r>
+            <w:r>
+              <w:rPr>
+                <w:sz w:val="16"/>
+                <w:szCs w:val="18"/>
+                <w:lang w:val="en-CA"/>
+              </w:rPr>
+              <w:t xml:space="preserve">irectly click the x button to close it (do not click back to close). </w:t>
+            </w:r>
+            <w:r>
+              <w:rPr>
+                <w:rFonts w:hint="eastAsia"/>
+                <w:sz w:val="16"/>
+                <w:szCs w:val="18"/>
+                <w:lang w:val="en-CA"/>
+              </w:rPr>
+              <w:t>R</w:t>
+            </w:r>
+            <w:r>
+              <w:rPr>
+                <w:sz w:val="16"/>
+                <w:szCs w:val="18"/>
+                <w:lang w:val="en-CA"/>
+              </w:rPr>
+              <w:t>eopen the styles page.</w:t>
+            </w:r>
+          </w:p>
+        </w:tc>
+        <w:tc>
+          <w:tcPr>
+            <w:tcW w:w="3118" w:type="dxa"/>
+          </w:tcPr>
+          <w:p>
+            <w:pPr>
+              <w:rPr>
+                <w:sz w:val="16"/>
+                <w:szCs w:val="18"/>
+                <w:lang w:val="en-CA"/>
+              </w:rPr>
+            </w:pPr>
+            <w:r>
+              <w:rPr>
+                <w:rFonts w:hint="eastAsia"/>
+                <w:sz w:val="16"/>
+                <w:szCs w:val="18"/>
+                <w:lang w:val="en-CA"/>
+              </w:rPr>
+              <w:t>T</w:t>
+            </w:r>
+            <w:r>
+              <w:rPr>
+                <w:sz w:val="16"/>
+                <w:szCs w:val="18"/>
+                <w:lang w:val="en-CA"/>
+              </w:rPr>
+              <w:t>he styles page should open where you left off</w:t>
+            </w:r>
+          </w:p>
+        </w:tc>
+        <w:tc>
+          <w:tcPr>
+            <w:tcW w:w="2410" w:type="dxa"/>
+          </w:tcPr>
+          <w:p>
+            <w:pPr>
+              <w:rPr>
+                <w:sz w:val="16"/>
+                <w:szCs w:val="18"/>
+                <w:lang w:val="en-CA"/>
+              </w:rPr>
+            </w:pPr>
+            <w:r>
+              <w:rPr>
+                <w:rFonts w:hint="eastAsia"/>
+                <w:sz w:val="16"/>
+                <w:szCs w:val="18"/>
+                <w:lang w:val="en-CA"/>
+              </w:rPr>
+              <w:t>N</w:t>
+            </w:r>
+            <w:r>
+              <w:rPr>
+                <w:sz w:val="16"/>
+                <w:szCs w:val="18"/>
+                <w:lang w:val="en-CA"/>
+              </w:rPr>
+              <w:t>ot implemented yet</w:t>
+            </w:r>
+          </w:p>
+        </w:tc>
+      </w:tr>
+    </w:tbl>
     <w:p>
       <w:pPr>
         <w:jc w:val="center"/>
@@ -885,7 +1476,16 @@
                 <w:szCs w:val="18"/>
                 <w:lang w:val="en-CA"/>
               </w:rPr>
-              <w:t>ither add a visual indicator or accept the keybind after 1 keypress.</w:t>
+              <w:t xml:space="preserve">ither add a visual </w:t>
+            </w:r>
+            <w:r>
+              <w:rPr>
+                <w:sz w:val="16"/>
+                <w:szCs w:val="18"/>
+                <w:lang w:val="en-CA"/>
+              </w:rPr>
+              <w:lastRenderedPageBreak/>
+              <w:t>indicator or accept the keybind after 1 keypress.</w:t>
             </w:r>
           </w:p>
         </w:tc>
@@ -911,6 +1511,7 @@
                 <w:szCs w:val="18"/>
                 <w:lang w:val="en-CA"/>
               </w:rPr>
+              <w:lastRenderedPageBreak/>
               <w:t>S</w:t>
             </w:r>
             <w:r>
@@ -1389,16 +1990,7 @@
                 <w:szCs w:val="18"/>
                 <w:lang w:val="en-CA"/>
               </w:rPr>
-              <w:t xml:space="preserve">f there is only one keybind, there should still be an </w:t>
-            </w:r>
-            <w:r>
-              <w:rPr>
-                <w:sz w:val="16"/>
-                <w:szCs w:val="18"/>
-                <w:lang w:val="en-CA"/>
-              </w:rPr>
-              <w:lastRenderedPageBreak/>
-              <w:t>X button</w:t>
+              <w:t>f there is only one keybind, there should still be an X button</w:t>
             </w:r>
           </w:p>
         </w:tc>
@@ -1422,7 +2014,6 @@
                 <w:szCs w:val="18"/>
                 <w:lang w:val="en-CA"/>
               </w:rPr>
-              <w:lastRenderedPageBreak/>
               <w:t>S</w:t>
             </w:r>
             <w:r>
@@ -1456,16 +2047,7 @@
                 <w:szCs w:val="18"/>
                 <w:lang w:val="en-CA"/>
               </w:rPr>
-              <w:t xml:space="preserve">eeds fixing: allow </w:t>
-            </w:r>
-            <w:r>
-              <w:rPr>
-                <w:sz w:val="16"/>
-                <w:szCs w:val="18"/>
-                <w:lang w:val="en-CA"/>
-              </w:rPr>
-              <w:lastRenderedPageBreak/>
-              <w:t>single keybinds to have an X button</w:t>
+              <w:t>eeds fixing: allow single keybinds to have an X button</w:t>
             </w:r>
           </w:p>
         </w:tc>
@@ -1491,7 +2073,6 @@
                 <w:szCs w:val="18"/>
                 <w:lang w:val="en-CA"/>
               </w:rPr>
-              <w:lastRenderedPageBreak/>
               <w:t>S</w:t>
             </w:r>
             <w:r>
@@ -2467,81 +3048,23 @@
                 <w:szCs w:val="18"/>
                 <w:lang w:val="en-CA"/>
               </w:rPr>
-              <w:t>N</w:t>
-            </w:r>
-            <w:r>
-              <w:rPr>
-                <w:sz w:val="16"/>
-                <w:szCs w:val="18"/>
-                <w:lang w:val="en-CA"/>
-              </w:rPr>
-              <w:t>ot working</w:t>
-            </w:r>
-            <w:r>
-              <w:rPr>
-                <w:sz w:val="16"/>
-                <w:szCs w:val="18"/>
-                <w:lang w:val="en-CA"/>
-              </w:rPr>
-              <w:t xml:space="preserve"> for when its disabled.</w:t>
-            </w:r>
-            <w:r>
-              <w:rPr>
-                <w:sz w:val="16"/>
-                <w:szCs w:val="18"/>
-                <w:lang w:val="en-CA"/>
-              </w:rPr>
-              <w:t xml:space="preserve"> </w:t>
-            </w:r>
-            <w:r>
-              <w:rPr>
-                <w:rFonts w:hint="eastAsia"/>
-                <w:sz w:val="16"/>
-                <w:szCs w:val="18"/>
-                <w:lang w:val="en-CA"/>
-              </w:rPr>
-              <w:t>C</w:t>
-            </w:r>
-            <w:r>
-              <w:rPr>
-                <w:sz w:val="16"/>
-                <w:szCs w:val="18"/>
-                <w:lang w:val="en-CA"/>
-              </w:rPr>
-              <w:t>licking does not close the modal.</w:t>
-            </w:r>
-            <w:r>
-              <w:rPr>
-                <w:sz w:val="16"/>
-                <w:szCs w:val="18"/>
-                <w:lang w:val="en-CA"/>
-              </w:rPr>
-              <w:t xml:space="preserve"> </w:t>
-            </w:r>
-            <w:r>
-              <w:rPr>
-                <w:rFonts w:hint="eastAsia"/>
-                <w:sz w:val="16"/>
-                <w:szCs w:val="18"/>
-                <w:lang w:val="en-CA"/>
-              </w:rPr>
-              <w:t>A</w:t>
-            </w:r>
-            <w:r>
-              <w:rPr>
-                <w:sz w:val="16"/>
-                <w:szCs w:val="18"/>
-                <w:lang w:val="en-CA"/>
-              </w:rPr>
-              <w:t xml:space="preserve">s of </w:t>
-            </w:r>
-            <w:r>
-              <w:rPr>
-                <w:sz w:val="16"/>
-                <w:szCs w:val="18"/>
-                <w:lang w:val="en-CA"/>
-              </w:rPr>
-              <w:t>199def07d25e3c2c827656c83e632a8c36045ea9</w:t>
+              <w:t>W</w:t>
+            </w:r>
+            <w:r>
+              <w:rPr>
+                <w:sz w:val="16"/>
+                <w:szCs w:val="18"/>
+                <w:lang w:val="en-CA"/>
+              </w:rPr>
+              <w:t xml:space="preserve">orking as of </w:t>
+            </w:r>
+            <w:r>
+              <w:rPr>
+                <w:sz w:val="16"/>
+                <w:szCs w:val="18"/>
+                <w:lang w:val="en-CA"/>
+              </w:rPr>
+              <w:t>1d0238597f37bde11d1e6104a2cd19ec89778495</w:t>
             </w:r>
           </w:p>
         </w:tc>
@@ -2956,7 +3479,16 @@
                 <w:szCs w:val="18"/>
                 <w:lang w:val="en-CA"/>
               </w:rPr>
-              <w:t>urning this setting on allows you to drag the modal, which isn’t what this setting is supposed to do.</w:t>
+              <w:t xml:space="preserve">urning this setting on allows you to drag the modal, which isn’t what this </w:t>
+            </w:r>
+            <w:r>
+              <w:rPr>
+                <w:sz w:val="16"/>
+                <w:szCs w:val="18"/>
+                <w:lang w:val="en-CA"/>
+              </w:rPr>
+              <w:lastRenderedPageBreak/>
+              <w:t>setting is supposed to do.</w:t>
             </w:r>
           </w:p>
         </w:tc>
@@ -2983,6 +3515,7 @@
                 <w:szCs w:val="18"/>
                 <w:lang w:val="en-CA"/>
               </w:rPr>
+              <w:lastRenderedPageBreak/>
               <w:t>S</w:t>
             </w:r>
             <w:r>
@@ -3232,16 +3765,7 @@
                 <w:szCs w:val="18"/>
                 <w:lang w:val="en-CA"/>
               </w:rPr>
-              <w:t xml:space="preserve">ettings.tsx, draggableModal.tsx, Toast.tsx, modalManager.ts, </w:t>
-            </w:r>
-            <w:r>
-              <w:rPr>
-                <w:sz w:val="16"/>
-                <w:szCs w:val="18"/>
-                <w:lang w:val="en-CA"/>
-              </w:rPr>
-              <w:lastRenderedPageBreak/>
-              <w:t>modalPermissions.ts</w:t>
+              <w:t>ettings.tsx, draggableModal.tsx, Toast.tsx, modalManager.ts, modalPermissions.ts</w:t>
             </w:r>
           </w:p>
         </w:tc>
@@ -3266,7 +3790,6 @@
                 <w:szCs w:val="18"/>
                 <w:lang w:val="en-CA"/>
               </w:rPr>
-              <w:lastRenderedPageBreak/>
               <w:t>S</w:t>
             </w:r>
             <w:r>
@@ -3464,16 +3987,7 @@
                 <w:szCs w:val="18"/>
                 <w:lang w:val="en-CA"/>
               </w:rPr>
-              <w:t xml:space="preserve">I can open the same modal and </w:t>
-            </w:r>
-            <w:r>
-              <w:rPr>
-                <w:sz w:val="16"/>
-                <w:szCs w:val="18"/>
-                <w:lang w:val="en-CA"/>
-              </w:rPr>
-              <w:lastRenderedPageBreak/>
-              <w:t>close the same modal and reopen the same modal.</w:t>
+              <w:t>I can open the same modal and close the same modal and reopen the same modal.</w:t>
             </w:r>
           </w:p>
         </w:tc>
@@ -3500,7 +4014,6 @@
                 <w:szCs w:val="18"/>
                 <w:lang w:val="en-CA"/>
               </w:rPr>
-              <w:lastRenderedPageBreak/>
               <w:t>S</w:t>
             </w:r>
             <w:r>
@@ -4656,7 +5169,16 @@
                 <w:szCs w:val="18"/>
                 <w:lang w:val="en-CA"/>
               </w:rPr>
-              <w:t>nsure that the timing is correlated to the slider, so the longer the slider’s set duration time, the longer the transition should feel</w:t>
+              <w:t xml:space="preserve">nsure that the timing is correlated to the slider, so the longer the slider’s set duration time, the longer </w:t>
+            </w:r>
+            <w:r>
+              <w:rPr>
+                <w:sz w:val="16"/>
+                <w:szCs w:val="18"/>
+                <w:lang w:val="en-CA"/>
+              </w:rPr>
+              <w:lastRenderedPageBreak/>
+              <w:t>the transition should feel</w:t>
             </w:r>
           </w:p>
         </w:tc>
@@ -4680,6 +5202,7 @@
                 <w:szCs w:val="18"/>
                 <w:lang w:val="en-CA"/>
               </w:rPr>
+              <w:lastRenderedPageBreak/>
               <w:t>N</w:t>
             </w:r>
             <w:r>
@@ -4839,7 +5362,6 @@
                 <w:szCs w:val="18"/>
                 <w:lang w:val="en-CA"/>
               </w:rPr>
-              <w:lastRenderedPageBreak/>
               <w:drawing>
                 <wp:inline distT="0" distB="0" distL="0" distR="0" wp14:anchorId="78D08D55" wp14:editId="73CAFEEB">
                   <wp:extent cx="1393190" cy="1348105"/>
@@ -4942,7 +5464,6 @@
                 <w:szCs w:val="18"/>
                 <w:lang w:val="en-CA"/>
               </w:rPr>
-              <w:lastRenderedPageBreak/>
               <w:t>T</w:t>
             </w:r>
             <w:r>
@@ -5921,7 +6442,16 @@
                 <w:szCs w:val="18"/>
                 <w:lang w:val="en-CA"/>
               </w:rPr>
-              <w:t>ettings: components: torus menu editor: delay slider</w:t>
+              <w:t xml:space="preserve">ettings: components: torus menu editor: delay </w:t>
+            </w:r>
+            <w:r>
+              <w:rPr>
+                <w:sz w:val="16"/>
+                <w:szCs w:val="18"/>
+                <w:lang w:val="en-CA"/>
+              </w:rPr>
+              <w:lastRenderedPageBreak/>
+              <w:t>slider</w:t>
             </w:r>
           </w:p>
         </w:tc>
@@ -5950,6 +6480,7 @@
                 <w:szCs w:val="18"/>
                 <w:lang w:val="en-CA"/>
               </w:rPr>
+              <w:lastRenderedPageBreak/>
               <w:t>S</w:t>
             </w:r>
             <w:r>
@@ -5966,7 +6497,16 @@
                 <w:szCs w:val="18"/>
                 <w:lang w:val="en-CA"/>
               </w:rPr>
-              <w:t>, click on the (…) open torus menu button</w:t>
+              <w:t xml:space="preserve">, click on the (…) open torus menu </w:t>
+            </w:r>
+            <w:r>
+              <w:rPr>
+                <w:sz w:val="16"/>
+                <w:szCs w:val="18"/>
+                <w:lang w:val="en-CA"/>
+              </w:rPr>
+              <w:lastRenderedPageBreak/>
+              <w:t>button</w:t>
             </w:r>
           </w:p>
           <w:p>
@@ -6030,16 +6570,7 @@
                 <w:szCs w:val="18"/>
                 <w:lang w:val="en-CA"/>
               </w:rPr>
-              <w:t xml:space="preserve">est the slider for different negative values and click </w:t>
-            </w:r>
-            <w:r>
-              <w:rPr>
-                <w:sz w:val="16"/>
-                <w:szCs w:val="18"/>
-                <w:lang w:val="en-CA"/>
-              </w:rPr>
-              <w:lastRenderedPageBreak/>
-              <w:t>(…) each time</w:t>
+              <w:t>est the slider for different negative values and click (…) each time</w:t>
             </w:r>
           </w:p>
         </w:tc>
@@ -6077,7 +6608,16 @@
                 <w:szCs w:val="18"/>
                 <w:lang w:val="en-CA"/>
               </w:rPr>
-              <w:t>n test 1, the torus menu should open in one union, all annular sectors synchronized at the same time</w:t>
+              <w:t xml:space="preserve">n test 1, the torus menu should open in one union, all annular </w:t>
+            </w:r>
+            <w:r>
+              <w:rPr>
+                <w:sz w:val="16"/>
+                <w:szCs w:val="18"/>
+                <w:lang w:val="en-CA"/>
+              </w:rPr>
+              <w:lastRenderedPageBreak/>
+              <w:t>sectors synchronized at the same time</w:t>
             </w:r>
           </w:p>
           <w:p>
@@ -6126,16 +6666,7 @@
                 <w:szCs w:val="18"/>
                 <w:lang w:val="en-CA"/>
               </w:rPr>
-              <w:t xml:space="preserve">he longer the delay, the </w:t>
-            </w:r>
-            <w:r>
-              <w:rPr>
-                <w:sz w:val="16"/>
-                <w:szCs w:val="18"/>
-                <w:lang w:val="en-CA"/>
-              </w:rPr>
-              <w:lastRenderedPageBreak/>
-              <w:t>slower/longer interval between each annular sector</w:t>
+              <w:t>he longer the delay, the slower/longer interval between each annular sector</w:t>
             </w:r>
           </w:p>
           <w:p>
@@ -6225,7 +6756,16 @@
                 <w:szCs w:val="18"/>
                 <w:lang w:val="en-CA"/>
               </w:rPr>
-              <w:t>5bddf836872611033759d627746d8b4161bba22a</w:t>
+              <w:t>5bddf836872611033759d62774</w:t>
+            </w:r>
+            <w:r>
+              <w:rPr>
+                <w:sz w:val="16"/>
+                <w:szCs w:val="18"/>
+                <w:lang w:val="en-CA"/>
+              </w:rPr>
+              <w:lastRenderedPageBreak/>
+              <w:t>6d8b4161bba22a</w:t>
             </w:r>
           </w:p>
         </w:tc>
@@ -7277,7 +7817,16 @@
                 <w:szCs w:val="18"/>
                 <w:lang w:val="en-CA"/>
               </w:rPr>
-              <w:t>or any color, click on the color rectangle in the styles page and start dragging around the color picker in the color wheel</w:t>
+              <w:t xml:space="preserve">or any color, click on the color rectangle in the styles page and </w:t>
+            </w:r>
+            <w:r>
+              <w:rPr>
+                <w:sz w:val="16"/>
+                <w:szCs w:val="18"/>
+                <w:lang w:val="en-CA"/>
+              </w:rPr>
+              <w:lastRenderedPageBreak/>
+              <w:t>start dragging around the color picker in the color wheel</w:t>
             </w:r>
           </w:p>
         </w:tc>
@@ -7301,6 +7850,7 @@
                 <w:szCs w:val="18"/>
                 <w:lang w:val="en-CA"/>
               </w:rPr>
+              <w:lastRenderedPageBreak/>
               <w:t>T</w:t>
             </w:r>
             <w:r>
@@ -7326,7 +7876,16 @@
                 <w:szCs w:val="18"/>
                 <w:lang w:val="en-CA"/>
               </w:rPr>
-              <w:t>very element using that color should change instantaneously with no lag</w:t>
+              <w:t xml:space="preserve">very element using that color </w:t>
+            </w:r>
+            <w:r>
+              <w:rPr>
+                <w:sz w:val="16"/>
+                <w:szCs w:val="18"/>
+                <w:lang w:val="en-CA"/>
+              </w:rPr>
+              <w:lastRenderedPageBreak/>
+              <w:t>should change instantaneously with no lag</w:t>
             </w:r>
           </w:p>
         </w:tc>
@@ -7350,6 +7909,7 @@
                 <w:szCs w:val="18"/>
                 <w:lang w:val="en-CA"/>
               </w:rPr>
+              <w:lastRenderedPageBreak/>
               <w:t>P</w:t>
             </w:r>
             <w:r>
@@ -7366,7 +7926,16 @@
                 <w:szCs w:val="18"/>
                 <w:lang w:val="en-CA"/>
               </w:rPr>
-              <w:t>5bddf836872611033759d627746d8b4161bba22a</w:t>
+              <w:t>5bddf836872611033759d62774</w:t>
+            </w:r>
+            <w:r>
+              <w:rPr>
+                <w:sz w:val="16"/>
+                <w:szCs w:val="18"/>
+                <w:lang w:val="en-CA"/>
+              </w:rPr>
+              <w:lastRenderedPageBreak/>
+              <w:t>6d8b4161bba22a</w:t>
             </w:r>
             <w:r>
               <w:rPr>
@@ -7418,16 +7987,7 @@
                 <w:szCs w:val="18"/>
                 <w:lang w:val="en-CA"/>
               </w:rPr>
-              <w:t xml:space="preserve">t </w:t>
-            </w:r>
-            <w:r>
-              <w:rPr>
-                <w:sz w:val="16"/>
-                <w:szCs w:val="18"/>
-                <w:lang w:val="en-CA"/>
-              </w:rPr>
-              <w:lastRenderedPageBreak/>
-              <w:t xml:space="preserve">like waits 500ms then changes. </w:t>
+              <w:t xml:space="preserve">t like waits 500ms then changes. </w:t>
             </w:r>
             <w:r>
               <w:rPr>
@@ -8525,7 +9085,16 @@
                 <w:szCs w:val="18"/>
                 <w:lang w:val="en-CA"/>
               </w:rPr>
-              <w:t xml:space="preserve">rigger the “open multiple menus is disabled!” toast by turning off allow open multiple menus and attempting to open multiple menus. </w:t>
+              <w:t xml:space="preserve">rigger the “open multiple menus is disabled!” toast by turning off allow open multiple menus and attempting to open </w:t>
+            </w:r>
+            <w:r>
+              <w:rPr>
+                <w:sz w:val="16"/>
+                <w:szCs w:val="18"/>
+                <w:lang w:val="en-CA"/>
+              </w:rPr>
+              <w:lastRenderedPageBreak/>
+              <w:t xml:space="preserve">multiple menus. </w:t>
             </w:r>
           </w:p>
         </w:tc>
@@ -8549,6 +9118,7 @@
                 <w:szCs w:val="18"/>
                 <w:lang w:val="en-CA"/>
               </w:rPr>
+              <w:lastRenderedPageBreak/>
               <w:t>T</w:t>
             </w:r>
             <w:r>
@@ -8622,7 +9192,16 @@
                 <w:szCs w:val="18"/>
                 <w:lang w:val="en-CA"/>
               </w:rPr>
-              <w:t>he toast for the settings button appears on top of it and in one fat line.</w:t>
+              <w:t xml:space="preserve">he toast for the settings button appears on </w:t>
+            </w:r>
+            <w:r>
+              <w:rPr>
+                <w:sz w:val="16"/>
+                <w:szCs w:val="18"/>
+                <w:lang w:val="en-CA"/>
+              </w:rPr>
+              <w:lastRenderedPageBreak/>
+              <w:t>top of it and in one fat line.</w:t>
             </w:r>
           </w:p>
         </w:tc>
@@ -8648,6 +9227,7 @@
           <w:szCs w:val="32"/>
           <w:lang w:val="en-CA"/>
         </w:rPr>
+        <w:lastRenderedPageBreak/>
         <w:t>PlayneedleEditor.tsx</w:t>
       </w:r>
     </w:p>
@@ -8882,16 +9462,7 @@
                 <w:szCs w:val="18"/>
                 <w:lang w:val="en-CA"/>
               </w:rPr>
-              <w:t xml:space="preserve">ettings: components: </w:t>
-            </w:r>
-            <w:r>
-              <w:rPr>
-                <w:sz w:val="16"/>
-                <w:szCs w:val="18"/>
-                <w:lang w:val="en-CA"/>
-              </w:rPr>
-              <w:lastRenderedPageBreak/>
-              <w:t>playneedle editor: width slider</w:t>
+              <w:t>ettings: components: playneedle editor: width slider</w:t>
             </w:r>
           </w:p>
         </w:tc>
@@ -8915,7 +9486,6 @@
                 <w:szCs w:val="18"/>
                 <w:lang w:val="en-CA"/>
               </w:rPr>
-              <w:lastRenderedPageBreak/>
               <w:t>C</w:t>
             </w:r>
             <w:r>
@@ -8924,16 +9494,7 @@
                 <w:szCs w:val="18"/>
                 <w:lang w:val="en-CA"/>
               </w:rPr>
-              <w:t xml:space="preserve">hange the playneedle width </w:t>
-            </w:r>
-            <w:r>
-              <w:rPr>
-                <w:sz w:val="16"/>
-                <w:szCs w:val="18"/>
-                <w:lang w:val="en-CA"/>
-              </w:rPr>
-              <w:lastRenderedPageBreak/>
-              <w:t>(px) slider</w:t>
+              <w:t>hange the playneedle width (px) slider</w:t>
             </w:r>
           </w:p>
         </w:tc>
@@ -8957,7 +9518,6 @@
                 <w:szCs w:val="18"/>
                 <w:lang w:val="en-CA"/>
               </w:rPr>
-              <w:lastRenderedPageBreak/>
               <w:t>I</w:t>
             </w:r>
             <w:r>
@@ -8966,16 +9526,7 @@
                 <w:szCs w:val="18"/>
                 <w:lang w:val="en-CA"/>
               </w:rPr>
-              <w:t xml:space="preserve">t should change the width of the </w:t>
-            </w:r>
-            <w:r>
-              <w:rPr>
-                <w:sz w:val="16"/>
-                <w:szCs w:val="18"/>
-                <w:lang w:val="en-CA"/>
-              </w:rPr>
-              <w:lastRenderedPageBreak/>
-              <w:t>playneedle both inside the editor and in the timeline.</w:t>
+              <w:t>t should change the width of the playneedle both inside the editor and in the timeline.</w:t>
             </w:r>
           </w:p>
         </w:tc>
@@ -8999,7 +9550,6 @@
                 <w:szCs w:val="18"/>
                 <w:lang w:val="en-CA"/>
               </w:rPr>
-              <w:lastRenderedPageBreak/>
               <w:t>W</w:t>
             </w:r>
             <w:r>
@@ -9016,7 +9566,6 @@
                 <w:szCs w:val="18"/>
                 <w:lang w:val="en-CA"/>
               </w:rPr>
-              <w:lastRenderedPageBreak/>
               <w:t>067b44dd917b163ba79b5362cfbd05c485b350d9</w:t>
             </w:r>
           </w:p>
@@ -10220,7 +10769,7 @@
   <w:style w:type="paragraph" w:default="1" w:styleId="a">
     <w:name w:val="Normal"/>
     <w:qFormat/>
-    <w:rsid w:val="00EC153A"/>
+    <w:rsid w:val="00877AA3"/>
     <w:pPr>
       <w:widowControl w:val="0"/>
     </w:pPr>

</xml_diff>

<commit_message>
fixed TEST_PLAN: DraggableModal: remember the page state next time you open it (#2 styles): styles page now remembers page state next time you open it
</commit_message>
<xml_diff>
--- a/test plan.docx
+++ b/test plan.docx
@@ -438,6 +438,7 @@
           <w:lang w:val="en-CA"/>
         </w:rPr>
       </w:pPr>
+      <w:proofErr w:type="spellStart"/>
       <w:r>
         <w:rPr>
           <w:rFonts w:hint="eastAsia"/>
@@ -459,6 +460,7 @@
         </w:rPr>
         <w:t>pp.tsx</w:t>
       </w:r>
+      <w:proofErr w:type="spellEnd"/>
     </w:p>
     <w:tbl>
       <w:tblPr>
@@ -643,22 +645,33 @@
         <w:tc>
           <w:tcPr>
             <w:tcW w:w="1843" w:type="dxa"/>
-          </w:tcPr>
-          <w:p>
-            <w:pPr>
-              <w:rPr>
-                <w:sz w:val="16"/>
-                <w:szCs w:val="18"/>
-                <w:lang w:val="en-CA"/>
-              </w:rPr>
-            </w:pPr>
-            <w:r>
-              <w:rPr>
-                <w:sz w:val="16"/>
-                <w:szCs w:val="18"/>
-                <w:lang w:val="en-CA"/>
-              </w:rPr>
-              <w:t>settings.tsx,</w:t>
+            <w:shd w:val="clear" w:color="auto" w:fill="D9F2D0" w:themeFill="accent6" w:themeFillTint="33"/>
+          </w:tcPr>
+          <w:p>
+            <w:pPr>
+              <w:rPr>
+                <w:sz w:val="16"/>
+                <w:szCs w:val="18"/>
+                <w:lang w:val="en-CA"/>
+              </w:rPr>
+            </w:pPr>
+            <w:proofErr w:type="spellStart"/>
+            <w:r>
+              <w:rPr>
+                <w:sz w:val="16"/>
+                <w:szCs w:val="18"/>
+                <w:lang w:val="en-CA"/>
+              </w:rPr>
+              <w:t>settings.tsx</w:t>
+            </w:r>
+            <w:proofErr w:type="spellEnd"/>
+            <w:r>
+              <w:rPr>
+                <w:sz w:val="16"/>
+                <w:szCs w:val="18"/>
+                <w:lang w:val="en-CA"/>
+              </w:rPr>
+              <w:t>,</w:t>
             </w:r>
             <w:r>
               <w:rPr>
@@ -668,6 +681,7 @@
               </w:rPr>
               <w:t xml:space="preserve"> </w:t>
             </w:r>
+            <w:proofErr w:type="spellStart"/>
             <w:r>
               <w:rPr>
                 <w:sz w:val="16"/>
@@ -676,27 +690,39 @@
               </w:rPr>
               <w:t>DraggableModal.tsx</w:t>
             </w:r>
+            <w:proofErr w:type="spellEnd"/>
           </w:p>
         </w:tc>
         <w:tc>
           <w:tcPr>
             <w:tcW w:w="1843" w:type="dxa"/>
-          </w:tcPr>
-          <w:p>
-            <w:pPr>
-              <w:rPr>
-                <w:sz w:val="16"/>
-                <w:szCs w:val="18"/>
-                <w:lang w:val="en-CA"/>
-              </w:rPr>
-            </w:pPr>
-            <w:r>
-              <w:rPr>
-                <w:sz w:val="16"/>
-                <w:szCs w:val="18"/>
-                <w:lang w:val="en-CA"/>
-              </w:rPr>
-              <w:t>DraggableModal:</w:t>
+            <w:shd w:val="clear" w:color="auto" w:fill="D9F2D0" w:themeFill="accent6" w:themeFillTint="33"/>
+          </w:tcPr>
+          <w:p>
+            <w:pPr>
+              <w:rPr>
+                <w:sz w:val="16"/>
+                <w:szCs w:val="18"/>
+                <w:lang w:val="en-CA"/>
+              </w:rPr>
+            </w:pPr>
+            <w:proofErr w:type="spellStart"/>
+            <w:r>
+              <w:rPr>
+                <w:sz w:val="16"/>
+                <w:szCs w:val="18"/>
+                <w:lang w:val="en-CA"/>
+              </w:rPr>
+              <w:t>DraggableModal</w:t>
+            </w:r>
+            <w:proofErr w:type="spellEnd"/>
+            <w:r>
+              <w:rPr>
+                <w:sz w:val="16"/>
+                <w:szCs w:val="18"/>
+                <w:lang w:val="en-CA"/>
+              </w:rPr>
+              <w:t>:</w:t>
             </w:r>
             <w:r>
               <w:rPr>
@@ -727,6 +753,7 @@
         <w:tc>
           <w:tcPr>
             <w:tcW w:w="2410" w:type="dxa"/>
+            <w:shd w:val="clear" w:color="auto" w:fill="D9F2D0" w:themeFill="accent6" w:themeFillTint="33"/>
           </w:tcPr>
           <w:p>
             <w:pPr>
@@ -775,6 +802,7 @@
         <w:tc>
           <w:tcPr>
             <w:tcW w:w="3118" w:type="dxa"/>
+            <w:shd w:val="clear" w:color="auto" w:fill="D9F2D0" w:themeFill="accent6" w:themeFillTint="33"/>
           </w:tcPr>
           <w:p>
             <w:pPr>
@@ -806,6 +834,7 @@
         <w:tc>
           <w:tcPr>
             <w:tcW w:w="2410" w:type="dxa"/>
+            <w:shd w:val="clear" w:color="auto" w:fill="D9F2D0" w:themeFill="accent6" w:themeFillTint="33"/>
           </w:tcPr>
           <w:p>
             <w:pPr>
@@ -847,6 +876,14 @@
                 <w:lang w:val="en-CA"/>
               </w:rPr>
               <w:t xml:space="preserve"> + 1</w:t>
+            </w:r>
+            <w:r>
+              <w:rPr>
+                <w:sz w:val="16"/>
+                <w:szCs w:val="18"/>
+                <w:lang w:val="en-CA"/>
+              </w:rPr>
+              <w:t>, working</w:t>
             </w:r>
           </w:p>
         </w:tc>
@@ -855,6 +892,7 @@
         <w:tc>
           <w:tcPr>
             <w:tcW w:w="1843" w:type="dxa"/>
+            <w:shd w:val="clear" w:color="auto" w:fill="D9F2D0" w:themeFill="accent6" w:themeFillTint="33"/>
           </w:tcPr>
           <w:p>
             <w:pPr>
@@ -865,14 +903,25 @@
                 <w:lang w:val="en-CA"/>
               </w:rPr>
             </w:pPr>
-            <w:r>
-              <w:rPr>
-                <w:sz w:val="16"/>
-                <w:szCs w:val="18"/>
-                <w:lang w:val="en-CA"/>
-              </w:rPr>
-              <w:t xml:space="preserve">styles.tsx. </w:t>
-            </w:r>
+            <w:proofErr w:type="spellStart"/>
+            <w:r>
+              <w:rPr>
+                <w:sz w:val="16"/>
+                <w:szCs w:val="18"/>
+                <w:lang w:val="en-CA"/>
+              </w:rPr>
+              <w:t>styles.tsx</w:t>
+            </w:r>
+            <w:proofErr w:type="spellEnd"/>
+            <w:r>
+              <w:rPr>
+                <w:sz w:val="16"/>
+                <w:szCs w:val="18"/>
+                <w:lang w:val="en-CA"/>
+              </w:rPr>
+              <w:t xml:space="preserve">. </w:t>
+            </w:r>
+            <w:proofErr w:type="spellStart"/>
             <w:r>
               <w:rPr>
                 <w:sz w:val="16"/>
@@ -881,33 +930,46 @@
               </w:rPr>
               <w:t>DraggableModal.tsx</w:t>
             </w:r>
+            <w:proofErr w:type="spellEnd"/>
           </w:p>
         </w:tc>
         <w:tc>
           <w:tcPr>
             <w:tcW w:w="1843" w:type="dxa"/>
-          </w:tcPr>
-          <w:p>
-            <w:pPr>
-              <w:rPr>
-                <w:sz w:val="16"/>
-                <w:szCs w:val="18"/>
-                <w:lang w:val="en-CA"/>
-              </w:rPr>
-            </w:pPr>
-            <w:r>
-              <w:rPr>
-                <w:sz w:val="16"/>
-                <w:szCs w:val="18"/>
-                <w:lang w:val="en-CA"/>
-              </w:rPr>
-              <w:t>DraggableModal: remember the page state next time you open it (#2 styles)</w:t>
+            <w:shd w:val="clear" w:color="auto" w:fill="D9F2D0" w:themeFill="accent6" w:themeFillTint="33"/>
+          </w:tcPr>
+          <w:p>
+            <w:pPr>
+              <w:rPr>
+                <w:sz w:val="16"/>
+                <w:szCs w:val="18"/>
+                <w:lang w:val="en-CA"/>
+              </w:rPr>
+            </w:pPr>
+            <w:proofErr w:type="spellStart"/>
+            <w:r>
+              <w:rPr>
+                <w:sz w:val="16"/>
+                <w:szCs w:val="18"/>
+                <w:lang w:val="en-CA"/>
+              </w:rPr>
+              <w:t>DraggableModal</w:t>
+            </w:r>
+            <w:proofErr w:type="spellEnd"/>
+            <w:r>
+              <w:rPr>
+                <w:sz w:val="16"/>
+                <w:szCs w:val="18"/>
+                <w:lang w:val="en-CA"/>
+              </w:rPr>
+              <w:t>: remember the page state next time you open it (#2 styles)</w:t>
             </w:r>
           </w:p>
         </w:tc>
         <w:tc>
           <w:tcPr>
             <w:tcW w:w="2410" w:type="dxa"/>
+            <w:shd w:val="clear" w:color="auto" w:fill="D9F2D0" w:themeFill="accent6" w:themeFillTint="33"/>
           </w:tcPr>
           <w:p>
             <w:pPr>
@@ -990,13 +1052,13 @@
         <w:tc>
           <w:tcPr>
             <w:tcW w:w="3118" w:type="dxa"/>
-          </w:tcPr>
-          <w:p>
-            <w:pPr>
-              <w:rPr>
-                <w:sz w:val="16"/>
-                <w:szCs w:val="18"/>
-                <w:lang w:val="en-CA"/>
+            <w:shd w:val="clear" w:color="auto" w:fill="D9F2D0" w:themeFill="accent6" w:themeFillTint="33"/>
+          </w:tcPr>
+          <w:p>
+            <w:pPr>
+              <w:rPr>
+                <w:sz w:val="16"/>
+                <w:szCs w:val="18"/>
               </w:rPr>
             </w:pPr>
             <w:r>
@@ -1016,36 +1078,188 @@
               </w:rPr>
               <w:t>he styles page should open where you left off</w:t>
             </w:r>
+            <w:r>
+              <w:rPr>
+                <w:sz w:val="16"/>
+                <w:szCs w:val="18"/>
+                <w:lang w:val="en-CA"/>
+              </w:rPr>
+              <w:t xml:space="preserve">. </w:t>
+            </w:r>
+            <w:r>
+              <w:rPr>
+                <w:sz w:val="16"/>
+                <w:szCs w:val="18"/>
+                <w:lang w:val="en-CA"/>
+              </w:rPr>
+              <w:t xml:space="preserve">THE FIX: deleted </w:t>
+            </w:r>
+            <w:proofErr w:type="spellStart"/>
+            <w:r>
+              <w:rPr>
+                <w:sz w:val="16"/>
+                <w:szCs w:val="18"/>
+                <w:lang w:val="en-CA"/>
+              </w:rPr>
+              <w:t>setStylePage</w:t>
+            </w:r>
+            <w:proofErr w:type="spellEnd"/>
+            <w:r>
+              <w:rPr>
+                <w:sz w:val="16"/>
+                <w:szCs w:val="18"/>
+                <w:lang w:val="en-CA"/>
+              </w:rPr>
+              <w:t>(null);</w:t>
+            </w:r>
+            <w:r>
+              <w:rPr>
+                <w:sz w:val="16"/>
+                <w:szCs w:val="18"/>
+                <w:lang w:val="en-CA"/>
+              </w:rPr>
+              <w:t xml:space="preserve"> on line 181 in </w:t>
+            </w:r>
+            <w:proofErr w:type="spellStart"/>
+            <w:r>
+              <w:rPr>
+                <w:sz w:val="16"/>
+                <w:szCs w:val="18"/>
+                <w:lang w:val="en-CA"/>
+              </w:rPr>
+              <w:t>styles.tsx</w:t>
+            </w:r>
+            <w:proofErr w:type="spellEnd"/>
+            <w:r>
+              <w:rPr>
+                <w:sz w:val="16"/>
+                <w:szCs w:val="18"/>
+                <w:lang w:val="en-CA"/>
+              </w:rPr>
+              <w:t xml:space="preserve"> to </w:t>
+            </w:r>
+            <w:proofErr w:type="spellStart"/>
+            <w:r>
+              <w:rPr>
+                <w:i/>
+                <w:iCs/>
+                <w:sz w:val="16"/>
+                <w:szCs w:val="18"/>
+              </w:rPr>
+              <w:t>onClose</w:t>
+            </w:r>
+            <w:proofErr w:type="spellEnd"/>
+            <w:r>
+              <w:rPr>
+                <w:sz w:val="16"/>
+                <w:szCs w:val="18"/>
+              </w:rPr>
+              <w:t xml:space="preserve">={() =&gt; { </w:t>
+            </w:r>
+            <w:proofErr w:type="spellStart"/>
+            <w:r>
+              <w:rPr>
+                <w:sz w:val="16"/>
+                <w:szCs w:val="18"/>
+              </w:rPr>
+              <w:t>modalManager.close</w:t>
+            </w:r>
+            <w:proofErr w:type="spellEnd"/>
+            <w:r>
+              <w:rPr>
+                <w:sz w:val="16"/>
+                <w:szCs w:val="18"/>
+              </w:rPr>
+              <w:t xml:space="preserve">('styles'); </w:t>
+            </w:r>
+            <w:proofErr w:type="spellStart"/>
+            <w:r>
+              <w:rPr>
+                <w:sz w:val="16"/>
+                <w:szCs w:val="18"/>
+              </w:rPr>
+              <w:t>setShowStyle</w:t>
+            </w:r>
+            <w:proofErr w:type="spellEnd"/>
+            <w:r>
+              <w:rPr>
+                <w:sz w:val="16"/>
+                <w:szCs w:val="18"/>
+              </w:rPr>
+              <w:t>(</w:t>
+            </w:r>
+            <w:r>
+              <w:rPr>
+                <w:i/>
+                <w:iCs/>
+                <w:sz w:val="16"/>
+                <w:szCs w:val="18"/>
+              </w:rPr>
+              <w:t>false</w:t>
+            </w:r>
+            <w:r>
+              <w:rPr>
+                <w:sz w:val="16"/>
+                <w:szCs w:val="18"/>
+              </w:rPr>
+              <w:t>);}}</w:t>
+            </w:r>
+          </w:p>
+          <w:p>
+            <w:pPr>
+              <w:rPr>
+                <w:sz w:val="16"/>
+                <w:szCs w:val="18"/>
+                <w:lang w:val="en-CA"/>
+              </w:rPr>
+            </w:pPr>
           </w:p>
         </w:tc>
         <w:tc>
           <w:tcPr>
             <w:tcW w:w="2410" w:type="dxa"/>
-          </w:tcPr>
-          <w:p>
-            <w:pPr>
-              <w:rPr>
-                <w:sz w:val="16"/>
-                <w:szCs w:val="18"/>
-                <w:lang w:val="en-CA"/>
-              </w:rPr>
-            </w:pPr>
-            <w:r>
-              <w:rPr>
-                <w:rFonts w:hint="eastAsia"/>
-                <w:sz w:val="16"/>
-                <w:szCs w:val="18"/>
-                <w:lang w:val="en-CA"/>
-              </w:rPr>
-              <w:t>N</w:t>
-            </w:r>
-            <w:r>
-              <w:rPr>
-                <w:sz w:val="16"/>
-                <w:szCs w:val="18"/>
-                <w:lang w:val="en-CA"/>
-              </w:rPr>
-              <w:t>ot implemented yet</w:t>
+            <w:shd w:val="clear" w:color="auto" w:fill="D9F2D0" w:themeFill="accent6" w:themeFillTint="33"/>
+          </w:tcPr>
+          <w:p>
+            <w:pPr>
+              <w:rPr>
+                <w:sz w:val="16"/>
+                <w:szCs w:val="18"/>
+                <w:lang w:val="en-CA"/>
+              </w:rPr>
+            </w:pPr>
+            <w:r>
+              <w:rPr>
+                <w:rFonts w:hint="eastAsia"/>
+                <w:sz w:val="16"/>
+                <w:szCs w:val="18"/>
+                <w:lang w:val="en-CA"/>
+              </w:rPr>
+              <w:t>I</w:t>
+            </w:r>
+            <w:r>
+              <w:rPr>
+                <w:sz w:val="16"/>
+                <w:szCs w:val="18"/>
+                <w:lang w:val="en-CA"/>
+              </w:rPr>
+              <w:t xml:space="preserve">mplemented as of </w:t>
+            </w:r>
+            <w:r>
+              <w:rPr>
+                <w:sz w:val="16"/>
+                <w:szCs w:val="18"/>
+                <w:lang w:val="en-CA"/>
+              </w:rPr>
+              <w:t>671c55a66f759fcb0d64d194414cb33a1d4f0d15</w:t>
+            </w:r>
+            <w:r>
+              <w:rPr>
+                <w:sz w:val="16"/>
+                <w:szCs w:val="18"/>
+                <w:lang w:val="en-CA"/>
+              </w:rPr>
+              <w:t xml:space="preserve"> + 1. working</w:t>
             </w:r>
           </w:p>
         </w:tc>
@@ -1076,6 +1290,7 @@
           <w:lang w:val="en-CA"/>
         </w:rPr>
       </w:pPr>
+      <w:proofErr w:type="spellStart"/>
       <w:r>
         <w:rPr>
           <w:rFonts w:hint="eastAsia"/>
@@ -1097,6 +1312,7 @@
         </w:rPr>
         <w:t>ettings.tsx</w:t>
       </w:r>
+      <w:proofErr w:type="spellEnd"/>
       <w:r>
         <w:rPr>
           <w:b/>
@@ -1308,6 +1524,7 @@
                 <w:lang w:val="en-CA"/>
               </w:rPr>
             </w:pPr>
+            <w:proofErr w:type="spellStart"/>
             <w:r>
               <w:rPr>
                 <w:sz w:val="16"/>
@@ -1316,6 +1533,7 @@
               </w:rPr>
               <w:t>Settings.tsx</w:t>
             </w:r>
+            <w:proofErr w:type="spellEnd"/>
           </w:p>
         </w:tc>
         <w:tc>
@@ -1442,7 +1660,25 @@
                 <w:szCs w:val="18"/>
                 <w:lang w:val="en-CA"/>
               </w:rPr>
-              <w:t xml:space="preserve">he keybind box keeps registering your keys until you click away from the box. </w:t>
+              <w:t xml:space="preserve">he </w:t>
+            </w:r>
+            <w:proofErr w:type="spellStart"/>
+            <w:r>
+              <w:rPr>
+                <w:sz w:val="16"/>
+                <w:szCs w:val="18"/>
+                <w:lang w:val="en-CA"/>
+              </w:rPr>
+              <w:t>keybind</w:t>
+            </w:r>
+            <w:proofErr w:type="spellEnd"/>
+            <w:r>
+              <w:rPr>
+                <w:sz w:val="16"/>
+                <w:szCs w:val="18"/>
+                <w:lang w:val="en-CA"/>
+              </w:rPr>
+              <w:t xml:space="preserve"> box keeps registering your keys until you click away from the box. </w:t>
             </w:r>
             <w:r>
               <w:rPr>
@@ -1459,7 +1695,62 @@
                 <w:szCs w:val="18"/>
                 <w:lang w:val="en-CA"/>
               </w:rPr>
-              <w:t xml:space="preserve">his behavior may be ambiguous to users because there’s no visual indicator as to which keybind box is selected or that you have to click away to apply the keybind. </w:t>
+              <w:t xml:space="preserve">his behavior may be ambiguous to users because there’s no visual indicator as to which </w:t>
+            </w:r>
+            <w:proofErr w:type="spellStart"/>
+            <w:r>
+              <w:rPr>
+                <w:sz w:val="16"/>
+                <w:szCs w:val="18"/>
+                <w:lang w:val="en-CA"/>
+              </w:rPr>
+              <w:t>keybind</w:t>
+            </w:r>
+            <w:proofErr w:type="spellEnd"/>
+            <w:r>
+              <w:rPr>
+                <w:sz w:val="16"/>
+                <w:szCs w:val="18"/>
+                <w:lang w:val="en-CA"/>
+              </w:rPr>
+              <w:t xml:space="preserve"> box is selected or that you </w:t>
+            </w:r>
+            <w:proofErr w:type="gramStart"/>
+            <w:r>
+              <w:rPr>
+                <w:sz w:val="16"/>
+                <w:szCs w:val="18"/>
+                <w:lang w:val="en-CA"/>
+              </w:rPr>
+              <w:t>have to</w:t>
+            </w:r>
+            <w:proofErr w:type="gramEnd"/>
+            <w:r>
+              <w:rPr>
+                <w:sz w:val="16"/>
+                <w:szCs w:val="18"/>
+                <w:lang w:val="en-CA"/>
+              </w:rPr>
+              <w:t xml:space="preserve"> click away to apply the </w:t>
+            </w:r>
+            <w:proofErr w:type="spellStart"/>
+            <w:r>
+              <w:rPr>
+                <w:sz w:val="16"/>
+                <w:szCs w:val="18"/>
+                <w:lang w:val="en-CA"/>
+              </w:rPr>
+              <w:lastRenderedPageBreak/>
+              <w:t>keybind</w:t>
+            </w:r>
+            <w:proofErr w:type="spellEnd"/>
+            <w:r>
+              <w:rPr>
+                <w:sz w:val="16"/>
+                <w:szCs w:val="18"/>
+                <w:lang w:val="en-CA"/>
+              </w:rPr>
+              <w:t xml:space="preserve">. </w:t>
             </w:r>
             <w:r>
               <w:rPr>
@@ -1476,16 +1767,25 @@
                 <w:szCs w:val="18"/>
                 <w:lang w:val="en-CA"/>
               </w:rPr>
-              <w:t xml:space="preserve">ither add a visual </w:t>
-            </w:r>
-            <w:r>
-              <w:rPr>
-                <w:sz w:val="16"/>
-                <w:szCs w:val="18"/>
-                <w:lang w:val="en-CA"/>
-              </w:rPr>
-              <w:lastRenderedPageBreak/>
-              <w:t>indicator or accept the keybind after 1 keypress.</w:t>
+              <w:t xml:space="preserve">ither add a visual indicator or accept the </w:t>
+            </w:r>
+            <w:proofErr w:type="spellStart"/>
+            <w:r>
+              <w:rPr>
+                <w:sz w:val="16"/>
+                <w:szCs w:val="18"/>
+                <w:lang w:val="en-CA"/>
+              </w:rPr>
+              <w:t>keybind</w:t>
+            </w:r>
+            <w:proofErr w:type="spellEnd"/>
+            <w:r>
+              <w:rPr>
+                <w:sz w:val="16"/>
+                <w:szCs w:val="18"/>
+                <w:lang w:val="en-CA"/>
+              </w:rPr>
+              <w:t xml:space="preserve"> after 1 keypress.</w:t>
             </w:r>
           </w:p>
         </w:tc>
@@ -1504,6 +1804,7 @@
                 <w:lang w:val="en-CA"/>
               </w:rPr>
             </w:pPr>
+            <w:proofErr w:type="spellStart"/>
             <w:r>
               <w:rPr>
                 <w:rFonts w:hint="eastAsia"/>
@@ -1522,6 +1823,7 @@
               </w:rPr>
               <w:t>ettings.tsx</w:t>
             </w:r>
+            <w:proofErr w:type="spellEnd"/>
           </w:p>
         </w:tc>
         <w:tc>
@@ -1616,7 +1918,25 @@
                 <w:szCs w:val="18"/>
                 <w:lang w:val="en-CA"/>
               </w:rPr>
-              <w:t xml:space="preserve">ny modified keybinds should reset to default. </w:t>
+              <w:t xml:space="preserve">ny modified </w:t>
+            </w:r>
+            <w:proofErr w:type="spellStart"/>
+            <w:r>
+              <w:rPr>
+                <w:sz w:val="16"/>
+                <w:szCs w:val="18"/>
+                <w:lang w:val="en-CA"/>
+              </w:rPr>
+              <w:t>keybinds</w:t>
+            </w:r>
+            <w:proofErr w:type="spellEnd"/>
+            <w:r>
+              <w:rPr>
+                <w:sz w:val="16"/>
+                <w:szCs w:val="18"/>
+                <w:lang w:val="en-CA"/>
+              </w:rPr>
+              <w:t xml:space="preserve"> should reset to default. </w:t>
             </w:r>
             <w:r>
               <w:rPr>
@@ -1633,7 +1953,25 @@
                 <w:szCs w:val="18"/>
                 <w:lang w:val="en-CA"/>
               </w:rPr>
-              <w:t xml:space="preserve">ny non default additional keybinds should be gone. </w:t>
+              <w:t xml:space="preserve">ny non default additional </w:t>
+            </w:r>
+            <w:proofErr w:type="spellStart"/>
+            <w:r>
+              <w:rPr>
+                <w:sz w:val="16"/>
+                <w:szCs w:val="18"/>
+                <w:lang w:val="en-CA"/>
+              </w:rPr>
+              <w:t>keybinds</w:t>
+            </w:r>
+            <w:proofErr w:type="spellEnd"/>
+            <w:r>
+              <w:rPr>
+                <w:sz w:val="16"/>
+                <w:szCs w:val="18"/>
+                <w:lang w:val="en-CA"/>
+              </w:rPr>
+              <w:t xml:space="preserve"> should be gone. </w:t>
             </w:r>
             <w:r>
               <w:rPr>
@@ -1650,7 +1988,25 @@
                 <w:szCs w:val="18"/>
                 <w:lang w:val="en-CA"/>
               </w:rPr>
-              <w:t>ny removed keybinds from the default setting should be added back</w:t>
+              <w:t xml:space="preserve">ny removed </w:t>
+            </w:r>
+            <w:proofErr w:type="spellStart"/>
+            <w:r>
+              <w:rPr>
+                <w:sz w:val="16"/>
+                <w:szCs w:val="18"/>
+                <w:lang w:val="en-CA"/>
+              </w:rPr>
+              <w:t>keybinds</w:t>
+            </w:r>
+            <w:proofErr w:type="spellEnd"/>
+            <w:r>
+              <w:rPr>
+                <w:sz w:val="16"/>
+                <w:szCs w:val="18"/>
+                <w:lang w:val="en-CA"/>
+              </w:rPr>
+              <w:t xml:space="preserve"> from the default setting should be added back</w:t>
             </w:r>
           </w:p>
         </w:tc>
@@ -1692,6 +2048,7 @@
                 <w:lang w:val="en-CA"/>
               </w:rPr>
             </w:pPr>
+            <w:proofErr w:type="spellStart"/>
             <w:r>
               <w:rPr>
                 <w:rFonts w:hint="eastAsia"/>
@@ -1709,6 +2066,7 @@
               </w:rPr>
               <w:t>ettings.tsx</w:t>
             </w:r>
+            <w:proofErr w:type="spellEnd"/>
           </w:p>
         </w:tc>
         <w:tc>
@@ -1803,7 +2161,25 @@
                 <w:szCs w:val="18"/>
                 <w:lang w:val="en-CA"/>
               </w:rPr>
-              <w:t xml:space="preserve">t should add a new keybind box. </w:t>
+              <w:t xml:space="preserve">t should add a new </w:t>
+            </w:r>
+            <w:proofErr w:type="spellStart"/>
+            <w:r>
+              <w:rPr>
+                <w:sz w:val="16"/>
+                <w:szCs w:val="18"/>
+                <w:lang w:val="en-CA"/>
+              </w:rPr>
+              <w:t>keybind</w:t>
+            </w:r>
+            <w:proofErr w:type="spellEnd"/>
+            <w:r>
+              <w:rPr>
+                <w:sz w:val="16"/>
+                <w:szCs w:val="18"/>
+                <w:lang w:val="en-CA"/>
+              </w:rPr>
+              <w:t xml:space="preserve"> box. </w:t>
             </w:r>
             <w:r>
               <w:rPr>
@@ -1820,7 +2196,25 @@
                 <w:szCs w:val="18"/>
                 <w:lang w:val="en-CA"/>
               </w:rPr>
-              <w:t>oth keybind boxes should have an “x” button</w:t>
+              <w:t xml:space="preserve">oth </w:t>
+            </w:r>
+            <w:proofErr w:type="spellStart"/>
+            <w:r>
+              <w:rPr>
+                <w:sz w:val="16"/>
+                <w:szCs w:val="18"/>
+                <w:lang w:val="en-CA"/>
+              </w:rPr>
+              <w:t>keybind</w:t>
+            </w:r>
+            <w:proofErr w:type="spellEnd"/>
+            <w:r>
+              <w:rPr>
+                <w:sz w:val="16"/>
+                <w:szCs w:val="18"/>
+                <w:lang w:val="en-CA"/>
+              </w:rPr>
+              <w:t xml:space="preserve"> boxes should have an “x” button</w:t>
             </w:r>
           </w:p>
         </w:tc>
@@ -1862,6 +2256,7 @@
                 <w:lang w:val="en-CA"/>
               </w:rPr>
             </w:pPr>
+            <w:proofErr w:type="spellStart"/>
             <w:r>
               <w:rPr>
                 <w:rFonts w:hint="eastAsia"/>
@@ -1879,6 +2274,7 @@
               </w:rPr>
               <w:t>ettings.tsx</w:t>
             </w:r>
+            <w:proofErr w:type="spellEnd"/>
           </w:p>
         </w:tc>
         <w:tc>
@@ -1941,7 +2337,25 @@
                 <w:szCs w:val="18"/>
                 <w:lang w:val="en-CA"/>
               </w:rPr>
-              <w:t>lick the “x” button on the right side in a keybind box</w:t>
+              <w:t xml:space="preserve">lick the “x” button on the right side in a </w:t>
+            </w:r>
+            <w:proofErr w:type="spellStart"/>
+            <w:r>
+              <w:rPr>
+                <w:sz w:val="16"/>
+                <w:szCs w:val="18"/>
+                <w:lang w:val="en-CA"/>
+              </w:rPr>
+              <w:t>keybind</w:t>
+            </w:r>
+            <w:proofErr w:type="spellEnd"/>
+            <w:r>
+              <w:rPr>
+                <w:sz w:val="16"/>
+                <w:szCs w:val="18"/>
+                <w:lang w:val="en-CA"/>
+              </w:rPr>
+              <w:t xml:space="preserve"> box</w:t>
             </w:r>
           </w:p>
         </w:tc>
@@ -1973,7 +2387,25 @@
                 <w:szCs w:val="18"/>
                 <w:lang w:val="en-CA"/>
               </w:rPr>
-              <w:t xml:space="preserve">t should delete that keybind. </w:t>
+              <w:t xml:space="preserve">t should delete that </w:t>
+            </w:r>
+            <w:proofErr w:type="spellStart"/>
+            <w:r>
+              <w:rPr>
+                <w:sz w:val="16"/>
+                <w:szCs w:val="18"/>
+                <w:lang w:val="en-CA"/>
+              </w:rPr>
+              <w:t>keybind</w:t>
+            </w:r>
+            <w:proofErr w:type="spellEnd"/>
+            <w:r>
+              <w:rPr>
+                <w:sz w:val="16"/>
+                <w:szCs w:val="18"/>
+                <w:lang w:val="en-CA"/>
+              </w:rPr>
+              <w:t xml:space="preserve">. </w:t>
             </w:r>
             <w:r>
               <w:rPr>
@@ -1990,7 +2422,25 @@
                 <w:szCs w:val="18"/>
                 <w:lang w:val="en-CA"/>
               </w:rPr>
-              <w:t>f there is only one keybind, there should still be an X button</w:t>
+              <w:t xml:space="preserve">f there is only one </w:t>
+            </w:r>
+            <w:proofErr w:type="spellStart"/>
+            <w:r>
+              <w:rPr>
+                <w:sz w:val="16"/>
+                <w:szCs w:val="18"/>
+                <w:lang w:val="en-CA"/>
+              </w:rPr>
+              <w:t>keybind</w:t>
+            </w:r>
+            <w:proofErr w:type="spellEnd"/>
+            <w:r>
+              <w:rPr>
+                <w:sz w:val="16"/>
+                <w:szCs w:val="18"/>
+                <w:lang w:val="en-CA"/>
+              </w:rPr>
+              <w:t>, there should still be an X button</w:t>
             </w:r>
           </w:p>
         </w:tc>
@@ -2022,7 +2472,25 @@
                 <w:szCs w:val="18"/>
                 <w:lang w:val="en-CA"/>
               </w:rPr>
-              <w:t>ingle keybinds don’t have an X button</w:t>
+              <w:t xml:space="preserve">ingle </w:t>
+            </w:r>
+            <w:proofErr w:type="spellStart"/>
+            <w:r>
+              <w:rPr>
+                <w:sz w:val="16"/>
+                <w:szCs w:val="18"/>
+                <w:lang w:val="en-CA"/>
+              </w:rPr>
+              <w:t>keybinds</w:t>
+            </w:r>
+            <w:proofErr w:type="spellEnd"/>
+            <w:r>
+              <w:rPr>
+                <w:sz w:val="16"/>
+                <w:szCs w:val="18"/>
+                <w:lang w:val="en-CA"/>
+              </w:rPr>
+              <w:t xml:space="preserve"> don’t have an X button</w:t>
             </w:r>
             <w:r>
               <w:rPr>
@@ -2047,7 +2515,25 @@
                 <w:szCs w:val="18"/>
                 <w:lang w:val="en-CA"/>
               </w:rPr>
-              <w:t>eeds fixing: allow single keybinds to have an X button</w:t>
+              <w:t xml:space="preserve">eeds fixing: allow single </w:t>
+            </w:r>
+            <w:proofErr w:type="spellStart"/>
+            <w:r>
+              <w:rPr>
+                <w:sz w:val="16"/>
+                <w:szCs w:val="18"/>
+                <w:lang w:val="en-CA"/>
+              </w:rPr>
+              <w:t>keybinds</w:t>
+            </w:r>
+            <w:proofErr w:type="spellEnd"/>
+            <w:r>
+              <w:rPr>
+                <w:sz w:val="16"/>
+                <w:szCs w:val="18"/>
+                <w:lang w:val="en-CA"/>
+              </w:rPr>
+              <w:t xml:space="preserve"> to have an X button</w:t>
             </w:r>
           </w:p>
         </w:tc>
@@ -2066,6 +2552,7 @@
                 <w:lang w:val="en-CA"/>
               </w:rPr>
             </w:pPr>
+            <w:proofErr w:type="spellStart"/>
             <w:r>
               <w:rPr>
                 <w:rFonts w:hint="eastAsia"/>
@@ -2083,6 +2570,7 @@
               </w:rPr>
               <w:t>ettings.tsx</w:t>
             </w:r>
+            <w:proofErr w:type="spellEnd"/>
           </w:p>
         </w:tc>
         <w:tc>
@@ -2145,8 +2633,18 @@
                 <w:szCs w:val="18"/>
                 <w:lang w:val="en-CA"/>
               </w:rPr>
-              <w:t>ake an adjustment to the clip in the timeline and press the undo keybind</w:t>
-            </w:r>
+              <w:t xml:space="preserve">ake an adjustment to the clip in the timeline and press the undo </w:t>
+            </w:r>
+            <w:proofErr w:type="spellStart"/>
+            <w:r>
+              <w:rPr>
+                <w:sz w:val="16"/>
+                <w:szCs w:val="18"/>
+                <w:lang w:val="en-CA"/>
+              </w:rPr>
+              <w:t>keybind</w:t>
+            </w:r>
+            <w:proofErr w:type="spellEnd"/>
           </w:p>
         </w:tc>
         <w:tc>
@@ -2231,6 +2729,7 @@
           <w:lang w:val="en-CA"/>
         </w:rPr>
       </w:pPr>
+      <w:proofErr w:type="spellStart"/>
       <w:r>
         <w:rPr>
           <w:rFonts w:hint="eastAsia"/>
@@ -2250,7 +2749,18 @@
           <w:szCs w:val="32"/>
           <w:lang w:val="en-CA"/>
         </w:rPr>
-        <w:t xml:space="preserve">ettings.tsx: </w:t>
+        <w:t>ettings.tsx</w:t>
+      </w:r>
+      <w:proofErr w:type="spellEnd"/>
+      <w:r>
+        <w:rPr>
+          <w:b/>
+          <w:bCs/>
+          <w:sz w:val="28"/>
+          <w:szCs w:val="32"/>
+          <w:lang w:val="en-CA"/>
+        </w:rPr>
+        <w:t xml:space="preserve">: </w:t>
       </w:r>
       <w:r>
         <w:rPr>
@@ -2457,6 +2967,7 @@
                 <w:lang w:val="en-CA"/>
               </w:rPr>
             </w:pPr>
+            <w:proofErr w:type="spellStart"/>
             <w:r>
               <w:rPr>
                 <w:rFonts w:hint="eastAsia"/>
@@ -2474,14 +2985,25 @@
               </w:rPr>
               <w:t>ettings.tsx</w:t>
             </w:r>
-            <w:r>
-              <w:rPr>
-                <w:sz w:val="16"/>
-                <w:szCs w:val="18"/>
-                <w:lang w:val="en-CA"/>
-              </w:rPr>
-              <w:t xml:space="preserve"> DraggableModal.tsx</w:t>
-            </w:r>
+            <w:proofErr w:type="spellEnd"/>
+            <w:r>
+              <w:rPr>
+                <w:sz w:val="16"/>
+                <w:szCs w:val="18"/>
+                <w:lang w:val="en-CA"/>
+              </w:rPr>
+              <w:t xml:space="preserve"> </w:t>
+            </w:r>
+            <w:proofErr w:type="spellStart"/>
+            <w:r>
+              <w:rPr>
+                <w:sz w:val="16"/>
+                <w:szCs w:val="18"/>
+                <w:lang w:val="en-CA"/>
+              </w:rPr>
+              <w:t>DraggableModal.tsx</w:t>
+            </w:r>
+            <w:proofErr w:type="spellEnd"/>
           </w:p>
         </w:tc>
         <w:tc>
@@ -2562,6 +3084,7 @@
               </w:rPr>
               <w:t xml:space="preserve">pen a modal, </w:t>
             </w:r>
+            <w:proofErr w:type="gramStart"/>
             <w:r>
               <w:rPr>
                 <w:rFonts w:hint="eastAsia"/>
@@ -2577,7 +3100,16 @@
                 <w:szCs w:val="18"/>
                 <w:lang w:val="en-CA"/>
               </w:rPr>
-              <w:t>ry dragging the x button, - button, and back button.</w:t>
+              <w:t>ry</w:t>
+            </w:r>
+            <w:proofErr w:type="gramEnd"/>
+            <w:r>
+              <w:rPr>
+                <w:sz w:val="16"/>
+                <w:szCs w:val="18"/>
+                <w:lang w:val="en-CA"/>
+              </w:rPr>
+              <w:t xml:space="preserve"> dragging the x button, - button, and back button.</w:t>
             </w:r>
           </w:p>
         </w:tc>
@@ -2671,6 +3203,7 @@
                 <w:lang w:val="en-CA"/>
               </w:rPr>
             </w:pPr>
+            <w:proofErr w:type="spellStart"/>
             <w:r>
               <w:rPr>
                 <w:rFonts w:hint="eastAsia"/>
@@ -2688,14 +3221,25 @@
               </w:rPr>
               <w:t>ettings.tsx</w:t>
             </w:r>
-            <w:r>
-              <w:rPr>
-                <w:sz w:val="16"/>
-                <w:szCs w:val="18"/>
-                <w:lang w:val="en-CA"/>
-              </w:rPr>
-              <w:t xml:space="preserve"> DraggableModal.tsx</w:t>
-            </w:r>
+            <w:proofErr w:type="spellEnd"/>
+            <w:r>
+              <w:rPr>
+                <w:sz w:val="16"/>
+                <w:szCs w:val="18"/>
+                <w:lang w:val="en-CA"/>
+              </w:rPr>
+              <w:t xml:space="preserve"> </w:t>
+            </w:r>
+            <w:proofErr w:type="spellStart"/>
+            <w:r>
+              <w:rPr>
+                <w:sz w:val="16"/>
+                <w:szCs w:val="18"/>
+                <w:lang w:val="en-CA"/>
+              </w:rPr>
+              <w:t>DraggableModal.tsx</w:t>
+            </w:r>
+            <w:proofErr w:type="spellEnd"/>
           </w:p>
         </w:tc>
         <w:tc>
@@ -2882,6 +3426,7 @@
                 <w:lang w:val="en-CA"/>
               </w:rPr>
             </w:pPr>
+            <w:proofErr w:type="spellStart"/>
             <w:r>
               <w:rPr>
                 <w:rFonts w:hint="eastAsia"/>
@@ -2897,8 +3442,27 @@
                 <w:szCs w:val="18"/>
                 <w:lang w:val="en-CA"/>
               </w:rPr>
-              <w:t>ettings.tsx, DraggableModal.tsx</w:t>
-            </w:r>
+              <w:t>ettings.tsx</w:t>
+            </w:r>
+            <w:proofErr w:type="spellEnd"/>
+            <w:r>
+              <w:rPr>
+                <w:sz w:val="16"/>
+                <w:szCs w:val="18"/>
+                <w:lang w:val="en-CA"/>
+              </w:rPr>
+              <w:t xml:space="preserve">, </w:t>
+            </w:r>
+            <w:proofErr w:type="spellStart"/>
+            <w:r>
+              <w:rPr>
+                <w:sz w:val="16"/>
+                <w:szCs w:val="18"/>
+                <w:lang w:val="en-CA"/>
+              </w:rPr>
+              <w:t>DraggableModal.tsx</w:t>
+            </w:r>
+            <w:proofErr w:type="spellEnd"/>
           </w:p>
         </w:tc>
         <w:tc>
@@ -2977,6 +3541,7 @@
               </w:rPr>
               <w:t xml:space="preserve">pen a modal, </w:t>
             </w:r>
+            <w:proofErr w:type="gramStart"/>
             <w:r>
               <w:rPr>
                 <w:rFonts w:hint="eastAsia"/>
@@ -2992,7 +3557,16 @@
                 <w:szCs w:val="18"/>
                 <w:lang w:val="en-CA"/>
               </w:rPr>
-              <w:t>ry clicking on the x button, - button, or back button</w:t>
+              <w:t>ry</w:t>
+            </w:r>
+            <w:proofErr w:type="gramEnd"/>
+            <w:r>
+              <w:rPr>
+                <w:sz w:val="16"/>
+                <w:szCs w:val="18"/>
+                <w:lang w:val="en-CA"/>
+              </w:rPr>
+              <w:t xml:space="preserve"> clicking on the x button, - button, or back button</w:t>
             </w:r>
           </w:p>
         </w:tc>
@@ -3084,6 +3658,7 @@
                 <w:lang w:val="en-CA"/>
               </w:rPr>
             </w:pPr>
+            <w:proofErr w:type="spellStart"/>
             <w:r>
               <w:rPr>
                 <w:rFonts w:hint="eastAsia"/>
@@ -3101,14 +3676,25 @@
               </w:rPr>
               <w:t>ettings.tsx</w:t>
             </w:r>
-            <w:r>
-              <w:rPr>
-                <w:sz w:val="16"/>
-                <w:szCs w:val="18"/>
-                <w:lang w:val="en-CA"/>
-              </w:rPr>
-              <w:t xml:space="preserve"> DraggableModal.tsx</w:t>
-            </w:r>
+            <w:proofErr w:type="spellEnd"/>
+            <w:r>
+              <w:rPr>
+                <w:sz w:val="16"/>
+                <w:szCs w:val="18"/>
+                <w:lang w:val="en-CA"/>
+              </w:rPr>
+              <w:t xml:space="preserve"> </w:t>
+            </w:r>
+            <w:proofErr w:type="spellStart"/>
+            <w:r>
+              <w:rPr>
+                <w:sz w:val="16"/>
+                <w:szCs w:val="18"/>
+                <w:lang w:val="en-CA"/>
+              </w:rPr>
+              <w:t>DraggableModal.tsx</w:t>
+            </w:r>
+            <w:proofErr w:type="spellEnd"/>
           </w:p>
         </w:tc>
         <w:tc>
@@ -3304,6 +3890,7 @@
                 <w:lang w:val="en-CA"/>
               </w:rPr>
             </w:pPr>
+            <w:proofErr w:type="spellStart"/>
             <w:r>
               <w:rPr>
                 <w:rFonts w:hint="eastAsia"/>
@@ -3319,8 +3906,27 @@
                 <w:szCs w:val="18"/>
                 <w:lang w:val="en-CA"/>
               </w:rPr>
-              <w:t>ettings.tsx, DraggableModal.tsx</w:t>
-            </w:r>
+              <w:t>ettings.tsx</w:t>
+            </w:r>
+            <w:proofErr w:type="spellEnd"/>
+            <w:r>
+              <w:rPr>
+                <w:sz w:val="16"/>
+                <w:szCs w:val="18"/>
+                <w:lang w:val="en-CA"/>
+              </w:rPr>
+              <w:t xml:space="preserve">, </w:t>
+            </w:r>
+            <w:proofErr w:type="spellStart"/>
+            <w:r>
+              <w:rPr>
+                <w:sz w:val="16"/>
+                <w:szCs w:val="18"/>
+                <w:lang w:val="en-CA"/>
+              </w:rPr>
+              <w:t>DraggableModal.tsx</w:t>
+            </w:r>
+            <w:proofErr w:type="spellEnd"/>
           </w:p>
         </w:tc>
         <w:tc>
@@ -3479,7 +4085,7 @@
                 <w:szCs w:val="18"/>
                 <w:lang w:val="en-CA"/>
               </w:rPr>
-              <w:t xml:space="preserve">urning this setting on allows you to drag the modal, which isn’t what this </w:t>
+              <w:t xml:space="preserve">urning this setting on allows you to drag </w:t>
             </w:r>
             <w:r>
               <w:rPr>
@@ -3488,7 +4094,7 @@
                 <w:lang w:val="en-CA"/>
               </w:rPr>
               <w:lastRenderedPageBreak/>
-              <w:t>setting is supposed to do.</w:t>
+              <w:t>the modal, which isn’t what this setting is supposed to do.</w:t>
             </w:r>
           </w:p>
         </w:tc>
@@ -3508,6 +4114,7 @@
                 <w:lang w:val="en-CA"/>
               </w:rPr>
             </w:pPr>
+            <w:proofErr w:type="spellStart"/>
             <w:r>
               <w:rPr>
                 <w:rFonts w:hint="eastAsia"/>
@@ -3526,14 +4133,79 @@
               </w:rPr>
               <w:t>ettings.tsx</w:t>
             </w:r>
-            <w:r>
-              <w:rPr>
-                <w:sz w:val="16"/>
-                <w:szCs w:val="18"/>
-                <w:lang w:val="en-CA"/>
-              </w:rPr>
-              <w:t>, draggableModal.tsx, Toast.tsx, modalManager.ts, modalPermissions.ts</w:t>
-            </w:r>
+            <w:proofErr w:type="spellEnd"/>
+            <w:r>
+              <w:rPr>
+                <w:sz w:val="16"/>
+                <w:szCs w:val="18"/>
+                <w:lang w:val="en-CA"/>
+              </w:rPr>
+              <w:t xml:space="preserve">, </w:t>
+            </w:r>
+            <w:proofErr w:type="spellStart"/>
+            <w:r>
+              <w:rPr>
+                <w:sz w:val="16"/>
+                <w:szCs w:val="18"/>
+                <w:lang w:val="en-CA"/>
+              </w:rPr>
+              <w:t>draggableModal.tsx</w:t>
+            </w:r>
+            <w:proofErr w:type="spellEnd"/>
+            <w:r>
+              <w:rPr>
+                <w:sz w:val="16"/>
+                <w:szCs w:val="18"/>
+                <w:lang w:val="en-CA"/>
+              </w:rPr>
+              <w:t xml:space="preserve">, </w:t>
+            </w:r>
+            <w:proofErr w:type="spellStart"/>
+            <w:r>
+              <w:rPr>
+                <w:sz w:val="16"/>
+                <w:szCs w:val="18"/>
+                <w:lang w:val="en-CA"/>
+              </w:rPr>
+              <w:t>Toast.tsx</w:t>
+            </w:r>
+            <w:proofErr w:type="spellEnd"/>
+            <w:r>
+              <w:rPr>
+                <w:sz w:val="16"/>
+                <w:szCs w:val="18"/>
+                <w:lang w:val="en-CA"/>
+              </w:rPr>
+              <w:t xml:space="preserve">, </w:t>
+            </w:r>
+            <w:proofErr w:type="spellStart"/>
+            <w:r>
+              <w:rPr>
+                <w:sz w:val="16"/>
+                <w:szCs w:val="18"/>
+                <w:lang w:val="en-CA"/>
+              </w:rPr>
+              <w:t>modalManager.ts</w:t>
+            </w:r>
+            <w:proofErr w:type="spellEnd"/>
+            <w:r>
+              <w:rPr>
+                <w:sz w:val="16"/>
+                <w:szCs w:val="18"/>
+                <w:lang w:val="en-CA"/>
+              </w:rPr>
+              <w:t xml:space="preserve">, </w:t>
+            </w:r>
+            <w:proofErr w:type="spellStart"/>
+            <w:r>
+              <w:rPr>
+                <w:sz w:val="16"/>
+                <w:szCs w:val="18"/>
+                <w:lang w:val="en-CA"/>
+              </w:rPr>
+              <w:t>modalPermissions.ts</w:t>
+            </w:r>
+            <w:proofErr w:type="spellEnd"/>
           </w:p>
         </w:tc>
         <w:tc>
@@ -3750,6 +4422,7 @@
                 <w:lang w:val="en-CA"/>
               </w:rPr>
             </w:pPr>
+            <w:proofErr w:type="spellStart"/>
             <w:r>
               <w:rPr>
                 <w:rFonts w:hint="eastAsia"/>
@@ -3765,8 +4438,81 @@
                 <w:szCs w:val="18"/>
                 <w:lang w:val="en-CA"/>
               </w:rPr>
-              <w:t>ettings.tsx, draggableModal.tsx, Toast.tsx, modalManager.ts, modalPermissions.ts</w:t>
-            </w:r>
+              <w:t>ettings.tsx</w:t>
+            </w:r>
+            <w:proofErr w:type="spellEnd"/>
+            <w:r>
+              <w:rPr>
+                <w:sz w:val="16"/>
+                <w:szCs w:val="18"/>
+                <w:lang w:val="en-CA"/>
+              </w:rPr>
+              <w:t xml:space="preserve">, </w:t>
+            </w:r>
+            <w:proofErr w:type="spellStart"/>
+            <w:r>
+              <w:rPr>
+                <w:sz w:val="16"/>
+                <w:szCs w:val="18"/>
+                <w:lang w:val="en-CA"/>
+              </w:rPr>
+              <w:t>draggableModal.tsx</w:t>
+            </w:r>
+            <w:proofErr w:type="spellEnd"/>
+            <w:r>
+              <w:rPr>
+                <w:sz w:val="16"/>
+                <w:szCs w:val="18"/>
+                <w:lang w:val="en-CA"/>
+              </w:rPr>
+              <w:t xml:space="preserve">, </w:t>
+            </w:r>
+            <w:proofErr w:type="spellStart"/>
+            <w:r>
+              <w:rPr>
+                <w:sz w:val="16"/>
+                <w:szCs w:val="18"/>
+                <w:lang w:val="en-CA"/>
+              </w:rPr>
+              <w:t>Toast.tsx</w:t>
+            </w:r>
+            <w:proofErr w:type="spellEnd"/>
+            <w:r>
+              <w:rPr>
+                <w:sz w:val="16"/>
+                <w:szCs w:val="18"/>
+                <w:lang w:val="en-CA"/>
+              </w:rPr>
+              <w:t xml:space="preserve">, </w:t>
+            </w:r>
+            <w:proofErr w:type="spellStart"/>
+            <w:r>
+              <w:rPr>
+                <w:sz w:val="16"/>
+                <w:szCs w:val="18"/>
+                <w:lang w:val="en-CA"/>
+              </w:rPr>
+              <w:t>modalManager.ts</w:t>
+            </w:r>
+            <w:proofErr w:type="spellEnd"/>
+            <w:r>
+              <w:rPr>
+                <w:sz w:val="16"/>
+                <w:szCs w:val="18"/>
+                <w:lang w:val="en-CA"/>
+              </w:rPr>
+              <w:t xml:space="preserve">, </w:t>
+            </w:r>
+            <w:proofErr w:type="spellStart"/>
+            <w:r>
+              <w:rPr>
+                <w:sz w:val="16"/>
+                <w:szCs w:val="18"/>
+                <w:lang w:val="en-CA"/>
+              </w:rPr>
+              <w:t>modalPermissions.ts</w:t>
+            </w:r>
+            <w:proofErr w:type="spellEnd"/>
           </w:p>
         </w:tc>
         <w:tc>
@@ -4007,6 +4753,7 @@
                 <w:lang w:val="en-CA"/>
               </w:rPr>
             </w:pPr>
+            <w:proofErr w:type="spellStart"/>
             <w:r>
               <w:rPr>
                 <w:rFonts w:hint="eastAsia"/>
@@ -4022,8 +4769,81 @@
                 <w:szCs w:val="18"/>
                 <w:lang w:val="en-CA"/>
               </w:rPr>
-              <w:t>ettings.tsx, draggableModal.tsx, Toast.tsx, modalManager.ts, modalPermissions.ts</w:t>
-            </w:r>
+              <w:t>ettings.tsx</w:t>
+            </w:r>
+            <w:proofErr w:type="spellEnd"/>
+            <w:r>
+              <w:rPr>
+                <w:sz w:val="16"/>
+                <w:szCs w:val="18"/>
+                <w:lang w:val="en-CA"/>
+              </w:rPr>
+              <w:t xml:space="preserve">, </w:t>
+            </w:r>
+            <w:proofErr w:type="spellStart"/>
+            <w:r>
+              <w:rPr>
+                <w:sz w:val="16"/>
+                <w:szCs w:val="18"/>
+                <w:lang w:val="en-CA"/>
+              </w:rPr>
+              <w:t>draggableModal.tsx</w:t>
+            </w:r>
+            <w:proofErr w:type="spellEnd"/>
+            <w:r>
+              <w:rPr>
+                <w:sz w:val="16"/>
+                <w:szCs w:val="18"/>
+                <w:lang w:val="en-CA"/>
+              </w:rPr>
+              <w:t xml:space="preserve">, </w:t>
+            </w:r>
+            <w:proofErr w:type="spellStart"/>
+            <w:r>
+              <w:rPr>
+                <w:sz w:val="16"/>
+                <w:szCs w:val="18"/>
+                <w:lang w:val="en-CA"/>
+              </w:rPr>
+              <w:t>Toast.tsx</w:t>
+            </w:r>
+            <w:proofErr w:type="spellEnd"/>
+            <w:r>
+              <w:rPr>
+                <w:sz w:val="16"/>
+                <w:szCs w:val="18"/>
+                <w:lang w:val="en-CA"/>
+              </w:rPr>
+              <w:t xml:space="preserve">, </w:t>
+            </w:r>
+            <w:proofErr w:type="spellStart"/>
+            <w:r>
+              <w:rPr>
+                <w:sz w:val="16"/>
+                <w:szCs w:val="18"/>
+                <w:lang w:val="en-CA"/>
+              </w:rPr>
+              <w:t>modalManager.ts</w:t>
+            </w:r>
+            <w:proofErr w:type="spellEnd"/>
+            <w:r>
+              <w:rPr>
+                <w:sz w:val="16"/>
+                <w:szCs w:val="18"/>
+                <w:lang w:val="en-CA"/>
+              </w:rPr>
+              <w:t xml:space="preserve">, </w:t>
+            </w:r>
+            <w:proofErr w:type="spellStart"/>
+            <w:r>
+              <w:rPr>
+                <w:sz w:val="16"/>
+                <w:szCs w:val="18"/>
+                <w:lang w:val="en-CA"/>
+              </w:rPr>
+              <w:t>modalPermissions.ts</w:t>
+            </w:r>
+            <w:proofErr w:type="spellEnd"/>
           </w:p>
         </w:tc>
         <w:tc>
@@ -4179,6 +4999,7 @@
                 <w:lang w:val="en-CA"/>
               </w:rPr>
             </w:pPr>
+            <w:proofErr w:type="spellStart"/>
             <w:r>
               <w:rPr>
                 <w:rFonts w:hint="eastAsia"/>
@@ -4196,6 +5017,7 @@
               </w:rPr>
               <w:t>ettings.tsx</w:t>
             </w:r>
+            <w:proofErr w:type="spellEnd"/>
           </w:p>
         </w:tc>
         <w:tc>
@@ -4373,6 +5195,7 @@
                 <w:lang w:val="en-CA"/>
               </w:rPr>
             </w:pPr>
+            <w:proofErr w:type="spellStart"/>
             <w:r>
               <w:rPr>
                 <w:rFonts w:hint="eastAsia"/>
@@ -4390,6 +5213,7 @@
               </w:rPr>
               <w:t>ettings.tsx</w:t>
             </w:r>
+            <w:proofErr w:type="spellEnd"/>
           </w:p>
         </w:tc>
         <w:tc>
@@ -4695,6 +5519,7 @@
                 <w:lang w:val="en-CA"/>
               </w:rPr>
             </w:pPr>
+            <w:proofErr w:type="spellStart"/>
             <w:r>
               <w:rPr>
                 <w:rFonts w:hint="eastAsia"/>
@@ -4712,6 +5537,7 @@
               </w:rPr>
               <w:t>ettings.tsx</w:t>
             </w:r>
+            <w:proofErr w:type="spellEnd"/>
           </w:p>
         </w:tc>
         <w:tc>
@@ -4774,7 +5600,25 @@
                 <w:szCs w:val="18"/>
                 <w:lang w:val="en-CA"/>
               </w:rPr>
-              <w:t xml:space="preserve">earch for TAB_NAMES in settings.tsx. change any one of the names in quotation marks. </w:t>
+              <w:t xml:space="preserve">earch for TAB_NAMES in </w:t>
+            </w:r>
+            <w:proofErr w:type="spellStart"/>
+            <w:r>
+              <w:rPr>
+                <w:sz w:val="16"/>
+                <w:szCs w:val="18"/>
+                <w:lang w:val="en-CA"/>
+              </w:rPr>
+              <w:t>settings.tsx</w:t>
+            </w:r>
+            <w:proofErr w:type="spellEnd"/>
+            <w:r>
+              <w:rPr>
+                <w:sz w:val="16"/>
+                <w:szCs w:val="18"/>
+                <w:lang w:val="en-CA"/>
+              </w:rPr>
+              <w:t xml:space="preserve">. change any one of the names in quotation marks. </w:t>
             </w:r>
             <w:r>
               <w:rPr>
@@ -4996,6 +5840,7 @@
                 <w:lang w:val="en-CA"/>
               </w:rPr>
             </w:pPr>
+            <w:proofErr w:type="spellStart"/>
             <w:r>
               <w:rPr>
                 <w:rFonts w:hint="eastAsia"/>
@@ -5011,7 +5856,16 @@
                 <w:szCs w:val="18"/>
                 <w:lang w:val="en-CA"/>
               </w:rPr>
-              <w:t>ettings.tsx, index.css</w:t>
+              <w:t>ettings.tsx</w:t>
+            </w:r>
+            <w:proofErr w:type="spellEnd"/>
+            <w:r>
+              <w:rPr>
+                <w:sz w:val="16"/>
+                <w:szCs w:val="18"/>
+                <w:lang w:val="en-CA"/>
+              </w:rPr>
+              <w:t>, index.css</w:t>
             </w:r>
           </w:p>
         </w:tc>
@@ -5100,7 +5954,16 @@
                 <w:szCs w:val="18"/>
                 <w:lang w:val="en-CA"/>
               </w:rPr>
-              <w:t>hen slide the slider to 500ms, try again, 1000ms, try again</w:t>
+              <w:t xml:space="preserve">hen slide the slider to 500ms, try </w:t>
+            </w:r>
+            <w:r>
+              <w:rPr>
+                <w:sz w:val="16"/>
+                <w:szCs w:val="18"/>
+                <w:lang w:val="en-CA"/>
+              </w:rPr>
+              <w:lastRenderedPageBreak/>
+              <w:t>again, 1000ms, try again</w:t>
             </w:r>
           </w:p>
         </w:tc>
@@ -5129,6 +5992,7 @@
                 <w:szCs w:val="18"/>
                 <w:lang w:val="en-CA"/>
               </w:rPr>
+              <w:lastRenderedPageBreak/>
               <w:t>E</w:t>
             </w:r>
             <w:r>
@@ -5169,7 +6033,7 @@
                 <w:szCs w:val="18"/>
                 <w:lang w:val="en-CA"/>
               </w:rPr>
-              <w:t xml:space="preserve">nsure that the timing is correlated to the slider, so the longer the slider’s set duration time, the longer </w:t>
+              <w:t xml:space="preserve">nsure that the timing is correlated to the slider, so the longer the </w:t>
             </w:r>
             <w:r>
               <w:rPr>
@@ -5178,7 +6042,7 @@
                 <w:lang w:val="en-CA"/>
               </w:rPr>
               <w:lastRenderedPageBreak/>
-              <w:t>the transition should feel</w:t>
+              <w:t>slider’s set duration time, the longer the transition should feel</w:t>
             </w:r>
           </w:p>
         </w:tc>
@@ -5247,6 +6111,7 @@
                 <w:lang w:val="en-CA"/>
               </w:rPr>
             </w:pPr>
+            <w:proofErr w:type="spellStart"/>
             <w:r>
               <w:rPr>
                 <w:rFonts w:hint="eastAsia"/>
@@ -5264,6 +6129,7 @@
               </w:rPr>
               <w:t>ettings.tsx</w:t>
             </w:r>
+            <w:proofErr w:type="spellEnd"/>
           </w:p>
         </w:tc>
         <w:tc>
@@ -5343,7 +6209,25 @@
                 <w:szCs w:val="18"/>
                 <w:lang w:val="en-CA"/>
               </w:rPr>
-              <w:t>gh let me just screenshot it real quick)</w:t>
+              <w:t xml:space="preserve">gh let me just screenshot it </w:t>
+            </w:r>
+            <w:proofErr w:type="gramStart"/>
+            <w:r>
+              <w:rPr>
+                <w:sz w:val="16"/>
+                <w:szCs w:val="18"/>
+                <w:lang w:val="en-CA"/>
+              </w:rPr>
+              <w:t>real</w:t>
+            </w:r>
+            <w:proofErr w:type="gramEnd"/>
+            <w:r>
+              <w:rPr>
+                <w:sz w:val="16"/>
+                <w:szCs w:val="18"/>
+                <w:lang w:val="en-CA"/>
+              </w:rPr>
+              <w:t xml:space="preserve"> quick)</w:t>
             </w:r>
           </w:p>
           <w:p>
@@ -5535,6 +6419,7 @@
           <w:lang w:val="en-CA"/>
         </w:rPr>
       </w:pPr>
+      <w:proofErr w:type="spellStart"/>
       <w:r>
         <w:rPr>
           <w:rFonts w:hint="eastAsia"/>
@@ -5556,6 +6441,7 @@
         </w:rPr>
         <w:t>orusMenuEditor.tsx</w:t>
       </w:r>
+      <w:proofErr w:type="spellEnd"/>
     </w:p>
     <w:tbl>
       <w:tblPr>
@@ -5750,6 +6636,7 @@
                 <w:lang w:val="en-CA"/>
               </w:rPr>
             </w:pPr>
+            <w:proofErr w:type="spellStart"/>
             <w:r>
               <w:rPr>
                 <w:rFonts w:hint="eastAsia"/>
@@ -5765,8 +6652,27 @@
                 <w:szCs w:val="18"/>
                 <w:lang w:val="en-CA"/>
               </w:rPr>
-              <w:t>raph.tsx, TorusMenuEditor.tsx</w:t>
-            </w:r>
+              <w:t>raph.tsx</w:t>
+            </w:r>
+            <w:proofErr w:type="spellEnd"/>
+            <w:r>
+              <w:rPr>
+                <w:sz w:val="16"/>
+                <w:szCs w:val="18"/>
+                <w:lang w:val="en-CA"/>
+              </w:rPr>
+              <w:t xml:space="preserve">, </w:t>
+            </w:r>
+            <w:proofErr w:type="spellStart"/>
+            <w:r>
+              <w:rPr>
+                <w:sz w:val="16"/>
+                <w:szCs w:val="18"/>
+                <w:lang w:val="en-CA"/>
+              </w:rPr>
+              <w:t>TorusMenuEditor.tsx</w:t>
+            </w:r>
+            <w:proofErr w:type="spellEnd"/>
           </w:p>
         </w:tc>
         <w:tc>
@@ -5986,7 +6892,25 @@
                 <w:lang w:val="en-CA"/>
               </w:rPr>
               <w:br/>
-              <w:t>although the hitbox for the ease handler is kinda small and super annoying to click, in fact it’s smaller than the area in which your cursor turns into an arrow handle.</w:t>
+              <w:t xml:space="preserve">although the hitbox for the ease handler is </w:t>
+            </w:r>
+            <w:proofErr w:type="spellStart"/>
+            <w:r>
+              <w:rPr>
+                <w:sz w:val="16"/>
+                <w:szCs w:val="18"/>
+                <w:lang w:val="en-CA"/>
+              </w:rPr>
+              <w:t>kinda</w:t>
+            </w:r>
+            <w:proofErr w:type="spellEnd"/>
+            <w:r>
+              <w:rPr>
+                <w:sz w:val="16"/>
+                <w:szCs w:val="18"/>
+                <w:lang w:val="en-CA"/>
+              </w:rPr>
+              <w:t xml:space="preserve"> small and super annoying to click, in fact it’s smaller than the area in which your cursor turns into an arrow handle.</w:t>
             </w:r>
           </w:p>
         </w:tc>
@@ -6005,6 +6929,7 @@
                 <w:lang w:val="en-CA"/>
               </w:rPr>
             </w:pPr>
+            <w:proofErr w:type="spellStart"/>
             <w:r>
               <w:rPr>
                 <w:rFonts w:hint="eastAsia"/>
@@ -6020,8 +6945,27 @@
                 <w:szCs w:val="18"/>
                 <w:lang w:val="en-CA"/>
               </w:rPr>
-              <w:t>raph.tsx, TorusMenuEditor.tsx</w:t>
-            </w:r>
+              <w:t>raph.tsx</w:t>
+            </w:r>
+            <w:proofErr w:type="spellEnd"/>
+            <w:r>
+              <w:rPr>
+                <w:sz w:val="16"/>
+                <w:szCs w:val="18"/>
+                <w:lang w:val="en-CA"/>
+              </w:rPr>
+              <w:t xml:space="preserve">, </w:t>
+            </w:r>
+            <w:proofErr w:type="spellStart"/>
+            <w:r>
+              <w:rPr>
+                <w:sz w:val="16"/>
+                <w:szCs w:val="18"/>
+                <w:lang w:val="en-CA"/>
+              </w:rPr>
+              <w:t>TorusMenuEditor.tsx</w:t>
+            </w:r>
+            <w:proofErr w:type="spellEnd"/>
           </w:p>
         </w:tc>
         <w:tc>
@@ -6192,6 +7136,7 @@
                 <w:lang w:val="en-CA"/>
               </w:rPr>
             </w:pPr>
+            <w:proofErr w:type="spellStart"/>
             <w:r>
               <w:rPr>
                 <w:rFonts w:hint="eastAsia"/>
@@ -6207,8 +7152,27 @@
                 <w:szCs w:val="18"/>
                 <w:lang w:val="en-CA"/>
               </w:rPr>
-              <w:t>raph.tsx, TorusMenuEditor.tsx</w:t>
-            </w:r>
+              <w:t>raph.tsx</w:t>
+            </w:r>
+            <w:proofErr w:type="spellEnd"/>
+            <w:r>
+              <w:rPr>
+                <w:sz w:val="16"/>
+                <w:szCs w:val="18"/>
+                <w:lang w:val="en-CA"/>
+              </w:rPr>
+              <w:t xml:space="preserve">, </w:t>
+            </w:r>
+            <w:proofErr w:type="spellStart"/>
+            <w:r>
+              <w:rPr>
+                <w:sz w:val="16"/>
+                <w:szCs w:val="18"/>
+                <w:lang w:val="en-CA"/>
+              </w:rPr>
+              <w:t>TorusMenuEditor.tsx</w:t>
+            </w:r>
+            <w:proofErr w:type="spellEnd"/>
           </w:p>
         </w:tc>
         <w:tc>
@@ -6404,6 +7368,7 @@
                 <w:lang w:val="en-CA"/>
               </w:rPr>
             </w:pPr>
+            <w:proofErr w:type="spellStart"/>
             <w:r>
               <w:rPr>
                 <w:sz w:val="16"/>
@@ -6412,6 +7377,7 @@
               </w:rPr>
               <w:t>TorusMenuEditor.tsx</w:t>
             </w:r>
+            <w:proofErr w:type="spellEnd"/>
           </w:p>
         </w:tc>
         <w:tc>
@@ -6442,7 +7408,7 @@
                 <w:szCs w:val="18"/>
                 <w:lang w:val="en-CA"/>
               </w:rPr>
-              <w:t xml:space="preserve">ettings: components: torus menu editor: delay </w:t>
+              <w:t xml:space="preserve">ettings: components: </w:t>
             </w:r>
             <w:r>
               <w:rPr>
@@ -6451,7 +7417,7 @@
                 <w:lang w:val="en-CA"/>
               </w:rPr>
               <w:lastRenderedPageBreak/>
-              <w:t>slider</w:t>
+              <w:t>torus menu editor: delay slider</w:t>
             </w:r>
           </w:p>
         </w:tc>
@@ -6497,7 +7463,7 @@
                 <w:szCs w:val="18"/>
                 <w:lang w:val="en-CA"/>
               </w:rPr>
-              <w:t xml:space="preserve">, click on the (…) open torus menu </w:t>
+              <w:t xml:space="preserve">, click on </w:t>
             </w:r>
             <w:r>
               <w:rPr>
@@ -6506,7 +7472,7 @@
                 <w:lang w:val="en-CA"/>
               </w:rPr>
               <w:lastRenderedPageBreak/>
-              <w:t>button</w:t>
+              <w:t>the (…) open torus menu button</w:t>
             </w:r>
           </w:p>
           <w:p>
@@ -6608,7 +7574,7 @@
                 <w:szCs w:val="18"/>
                 <w:lang w:val="en-CA"/>
               </w:rPr>
-              <w:t xml:space="preserve">n test 1, the torus menu should open in one union, all annular </w:t>
+              <w:t xml:space="preserve">n test 1, the torus menu should </w:t>
             </w:r>
             <w:r>
               <w:rPr>
@@ -6617,7 +7583,7 @@
                 <w:lang w:val="en-CA"/>
               </w:rPr>
               <w:lastRenderedPageBreak/>
-              <w:t>sectors synchronized at the same time</w:t>
+              <w:t>open in one union, all annular sectors synchronized at the same time</w:t>
             </w:r>
           </w:p>
           <w:p>
@@ -6756,16 +7722,8 @@
                 <w:szCs w:val="18"/>
                 <w:lang w:val="en-CA"/>
               </w:rPr>
-              <w:t>5bddf836872611033759d62774</w:t>
-            </w:r>
-            <w:r>
-              <w:rPr>
-                <w:sz w:val="16"/>
-                <w:szCs w:val="18"/>
-                <w:lang w:val="en-CA"/>
-              </w:rPr>
               <w:lastRenderedPageBreak/>
-              <w:t>6d8b4161bba22a</w:t>
+              <w:t>5bddf836872611033759d627746d8b4161bba22a</w:t>
             </w:r>
           </w:p>
         </w:tc>
@@ -6784,6 +7742,7 @@
                 <w:lang w:val="en-CA"/>
               </w:rPr>
             </w:pPr>
+            <w:proofErr w:type="spellStart"/>
             <w:r>
               <w:rPr>
                 <w:sz w:val="16"/>
@@ -6792,6 +7751,7 @@
               </w:rPr>
               <w:t>TorusMenuEditor.tsx</w:t>
             </w:r>
+            <w:proofErr w:type="spellEnd"/>
           </w:p>
         </w:tc>
         <w:tc>
@@ -6971,6 +7931,7 @@
                 <w:lang w:val="en-CA"/>
               </w:rPr>
             </w:pPr>
+            <w:proofErr w:type="spellStart"/>
             <w:r>
               <w:rPr>
                 <w:sz w:val="16"/>
@@ -6979,6 +7940,7 @@
               </w:rPr>
               <w:t>TorusMenuEditor.tsx</w:t>
             </w:r>
+            <w:proofErr w:type="spellEnd"/>
           </w:p>
         </w:tc>
         <w:tc>
@@ -7049,7 +8011,25 @@
                 <w:szCs w:val="18"/>
                 <w:lang w:val="en-CA"/>
               </w:rPr>
-              <w:t xml:space="preserve">dd a bunch of anchor points and adjust all of the ease handles to a non-default or non-linear position. </w:t>
+              <w:t xml:space="preserve">dd a bunch of anchor points and adjust </w:t>
+            </w:r>
+            <w:proofErr w:type="gramStart"/>
+            <w:r>
+              <w:rPr>
+                <w:sz w:val="16"/>
+                <w:szCs w:val="18"/>
+                <w:lang w:val="en-CA"/>
+              </w:rPr>
+              <w:t>all of</w:t>
+            </w:r>
+            <w:proofErr w:type="gramEnd"/>
+            <w:r>
+              <w:rPr>
+                <w:sz w:val="16"/>
+                <w:szCs w:val="18"/>
+                <w:lang w:val="en-CA"/>
+              </w:rPr>
+              <w:t xml:space="preserve"> the ease handles to a non-default or non-linear position. </w:t>
             </w:r>
             <w:r>
               <w:rPr>
@@ -7161,6 +8141,7 @@
           <w:lang w:val="en-CA"/>
         </w:rPr>
       </w:pPr>
+      <w:proofErr w:type="spellStart"/>
       <w:r>
         <w:rPr>
           <w:b/>
@@ -7171,6 +8152,7 @@
         </w:rPr>
         <w:t>TorusMenu.tsx</w:t>
       </w:r>
+      <w:proofErr w:type="spellEnd"/>
     </w:p>
     <w:tbl>
       <w:tblPr>
@@ -7371,8 +8353,18 @@
                 <w:szCs w:val="18"/>
                 <w:lang w:val="en-CA"/>
               </w:rPr>
-              <w:t xml:space="preserve"> TorusMenu.tsx</w:t>
-            </w:r>
+              <w:t xml:space="preserve"> </w:t>
+            </w:r>
+            <w:proofErr w:type="spellStart"/>
+            <w:r>
+              <w:rPr>
+                <w:sz w:val="16"/>
+                <w:szCs w:val="18"/>
+                <w:lang w:val="en-CA"/>
+              </w:rPr>
+              <w:t>TorusMenu.tsx</w:t>
+            </w:r>
+            <w:proofErr w:type="spellEnd"/>
           </w:p>
         </w:tc>
         <w:tc>
@@ -7443,7 +8435,25 @@
                 <w:szCs w:val="18"/>
                 <w:lang w:val="en-CA"/>
               </w:rPr>
-              <w:t>hen, on a 45 degree angle right outside the circle, click.</w:t>
+              <w:t xml:space="preserve">hen, on a </w:t>
+            </w:r>
+            <w:proofErr w:type="gramStart"/>
+            <w:r>
+              <w:rPr>
+                <w:sz w:val="16"/>
+                <w:szCs w:val="18"/>
+                <w:lang w:val="en-CA"/>
+              </w:rPr>
+              <w:t>45 degree</w:t>
+            </w:r>
+            <w:proofErr w:type="gramEnd"/>
+            <w:r>
+              <w:rPr>
+                <w:sz w:val="16"/>
+                <w:szCs w:val="18"/>
+                <w:lang w:val="en-CA"/>
+              </w:rPr>
+              <w:t xml:space="preserve"> angle right outside the circle, click.</w:t>
             </w:r>
           </w:p>
         </w:tc>
@@ -7543,6 +8553,7 @@
           <w:lang w:val="en-CA"/>
         </w:rPr>
       </w:pPr>
+      <w:proofErr w:type="spellStart"/>
       <w:r>
         <w:rPr>
           <w:b/>
@@ -7553,6 +8564,7 @@
         </w:rPr>
         <w:t>ColorPicker.tsx</w:t>
       </w:r>
+      <w:proofErr w:type="spellEnd"/>
     </w:p>
     <w:tbl>
       <w:tblPr>
@@ -7747,14 +8759,53 @@
                 <w:lang w:val="en-CA"/>
               </w:rPr>
             </w:pPr>
-            <w:r>
-              <w:rPr>
-                <w:sz w:val="16"/>
-                <w:szCs w:val="18"/>
-                <w:lang w:val="en-CA"/>
-              </w:rPr>
-              <w:t>ColorPicker.tsx, Styles.tsx, App.tsx</w:t>
-            </w:r>
+            <w:proofErr w:type="spellStart"/>
+            <w:r>
+              <w:rPr>
+                <w:sz w:val="16"/>
+                <w:szCs w:val="18"/>
+                <w:lang w:val="en-CA"/>
+              </w:rPr>
+              <w:t>ColorPicker.tsx</w:t>
+            </w:r>
+            <w:proofErr w:type="spellEnd"/>
+            <w:r>
+              <w:rPr>
+                <w:sz w:val="16"/>
+                <w:szCs w:val="18"/>
+                <w:lang w:val="en-CA"/>
+              </w:rPr>
+              <w:t xml:space="preserve">, </w:t>
+            </w:r>
+            <w:proofErr w:type="spellStart"/>
+            <w:r>
+              <w:rPr>
+                <w:sz w:val="16"/>
+                <w:szCs w:val="18"/>
+                <w:lang w:val="en-CA"/>
+              </w:rPr>
+              <w:lastRenderedPageBreak/>
+              <w:t>Styles.tsx</w:t>
+            </w:r>
+            <w:proofErr w:type="spellEnd"/>
+            <w:r>
+              <w:rPr>
+                <w:sz w:val="16"/>
+                <w:szCs w:val="18"/>
+                <w:lang w:val="en-CA"/>
+              </w:rPr>
+              <w:t xml:space="preserve">, </w:t>
+            </w:r>
+            <w:proofErr w:type="spellStart"/>
+            <w:r>
+              <w:rPr>
+                <w:sz w:val="16"/>
+                <w:szCs w:val="18"/>
+                <w:lang w:val="en-CA"/>
+              </w:rPr>
+              <w:t>App.tsx</w:t>
+            </w:r>
+            <w:proofErr w:type="spellEnd"/>
           </w:p>
         </w:tc>
         <w:tc>
@@ -7777,6 +8828,7 @@
                 <w:szCs w:val="18"/>
                 <w:lang w:val="en-CA"/>
               </w:rPr>
+              <w:lastRenderedPageBreak/>
               <w:t>S</w:t>
             </w:r>
             <w:r>
@@ -7785,7 +8837,16 @@
                 <w:szCs w:val="18"/>
                 <w:lang w:val="en-CA"/>
               </w:rPr>
-              <w:t xml:space="preserve">tyles: color picker: live color updating test </w:t>
+              <w:t xml:space="preserve">tyles: color picker: live </w:t>
+            </w:r>
+            <w:r>
+              <w:rPr>
+                <w:sz w:val="16"/>
+                <w:szCs w:val="18"/>
+                <w:lang w:val="en-CA"/>
+              </w:rPr>
+              <w:lastRenderedPageBreak/>
+              <w:t xml:space="preserve">color updating test </w:t>
             </w:r>
           </w:p>
         </w:tc>
@@ -7809,6 +8870,7 @@
                 <w:szCs w:val="18"/>
                 <w:lang w:val="en-CA"/>
               </w:rPr>
+              <w:lastRenderedPageBreak/>
               <w:t>F</w:t>
             </w:r>
             <w:r>
@@ -7817,7 +8879,7 @@
                 <w:szCs w:val="18"/>
                 <w:lang w:val="en-CA"/>
               </w:rPr>
-              <w:t xml:space="preserve">or any color, click on the color rectangle in the styles page and </w:t>
+              <w:t xml:space="preserve">or any color, click on the color </w:t>
             </w:r>
             <w:r>
               <w:rPr>
@@ -7826,7 +8888,7 @@
                 <w:lang w:val="en-CA"/>
               </w:rPr>
               <w:lastRenderedPageBreak/>
-              <w:t>start dragging around the color picker in the color wheel</w:t>
+              <w:t>rectangle in the styles page and start dragging around the color picker in the color wheel</w:t>
             </w:r>
           </w:p>
         </w:tc>
@@ -7859,7 +8921,16 @@
                 <w:szCs w:val="18"/>
                 <w:lang w:val="en-CA"/>
               </w:rPr>
-              <w:t xml:space="preserve">he color should update in real time in the editor. </w:t>
+              <w:t xml:space="preserve">he color should update in real time in </w:t>
+            </w:r>
+            <w:r>
+              <w:rPr>
+                <w:sz w:val="16"/>
+                <w:szCs w:val="18"/>
+                <w:lang w:val="en-CA"/>
+              </w:rPr>
+              <w:lastRenderedPageBreak/>
+              <w:t xml:space="preserve">the editor. </w:t>
             </w:r>
             <w:r>
               <w:rPr>
@@ -7876,16 +8947,7 @@
                 <w:szCs w:val="18"/>
                 <w:lang w:val="en-CA"/>
               </w:rPr>
-              <w:t xml:space="preserve">very element using that color </w:t>
-            </w:r>
-            <w:r>
-              <w:rPr>
-                <w:sz w:val="16"/>
-                <w:szCs w:val="18"/>
-                <w:lang w:val="en-CA"/>
-              </w:rPr>
-              <w:lastRenderedPageBreak/>
-              <w:t>should change instantaneously with no lag</w:t>
+              <w:t>very element using that color should change instantaneously with no lag</w:t>
             </w:r>
           </w:p>
         </w:tc>
@@ -7926,16 +8988,8 @@
                 <w:szCs w:val="18"/>
                 <w:lang w:val="en-CA"/>
               </w:rPr>
-              <w:t>5bddf836872611033759d62774</w:t>
-            </w:r>
-            <w:r>
-              <w:rPr>
-                <w:sz w:val="16"/>
-                <w:szCs w:val="18"/>
-                <w:lang w:val="en-CA"/>
-              </w:rPr>
               <w:lastRenderedPageBreak/>
-              <w:t>6d8b4161bba22a</w:t>
+              <w:t>5bddf836872611033759d627746d8b4161bba22a</w:t>
             </w:r>
             <w:r>
               <w:rPr>
@@ -8057,6 +9111,7 @@
                 <w:lang w:val="en-CA"/>
               </w:rPr>
             </w:pPr>
+            <w:proofErr w:type="spellStart"/>
             <w:r>
               <w:rPr>
                 <w:sz w:val="16"/>
@@ -8064,8 +9119,27 @@
                 <w:lang w:val="en-CA"/>
               </w:rPr>
               <w:lastRenderedPageBreak/>
-              <w:t>Styles.tsx, App.tsx</w:t>
-            </w:r>
+              <w:t>Styles.tsx</w:t>
+            </w:r>
+            <w:proofErr w:type="spellEnd"/>
+            <w:r>
+              <w:rPr>
+                <w:sz w:val="16"/>
+                <w:szCs w:val="18"/>
+                <w:lang w:val="en-CA"/>
+              </w:rPr>
+              <w:t xml:space="preserve">, </w:t>
+            </w:r>
+            <w:proofErr w:type="spellStart"/>
+            <w:r>
+              <w:rPr>
+                <w:sz w:val="16"/>
+                <w:szCs w:val="18"/>
+                <w:lang w:val="en-CA"/>
+              </w:rPr>
+              <w:t>App.tsx</w:t>
+            </w:r>
+            <w:proofErr w:type="spellEnd"/>
           </w:p>
         </w:tc>
         <w:tc>
@@ -8293,6 +9367,7 @@
                 <w:lang w:val="en-CA"/>
               </w:rPr>
             </w:pPr>
+            <w:proofErr w:type="spellStart"/>
             <w:r>
               <w:rPr>
                 <w:sz w:val="16"/>
@@ -8301,6 +9376,7 @@
               </w:rPr>
               <w:t>ColorPicker.tsx</w:t>
             </w:r>
+            <w:proofErr w:type="spellEnd"/>
           </w:p>
         </w:tc>
         <w:tc>
@@ -8495,6 +9571,7 @@
           <w:lang w:val="en-CA"/>
         </w:rPr>
       </w:pPr>
+      <w:proofErr w:type="spellStart"/>
       <w:r>
         <w:rPr>
           <w:b/>
@@ -8515,6 +9592,7 @@
         </w:rPr>
         <w:t>.tsx</w:t>
       </w:r>
+      <w:proofErr w:type="spellEnd"/>
     </w:p>
     <w:tbl>
       <w:tblPr>
@@ -8709,6 +9787,7 @@
                 <w:lang w:val="en-CA"/>
               </w:rPr>
             </w:pPr>
+            <w:proofErr w:type="spellStart"/>
             <w:r>
               <w:rPr>
                 <w:rFonts w:hint="eastAsia"/>
@@ -8724,8 +9803,27 @@
                 <w:szCs w:val="18"/>
                 <w:lang w:val="en-CA"/>
               </w:rPr>
-              <w:t>pp.tsx, toast.tsx</w:t>
-            </w:r>
+              <w:t>pp.tsx</w:t>
+            </w:r>
+            <w:proofErr w:type="spellEnd"/>
+            <w:r>
+              <w:rPr>
+                <w:sz w:val="16"/>
+                <w:szCs w:val="18"/>
+                <w:lang w:val="en-CA"/>
+              </w:rPr>
+              <w:t xml:space="preserve">, </w:t>
+            </w:r>
+            <w:proofErr w:type="spellStart"/>
+            <w:r>
+              <w:rPr>
+                <w:sz w:val="16"/>
+                <w:szCs w:val="18"/>
+                <w:lang w:val="en-CA"/>
+              </w:rPr>
+              <w:t>toast.tsx</w:t>
+            </w:r>
+            <w:proofErr w:type="spellEnd"/>
           </w:p>
         </w:tc>
         <w:tc>
@@ -8788,7 +9886,25 @@
                 <w:szCs w:val="18"/>
                 <w:lang w:val="en-CA"/>
               </w:rPr>
-              <w:t xml:space="preserve">o into app.tsx wherever there is a toast instantiation. </w:t>
+              <w:t xml:space="preserve">o into </w:t>
+            </w:r>
+            <w:proofErr w:type="spellStart"/>
+            <w:r>
+              <w:rPr>
+                <w:sz w:val="16"/>
+                <w:szCs w:val="18"/>
+                <w:lang w:val="en-CA"/>
+              </w:rPr>
+              <w:t>app.tsx</w:t>
+            </w:r>
+            <w:proofErr w:type="spellEnd"/>
+            <w:r>
+              <w:rPr>
+                <w:sz w:val="16"/>
+                <w:szCs w:val="18"/>
+                <w:lang w:val="en-CA"/>
+              </w:rPr>
+              <w:t xml:space="preserve"> wherever there is a toast instantiation. </w:t>
             </w:r>
             <w:r>
               <w:rPr>
@@ -9006,6 +10122,7 @@
                 <w:lang w:val="en-CA"/>
               </w:rPr>
             </w:pPr>
+            <w:proofErr w:type="spellStart"/>
             <w:r>
               <w:rPr>
                 <w:rFonts w:hint="eastAsia"/>
@@ -9021,8 +10138,27 @@
                 <w:szCs w:val="18"/>
                 <w:lang w:val="en-CA"/>
               </w:rPr>
-              <w:t>pp.tsx, toast.tsx</w:t>
-            </w:r>
+              <w:t>pp.tsx</w:t>
+            </w:r>
+            <w:proofErr w:type="spellEnd"/>
+            <w:r>
+              <w:rPr>
+                <w:sz w:val="16"/>
+                <w:szCs w:val="18"/>
+                <w:lang w:val="en-CA"/>
+              </w:rPr>
+              <w:t xml:space="preserve">, </w:t>
+            </w:r>
+            <w:proofErr w:type="spellStart"/>
+            <w:r>
+              <w:rPr>
+                <w:sz w:val="16"/>
+                <w:szCs w:val="18"/>
+                <w:lang w:val="en-CA"/>
+              </w:rPr>
+              <w:t>toast.tsx</w:t>
+            </w:r>
+            <w:proofErr w:type="spellEnd"/>
           </w:p>
         </w:tc>
         <w:tc>
@@ -9053,54 +10189,22 @@
                 <w:szCs w:val="18"/>
                 <w:lang w:val="en-CA"/>
               </w:rPr>
-              <w:t>oast: “open multiple menus is disabled!” toast: correct positioning</w:t>
+              <w:t xml:space="preserve">oast: “open multiple menus is disabled!” toast: correct </w:t>
+            </w:r>
+            <w:r>
+              <w:rPr>
+                <w:sz w:val="16"/>
+                <w:szCs w:val="18"/>
+                <w:lang w:val="en-CA"/>
+              </w:rPr>
+              <w:lastRenderedPageBreak/>
+              <w:t>positioning</w:t>
             </w:r>
           </w:p>
         </w:tc>
         <w:tc>
           <w:tcPr>
             <w:tcW w:w="2410" w:type="dxa"/>
-          </w:tcPr>
-          <w:p>
-            <w:pPr>
-              <w:rPr>
-                <w:rFonts w:hint="eastAsia"/>
-                <w:sz w:val="16"/>
-                <w:szCs w:val="18"/>
-                <w:lang w:val="en-CA"/>
-              </w:rPr>
-            </w:pPr>
-            <w:r>
-              <w:rPr>
-                <w:rFonts w:hint="eastAsia"/>
-                <w:sz w:val="16"/>
-                <w:szCs w:val="18"/>
-                <w:lang w:val="en-CA"/>
-              </w:rPr>
-              <w:t>T</w:t>
-            </w:r>
-            <w:r>
-              <w:rPr>
-                <w:sz w:val="16"/>
-                <w:szCs w:val="18"/>
-                <w:lang w:val="en-CA"/>
-              </w:rPr>
-              <w:t xml:space="preserve">rigger the “open multiple menus is disabled!” toast by turning off allow open multiple menus and attempting to open </w:t>
-            </w:r>
-            <w:r>
-              <w:rPr>
-                <w:sz w:val="16"/>
-                <w:szCs w:val="18"/>
-                <w:lang w:val="en-CA"/>
-              </w:rPr>
-              <w:lastRenderedPageBreak/>
-              <w:t xml:space="preserve">multiple menus. </w:t>
-            </w:r>
-          </w:p>
-        </w:tc>
-        <w:tc>
-          <w:tcPr>
-            <w:tcW w:w="3118" w:type="dxa"/>
           </w:tcPr>
           <w:p>
             <w:pPr>
@@ -9127,6 +10231,66 @@
                 <w:szCs w:val="18"/>
                 <w:lang w:val="en-CA"/>
               </w:rPr>
+              <w:t xml:space="preserve">rigger the “open multiple menus </w:t>
+            </w:r>
+            <w:proofErr w:type="gramStart"/>
+            <w:r>
+              <w:rPr>
+                <w:sz w:val="16"/>
+                <w:szCs w:val="18"/>
+                <w:lang w:val="en-CA"/>
+              </w:rPr>
+              <w:t>is</w:t>
+            </w:r>
+            <w:proofErr w:type="gramEnd"/>
+            <w:r>
+              <w:rPr>
+                <w:sz w:val="16"/>
+                <w:szCs w:val="18"/>
+                <w:lang w:val="en-CA"/>
+              </w:rPr>
+              <w:t xml:space="preserve"> disabled!” toast by turning off allow open multiple </w:t>
+            </w:r>
+            <w:r>
+              <w:rPr>
+                <w:sz w:val="16"/>
+                <w:szCs w:val="18"/>
+                <w:lang w:val="en-CA"/>
+              </w:rPr>
+              <w:lastRenderedPageBreak/>
+              <w:t xml:space="preserve">menus and attempting to open multiple menus. </w:t>
+            </w:r>
+          </w:p>
+        </w:tc>
+        <w:tc>
+          <w:tcPr>
+            <w:tcW w:w="3118" w:type="dxa"/>
+          </w:tcPr>
+          <w:p>
+            <w:pPr>
+              <w:rPr>
+                <w:rFonts w:hint="eastAsia"/>
+                <w:sz w:val="16"/>
+                <w:szCs w:val="18"/>
+                <w:lang w:val="en-CA"/>
+              </w:rPr>
+            </w:pPr>
+            <w:r>
+              <w:rPr>
+                <w:rFonts w:hint="eastAsia"/>
+                <w:sz w:val="16"/>
+                <w:szCs w:val="18"/>
+                <w:lang w:val="en-CA"/>
+              </w:rPr>
+              <w:lastRenderedPageBreak/>
+              <w:t>T</w:t>
+            </w:r>
+            <w:r>
+              <w:rPr>
+                <w:sz w:val="16"/>
+                <w:szCs w:val="18"/>
+                <w:lang w:val="en-CA"/>
+              </w:rPr>
               <w:t>he toast should appear adjacent to the icon/button, and the arrow should be pointing at it</w:t>
             </w:r>
           </w:p>
@@ -9192,7 +10356,7 @@
                 <w:szCs w:val="18"/>
                 <w:lang w:val="en-CA"/>
               </w:rPr>
-              <w:t xml:space="preserve">he toast for the settings button appears on </w:t>
+              <w:t xml:space="preserve">he toast for </w:t>
             </w:r>
             <w:r>
               <w:rPr>
@@ -9201,7 +10365,7 @@
                 <w:lang w:val="en-CA"/>
               </w:rPr>
               <w:lastRenderedPageBreak/>
-              <w:t>top of it and in one fat line.</w:t>
+              <w:t>the settings button appears on top of it and in one fat line.</w:t>
             </w:r>
           </w:p>
         </w:tc>
@@ -9219,6 +10383,7 @@
           <w:lang w:val="en-CA"/>
         </w:rPr>
       </w:pPr>
+      <w:proofErr w:type="spellStart"/>
       <w:r>
         <w:rPr>
           <w:b/>
@@ -9230,6 +10395,7 @@
         <w:lastRenderedPageBreak/>
         <w:t>PlayneedleEditor.tsx</w:t>
       </w:r>
+      <w:proofErr w:type="spellEnd"/>
     </w:p>
     <w:tbl>
       <w:tblPr>
@@ -9424,6 +10590,7 @@
                 <w:lang w:val="en-CA"/>
               </w:rPr>
             </w:pPr>
+            <w:proofErr w:type="spellStart"/>
             <w:r>
               <w:rPr>
                 <w:sz w:val="16"/>
@@ -9432,6 +10599,7 @@
               </w:rPr>
               <w:t>PlayneedleEditor.tsx</w:t>
             </w:r>
+            <w:proofErr w:type="spellEnd"/>
           </w:p>
         </w:tc>
         <w:tc>
@@ -9462,7 +10630,25 @@
                 <w:szCs w:val="18"/>
                 <w:lang w:val="en-CA"/>
               </w:rPr>
-              <w:t>ettings: components: playneedle editor: width slider</w:t>
+              <w:t xml:space="preserve">ettings: components: </w:t>
+            </w:r>
+            <w:proofErr w:type="spellStart"/>
+            <w:r>
+              <w:rPr>
+                <w:sz w:val="16"/>
+                <w:szCs w:val="18"/>
+                <w:lang w:val="en-CA"/>
+              </w:rPr>
+              <w:t>playneedle</w:t>
+            </w:r>
+            <w:proofErr w:type="spellEnd"/>
+            <w:r>
+              <w:rPr>
+                <w:sz w:val="16"/>
+                <w:szCs w:val="18"/>
+                <w:lang w:val="en-CA"/>
+              </w:rPr>
+              <w:t xml:space="preserve"> editor: width slider</w:t>
             </w:r>
           </w:p>
         </w:tc>
@@ -9494,7 +10680,43 @@
                 <w:szCs w:val="18"/>
                 <w:lang w:val="en-CA"/>
               </w:rPr>
-              <w:t>hange the playneedle width (px) slider</w:t>
+              <w:t xml:space="preserve">hange the </w:t>
+            </w:r>
+            <w:proofErr w:type="spellStart"/>
+            <w:r>
+              <w:rPr>
+                <w:sz w:val="16"/>
+                <w:szCs w:val="18"/>
+                <w:lang w:val="en-CA"/>
+              </w:rPr>
+              <w:t>playneedle</w:t>
+            </w:r>
+            <w:proofErr w:type="spellEnd"/>
+            <w:r>
+              <w:rPr>
+                <w:sz w:val="16"/>
+                <w:szCs w:val="18"/>
+                <w:lang w:val="en-CA"/>
+              </w:rPr>
+              <w:t xml:space="preserve"> width (</w:t>
+            </w:r>
+            <w:proofErr w:type="spellStart"/>
+            <w:r>
+              <w:rPr>
+                <w:sz w:val="16"/>
+                <w:szCs w:val="18"/>
+                <w:lang w:val="en-CA"/>
+              </w:rPr>
+              <w:t>px</w:t>
+            </w:r>
+            <w:proofErr w:type="spellEnd"/>
+            <w:r>
+              <w:rPr>
+                <w:sz w:val="16"/>
+                <w:szCs w:val="18"/>
+                <w:lang w:val="en-CA"/>
+              </w:rPr>
+              <w:t>) slider</w:t>
             </w:r>
           </w:p>
         </w:tc>
@@ -9526,7 +10748,25 @@
                 <w:szCs w:val="18"/>
                 <w:lang w:val="en-CA"/>
               </w:rPr>
-              <w:t>t should change the width of the playneedle both inside the editor and in the timeline.</w:t>
+              <w:t xml:space="preserve">t should change the width of the </w:t>
+            </w:r>
+            <w:proofErr w:type="spellStart"/>
+            <w:r>
+              <w:rPr>
+                <w:sz w:val="16"/>
+                <w:szCs w:val="18"/>
+                <w:lang w:val="en-CA"/>
+              </w:rPr>
+              <w:t>playneedle</w:t>
+            </w:r>
+            <w:proofErr w:type="spellEnd"/>
+            <w:r>
+              <w:rPr>
+                <w:sz w:val="16"/>
+                <w:szCs w:val="18"/>
+                <w:lang w:val="en-CA"/>
+              </w:rPr>
+              <w:t xml:space="preserve"> both inside the editor and in the timeline.</w:t>
             </w:r>
           </w:p>
         </w:tc>
@@ -9597,6 +10837,7 @@
           <w:lang w:val="en-CA"/>
         </w:rPr>
       </w:pPr>
+      <w:proofErr w:type="spellStart"/>
       <w:r>
         <w:rPr>
           <w:b/>
@@ -9605,8 +10846,31 @@
           <w:szCs w:val="32"/>
           <w:lang w:val="en-CA"/>
         </w:rPr>
-        <w:t>modalManager.ts &amp; modalPermissions.ts</w:t>
+        <w:t>modalManager.ts</w:t>
       </w:r>
+      <w:proofErr w:type="spellEnd"/>
+      <w:r>
+        <w:rPr>
+          <w:b/>
+          <w:bCs/>
+          <w:sz w:val="28"/>
+          <w:szCs w:val="32"/>
+          <w:lang w:val="en-CA"/>
+        </w:rPr>
+        <w:t xml:space="preserve"> &amp; </w:t>
+      </w:r>
+      <w:proofErr w:type="spellStart"/>
+      <w:r>
+        <w:rPr>
+          <w:b/>
+          <w:bCs/>
+          <w:sz w:val="28"/>
+          <w:szCs w:val="32"/>
+          <w:lang w:val="en-CA"/>
+        </w:rPr>
+        <w:t>modalPermissions.ts</w:t>
+      </w:r>
+      <w:proofErr w:type="spellEnd"/>
     </w:p>
     <w:p>
       <w:pPr>

</xml_diff>

<commit_message>
fixed TEST_PLAN: Settings: keyboard: all: x button for keybinds: made single key keybinds have an x button, clicking it completely removes the keybind, but a keybind can be re added by clicking on the plus button.
</commit_message>
<xml_diff>
--- a/test plan.docx
+++ b/test plan.docx
@@ -438,7 +438,6 @@
           <w:lang w:val="en-CA"/>
         </w:rPr>
       </w:pPr>
-      <w:proofErr w:type="spellStart"/>
       <w:r>
         <w:rPr>
           <w:rFonts w:hint="eastAsia"/>
@@ -460,7 +459,6 @@
         </w:rPr>
         <w:t>pp.tsx</w:t>
       </w:r>
-      <w:proofErr w:type="spellEnd"/>
     </w:p>
     <w:tbl>
       <w:tblPr>
@@ -655,23 +653,13 @@
                 <w:lang w:val="en-CA"/>
               </w:rPr>
             </w:pPr>
-            <w:proofErr w:type="spellStart"/>
-            <w:r>
-              <w:rPr>
-                <w:sz w:val="16"/>
-                <w:szCs w:val="18"/>
-                <w:lang w:val="en-CA"/>
-              </w:rPr>
-              <w:t>settings.tsx</w:t>
-            </w:r>
-            <w:proofErr w:type="spellEnd"/>
-            <w:r>
-              <w:rPr>
-                <w:sz w:val="16"/>
-                <w:szCs w:val="18"/>
-                <w:lang w:val="en-CA"/>
-              </w:rPr>
-              <w:t>,</w:t>
+            <w:r>
+              <w:rPr>
+                <w:sz w:val="16"/>
+                <w:szCs w:val="18"/>
+                <w:lang w:val="en-CA"/>
+              </w:rPr>
+              <w:t>settings.tsx,</w:t>
             </w:r>
             <w:r>
               <w:rPr>
@@ -681,7 +669,6 @@
               </w:rPr>
               <w:t xml:space="preserve"> </w:t>
             </w:r>
-            <w:proofErr w:type="spellStart"/>
             <w:r>
               <w:rPr>
                 <w:sz w:val="16"/>
@@ -690,7 +677,6 @@
               </w:rPr>
               <w:t>DraggableModal.tsx</w:t>
             </w:r>
-            <w:proofErr w:type="spellEnd"/>
           </w:p>
         </w:tc>
         <w:tc>
@@ -706,23 +692,13 @@
                 <w:lang w:val="en-CA"/>
               </w:rPr>
             </w:pPr>
-            <w:proofErr w:type="spellStart"/>
-            <w:r>
-              <w:rPr>
-                <w:sz w:val="16"/>
-                <w:szCs w:val="18"/>
-                <w:lang w:val="en-CA"/>
-              </w:rPr>
-              <w:t>DraggableModal</w:t>
-            </w:r>
-            <w:proofErr w:type="spellEnd"/>
-            <w:r>
-              <w:rPr>
-                <w:sz w:val="16"/>
-                <w:szCs w:val="18"/>
-                <w:lang w:val="en-CA"/>
-              </w:rPr>
-              <w:t>:</w:t>
+            <w:r>
+              <w:rPr>
+                <w:sz w:val="16"/>
+                <w:szCs w:val="18"/>
+                <w:lang w:val="en-CA"/>
+              </w:rPr>
+              <w:t>DraggableModal:</w:t>
             </w:r>
             <w:r>
               <w:rPr>
@@ -903,25 +879,14 @@
                 <w:lang w:val="en-CA"/>
               </w:rPr>
             </w:pPr>
-            <w:proofErr w:type="spellStart"/>
-            <w:r>
-              <w:rPr>
-                <w:sz w:val="16"/>
-                <w:szCs w:val="18"/>
-                <w:lang w:val="en-CA"/>
-              </w:rPr>
-              <w:t>styles.tsx</w:t>
-            </w:r>
-            <w:proofErr w:type="spellEnd"/>
-            <w:r>
-              <w:rPr>
-                <w:sz w:val="16"/>
-                <w:szCs w:val="18"/>
-                <w:lang w:val="en-CA"/>
-              </w:rPr>
-              <w:t xml:space="preserve">. </w:t>
-            </w:r>
-            <w:proofErr w:type="spellStart"/>
+            <w:r>
+              <w:rPr>
+                <w:sz w:val="16"/>
+                <w:szCs w:val="18"/>
+                <w:lang w:val="en-CA"/>
+              </w:rPr>
+              <w:t xml:space="preserve">styles.tsx. </w:t>
+            </w:r>
             <w:r>
               <w:rPr>
                 <w:sz w:val="16"/>
@@ -930,7 +895,6 @@
               </w:rPr>
               <w:t>DraggableModal.tsx</w:t>
             </w:r>
-            <w:proofErr w:type="spellEnd"/>
           </w:p>
         </w:tc>
         <w:tc>
@@ -946,23 +910,13 @@
                 <w:lang w:val="en-CA"/>
               </w:rPr>
             </w:pPr>
-            <w:proofErr w:type="spellStart"/>
-            <w:r>
-              <w:rPr>
-                <w:sz w:val="16"/>
-                <w:szCs w:val="18"/>
-                <w:lang w:val="en-CA"/>
-              </w:rPr>
-              <w:t>DraggableModal</w:t>
-            </w:r>
-            <w:proofErr w:type="spellEnd"/>
-            <w:r>
-              <w:rPr>
-                <w:sz w:val="16"/>
-                <w:szCs w:val="18"/>
-                <w:lang w:val="en-CA"/>
-              </w:rPr>
-              <w:t>: remember the page state next time you open it (#2 styles)</w:t>
+            <w:r>
+              <w:rPr>
+                <w:sz w:val="16"/>
+                <w:szCs w:val="18"/>
+                <w:lang w:val="en-CA"/>
+              </w:rPr>
+              <w:t>DraggableModal: remember the page state next time you open it (#2 styles)</w:t>
             </w:r>
           </w:p>
         </w:tc>
@@ -1094,51 +1048,22 @@
               </w:rPr>
               <w:t xml:space="preserve">THE FIX: deleted </w:t>
             </w:r>
-            <w:proofErr w:type="spellStart"/>
-            <w:r>
-              <w:rPr>
-                <w:sz w:val="16"/>
-                <w:szCs w:val="18"/>
-                <w:lang w:val="en-CA"/>
-              </w:rPr>
-              <w:t>setStylePage</w:t>
-            </w:r>
-            <w:proofErr w:type="spellEnd"/>
-            <w:r>
-              <w:rPr>
-                <w:sz w:val="16"/>
-                <w:szCs w:val="18"/>
-                <w:lang w:val="en-CA"/>
-              </w:rPr>
-              <w:t>(null);</w:t>
-            </w:r>
-            <w:r>
-              <w:rPr>
-                <w:sz w:val="16"/>
-                <w:szCs w:val="18"/>
-                <w:lang w:val="en-CA"/>
-              </w:rPr>
-              <w:t xml:space="preserve"> on line 181 in </w:t>
-            </w:r>
-            <w:proofErr w:type="spellStart"/>
-            <w:r>
-              <w:rPr>
-                <w:sz w:val="16"/>
-                <w:szCs w:val="18"/>
-                <w:lang w:val="en-CA"/>
-              </w:rPr>
-              <w:t>styles.tsx</w:t>
-            </w:r>
-            <w:proofErr w:type="spellEnd"/>
-            <w:r>
-              <w:rPr>
-                <w:sz w:val="16"/>
-                <w:szCs w:val="18"/>
-                <w:lang w:val="en-CA"/>
-              </w:rPr>
-              <w:t xml:space="preserve"> to </w:t>
-            </w:r>
-            <w:proofErr w:type="spellStart"/>
+            <w:r>
+              <w:rPr>
+                <w:sz w:val="16"/>
+                <w:szCs w:val="18"/>
+                <w:lang w:val="en-CA"/>
+              </w:rPr>
+              <w:t>setStylePage(null);</w:t>
+            </w:r>
+            <w:r>
+              <w:rPr>
+                <w:sz w:val="16"/>
+                <w:szCs w:val="18"/>
+                <w:lang w:val="en-CA"/>
+              </w:rPr>
+              <w:t xml:space="preserve"> on line 181 in styles.tsx to </w:t>
+            </w:r>
             <w:r>
               <w:rPr>
                 <w:i/>
@@ -1148,45 +1073,12 @@
               </w:rPr>
               <w:t>onClose</w:t>
             </w:r>
-            <w:proofErr w:type="spellEnd"/>
-            <w:r>
-              <w:rPr>
-                <w:sz w:val="16"/>
-                <w:szCs w:val="18"/>
-              </w:rPr>
-              <w:t xml:space="preserve">={() =&gt; { </w:t>
-            </w:r>
-            <w:proofErr w:type="spellStart"/>
-            <w:r>
-              <w:rPr>
-                <w:sz w:val="16"/>
-                <w:szCs w:val="18"/>
-              </w:rPr>
-              <w:t>modalManager.close</w:t>
-            </w:r>
-            <w:proofErr w:type="spellEnd"/>
-            <w:r>
-              <w:rPr>
-                <w:sz w:val="16"/>
-                <w:szCs w:val="18"/>
-              </w:rPr>
-              <w:t xml:space="preserve">('styles'); </w:t>
-            </w:r>
-            <w:proofErr w:type="spellStart"/>
-            <w:r>
-              <w:rPr>
-                <w:sz w:val="16"/>
-                <w:szCs w:val="18"/>
-              </w:rPr>
-              <w:t>setShowStyle</w:t>
-            </w:r>
-            <w:proofErr w:type="spellEnd"/>
-            <w:r>
-              <w:rPr>
-                <w:sz w:val="16"/>
-                <w:szCs w:val="18"/>
-              </w:rPr>
-              <w:t>(</w:t>
+            <w:r>
+              <w:rPr>
+                <w:sz w:val="16"/>
+                <w:szCs w:val="18"/>
+              </w:rPr>
+              <w:t>={() =&gt; { modalManager.close('styles'); setShowStyle(</w:t>
             </w:r>
             <w:r>
               <w:rPr>
@@ -1290,7 +1182,6 @@
           <w:lang w:val="en-CA"/>
         </w:rPr>
       </w:pPr>
-      <w:proofErr w:type="spellStart"/>
       <w:r>
         <w:rPr>
           <w:rFonts w:hint="eastAsia"/>
@@ -1312,7 +1203,6 @@
         </w:rPr>
         <w:t>ettings.tsx</w:t>
       </w:r>
-      <w:proofErr w:type="spellEnd"/>
       <w:r>
         <w:rPr>
           <w:b/>
@@ -1329,19 +1219,20 @@
         <w:tblStyle w:val="ae"/>
         <w:tblW w:w="11624" w:type="dxa"/>
         <w:tblInd w:w="-1706" w:type="dxa"/>
+        <w:tblLayout w:type="fixed"/>
         <w:tblLook w:val="04A0" w:firstRow="1" w:lastRow="0" w:firstColumn="1" w:lastColumn="0" w:noHBand="0" w:noVBand="1"/>
       </w:tblPr>
       <w:tblGrid>
-        <w:gridCol w:w="1885"/>
-        <w:gridCol w:w="1761"/>
-        <w:gridCol w:w="2450"/>
-        <w:gridCol w:w="3118"/>
+        <w:gridCol w:w="1843"/>
+        <w:gridCol w:w="1843"/>
         <w:gridCol w:w="2410"/>
+        <w:gridCol w:w="2835"/>
+        <w:gridCol w:w="2693"/>
       </w:tblGrid>
       <w:tr>
         <w:tc>
           <w:tcPr>
-            <w:tcW w:w="1885" w:type="dxa"/>
+            <w:tcW w:w="1843" w:type="dxa"/>
           </w:tcPr>
           <w:p>
             <w:pPr>
@@ -1377,7 +1268,7 @@
         </w:tc>
         <w:tc>
           <w:tcPr>
-            <w:tcW w:w="1761" w:type="dxa"/>
+            <w:tcW w:w="1843" w:type="dxa"/>
           </w:tcPr>
           <w:p>
             <w:pPr>
@@ -1407,7 +1298,7 @@
         </w:tc>
         <w:tc>
           <w:tcPr>
-            <w:tcW w:w="2450" w:type="dxa"/>
+            <w:tcW w:w="2410" w:type="dxa"/>
           </w:tcPr>
           <w:p>
             <w:pPr>
@@ -1439,7 +1330,7 @@
         </w:tc>
         <w:tc>
           <w:tcPr>
-            <w:tcW w:w="3118" w:type="dxa"/>
+            <w:tcW w:w="2835" w:type="dxa"/>
           </w:tcPr>
           <w:p>
             <w:pPr>
@@ -1471,7 +1362,7 @@
         </w:tc>
         <w:tc>
           <w:tcPr>
-            <w:tcW w:w="2410" w:type="dxa"/>
+            <w:tcW w:w="2693" w:type="dxa"/>
           </w:tcPr>
           <w:p>
             <w:pPr>
@@ -1513,18 +1404,17 @@
       <w:tr>
         <w:tc>
           <w:tcPr>
-            <w:tcW w:w="1885" w:type="dxa"/>
-          </w:tcPr>
-          <w:p>
-            <w:pPr>
-              <w:rPr>
-                <w:rFonts w:hint="eastAsia"/>
-                <w:sz w:val="16"/>
-                <w:szCs w:val="18"/>
-                <w:lang w:val="en-CA"/>
-              </w:rPr>
-            </w:pPr>
-            <w:proofErr w:type="spellStart"/>
+            <w:tcW w:w="1843" w:type="dxa"/>
+          </w:tcPr>
+          <w:p>
+            <w:pPr>
+              <w:rPr>
+                <w:rFonts w:hint="eastAsia"/>
+                <w:sz w:val="16"/>
+                <w:szCs w:val="18"/>
+                <w:lang w:val="en-CA"/>
+              </w:rPr>
+            </w:pPr>
             <w:r>
               <w:rPr>
                 <w:sz w:val="16"/>
@@ -1533,12 +1423,11 @@
               </w:rPr>
               <w:t>Settings.tsx</w:t>
             </w:r>
-            <w:proofErr w:type="spellEnd"/>
-          </w:p>
-        </w:tc>
-        <w:tc>
-          <w:tcPr>
-            <w:tcW w:w="1761" w:type="dxa"/>
+          </w:p>
+        </w:tc>
+        <w:tc>
+          <w:tcPr>
+            <w:tcW w:w="1843" w:type="dxa"/>
           </w:tcPr>
           <w:p>
             <w:pPr>
@@ -1570,7 +1459,7 @@
         </w:tc>
         <w:tc>
           <w:tcPr>
-            <w:tcW w:w="2450" w:type="dxa"/>
+            <w:tcW w:w="2410" w:type="dxa"/>
           </w:tcPr>
           <w:p>
             <w:pPr>
@@ -1602,7 +1491,7 @@
         </w:tc>
         <w:tc>
           <w:tcPr>
-            <w:tcW w:w="3118" w:type="dxa"/>
+            <w:tcW w:w="2835" w:type="dxa"/>
           </w:tcPr>
           <w:p>
             <w:pPr>
@@ -1634,7 +1523,7 @@
         </w:tc>
         <w:tc>
           <w:tcPr>
-            <w:tcW w:w="2410" w:type="dxa"/>
+            <w:tcW w:w="2693" w:type="dxa"/>
           </w:tcPr>
           <w:p>
             <w:pPr>
@@ -1660,25 +1549,7 @@
                 <w:szCs w:val="18"/>
                 <w:lang w:val="en-CA"/>
               </w:rPr>
-              <w:t xml:space="preserve">he </w:t>
-            </w:r>
-            <w:proofErr w:type="spellStart"/>
-            <w:r>
-              <w:rPr>
-                <w:sz w:val="16"/>
-                <w:szCs w:val="18"/>
-                <w:lang w:val="en-CA"/>
-              </w:rPr>
-              <w:t>keybind</w:t>
-            </w:r>
-            <w:proofErr w:type="spellEnd"/>
-            <w:r>
-              <w:rPr>
-                <w:sz w:val="16"/>
-                <w:szCs w:val="18"/>
-                <w:lang w:val="en-CA"/>
-              </w:rPr>
-              <w:t xml:space="preserve"> box keeps registering your keys until you click away from the box. </w:t>
+              <w:t xml:space="preserve">he keybind box keeps registering your keys until you click away from the box. </w:t>
             </w:r>
             <w:r>
               <w:rPr>
@@ -1695,45 +1566,25 @@
                 <w:szCs w:val="18"/>
                 <w:lang w:val="en-CA"/>
               </w:rPr>
-              <w:t xml:space="preserve">his behavior may be ambiguous to users because there’s no visual indicator as to which </w:t>
-            </w:r>
-            <w:proofErr w:type="spellStart"/>
-            <w:r>
-              <w:rPr>
-                <w:sz w:val="16"/>
-                <w:szCs w:val="18"/>
-                <w:lang w:val="en-CA"/>
-              </w:rPr>
-              <w:t>keybind</w:t>
-            </w:r>
-            <w:proofErr w:type="spellEnd"/>
-            <w:r>
-              <w:rPr>
-                <w:sz w:val="16"/>
-                <w:szCs w:val="18"/>
-                <w:lang w:val="en-CA"/>
-              </w:rPr>
-              <w:t xml:space="preserve"> box is selected or that you </w:t>
-            </w:r>
-            <w:proofErr w:type="gramStart"/>
-            <w:r>
-              <w:rPr>
-                <w:sz w:val="16"/>
-                <w:szCs w:val="18"/>
-                <w:lang w:val="en-CA"/>
-              </w:rPr>
-              <w:t>have to</w:t>
-            </w:r>
-            <w:proofErr w:type="gramEnd"/>
-            <w:r>
-              <w:rPr>
-                <w:sz w:val="16"/>
-                <w:szCs w:val="18"/>
-                <w:lang w:val="en-CA"/>
-              </w:rPr>
-              <w:t xml:space="preserve"> click away to apply the </w:t>
-            </w:r>
-            <w:proofErr w:type="spellStart"/>
+              <w:t xml:space="preserve">his behavior may be ambiguous to users because there’s no visual indicator as to which keybind box is selected or that you have to click away to apply the keybind. </w:t>
+            </w:r>
+            <w:r>
+              <w:rPr>
+                <w:rFonts w:hint="eastAsia"/>
+                <w:sz w:val="16"/>
+                <w:szCs w:val="18"/>
+                <w:lang w:val="en-CA"/>
+              </w:rPr>
+              <w:t>E</w:t>
+            </w:r>
+            <w:r>
+              <w:rPr>
+                <w:sz w:val="16"/>
+                <w:szCs w:val="18"/>
+                <w:lang w:val="en-CA"/>
+              </w:rPr>
+              <w:t xml:space="preserve">ither add a visual </w:t>
+            </w:r>
             <w:r>
               <w:rPr>
                 <w:sz w:val="16"/>
@@ -1741,51 +1592,7 @@
                 <w:lang w:val="en-CA"/>
               </w:rPr>
               <w:lastRenderedPageBreak/>
-              <w:t>keybind</w:t>
-            </w:r>
-            <w:proofErr w:type="spellEnd"/>
-            <w:r>
-              <w:rPr>
-                <w:sz w:val="16"/>
-                <w:szCs w:val="18"/>
-                <w:lang w:val="en-CA"/>
-              </w:rPr>
-              <w:t xml:space="preserve">. </w:t>
-            </w:r>
-            <w:r>
-              <w:rPr>
-                <w:rFonts w:hint="eastAsia"/>
-                <w:sz w:val="16"/>
-                <w:szCs w:val="18"/>
-                <w:lang w:val="en-CA"/>
-              </w:rPr>
-              <w:t>E</w:t>
-            </w:r>
-            <w:r>
-              <w:rPr>
-                <w:sz w:val="16"/>
-                <w:szCs w:val="18"/>
-                <w:lang w:val="en-CA"/>
-              </w:rPr>
-              <w:t xml:space="preserve">ither add a visual indicator or accept the </w:t>
-            </w:r>
-            <w:proofErr w:type="spellStart"/>
-            <w:r>
-              <w:rPr>
-                <w:sz w:val="16"/>
-                <w:szCs w:val="18"/>
-                <w:lang w:val="en-CA"/>
-              </w:rPr>
-              <w:t>keybind</w:t>
-            </w:r>
-            <w:proofErr w:type="spellEnd"/>
-            <w:r>
-              <w:rPr>
-                <w:sz w:val="16"/>
-                <w:szCs w:val="18"/>
-                <w:lang w:val="en-CA"/>
-              </w:rPr>
-              <w:t xml:space="preserve"> after 1 keypress.</w:t>
+              <w:t>indicator or accept the keybind after 1 keypress.</w:t>
             </w:r>
           </w:p>
         </w:tc>
@@ -1793,18 +1600,17 @@
       <w:tr>
         <w:tc>
           <w:tcPr>
-            <w:tcW w:w="1885" w:type="dxa"/>
-          </w:tcPr>
-          <w:p>
-            <w:pPr>
-              <w:rPr>
-                <w:rFonts w:hint="eastAsia"/>
-                <w:sz w:val="16"/>
-                <w:szCs w:val="18"/>
-                <w:lang w:val="en-CA"/>
-              </w:rPr>
-            </w:pPr>
-            <w:proofErr w:type="spellStart"/>
+            <w:tcW w:w="1843" w:type="dxa"/>
+          </w:tcPr>
+          <w:p>
+            <w:pPr>
+              <w:rPr>
+                <w:rFonts w:hint="eastAsia"/>
+                <w:sz w:val="16"/>
+                <w:szCs w:val="18"/>
+                <w:lang w:val="en-CA"/>
+              </w:rPr>
+            </w:pPr>
             <w:r>
               <w:rPr>
                 <w:rFonts w:hint="eastAsia"/>
@@ -1823,12 +1629,11 @@
               </w:rPr>
               <w:t>ettings.tsx</w:t>
             </w:r>
-            <w:proofErr w:type="spellEnd"/>
-          </w:p>
-        </w:tc>
-        <w:tc>
-          <w:tcPr>
-            <w:tcW w:w="1761" w:type="dxa"/>
+          </w:p>
+        </w:tc>
+        <w:tc>
+          <w:tcPr>
+            <w:tcW w:w="1843" w:type="dxa"/>
           </w:tcPr>
           <w:p>
             <w:pPr>
@@ -1860,7 +1665,7 @@
         </w:tc>
         <w:tc>
           <w:tcPr>
-            <w:tcW w:w="2450" w:type="dxa"/>
+            <w:tcW w:w="2410" w:type="dxa"/>
           </w:tcPr>
           <w:p>
             <w:pPr>
@@ -1892,7 +1697,7 @@
         </w:tc>
         <w:tc>
           <w:tcPr>
-            <w:tcW w:w="3118" w:type="dxa"/>
+            <w:tcW w:w="2835" w:type="dxa"/>
           </w:tcPr>
           <w:p>
             <w:pPr>
@@ -1918,25 +1723,7 @@
                 <w:szCs w:val="18"/>
                 <w:lang w:val="en-CA"/>
               </w:rPr>
-              <w:t xml:space="preserve">ny modified </w:t>
-            </w:r>
-            <w:proofErr w:type="spellStart"/>
-            <w:r>
-              <w:rPr>
-                <w:sz w:val="16"/>
-                <w:szCs w:val="18"/>
-                <w:lang w:val="en-CA"/>
-              </w:rPr>
-              <w:t>keybinds</w:t>
-            </w:r>
-            <w:proofErr w:type="spellEnd"/>
-            <w:r>
-              <w:rPr>
-                <w:sz w:val="16"/>
-                <w:szCs w:val="18"/>
-                <w:lang w:val="en-CA"/>
-              </w:rPr>
-              <w:t xml:space="preserve"> should reset to default. </w:t>
+              <w:t xml:space="preserve">ny modified keybinds should reset to default. </w:t>
             </w:r>
             <w:r>
               <w:rPr>
@@ -1953,25 +1740,7 @@
                 <w:szCs w:val="18"/>
                 <w:lang w:val="en-CA"/>
               </w:rPr>
-              <w:t xml:space="preserve">ny non default additional </w:t>
-            </w:r>
-            <w:proofErr w:type="spellStart"/>
-            <w:r>
-              <w:rPr>
-                <w:sz w:val="16"/>
-                <w:szCs w:val="18"/>
-                <w:lang w:val="en-CA"/>
-              </w:rPr>
-              <w:t>keybinds</w:t>
-            </w:r>
-            <w:proofErr w:type="spellEnd"/>
-            <w:r>
-              <w:rPr>
-                <w:sz w:val="16"/>
-                <w:szCs w:val="18"/>
-                <w:lang w:val="en-CA"/>
-              </w:rPr>
-              <w:t xml:space="preserve"> should be gone. </w:t>
+              <w:t xml:space="preserve">ny non default additional keybinds should be gone. </w:t>
             </w:r>
             <w:r>
               <w:rPr>
@@ -1988,31 +1757,13 @@
                 <w:szCs w:val="18"/>
                 <w:lang w:val="en-CA"/>
               </w:rPr>
-              <w:t xml:space="preserve">ny removed </w:t>
-            </w:r>
-            <w:proofErr w:type="spellStart"/>
-            <w:r>
-              <w:rPr>
-                <w:sz w:val="16"/>
-                <w:szCs w:val="18"/>
-                <w:lang w:val="en-CA"/>
-              </w:rPr>
-              <w:t>keybinds</w:t>
-            </w:r>
-            <w:proofErr w:type="spellEnd"/>
-            <w:r>
-              <w:rPr>
-                <w:sz w:val="16"/>
-                <w:szCs w:val="18"/>
-                <w:lang w:val="en-CA"/>
-              </w:rPr>
-              <w:t xml:space="preserve"> from the default setting should be added back</w:t>
-            </w:r>
-          </w:p>
-        </w:tc>
-        <w:tc>
-          <w:tcPr>
-            <w:tcW w:w="2410" w:type="dxa"/>
+              <w:t>ny removed keybinds from the default setting should be added back</w:t>
+            </w:r>
+          </w:p>
+        </w:tc>
+        <w:tc>
+          <w:tcPr>
+            <w:tcW w:w="2693" w:type="dxa"/>
           </w:tcPr>
           <w:p>
             <w:pPr>
@@ -2037,18 +1788,17 @@
       <w:tr>
         <w:tc>
           <w:tcPr>
-            <w:tcW w:w="1885" w:type="dxa"/>
-          </w:tcPr>
-          <w:p>
-            <w:pPr>
-              <w:rPr>
-                <w:rFonts w:hint="eastAsia"/>
-                <w:sz w:val="16"/>
-                <w:szCs w:val="18"/>
-                <w:lang w:val="en-CA"/>
-              </w:rPr>
-            </w:pPr>
-            <w:proofErr w:type="spellStart"/>
+            <w:tcW w:w="1843" w:type="dxa"/>
+          </w:tcPr>
+          <w:p>
+            <w:pPr>
+              <w:rPr>
+                <w:rFonts w:hint="eastAsia"/>
+                <w:sz w:val="16"/>
+                <w:szCs w:val="18"/>
+                <w:lang w:val="en-CA"/>
+              </w:rPr>
+            </w:pPr>
             <w:r>
               <w:rPr>
                 <w:rFonts w:hint="eastAsia"/>
@@ -2066,12 +1816,11 @@
               </w:rPr>
               <w:t>ettings.tsx</w:t>
             </w:r>
-            <w:proofErr w:type="spellEnd"/>
-          </w:p>
-        </w:tc>
-        <w:tc>
-          <w:tcPr>
-            <w:tcW w:w="1761" w:type="dxa"/>
+          </w:p>
+        </w:tc>
+        <w:tc>
+          <w:tcPr>
+            <w:tcW w:w="1843" w:type="dxa"/>
           </w:tcPr>
           <w:p>
             <w:pPr>
@@ -2099,11 +1848,19 @@
               </w:rPr>
               <w:t>ettings: keyboard: all</w:t>
             </w:r>
-          </w:p>
-        </w:tc>
-        <w:tc>
-          <w:tcPr>
-            <w:tcW w:w="2450" w:type="dxa"/>
+            <w:r>
+              <w:rPr>
+                <w:sz w:val="16"/>
+                <w:szCs w:val="18"/>
+                <w:lang w:val="en-CA"/>
+              </w:rPr>
+              <w:t>: plus button</w:t>
+            </w:r>
+          </w:p>
+        </w:tc>
+        <w:tc>
+          <w:tcPr>
+            <w:tcW w:w="2410" w:type="dxa"/>
           </w:tcPr>
           <w:p>
             <w:pPr>
@@ -2135,7 +1892,7 @@
         </w:tc>
         <w:tc>
           <w:tcPr>
-            <w:tcW w:w="3118" w:type="dxa"/>
+            <w:tcW w:w="2835" w:type="dxa"/>
           </w:tcPr>
           <w:p>
             <w:pPr>
@@ -2161,25 +1918,7 @@
                 <w:szCs w:val="18"/>
                 <w:lang w:val="en-CA"/>
               </w:rPr>
-              <w:t xml:space="preserve">t should add a new </w:t>
-            </w:r>
-            <w:proofErr w:type="spellStart"/>
-            <w:r>
-              <w:rPr>
-                <w:sz w:val="16"/>
-                <w:szCs w:val="18"/>
-                <w:lang w:val="en-CA"/>
-              </w:rPr>
-              <w:t>keybind</w:t>
-            </w:r>
-            <w:proofErr w:type="spellEnd"/>
-            <w:r>
-              <w:rPr>
-                <w:sz w:val="16"/>
-                <w:szCs w:val="18"/>
-                <w:lang w:val="en-CA"/>
-              </w:rPr>
-              <w:t xml:space="preserve"> box. </w:t>
+              <w:t xml:space="preserve">t should add a new keybind box. </w:t>
             </w:r>
             <w:r>
               <w:rPr>
@@ -2196,31 +1935,13 @@
                 <w:szCs w:val="18"/>
                 <w:lang w:val="en-CA"/>
               </w:rPr>
-              <w:t xml:space="preserve">oth </w:t>
-            </w:r>
-            <w:proofErr w:type="spellStart"/>
-            <w:r>
-              <w:rPr>
-                <w:sz w:val="16"/>
-                <w:szCs w:val="18"/>
-                <w:lang w:val="en-CA"/>
-              </w:rPr>
-              <w:t>keybind</w:t>
-            </w:r>
-            <w:proofErr w:type="spellEnd"/>
-            <w:r>
-              <w:rPr>
-                <w:sz w:val="16"/>
-                <w:szCs w:val="18"/>
-                <w:lang w:val="en-CA"/>
-              </w:rPr>
-              <w:t xml:space="preserve"> boxes should have an “x” button</w:t>
-            </w:r>
-          </w:p>
-        </w:tc>
-        <w:tc>
-          <w:tcPr>
-            <w:tcW w:w="2410" w:type="dxa"/>
+              <w:t>oth keybind boxes should have an “x” button</w:t>
+            </w:r>
+          </w:p>
+        </w:tc>
+        <w:tc>
+          <w:tcPr>
+            <w:tcW w:w="2693" w:type="dxa"/>
           </w:tcPr>
           <w:p>
             <w:pPr>
@@ -2245,18 +1966,18 @@
       <w:tr>
         <w:tc>
           <w:tcPr>
-            <w:tcW w:w="1885" w:type="dxa"/>
-          </w:tcPr>
-          <w:p>
-            <w:pPr>
-              <w:rPr>
-                <w:rFonts w:hint="eastAsia"/>
-                <w:sz w:val="16"/>
-                <w:szCs w:val="18"/>
-                <w:lang w:val="en-CA"/>
-              </w:rPr>
-            </w:pPr>
-            <w:proofErr w:type="spellStart"/>
+            <w:tcW w:w="1843" w:type="dxa"/>
+            <w:shd w:val="clear" w:color="auto" w:fill="D9F2D0" w:themeFill="accent6" w:themeFillTint="33"/>
+          </w:tcPr>
+          <w:p>
+            <w:pPr>
+              <w:rPr>
+                <w:rFonts w:hint="eastAsia"/>
+                <w:sz w:val="16"/>
+                <w:szCs w:val="18"/>
+                <w:lang w:val="en-CA"/>
+              </w:rPr>
+            </w:pPr>
             <w:r>
               <w:rPr>
                 <w:rFonts w:hint="eastAsia"/>
@@ -2274,12 +1995,12 @@
               </w:rPr>
               <w:t>ettings.tsx</w:t>
             </w:r>
-            <w:proofErr w:type="spellEnd"/>
-          </w:p>
-        </w:tc>
-        <w:tc>
-          <w:tcPr>
-            <w:tcW w:w="1761" w:type="dxa"/>
+          </w:p>
+        </w:tc>
+        <w:tc>
+          <w:tcPr>
+            <w:tcW w:w="1843" w:type="dxa"/>
+            <w:shd w:val="clear" w:color="auto" w:fill="D9F2D0" w:themeFill="accent6" w:themeFillTint="33"/>
           </w:tcPr>
           <w:p>
             <w:pPr>
@@ -2307,11 +2028,20 @@
               </w:rPr>
               <w:t>ettings: keyboard: all</w:t>
             </w:r>
-          </w:p>
-        </w:tc>
-        <w:tc>
-          <w:tcPr>
-            <w:tcW w:w="2450" w:type="dxa"/>
+            <w:r>
+              <w:rPr>
+                <w:sz w:val="16"/>
+                <w:szCs w:val="18"/>
+                <w:lang w:val="en-CA"/>
+              </w:rPr>
+              <w:t>: x button for keybinds</w:t>
+            </w:r>
+          </w:p>
+        </w:tc>
+        <w:tc>
+          <w:tcPr>
+            <w:tcW w:w="2410" w:type="dxa"/>
+            <w:shd w:val="clear" w:color="auto" w:fill="D9F2D0" w:themeFill="accent6" w:themeFillTint="33"/>
           </w:tcPr>
           <w:p>
             <w:pPr>
@@ -2337,31 +2067,39 @@
                 <w:szCs w:val="18"/>
                 <w:lang w:val="en-CA"/>
               </w:rPr>
-              <w:t xml:space="preserve">lick the “x” button on the right side in a </w:t>
-            </w:r>
-            <w:proofErr w:type="spellStart"/>
-            <w:r>
-              <w:rPr>
-                <w:sz w:val="16"/>
-                <w:szCs w:val="18"/>
-                <w:lang w:val="en-CA"/>
-              </w:rPr>
-              <w:t>keybind</w:t>
-            </w:r>
-            <w:proofErr w:type="spellEnd"/>
-            <w:r>
-              <w:rPr>
-                <w:sz w:val="16"/>
-                <w:szCs w:val="18"/>
-                <w:lang w:val="en-CA"/>
-              </w:rPr>
-              <w:t xml:space="preserve"> box</w:t>
-            </w:r>
-          </w:p>
-        </w:tc>
-        <w:tc>
-          <w:tcPr>
-            <w:tcW w:w="3118" w:type="dxa"/>
+              <w:t>lick the “x” button on the right side in a keybind box</w:t>
+            </w:r>
+            <w:r>
+              <w:rPr>
+                <w:sz w:val="16"/>
+                <w:szCs w:val="18"/>
+                <w:lang w:val="en-CA"/>
+              </w:rPr>
+              <w:t xml:space="preserve">. </w:t>
+            </w:r>
+            <w:r>
+              <w:rPr>
+                <w:rFonts w:hint="eastAsia"/>
+                <w:sz w:val="16"/>
+                <w:szCs w:val="18"/>
+                <w:lang w:val="en-CA"/>
+              </w:rPr>
+              <w:t>T</w:t>
+            </w:r>
+            <w:r>
+              <w:rPr>
+                <w:sz w:val="16"/>
+                <w:szCs w:val="18"/>
+                <w:lang w:val="en-CA"/>
+              </w:rPr>
+              <w:t>ry this for commands with multiple keybinds and just one keybind</w:t>
+            </w:r>
+          </w:p>
+        </w:tc>
+        <w:tc>
+          <w:tcPr>
+            <w:tcW w:w="2835" w:type="dxa"/>
+            <w:shd w:val="clear" w:color="auto" w:fill="D9F2D0" w:themeFill="accent6" w:themeFillTint="33"/>
           </w:tcPr>
           <w:p>
             <w:pPr>
@@ -2387,18 +2125,25 @@
                 <w:szCs w:val="18"/>
                 <w:lang w:val="en-CA"/>
               </w:rPr>
-              <w:t xml:space="preserve">t should delete that </w:t>
-            </w:r>
-            <w:proofErr w:type="spellStart"/>
-            <w:r>
-              <w:rPr>
-                <w:sz w:val="16"/>
-                <w:szCs w:val="18"/>
-                <w:lang w:val="en-CA"/>
-              </w:rPr>
-              <w:t>keybind</w:t>
-            </w:r>
-            <w:proofErr w:type="spellEnd"/>
+              <w:t xml:space="preserve">t should delete that keybind. </w:t>
+            </w:r>
+            <w:r>
+              <w:rPr>
+                <w:rFonts w:hint="eastAsia"/>
+                <w:sz w:val="16"/>
+                <w:szCs w:val="18"/>
+                <w:lang w:val="en-CA"/>
+              </w:rPr>
+              <w:t>I</w:t>
+            </w:r>
+            <w:r>
+              <w:rPr>
+                <w:sz w:val="16"/>
+                <w:szCs w:val="18"/>
+                <w:lang w:val="en-CA"/>
+              </w:rPr>
+              <w:t>f there is only one keybind, there should still be an X button</w:t>
+            </w:r>
             <w:r>
               <w:rPr>
                 <w:sz w:val="16"/>
@@ -2414,126 +2159,64 @@
                 <w:szCs w:val="18"/>
                 <w:lang w:val="en-CA"/>
               </w:rPr>
-              <w:t>I</w:t>
-            </w:r>
-            <w:r>
-              <w:rPr>
-                <w:sz w:val="16"/>
-                <w:szCs w:val="18"/>
-                <w:lang w:val="en-CA"/>
-              </w:rPr>
-              <w:t xml:space="preserve">f there is only one </w:t>
-            </w:r>
-            <w:proofErr w:type="spellStart"/>
-            <w:r>
-              <w:rPr>
-                <w:sz w:val="16"/>
-                <w:szCs w:val="18"/>
-                <w:lang w:val="en-CA"/>
-              </w:rPr>
-              <w:t>keybind</w:t>
-            </w:r>
-            <w:proofErr w:type="spellEnd"/>
-            <w:r>
-              <w:rPr>
-                <w:sz w:val="16"/>
-                <w:szCs w:val="18"/>
-                <w:lang w:val="en-CA"/>
-              </w:rPr>
-              <w:t>, there should still be an X button</w:t>
-            </w:r>
-          </w:p>
-        </w:tc>
-        <w:tc>
-          <w:tcPr>
-            <w:tcW w:w="2410" w:type="dxa"/>
-          </w:tcPr>
-          <w:p>
-            <w:pPr>
-              <w:rPr>
-                <w:rFonts w:hint="eastAsia"/>
-                <w:sz w:val="16"/>
-                <w:szCs w:val="18"/>
-                <w:lang w:val="en-CA"/>
-              </w:rPr>
-            </w:pPr>
-            <w:r>
-              <w:rPr>
-                <w:rFonts w:hint="eastAsia"/>
-                <w:sz w:val="16"/>
-                <w:szCs w:val="18"/>
-                <w:lang w:val="en-CA"/>
-              </w:rPr>
-              <w:t>S</w:t>
-            </w:r>
-            <w:r>
-              <w:rPr>
-                <w:sz w:val="16"/>
-                <w:szCs w:val="18"/>
-                <w:lang w:val="en-CA"/>
-              </w:rPr>
-              <w:t xml:space="preserve">ingle </w:t>
-            </w:r>
-            <w:proofErr w:type="spellStart"/>
-            <w:r>
-              <w:rPr>
-                <w:sz w:val="16"/>
-                <w:szCs w:val="18"/>
-                <w:lang w:val="en-CA"/>
-              </w:rPr>
-              <w:t>keybinds</w:t>
-            </w:r>
-            <w:proofErr w:type="spellEnd"/>
-            <w:r>
-              <w:rPr>
-                <w:sz w:val="16"/>
-                <w:szCs w:val="18"/>
-                <w:lang w:val="en-CA"/>
-              </w:rPr>
-              <w:t xml:space="preserve"> don’t have an X button</w:t>
-            </w:r>
-            <w:r>
-              <w:rPr>
-                <w:sz w:val="16"/>
-                <w:szCs w:val="18"/>
-                <w:lang w:val="en-CA"/>
-              </w:rPr>
-              <w:t xml:space="preserve">. </w:t>
-            </w:r>
-            <w:r>
-              <w:rPr>
-                <w:rFonts w:hint="eastAsia"/>
-                <w:sz w:val="16"/>
-                <w:szCs w:val="18"/>
-                <w:lang w:val="en-CA"/>
-              </w:rPr>
-              <w:t>N</w:t>
-            </w:r>
-            <w:r>
-              <w:rPr>
-                <w:sz w:val="16"/>
-                <w:szCs w:val="18"/>
-                <w:lang w:val="en-CA"/>
-              </w:rPr>
-              <w:t xml:space="preserve">eeds fixing: allow single </w:t>
-            </w:r>
-            <w:proofErr w:type="spellStart"/>
-            <w:r>
-              <w:rPr>
-                <w:sz w:val="16"/>
-                <w:szCs w:val="18"/>
-                <w:lang w:val="en-CA"/>
-              </w:rPr>
-              <w:t>keybinds</w:t>
-            </w:r>
-            <w:proofErr w:type="spellEnd"/>
-            <w:r>
-              <w:rPr>
-                <w:sz w:val="16"/>
-                <w:szCs w:val="18"/>
-                <w:lang w:val="en-CA"/>
-              </w:rPr>
-              <w:t xml:space="preserve"> to have an X button</w:t>
+              <w:t>C</w:t>
+            </w:r>
+            <w:r>
+              <w:rPr>
+                <w:sz w:val="16"/>
+                <w:szCs w:val="18"/>
+                <w:lang w:val="en-CA"/>
+              </w:rPr>
+              <w:t>licking this x button should remove the keybind completely</w:t>
+            </w:r>
+          </w:p>
+        </w:tc>
+        <w:tc>
+          <w:tcPr>
+            <w:tcW w:w="2693" w:type="dxa"/>
+            <w:shd w:val="clear" w:color="auto" w:fill="D9F2D0" w:themeFill="accent6" w:themeFillTint="33"/>
+          </w:tcPr>
+          <w:p>
+            <w:pPr>
+              <w:rPr>
+                <w:rFonts w:hint="eastAsia"/>
+                <w:sz w:val="16"/>
+                <w:szCs w:val="18"/>
+                <w:lang w:val="en-CA"/>
+              </w:rPr>
+            </w:pPr>
+            <w:r>
+              <w:rPr>
+                <w:rFonts w:hint="eastAsia"/>
+                <w:sz w:val="16"/>
+                <w:szCs w:val="18"/>
+                <w:lang w:val="en-CA"/>
+              </w:rPr>
+              <w:t>F</w:t>
+            </w:r>
+            <w:r>
+              <w:rPr>
+                <w:sz w:val="16"/>
+                <w:szCs w:val="18"/>
+                <w:lang w:val="en-CA"/>
+              </w:rPr>
+              <w:t xml:space="preserve">ixed as of </w:t>
+            </w:r>
+            <w:r>
+              <w:rPr>
+                <w:sz w:val="16"/>
+                <w:szCs w:val="18"/>
+                <w:lang w:val="en-CA"/>
+              </w:rPr>
+              <w:t>3607af226c53e66d838d2e7e6d12f7786861206e</w:t>
+            </w:r>
+            <w:r>
+              <w:rPr>
+                <w:sz w:val="16"/>
+                <w:szCs w:val="18"/>
+                <w:lang w:val="en-CA"/>
+              </w:rPr>
+              <w:t xml:space="preserve"> + 1</w:t>
             </w:r>
           </w:p>
         </w:tc>
@@ -2541,18 +2224,17 @@
       <w:tr>
         <w:tc>
           <w:tcPr>
-            <w:tcW w:w="1885" w:type="dxa"/>
-          </w:tcPr>
-          <w:p>
-            <w:pPr>
-              <w:rPr>
-                <w:rFonts w:hint="eastAsia"/>
-                <w:sz w:val="16"/>
-                <w:szCs w:val="18"/>
-                <w:lang w:val="en-CA"/>
-              </w:rPr>
-            </w:pPr>
-            <w:proofErr w:type="spellStart"/>
+            <w:tcW w:w="1843" w:type="dxa"/>
+          </w:tcPr>
+          <w:p>
+            <w:pPr>
+              <w:rPr>
+                <w:rFonts w:hint="eastAsia"/>
+                <w:sz w:val="16"/>
+                <w:szCs w:val="18"/>
+                <w:lang w:val="en-CA"/>
+              </w:rPr>
+            </w:pPr>
             <w:r>
               <w:rPr>
                 <w:rFonts w:hint="eastAsia"/>
@@ -2570,12 +2252,11 @@
               </w:rPr>
               <w:t>ettings.tsx</w:t>
             </w:r>
-            <w:proofErr w:type="spellEnd"/>
-          </w:p>
-        </w:tc>
-        <w:tc>
-          <w:tcPr>
-            <w:tcW w:w="1761" w:type="dxa"/>
+          </w:p>
+        </w:tc>
+        <w:tc>
+          <w:tcPr>
+            <w:tcW w:w="1843" w:type="dxa"/>
           </w:tcPr>
           <w:p>
             <w:pPr>
@@ -2607,7 +2288,7 @@
         </w:tc>
         <w:tc>
           <w:tcPr>
-            <w:tcW w:w="2450" w:type="dxa"/>
+            <w:tcW w:w="2410" w:type="dxa"/>
           </w:tcPr>
           <w:p>
             <w:pPr>
@@ -2633,23 +2314,13 @@
                 <w:szCs w:val="18"/>
                 <w:lang w:val="en-CA"/>
               </w:rPr>
-              <w:t xml:space="preserve">ake an adjustment to the clip in the timeline and press the undo </w:t>
-            </w:r>
-            <w:proofErr w:type="spellStart"/>
-            <w:r>
-              <w:rPr>
-                <w:sz w:val="16"/>
-                <w:szCs w:val="18"/>
-                <w:lang w:val="en-CA"/>
-              </w:rPr>
-              <w:t>keybind</w:t>
-            </w:r>
-            <w:proofErr w:type="spellEnd"/>
-          </w:p>
-        </w:tc>
-        <w:tc>
-          <w:tcPr>
-            <w:tcW w:w="3118" w:type="dxa"/>
+              <w:t>ake an adjustment to the clip in the timeline and press the undo keybind</w:t>
+            </w:r>
+          </w:p>
+        </w:tc>
+        <w:tc>
+          <w:tcPr>
+            <w:tcW w:w="2835" w:type="dxa"/>
           </w:tcPr>
           <w:p>
             <w:pPr>
@@ -2681,7 +2352,7 @@
         </w:tc>
         <w:tc>
           <w:tcPr>
-            <w:tcW w:w="2410" w:type="dxa"/>
+            <w:tcW w:w="2693" w:type="dxa"/>
           </w:tcPr>
           <w:p>
             <w:pPr>
@@ -2729,7 +2400,6 @@
           <w:lang w:val="en-CA"/>
         </w:rPr>
       </w:pPr>
-      <w:proofErr w:type="spellStart"/>
       <w:r>
         <w:rPr>
           <w:rFonts w:hint="eastAsia"/>
@@ -2749,18 +2419,7 @@
           <w:szCs w:val="32"/>
           <w:lang w:val="en-CA"/>
         </w:rPr>
-        <w:t>ettings.tsx</w:t>
-      </w:r>
-      <w:proofErr w:type="spellEnd"/>
-      <w:r>
-        <w:rPr>
-          <w:b/>
-          <w:bCs/>
-          <w:sz w:val="28"/>
-          <w:szCs w:val="32"/>
-          <w:lang w:val="en-CA"/>
-        </w:rPr>
-        <w:t xml:space="preserve">: </w:t>
+        <w:t xml:space="preserve">ettings.tsx: </w:t>
       </w:r>
       <w:r>
         <w:rPr>
@@ -2967,7 +2626,6 @@
                 <w:lang w:val="en-CA"/>
               </w:rPr>
             </w:pPr>
-            <w:proofErr w:type="spellStart"/>
             <w:r>
               <w:rPr>
                 <w:rFonts w:hint="eastAsia"/>
@@ -2985,25 +2643,14 @@
               </w:rPr>
               <w:t>ettings.tsx</w:t>
             </w:r>
-            <w:proofErr w:type="spellEnd"/>
-            <w:r>
-              <w:rPr>
-                <w:sz w:val="16"/>
-                <w:szCs w:val="18"/>
-                <w:lang w:val="en-CA"/>
-              </w:rPr>
-              <w:t xml:space="preserve"> </w:t>
-            </w:r>
-            <w:proofErr w:type="spellStart"/>
-            <w:r>
-              <w:rPr>
-                <w:sz w:val="16"/>
-                <w:szCs w:val="18"/>
-                <w:lang w:val="en-CA"/>
-              </w:rPr>
-              <w:t>DraggableModal.tsx</w:t>
-            </w:r>
-            <w:proofErr w:type="spellEnd"/>
+            <w:r>
+              <w:rPr>
+                <w:sz w:val="16"/>
+                <w:szCs w:val="18"/>
+                <w:lang w:val="en-CA"/>
+              </w:rPr>
+              <w:t xml:space="preserve"> DraggableModal.tsx</w:t>
+            </w:r>
           </w:p>
         </w:tc>
         <w:tc>
@@ -3084,7 +2731,6 @@
               </w:rPr>
               <w:t xml:space="preserve">pen a modal, </w:t>
             </w:r>
-            <w:proofErr w:type="gramStart"/>
             <w:r>
               <w:rPr>
                 <w:rFonts w:hint="eastAsia"/>
@@ -3100,16 +2746,7 @@
                 <w:szCs w:val="18"/>
                 <w:lang w:val="en-CA"/>
               </w:rPr>
-              <w:t>ry</w:t>
-            </w:r>
-            <w:proofErr w:type="gramEnd"/>
-            <w:r>
-              <w:rPr>
-                <w:sz w:val="16"/>
-                <w:szCs w:val="18"/>
-                <w:lang w:val="en-CA"/>
-              </w:rPr>
-              <w:t xml:space="preserve"> dragging the x button, - button, and back button.</w:t>
+              <w:t>ry dragging the x button, - button, and back button.</w:t>
             </w:r>
           </w:p>
         </w:tc>
@@ -3203,7 +2840,6 @@
                 <w:lang w:val="en-CA"/>
               </w:rPr>
             </w:pPr>
-            <w:proofErr w:type="spellStart"/>
             <w:r>
               <w:rPr>
                 <w:rFonts w:hint="eastAsia"/>
@@ -3221,25 +2857,14 @@
               </w:rPr>
               <w:t>ettings.tsx</w:t>
             </w:r>
-            <w:proofErr w:type="spellEnd"/>
-            <w:r>
-              <w:rPr>
-                <w:sz w:val="16"/>
-                <w:szCs w:val="18"/>
-                <w:lang w:val="en-CA"/>
-              </w:rPr>
-              <w:t xml:space="preserve"> </w:t>
-            </w:r>
-            <w:proofErr w:type="spellStart"/>
-            <w:r>
-              <w:rPr>
-                <w:sz w:val="16"/>
-                <w:szCs w:val="18"/>
-                <w:lang w:val="en-CA"/>
-              </w:rPr>
-              <w:t>DraggableModal.tsx</w:t>
-            </w:r>
-            <w:proofErr w:type="spellEnd"/>
+            <w:r>
+              <w:rPr>
+                <w:sz w:val="16"/>
+                <w:szCs w:val="18"/>
+                <w:lang w:val="en-CA"/>
+              </w:rPr>
+              <w:t xml:space="preserve"> DraggableModal.tsx</w:t>
+            </w:r>
           </w:p>
         </w:tc>
         <w:tc>
@@ -3426,7 +3051,6 @@
                 <w:lang w:val="en-CA"/>
               </w:rPr>
             </w:pPr>
-            <w:proofErr w:type="spellStart"/>
             <w:r>
               <w:rPr>
                 <w:rFonts w:hint="eastAsia"/>
@@ -3442,27 +3066,8 @@
                 <w:szCs w:val="18"/>
                 <w:lang w:val="en-CA"/>
               </w:rPr>
-              <w:t>ettings.tsx</w:t>
-            </w:r>
-            <w:proofErr w:type="spellEnd"/>
-            <w:r>
-              <w:rPr>
-                <w:sz w:val="16"/>
-                <w:szCs w:val="18"/>
-                <w:lang w:val="en-CA"/>
-              </w:rPr>
-              <w:t xml:space="preserve">, </w:t>
-            </w:r>
-            <w:proofErr w:type="spellStart"/>
-            <w:r>
-              <w:rPr>
-                <w:sz w:val="16"/>
-                <w:szCs w:val="18"/>
-                <w:lang w:val="en-CA"/>
-              </w:rPr>
-              <w:t>DraggableModal.tsx</w:t>
-            </w:r>
-            <w:proofErr w:type="spellEnd"/>
+              <w:t>ettings.tsx, DraggableModal.tsx</w:t>
+            </w:r>
           </w:p>
         </w:tc>
         <w:tc>
@@ -3541,7 +3146,6 @@
               </w:rPr>
               <w:t xml:space="preserve">pen a modal, </w:t>
             </w:r>
-            <w:proofErr w:type="gramStart"/>
             <w:r>
               <w:rPr>
                 <w:rFonts w:hint="eastAsia"/>
@@ -3557,16 +3161,7 @@
                 <w:szCs w:val="18"/>
                 <w:lang w:val="en-CA"/>
               </w:rPr>
-              <w:t>ry</w:t>
-            </w:r>
-            <w:proofErr w:type="gramEnd"/>
-            <w:r>
-              <w:rPr>
-                <w:sz w:val="16"/>
-                <w:szCs w:val="18"/>
-                <w:lang w:val="en-CA"/>
-              </w:rPr>
-              <w:t xml:space="preserve"> clicking on the x button, - button, or back button</w:t>
+              <w:t>ry clicking on the x button, - button, or back button</w:t>
             </w:r>
           </w:p>
         </w:tc>
@@ -3658,7 +3253,6 @@
                 <w:lang w:val="en-CA"/>
               </w:rPr>
             </w:pPr>
-            <w:proofErr w:type="spellStart"/>
             <w:r>
               <w:rPr>
                 <w:rFonts w:hint="eastAsia"/>
@@ -3676,25 +3270,14 @@
               </w:rPr>
               <w:t>ettings.tsx</w:t>
             </w:r>
-            <w:proofErr w:type="spellEnd"/>
-            <w:r>
-              <w:rPr>
-                <w:sz w:val="16"/>
-                <w:szCs w:val="18"/>
-                <w:lang w:val="en-CA"/>
-              </w:rPr>
-              <w:t xml:space="preserve"> </w:t>
-            </w:r>
-            <w:proofErr w:type="spellStart"/>
-            <w:r>
-              <w:rPr>
-                <w:sz w:val="16"/>
-                <w:szCs w:val="18"/>
-                <w:lang w:val="en-CA"/>
-              </w:rPr>
-              <w:t>DraggableModal.tsx</w:t>
-            </w:r>
-            <w:proofErr w:type="spellEnd"/>
+            <w:r>
+              <w:rPr>
+                <w:sz w:val="16"/>
+                <w:szCs w:val="18"/>
+                <w:lang w:val="en-CA"/>
+              </w:rPr>
+              <w:t xml:space="preserve"> DraggableModal.tsx</w:t>
+            </w:r>
           </w:p>
         </w:tc>
         <w:tc>
@@ -3890,7 +3473,6 @@
                 <w:lang w:val="en-CA"/>
               </w:rPr>
             </w:pPr>
-            <w:proofErr w:type="spellStart"/>
             <w:r>
               <w:rPr>
                 <w:rFonts w:hint="eastAsia"/>
@@ -3906,27 +3488,8 @@
                 <w:szCs w:val="18"/>
                 <w:lang w:val="en-CA"/>
               </w:rPr>
-              <w:t>ettings.tsx</w:t>
-            </w:r>
-            <w:proofErr w:type="spellEnd"/>
-            <w:r>
-              <w:rPr>
-                <w:sz w:val="16"/>
-                <w:szCs w:val="18"/>
-                <w:lang w:val="en-CA"/>
-              </w:rPr>
-              <w:t xml:space="preserve">, </w:t>
-            </w:r>
-            <w:proofErr w:type="spellStart"/>
-            <w:r>
-              <w:rPr>
-                <w:sz w:val="16"/>
-                <w:szCs w:val="18"/>
-                <w:lang w:val="en-CA"/>
-              </w:rPr>
-              <w:t>DraggableModal.tsx</w:t>
-            </w:r>
-            <w:proofErr w:type="spellEnd"/>
+              <w:t>ettings.tsx, DraggableModal.tsx</w:t>
+            </w:r>
           </w:p>
         </w:tc>
         <w:tc>
@@ -3957,7 +3520,16 @@
                 <w:szCs w:val="18"/>
                 <w:lang w:val="en-CA"/>
               </w:rPr>
-              <w:t>ettings: switches: execute header action buttons when dragging: ENABLED</w:t>
+              <w:t xml:space="preserve">ettings: switches: execute header action buttons when dragging: </w:t>
+            </w:r>
+            <w:r>
+              <w:rPr>
+                <w:sz w:val="16"/>
+                <w:szCs w:val="18"/>
+                <w:lang w:val="en-CA"/>
+              </w:rPr>
+              <w:lastRenderedPageBreak/>
+              <w:t>ENABLED</w:t>
             </w:r>
           </w:p>
         </w:tc>
@@ -3981,6 +3553,7 @@
                 <w:szCs w:val="18"/>
                 <w:lang w:val="en-CA"/>
               </w:rPr>
+              <w:lastRenderedPageBreak/>
               <w:t>O</w:t>
             </w:r>
             <w:r>
@@ -4085,7 +3658,7 @@
                 <w:szCs w:val="18"/>
                 <w:lang w:val="en-CA"/>
               </w:rPr>
-              <w:t xml:space="preserve">urning this setting on allows you to drag </w:t>
+              <w:t xml:space="preserve">urning this </w:t>
             </w:r>
             <w:r>
               <w:rPr>
@@ -4094,7 +3667,7 @@
                 <w:lang w:val="en-CA"/>
               </w:rPr>
               <w:lastRenderedPageBreak/>
-              <w:t>the modal, which isn’t what this setting is supposed to do.</w:t>
+              <w:t>setting on allows you to drag the modal, which isn’t what this setting is supposed to do.</w:t>
             </w:r>
           </w:p>
         </w:tc>
@@ -4114,7 +3687,6 @@
                 <w:lang w:val="en-CA"/>
               </w:rPr>
             </w:pPr>
-            <w:proofErr w:type="spellStart"/>
             <w:r>
               <w:rPr>
                 <w:rFonts w:hint="eastAsia"/>
@@ -4133,79 +3705,14 @@
               </w:rPr>
               <w:t>ettings.tsx</w:t>
             </w:r>
-            <w:proofErr w:type="spellEnd"/>
-            <w:r>
-              <w:rPr>
-                <w:sz w:val="16"/>
-                <w:szCs w:val="18"/>
-                <w:lang w:val="en-CA"/>
-              </w:rPr>
-              <w:t xml:space="preserve">, </w:t>
-            </w:r>
-            <w:proofErr w:type="spellStart"/>
-            <w:r>
-              <w:rPr>
-                <w:sz w:val="16"/>
-                <w:szCs w:val="18"/>
-                <w:lang w:val="en-CA"/>
-              </w:rPr>
-              <w:t>draggableModal.tsx</w:t>
-            </w:r>
-            <w:proofErr w:type="spellEnd"/>
-            <w:r>
-              <w:rPr>
-                <w:sz w:val="16"/>
-                <w:szCs w:val="18"/>
-                <w:lang w:val="en-CA"/>
-              </w:rPr>
-              <w:t xml:space="preserve">, </w:t>
-            </w:r>
-            <w:proofErr w:type="spellStart"/>
-            <w:r>
-              <w:rPr>
-                <w:sz w:val="16"/>
-                <w:szCs w:val="18"/>
-                <w:lang w:val="en-CA"/>
-              </w:rPr>
-              <w:t>Toast.tsx</w:t>
-            </w:r>
-            <w:proofErr w:type="spellEnd"/>
-            <w:r>
-              <w:rPr>
-                <w:sz w:val="16"/>
-                <w:szCs w:val="18"/>
-                <w:lang w:val="en-CA"/>
-              </w:rPr>
-              <w:t xml:space="preserve">, </w:t>
-            </w:r>
-            <w:proofErr w:type="spellStart"/>
-            <w:r>
-              <w:rPr>
-                <w:sz w:val="16"/>
-                <w:szCs w:val="18"/>
-                <w:lang w:val="en-CA"/>
-              </w:rPr>
-              <w:t>modalManager.ts</w:t>
-            </w:r>
-            <w:proofErr w:type="spellEnd"/>
-            <w:r>
-              <w:rPr>
-                <w:sz w:val="16"/>
-                <w:szCs w:val="18"/>
-                <w:lang w:val="en-CA"/>
-              </w:rPr>
-              <w:t xml:space="preserve">, </w:t>
-            </w:r>
-            <w:proofErr w:type="spellStart"/>
-            <w:r>
-              <w:rPr>
-                <w:sz w:val="16"/>
-                <w:szCs w:val="18"/>
-                <w:lang w:val="en-CA"/>
-              </w:rPr>
-              <w:t>modalPermissions.ts</w:t>
-            </w:r>
-            <w:proofErr w:type="spellEnd"/>
+            <w:r>
+              <w:rPr>
+                <w:sz w:val="16"/>
+                <w:szCs w:val="18"/>
+                <w:lang w:val="en-CA"/>
+              </w:rPr>
+              <w:t>, draggableModal.tsx, Toast.tsx, modalManager.ts, modalPermissions.ts</w:t>
+            </w:r>
           </w:p>
         </w:tc>
         <w:tc>
@@ -4422,7 +3929,6 @@
                 <w:lang w:val="en-CA"/>
               </w:rPr>
             </w:pPr>
-            <w:proofErr w:type="spellStart"/>
             <w:r>
               <w:rPr>
                 <w:rFonts w:hint="eastAsia"/>
@@ -4438,81 +3944,8 @@
                 <w:szCs w:val="18"/>
                 <w:lang w:val="en-CA"/>
               </w:rPr>
-              <w:t>ettings.tsx</w:t>
-            </w:r>
-            <w:proofErr w:type="spellEnd"/>
-            <w:r>
-              <w:rPr>
-                <w:sz w:val="16"/>
-                <w:szCs w:val="18"/>
-                <w:lang w:val="en-CA"/>
-              </w:rPr>
-              <w:t xml:space="preserve">, </w:t>
-            </w:r>
-            <w:proofErr w:type="spellStart"/>
-            <w:r>
-              <w:rPr>
-                <w:sz w:val="16"/>
-                <w:szCs w:val="18"/>
-                <w:lang w:val="en-CA"/>
-              </w:rPr>
-              <w:t>draggableModal.tsx</w:t>
-            </w:r>
-            <w:proofErr w:type="spellEnd"/>
-            <w:r>
-              <w:rPr>
-                <w:sz w:val="16"/>
-                <w:szCs w:val="18"/>
-                <w:lang w:val="en-CA"/>
-              </w:rPr>
-              <w:t xml:space="preserve">, </w:t>
-            </w:r>
-            <w:proofErr w:type="spellStart"/>
-            <w:r>
-              <w:rPr>
-                <w:sz w:val="16"/>
-                <w:szCs w:val="18"/>
-                <w:lang w:val="en-CA"/>
-              </w:rPr>
-              <w:t>Toast.tsx</w:t>
-            </w:r>
-            <w:proofErr w:type="spellEnd"/>
-            <w:r>
-              <w:rPr>
-                <w:sz w:val="16"/>
-                <w:szCs w:val="18"/>
-                <w:lang w:val="en-CA"/>
-              </w:rPr>
-              <w:t xml:space="preserve">, </w:t>
-            </w:r>
-            <w:proofErr w:type="spellStart"/>
-            <w:r>
-              <w:rPr>
-                <w:sz w:val="16"/>
-                <w:szCs w:val="18"/>
-                <w:lang w:val="en-CA"/>
-              </w:rPr>
-              <w:t>modalManager.ts</w:t>
-            </w:r>
-            <w:proofErr w:type="spellEnd"/>
-            <w:r>
-              <w:rPr>
-                <w:sz w:val="16"/>
-                <w:szCs w:val="18"/>
-                <w:lang w:val="en-CA"/>
-              </w:rPr>
-              <w:t xml:space="preserve">, </w:t>
-            </w:r>
-            <w:proofErr w:type="spellStart"/>
-            <w:r>
-              <w:rPr>
-                <w:sz w:val="16"/>
-                <w:szCs w:val="18"/>
-                <w:lang w:val="en-CA"/>
-              </w:rPr>
-              <w:t>modalPermissions.ts</w:t>
-            </w:r>
-            <w:proofErr w:type="spellEnd"/>
+              <w:t>ettings.tsx, draggableModal.tsx, Toast.tsx, modalManager.ts, modalPermissions.ts</w:t>
+            </w:r>
           </w:p>
         </w:tc>
         <w:tc>
@@ -4753,7 +4186,6 @@
                 <w:lang w:val="en-CA"/>
               </w:rPr>
             </w:pPr>
-            <w:proofErr w:type="spellStart"/>
             <w:r>
               <w:rPr>
                 <w:rFonts w:hint="eastAsia"/>
@@ -4769,81 +4201,8 @@
                 <w:szCs w:val="18"/>
                 <w:lang w:val="en-CA"/>
               </w:rPr>
-              <w:t>ettings.tsx</w:t>
-            </w:r>
-            <w:proofErr w:type="spellEnd"/>
-            <w:r>
-              <w:rPr>
-                <w:sz w:val="16"/>
-                <w:szCs w:val="18"/>
-                <w:lang w:val="en-CA"/>
-              </w:rPr>
-              <w:t xml:space="preserve">, </w:t>
-            </w:r>
-            <w:proofErr w:type="spellStart"/>
-            <w:r>
-              <w:rPr>
-                <w:sz w:val="16"/>
-                <w:szCs w:val="18"/>
-                <w:lang w:val="en-CA"/>
-              </w:rPr>
-              <w:t>draggableModal.tsx</w:t>
-            </w:r>
-            <w:proofErr w:type="spellEnd"/>
-            <w:r>
-              <w:rPr>
-                <w:sz w:val="16"/>
-                <w:szCs w:val="18"/>
-                <w:lang w:val="en-CA"/>
-              </w:rPr>
-              <w:t xml:space="preserve">, </w:t>
-            </w:r>
-            <w:proofErr w:type="spellStart"/>
-            <w:r>
-              <w:rPr>
-                <w:sz w:val="16"/>
-                <w:szCs w:val="18"/>
-                <w:lang w:val="en-CA"/>
-              </w:rPr>
-              <w:t>Toast.tsx</w:t>
-            </w:r>
-            <w:proofErr w:type="spellEnd"/>
-            <w:r>
-              <w:rPr>
-                <w:sz w:val="16"/>
-                <w:szCs w:val="18"/>
-                <w:lang w:val="en-CA"/>
-              </w:rPr>
-              <w:t xml:space="preserve">, </w:t>
-            </w:r>
-            <w:proofErr w:type="spellStart"/>
-            <w:r>
-              <w:rPr>
-                <w:sz w:val="16"/>
-                <w:szCs w:val="18"/>
-                <w:lang w:val="en-CA"/>
-              </w:rPr>
-              <w:t>modalManager.ts</w:t>
-            </w:r>
-            <w:proofErr w:type="spellEnd"/>
-            <w:r>
-              <w:rPr>
-                <w:sz w:val="16"/>
-                <w:szCs w:val="18"/>
-                <w:lang w:val="en-CA"/>
-              </w:rPr>
-              <w:t xml:space="preserve">, </w:t>
-            </w:r>
-            <w:proofErr w:type="spellStart"/>
-            <w:r>
-              <w:rPr>
-                <w:sz w:val="16"/>
-                <w:szCs w:val="18"/>
-                <w:lang w:val="en-CA"/>
-              </w:rPr>
-              <w:t>modalPermissions.ts</w:t>
-            </w:r>
-            <w:proofErr w:type="spellEnd"/>
+              <w:t>ettings.tsx, draggableModal.tsx, Toast.tsx, modalManager.ts, modalPermissions.ts</w:t>
+            </w:r>
           </w:p>
         </w:tc>
         <w:tc>
@@ -4999,7 +4358,6 @@
                 <w:lang w:val="en-CA"/>
               </w:rPr>
             </w:pPr>
-            <w:proofErr w:type="spellStart"/>
             <w:r>
               <w:rPr>
                 <w:rFonts w:hint="eastAsia"/>
@@ -5017,7 +4375,6 @@
               </w:rPr>
               <w:t>ettings.tsx</w:t>
             </w:r>
-            <w:proofErr w:type="spellEnd"/>
           </w:p>
         </w:tc>
         <w:tc>
@@ -5195,7 +4552,6 @@
                 <w:lang w:val="en-CA"/>
               </w:rPr>
             </w:pPr>
-            <w:proofErr w:type="spellStart"/>
             <w:r>
               <w:rPr>
                 <w:rFonts w:hint="eastAsia"/>
@@ -5213,7 +4569,6 @@
               </w:rPr>
               <w:t>ettings.tsx</w:t>
             </w:r>
-            <w:proofErr w:type="spellEnd"/>
           </w:p>
         </w:tc>
         <w:tc>
@@ -5519,7 +4874,6 @@
                 <w:lang w:val="en-CA"/>
               </w:rPr>
             </w:pPr>
-            <w:proofErr w:type="spellStart"/>
             <w:r>
               <w:rPr>
                 <w:rFonts w:hint="eastAsia"/>
@@ -5537,7 +4891,6 @@
               </w:rPr>
               <w:t>ettings.tsx</w:t>
             </w:r>
-            <w:proofErr w:type="spellEnd"/>
           </w:p>
         </w:tc>
         <w:tc>
@@ -5600,25 +4953,7 @@
                 <w:szCs w:val="18"/>
                 <w:lang w:val="en-CA"/>
               </w:rPr>
-              <w:t xml:space="preserve">earch for TAB_NAMES in </w:t>
-            </w:r>
-            <w:proofErr w:type="spellStart"/>
-            <w:r>
-              <w:rPr>
-                <w:sz w:val="16"/>
-                <w:szCs w:val="18"/>
-                <w:lang w:val="en-CA"/>
-              </w:rPr>
-              <w:t>settings.tsx</w:t>
-            </w:r>
-            <w:proofErr w:type="spellEnd"/>
-            <w:r>
-              <w:rPr>
-                <w:sz w:val="16"/>
-                <w:szCs w:val="18"/>
-                <w:lang w:val="en-CA"/>
-              </w:rPr>
-              <w:t xml:space="preserve">. change any one of the names in quotation marks. </w:t>
+              <w:t xml:space="preserve">earch for TAB_NAMES in settings.tsx. change any one of the names in quotation marks. </w:t>
             </w:r>
             <w:r>
               <w:rPr>
@@ -5840,7 +5175,6 @@
                 <w:lang w:val="en-CA"/>
               </w:rPr>
             </w:pPr>
-            <w:proofErr w:type="spellStart"/>
             <w:r>
               <w:rPr>
                 <w:rFonts w:hint="eastAsia"/>
@@ -5856,16 +5190,7 @@
                 <w:szCs w:val="18"/>
                 <w:lang w:val="en-CA"/>
               </w:rPr>
-              <w:t>ettings.tsx</w:t>
-            </w:r>
-            <w:proofErr w:type="spellEnd"/>
-            <w:r>
-              <w:rPr>
-                <w:sz w:val="16"/>
-                <w:szCs w:val="18"/>
-                <w:lang w:val="en-CA"/>
-              </w:rPr>
-              <w:t>, index.css</w:t>
+              <w:t>ettings.tsx, index.css</w:t>
             </w:r>
           </w:p>
         </w:tc>
@@ -5954,7 +5279,7 @@
                 <w:szCs w:val="18"/>
                 <w:lang w:val="en-CA"/>
               </w:rPr>
-              <w:t xml:space="preserve">hen slide the slider to 500ms, try </w:t>
+              <w:t xml:space="preserve">hen </w:t>
             </w:r>
             <w:r>
               <w:rPr>
@@ -5963,7 +5288,7 @@
                 <w:lang w:val="en-CA"/>
               </w:rPr>
               <w:lastRenderedPageBreak/>
-              <w:t>again, 1000ms, try again</w:t>
+              <w:t>slide the slider to 500ms, try again, 1000ms, try again</w:t>
             </w:r>
           </w:p>
         </w:tc>
@@ -6033,7 +5358,7 @@
                 <w:szCs w:val="18"/>
                 <w:lang w:val="en-CA"/>
               </w:rPr>
-              <w:t xml:space="preserve">nsure that the timing is correlated to the slider, so the longer the </w:t>
+              <w:t xml:space="preserve">nsure that the timing is correlated </w:t>
             </w:r>
             <w:r>
               <w:rPr>
@@ -6042,7 +5367,7 @@
                 <w:lang w:val="en-CA"/>
               </w:rPr>
               <w:lastRenderedPageBreak/>
-              <w:t>slider’s set duration time, the longer the transition should feel</w:t>
+              <w:t>to the slider, so the longer the slider’s set duration time, the longer the transition should feel</w:t>
             </w:r>
           </w:p>
         </w:tc>
@@ -6092,7 +5417,16 @@
                 <w:szCs w:val="18"/>
                 <w:lang w:val="en-CA"/>
               </w:rPr>
-              <w:t>g the color of the icons in the styles page, whatever that color is</w:t>
+              <w:t xml:space="preserve">g the color of the icons in the styles </w:t>
+            </w:r>
+            <w:r>
+              <w:rPr>
+                <w:sz w:val="16"/>
+                <w:szCs w:val="18"/>
+                <w:lang w:val="en-CA"/>
+              </w:rPr>
+              <w:lastRenderedPageBreak/>
+              <w:t>page, whatever that color is</w:t>
             </w:r>
           </w:p>
         </w:tc>
@@ -6111,7 +5445,6 @@
                 <w:lang w:val="en-CA"/>
               </w:rPr>
             </w:pPr>
-            <w:proofErr w:type="spellStart"/>
             <w:r>
               <w:rPr>
                 <w:rFonts w:hint="eastAsia"/>
@@ -6129,7 +5462,6 @@
               </w:rPr>
               <w:t>ettings.tsx</w:t>
             </w:r>
-            <w:proofErr w:type="spellEnd"/>
           </w:p>
         </w:tc>
         <w:tc>
@@ -6209,25 +5541,7 @@
                 <w:szCs w:val="18"/>
                 <w:lang w:val="en-CA"/>
               </w:rPr>
-              <w:t xml:space="preserve">gh let me just screenshot it </w:t>
-            </w:r>
-            <w:proofErr w:type="gramStart"/>
-            <w:r>
-              <w:rPr>
-                <w:sz w:val="16"/>
-                <w:szCs w:val="18"/>
-                <w:lang w:val="en-CA"/>
-              </w:rPr>
-              <w:t>real</w:t>
-            </w:r>
-            <w:proofErr w:type="gramEnd"/>
-            <w:r>
-              <w:rPr>
-                <w:sz w:val="16"/>
-                <w:szCs w:val="18"/>
-                <w:lang w:val="en-CA"/>
-              </w:rPr>
-              <w:t xml:space="preserve"> quick)</w:t>
+              <w:t>gh let me just screenshot it real quick)</w:t>
             </w:r>
           </w:p>
           <w:p>
@@ -6419,7 +5733,6 @@
           <w:lang w:val="en-CA"/>
         </w:rPr>
       </w:pPr>
-      <w:proofErr w:type="spellStart"/>
       <w:r>
         <w:rPr>
           <w:rFonts w:hint="eastAsia"/>
@@ -6441,7 +5754,6 @@
         </w:rPr>
         <w:t>orusMenuEditor.tsx</w:t>
       </w:r>
-      <w:proofErr w:type="spellEnd"/>
     </w:p>
     <w:tbl>
       <w:tblPr>
@@ -6636,7 +5948,6 @@
                 <w:lang w:val="en-CA"/>
               </w:rPr>
             </w:pPr>
-            <w:proofErr w:type="spellStart"/>
             <w:r>
               <w:rPr>
                 <w:rFonts w:hint="eastAsia"/>
@@ -6652,27 +5963,8 @@
                 <w:szCs w:val="18"/>
                 <w:lang w:val="en-CA"/>
               </w:rPr>
-              <w:t>raph.tsx</w:t>
-            </w:r>
-            <w:proofErr w:type="spellEnd"/>
-            <w:r>
-              <w:rPr>
-                <w:sz w:val="16"/>
-                <w:szCs w:val="18"/>
-                <w:lang w:val="en-CA"/>
-              </w:rPr>
-              <w:t xml:space="preserve">, </w:t>
-            </w:r>
-            <w:proofErr w:type="spellStart"/>
-            <w:r>
-              <w:rPr>
-                <w:sz w:val="16"/>
-                <w:szCs w:val="18"/>
-                <w:lang w:val="en-CA"/>
-              </w:rPr>
-              <w:t>TorusMenuEditor.tsx</w:t>
-            </w:r>
-            <w:proofErr w:type="spellEnd"/>
+              <w:t>raph.tsx, TorusMenuEditor.tsx</w:t>
+            </w:r>
           </w:p>
         </w:tc>
         <w:tc>
@@ -6892,25 +6184,7 @@
                 <w:lang w:val="en-CA"/>
               </w:rPr>
               <w:br/>
-              <w:t xml:space="preserve">although the hitbox for the ease handler is </w:t>
-            </w:r>
-            <w:proofErr w:type="spellStart"/>
-            <w:r>
-              <w:rPr>
-                <w:sz w:val="16"/>
-                <w:szCs w:val="18"/>
-                <w:lang w:val="en-CA"/>
-              </w:rPr>
-              <w:t>kinda</w:t>
-            </w:r>
-            <w:proofErr w:type="spellEnd"/>
-            <w:r>
-              <w:rPr>
-                <w:sz w:val="16"/>
-                <w:szCs w:val="18"/>
-                <w:lang w:val="en-CA"/>
-              </w:rPr>
-              <w:t xml:space="preserve"> small and super annoying to click, in fact it’s smaller than the area in which your cursor turns into an arrow handle.</w:t>
+              <w:t>although the hitbox for the ease handler is kinda small and super annoying to click, in fact it’s smaller than the area in which your cursor turns into an arrow handle.</w:t>
             </w:r>
           </w:p>
         </w:tc>
@@ -6929,7 +6203,6 @@
                 <w:lang w:val="en-CA"/>
               </w:rPr>
             </w:pPr>
-            <w:proofErr w:type="spellStart"/>
             <w:r>
               <w:rPr>
                 <w:rFonts w:hint="eastAsia"/>
@@ -6945,27 +6218,8 @@
                 <w:szCs w:val="18"/>
                 <w:lang w:val="en-CA"/>
               </w:rPr>
-              <w:t>raph.tsx</w:t>
-            </w:r>
-            <w:proofErr w:type="spellEnd"/>
-            <w:r>
-              <w:rPr>
-                <w:sz w:val="16"/>
-                <w:szCs w:val="18"/>
-                <w:lang w:val="en-CA"/>
-              </w:rPr>
-              <w:t xml:space="preserve">, </w:t>
-            </w:r>
-            <w:proofErr w:type="spellStart"/>
-            <w:r>
-              <w:rPr>
-                <w:sz w:val="16"/>
-                <w:szCs w:val="18"/>
-                <w:lang w:val="en-CA"/>
-              </w:rPr>
-              <w:t>TorusMenuEditor.tsx</w:t>
-            </w:r>
-            <w:proofErr w:type="spellEnd"/>
+              <w:t>raph.tsx, TorusMenuEditor.tsx</w:t>
+            </w:r>
           </w:p>
         </w:tc>
         <w:tc>
@@ -7136,7 +6390,6 @@
                 <w:lang w:val="en-CA"/>
               </w:rPr>
             </w:pPr>
-            <w:proofErr w:type="spellStart"/>
             <w:r>
               <w:rPr>
                 <w:rFonts w:hint="eastAsia"/>
@@ -7152,27 +6405,8 @@
                 <w:szCs w:val="18"/>
                 <w:lang w:val="en-CA"/>
               </w:rPr>
-              <w:t>raph.tsx</w:t>
-            </w:r>
-            <w:proofErr w:type="spellEnd"/>
-            <w:r>
-              <w:rPr>
-                <w:sz w:val="16"/>
-                <w:szCs w:val="18"/>
-                <w:lang w:val="en-CA"/>
-              </w:rPr>
-              <w:t xml:space="preserve">, </w:t>
-            </w:r>
-            <w:proofErr w:type="spellStart"/>
-            <w:r>
-              <w:rPr>
-                <w:sz w:val="16"/>
-                <w:szCs w:val="18"/>
-                <w:lang w:val="en-CA"/>
-              </w:rPr>
-              <w:t>TorusMenuEditor.tsx</w:t>
-            </w:r>
-            <w:proofErr w:type="spellEnd"/>
+              <w:t>raph.tsx, TorusMenuEditor.tsx</w:t>
+            </w:r>
           </w:p>
         </w:tc>
         <w:tc>
@@ -7368,16 +6602,15 @@
                 <w:lang w:val="en-CA"/>
               </w:rPr>
             </w:pPr>
-            <w:proofErr w:type="spellStart"/>
-            <w:r>
-              <w:rPr>
-                <w:sz w:val="16"/>
-                <w:szCs w:val="18"/>
-                <w:lang w:val="en-CA"/>
-              </w:rPr>
+            <w:r>
+              <w:rPr>
+                <w:sz w:val="16"/>
+                <w:szCs w:val="18"/>
+                <w:lang w:val="en-CA"/>
+              </w:rPr>
+              <w:lastRenderedPageBreak/>
               <w:t>TorusMenuEditor.tsx</w:t>
             </w:r>
-            <w:proofErr w:type="spellEnd"/>
           </w:p>
         </w:tc>
         <w:tc>
@@ -7408,16 +6641,7 @@
                 <w:szCs w:val="18"/>
                 <w:lang w:val="en-CA"/>
               </w:rPr>
-              <w:t xml:space="preserve">ettings: components: </w:t>
-            </w:r>
-            <w:r>
-              <w:rPr>
-                <w:sz w:val="16"/>
-                <w:szCs w:val="18"/>
-                <w:lang w:val="en-CA"/>
-              </w:rPr>
-              <w:lastRenderedPageBreak/>
-              <w:t>torus menu editor: delay slider</w:t>
+              <w:t>ettings: components: torus menu editor: delay slider</w:t>
             </w:r>
           </w:p>
         </w:tc>
@@ -7446,7 +6670,6 @@
                 <w:szCs w:val="18"/>
                 <w:lang w:val="en-CA"/>
               </w:rPr>
-              <w:lastRenderedPageBreak/>
               <w:t>S</w:t>
             </w:r>
             <w:r>
@@ -7463,16 +6686,7 @@
                 <w:szCs w:val="18"/>
                 <w:lang w:val="en-CA"/>
               </w:rPr>
-              <w:t xml:space="preserve">, click on </w:t>
-            </w:r>
-            <w:r>
-              <w:rPr>
-                <w:sz w:val="16"/>
-                <w:szCs w:val="18"/>
-                <w:lang w:val="en-CA"/>
-              </w:rPr>
-              <w:lastRenderedPageBreak/>
-              <w:t>the (…) open torus menu button</w:t>
+              <w:t>, click on the (…) open torus menu button</w:t>
             </w:r>
           </w:p>
           <w:p>
@@ -7565,7 +6779,6 @@
                 <w:szCs w:val="18"/>
                 <w:lang w:val="en-CA"/>
               </w:rPr>
-              <w:lastRenderedPageBreak/>
               <w:t>O</w:t>
             </w:r>
             <w:r>
@@ -7574,16 +6787,7 @@
                 <w:szCs w:val="18"/>
                 <w:lang w:val="en-CA"/>
               </w:rPr>
-              <w:t xml:space="preserve">n test 1, the torus menu should </w:t>
-            </w:r>
-            <w:r>
-              <w:rPr>
-                <w:sz w:val="16"/>
-                <w:szCs w:val="18"/>
-                <w:lang w:val="en-CA"/>
-              </w:rPr>
-              <w:lastRenderedPageBreak/>
-              <w:t>open in one union, all annular sectors synchronized at the same time</w:t>
+              <w:t>n test 1, the torus menu should open in one union, all annular sectors synchronized at the same time</w:t>
             </w:r>
           </w:p>
           <w:p>
@@ -7705,7 +6909,6 @@
                 <w:szCs w:val="18"/>
                 <w:lang w:val="en-CA"/>
               </w:rPr>
-              <w:lastRenderedPageBreak/>
               <w:t>W</w:t>
             </w:r>
             <w:r>
@@ -7722,7 +6925,6 @@
                 <w:szCs w:val="18"/>
                 <w:lang w:val="en-CA"/>
               </w:rPr>
-              <w:lastRenderedPageBreak/>
               <w:t>5bddf836872611033759d627746d8b4161bba22a</w:t>
             </w:r>
           </w:p>
@@ -7742,7 +6944,6 @@
                 <w:lang w:val="en-CA"/>
               </w:rPr>
             </w:pPr>
-            <w:proofErr w:type="spellStart"/>
             <w:r>
               <w:rPr>
                 <w:sz w:val="16"/>
@@ -7751,7 +6952,6 @@
               </w:rPr>
               <w:t>TorusMenuEditor.tsx</w:t>
             </w:r>
-            <w:proofErr w:type="spellEnd"/>
           </w:p>
         </w:tc>
         <w:tc>
@@ -7931,7 +7131,6 @@
                 <w:lang w:val="en-CA"/>
               </w:rPr>
             </w:pPr>
-            <w:proofErr w:type="spellStart"/>
             <w:r>
               <w:rPr>
                 <w:sz w:val="16"/>
@@ -7940,7 +7139,6 @@
               </w:rPr>
               <w:t>TorusMenuEditor.tsx</w:t>
             </w:r>
-            <w:proofErr w:type="spellEnd"/>
           </w:p>
         </w:tc>
         <w:tc>
@@ -8011,25 +7209,7 @@
                 <w:szCs w:val="18"/>
                 <w:lang w:val="en-CA"/>
               </w:rPr>
-              <w:t xml:space="preserve">dd a bunch of anchor points and adjust </w:t>
-            </w:r>
-            <w:proofErr w:type="gramStart"/>
-            <w:r>
-              <w:rPr>
-                <w:sz w:val="16"/>
-                <w:szCs w:val="18"/>
-                <w:lang w:val="en-CA"/>
-              </w:rPr>
-              <w:t>all of</w:t>
-            </w:r>
-            <w:proofErr w:type="gramEnd"/>
-            <w:r>
-              <w:rPr>
-                <w:sz w:val="16"/>
-                <w:szCs w:val="18"/>
-                <w:lang w:val="en-CA"/>
-              </w:rPr>
-              <w:t xml:space="preserve"> the ease handles to a non-default or non-linear position. </w:t>
+              <w:t xml:space="preserve">dd a bunch of anchor points and adjust all of the ease handles to a non-default or non-linear position. </w:t>
             </w:r>
             <w:r>
               <w:rPr>
@@ -8141,7 +7321,6 @@
           <w:lang w:val="en-CA"/>
         </w:rPr>
       </w:pPr>
-      <w:proofErr w:type="spellStart"/>
       <w:r>
         <w:rPr>
           <w:b/>
@@ -8152,7 +7331,6 @@
         </w:rPr>
         <w:t>TorusMenu.tsx</w:t>
       </w:r>
-      <w:proofErr w:type="spellEnd"/>
     </w:p>
     <w:tbl>
       <w:tblPr>
@@ -8353,18 +7531,8 @@
                 <w:szCs w:val="18"/>
                 <w:lang w:val="en-CA"/>
               </w:rPr>
-              <w:t xml:space="preserve"> </w:t>
-            </w:r>
-            <w:proofErr w:type="spellStart"/>
-            <w:r>
-              <w:rPr>
-                <w:sz w:val="16"/>
-                <w:szCs w:val="18"/>
-                <w:lang w:val="en-CA"/>
-              </w:rPr>
-              <w:t>TorusMenu.tsx</w:t>
-            </w:r>
-            <w:proofErr w:type="spellEnd"/>
+              <w:t xml:space="preserve"> TorusMenu.tsx</w:t>
+            </w:r>
           </w:p>
         </w:tc>
         <w:tc>
@@ -8435,25 +7603,7 @@
                 <w:szCs w:val="18"/>
                 <w:lang w:val="en-CA"/>
               </w:rPr>
-              <w:t xml:space="preserve">hen, on a </w:t>
-            </w:r>
-            <w:proofErr w:type="gramStart"/>
-            <w:r>
-              <w:rPr>
-                <w:sz w:val="16"/>
-                <w:szCs w:val="18"/>
-                <w:lang w:val="en-CA"/>
-              </w:rPr>
-              <w:t>45 degree</w:t>
-            </w:r>
-            <w:proofErr w:type="gramEnd"/>
-            <w:r>
-              <w:rPr>
-                <w:sz w:val="16"/>
-                <w:szCs w:val="18"/>
-                <w:lang w:val="en-CA"/>
-              </w:rPr>
-              <w:t xml:space="preserve"> angle right outside the circle, click.</w:t>
+              <w:t>hen, on a 45 degree angle right outside the circle, click.</w:t>
             </w:r>
           </w:p>
         </w:tc>
@@ -8553,7 +7703,6 @@
           <w:lang w:val="en-CA"/>
         </w:rPr>
       </w:pPr>
-      <w:proofErr w:type="spellStart"/>
       <w:r>
         <w:rPr>
           <w:b/>
@@ -8564,7 +7713,6 @@
         </w:rPr>
         <w:t>ColorPicker.tsx</w:t>
       </w:r>
-      <w:proofErr w:type="spellEnd"/>
     </w:p>
     <w:tbl>
       <w:tblPr>
@@ -8759,25 +7907,6 @@
                 <w:lang w:val="en-CA"/>
               </w:rPr>
             </w:pPr>
-            <w:proofErr w:type="spellStart"/>
-            <w:r>
-              <w:rPr>
-                <w:sz w:val="16"/>
-                <w:szCs w:val="18"/>
-                <w:lang w:val="en-CA"/>
-              </w:rPr>
-              <w:t>ColorPicker.tsx</w:t>
-            </w:r>
-            <w:proofErr w:type="spellEnd"/>
-            <w:r>
-              <w:rPr>
-                <w:sz w:val="16"/>
-                <w:szCs w:val="18"/>
-                <w:lang w:val="en-CA"/>
-              </w:rPr>
-              <w:t xml:space="preserve">, </w:t>
-            </w:r>
-            <w:proofErr w:type="spellStart"/>
             <w:r>
               <w:rPr>
                 <w:sz w:val="16"/>
@@ -8785,27 +7914,8 @@
                 <w:lang w:val="en-CA"/>
               </w:rPr>
               <w:lastRenderedPageBreak/>
-              <w:t>Styles.tsx</w:t>
-            </w:r>
-            <w:proofErr w:type="spellEnd"/>
-            <w:r>
-              <w:rPr>
-                <w:sz w:val="16"/>
-                <w:szCs w:val="18"/>
-                <w:lang w:val="en-CA"/>
-              </w:rPr>
-              <w:t xml:space="preserve">, </w:t>
-            </w:r>
-            <w:proofErr w:type="spellStart"/>
-            <w:r>
-              <w:rPr>
-                <w:sz w:val="16"/>
-                <w:szCs w:val="18"/>
-                <w:lang w:val="en-CA"/>
-              </w:rPr>
-              <w:t>App.tsx</w:t>
-            </w:r>
-            <w:proofErr w:type="spellEnd"/>
+              <w:t>ColorPicker.tsx, Styles.tsx, App.tsx</w:t>
+            </w:r>
           </w:p>
         </w:tc>
         <w:tc>
@@ -8828,7 +7938,6 @@
                 <w:szCs w:val="18"/>
                 <w:lang w:val="en-CA"/>
               </w:rPr>
-              <w:lastRenderedPageBreak/>
               <w:t>S</w:t>
             </w:r>
             <w:r>
@@ -8837,16 +7946,7 @@
                 <w:szCs w:val="18"/>
                 <w:lang w:val="en-CA"/>
               </w:rPr>
-              <w:t xml:space="preserve">tyles: color picker: live </w:t>
-            </w:r>
-            <w:r>
-              <w:rPr>
-                <w:sz w:val="16"/>
-                <w:szCs w:val="18"/>
-                <w:lang w:val="en-CA"/>
-              </w:rPr>
-              <w:lastRenderedPageBreak/>
-              <w:t xml:space="preserve">color updating test </w:t>
+              <w:t xml:space="preserve">tyles: color picker: live color updating test </w:t>
             </w:r>
           </w:p>
         </w:tc>
@@ -8870,7 +7970,6 @@
                 <w:szCs w:val="18"/>
                 <w:lang w:val="en-CA"/>
               </w:rPr>
-              <w:lastRenderedPageBreak/>
               <w:t>F</w:t>
             </w:r>
             <w:r>
@@ -8879,16 +7978,7 @@
                 <w:szCs w:val="18"/>
                 <w:lang w:val="en-CA"/>
               </w:rPr>
-              <w:t xml:space="preserve">or any color, click on the color </w:t>
-            </w:r>
-            <w:r>
-              <w:rPr>
-                <w:sz w:val="16"/>
-                <w:szCs w:val="18"/>
-                <w:lang w:val="en-CA"/>
-              </w:rPr>
-              <w:lastRenderedPageBreak/>
-              <w:t>rectangle in the styles page and start dragging around the color picker in the color wheel</w:t>
+              <w:t>or any color, click on the color rectangle in the styles page and start dragging around the color picker in the color wheel</w:t>
             </w:r>
           </w:p>
         </w:tc>
@@ -8912,7 +8002,6 @@
                 <w:szCs w:val="18"/>
                 <w:lang w:val="en-CA"/>
               </w:rPr>
-              <w:lastRenderedPageBreak/>
               <w:t>T</w:t>
             </w:r>
             <w:r>
@@ -8921,16 +8010,7 @@
                 <w:szCs w:val="18"/>
                 <w:lang w:val="en-CA"/>
               </w:rPr>
-              <w:t xml:space="preserve">he color should update in real time in </w:t>
-            </w:r>
-            <w:r>
-              <w:rPr>
-                <w:sz w:val="16"/>
-                <w:szCs w:val="18"/>
-                <w:lang w:val="en-CA"/>
-              </w:rPr>
-              <w:lastRenderedPageBreak/>
-              <w:t xml:space="preserve">the editor. </w:t>
+              <w:t xml:space="preserve">he color should update in real time in the editor. </w:t>
             </w:r>
             <w:r>
               <w:rPr>
@@ -8971,7 +8051,6 @@
                 <w:szCs w:val="18"/>
                 <w:lang w:val="en-CA"/>
               </w:rPr>
-              <w:lastRenderedPageBreak/>
               <w:t>P</w:t>
             </w:r>
             <w:r>
@@ -8988,7 +8067,6 @@
                 <w:szCs w:val="18"/>
                 <w:lang w:val="en-CA"/>
               </w:rPr>
-              <w:lastRenderedPageBreak/>
               <w:t>5bddf836872611033759d627746d8b4161bba22a</w:t>
             </w:r>
             <w:r>
@@ -9111,35 +8189,14 @@
                 <w:lang w:val="en-CA"/>
               </w:rPr>
             </w:pPr>
-            <w:proofErr w:type="spellStart"/>
-            <w:r>
-              <w:rPr>
-                <w:sz w:val="16"/>
-                <w:szCs w:val="18"/>
-                <w:lang w:val="en-CA"/>
-              </w:rPr>
-              <w:lastRenderedPageBreak/>
-              <w:t>Styles.tsx</w:t>
-            </w:r>
-            <w:proofErr w:type="spellEnd"/>
-            <w:r>
-              <w:rPr>
-                <w:sz w:val="16"/>
-                <w:szCs w:val="18"/>
-                <w:lang w:val="en-CA"/>
-              </w:rPr>
-              <w:t xml:space="preserve">, </w:t>
-            </w:r>
-            <w:proofErr w:type="spellStart"/>
-            <w:r>
-              <w:rPr>
-                <w:sz w:val="16"/>
-                <w:szCs w:val="18"/>
-                <w:lang w:val="en-CA"/>
-              </w:rPr>
-              <w:t>App.tsx</w:t>
-            </w:r>
-            <w:proofErr w:type="spellEnd"/>
+            <w:r>
+              <w:rPr>
+                <w:sz w:val="16"/>
+                <w:szCs w:val="18"/>
+                <w:lang w:val="en-CA"/>
+              </w:rPr>
+              <w:t>Styles.tsx, App.tsx</w:t>
+            </w:r>
           </w:p>
         </w:tc>
         <w:tc>
@@ -9367,7 +8424,6 @@
                 <w:lang w:val="en-CA"/>
               </w:rPr>
             </w:pPr>
-            <w:proofErr w:type="spellStart"/>
             <w:r>
               <w:rPr>
                 <w:sz w:val="16"/>
@@ -9376,7 +8432,6 @@
               </w:rPr>
               <w:t>ColorPicker.tsx</w:t>
             </w:r>
-            <w:proofErr w:type="spellEnd"/>
           </w:p>
         </w:tc>
         <w:tc>
@@ -9571,7 +8626,6 @@
           <w:lang w:val="en-CA"/>
         </w:rPr>
       </w:pPr>
-      <w:proofErr w:type="spellStart"/>
       <w:r>
         <w:rPr>
           <w:b/>
@@ -9592,7 +8646,6 @@
         </w:rPr>
         <w:t>.tsx</w:t>
       </w:r>
-      <w:proofErr w:type="spellEnd"/>
     </w:p>
     <w:tbl>
       <w:tblPr>
@@ -9787,7 +8840,6 @@
                 <w:lang w:val="en-CA"/>
               </w:rPr>
             </w:pPr>
-            <w:proofErr w:type="spellStart"/>
             <w:r>
               <w:rPr>
                 <w:rFonts w:hint="eastAsia"/>
@@ -9803,27 +8855,8 @@
                 <w:szCs w:val="18"/>
                 <w:lang w:val="en-CA"/>
               </w:rPr>
-              <w:t>pp.tsx</w:t>
-            </w:r>
-            <w:proofErr w:type="spellEnd"/>
-            <w:r>
-              <w:rPr>
-                <w:sz w:val="16"/>
-                <w:szCs w:val="18"/>
-                <w:lang w:val="en-CA"/>
-              </w:rPr>
-              <w:t xml:space="preserve">, </w:t>
-            </w:r>
-            <w:proofErr w:type="spellStart"/>
-            <w:r>
-              <w:rPr>
-                <w:sz w:val="16"/>
-                <w:szCs w:val="18"/>
-                <w:lang w:val="en-CA"/>
-              </w:rPr>
-              <w:t>toast.tsx</w:t>
-            </w:r>
-            <w:proofErr w:type="spellEnd"/>
+              <w:t>pp.tsx, toast.tsx</w:t>
+            </w:r>
           </w:p>
         </w:tc>
         <w:tc>
@@ -9886,25 +8919,7 @@
                 <w:szCs w:val="18"/>
                 <w:lang w:val="en-CA"/>
               </w:rPr>
-              <w:t xml:space="preserve">o into </w:t>
-            </w:r>
-            <w:proofErr w:type="spellStart"/>
-            <w:r>
-              <w:rPr>
-                <w:sz w:val="16"/>
-                <w:szCs w:val="18"/>
-                <w:lang w:val="en-CA"/>
-              </w:rPr>
-              <w:t>app.tsx</w:t>
-            </w:r>
-            <w:proofErr w:type="spellEnd"/>
-            <w:r>
-              <w:rPr>
-                <w:sz w:val="16"/>
-                <w:szCs w:val="18"/>
-                <w:lang w:val="en-CA"/>
-              </w:rPr>
-              <w:t xml:space="preserve"> wherever there is a toast instantiation. </w:t>
+              <w:t xml:space="preserve">o into app.tsx wherever there is a toast instantiation. </w:t>
             </w:r>
             <w:r>
               <w:rPr>
@@ -10122,7 +9137,6 @@
                 <w:lang w:val="en-CA"/>
               </w:rPr>
             </w:pPr>
-            <w:proofErr w:type="spellStart"/>
             <w:r>
               <w:rPr>
                 <w:rFonts w:hint="eastAsia"/>
@@ -10138,27 +9152,8 @@
                 <w:szCs w:val="18"/>
                 <w:lang w:val="en-CA"/>
               </w:rPr>
-              <w:t>pp.tsx</w:t>
-            </w:r>
-            <w:proofErr w:type="spellEnd"/>
-            <w:r>
-              <w:rPr>
-                <w:sz w:val="16"/>
-                <w:szCs w:val="18"/>
-                <w:lang w:val="en-CA"/>
-              </w:rPr>
-              <w:t xml:space="preserve">, </w:t>
-            </w:r>
-            <w:proofErr w:type="spellStart"/>
-            <w:r>
-              <w:rPr>
-                <w:sz w:val="16"/>
-                <w:szCs w:val="18"/>
-                <w:lang w:val="en-CA"/>
-              </w:rPr>
-              <w:t>toast.tsx</w:t>
-            </w:r>
-            <w:proofErr w:type="spellEnd"/>
+              <w:t>pp.tsx, toast.tsx</w:t>
+            </w:r>
           </w:p>
         </w:tc>
         <w:tc>
@@ -10189,7 +9184,7 @@
                 <w:szCs w:val="18"/>
                 <w:lang w:val="en-CA"/>
               </w:rPr>
-              <w:t xml:space="preserve">oast: “open multiple menus is disabled!” toast: correct </w:t>
+              <w:t xml:space="preserve">oast: “open multiple menus is disabled!” </w:t>
             </w:r>
             <w:r>
               <w:rPr>
@@ -10198,7 +9193,7 @@
                 <w:lang w:val="en-CA"/>
               </w:rPr>
               <w:lastRenderedPageBreak/>
-              <w:t>positioning</w:t>
+              <w:t>toast: correct positioning</w:t>
             </w:r>
           </w:p>
         </w:tc>
@@ -10231,25 +9226,7 @@
                 <w:szCs w:val="18"/>
                 <w:lang w:val="en-CA"/>
               </w:rPr>
-              <w:t xml:space="preserve">rigger the “open multiple menus </w:t>
-            </w:r>
-            <w:proofErr w:type="gramStart"/>
-            <w:r>
-              <w:rPr>
-                <w:sz w:val="16"/>
-                <w:szCs w:val="18"/>
-                <w:lang w:val="en-CA"/>
-              </w:rPr>
-              <w:t>is</w:t>
-            </w:r>
-            <w:proofErr w:type="gramEnd"/>
-            <w:r>
-              <w:rPr>
-                <w:sz w:val="16"/>
-                <w:szCs w:val="18"/>
-                <w:lang w:val="en-CA"/>
-              </w:rPr>
-              <w:t xml:space="preserve"> disabled!” toast by turning off allow open multiple </w:t>
+              <w:t xml:space="preserve">rigger the “open multiple menus is disabled!” toast by </w:t>
             </w:r>
             <w:r>
               <w:rPr>
@@ -10258,7 +9235,7 @@
                 <w:lang w:val="en-CA"/>
               </w:rPr>
               <w:lastRenderedPageBreak/>
-              <w:t xml:space="preserve">menus and attempting to open multiple menus. </w:t>
+              <w:t xml:space="preserve">turning off allow open multiple menus and attempting to open multiple menus. </w:t>
             </w:r>
           </w:p>
         </w:tc>
@@ -10291,7 +9268,16 @@
                 <w:szCs w:val="18"/>
                 <w:lang w:val="en-CA"/>
               </w:rPr>
-              <w:t>he toast should appear adjacent to the icon/button, and the arrow should be pointing at it</w:t>
+              <w:t xml:space="preserve">he toast should appear adjacent to the icon/button, and the arrow should be </w:t>
+            </w:r>
+            <w:r>
+              <w:rPr>
+                <w:sz w:val="16"/>
+                <w:szCs w:val="18"/>
+                <w:lang w:val="en-CA"/>
+              </w:rPr>
+              <w:lastRenderedPageBreak/>
+              <w:t>pointing at it</w:t>
             </w:r>
           </w:p>
         </w:tc>
@@ -10315,6 +9301,7 @@
                 <w:szCs w:val="18"/>
                 <w:lang w:val="en-CA"/>
               </w:rPr>
+              <w:lastRenderedPageBreak/>
               <w:t>N</w:t>
             </w:r>
             <w:r>
@@ -10331,7 +9318,16 @@
                 <w:szCs w:val="18"/>
                 <w:lang w:val="en-CA"/>
               </w:rPr>
-              <w:t>72353571f3d02393a601e5c151529df37aea6b30</w:t>
+              <w:t>72353571f3d02393a601e5c151</w:t>
+            </w:r>
+            <w:r>
+              <w:rPr>
+                <w:sz w:val="16"/>
+                <w:szCs w:val="18"/>
+                <w:lang w:val="en-CA"/>
+              </w:rPr>
+              <w:lastRenderedPageBreak/>
+              <w:t>529df37aea6b30</w:t>
             </w:r>
             <w:r>
               <w:rPr>
@@ -10356,16 +9352,7 @@
                 <w:szCs w:val="18"/>
                 <w:lang w:val="en-CA"/>
               </w:rPr>
-              <w:t xml:space="preserve">he toast for </w:t>
-            </w:r>
-            <w:r>
-              <w:rPr>
-                <w:sz w:val="16"/>
-                <w:szCs w:val="18"/>
-                <w:lang w:val="en-CA"/>
-              </w:rPr>
-              <w:lastRenderedPageBreak/>
-              <w:t>the settings button appears on top of it and in one fat line.</w:t>
+              <w:t>he toast for the settings button appears on top of it and in one fat line.</w:t>
             </w:r>
           </w:p>
         </w:tc>
@@ -10383,7 +9370,6 @@
           <w:lang w:val="en-CA"/>
         </w:rPr>
       </w:pPr>
-      <w:proofErr w:type="spellStart"/>
       <w:r>
         <w:rPr>
           <w:b/>
@@ -10395,7 +9381,6 @@
         <w:lastRenderedPageBreak/>
         <w:t>PlayneedleEditor.tsx</w:t>
       </w:r>
-      <w:proofErr w:type="spellEnd"/>
     </w:p>
     <w:tbl>
       <w:tblPr>
@@ -10590,7 +9575,6 @@
                 <w:lang w:val="en-CA"/>
               </w:rPr>
             </w:pPr>
-            <w:proofErr w:type="spellStart"/>
             <w:r>
               <w:rPr>
                 <w:sz w:val="16"/>
@@ -10599,7 +9583,6 @@
               </w:rPr>
               <w:t>PlayneedleEditor.tsx</w:t>
             </w:r>
-            <w:proofErr w:type="spellEnd"/>
           </w:p>
         </w:tc>
         <w:tc>
@@ -10630,25 +9613,7 @@
                 <w:szCs w:val="18"/>
                 <w:lang w:val="en-CA"/>
               </w:rPr>
-              <w:t xml:space="preserve">ettings: components: </w:t>
-            </w:r>
-            <w:proofErr w:type="spellStart"/>
-            <w:r>
-              <w:rPr>
-                <w:sz w:val="16"/>
-                <w:szCs w:val="18"/>
-                <w:lang w:val="en-CA"/>
-              </w:rPr>
-              <w:t>playneedle</w:t>
-            </w:r>
-            <w:proofErr w:type="spellEnd"/>
-            <w:r>
-              <w:rPr>
-                <w:sz w:val="16"/>
-                <w:szCs w:val="18"/>
-                <w:lang w:val="en-CA"/>
-              </w:rPr>
-              <w:t xml:space="preserve"> editor: width slider</w:t>
+              <w:t>ettings: components: playneedle editor: width slider</w:t>
             </w:r>
           </w:p>
         </w:tc>
@@ -10680,43 +9645,7 @@
                 <w:szCs w:val="18"/>
                 <w:lang w:val="en-CA"/>
               </w:rPr>
-              <w:t xml:space="preserve">hange the </w:t>
-            </w:r>
-            <w:proofErr w:type="spellStart"/>
-            <w:r>
-              <w:rPr>
-                <w:sz w:val="16"/>
-                <w:szCs w:val="18"/>
-                <w:lang w:val="en-CA"/>
-              </w:rPr>
-              <w:t>playneedle</w:t>
-            </w:r>
-            <w:proofErr w:type="spellEnd"/>
-            <w:r>
-              <w:rPr>
-                <w:sz w:val="16"/>
-                <w:szCs w:val="18"/>
-                <w:lang w:val="en-CA"/>
-              </w:rPr>
-              <w:t xml:space="preserve"> width (</w:t>
-            </w:r>
-            <w:proofErr w:type="spellStart"/>
-            <w:r>
-              <w:rPr>
-                <w:sz w:val="16"/>
-                <w:szCs w:val="18"/>
-                <w:lang w:val="en-CA"/>
-              </w:rPr>
-              <w:t>px</w:t>
-            </w:r>
-            <w:proofErr w:type="spellEnd"/>
-            <w:r>
-              <w:rPr>
-                <w:sz w:val="16"/>
-                <w:szCs w:val="18"/>
-                <w:lang w:val="en-CA"/>
-              </w:rPr>
-              <w:t>) slider</w:t>
+              <w:t>hange the playneedle width (px) slider</w:t>
             </w:r>
           </w:p>
         </w:tc>
@@ -10748,25 +9677,7 @@
                 <w:szCs w:val="18"/>
                 <w:lang w:val="en-CA"/>
               </w:rPr>
-              <w:t xml:space="preserve">t should change the width of the </w:t>
-            </w:r>
-            <w:proofErr w:type="spellStart"/>
-            <w:r>
-              <w:rPr>
-                <w:sz w:val="16"/>
-                <w:szCs w:val="18"/>
-                <w:lang w:val="en-CA"/>
-              </w:rPr>
-              <w:t>playneedle</w:t>
-            </w:r>
-            <w:proofErr w:type="spellEnd"/>
-            <w:r>
-              <w:rPr>
-                <w:sz w:val="16"/>
-                <w:szCs w:val="18"/>
-                <w:lang w:val="en-CA"/>
-              </w:rPr>
-              <w:t xml:space="preserve"> both inside the editor and in the timeline.</w:t>
+              <w:t>t should change the width of the playneedle both inside the editor and in the timeline.</w:t>
             </w:r>
           </w:p>
         </w:tc>
@@ -10837,7 +9748,6 @@
           <w:lang w:val="en-CA"/>
         </w:rPr>
       </w:pPr>
-      <w:proofErr w:type="spellStart"/>
       <w:r>
         <w:rPr>
           <w:b/>
@@ -10846,31 +9756,8 @@
           <w:szCs w:val="32"/>
           <w:lang w:val="en-CA"/>
         </w:rPr>
-        <w:t>modalManager.ts</w:t>
+        <w:t>modalManager.ts &amp; modalPermissions.ts</w:t>
       </w:r>
-      <w:proofErr w:type="spellEnd"/>
-      <w:r>
-        <w:rPr>
-          <w:b/>
-          <w:bCs/>
-          <w:sz w:val="28"/>
-          <w:szCs w:val="32"/>
-          <w:lang w:val="en-CA"/>
-        </w:rPr>
-        <w:t xml:space="preserve"> &amp; </w:t>
-      </w:r>
-      <w:proofErr w:type="spellStart"/>
-      <w:r>
-        <w:rPr>
-          <w:b/>
-          <w:bCs/>
-          <w:sz w:val="28"/>
-          <w:szCs w:val="32"/>
-          <w:lang w:val="en-CA"/>
-        </w:rPr>
-        <w:t>modalPermissions.ts</w:t>
-      </w:r>
-      <w:proofErr w:type="spellEnd"/>
     </w:p>
     <w:p>
       <w:pPr>

</xml_diff>

<commit_message>
fully fixed Settings: components: torus menu editor: graph: ease handle: hitbox inconsistency. ease handle is now comfortably large and draggable
</commit_message>
<xml_diff>
--- a/test plan.docx
+++ b/test plan.docx
@@ -417,7 +417,664 @@
       <w:pPr>
         <w:jc w:val="center"/>
         <w:rPr>
+          <w:b/>
+          <w:bCs/>
+          <w:sz w:val="28"/>
+          <w:szCs w:val="32"/>
+          <w:lang w:val="en-CA"/>
+        </w:rPr>
+      </w:pPr>
+    </w:p>
+    <w:p>
+      <w:pPr>
+        <w:jc w:val="center"/>
+        <w:rPr>
+          <w:b/>
+          <w:bCs/>
+          <w:sz w:val="28"/>
+          <w:szCs w:val="32"/>
+          <w:lang w:val="en-CA"/>
+        </w:rPr>
+      </w:pPr>
+      <w:r>
+        <w:rPr>
           <w:rFonts w:hint="eastAsia"/>
+          <w:b/>
+          <w:bCs/>
+          <w:sz w:val="28"/>
+          <w:szCs w:val="32"/>
+          <w:lang w:val="en-CA"/>
+        </w:rPr>
+        <w:t>M</w:t>
+      </w:r>
+      <w:r>
+        <w:rPr>
+          <w:b/>
+          <w:bCs/>
+          <w:sz w:val="28"/>
+          <w:szCs w:val="32"/>
+          <w:lang w:val="en-CA"/>
+        </w:rPr>
+        <w:t>ain.cjs</w:t>
+      </w:r>
+    </w:p>
+    <w:tbl>
+      <w:tblPr>
+        <w:tblStyle w:val="ae"/>
+        <w:tblW w:w="11624" w:type="dxa"/>
+        <w:tblInd w:w="-1706" w:type="dxa"/>
+        <w:tblLayout w:type="fixed"/>
+        <w:tblLook w:val="04A0" w:firstRow="1" w:lastRow="0" w:firstColumn="1" w:lastColumn="0" w:noHBand="0" w:noVBand="1"/>
+      </w:tblPr>
+      <w:tblGrid>
+        <w:gridCol w:w="1843"/>
+        <w:gridCol w:w="1843"/>
+        <w:gridCol w:w="2410"/>
+        <w:gridCol w:w="3118"/>
+        <w:gridCol w:w="2410"/>
+      </w:tblGrid>
+      <w:tr>
+        <w:tc>
+          <w:tcPr>
+            <w:tcW w:w="1843" w:type="dxa"/>
+          </w:tcPr>
+          <w:p>
+            <w:pPr>
+              <w:rPr>
+                <w:rFonts w:hint="eastAsia"/>
+                <w:sz w:val="16"/>
+                <w:szCs w:val="18"/>
+              </w:rPr>
+            </w:pPr>
+            <w:r>
+              <w:rPr>
+                <w:sz w:val="16"/>
+                <w:szCs w:val="18"/>
+              </w:rPr>
+              <w:t>Relevant f</w:t>
+            </w:r>
+            <w:r>
+              <w:rPr>
+                <w:rFonts w:hint="eastAsia"/>
+                <w:sz w:val="16"/>
+                <w:szCs w:val="18"/>
+              </w:rPr>
+              <w:t>ile</w:t>
+            </w:r>
+            <w:r>
+              <w:rPr>
+                <w:sz w:val="16"/>
+                <w:szCs w:val="18"/>
+              </w:rPr>
+              <w:t>(s)</w:t>
+            </w:r>
+          </w:p>
+        </w:tc>
+        <w:tc>
+          <w:tcPr>
+            <w:tcW w:w="1843" w:type="dxa"/>
+          </w:tcPr>
+          <w:p>
+            <w:pPr>
+              <w:rPr>
+                <w:rFonts w:hint="eastAsia"/>
+                <w:sz w:val="16"/>
+                <w:szCs w:val="18"/>
+                <w:lang w:val="en-CA"/>
+              </w:rPr>
+            </w:pPr>
+            <w:r>
+              <w:rPr>
+                <w:rFonts w:hint="eastAsia"/>
+                <w:sz w:val="16"/>
+                <w:szCs w:val="18"/>
+              </w:rPr>
+              <w:t>C</w:t>
+            </w:r>
+            <w:r>
+              <w:rPr>
+                <w:sz w:val="16"/>
+                <w:szCs w:val="18"/>
+              </w:rPr>
+              <w:t>omponent</w:t>
+            </w:r>
+          </w:p>
+        </w:tc>
+        <w:tc>
+          <w:tcPr>
+            <w:tcW w:w="2410" w:type="dxa"/>
+          </w:tcPr>
+          <w:p>
+            <w:pPr>
+              <w:rPr>
+                <w:rFonts w:hint="eastAsia"/>
+                <w:sz w:val="16"/>
+                <w:szCs w:val="18"/>
+                <w:lang w:val="en-CA"/>
+              </w:rPr>
+            </w:pPr>
+            <w:r>
+              <w:rPr>
+                <w:rFonts w:hint="eastAsia"/>
+                <w:sz w:val="16"/>
+                <w:szCs w:val="18"/>
+                <w:lang w:val="en-CA"/>
+              </w:rPr>
+              <w:t>H</w:t>
+            </w:r>
+            <w:r>
+              <w:rPr>
+                <w:sz w:val="16"/>
+                <w:szCs w:val="18"/>
+                <w:lang w:val="en-CA"/>
+              </w:rPr>
+              <w:t>ow to test</w:t>
+            </w:r>
+          </w:p>
+        </w:tc>
+        <w:tc>
+          <w:tcPr>
+            <w:tcW w:w="3118" w:type="dxa"/>
+          </w:tcPr>
+          <w:p>
+            <w:pPr>
+              <w:rPr>
+                <w:rFonts w:hint="eastAsia"/>
+                <w:sz w:val="16"/>
+                <w:szCs w:val="18"/>
+                <w:lang w:val="en-CA"/>
+              </w:rPr>
+            </w:pPr>
+            <w:r>
+              <w:rPr>
+                <w:rFonts w:hint="eastAsia"/>
+                <w:sz w:val="16"/>
+                <w:szCs w:val="18"/>
+                <w:lang w:val="en-CA"/>
+              </w:rPr>
+              <w:t>E</w:t>
+            </w:r>
+            <w:r>
+              <w:rPr>
+                <w:sz w:val="16"/>
+                <w:szCs w:val="18"/>
+                <w:lang w:val="en-CA"/>
+              </w:rPr>
+              <w:t>xpected outcome</w:t>
+            </w:r>
+          </w:p>
+        </w:tc>
+        <w:tc>
+          <w:tcPr>
+            <w:tcW w:w="2410" w:type="dxa"/>
+          </w:tcPr>
+          <w:p>
+            <w:pPr>
+              <w:rPr>
+                <w:rFonts w:hint="eastAsia"/>
+                <w:sz w:val="16"/>
+                <w:szCs w:val="18"/>
+                <w:lang w:val="en-CA"/>
+              </w:rPr>
+            </w:pPr>
+            <w:r>
+              <w:rPr>
+                <w:rFonts w:hint="eastAsia"/>
+                <w:sz w:val="16"/>
+                <w:szCs w:val="18"/>
+                <w:lang w:val="en-CA"/>
+              </w:rPr>
+              <w:t>T</w:t>
+            </w:r>
+            <w:r>
+              <w:rPr>
+                <w:sz w:val="16"/>
+                <w:szCs w:val="18"/>
+                <w:lang w:val="en-CA"/>
+              </w:rPr>
+              <w:t>ested on (commit) and notes</w:t>
+            </w:r>
+          </w:p>
+        </w:tc>
+      </w:tr>
+      <w:tr>
+        <w:tc>
+          <w:tcPr>
+            <w:tcW w:w="1843" w:type="dxa"/>
+          </w:tcPr>
+          <w:p>
+            <w:pPr>
+              <w:rPr>
+                <w:sz w:val="16"/>
+                <w:szCs w:val="18"/>
+                <w:lang w:val="en-CA"/>
+              </w:rPr>
+            </w:pPr>
+            <w:r>
+              <w:rPr>
+                <w:rFonts w:hint="eastAsia"/>
+                <w:sz w:val="16"/>
+                <w:szCs w:val="18"/>
+                <w:lang w:val="en-CA"/>
+              </w:rPr>
+              <w:t>M</w:t>
+            </w:r>
+            <w:r>
+              <w:rPr>
+                <w:sz w:val="16"/>
+                <w:szCs w:val="18"/>
+                <w:lang w:val="en-CA"/>
+              </w:rPr>
+              <w:t>ain.cjs</w:t>
+            </w:r>
+          </w:p>
+        </w:tc>
+        <w:tc>
+          <w:tcPr>
+            <w:tcW w:w="1843" w:type="dxa"/>
+          </w:tcPr>
+          <w:p>
+            <w:pPr>
+              <w:rPr>
+                <w:sz w:val="16"/>
+                <w:szCs w:val="18"/>
+                <w:lang w:val="en-CA"/>
+              </w:rPr>
+            </w:pPr>
+            <w:r>
+              <w:rPr>
+                <w:rFonts w:hint="eastAsia"/>
+                <w:sz w:val="16"/>
+                <w:szCs w:val="18"/>
+                <w:lang w:val="en-CA"/>
+              </w:rPr>
+              <w:t>E</w:t>
+            </w:r>
+            <w:r>
+              <w:rPr>
+                <w:sz w:val="16"/>
+                <w:szCs w:val="18"/>
+                <w:lang w:val="en-CA"/>
+              </w:rPr>
+              <w:t>lectron: top dashbar</w:t>
+            </w:r>
+          </w:p>
+        </w:tc>
+        <w:tc>
+          <w:tcPr>
+            <w:tcW w:w="2410" w:type="dxa"/>
+          </w:tcPr>
+          <w:p>
+            <w:pPr>
+              <w:rPr>
+                <w:sz w:val="16"/>
+                <w:szCs w:val="18"/>
+                <w:lang w:val="en-CA"/>
+              </w:rPr>
+            </w:pPr>
+            <w:r>
+              <w:rPr>
+                <w:rFonts w:hint="eastAsia"/>
+                <w:sz w:val="16"/>
+                <w:szCs w:val="18"/>
+                <w:lang w:val="en-CA"/>
+              </w:rPr>
+              <w:t>D</w:t>
+            </w:r>
+            <w:r>
+              <w:rPr>
+                <w:sz w:val="16"/>
+                <w:szCs w:val="18"/>
+                <w:lang w:val="en-CA"/>
+              </w:rPr>
+              <w:t>rag an empty space in the top dashbar in electron</w:t>
+            </w:r>
+          </w:p>
+        </w:tc>
+        <w:tc>
+          <w:tcPr>
+            <w:tcW w:w="3118" w:type="dxa"/>
+          </w:tcPr>
+          <w:p>
+            <w:pPr>
+              <w:rPr>
+                <w:rFonts w:hint="eastAsia"/>
+                <w:sz w:val="16"/>
+                <w:szCs w:val="18"/>
+                <w:lang w:val="en-CA"/>
+              </w:rPr>
+            </w:pPr>
+            <w:r>
+              <w:rPr>
+                <w:rFonts w:hint="eastAsia"/>
+                <w:sz w:val="16"/>
+                <w:szCs w:val="18"/>
+                <w:lang w:val="en-CA"/>
+              </w:rPr>
+              <w:t>T</w:t>
+            </w:r>
+            <w:r>
+              <w:rPr>
+                <w:sz w:val="16"/>
+                <w:szCs w:val="18"/>
+                <w:lang w:val="en-CA"/>
+              </w:rPr>
+              <w:t>he window should drag</w:t>
+            </w:r>
+          </w:p>
+        </w:tc>
+        <w:tc>
+          <w:tcPr>
+            <w:tcW w:w="2410" w:type="dxa"/>
+          </w:tcPr>
+          <w:p>
+            <w:pPr>
+              <w:rPr>
+                <w:rFonts w:hint="eastAsia"/>
+                <w:sz w:val="16"/>
+                <w:szCs w:val="18"/>
+                <w:lang w:val="en-CA"/>
+              </w:rPr>
+            </w:pPr>
+          </w:p>
+        </w:tc>
+      </w:tr>
+      <w:tr>
+        <w:tc>
+          <w:tcPr>
+            <w:tcW w:w="1843" w:type="dxa"/>
+          </w:tcPr>
+          <w:p>
+            <w:pPr>
+              <w:rPr>
+                <w:sz w:val="16"/>
+                <w:szCs w:val="18"/>
+                <w:lang w:val="en-CA"/>
+              </w:rPr>
+            </w:pPr>
+            <w:r>
+              <w:rPr>
+                <w:rFonts w:hint="eastAsia"/>
+                <w:sz w:val="16"/>
+                <w:szCs w:val="18"/>
+                <w:lang w:val="en-CA"/>
+              </w:rPr>
+              <w:t>M</w:t>
+            </w:r>
+            <w:r>
+              <w:rPr>
+                <w:sz w:val="16"/>
+                <w:szCs w:val="18"/>
+                <w:lang w:val="en-CA"/>
+              </w:rPr>
+              <w:t>ain.cjs</w:t>
+            </w:r>
+          </w:p>
+        </w:tc>
+        <w:tc>
+          <w:tcPr>
+            <w:tcW w:w="1843" w:type="dxa"/>
+          </w:tcPr>
+          <w:p>
+            <w:pPr>
+              <w:rPr>
+                <w:sz w:val="16"/>
+                <w:szCs w:val="18"/>
+                <w:lang w:val="en-CA"/>
+              </w:rPr>
+            </w:pPr>
+            <w:r>
+              <w:rPr>
+                <w:rFonts w:hint="eastAsia"/>
+                <w:sz w:val="16"/>
+                <w:szCs w:val="18"/>
+                <w:lang w:val="en-CA"/>
+              </w:rPr>
+              <w:t>E</w:t>
+            </w:r>
+            <w:r>
+              <w:rPr>
+                <w:sz w:val="16"/>
+                <w:szCs w:val="18"/>
+                <w:lang w:val="en-CA"/>
+              </w:rPr>
+              <w:t>lectron: window buttons (#1): hover mechanics</w:t>
+            </w:r>
+          </w:p>
+        </w:tc>
+        <w:tc>
+          <w:tcPr>
+            <w:tcW w:w="2410" w:type="dxa"/>
+          </w:tcPr>
+          <w:p>
+            <w:pPr>
+              <w:rPr>
+                <w:sz w:val="16"/>
+                <w:szCs w:val="18"/>
+                <w:lang w:val="en-CA"/>
+              </w:rPr>
+            </w:pPr>
+            <w:r>
+              <w:rPr>
+                <w:rFonts w:hint="eastAsia"/>
+                <w:sz w:val="16"/>
+                <w:szCs w:val="18"/>
+                <w:lang w:val="en-CA"/>
+              </w:rPr>
+              <w:t>H</w:t>
+            </w:r>
+            <w:r>
+              <w:rPr>
+                <w:sz w:val="16"/>
+                <w:szCs w:val="18"/>
+                <w:lang w:val="en-CA"/>
+              </w:rPr>
+              <w:t>over over the dashbar buttons</w:t>
+            </w:r>
+          </w:p>
+        </w:tc>
+        <w:tc>
+          <w:tcPr>
+            <w:tcW w:w="3118" w:type="dxa"/>
+          </w:tcPr>
+          <w:p>
+            <w:pPr>
+              <w:rPr>
+                <w:sz w:val="16"/>
+                <w:szCs w:val="18"/>
+                <w:lang w:val="en-CA"/>
+              </w:rPr>
+            </w:pPr>
+            <w:r>
+              <w:rPr>
+                <w:rFonts w:hint="eastAsia"/>
+                <w:sz w:val="16"/>
+                <w:szCs w:val="18"/>
+                <w:lang w:val="en-CA"/>
+              </w:rPr>
+              <w:t>T</w:t>
+            </w:r>
+            <w:r>
+              <w:rPr>
+                <w:sz w:val="16"/>
+                <w:szCs w:val="18"/>
+                <w:lang w:val="en-CA"/>
+              </w:rPr>
+              <w:t>hey should grow in size and glow</w:t>
+            </w:r>
+          </w:p>
+        </w:tc>
+        <w:tc>
+          <w:tcPr>
+            <w:tcW w:w="2410" w:type="dxa"/>
+          </w:tcPr>
+          <w:p>
+            <w:pPr>
+              <w:rPr>
+                <w:rFonts w:hint="eastAsia"/>
+                <w:sz w:val="16"/>
+                <w:szCs w:val="18"/>
+                <w:lang w:val="en-CA"/>
+              </w:rPr>
+            </w:pPr>
+          </w:p>
+        </w:tc>
+      </w:tr>
+      <w:tr>
+        <w:tc>
+          <w:tcPr>
+            <w:tcW w:w="1843" w:type="dxa"/>
+          </w:tcPr>
+          <w:p>
+            <w:pPr>
+              <w:rPr>
+                <w:sz w:val="16"/>
+                <w:szCs w:val="18"/>
+                <w:lang w:val="en-CA"/>
+              </w:rPr>
+            </w:pPr>
+            <w:r>
+              <w:rPr>
+                <w:rFonts w:hint="eastAsia"/>
+                <w:sz w:val="16"/>
+                <w:szCs w:val="18"/>
+                <w:lang w:val="en-CA"/>
+              </w:rPr>
+              <w:t>M</w:t>
+            </w:r>
+            <w:r>
+              <w:rPr>
+                <w:sz w:val="16"/>
+                <w:szCs w:val="18"/>
+                <w:lang w:val="en-CA"/>
+              </w:rPr>
+              <w:t>ain.cjs</w:t>
+            </w:r>
+          </w:p>
+        </w:tc>
+        <w:tc>
+          <w:tcPr>
+            <w:tcW w:w="1843" w:type="dxa"/>
+          </w:tcPr>
+          <w:p>
+            <w:pPr>
+              <w:rPr>
+                <w:sz w:val="16"/>
+                <w:szCs w:val="18"/>
+                <w:lang w:val="en-CA"/>
+              </w:rPr>
+            </w:pPr>
+            <w:r>
+              <w:rPr>
+                <w:rFonts w:hint="eastAsia"/>
+                <w:sz w:val="16"/>
+                <w:szCs w:val="18"/>
+                <w:lang w:val="en-CA"/>
+              </w:rPr>
+              <w:t>E</w:t>
+            </w:r>
+            <w:r>
+              <w:rPr>
+                <w:sz w:val="16"/>
+                <w:szCs w:val="18"/>
+                <w:lang w:val="en-CA"/>
+              </w:rPr>
+              <w:t>lectron: window buttons (#2): functionality</w:t>
+            </w:r>
+          </w:p>
+        </w:tc>
+        <w:tc>
+          <w:tcPr>
+            <w:tcW w:w="2410" w:type="dxa"/>
+          </w:tcPr>
+          <w:p>
+            <w:pPr>
+              <w:rPr>
+                <w:sz w:val="16"/>
+                <w:szCs w:val="18"/>
+                <w:lang w:val="en-CA"/>
+              </w:rPr>
+            </w:pPr>
+            <w:r>
+              <w:rPr>
+                <w:rFonts w:hint="eastAsia"/>
+                <w:sz w:val="16"/>
+                <w:szCs w:val="18"/>
+                <w:lang w:val="en-CA"/>
+              </w:rPr>
+              <w:t>C</w:t>
+            </w:r>
+            <w:r>
+              <w:rPr>
+                <w:sz w:val="16"/>
+                <w:szCs w:val="18"/>
+                <w:lang w:val="en-CA"/>
+              </w:rPr>
+              <w:t>lick on all 3 buttons (</w:t>
+            </w:r>
+            <w:r>
+              <w:rPr>
+                <w:rFonts w:ascii="Segoe UI Emoji" w:hAnsi="Segoe UI Emoji" w:cs="Segoe UI Emoji"/>
+                <w:sz w:val="16"/>
+                <w:szCs w:val="18"/>
+                <w:lang w:val="en-CA"/>
+              </w:rPr>
+              <w:t>🟡🟢🔴)</w:t>
+            </w:r>
+          </w:p>
+        </w:tc>
+        <w:tc>
+          <w:tcPr>
+            <w:tcW w:w="3118" w:type="dxa"/>
+          </w:tcPr>
+          <w:p>
+            <w:pPr>
+              <w:rPr>
+                <w:sz w:val="16"/>
+                <w:szCs w:val="18"/>
+                <w:lang w:val="en-CA"/>
+              </w:rPr>
+            </w:pPr>
+            <w:r>
+              <w:rPr>
+                <w:rFonts w:hint="eastAsia"/>
+                <w:sz w:val="16"/>
+                <w:szCs w:val="18"/>
+                <w:lang w:val="en-CA"/>
+              </w:rPr>
+              <w:t>R</w:t>
+            </w:r>
+            <w:r>
+              <w:rPr>
+                <w:sz w:val="16"/>
+                <w:szCs w:val="18"/>
+                <w:lang w:val="en-CA"/>
+              </w:rPr>
+              <w:t>ed should close, green should maximize when unmaximized, and unmaximize to its last previous resolution when already maximized (green should toggle maximize), and yellow should minimize</w:t>
+            </w:r>
+          </w:p>
+        </w:tc>
+        <w:tc>
+          <w:tcPr>
+            <w:tcW w:w="2410" w:type="dxa"/>
+          </w:tcPr>
+          <w:p>
+            <w:pPr>
+              <w:rPr>
+                <w:rFonts w:hint="eastAsia"/>
+                <w:sz w:val="16"/>
+                <w:szCs w:val="18"/>
+                <w:lang w:val="en-CA"/>
+              </w:rPr>
+            </w:pPr>
+          </w:p>
+        </w:tc>
+      </w:tr>
+    </w:tbl>
+    <w:p>
+      <w:pPr>
+        <w:jc w:val="center"/>
+        <w:rPr>
           <w:b/>
           <w:bCs/>
           <w:sz w:val="28"/>
@@ -999,7 +1656,16 @@
                 <w:szCs w:val="18"/>
                 <w:lang w:val="en-CA"/>
               </w:rPr>
-              <w:t>eopen the styles page.</w:t>
+              <w:t xml:space="preserve">eopen the </w:t>
+            </w:r>
+            <w:r>
+              <w:rPr>
+                <w:sz w:val="16"/>
+                <w:szCs w:val="18"/>
+                <w:lang w:val="en-CA"/>
+              </w:rPr>
+              <w:lastRenderedPageBreak/>
+              <w:t>styles page.</w:t>
             </w:r>
           </w:p>
         </w:tc>
@@ -1022,6 +1688,7 @@
                 <w:szCs w:val="18"/>
                 <w:lang w:val="en-CA"/>
               </w:rPr>
+              <w:lastRenderedPageBreak/>
               <w:t>T</w:t>
             </w:r>
             <w:r>
@@ -1078,7 +1745,15 @@
                 <w:sz w:val="16"/>
                 <w:szCs w:val="18"/>
               </w:rPr>
-              <w:t>={() =&gt; { modalManager.close('styles'); setShowStyle(</w:t>
+              <w:t xml:space="preserve">={() =&gt; { modalManager.close('styles'); </w:t>
+            </w:r>
+            <w:r>
+              <w:rPr>
+                <w:sz w:val="16"/>
+                <w:szCs w:val="18"/>
+              </w:rPr>
+              <w:lastRenderedPageBreak/>
+              <w:t>setShowStyle(</w:t>
             </w:r>
             <w:r>
               <w:rPr>
@@ -1127,6 +1802,7 @@
                 <w:szCs w:val="18"/>
                 <w:lang w:val="en-CA"/>
               </w:rPr>
+              <w:lastRenderedPageBreak/>
               <w:t>I</w:t>
             </w:r>
             <w:r>
@@ -1583,16 +2259,7 @@
                 <w:szCs w:val="18"/>
                 <w:lang w:val="en-CA"/>
               </w:rPr>
-              <w:t xml:space="preserve">ither add a visual </w:t>
-            </w:r>
-            <w:r>
-              <w:rPr>
-                <w:sz w:val="16"/>
-                <w:szCs w:val="18"/>
-                <w:lang w:val="en-CA"/>
-              </w:rPr>
-              <w:lastRenderedPageBreak/>
-              <w:t>indicator or accept the keybind after 1 keypress.</w:t>
+              <w:t>ither add a visual indicator or accept the keybind after 1 keypress.</w:t>
             </w:r>
           </w:p>
         </w:tc>
@@ -1601,24 +2268,24 @@
         <w:tc>
           <w:tcPr>
             <w:tcW w:w="1843" w:type="dxa"/>
-          </w:tcPr>
-          <w:p>
-            <w:pPr>
-              <w:rPr>
-                <w:rFonts w:hint="eastAsia"/>
-                <w:sz w:val="16"/>
-                <w:szCs w:val="18"/>
-                <w:lang w:val="en-CA"/>
-              </w:rPr>
-            </w:pPr>
-            <w:r>
-              <w:rPr>
-                <w:rFonts w:hint="eastAsia"/>
-                <w:sz w:val="16"/>
-                <w:szCs w:val="18"/>
-                <w:lang w:val="en-CA"/>
-              </w:rPr>
-              <w:lastRenderedPageBreak/>
+            <w:shd w:val="clear" w:color="auto" w:fill="D9F2D0" w:themeFill="accent6" w:themeFillTint="33"/>
+          </w:tcPr>
+          <w:p>
+            <w:pPr>
+              <w:rPr>
+                <w:rFonts w:hint="eastAsia"/>
+                <w:sz w:val="16"/>
+                <w:szCs w:val="18"/>
+                <w:lang w:val="en-CA"/>
+              </w:rPr>
+            </w:pPr>
+            <w:r>
+              <w:rPr>
+                <w:rFonts w:hint="eastAsia"/>
+                <w:sz w:val="16"/>
+                <w:szCs w:val="18"/>
+                <w:lang w:val="en-CA"/>
+              </w:rPr>
               <w:t>S</w:t>
             </w:r>
             <w:r>
@@ -1634,6 +2301,7 @@
         <w:tc>
           <w:tcPr>
             <w:tcW w:w="1843" w:type="dxa"/>
+            <w:shd w:val="clear" w:color="auto" w:fill="D9F2D0" w:themeFill="accent6" w:themeFillTint="33"/>
           </w:tcPr>
           <w:p>
             <w:pPr>
@@ -1666,6 +2334,7 @@
         <w:tc>
           <w:tcPr>
             <w:tcW w:w="2410" w:type="dxa"/>
+            <w:shd w:val="clear" w:color="auto" w:fill="D9F2D0" w:themeFill="accent6" w:themeFillTint="33"/>
           </w:tcPr>
           <w:p>
             <w:pPr>
@@ -1698,6 +2367,7 @@
         <w:tc>
           <w:tcPr>
             <w:tcW w:w="2835" w:type="dxa"/>
+            <w:shd w:val="clear" w:color="auto" w:fill="D9F2D0" w:themeFill="accent6" w:themeFillTint="33"/>
           </w:tcPr>
           <w:p>
             <w:pPr>
@@ -1764,6 +2434,7 @@
         <w:tc>
           <w:tcPr>
             <w:tcW w:w="2693" w:type="dxa"/>
+            <w:shd w:val="clear" w:color="auto" w:fill="D9F2D0" w:themeFill="accent6" w:themeFillTint="33"/>
           </w:tcPr>
           <w:p>
             <w:pPr>
@@ -1789,6 +2460,7 @@
         <w:tc>
           <w:tcPr>
             <w:tcW w:w="1843" w:type="dxa"/>
+            <w:shd w:val="clear" w:color="auto" w:fill="D9F2D0" w:themeFill="accent6" w:themeFillTint="33"/>
           </w:tcPr>
           <w:p>
             <w:pPr>
@@ -1821,6 +2493,7 @@
         <w:tc>
           <w:tcPr>
             <w:tcW w:w="1843" w:type="dxa"/>
+            <w:shd w:val="clear" w:color="auto" w:fill="D9F2D0" w:themeFill="accent6" w:themeFillTint="33"/>
           </w:tcPr>
           <w:p>
             <w:pPr>
@@ -1861,6 +2534,7 @@
         <w:tc>
           <w:tcPr>
             <w:tcW w:w="2410" w:type="dxa"/>
+            <w:shd w:val="clear" w:color="auto" w:fill="D9F2D0" w:themeFill="accent6" w:themeFillTint="33"/>
           </w:tcPr>
           <w:p>
             <w:pPr>
@@ -1893,6 +2567,7 @@
         <w:tc>
           <w:tcPr>
             <w:tcW w:w="2835" w:type="dxa"/>
+            <w:shd w:val="clear" w:color="auto" w:fill="D9F2D0" w:themeFill="accent6" w:themeFillTint="33"/>
           </w:tcPr>
           <w:p>
             <w:pPr>
@@ -1942,6 +2617,7 @@
         <w:tc>
           <w:tcPr>
             <w:tcW w:w="2693" w:type="dxa"/>
+            <w:shd w:val="clear" w:color="auto" w:fill="D9F2D0" w:themeFill="accent6" w:themeFillTint="33"/>
           </w:tcPr>
           <w:p>
             <w:pPr>
@@ -2847,6 +3523,7 @@
                 <w:szCs w:val="18"/>
                 <w:lang w:val="en-CA"/>
               </w:rPr>
+              <w:lastRenderedPageBreak/>
               <w:t>S</w:t>
             </w:r>
             <w:r>
@@ -3041,6 +3718,7 @@
         <w:tc>
           <w:tcPr>
             <w:tcW w:w="1667" w:type="dxa"/>
+            <w:shd w:val="clear" w:color="auto" w:fill="D9F2D0" w:themeFill="accent6" w:themeFillTint="33"/>
           </w:tcPr>
           <w:p>
             <w:pPr>
@@ -3073,6 +3751,7 @@
         <w:tc>
           <w:tcPr>
             <w:tcW w:w="2019" w:type="dxa"/>
+            <w:shd w:val="clear" w:color="auto" w:fill="D9F2D0" w:themeFill="accent6" w:themeFillTint="33"/>
           </w:tcPr>
           <w:p>
             <w:pPr>
@@ -3119,6 +3798,7 @@
         <w:tc>
           <w:tcPr>
             <w:tcW w:w="2410" w:type="dxa"/>
+            <w:shd w:val="clear" w:color="auto" w:fill="D9F2D0" w:themeFill="accent6" w:themeFillTint="33"/>
           </w:tcPr>
           <w:p>
             <w:pPr>
@@ -3168,6 +3848,7 @@
         <w:tc>
           <w:tcPr>
             <w:tcW w:w="3118" w:type="dxa"/>
+            <w:shd w:val="clear" w:color="auto" w:fill="D9F2D0" w:themeFill="accent6" w:themeFillTint="33"/>
           </w:tcPr>
           <w:p>
             <w:pPr>
@@ -3200,6 +3881,7 @@
         <w:tc>
           <w:tcPr>
             <w:tcW w:w="2410" w:type="dxa"/>
+            <w:shd w:val="clear" w:color="auto" w:fill="D9F2D0" w:themeFill="accent6" w:themeFillTint="33"/>
           </w:tcPr>
           <w:p>
             <w:pPr>
@@ -3520,16 +4202,7 @@
                 <w:szCs w:val="18"/>
                 <w:lang w:val="en-CA"/>
               </w:rPr>
-              <w:t xml:space="preserve">ettings: switches: execute header action buttons when dragging: </w:t>
-            </w:r>
-            <w:r>
-              <w:rPr>
-                <w:sz w:val="16"/>
-                <w:szCs w:val="18"/>
-                <w:lang w:val="en-CA"/>
-              </w:rPr>
-              <w:lastRenderedPageBreak/>
-              <w:t>ENABLED</w:t>
+              <w:t>ettings: switches: execute header action buttons when dragging: ENABLED</w:t>
             </w:r>
           </w:p>
         </w:tc>
@@ -3553,7 +4226,6 @@
                 <w:szCs w:val="18"/>
                 <w:lang w:val="en-CA"/>
               </w:rPr>
-              <w:lastRenderedPageBreak/>
               <w:t>O</w:t>
             </w:r>
             <w:r>
@@ -3658,16 +4330,7 @@
                 <w:szCs w:val="18"/>
                 <w:lang w:val="en-CA"/>
               </w:rPr>
-              <w:t xml:space="preserve">urning this </w:t>
-            </w:r>
-            <w:r>
-              <w:rPr>
-                <w:sz w:val="16"/>
-                <w:szCs w:val="18"/>
-                <w:lang w:val="en-CA"/>
-              </w:rPr>
-              <w:lastRenderedPageBreak/>
-              <w:t>setting on allows you to drag the modal, which isn’t what this setting is supposed to do.</w:t>
+              <w:t>urning this setting on allows you to drag the modal, which isn’t what this setting is supposed to do.</w:t>
             </w:r>
           </w:p>
         </w:tc>
@@ -3694,7 +4357,6 @@
                 <w:szCs w:val="18"/>
                 <w:lang w:val="en-CA"/>
               </w:rPr>
-              <w:lastRenderedPageBreak/>
               <w:t>S</w:t>
             </w:r>
             <w:r>
@@ -4724,6 +5386,7 @@
                 <w:szCs w:val="18"/>
                 <w:lang w:val="en-CA"/>
               </w:rPr>
+              <w:lastRenderedPageBreak/>
               <w:t>O</w:t>
             </w:r>
             <w:r>
@@ -4756,6 +5419,7 @@
                 <w:szCs w:val="18"/>
                 <w:lang w:val="en-CA"/>
               </w:rPr>
+              <w:lastRenderedPageBreak/>
               <w:t>A</w:t>
             </w:r>
             <w:r>
@@ -4864,6 +5528,7 @@
         <w:tc>
           <w:tcPr>
             <w:tcW w:w="1667" w:type="dxa"/>
+            <w:shd w:val="clear" w:color="auto" w:fill="D9F2D0" w:themeFill="accent6" w:themeFillTint="33"/>
           </w:tcPr>
           <w:p>
             <w:pPr>
@@ -4896,6 +5561,7 @@
         <w:tc>
           <w:tcPr>
             <w:tcW w:w="2019" w:type="dxa"/>
+            <w:shd w:val="clear" w:color="auto" w:fill="D9F2D0" w:themeFill="accent6" w:themeFillTint="33"/>
           </w:tcPr>
           <w:p>
             <w:pPr>
@@ -4928,6 +5594,7 @@
         <w:tc>
           <w:tcPr>
             <w:tcW w:w="2410" w:type="dxa"/>
+            <w:shd w:val="clear" w:color="auto" w:fill="D9F2D0" w:themeFill="accent6" w:themeFillTint="33"/>
           </w:tcPr>
           <w:p>
             <w:pPr>
@@ -5030,6 +5697,7 @@
         <w:tc>
           <w:tcPr>
             <w:tcW w:w="3118" w:type="dxa"/>
+            <w:shd w:val="clear" w:color="auto" w:fill="D9F2D0" w:themeFill="accent6" w:themeFillTint="33"/>
           </w:tcPr>
           <w:p>
             <w:pPr>
@@ -5115,6 +5783,7 @@
         <w:tc>
           <w:tcPr>
             <w:tcW w:w="2410" w:type="dxa"/>
+            <w:shd w:val="clear" w:color="auto" w:fill="D9F2D0" w:themeFill="accent6" w:themeFillTint="33"/>
           </w:tcPr>
           <w:p>
             <w:pPr>
@@ -5279,16 +5948,7 @@
                 <w:szCs w:val="18"/>
                 <w:lang w:val="en-CA"/>
               </w:rPr>
-              <w:t xml:space="preserve">hen </w:t>
-            </w:r>
-            <w:r>
-              <w:rPr>
-                <w:sz w:val="16"/>
-                <w:szCs w:val="18"/>
-                <w:lang w:val="en-CA"/>
-              </w:rPr>
-              <w:lastRenderedPageBreak/>
-              <w:t>slide the slider to 500ms, try again, 1000ms, try again</w:t>
+              <w:t>hen slide the slider to 500ms, try again, 1000ms, try again</w:t>
             </w:r>
           </w:p>
         </w:tc>
@@ -5317,7 +5977,6 @@
                 <w:szCs w:val="18"/>
                 <w:lang w:val="en-CA"/>
               </w:rPr>
-              <w:lastRenderedPageBreak/>
               <w:t>E</w:t>
             </w:r>
             <w:r>
@@ -5358,16 +6017,7 @@
                 <w:szCs w:val="18"/>
                 <w:lang w:val="en-CA"/>
               </w:rPr>
-              <w:t xml:space="preserve">nsure that the timing is correlated </w:t>
-            </w:r>
-            <w:r>
-              <w:rPr>
-                <w:sz w:val="16"/>
-                <w:szCs w:val="18"/>
-                <w:lang w:val="en-CA"/>
-              </w:rPr>
-              <w:lastRenderedPageBreak/>
-              <w:t>to the slider, so the longer the slider’s set duration time, the longer the transition should feel</w:t>
+              <w:t>nsure that the timing is correlated to the slider, so the longer the slider’s set duration time, the longer the transition should feel</w:t>
             </w:r>
           </w:p>
         </w:tc>
@@ -5391,7 +6041,6 @@
                 <w:szCs w:val="18"/>
                 <w:lang w:val="en-CA"/>
               </w:rPr>
-              <w:lastRenderedPageBreak/>
               <w:t>N</w:t>
             </w:r>
             <w:r>
@@ -5417,16 +6066,7 @@
                 <w:szCs w:val="18"/>
                 <w:lang w:val="en-CA"/>
               </w:rPr>
-              <w:t xml:space="preserve">g the color of the icons in the styles </w:t>
-            </w:r>
-            <w:r>
-              <w:rPr>
-                <w:sz w:val="16"/>
-                <w:szCs w:val="18"/>
-                <w:lang w:val="en-CA"/>
-              </w:rPr>
-              <w:lastRenderedPageBreak/>
-              <w:t>page, whatever that color is</w:t>
+              <w:t>g the color of the icons in the styles page, whatever that color is</w:t>
             </w:r>
           </w:p>
         </w:tc>
@@ -5938,6 +6578,7 @@
         <w:tc>
           <w:tcPr>
             <w:tcW w:w="1701" w:type="dxa"/>
+            <w:shd w:val="clear" w:color="auto" w:fill="D9F2D0" w:themeFill="accent6" w:themeFillTint="33"/>
           </w:tcPr>
           <w:p>
             <w:pPr>
@@ -5970,6 +6611,7 @@
         <w:tc>
           <w:tcPr>
             <w:tcW w:w="1985" w:type="dxa"/>
+            <w:shd w:val="clear" w:color="auto" w:fill="D9F2D0" w:themeFill="accent6" w:themeFillTint="33"/>
           </w:tcPr>
           <w:p>
             <w:pPr>
@@ -6002,6 +6644,7 @@
         <w:tc>
           <w:tcPr>
             <w:tcW w:w="2410" w:type="dxa"/>
+            <w:shd w:val="clear" w:color="auto" w:fill="D9F2D0" w:themeFill="accent6" w:themeFillTint="33"/>
           </w:tcPr>
           <w:p>
             <w:pPr>
@@ -6068,6 +6711,7 @@
         <w:tc>
           <w:tcPr>
             <w:tcW w:w="3118" w:type="dxa"/>
+            <w:shd w:val="clear" w:color="auto" w:fill="D9F2D0" w:themeFill="accent6" w:themeFillTint="33"/>
           </w:tcPr>
           <w:p>
             <w:pPr>
@@ -6129,28 +6773,64 @@
               </w:rPr>
               <w:t>he third time, it should wait and then quickly speed up and abruptly stop</w:t>
             </w:r>
+            <w:r>
+              <w:rPr>
+                <w:sz w:val="16"/>
+                <w:szCs w:val="18"/>
+                <w:lang w:val="en-CA"/>
+              </w:rPr>
+              <w:t xml:space="preserve">. </w:t>
+            </w:r>
+            <w:r>
+              <w:rPr>
+                <w:rFonts w:hint="eastAsia"/>
+                <w:sz w:val="16"/>
+                <w:szCs w:val="18"/>
+                <w:lang w:val="en-CA"/>
+              </w:rPr>
+              <w:t>C</w:t>
+            </w:r>
+            <w:r>
+              <w:rPr>
+                <w:sz w:val="16"/>
+                <w:szCs w:val="18"/>
+                <w:lang w:val="en-CA"/>
+              </w:rPr>
+              <w:t xml:space="preserve">orroborate the behavior between the </w:t>
+            </w:r>
+            <w:r>
+              <w:rPr>
+                <w:sz w:val="16"/>
+                <w:szCs w:val="18"/>
+                <w:lang w:val="en-CA"/>
+              </w:rPr>
+              <w:lastRenderedPageBreak/>
+              <w:t>interactive torus menu and the timeline torus menu</w:t>
+            </w:r>
           </w:p>
         </w:tc>
         <w:tc>
           <w:tcPr>
             <w:tcW w:w="2410" w:type="dxa"/>
-          </w:tcPr>
-          <w:p>
-            <w:pPr>
-              <w:rPr>
-                <w:rFonts w:hint="eastAsia"/>
-                <w:sz w:val="16"/>
-                <w:szCs w:val="18"/>
-                <w:lang w:val="en-CA"/>
-              </w:rPr>
-            </w:pPr>
-            <w:r>
-              <w:rPr>
-                <w:rFonts w:hint="eastAsia"/>
-                <w:sz w:val="16"/>
-                <w:szCs w:val="18"/>
-                <w:lang w:val="en-CA"/>
-              </w:rPr>
+            <w:shd w:val="clear" w:color="auto" w:fill="D9F2D0" w:themeFill="accent6" w:themeFillTint="33"/>
+          </w:tcPr>
+          <w:p>
+            <w:pPr>
+              <w:rPr>
+                <w:rFonts w:hint="eastAsia"/>
+                <w:sz w:val="16"/>
+                <w:szCs w:val="18"/>
+                <w:lang w:val="en-CA"/>
+              </w:rPr>
+            </w:pPr>
+            <w:r>
+              <w:rPr>
+                <w:rFonts w:hint="eastAsia"/>
+                <w:sz w:val="16"/>
+                <w:szCs w:val="18"/>
+                <w:lang w:val="en-CA"/>
+              </w:rPr>
+              <w:lastRenderedPageBreak/>
               <w:t>W</w:t>
             </w:r>
             <w:r>
@@ -6167,24 +6847,23 @@
                 <w:szCs w:val="18"/>
                 <w:lang w:val="en-CA"/>
               </w:rPr>
-              <w:t xml:space="preserve">: </w:t>
-            </w:r>
-            <w:r>
-              <w:rPr>
-                <w:sz w:val="16"/>
-                <w:szCs w:val="18"/>
-                <w:lang w:val="en-CA"/>
-              </w:rPr>
-              <w:t>5bddf836872611033759d627746d8b4161bba22a</w:t>
-            </w:r>
-            <w:r>
-              <w:rPr>
-                <w:sz w:val="16"/>
-                <w:szCs w:val="18"/>
-                <w:lang w:val="en-CA"/>
-              </w:rPr>
-              <w:br/>
-              <w:t>although the hitbox for the ease handler is kinda small and super annoying to click, in fact it’s smaller than the area in which your cursor turns into an arrow handle.</w:t>
+              <w:t xml:space="preserve"> as of </w:t>
+            </w:r>
+            <w:r>
+              <w:rPr>
+                <w:sz w:val="16"/>
+                <w:szCs w:val="18"/>
+                <w:lang w:val="en-CA"/>
+              </w:rPr>
+              <w:t>317d68bbef40c3746b6ad4695dfd0c2682856f6e</w:t>
+            </w:r>
+            <w:r>
+              <w:rPr>
+                <w:sz w:val="16"/>
+                <w:szCs w:val="18"/>
+                <w:lang w:val="en-CA"/>
+              </w:rPr>
+              <w:t xml:space="preserve"> + 1.</w:t>
             </w:r>
           </w:p>
         </w:tc>
@@ -6193,43 +6872,34 @@
         <w:tc>
           <w:tcPr>
             <w:tcW w:w="1701" w:type="dxa"/>
-          </w:tcPr>
-          <w:p>
-            <w:pPr>
-              <w:rPr>
-                <w:rFonts w:hint="eastAsia"/>
-                <w:sz w:val="16"/>
-                <w:szCs w:val="18"/>
-                <w:lang w:val="en-CA"/>
-              </w:rPr>
-            </w:pPr>
-            <w:r>
-              <w:rPr>
-                <w:rFonts w:hint="eastAsia"/>
-                <w:sz w:val="16"/>
-                <w:szCs w:val="18"/>
-                <w:lang w:val="en-CA"/>
-              </w:rPr>
-              <w:t>G</w:t>
-            </w:r>
-            <w:r>
-              <w:rPr>
-                <w:sz w:val="16"/>
-                <w:szCs w:val="18"/>
-                <w:lang w:val="en-CA"/>
-              </w:rPr>
-              <w:t>raph.tsx, TorusMenuEditor.tsx</w:t>
+            <w:shd w:val="clear" w:color="auto" w:fill="D9F2D0" w:themeFill="accent6" w:themeFillTint="33"/>
+          </w:tcPr>
+          <w:p>
+            <w:pPr>
+              <w:rPr>
+                <w:sz w:val="16"/>
+                <w:szCs w:val="18"/>
+                <w:lang w:val="en-CA"/>
+              </w:rPr>
+            </w:pPr>
+            <w:r>
+              <w:rPr>
+                <w:sz w:val="16"/>
+                <w:szCs w:val="18"/>
+                <w:lang w:val="en-CA"/>
+              </w:rPr>
+              <w:t>Graph.tsx, TorusMenuEditor.tsx</w:t>
             </w:r>
           </w:p>
         </w:tc>
         <w:tc>
           <w:tcPr>
             <w:tcW w:w="1985" w:type="dxa"/>
-          </w:tcPr>
-          <w:p>
-            <w:pPr>
-              <w:rPr>
-                <w:rFonts w:hint="eastAsia"/>
+            <w:shd w:val="clear" w:color="auto" w:fill="D9F2D0" w:themeFill="accent6" w:themeFillTint="33"/>
+          </w:tcPr>
+          <w:p>
+            <w:pPr>
+              <w:rPr>
                 <w:sz w:val="16"/>
                 <w:szCs w:val="18"/>
                 <w:lang w:val="en-CA"/>
@@ -6250,99 +6920,83 @@
                 <w:szCs w:val="18"/>
                 <w:lang w:val="en-CA"/>
               </w:rPr>
-              <w:t>ettings: components: torus menu editor: graph: multiple anchor points</w:t>
+              <w:t>ettings: components: torus menu editor: graph: ease handle hitbox</w:t>
             </w:r>
           </w:p>
         </w:tc>
         <w:tc>
           <w:tcPr>
             <w:tcW w:w="2410" w:type="dxa"/>
-          </w:tcPr>
-          <w:p>
-            <w:pPr>
-              <w:rPr>
-                <w:rFonts w:hint="eastAsia"/>
-                <w:sz w:val="16"/>
-                <w:szCs w:val="18"/>
-                <w:lang w:val="en-CA"/>
-              </w:rPr>
-            </w:pPr>
-            <w:r>
-              <w:rPr>
-                <w:rFonts w:hint="eastAsia"/>
-                <w:sz w:val="16"/>
-                <w:szCs w:val="18"/>
-                <w:lang w:val="en-CA"/>
-              </w:rPr>
-              <w:t>C</w:t>
-            </w:r>
-            <w:r>
-              <w:rPr>
-                <w:sz w:val="16"/>
-                <w:szCs w:val="18"/>
-                <w:lang w:val="en-CA"/>
-              </w:rPr>
-              <w:t xml:space="preserve">lick and drag a point and move it up and towards the beginning of the graph. </w:t>
-            </w:r>
-            <w:r>
-              <w:rPr>
-                <w:rFonts w:hint="eastAsia"/>
-                <w:sz w:val="16"/>
-                <w:szCs w:val="18"/>
-                <w:lang w:val="en-CA"/>
-              </w:rPr>
-              <w:t>A</w:t>
-            </w:r>
-            <w:r>
-              <w:rPr>
-                <w:sz w:val="16"/>
-                <w:szCs w:val="18"/>
-                <w:lang w:val="en-CA"/>
-              </w:rPr>
-              <w:t>fter that point, click and drag another point and bring it down</w:t>
+            <w:shd w:val="clear" w:color="auto" w:fill="D9F2D0" w:themeFill="accent6" w:themeFillTint="33"/>
+          </w:tcPr>
+          <w:p>
+            <w:pPr>
+              <w:rPr>
+                <w:sz w:val="16"/>
+                <w:szCs w:val="18"/>
+                <w:lang w:val="en-CA"/>
+              </w:rPr>
+            </w:pPr>
+            <w:r>
+              <w:rPr>
+                <w:rFonts w:hint="eastAsia"/>
+                <w:sz w:val="16"/>
+                <w:szCs w:val="18"/>
+                <w:lang w:val="en-CA"/>
+              </w:rPr>
+              <w:t>D</w:t>
+            </w:r>
+            <w:r>
+              <w:rPr>
+                <w:sz w:val="16"/>
+                <w:szCs w:val="18"/>
+                <w:lang w:val="en-CA"/>
+              </w:rPr>
+              <w:t xml:space="preserve">rag the ease handle hitbox. </w:t>
             </w:r>
           </w:p>
         </w:tc>
         <w:tc>
           <w:tcPr>
             <w:tcW w:w="3118" w:type="dxa"/>
-          </w:tcPr>
-          <w:p>
-            <w:pPr>
-              <w:rPr>
-                <w:rFonts w:hint="eastAsia"/>
-                <w:sz w:val="16"/>
-                <w:szCs w:val="18"/>
-                <w:lang w:val="en-CA"/>
-              </w:rPr>
-            </w:pPr>
-            <w:r>
-              <w:rPr>
-                <w:rFonts w:hint="eastAsia"/>
-                <w:sz w:val="16"/>
-                <w:szCs w:val="18"/>
-                <w:lang w:val="en-CA"/>
-              </w:rPr>
-              <w:t>T</w:t>
-            </w:r>
-            <w:r>
-              <w:rPr>
-                <w:sz w:val="16"/>
-                <w:szCs w:val="18"/>
-                <w:lang w:val="en-CA"/>
-              </w:rPr>
-              <w:t xml:space="preserve">he points should be immediately created as soon as you clicked your mouse button down, and the anchor point should’ve followed your mouse as you dragged it across the graph. </w:t>
+            <w:shd w:val="clear" w:color="auto" w:fill="D9F2D0" w:themeFill="accent6" w:themeFillTint="33"/>
+          </w:tcPr>
+          <w:p>
+            <w:pPr>
+              <w:rPr>
+                <w:rFonts w:hint="eastAsia"/>
+                <w:sz w:val="16"/>
+                <w:szCs w:val="18"/>
+                <w:lang w:val="en-CA"/>
+              </w:rPr>
+            </w:pPr>
+            <w:r>
+              <w:rPr>
+                <w:rFonts w:hint="eastAsia"/>
+                <w:sz w:val="16"/>
+                <w:szCs w:val="18"/>
+                <w:lang w:val="en-CA"/>
+              </w:rPr>
+              <w:t>M</w:t>
+            </w:r>
+            <w:r>
+              <w:rPr>
+                <w:sz w:val="16"/>
+                <w:szCs w:val="18"/>
+                <w:lang w:val="en-CA"/>
+              </w:rPr>
+              <w:t>ake sure the hitbox is comfortably large and draggable</w:t>
             </w:r>
           </w:p>
         </w:tc>
         <w:tc>
           <w:tcPr>
             <w:tcW w:w="2410" w:type="dxa"/>
-          </w:tcPr>
-          <w:p>
-            <w:pPr>
-              <w:rPr>
-                <w:rFonts w:hint="eastAsia"/>
+            <w:shd w:val="clear" w:color="auto" w:fill="D9F2D0" w:themeFill="accent6" w:themeFillTint="33"/>
+          </w:tcPr>
+          <w:p>
+            <w:pPr>
+              <w:rPr>
                 <w:sz w:val="16"/>
                 <w:szCs w:val="18"/>
                 <w:lang w:val="en-CA"/>
@@ -6371,7 +7025,32 @@
                 <w:szCs w:val="18"/>
                 <w:lang w:val="en-CA"/>
               </w:rPr>
-              <w:t>5bddf836872611033759d627746d8b4161bba22a</w:t>
+              <w:t>317d68bbef40c3746b6ad4695dfd0c2682856f6e</w:t>
+            </w:r>
+            <w:r>
+              <w:rPr>
+                <w:sz w:val="16"/>
+                <w:szCs w:val="18"/>
+                <w:lang w:val="en-CA"/>
+              </w:rPr>
+              <w:t xml:space="preserve"> + 1. </w:t>
+            </w:r>
+            <w:r>
+              <w:rPr>
+                <w:rFonts w:hint="eastAsia"/>
+                <w:sz w:val="16"/>
+                <w:szCs w:val="18"/>
+                <w:lang w:val="en-CA"/>
+              </w:rPr>
+              <w:t>H</w:t>
+            </w:r>
+            <w:r>
+              <w:rPr>
+                <w:sz w:val="16"/>
+                <w:szCs w:val="18"/>
+                <w:lang w:val="en-CA"/>
+              </w:rPr>
+              <w:t>itbox is much larger and draggable.</w:t>
             </w:r>
           </w:p>
         </w:tc>
@@ -6380,6 +7059,7 @@
         <w:tc>
           <w:tcPr>
             <w:tcW w:w="1701" w:type="dxa"/>
+            <w:shd w:val="clear" w:color="auto" w:fill="D9F2D0" w:themeFill="accent6" w:themeFillTint="33"/>
           </w:tcPr>
           <w:p>
             <w:pPr>
@@ -6412,6 +7092,7 @@
         <w:tc>
           <w:tcPr>
             <w:tcW w:w="1985" w:type="dxa"/>
+            <w:shd w:val="clear" w:color="auto" w:fill="D9F2D0" w:themeFill="accent6" w:themeFillTint="33"/>
           </w:tcPr>
           <w:p>
             <w:pPr>
@@ -6437,13 +7118,14 @@
                 <w:szCs w:val="18"/>
                 <w:lang w:val="en-CA"/>
               </w:rPr>
-              <w:t>ettings: components: torus menu editor: graph: multiple anchor points #2</w:t>
+              <w:t>ettings: components: torus menu editor: graph: multiple anchor points</w:t>
             </w:r>
           </w:p>
         </w:tc>
         <w:tc>
           <w:tcPr>
             <w:tcW w:w="2410" w:type="dxa"/>
+            <w:shd w:val="clear" w:color="auto" w:fill="D9F2D0" w:themeFill="accent6" w:themeFillTint="33"/>
           </w:tcPr>
           <w:p>
             <w:pPr>
@@ -6486,8 +7168,24 @@
                 <w:szCs w:val="18"/>
                 <w:lang w:val="en-CA"/>
               </w:rPr>
-              <w:t xml:space="preserve">fter that point, click and drag another point and bring it down. </w:t>
-            </w:r>
+              <w:t>fter that point, click and drag another point and bring it down</w:t>
+            </w:r>
+          </w:p>
+        </w:tc>
+        <w:tc>
+          <w:tcPr>
+            <w:tcW w:w="3118" w:type="dxa"/>
+            <w:shd w:val="clear" w:color="auto" w:fill="D9F2D0" w:themeFill="accent6" w:themeFillTint="33"/>
+          </w:tcPr>
+          <w:p>
+            <w:pPr>
+              <w:rPr>
+                <w:rFonts w:hint="eastAsia"/>
+                <w:sz w:val="16"/>
+                <w:szCs w:val="18"/>
+                <w:lang w:val="en-CA"/>
+              </w:rPr>
+            </w:pPr>
             <w:r>
               <w:rPr>
                 <w:rFonts w:hint="eastAsia"/>
@@ -6503,45 +7201,14 @@
                 <w:szCs w:val="18"/>
                 <w:lang w:val="en-CA"/>
               </w:rPr>
-              <w:t>hen, click the open torus menu button (…)</w:t>
-            </w:r>
-          </w:p>
-        </w:tc>
-        <w:tc>
-          <w:tcPr>
-            <w:tcW w:w="3118" w:type="dxa"/>
-          </w:tcPr>
-          <w:p>
-            <w:pPr>
-              <w:rPr>
-                <w:rFonts w:hint="eastAsia"/>
-                <w:sz w:val="16"/>
-                <w:szCs w:val="18"/>
-                <w:lang w:val="en-CA"/>
-              </w:rPr>
-            </w:pPr>
-            <w:r>
-              <w:rPr>
-                <w:rFonts w:hint="eastAsia"/>
-                <w:sz w:val="16"/>
-                <w:szCs w:val="18"/>
-                <w:lang w:val="en-CA"/>
-              </w:rPr>
-              <w:t>T</w:t>
-            </w:r>
-            <w:r>
-              <w:rPr>
-                <w:sz w:val="16"/>
-                <w:szCs w:val="18"/>
-                <w:lang w:val="en-CA"/>
-              </w:rPr>
-              <w:t>he torus menu should quickly enlarge, then contract, then enlarge again</w:t>
+              <w:t xml:space="preserve">he points should be immediately created as soon as you clicked your mouse button down, and the anchor point should’ve followed your mouse as you dragged it across the graph. </w:t>
             </w:r>
           </w:p>
         </w:tc>
         <w:tc>
           <w:tcPr>
             <w:tcW w:w="2410" w:type="dxa"/>
+            <w:shd w:val="clear" w:color="auto" w:fill="D9F2D0" w:themeFill="accent6" w:themeFillTint="33"/>
           </w:tcPr>
           <w:p>
             <w:pPr>
@@ -6567,15 +7234,7 @@
                 <w:szCs w:val="18"/>
                 <w:lang w:val="en-CA"/>
               </w:rPr>
-              <w:t>orks</w:t>
-            </w:r>
-            <w:r>
-              <w:rPr>
-                <w:sz w:val="16"/>
-                <w:szCs w:val="18"/>
-                <w:lang w:val="en-CA"/>
-              </w:rPr>
-              <w:t xml:space="preserve"> </w:t>
+              <w:t xml:space="preserve">orks as of </w:t>
             </w:r>
             <w:r>
               <w:rPr>
@@ -6592,23 +7251,240 @@
         <w:tc>
           <w:tcPr>
             <w:tcW w:w="1701" w:type="dxa"/>
-          </w:tcPr>
-          <w:p>
-            <w:pPr>
-              <w:rPr>
-                <w:rFonts w:hint="eastAsia"/>
-                <w:sz w:val="16"/>
-                <w:szCs w:val="18"/>
-                <w:lang w:val="en-CA"/>
-              </w:rPr>
-            </w:pPr>
-            <w:r>
-              <w:rPr>
-                <w:sz w:val="16"/>
-                <w:szCs w:val="18"/>
-                <w:lang w:val="en-CA"/>
-              </w:rPr>
-              <w:lastRenderedPageBreak/>
+            <w:shd w:val="clear" w:color="auto" w:fill="D9F2D0" w:themeFill="accent6" w:themeFillTint="33"/>
+          </w:tcPr>
+          <w:p>
+            <w:pPr>
+              <w:rPr>
+                <w:rFonts w:hint="eastAsia"/>
+                <w:sz w:val="16"/>
+                <w:szCs w:val="18"/>
+                <w:lang w:val="en-CA"/>
+              </w:rPr>
+            </w:pPr>
+            <w:r>
+              <w:rPr>
+                <w:rFonts w:hint="eastAsia"/>
+                <w:sz w:val="16"/>
+                <w:szCs w:val="18"/>
+                <w:lang w:val="en-CA"/>
+              </w:rPr>
+              <w:t>G</w:t>
+            </w:r>
+            <w:r>
+              <w:rPr>
+                <w:sz w:val="16"/>
+                <w:szCs w:val="18"/>
+                <w:lang w:val="en-CA"/>
+              </w:rPr>
+              <w:t>raph.tsx, TorusMenuEditor.tsx</w:t>
+            </w:r>
+          </w:p>
+        </w:tc>
+        <w:tc>
+          <w:tcPr>
+            <w:tcW w:w="1985" w:type="dxa"/>
+            <w:shd w:val="clear" w:color="auto" w:fill="D9F2D0" w:themeFill="accent6" w:themeFillTint="33"/>
+          </w:tcPr>
+          <w:p>
+            <w:pPr>
+              <w:rPr>
+                <w:rFonts w:hint="eastAsia"/>
+                <w:sz w:val="16"/>
+                <w:szCs w:val="18"/>
+                <w:lang w:val="en-CA"/>
+              </w:rPr>
+            </w:pPr>
+            <w:r>
+              <w:rPr>
+                <w:rFonts w:hint="eastAsia"/>
+                <w:sz w:val="16"/>
+                <w:szCs w:val="18"/>
+                <w:lang w:val="en-CA"/>
+              </w:rPr>
+              <w:t>S</w:t>
+            </w:r>
+            <w:r>
+              <w:rPr>
+                <w:sz w:val="16"/>
+                <w:szCs w:val="18"/>
+                <w:lang w:val="en-CA"/>
+              </w:rPr>
+              <w:t>ettings: components: torus menu editor: graph: multiple anchor points #2</w:t>
+            </w:r>
+          </w:p>
+        </w:tc>
+        <w:tc>
+          <w:tcPr>
+            <w:tcW w:w="2410" w:type="dxa"/>
+            <w:shd w:val="clear" w:color="auto" w:fill="D9F2D0" w:themeFill="accent6" w:themeFillTint="33"/>
+          </w:tcPr>
+          <w:p>
+            <w:pPr>
+              <w:rPr>
+                <w:rFonts w:hint="eastAsia"/>
+                <w:sz w:val="16"/>
+                <w:szCs w:val="18"/>
+                <w:lang w:val="en-CA"/>
+              </w:rPr>
+            </w:pPr>
+            <w:r>
+              <w:rPr>
+                <w:rFonts w:hint="eastAsia"/>
+                <w:sz w:val="16"/>
+                <w:szCs w:val="18"/>
+                <w:lang w:val="en-CA"/>
+              </w:rPr>
+              <w:t>C</w:t>
+            </w:r>
+            <w:r>
+              <w:rPr>
+                <w:sz w:val="16"/>
+                <w:szCs w:val="18"/>
+                <w:lang w:val="en-CA"/>
+              </w:rPr>
+              <w:t xml:space="preserve">lick and drag a point and move it up and towards the beginning of the graph. </w:t>
+            </w:r>
+            <w:r>
+              <w:rPr>
+                <w:rFonts w:hint="eastAsia"/>
+                <w:sz w:val="16"/>
+                <w:szCs w:val="18"/>
+                <w:lang w:val="en-CA"/>
+              </w:rPr>
+              <w:t>A</w:t>
+            </w:r>
+            <w:r>
+              <w:rPr>
+                <w:sz w:val="16"/>
+                <w:szCs w:val="18"/>
+                <w:lang w:val="en-CA"/>
+              </w:rPr>
+              <w:t xml:space="preserve">fter that point, click and drag another point and bring it down. </w:t>
+            </w:r>
+            <w:r>
+              <w:rPr>
+                <w:rFonts w:hint="eastAsia"/>
+                <w:sz w:val="16"/>
+                <w:szCs w:val="18"/>
+                <w:lang w:val="en-CA"/>
+              </w:rPr>
+              <w:t>T</w:t>
+            </w:r>
+            <w:r>
+              <w:rPr>
+                <w:sz w:val="16"/>
+                <w:szCs w:val="18"/>
+                <w:lang w:val="en-CA"/>
+              </w:rPr>
+              <w:t>hen, click the open torus menu button (…)</w:t>
+            </w:r>
+          </w:p>
+        </w:tc>
+        <w:tc>
+          <w:tcPr>
+            <w:tcW w:w="3118" w:type="dxa"/>
+            <w:shd w:val="clear" w:color="auto" w:fill="D9F2D0" w:themeFill="accent6" w:themeFillTint="33"/>
+          </w:tcPr>
+          <w:p>
+            <w:pPr>
+              <w:rPr>
+                <w:rFonts w:hint="eastAsia"/>
+                <w:sz w:val="16"/>
+                <w:szCs w:val="18"/>
+                <w:lang w:val="en-CA"/>
+              </w:rPr>
+            </w:pPr>
+            <w:r>
+              <w:rPr>
+                <w:rFonts w:hint="eastAsia"/>
+                <w:sz w:val="16"/>
+                <w:szCs w:val="18"/>
+                <w:lang w:val="en-CA"/>
+              </w:rPr>
+              <w:t>T</w:t>
+            </w:r>
+            <w:r>
+              <w:rPr>
+                <w:sz w:val="16"/>
+                <w:szCs w:val="18"/>
+                <w:lang w:val="en-CA"/>
+              </w:rPr>
+              <w:t>he torus menu should quickly enlarge, then contract, then enlarge again</w:t>
+            </w:r>
+          </w:p>
+        </w:tc>
+        <w:tc>
+          <w:tcPr>
+            <w:tcW w:w="2410" w:type="dxa"/>
+            <w:shd w:val="clear" w:color="auto" w:fill="D9F2D0" w:themeFill="accent6" w:themeFillTint="33"/>
+          </w:tcPr>
+          <w:p>
+            <w:pPr>
+              <w:rPr>
+                <w:rFonts w:hint="eastAsia"/>
+                <w:sz w:val="16"/>
+                <w:szCs w:val="18"/>
+                <w:lang w:val="en-CA"/>
+              </w:rPr>
+            </w:pPr>
+            <w:r>
+              <w:rPr>
+                <w:rFonts w:hint="eastAsia"/>
+                <w:sz w:val="16"/>
+                <w:szCs w:val="18"/>
+                <w:lang w:val="en-CA"/>
+              </w:rPr>
+              <w:t>W</w:t>
+            </w:r>
+            <w:r>
+              <w:rPr>
+                <w:sz w:val="16"/>
+                <w:szCs w:val="18"/>
+                <w:lang w:val="en-CA"/>
+              </w:rPr>
+              <w:t>orks</w:t>
+            </w:r>
+            <w:r>
+              <w:rPr>
+                <w:sz w:val="16"/>
+                <w:szCs w:val="18"/>
+                <w:lang w:val="en-CA"/>
+              </w:rPr>
+              <w:t xml:space="preserve"> </w:t>
+            </w:r>
+            <w:r>
+              <w:rPr>
+                <w:sz w:val="16"/>
+                <w:szCs w:val="18"/>
+                <w:lang w:val="en-CA"/>
+              </w:rPr>
+              <w:t>5bddf836872611033759d627746d8b4161bba22a</w:t>
+            </w:r>
+          </w:p>
+        </w:tc>
+      </w:tr>
+      <w:tr>
+        <w:tc>
+          <w:tcPr>
+            <w:tcW w:w="1701" w:type="dxa"/>
+            <w:shd w:val="clear" w:color="auto" w:fill="D9F2D0" w:themeFill="accent6" w:themeFillTint="33"/>
+          </w:tcPr>
+          <w:p>
+            <w:pPr>
+              <w:rPr>
+                <w:rFonts w:hint="eastAsia"/>
+                <w:sz w:val="16"/>
+                <w:szCs w:val="18"/>
+                <w:lang w:val="en-CA"/>
+              </w:rPr>
+            </w:pPr>
+            <w:r>
+              <w:rPr>
+                <w:sz w:val="16"/>
+                <w:szCs w:val="18"/>
+                <w:lang w:val="en-CA"/>
+              </w:rPr>
               <w:t>TorusMenuEditor.tsx</w:t>
             </w:r>
           </w:p>
@@ -6616,6 +7492,7 @@
         <w:tc>
           <w:tcPr>
             <w:tcW w:w="1985" w:type="dxa"/>
+            <w:shd w:val="clear" w:color="auto" w:fill="D9F2D0" w:themeFill="accent6" w:themeFillTint="33"/>
           </w:tcPr>
           <w:p>
             <w:pPr>
@@ -6648,6 +7525,7 @@
         <w:tc>
           <w:tcPr>
             <w:tcW w:w="2410" w:type="dxa"/>
+            <w:shd w:val="clear" w:color="auto" w:fill="D9F2D0" w:themeFill="accent6" w:themeFillTint="33"/>
           </w:tcPr>
           <w:p>
             <w:pPr>
@@ -6757,6 +7635,7 @@
         <w:tc>
           <w:tcPr>
             <w:tcW w:w="3118" w:type="dxa"/>
+            <w:shd w:val="clear" w:color="auto" w:fill="D9F2D0" w:themeFill="accent6" w:themeFillTint="33"/>
           </w:tcPr>
           <w:p>
             <w:pPr>
@@ -6892,6 +7771,7 @@
         <w:tc>
           <w:tcPr>
             <w:tcW w:w="2410" w:type="dxa"/>
+            <w:shd w:val="clear" w:color="auto" w:fill="D9F2D0" w:themeFill="accent6" w:themeFillTint="33"/>
           </w:tcPr>
           <w:p>
             <w:pPr>
@@ -7160,7 +8040,16 @@
                 <w:szCs w:val="18"/>
                 <w:lang w:val="en-CA"/>
               </w:rPr>
-              <w:t>Settings: components: torus menu editor: graph: save state of ease handles #2</w:t>
+              <w:t xml:space="preserve">Settings: components: torus menu editor: graph: </w:t>
+            </w:r>
+            <w:r>
+              <w:rPr>
+                <w:sz w:val="16"/>
+                <w:szCs w:val="18"/>
+                <w:lang w:val="en-CA"/>
+              </w:rPr>
+              <w:lastRenderedPageBreak/>
+              <w:t>save state of ease handles #2</w:t>
             </w:r>
           </w:p>
         </w:tc>
@@ -7184,6 +8073,7 @@
                 <w:szCs w:val="18"/>
                 <w:lang w:val="en-CA"/>
               </w:rPr>
+              <w:lastRenderedPageBreak/>
               <w:t>O</w:t>
             </w:r>
             <w:r>
@@ -7209,7 +8099,16 @@
                 <w:szCs w:val="18"/>
                 <w:lang w:val="en-CA"/>
               </w:rPr>
-              <w:t xml:space="preserve">dd a bunch of anchor points and adjust all of the ease handles to a non-default or non-linear position. </w:t>
+              <w:t xml:space="preserve">dd a bunch of </w:t>
+            </w:r>
+            <w:r>
+              <w:rPr>
+                <w:sz w:val="16"/>
+                <w:szCs w:val="18"/>
+                <w:lang w:val="en-CA"/>
+              </w:rPr>
+              <w:lastRenderedPageBreak/>
+              <w:t xml:space="preserve">anchor points and adjust all of the ease handles to a non-default or non-linear position. </w:t>
             </w:r>
             <w:r>
               <w:rPr>
@@ -7250,6 +8149,7 @@
                 <w:szCs w:val="18"/>
                 <w:lang w:val="en-CA"/>
               </w:rPr>
+              <w:lastRenderedPageBreak/>
               <w:t>A</w:t>
             </w:r>
             <w:r>
@@ -7671,11 +8571,28 @@
             </w:pPr>
             <w:r>
               <w:rPr>
-                <w:sz w:val="16"/>
-                <w:szCs w:val="18"/>
-                <w:lang w:val="en-CA"/>
-              </w:rPr>
-              <w:t>5bddf836872611033759d627746d8b4161bba22a</w:t>
+                <w:rFonts w:hint="eastAsia"/>
+                <w:sz w:val="16"/>
+                <w:szCs w:val="18"/>
+                <w:lang w:val="en-CA"/>
+              </w:rPr>
+              <w:t>W</w:t>
+            </w:r>
+            <w:r>
+              <w:rPr>
+                <w:sz w:val="16"/>
+                <w:szCs w:val="18"/>
+                <w:lang w:val="en-CA"/>
+              </w:rPr>
+              <w:t xml:space="preserve">orks as of </w:t>
+            </w:r>
+            <w:r>
+              <w:rPr>
+                <w:sz w:val="16"/>
+                <w:szCs w:val="18"/>
+                <w:lang w:val="en-CA"/>
+              </w:rPr>
+              <w:t>317d68bbef40c3746b6ad4695dfd0c2682856f6e</w:t>
             </w:r>
           </w:p>
         </w:tc>
@@ -7913,7 +8830,6 @@
                 <w:szCs w:val="18"/>
                 <w:lang w:val="en-CA"/>
               </w:rPr>
-              <w:lastRenderedPageBreak/>
               <w:t>ColorPicker.tsx, Styles.tsx, App.tsx</w:t>
             </w:r>
           </w:p>
@@ -8531,7 +9447,16 @@
                 <w:szCs w:val="18"/>
                 <w:lang w:val="en-CA"/>
               </w:rPr>
-              <w:t>ry to type in a new hex code</w:t>
+              <w:t xml:space="preserve">ry to type in a new hex </w:t>
+            </w:r>
+            <w:r>
+              <w:rPr>
+                <w:sz w:val="16"/>
+                <w:szCs w:val="18"/>
+                <w:lang w:val="en-CA"/>
+              </w:rPr>
+              <w:lastRenderedPageBreak/>
+              <w:t>code</w:t>
             </w:r>
           </w:p>
         </w:tc>
@@ -8555,6 +9480,7 @@
                 <w:szCs w:val="18"/>
                 <w:lang w:val="en-CA"/>
               </w:rPr>
+              <w:lastRenderedPageBreak/>
               <w:t>Y</w:t>
             </w:r>
             <w:r>
@@ -8580,7 +9506,16 @@
                 <w:szCs w:val="18"/>
                 <w:lang w:val="en-CA"/>
               </w:rPr>
-              <w:t>fter you finished typing in your new hex code, the new color should update both in the color picker (the color wheel and the lightness slider) and in the color of the component that your editing</w:t>
+              <w:t xml:space="preserve">fter you finished typing in your new hex code, the new color should </w:t>
+            </w:r>
+            <w:r>
+              <w:rPr>
+                <w:sz w:val="16"/>
+                <w:szCs w:val="18"/>
+                <w:lang w:val="en-CA"/>
+              </w:rPr>
+              <w:lastRenderedPageBreak/>
+              <w:t>update both in the color picker (the color wheel and the lightness slider) and in the color of the component that your editing</w:t>
             </w:r>
           </w:p>
         </w:tc>
@@ -9184,16 +10119,7 @@
                 <w:szCs w:val="18"/>
                 <w:lang w:val="en-CA"/>
               </w:rPr>
-              <w:t xml:space="preserve">oast: “open multiple menus is disabled!” </w:t>
-            </w:r>
-            <w:r>
-              <w:rPr>
-                <w:sz w:val="16"/>
-                <w:szCs w:val="18"/>
-                <w:lang w:val="en-CA"/>
-              </w:rPr>
-              <w:lastRenderedPageBreak/>
-              <w:t>toast: correct positioning</w:t>
+              <w:t>oast: “open multiple menus is disabled!” toast: correct positioning</w:t>
             </w:r>
           </w:p>
         </w:tc>
@@ -9217,7 +10143,6 @@
                 <w:szCs w:val="18"/>
                 <w:lang w:val="en-CA"/>
               </w:rPr>
-              <w:lastRenderedPageBreak/>
               <w:t>T</w:t>
             </w:r>
             <w:r>
@@ -9226,16 +10151,7 @@
                 <w:szCs w:val="18"/>
                 <w:lang w:val="en-CA"/>
               </w:rPr>
-              <w:t xml:space="preserve">rigger the “open multiple menus is disabled!” toast by </w:t>
-            </w:r>
-            <w:r>
-              <w:rPr>
-                <w:sz w:val="16"/>
-                <w:szCs w:val="18"/>
-                <w:lang w:val="en-CA"/>
-              </w:rPr>
-              <w:lastRenderedPageBreak/>
-              <w:t xml:space="preserve">turning off allow open multiple menus and attempting to open multiple menus. </w:t>
+              <w:t xml:space="preserve">rigger the “open multiple menus is disabled!” toast by turning off allow open multiple menus and attempting to open multiple menus. </w:t>
             </w:r>
           </w:p>
         </w:tc>
@@ -9259,7 +10175,6 @@
                 <w:szCs w:val="18"/>
                 <w:lang w:val="en-CA"/>
               </w:rPr>
-              <w:lastRenderedPageBreak/>
               <w:t>T</w:t>
             </w:r>
             <w:r>
@@ -9268,16 +10183,7 @@
                 <w:szCs w:val="18"/>
                 <w:lang w:val="en-CA"/>
               </w:rPr>
-              <w:t xml:space="preserve">he toast should appear adjacent to the icon/button, and the arrow should be </w:t>
-            </w:r>
-            <w:r>
-              <w:rPr>
-                <w:sz w:val="16"/>
-                <w:szCs w:val="18"/>
-                <w:lang w:val="en-CA"/>
-              </w:rPr>
-              <w:lastRenderedPageBreak/>
-              <w:t>pointing at it</w:t>
+              <w:t>he toast should appear adjacent to the icon/button, and the arrow should be pointing at it</w:t>
             </w:r>
           </w:p>
         </w:tc>
@@ -9301,7 +10207,6 @@
                 <w:szCs w:val="18"/>
                 <w:lang w:val="en-CA"/>
               </w:rPr>
-              <w:lastRenderedPageBreak/>
               <w:t>N</w:t>
             </w:r>
             <w:r>
@@ -9318,16 +10223,7 @@
                 <w:szCs w:val="18"/>
                 <w:lang w:val="en-CA"/>
               </w:rPr>
-              <w:t>72353571f3d02393a601e5c151</w:t>
-            </w:r>
-            <w:r>
-              <w:rPr>
-                <w:sz w:val="16"/>
-                <w:szCs w:val="18"/>
-                <w:lang w:val="en-CA"/>
-              </w:rPr>
-              <w:lastRenderedPageBreak/>
-              <w:t>529df37aea6b30</w:t>
+              <w:t>72353571f3d02393a601e5c151529df37aea6b30</w:t>
             </w:r>
             <w:r>
               <w:rPr>
@@ -9378,7 +10274,6 @@
           <w:szCs w:val="32"/>
           <w:lang w:val="en-CA"/>
         </w:rPr>
-        <w:lastRenderedPageBreak/>
         <w:t>PlayneedleEditor.tsx</w:t>
       </w:r>
     </w:p>
@@ -10920,7 +11815,7 @@
   <w:style w:type="paragraph" w:default="1" w:styleId="a">
     <w:name w:val="Normal"/>
     <w:qFormat/>
-    <w:rsid w:val="00877AA3"/>
+    <w:rsid w:val="00497598"/>
     <w:pPr>
       <w:widowControl w:val="0"/>
     </w:pPr>

</xml_diff>

<commit_message>
fixed Settings: components: torus menu editor: graph: anchor/ease cursor hidden (cursor now hides when dragging ease handles or anchor points) also added a little sensitivity controller by scrolling your mouse up and down
</commit_message>
<xml_diff>
--- a/test plan.docx
+++ b/test plan.docx
@@ -7064,6 +7064,382 @@
           <w:p>
             <w:pPr>
               <w:rPr>
+                <w:sz w:val="16"/>
+                <w:szCs w:val="18"/>
+                <w:lang w:val="en-CA"/>
+              </w:rPr>
+            </w:pPr>
+            <w:r>
+              <w:rPr>
+                <w:rFonts w:hint="eastAsia"/>
+                <w:sz w:val="16"/>
+                <w:szCs w:val="18"/>
+                <w:lang w:val="en-CA"/>
+              </w:rPr>
+              <w:t>G</w:t>
+            </w:r>
+            <w:r>
+              <w:rPr>
+                <w:sz w:val="16"/>
+                <w:szCs w:val="18"/>
+                <w:lang w:val="en-CA"/>
+              </w:rPr>
+              <w:t>raph.tsx, sensitivity.ts</w:t>
+            </w:r>
+          </w:p>
+        </w:tc>
+        <w:tc>
+          <w:tcPr>
+            <w:tcW w:w="1985" w:type="dxa"/>
+            <w:shd w:val="clear" w:color="auto" w:fill="D9F2D0" w:themeFill="accent6" w:themeFillTint="33"/>
+          </w:tcPr>
+          <w:p>
+            <w:pPr>
+              <w:rPr>
+                <w:sz w:val="16"/>
+                <w:szCs w:val="18"/>
+                <w:lang w:val="en-CA"/>
+              </w:rPr>
+            </w:pPr>
+            <w:r>
+              <w:rPr>
+                <w:rFonts w:hint="eastAsia"/>
+                <w:sz w:val="16"/>
+                <w:szCs w:val="18"/>
+                <w:lang w:val="en-CA"/>
+              </w:rPr>
+              <w:t>S</w:t>
+            </w:r>
+            <w:r>
+              <w:rPr>
+                <w:sz w:val="16"/>
+                <w:szCs w:val="18"/>
+                <w:lang w:val="en-CA"/>
+              </w:rPr>
+              <w:t xml:space="preserve">ettings: components: torus menu editor: graph: </w:t>
+            </w:r>
+            <w:r>
+              <w:rPr>
+                <w:sz w:val="16"/>
+                <w:szCs w:val="18"/>
+                <w:lang w:val="en-CA"/>
+              </w:rPr>
+              <w:t xml:space="preserve">anchor/ease </w:t>
+            </w:r>
+            <w:r>
+              <w:rPr>
+                <w:sz w:val="16"/>
+                <w:szCs w:val="18"/>
+                <w:lang w:val="en-CA"/>
+              </w:rPr>
+              <w:t>cursor hidden</w:t>
+            </w:r>
+          </w:p>
+        </w:tc>
+        <w:tc>
+          <w:tcPr>
+            <w:tcW w:w="2410" w:type="dxa"/>
+            <w:shd w:val="clear" w:color="auto" w:fill="D9F2D0" w:themeFill="accent6" w:themeFillTint="33"/>
+          </w:tcPr>
+          <w:p>
+            <w:pPr>
+              <w:rPr>
+                <w:sz w:val="16"/>
+                <w:szCs w:val="18"/>
+                <w:lang w:val="en-CA"/>
+              </w:rPr>
+            </w:pPr>
+            <w:r>
+              <w:rPr>
+                <w:rFonts w:hint="eastAsia"/>
+                <w:sz w:val="16"/>
+                <w:szCs w:val="18"/>
+                <w:lang w:val="en-CA"/>
+              </w:rPr>
+              <w:t>D</w:t>
+            </w:r>
+            <w:r>
+              <w:rPr>
+                <w:sz w:val="16"/>
+                <w:szCs w:val="18"/>
+                <w:lang w:val="en-CA"/>
+              </w:rPr>
+              <w:t xml:space="preserve">rag the ease handle and anchor </w:t>
+            </w:r>
+            <w:r>
+              <w:rPr>
+                <w:sz w:val="16"/>
+                <w:szCs w:val="18"/>
+                <w:lang w:val="en-CA"/>
+              </w:rPr>
+              <w:t>points</w:t>
+            </w:r>
+          </w:p>
+        </w:tc>
+        <w:tc>
+          <w:tcPr>
+            <w:tcW w:w="3118" w:type="dxa"/>
+            <w:shd w:val="clear" w:color="auto" w:fill="D9F2D0" w:themeFill="accent6" w:themeFillTint="33"/>
+          </w:tcPr>
+          <w:p>
+            <w:pPr>
+              <w:rPr>
+                <w:sz w:val="16"/>
+                <w:szCs w:val="18"/>
+                <w:lang w:val="en-CA"/>
+              </w:rPr>
+            </w:pPr>
+            <w:r>
+              <w:rPr>
+                <w:rFonts w:hint="eastAsia"/>
+                <w:sz w:val="16"/>
+                <w:szCs w:val="18"/>
+                <w:lang w:val="en-CA"/>
+              </w:rPr>
+              <w:t>Y</w:t>
+            </w:r>
+            <w:r>
+              <w:rPr>
+                <w:sz w:val="16"/>
+                <w:szCs w:val="18"/>
+                <w:lang w:val="en-CA"/>
+              </w:rPr>
+              <w:t>our cursor should be hidden as you drag for both ease and anchors</w:t>
+            </w:r>
+          </w:p>
+        </w:tc>
+        <w:tc>
+          <w:tcPr>
+            <w:tcW w:w="2410" w:type="dxa"/>
+            <w:shd w:val="clear" w:color="auto" w:fill="D9F2D0" w:themeFill="accent6" w:themeFillTint="33"/>
+          </w:tcPr>
+          <w:p>
+            <w:pPr>
+              <w:rPr>
+                <w:sz w:val="16"/>
+                <w:szCs w:val="18"/>
+                <w:lang w:val="en-CA"/>
+              </w:rPr>
+            </w:pPr>
+            <w:r>
+              <w:rPr>
+                <w:rFonts w:hint="eastAsia"/>
+                <w:sz w:val="16"/>
+                <w:szCs w:val="18"/>
+                <w:lang w:val="en-CA"/>
+              </w:rPr>
+              <w:t>W</w:t>
+            </w:r>
+            <w:r>
+              <w:rPr>
+                <w:sz w:val="16"/>
+                <w:szCs w:val="18"/>
+                <w:lang w:val="en-CA"/>
+              </w:rPr>
+              <w:t xml:space="preserve">orks as of </w:t>
+            </w:r>
+            <w:r>
+              <w:rPr>
+                <w:sz w:val="16"/>
+                <w:szCs w:val="18"/>
+                <w:lang w:val="en-CA"/>
+              </w:rPr>
+              <w:t>778697675ce93244703b4e3b60df72550d490d55</w:t>
+            </w:r>
+            <w:r>
+              <w:rPr>
+                <w:sz w:val="16"/>
+                <w:szCs w:val="18"/>
+                <w:lang w:val="en-CA"/>
+              </w:rPr>
+              <w:t xml:space="preserve"> + 1</w:t>
+            </w:r>
+          </w:p>
+        </w:tc>
+      </w:tr>
+      <w:tr>
+        <w:tc>
+          <w:tcPr>
+            <w:tcW w:w="1701" w:type="dxa"/>
+          </w:tcPr>
+          <w:p>
+            <w:pPr>
+              <w:rPr>
+                <w:sz w:val="16"/>
+                <w:szCs w:val="18"/>
+                <w:lang w:val="en-CA"/>
+              </w:rPr>
+            </w:pPr>
+            <w:r>
+              <w:rPr>
+                <w:rFonts w:hint="eastAsia"/>
+                <w:sz w:val="16"/>
+                <w:szCs w:val="18"/>
+                <w:lang w:val="en-CA"/>
+              </w:rPr>
+              <w:t>G</w:t>
+            </w:r>
+            <w:r>
+              <w:rPr>
+                <w:sz w:val="16"/>
+                <w:szCs w:val="18"/>
+                <w:lang w:val="en-CA"/>
+              </w:rPr>
+              <w:t>raph.tsx, sensitivity.tsx</w:t>
+            </w:r>
+          </w:p>
+        </w:tc>
+        <w:tc>
+          <w:tcPr>
+            <w:tcW w:w="1985" w:type="dxa"/>
+          </w:tcPr>
+          <w:p>
+            <w:pPr>
+              <w:rPr>
+                <w:sz w:val="16"/>
+                <w:szCs w:val="18"/>
+                <w:lang w:val="en-CA"/>
+              </w:rPr>
+            </w:pPr>
+            <w:r>
+              <w:rPr>
+                <w:rFonts w:hint="eastAsia"/>
+                <w:sz w:val="16"/>
+                <w:szCs w:val="18"/>
+                <w:lang w:val="en-CA"/>
+              </w:rPr>
+              <w:t>S</w:t>
+            </w:r>
+            <w:r>
+              <w:rPr>
+                <w:sz w:val="16"/>
+                <w:szCs w:val="18"/>
+                <w:lang w:val="en-CA"/>
+              </w:rPr>
+              <w:t>ettings: components: torus menu editor: graph: anchor/ease cursor stays place</w:t>
+            </w:r>
+          </w:p>
+        </w:tc>
+        <w:tc>
+          <w:tcPr>
+            <w:tcW w:w="2410" w:type="dxa"/>
+          </w:tcPr>
+          <w:p>
+            <w:pPr>
+              <w:rPr>
+                <w:sz w:val="16"/>
+                <w:szCs w:val="18"/>
+                <w:lang w:val="en-CA"/>
+              </w:rPr>
+            </w:pPr>
+            <w:r>
+              <w:rPr>
+                <w:rFonts w:hint="eastAsia"/>
+                <w:sz w:val="16"/>
+                <w:szCs w:val="18"/>
+                <w:lang w:val="en-CA"/>
+              </w:rPr>
+              <w:t>D</w:t>
+            </w:r>
+            <w:r>
+              <w:rPr>
+                <w:sz w:val="16"/>
+                <w:szCs w:val="18"/>
+                <w:lang w:val="en-CA"/>
+              </w:rPr>
+              <w:t>rag the ease handles and anchor points</w:t>
+            </w:r>
+          </w:p>
+        </w:tc>
+        <w:tc>
+          <w:tcPr>
+            <w:tcW w:w="3118" w:type="dxa"/>
+          </w:tcPr>
+          <w:p>
+            <w:pPr>
+              <w:rPr>
+                <w:sz w:val="16"/>
+                <w:szCs w:val="18"/>
+                <w:lang w:val="en-CA"/>
+              </w:rPr>
+            </w:pPr>
+            <w:r>
+              <w:rPr>
+                <w:rFonts w:hint="eastAsia"/>
+                <w:sz w:val="16"/>
+                <w:szCs w:val="18"/>
+                <w:lang w:val="en-CA"/>
+              </w:rPr>
+              <w:t>O</w:t>
+            </w:r>
+            <w:r>
+              <w:rPr>
+                <w:sz w:val="16"/>
+                <w:szCs w:val="18"/>
+                <w:lang w:val="en-CA"/>
+              </w:rPr>
+              <w:t xml:space="preserve">nce you release, your cursor should be exactly where it was. </w:t>
+            </w:r>
+            <w:r>
+              <w:rPr>
+                <w:rFonts w:hint="eastAsia"/>
+                <w:sz w:val="16"/>
+                <w:szCs w:val="18"/>
+                <w:lang w:val="en-CA"/>
+              </w:rPr>
+              <w:t>I</w:t>
+            </w:r>
+            <w:r>
+              <w:rPr>
+                <w:sz w:val="16"/>
+                <w:szCs w:val="18"/>
+                <w:lang w:val="en-CA"/>
+              </w:rPr>
+              <w:t>t shouldn’t be off the screen somewhere.</w:t>
+            </w:r>
+          </w:p>
+        </w:tc>
+        <w:tc>
+          <w:tcPr>
+            <w:tcW w:w="2410" w:type="dxa"/>
+          </w:tcPr>
+          <w:p>
+            <w:pPr>
+              <w:rPr>
+                <w:sz w:val="16"/>
+                <w:szCs w:val="18"/>
+                <w:lang w:val="en-CA"/>
+              </w:rPr>
+            </w:pPr>
+            <w:r>
+              <w:rPr>
+                <w:rFonts w:hint="eastAsia"/>
+                <w:sz w:val="16"/>
+                <w:szCs w:val="18"/>
+                <w:lang w:val="en-CA"/>
+              </w:rPr>
+              <w:t>N</w:t>
+            </w:r>
+            <w:r>
+              <w:rPr>
+                <w:sz w:val="16"/>
+                <w:szCs w:val="18"/>
+                <w:lang w:val="en-CA"/>
+              </w:rPr>
+              <w:t>ot working</w:t>
+            </w:r>
+          </w:p>
+        </w:tc>
+      </w:tr>
+      <w:tr>
+        <w:tc>
+          <w:tcPr>
+            <w:tcW w:w="1701" w:type="dxa"/>
+            <w:shd w:val="clear" w:color="auto" w:fill="D9F2D0" w:themeFill="accent6" w:themeFillTint="33"/>
+          </w:tcPr>
+          <w:p>
+            <w:pPr>
+              <w:rPr>
                 <w:rFonts w:hint="eastAsia"/>
                 <w:sz w:val="16"/>
                 <w:szCs w:val="18"/>
@@ -7764,7 +8140,16 @@
                 <w:szCs w:val="18"/>
                 <w:lang w:val="en-CA"/>
               </w:rPr>
-              <w:t>he annular sectors should open anticlockwise fast when the delay slider is set to a small negative value, and they should open slowly when the delay slider is set to a large negative value.</w:t>
+              <w:t xml:space="preserve">he annular sectors should open anticlockwise fast when the delay slider is set to a small negative value, and they should open slowly when the delay slider is set to a large </w:t>
+            </w:r>
+            <w:r>
+              <w:rPr>
+                <w:sz w:val="16"/>
+                <w:szCs w:val="18"/>
+                <w:lang w:val="en-CA"/>
+              </w:rPr>
+              <w:lastRenderedPageBreak/>
+              <w:t>negative value.</w:t>
             </w:r>
           </w:p>
         </w:tc>
@@ -7789,6 +8174,7 @@
                 <w:szCs w:val="18"/>
                 <w:lang w:val="en-CA"/>
               </w:rPr>
+              <w:lastRenderedPageBreak/>
               <w:t>W</w:t>
             </w:r>
             <w:r>
@@ -8040,16 +8426,7 @@
                 <w:szCs w:val="18"/>
                 <w:lang w:val="en-CA"/>
               </w:rPr>
-              <w:t xml:space="preserve">Settings: components: torus menu editor: graph: </w:t>
-            </w:r>
-            <w:r>
-              <w:rPr>
-                <w:sz w:val="16"/>
-                <w:szCs w:val="18"/>
-                <w:lang w:val="en-CA"/>
-              </w:rPr>
-              <w:lastRenderedPageBreak/>
-              <w:t>save state of ease handles #2</w:t>
+              <w:t>Settings: components: torus menu editor: graph: save state of ease handles #2</w:t>
             </w:r>
           </w:p>
         </w:tc>
@@ -8073,7 +8450,6 @@
                 <w:szCs w:val="18"/>
                 <w:lang w:val="en-CA"/>
               </w:rPr>
-              <w:lastRenderedPageBreak/>
               <w:t>O</w:t>
             </w:r>
             <w:r>
@@ -8099,16 +8475,7 @@
                 <w:szCs w:val="18"/>
                 <w:lang w:val="en-CA"/>
               </w:rPr>
-              <w:t xml:space="preserve">dd a bunch of </w:t>
-            </w:r>
-            <w:r>
-              <w:rPr>
-                <w:sz w:val="16"/>
-                <w:szCs w:val="18"/>
-                <w:lang w:val="en-CA"/>
-              </w:rPr>
-              <w:lastRenderedPageBreak/>
-              <w:t xml:space="preserve">anchor points and adjust all of the ease handles to a non-default or non-linear position. </w:t>
+              <w:t xml:space="preserve">dd a bunch of anchor points and adjust all of the ease handles to a non-default or non-linear position. </w:t>
             </w:r>
             <w:r>
               <w:rPr>
@@ -8149,7 +8516,6 @@
                 <w:szCs w:val="18"/>
                 <w:lang w:val="en-CA"/>
               </w:rPr>
-              <w:lastRenderedPageBreak/>
               <w:t>A</w:t>
             </w:r>
             <w:r>
@@ -9204,6 +9570,7 @@
                 <w:szCs w:val="18"/>
                 <w:lang w:val="en-CA"/>
               </w:rPr>
+              <w:lastRenderedPageBreak/>
               <w:t>C</w:t>
             </w:r>
             <w:r>
@@ -9241,6 +9608,7 @@
                 <w:szCs w:val="18"/>
                 <w:lang w:val="en-CA"/>
               </w:rPr>
+              <w:lastRenderedPageBreak/>
               <w:t>T</w:t>
             </w:r>
             <w:r>
@@ -9249,7 +9617,16 @@
                 <w:szCs w:val="18"/>
                 <w:lang w:val="en-CA"/>
               </w:rPr>
-              <w:t>he first test should create a new reset button next to the color rectangle</w:t>
+              <w:t xml:space="preserve">he first test should create a new reset button next to the color </w:t>
+            </w:r>
+            <w:r>
+              <w:rPr>
+                <w:sz w:val="16"/>
+                <w:szCs w:val="18"/>
+                <w:lang w:val="en-CA"/>
+              </w:rPr>
+              <w:lastRenderedPageBreak/>
+              <w:t>rectangle</w:t>
             </w:r>
           </w:p>
           <w:p>
@@ -9305,6 +9682,7 @@
                 <w:szCs w:val="18"/>
                 <w:lang w:val="en-CA"/>
               </w:rPr>
+              <w:lastRenderedPageBreak/>
               <w:t>W</w:t>
             </w:r>
             <w:r>
@@ -9321,7 +9699,16 @@
                 <w:szCs w:val="18"/>
                 <w:lang w:val="en-CA"/>
               </w:rPr>
-              <w:t>5bddf836872611033759d627746d8b4161bba22a</w:t>
+              <w:t>5bddf836872611033759d62774</w:t>
+            </w:r>
+            <w:r>
+              <w:rPr>
+                <w:sz w:val="16"/>
+                <w:szCs w:val="18"/>
+                <w:lang w:val="en-CA"/>
+              </w:rPr>
+              <w:lastRenderedPageBreak/>
+              <w:t>6d8b4161bba22a</w:t>
             </w:r>
           </w:p>
         </w:tc>
@@ -9447,16 +9834,7 @@
                 <w:szCs w:val="18"/>
                 <w:lang w:val="en-CA"/>
               </w:rPr>
-              <w:t xml:space="preserve">ry to type in a new hex </w:t>
-            </w:r>
-            <w:r>
-              <w:rPr>
-                <w:sz w:val="16"/>
-                <w:szCs w:val="18"/>
-                <w:lang w:val="en-CA"/>
-              </w:rPr>
-              <w:lastRenderedPageBreak/>
-              <w:t>code</w:t>
+              <w:t>ry to type in a new hex code</w:t>
             </w:r>
           </w:p>
         </w:tc>
@@ -9480,7 +9858,6 @@
                 <w:szCs w:val="18"/>
                 <w:lang w:val="en-CA"/>
               </w:rPr>
-              <w:lastRenderedPageBreak/>
               <w:t>Y</w:t>
             </w:r>
             <w:r>
@@ -9506,16 +9883,7 @@
                 <w:szCs w:val="18"/>
                 <w:lang w:val="en-CA"/>
               </w:rPr>
-              <w:t xml:space="preserve">fter you finished typing in your new hex code, the new color should </w:t>
-            </w:r>
-            <w:r>
-              <w:rPr>
-                <w:sz w:val="16"/>
-                <w:szCs w:val="18"/>
-                <w:lang w:val="en-CA"/>
-              </w:rPr>
-              <w:lastRenderedPageBreak/>
-              <w:t>update both in the color picker (the color wheel and the lightness slider) and in the color of the component that your editing</w:t>
+              <w:t>fter you finished typing in your new hex code, the new color should update both in the color picker (the color wheel and the lightness slider) and in the color of the component that your editing</w:t>
             </w:r>
           </w:p>
         </w:tc>

</xml_diff>

<commit_message>
re-fixed Settings: components: torus menu editor: graph: ease handle hitbox: ease handle now hides the cursor, locks it, has 1.5x sensitivity increment/decrement, and the hitbox is comfortably large. this applies to dragging ease handles and anchor points
</commit_message>
<xml_diff>
--- a/test plan.docx
+++ b/test plan.docx
@@ -438,7 +438,6 @@
           <w:lang w:val="en-CA"/>
         </w:rPr>
       </w:pPr>
-      <w:proofErr w:type="spellStart"/>
       <w:r>
         <w:rPr>
           <w:rFonts w:hint="eastAsia"/>
@@ -460,7 +459,6 @@
         </w:rPr>
         <w:t>ain.cjs</w:t>
       </w:r>
-      <w:proofErr w:type="spellEnd"/>
     </w:p>
     <w:tbl>
       <w:tblPr>
@@ -655,7 +653,6 @@
                 <w:lang w:val="en-CA"/>
               </w:rPr>
             </w:pPr>
-            <w:proofErr w:type="spellStart"/>
             <w:r>
               <w:rPr>
                 <w:rFonts w:hint="eastAsia"/>
@@ -673,7 +670,6 @@
               </w:rPr>
               <w:t>ain.cjs</w:t>
             </w:r>
-            <w:proofErr w:type="spellEnd"/>
           </w:p>
         </w:tc>
         <w:tc>
@@ -704,18 +700,8 @@
                 <w:szCs w:val="18"/>
                 <w:lang w:val="en-CA"/>
               </w:rPr>
-              <w:t xml:space="preserve">lectron: top </w:t>
-            </w:r>
-            <w:proofErr w:type="spellStart"/>
-            <w:r>
-              <w:rPr>
-                <w:sz w:val="16"/>
-                <w:szCs w:val="18"/>
-                <w:lang w:val="en-CA"/>
-              </w:rPr>
-              <w:t>dashbar</w:t>
-            </w:r>
-            <w:proofErr w:type="spellEnd"/>
+              <w:t>lectron: top dashbar</w:t>
+            </w:r>
           </w:p>
         </w:tc>
         <w:tc>
@@ -746,25 +732,7 @@
                 <w:szCs w:val="18"/>
                 <w:lang w:val="en-CA"/>
               </w:rPr>
-              <w:t xml:space="preserve">rag an empty space in the top </w:t>
-            </w:r>
-            <w:proofErr w:type="spellStart"/>
-            <w:r>
-              <w:rPr>
-                <w:sz w:val="16"/>
-                <w:szCs w:val="18"/>
-                <w:lang w:val="en-CA"/>
-              </w:rPr>
-              <w:t>dashbar</w:t>
-            </w:r>
-            <w:proofErr w:type="spellEnd"/>
-            <w:r>
-              <w:rPr>
-                <w:sz w:val="16"/>
-                <w:szCs w:val="18"/>
-                <w:lang w:val="en-CA"/>
-              </w:rPr>
-              <w:t xml:space="preserve"> in electron</w:t>
+              <w:t>rag an empty space in the top dashbar in electron</w:t>
             </w:r>
           </w:p>
         </w:tc>
@@ -830,7 +798,6 @@
                 <w:lang w:val="en-CA"/>
               </w:rPr>
             </w:pPr>
-            <w:proofErr w:type="spellStart"/>
             <w:r>
               <w:rPr>
                 <w:rFonts w:hint="eastAsia"/>
@@ -848,7 +815,6 @@
               </w:rPr>
               <w:t>ain.cjs</w:t>
             </w:r>
-            <w:proofErr w:type="spellEnd"/>
           </w:p>
         </w:tc>
         <w:tc>
@@ -911,25 +877,7 @@
                 <w:szCs w:val="18"/>
                 <w:lang w:val="en-CA"/>
               </w:rPr>
-              <w:t xml:space="preserve">over over the </w:t>
-            </w:r>
-            <w:proofErr w:type="spellStart"/>
-            <w:r>
-              <w:rPr>
-                <w:sz w:val="16"/>
-                <w:szCs w:val="18"/>
-                <w:lang w:val="en-CA"/>
-              </w:rPr>
-              <w:t>dashbar</w:t>
-            </w:r>
-            <w:proofErr w:type="spellEnd"/>
-            <w:r>
-              <w:rPr>
-                <w:sz w:val="16"/>
-                <w:szCs w:val="18"/>
-                <w:lang w:val="en-CA"/>
-              </w:rPr>
-              <w:t xml:space="preserve"> buttons</w:t>
+              <w:t>over over the dashbar buttons</w:t>
             </w:r>
           </w:p>
         </w:tc>
@@ -961,25 +909,7 @@
                 <w:szCs w:val="18"/>
                 <w:lang w:val="en-CA"/>
               </w:rPr>
-              <w:t xml:space="preserve">hey should </w:t>
-            </w:r>
-            <w:proofErr w:type="gramStart"/>
-            <w:r>
-              <w:rPr>
-                <w:sz w:val="16"/>
-                <w:szCs w:val="18"/>
-                <w:lang w:val="en-CA"/>
-              </w:rPr>
-              <w:t>grow in size</w:t>
-            </w:r>
-            <w:proofErr w:type="gramEnd"/>
-            <w:r>
-              <w:rPr>
-                <w:sz w:val="16"/>
-                <w:szCs w:val="18"/>
-                <w:lang w:val="en-CA"/>
-              </w:rPr>
-              <w:t xml:space="preserve"> and glow</w:t>
+              <w:t>hey should grow in size and glow</w:t>
             </w:r>
           </w:p>
         </w:tc>
@@ -1013,7 +943,6 @@
                 <w:lang w:val="en-CA"/>
               </w:rPr>
             </w:pPr>
-            <w:proofErr w:type="spellStart"/>
             <w:r>
               <w:rPr>
                 <w:rFonts w:hint="eastAsia"/>
@@ -1031,7 +960,6 @@
               </w:rPr>
               <w:t>ain.cjs</w:t>
             </w:r>
-            <w:proofErr w:type="spellEnd"/>
           </w:p>
         </w:tc>
         <w:tc>
@@ -1181,7 +1109,6 @@
           <w:lang w:val="en-CA"/>
         </w:rPr>
       </w:pPr>
-      <w:proofErr w:type="spellStart"/>
       <w:r>
         <w:rPr>
           <w:rFonts w:hint="eastAsia"/>
@@ -1203,7 +1130,6 @@
         </w:rPr>
         <w:t>pp.tsx</w:t>
       </w:r>
-      <w:proofErr w:type="spellEnd"/>
     </w:p>
     <w:tbl>
       <w:tblPr>
@@ -1399,23 +1325,13 @@
                 <w:lang w:val="en-CA"/>
               </w:rPr>
             </w:pPr>
-            <w:proofErr w:type="spellStart"/>
-            <w:r>
-              <w:rPr>
-                <w:sz w:val="16"/>
-                <w:szCs w:val="18"/>
-                <w:lang w:val="en-CA"/>
-              </w:rPr>
-              <w:t>settings.tsx</w:t>
-            </w:r>
-            <w:proofErr w:type="spellEnd"/>
-            <w:r>
-              <w:rPr>
-                <w:sz w:val="16"/>
-                <w:szCs w:val="18"/>
-                <w:lang w:val="en-CA"/>
-              </w:rPr>
-              <w:t>,</w:t>
+            <w:r>
+              <w:rPr>
+                <w:sz w:val="16"/>
+                <w:szCs w:val="18"/>
+                <w:lang w:val="en-CA"/>
+              </w:rPr>
+              <w:t>settings.tsx,</w:t>
             </w:r>
             <w:r>
               <w:rPr>
@@ -1425,7 +1341,6 @@
               </w:rPr>
               <w:t xml:space="preserve"> </w:t>
             </w:r>
-            <w:proofErr w:type="spellStart"/>
             <w:r>
               <w:rPr>
                 <w:sz w:val="16"/>
@@ -1434,7 +1349,6 @@
               </w:rPr>
               <w:t>DraggableModal.tsx</w:t>
             </w:r>
-            <w:proofErr w:type="spellEnd"/>
           </w:p>
         </w:tc>
         <w:tc>
@@ -1451,23 +1365,13 @@
                 <w:lang w:val="en-CA"/>
               </w:rPr>
             </w:pPr>
-            <w:proofErr w:type="spellStart"/>
-            <w:r>
-              <w:rPr>
-                <w:sz w:val="16"/>
-                <w:szCs w:val="18"/>
-                <w:lang w:val="en-CA"/>
-              </w:rPr>
-              <w:t>DraggableModal</w:t>
-            </w:r>
-            <w:proofErr w:type="spellEnd"/>
-            <w:r>
-              <w:rPr>
-                <w:sz w:val="16"/>
-                <w:szCs w:val="18"/>
-                <w:lang w:val="en-CA"/>
-              </w:rPr>
-              <w:t>:</w:t>
+            <w:r>
+              <w:rPr>
+                <w:sz w:val="16"/>
+                <w:szCs w:val="18"/>
+                <w:lang w:val="en-CA"/>
+              </w:rPr>
+              <w:t>DraggableModal:</w:t>
             </w:r>
             <w:r>
               <w:rPr>
@@ -1652,25 +1556,14 @@
                 <w:lang w:val="en-CA"/>
               </w:rPr>
             </w:pPr>
-            <w:proofErr w:type="spellStart"/>
-            <w:r>
-              <w:rPr>
-                <w:sz w:val="16"/>
-                <w:szCs w:val="18"/>
-                <w:lang w:val="en-CA"/>
-              </w:rPr>
-              <w:t>styles.tsx</w:t>
-            </w:r>
-            <w:proofErr w:type="spellEnd"/>
-            <w:r>
-              <w:rPr>
-                <w:sz w:val="16"/>
-                <w:szCs w:val="18"/>
-                <w:lang w:val="en-CA"/>
-              </w:rPr>
-              <w:t xml:space="preserve">. </w:t>
-            </w:r>
-            <w:proofErr w:type="spellStart"/>
+            <w:r>
+              <w:rPr>
+                <w:sz w:val="16"/>
+                <w:szCs w:val="18"/>
+                <w:lang w:val="en-CA"/>
+              </w:rPr>
+              <w:t xml:space="preserve">styles.tsx. </w:t>
+            </w:r>
             <w:r>
               <w:rPr>
                 <w:sz w:val="16"/>
@@ -1679,7 +1572,6 @@
               </w:rPr>
               <w:t>DraggableModal.tsx</w:t>
             </w:r>
-            <w:proofErr w:type="spellEnd"/>
           </w:p>
         </w:tc>
         <w:tc>
@@ -1696,23 +1588,13 @@
                 <w:lang w:val="en-CA"/>
               </w:rPr>
             </w:pPr>
-            <w:proofErr w:type="spellStart"/>
-            <w:r>
-              <w:rPr>
-                <w:sz w:val="16"/>
-                <w:szCs w:val="18"/>
-                <w:lang w:val="en-CA"/>
-              </w:rPr>
-              <w:t>DraggableModal</w:t>
-            </w:r>
-            <w:proofErr w:type="spellEnd"/>
-            <w:r>
-              <w:rPr>
-                <w:sz w:val="16"/>
-                <w:szCs w:val="18"/>
-                <w:lang w:val="en-CA"/>
-              </w:rPr>
-              <w:t>: remember the page state next time you open it (#2 styles)</w:t>
+            <w:r>
+              <w:rPr>
+                <w:sz w:val="16"/>
+                <w:szCs w:val="18"/>
+                <w:lang w:val="en-CA"/>
+              </w:rPr>
+              <w:t>DraggableModal: remember the page state next time you open it (#2 styles)</w:t>
             </w:r>
           </w:p>
         </w:tc>
@@ -1856,51 +1738,22 @@
               </w:rPr>
               <w:t xml:space="preserve">THE FIX: deleted </w:t>
             </w:r>
-            <w:proofErr w:type="spellStart"/>
-            <w:r>
-              <w:rPr>
-                <w:sz w:val="16"/>
-                <w:szCs w:val="18"/>
-                <w:lang w:val="en-CA"/>
-              </w:rPr>
-              <w:t>setStylePage</w:t>
-            </w:r>
-            <w:proofErr w:type="spellEnd"/>
-            <w:r>
-              <w:rPr>
-                <w:sz w:val="16"/>
-                <w:szCs w:val="18"/>
-                <w:lang w:val="en-CA"/>
-              </w:rPr>
-              <w:t>(null);</w:t>
-            </w:r>
-            <w:r>
-              <w:rPr>
-                <w:sz w:val="16"/>
-                <w:szCs w:val="18"/>
-                <w:lang w:val="en-CA"/>
-              </w:rPr>
-              <w:t xml:space="preserve"> on line 181 in </w:t>
-            </w:r>
-            <w:proofErr w:type="spellStart"/>
-            <w:r>
-              <w:rPr>
-                <w:sz w:val="16"/>
-                <w:szCs w:val="18"/>
-                <w:lang w:val="en-CA"/>
-              </w:rPr>
-              <w:t>styles.tsx</w:t>
-            </w:r>
-            <w:proofErr w:type="spellEnd"/>
-            <w:r>
-              <w:rPr>
-                <w:sz w:val="16"/>
-                <w:szCs w:val="18"/>
-                <w:lang w:val="en-CA"/>
-              </w:rPr>
-              <w:t xml:space="preserve"> to </w:t>
-            </w:r>
-            <w:proofErr w:type="spellStart"/>
+            <w:r>
+              <w:rPr>
+                <w:sz w:val="16"/>
+                <w:szCs w:val="18"/>
+                <w:lang w:val="en-CA"/>
+              </w:rPr>
+              <w:t>setStylePage(null);</w:t>
+            </w:r>
+            <w:r>
+              <w:rPr>
+                <w:sz w:val="16"/>
+                <w:szCs w:val="18"/>
+                <w:lang w:val="en-CA"/>
+              </w:rPr>
+              <w:t xml:space="preserve"> on line 181 in styles.tsx to </w:t>
+            </w:r>
             <w:r>
               <w:rPr>
                 <w:i/>
@@ -1910,64 +1763,20 @@
               </w:rPr>
               <w:t>onClose</w:t>
             </w:r>
-            <w:proofErr w:type="spellEnd"/>
-            <w:proofErr w:type="gramStart"/>
-            <w:r>
-              <w:rPr>
-                <w:sz w:val="16"/>
-                <w:szCs w:val="18"/>
-              </w:rPr>
-              <w:t>={</w:t>
-            </w:r>
-            <w:proofErr w:type="gramEnd"/>
-            <w:r>
-              <w:rPr>
-                <w:sz w:val="16"/>
-                <w:szCs w:val="18"/>
-              </w:rPr>
-              <w:t xml:space="preserve">() =&gt; </w:t>
-            </w:r>
-            <w:proofErr w:type="gramStart"/>
-            <w:r>
-              <w:rPr>
-                <w:sz w:val="16"/>
-                <w:szCs w:val="18"/>
-              </w:rPr>
-              <w:t xml:space="preserve">{ </w:t>
-            </w:r>
-            <w:proofErr w:type="spellStart"/>
-            <w:r>
-              <w:rPr>
-                <w:sz w:val="16"/>
-                <w:szCs w:val="18"/>
-              </w:rPr>
-              <w:t>modalManager.close</w:t>
-            </w:r>
-            <w:proofErr w:type="spellEnd"/>
-            <w:proofErr w:type="gramEnd"/>
-            <w:r>
-              <w:rPr>
-                <w:sz w:val="16"/>
-                <w:szCs w:val="18"/>
-              </w:rPr>
-              <w:t xml:space="preserve">('styles'); </w:t>
-            </w:r>
-            <w:proofErr w:type="spellStart"/>
+            <w:r>
+              <w:rPr>
+                <w:sz w:val="16"/>
+                <w:szCs w:val="18"/>
+              </w:rPr>
+              <w:t xml:space="preserve">={() =&gt; { modalManager.close('styles'); </w:t>
+            </w:r>
             <w:r>
               <w:rPr>
                 <w:sz w:val="16"/>
                 <w:szCs w:val="18"/>
               </w:rPr>
               <w:lastRenderedPageBreak/>
-              <w:t>setShowStyle</w:t>
-            </w:r>
-            <w:proofErr w:type="spellEnd"/>
-            <w:r>
-              <w:rPr>
-                <w:sz w:val="16"/>
-                <w:szCs w:val="18"/>
-              </w:rPr>
-              <w:t>(</w:t>
+              <w:t>setShowStyle(</w:t>
             </w:r>
             <w:r>
               <w:rPr>
@@ -2074,7 +1883,6 @@
           <w:lang w:val="en-CA"/>
         </w:rPr>
       </w:pPr>
-      <w:proofErr w:type="spellStart"/>
       <w:r>
         <w:rPr>
           <w:rFonts w:hint="eastAsia"/>
@@ -2096,7 +1904,6 @@
         </w:rPr>
         <w:t>ettings.tsx</w:t>
       </w:r>
-      <w:proofErr w:type="spellEnd"/>
       <w:r>
         <w:rPr>
           <w:b/>
@@ -2309,7 +2116,6 @@
                 <w:lang w:val="en-CA"/>
               </w:rPr>
             </w:pPr>
-            <w:proofErr w:type="spellStart"/>
             <w:r>
               <w:rPr>
                 <w:sz w:val="16"/>
@@ -2318,7 +2124,6 @@
               </w:rPr>
               <w:t>Settings.tsx</w:t>
             </w:r>
-            <w:proofErr w:type="spellEnd"/>
           </w:p>
         </w:tc>
         <w:tc>
@@ -2445,25 +2250,7 @@
                 <w:szCs w:val="18"/>
                 <w:lang w:val="en-CA"/>
               </w:rPr>
-              <w:t xml:space="preserve">he </w:t>
-            </w:r>
-            <w:proofErr w:type="spellStart"/>
-            <w:r>
-              <w:rPr>
-                <w:sz w:val="16"/>
-                <w:szCs w:val="18"/>
-                <w:lang w:val="en-CA"/>
-              </w:rPr>
-              <w:t>keybind</w:t>
-            </w:r>
-            <w:proofErr w:type="spellEnd"/>
-            <w:r>
-              <w:rPr>
-                <w:sz w:val="16"/>
-                <w:szCs w:val="18"/>
-                <w:lang w:val="en-CA"/>
-              </w:rPr>
-              <w:t xml:space="preserve"> box keeps registering your keys until you click away from the box. </w:t>
+              <w:t xml:space="preserve">he keybind box keeps registering your keys until you click away from the box. </w:t>
             </w:r>
             <w:r>
               <w:rPr>
@@ -2480,61 +2267,7 @@
                 <w:szCs w:val="18"/>
                 <w:lang w:val="en-CA"/>
               </w:rPr>
-              <w:t xml:space="preserve">his behavior may be ambiguous to users because there’s no visual indicator as to which </w:t>
-            </w:r>
-            <w:proofErr w:type="spellStart"/>
-            <w:r>
-              <w:rPr>
-                <w:sz w:val="16"/>
-                <w:szCs w:val="18"/>
-                <w:lang w:val="en-CA"/>
-              </w:rPr>
-              <w:t>keybind</w:t>
-            </w:r>
-            <w:proofErr w:type="spellEnd"/>
-            <w:r>
-              <w:rPr>
-                <w:sz w:val="16"/>
-                <w:szCs w:val="18"/>
-                <w:lang w:val="en-CA"/>
-              </w:rPr>
-              <w:t xml:space="preserve"> box is selected or that you </w:t>
-            </w:r>
-            <w:proofErr w:type="gramStart"/>
-            <w:r>
-              <w:rPr>
-                <w:sz w:val="16"/>
-                <w:szCs w:val="18"/>
-                <w:lang w:val="en-CA"/>
-              </w:rPr>
-              <w:t>have to</w:t>
-            </w:r>
-            <w:proofErr w:type="gramEnd"/>
-            <w:r>
-              <w:rPr>
-                <w:sz w:val="16"/>
-                <w:szCs w:val="18"/>
-                <w:lang w:val="en-CA"/>
-              </w:rPr>
-              <w:t xml:space="preserve"> click away to apply the </w:t>
-            </w:r>
-            <w:proofErr w:type="spellStart"/>
-            <w:r>
-              <w:rPr>
-                <w:sz w:val="16"/>
-                <w:szCs w:val="18"/>
-                <w:lang w:val="en-CA"/>
-              </w:rPr>
-              <w:t>keybind</w:t>
-            </w:r>
-            <w:proofErr w:type="spellEnd"/>
-            <w:r>
-              <w:rPr>
-                <w:sz w:val="16"/>
-                <w:szCs w:val="18"/>
-                <w:lang w:val="en-CA"/>
-              </w:rPr>
-              <w:t xml:space="preserve">. </w:t>
+              <w:t xml:space="preserve">his behavior may be ambiguous to users because there’s no visual indicator as to which keybind box is selected or that you have to click away to apply the keybind. </w:t>
             </w:r>
             <w:r>
               <w:rPr>
@@ -2551,25 +2284,7 @@
                 <w:szCs w:val="18"/>
                 <w:lang w:val="en-CA"/>
               </w:rPr>
-              <w:t xml:space="preserve">ither add a visual indicator or accept the </w:t>
-            </w:r>
-            <w:proofErr w:type="spellStart"/>
-            <w:r>
-              <w:rPr>
-                <w:sz w:val="16"/>
-                <w:szCs w:val="18"/>
-                <w:lang w:val="en-CA"/>
-              </w:rPr>
-              <w:t>keybind</w:t>
-            </w:r>
-            <w:proofErr w:type="spellEnd"/>
-            <w:r>
-              <w:rPr>
-                <w:sz w:val="16"/>
-                <w:szCs w:val="18"/>
-                <w:lang w:val="en-CA"/>
-              </w:rPr>
-              <w:t xml:space="preserve"> after 1 keypress.</w:t>
+              <w:t>ither add a visual indicator or accept the keybind after 1 keypress.</w:t>
             </w:r>
           </w:p>
         </w:tc>
@@ -2589,7 +2304,6 @@
                 <w:lang w:val="en-CA"/>
               </w:rPr>
             </w:pPr>
-            <w:proofErr w:type="spellStart"/>
             <w:r>
               <w:rPr>
                 <w:rFonts w:hint="eastAsia"/>
@@ -2607,7 +2321,6 @@
               </w:rPr>
               <w:t>ettings.tsx</w:t>
             </w:r>
-            <w:proofErr w:type="spellEnd"/>
           </w:p>
         </w:tc>
         <w:tc>
@@ -2705,25 +2418,7 @@
                 <w:szCs w:val="18"/>
                 <w:lang w:val="en-CA"/>
               </w:rPr>
-              <w:t xml:space="preserve">ny modified </w:t>
-            </w:r>
-            <w:proofErr w:type="spellStart"/>
-            <w:r>
-              <w:rPr>
-                <w:sz w:val="16"/>
-                <w:szCs w:val="18"/>
-                <w:lang w:val="en-CA"/>
-              </w:rPr>
-              <w:t>keybinds</w:t>
-            </w:r>
-            <w:proofErr w:type="spellEnd"/>
-            <w:r>
-              <w:rPr>
-                <w:sz w:val="16"/>
-                <w:szCs w:val="18"/>
-                <w:lang w:val="en-CA"/>
-              </w:rPr>
-              <w:t xml:space="preserve"> should reset to default. </w:t>
+              <w:t xml:space="preserve">ny modified keybinds should reset to default. </w:t>
             </w:r>
             <w:r>
               <w:rPr>
@@ -2740,25 +2435,7 @@
                 <w:szCs w:val="18"/>
                 <w:lang w:val="en-CA"/>
               </w:rPr>
-              <w:t xml:space="preserve">ny non default additional </w:t>
-            </w:r>
-            <w:proofErr w:type="spellStart"/>
-            <w:r>
-              <w:rPr>
-                <w:sz w:val="16"/>
-                <w:szCs w:val="18"/>
-                <w:lang w:val="en-CA"/>
-              </w:rPr>
-              <w:t>keybinds</w:t>
-            </w:r>
-            <w:proofErr w:type="spellEnd"/>
-            <w:r>
-              <w:rPr>
-                <w:sz w:val="16"/>
-                <w:szCs w:val="18"/>
-                <w:lang w:val="en-CA"/>
-              </w:rPr>
-              <w:t xml:space="preserve"> should be gone. </w:t>
+              <w:t xml:space="preserve">ny non default additional keybinds should be gone. </w:t>
             </w:r>
             <w:r>
               <w:rPr>
@@ -2775,25 +2452,7 @@
                 <w:szCs w:val="18"/>
                 <w:lang w:val="en-CA"/>
               </w:rPr>
-              <w:t xml:space="preserve">ny removed </w:t>
-            </w:r>
-            <w:proofErr w:type="spellStart"/>
-            <w:r>
-              <w:rPr>
-                <w:sz w:val="16"/>
-                <w:szCs w:val="18"/>
-                <w:lang w:val="en-CA"/>
-              </w:rPr>
-              <w:t>keybinds</w:t>
-            </w:r>
-            <w:proofErr w:type="spellEnd"/>
-            <w:r>
-              <w:rPr>
-                <w:sz w:val="16"/>
-                <w:szCs w:val="18"/>
-                <w:lang w:val="en-CA"/>
-              </w:rPr>
-              <w:t xml:space="preserve"> from the default setting should be added back</w:t>
+              <w:t>ny removed keybinds from the default setting should be added back</w:t>
             </w:r>
           </w:p>
         </w:tc>
@@ -2837,7 +2496,6 @@
                 <w:lang w:val="en-CA"/>
               </w:rPr>
             </w:pPr>
-            <w:proofErr w:type="spellStart"/>
             <w:r>
               <w:rPr>
                 <w:rFonts w:hint="eastAsia"/>
@@ -2855,7 +2513,6 @@
               </w:rPr>
               <w:t>ettings.tsx</w:t>
             </w:r>
-            <w:proofErr w:type="spellEnd"/>
           </w:p>
         </w:tc>
         <w:tc>
@@ -2895,25 +2552,7 @@
                 <w:szCs w:val="18"/>
                 <w:lang w:val="en-CA"/>
               </w:rPr>
-              <w:t xml:space="preserve">: </w:t>
-            </w:r>
-            <w:proofErr w:type="gramStart"/>
-            <w:r>
-              <w:rPr>
-                <w:sz w:val="16"/>
-                <w:szCs w:val="18"/>
-                <w:lang w:val="en-CA"/>
-              </w:rPr>
-              <w:t>plus</w:t>
-            </w:r>
-            <w:proofErr w:type="gramEnd"/>
-            <w:r>
-              <w:rPr>
-                <w:sz w:val="16"/>
-                <w:szCs w:val="18"/>
-                <w:lang w:val="en-CA"/>
-              </w:rPr>
-              <w:t xml:space="preserve"> button</w:t>
+              <w:t>: plus button</w:t>
             </w:r>
           </w:p>
         </w:tc>
@@ -2979,25 +2618,7 @@
                 <w:szCs w:val="18"/>
                 <w:lang w:val="en-CA"/>
               </w:rPr>
-              <w:t xml:space="preserve">t should add a new </w:t>
-            </w:r>
-            <w:proofErr w:type="spellStart"/>
-            <w:r>
-              <w:rPr>
-                <w:sz w:val="16"/>
-                <w:szCs w:val="18"/>
-                <w:lang w:val="en-CA"/>
-              </w:rPr>
-              <w:t>keybind</w:t>
-            </w:r>
-            <w:proofErr w:type="spellEnd"/>
-            <w:r>
-              <w:rPr>
-                <w:sz w:val="16"/>
-                <w:szCs w:val="18"/>
-                <w:lang w:val="en-CA"/>
-              </w:rPr>
-              <w:t xml:space="preserve"> box. </w:t>
+              <w:t xml:space="preserve">t should add a new keybind box. </w:t>
             </w:r>
             <w:r>
               <w:rPr>
@@ -3014,25 +2635,7 @@
                 <w:szCs w:val="18"/>
                 <w:lang w:val="en-CA"/>
               </w:rPr>
-              <w:t xml:space="preserve">oth </w:t>
-            </w:r>
-            <w:proofErr w:type="spellStart"/>
-            <w:r>
-              <w:rPr>
-                <w:sz w:val="16"/>
-                <w:szCs w:val="18"/>
-                <w:lang w:val="en-CA"/>
-              </w:rPr>
-              <w:t>keybind</w:t>
-            </w:r>
-            <w:proofErr w:type="spellEnd"/>
-            <w:r>
-              <w:rPr>
-                <w:sz w:val="16"/>
-                <w:szCs w:val="18"/>
-                <w:lang w:val="en-CA"/>
-              </w:rPr>
-              <w:t xml:space="preserve"> boxes should have an “x” button</w:t>
+              <w:t>oth keybind boxes should have an “x” button</w:t>
             </w:r>
           </w:p>
         </w:tc>
@@ -3076,7 +2679,6 @@
                 <w:lang w:val="en-CA"/>
               </w:rPr>
             </w:pPr>
-            <w:proofErr w:type="spellStart"/>
             <w:r>
               <w:rPr>
                 <w:rFonts w:hint="eastAsia"/>
@@ -3094,7 +2696,6 @@
               </w:rPr>
               <w:t>ettings.tsx</w:t>
             </w:r>
-            <w:proofErr w:type="spellEnd"/>
           </w:p>
         </w:tc>
         <w:tc>
@@ -3134,18 +2735,8 @@
                 <w:szCs w:val="18"/>
                 <w:lang w:val="en-CA"/>
               </w:rPr>
-              <w:t xml:space="preserve">: x button for </w:t>
-            </w:r>
-            <w:proofErr w:type="spellStart"/>
-            <w:r>
-              <w:rPr>
-                <w:sz w:val="16"/>
-                <w:szCs w:val="18"/>
-                <w:lang w:val="en-CA"/>
-              </w:rPr>
-              <w:t>keybinds</w:t>
-            </w:r>
-            <w:proofErr w:type="spellEnd"/>
+              <w:t>: x button for keybinds</w:t>
+            </w:r>
           </w:p>
         </w:tc>
         <w:tc>
@@ -3177,25 +2768,7 @@
                 <w:szCs w:val="18"/>
                 <w:lang w:val="en-CA"/>
               </w:rPr>
-              <w:t xml:space="preserve">lick the “x” button on the right side in a </w:t>
-            </w:r>
-            <w:proofErr w:type="spellStart"/>
-            <w:r>
-              <w:rPr>
-                <w:sz w:val="16"/>
-                <w:szCs w:val="18"/>
-                <w:lang w:val="en-CA"/>
-              </w:rPr>
-              <w:t>keybind</w:t>
-            </w:r>
-            <w:proofErr w:type="spellEnd"/>
-            <w:r>
-              <w:rPr>
-                <w:sz w:val="16"/>
-                <w:szCs w:val="18"/>
-                <w:lang w:val="en-CA"/>
-              </w:rPr>
-              <w:t xml:space="preserve"> box</w:t>
+              <w:t>lick the “x” button on the right side in a keybind box</w:t>
             </w:r>
             <w:r>
               <w:rPr>
@@ -3220,36 +2793,8 @@
                 <w:szCs w:val="18"/>
                 <w:lang w:val="en-CA"/>
               </w:rPr>
-              <w:t xml:space="preserve">ry this for commands with multiple </w:t>
-            </w:r>
-            <w:proofErr w:type="spellStart"/>
-            <w:r>
-              <w:rPr>
-                <w:sz w:val="16"/>
-                <w:szCs w:val="18"/>
-                <w:lang w:val="en-CA"/>
-              </w:rPr>
-              <w:t>keybinds</w:t>
-            </w:r>
-            <w:proofErr w:type="spellEnd"/>
-            <w:r>
-              <w:rPr>
-                <w:sz w:val="16"/>
-                <w:szCs w:val="18"/>
-                <w:lang w:val="en-CA"/>
-              </w:rPr>
-              <w:t xml:space="preserve"> and just one </w:t>
-            </w:r>
-            <w:proofErr w:type="spellStart"/>
-            <w:r>
-              <w:rPr>
-                <w:sz w:val="16"/>
-                <w:szCs w:val="18"/>
-                <w:lang w:val="en-CA"/>
-              </w:rPr>
-              <w:t>keybind</w:t>
-            </w:r>
-            <w:proofErr w:type="spellEnd"/>
+              <w:t>ry this for commands with multiple keybinds and just one keybind</w:t>
+            </w:r>
           </w:p>
         </w:tc>
         <w:tc>
@@ -3281,18 +2826,25 @@
                 <w:szCs w:val="18"/>
                 <w:lang w:val="en-CA"/>
               </w:rPr>
-              <w:t xml:space="preserve">t should delete that </w:t>
-            </w:r>
-            <w:proofErr w:type="spellStart"/>
-            <w:r>
-              <w:rPr>
-                <w:sz w:val="16"/>
-                <w:szCs w:val="18"/>
-                <w:lang w:val="en-CA"/>
-              </w:rPr>
-              <w:t>keybind</w:t>
-            </w:r>
-            <w:proofErr w:type="spellEnd"/>
+              <w:t xml:space="preserve">t should delete that keybind. </w:t>
+            </w:r>
+            <w:r>
+              <w:rPr>
+                <w:rFonts w:hint="eastAsia"/>
+                <w:sz w:val="16"/>
+                <w:szCs w:val="18"/>
+                <w:lang w:val="en-CA"/>
+              </w:rPr>
+              <w:t>I</w:t>
+            </w:r>
+            <w:r>
+              <w:rPr>
+                <w:sz w:val="16"/>
+                <w:szCs w:val="18"/>
+                <w:lang w:val="en-CA"/>
+              </w:rPr>
+              <w:t>f there is only one keybind, there should still be an X button</w:t>
+            </w:r>
             <w:r>
               <w:rPr>
                 <w:sz w:val="16"/>
@@ -3308,49 +2860,6 @@
                 <w:szCs w:val="18"/>
                 <w:lang w:val="en-CA"/>
               </w:rPr>
-              <w:t>I</w:t>
-            </w:r>
-            <w:r>
-              <w:rPr>
-                <w:sz w:val="16"/>
-                <w:szCs w:val="18"/>
-                <w:lang w:val="en-CA"/>
-              </w:rPr>
-              <w:t xml:space="preserve">f there is only one </w:t>
-            </w:r>
-            <w:proofErr w:type="spellStart"/>
-            <w:r>
-              <w:rPr>
-                <w:sz w:val="16"/>
-                <w:szCs w:val="18"/>
-                <w:lang w:val="en-CA"/>
-              </w:rPr>
-              <w:t>keybind</w:t>
-            </w:r>
-            <w:proofErr w:type="spellEnd"/>
-            <w:r>
-              <w:rPr>
-                <w:sz w:val="16"/>
-                <w:szCs w:val="18"/>
-                <w:lang w:val="en-CA"/>
-              </w:rPr>
-              <w:t>, there should still be an X button</w:t>
-            </w:r>
-            <w:r>
-              <w:rPr>
-                <w:sz w:val="16"/>
-                <w:szCs w:val="18"/>
-                <w:lang w:val="en-CA"/>
-              </w:rPr>
-              <w:t xml:space="preserve">. </w:t>
-            </w:r>
-            <w:r>
-              <w:rPr>
-                <w:rFonts w:hint="eastAsia"/>
-                <w:sz w:val="16"/>
-                <w:szCs w:val="18"/>
-                <w:lang w:val="en-CA"/>
-              </w:rPr>
               <w:t>C</w:t>
             </w:r>
             <w:r>
@@ -3359,25 +2868,7 @@
                 <w:szCs w:val="18"/>
                 <w:lang w:val="en-CA"/>
               </w:rPr>
-              <w:t xml:space="preserve">licking this x button should remove the </w:t>
-            </w:r>
-            <w:proofErr w:type="spellStart"/>
-            <w:r>
-              <w:rPr>
-                <w:sz w:val="16"/>
-                <w:szCs w:val="18"/>
-                <w:lang w:val="en-CA"/>
-              </w:rPr>
-              <w:t>keybind</w:t>
-            </w:r>
-            <w:proofErr w:type="spellEnd"/>
-            <w:r>
-              <w:rPr>
-                <w:sz w:val="16"/>
-                <w:szCs w:val="18"/>
-                <w:lang w:val="en-CA"/>
-              </w:rPr>
-              <w:t xml:space="preserve"> completely</w:t>
+              <w:t>licking this x button should remove the keybind completely</w:t>
             </w:r>
           </w:p>
         </w:tc>
@@ -3446,7 +2937,6 @@
                 <w:lang w:val="en-CA"/>
               </w:rPr>
             </w:pPr>
-            <w:proofErr w:type="spellStart"/>
             <w:r>
               <w:rPr>
                 <w:rFonts w:hint="eastAsia"/>
@@ -3464,7 +2954,6 @@
               </w:rPr>
               <w:t>ettings.tsx</w:t>
             </w:r>
-            <w:proofErr w:type="spellEnd"/>
           </w:p>
         </w:tc>
         <w:tc>
@@ -3529,18 +3018,8 @@
                 <w:szCs w:val="18"/>
                 <w:lang w:val="en-CA"/>
               </w:rPr>
-              <w:t xml:space="preserve">ake an adjustment to the clip in the timeline and press the undo </w:t>
-            </w:r>
-            <w:proofErr w:type="spellStart"/>
-            <w:r>
-              <w:rPr>
-                <w:sz w:val="16"/>
-                <w:szCs w:val="18"/>
-                <w:lang w:val="en-CA"/>
-              </w:rPr>
-              <w:t>keybind</w:t>
-            </w:r>
-            <w:proofErr w:type="spellEnd"/>
+              <w:t>ake an adjustment to the clip in the timeline and press the undo keybind</w:t>
+            </w:r>
           </w:p>
         </w:tc>
         <w:tc>
@@ -3627,7 +3106,6 @@
           <w:lang w:val="en-CA"/>
         </w:rPr>
       </w:pPr>
-      <w:proofErr w:type="spellStart"/>
       <w:r>
         <w:rPr>
           <w:rFonts w:hint="eastAsia"/>
@@ -3647,18 +3125,7 @@
           <w:szCs w:val="32"/>
           <w:lang w:val="en-CA"/>
         </w:rPr>
-        <w:t>ettings.tsx</w:t>
-      </w:r>
-      <w:proofErr w:type="spellEnd"/>
-      <w:r>
-        <w:rPr>
-          <w:b/>
-          <w:bCs/>
-          <w:sz w:val="28"/>
-          <w:szCs w:val="32"/>
-          <w:lang w:val="en-CA"/>
-        </w:rPr>
-        <w:t xml:space="preserve">: </w:t>
+        <w:t xml:space="preserve">ettings.tsx: </w:t>
       </w:r>
       <w:r>
         <w:rPr>
@@ -3865,7 +3332,6 @@
                 <w:lang w:val="en-CA"/>
               </w:rPr>
             </w:pPr>
-            <w:proofErr w:type="spellStart"/>
             <w:r>
               <w:rPr>
                 <w:rFonts w:hint="eastAsia"/>
@@ -3883,25 +3349,14 @@
               </w:rPr>
               <w:t>ettings.tsx</w:t>
             </w:r>
-            <w:proofErr w:type="spellEnd"/>
-            <w:r>
-              <w:rPr>
-                <w:sz w:val="16"/>
-                <w:szCs w:val="18"/>
-                <w:lang w:val="en-CA"/>
-              </w:rPr>
-              <w:t xml:space="preserve"> </w:t>
-            </w:r>
-            <w:proofErr w:type="spellStart"/>
-            <w:r>
-              <w:rPr>
-                <w:sz w:val="16"/>
-                <w:szCs w:val="18"/>
-                <w:lang w:val="en-CA"/>
-              </w:rPr>
-              <w:t>DraggableModal.tsx</w:t>
-            </w:r>
-            <w:proofErr w:type="spellEnd"/>
+            <w:r>
+              <w:rPr>
+                <w:sz w:val="16"/>
+                <w:szCs w:val="18"/>
+                <w:lang w:val="en-CA"/>
+              </w:rPr>
+              <w:t xml:space="preserve"> DraggableModal.tsx</w:t>
+            </w:r>
           </w:p>
         </w:tc>
         <w:tc>
@@ -3982,7 +3437,6 @@
               </w:rPr>
               <w:t xml:space="preserve">pen a modal, </w:t>
             </w:r>
-            <w:proofErr w:type="gramStart"/>
             <w:r>
               <w:rPr>
                 <w:rFonts w:hint="eastAsia"/>
@@ -3998,16 +3452,7 @@
                 <w:szCs w:val="18"/>
                 <w:lang w:val="en-CA"/>
               </w:rPr>
-              <w:t>ry</w:t>
-            </w:r>
-            <w:proofErr w:type="gramEnd"/>
-            <w:r>
-              <w:rPr>
-                <w:sz w:val="16"/>
-                <w:szCs w:val="18"/>
-                <w:lang w:val="en-CA"/>
-              </w:rPr>
-              <w:t xml:space="preserve"> dragging the x button, - button, and back button.</w:t>
+              <w:t>ry dragging the x button, - button, and back button.</w:t>
             </w:r>
           </w:p>
         </w:tc>
@@ -4101,7 +3546,6 @@
                 <w:lang w:val="en-CA"/>
               </w:rPr>
             </w:pPr>
-            <w:proofErr w:type="spellStart"/>
             <w:r>
               <w:rPr>
                 <w:rFonts w:hint="eastAsia"/>
@@ -4120,25 +3564,14 @@
               </w:rPr>
               <w:t>ettings.tsx</w:t>
             </w:r>
-            <w:proofErr w:type="spellEnd"/>
-            <w:r>
-              <w:rPr>
-                <w:sz w:val="16"/>
-                <w:szCs w:val="18"/>
-                <w:lang w:val="en-CA"/>
-              </w:rPr>
-              <w:t xml:space="preserve"> </w:t>
-            </w:r>
-            <w:proofErr w:type="spellStart"/>
-            <w:r>
-              <w:rPr>
-                <w:sz w:val="16"/>
-                <w:szCs w:val="18"/>
-                <w:lang w:val="en-CA"/>
-              </w:rPr>
-              <w:t>DraggableModal.tsx</w:t>
-            </w:r>
-            <w:proofErr w:type="spellEnd"/>
+            <w:r>
+              <w:rPr>
+                <w:sz w:val="16"/>
+                <w:szCs w:val="18"/>
+                <w:lang w:val="en-CA"/>
+              </w:rPr>
+              <w:t xml:space="preserve"> DraggableModal.tsx</w:t>
+            </w:r>
           </w:p>
         </w:tc>
         <w:tc>
@@ -4326,7 +3759,6 @@
                 <w:lang w:val="en-CA"/>
               </w:rPr>
             </w:pPr>
-            <w:proofErr w:type="spellStart"/>
             <w:r>
               <w:rPr>
                 <w:rFonts w:hint="eastAsia"/>
@@ -4342,27 +3774,8 @@
                 <w:szCs w:val="18"/>
                 <w:lang w:val="en-CA"/>
               </w:rPr>
-              <w:t>ettings.tsx</w:t>
-            </w:r>
-            <w:proofErr w:type="spellEnd"/>
-            <w:r>
-              <w:rPr>
-                <w:sz w:val="16"/>
-                <w:szCs w:val="18"/>
-                <w:lang w:val="en-CA"/>
-              </w:rPr>
-              <w:t xml:space="preserve">, </w:t>
-            </w:r>
-            <w:proofErr w:type="spellStart"/>
-            <w:r>
-              <w:rPr>
-                <w:sz w:val="16"/>
-                <w:szCs w:val="18"/>
-                <w:lang w:val="en-CA"/>
-              </w:rPr>
-              <w:t>DraggableModal.tsx</w:t>
-            </w:r>
-            <w:proofErr w:type="spellEnd"/>
+              <w:t>ettings.tsx, DraggableModal.tsx</w:t>
+            </w:r>
           </w:p>
         </w:tc>
         <w:tc>
@@ -4443,7 +3856,6 @@
               </w:rPr>
               <w:t xml:space="preserve">pen a modal, </w:t>
             </w:r>
-            <w:proofErr w:type="gramStart"/>
             <w:r>
               <w:rPr>
                 <w:rFonts w:hint="eastAsia"/>
@@ -4459,16 +3871,7 @@
                 <w:szCs w:val="18"/>
                 <w:lang w:val="en-CA"/>
               </w:rPr>
-              <w:t>ry</w:t>
-            </w:r>
-            <w:proofErr w:type="gramEnd"/>
-            <w:r>
-              <w:rPr>
-                <w:sz w:val="16"/>
-                <w:szCs w:val="18"/>
-                <w:lang w:val="en-CA"/>
-              </w:rPr>
-              <w:t xml:space="preserve"> clicking on the x button, - button, or back button</w:t>
+              <w:t>ry clicking on the x button, - button, or back button</w:t>
             </w:r>
           </w:p>
         </w:tc>
@@ -4562,7 +3965,6 @@
                 <w:lang w:val="en-CA"/>
               </w:rPr>
             </w:pPr>
-            <w:proofErr w:type="spellStart"/>
             <w:r>
               <w:rPr>
                 <w:rFonts w:hint="eastAsia"/>
@@ -4580,25 +3982,14 @@
               </w:rPr>
               <w:t>ettings.tsx</w:t>
             </w:r>
-            <w:proofErr w:type="spellEnd"/>
-            <w:r>
-              <w:rPr>
-                <w:sz w:val="16"/>
-                <w:szCs w:val="18"/>
-                <w:lang w:val="en-CA"/>
-              </w:rPr>
-              <w:t xml:space="preserve"> </w:t>
-            </w:r>
-            <w:proofErr w:type="spellStart"/>
-            <w:r>
-              <w:rPr>
-                <w:sz w:val="16"/>
-                <w:szCs w:val="18"/>
-                <w:lang w:val="en-CA"/>
-              </w:rPr>
-              <w:t>DraggableModal.tsx</w:t>
-            </w:r>
-            <w:proofErr w:type="spellEnd"/>
+            <w:r>
+              <w:rPr>
+                <w:sz w:val="16"/>
+                <w:szCs w:val="18"/>
+                <w:lang w:val="en-CA"/>
+              </w:rPr>
+              <w:t xml:space="preserve"> DraggableModal.tsx</w:t>
+            </w:r>
           </w:p>
         </w:tc>
         <w:tc>
@@ -4794,7 +4185,6 @@
                 <w:lang w:val="en-CA"/>
               </w:rPr>
             </w:pPr>
-            <w:proofErr w:type="spellStart"/>
             <w:r>
               <w:rPr>
                 <w:rFonts w:hint="eastAsia"/>
@@ -4810,27 +4200,8 @@
                 <w:szCs w:val="18"/>
                 <w:lang w:val="en-CA"/>
               </w:rPr>
-              <w:t>ettings.tsx</w:t>
-            </w:r>
-            <w:proofErr w:type="spellEnd"/>
-            <w:r>
-              <w:rPr>
-                <w:sz w:val="16"/>
-                <w:szCs w:val="18"/>
-                <w:lang w:val="en-CA"/>
-              </w:rPr>
-              <w:t xml:space="preserve">, </w:t>
-            </w:r>
-            <w:proofErr w:type="spellStart"/>
-            <w:r>
-              <w:rPr>
-                <w:sz w:val="16"/>
-                <w:szCs w:val="18"/>
-                <w:lang w:val="en-CA"/>
-              </w:rPr>
-              <w:t>DraggableModal.tsx</w:t>
-            </w:r>
-            <w:proofErr w:type="spellEnd"/>
+              <w:t>ettings.tsx, DraggableModal.tsx</w:t>
+            </w:r>
           </w:p>
         </w:tc>
         <w:tc>
@@ -5010,7 +4381,6 @@
                 <w:lang w:val="en-CA"/>
               </w:rPr>
             </w:pPr>
-            <w:proofErr w:type="spellStart"/>
             <w:r>
               <w:rPr>
                 <w:rFonts w:hint="eastAsia"/>
@@ -5028,79 +4398,14 @@
               </w:rPr>
               <w:t>ettings.tsx</w:t>
             </w:r>
-            <w:proofErr w:type="spellEnd"/>
-            <w:r>
-              <w:rPr>
-                <w:sz w:val="16"/>
-                <w:szCs w:val="18"/>
-                <w:lang w:val="en-CA"/>
-              </w:rPr>
-              <w:t xml:space="preserve">, </w:t>
-            </w:r>
-            <w:proofErr w:type="spellStart"/>
-            <w:r>
-              <w:rPr>
-                <w:sz w:val="16"/>
-                <w:szCs w:val="18"/>
-                <w:lang w:val="en-CA"/>
-              </w:rPr>
-              <w:t>draggableModal.tsx</w:t>
-            </w:r>
-            <w:proofErr w:type="spellEnd"/>
-            <w:r>
-              <w:rPr>
-                <w:sz w:val="16"/>
-                <w:szCs w:val="18"/>
-                <w:lang w:val="en-CA"/>
-              </w:rPr>
-              <w:t xml:space="preserve">, </w:t>
-            </w:r>
-            <w:proofErr w:type="spellStart"/>
-            <w:r>
-              <w:rPr>
-                <w:sz w:val="16"/>
-                <w:szCs w:val="18"/>
-                <w:lang w:val="en-CA"/>
-              </w:rPr>
-              <w:t>Toast.tsx</w:t>
-            </w:r>
-            <w:proofErr w:type="spellEnd"/>
-            <w:r>
-              <w:rPr>
-                <w:sz w:val="16"/>
-                <w:szCs w:val="18"/>
-                <w:lang w:val="en-CA"/>
-              </w:rPr>
-              <w:t xml:space="preserve">, </w:t>
-            </w:r>
-            <w:proofErr w:type="spellStart"/>
-            <w:r>
-              <w:rPr>
-                <w:sz w:val="16"/>
-                <w:szCs w:val="18"/>
-                <w:lang w:val="en-CA"/>
-              </w:rPr>
-              <w:t>modalManager.ts</w:t>
-            </w:r>
-            <w:proofErr w:type="spellEnd"/>
-            <w:r>
-              <w:rPr>
-                <w:sz w:val="16"/>
-                <w:szCs w:val="18"/>
-                <w:lang w:val="en-CA"/>
-              </w:rPr>
-              <w:t xml:space="preserve">, </w:t>
-            </w:r>
-            <w:proofErr w:type="spellStart"/>
-            <w:r>
-              <w:rPr>
-                <w:sz w:val="16"/>
-                <w:szCs w:val="18"/>
-                <w:lang w:val="en-CA"/>
-              </w:rPr>
-              <w:t>modalPermissions.ts</w:t>
-            </w:r>
-            <w:proofErr w:type="spellEnd"/>
+            <w:r>
+              <w:rPr>
+                <w:sz w:val="16"/>
+                <w:szCs w:val="18"/>
+                <w:lang w:val="en-CA"/>
+              </w:rPr>
+              <w:t>, draggableModal.tsx, Toast.tsx, modalManager.ts, modalPermissions.ts</w:t>
+            </w:r>
           </w:p>
         </w:tc>
         <w:tc>
@@ -5317,7 +4622,6 @@
                 <w:lang w:val="en-CA"/>
               </w:rPr>
             </w:pPr>
-            <w:proofErr w:type="spellStart"/>
             <w:r>
               <w:rPr>
                 <w:rFonts w:hint="eastAsia"/>
@@ -5333,81 +4637,8 @@
                 <w:szCs w:val="18"/>
                 <w:lang w:val="en-CA"/>
               </w:rPr>
-              <w:t>ettings.tsx</w:t>
-            </w:r>
-            <w:proofErr w:type="spellEnd"/>
-            <w:r>
-              <w:rPr>
-                <w:sz w:val="16"/>
-                <w:szCs w:val="18"/>
-                <w:lang w:val="en-CA"/>
-              </w:rPr>
-              <w:t xml:space="preserve">, </w:t>
-            </w:r>
-            <w:proofErr w:type="spellStart"/>
-            <w:r>
-              <w:rPr>
-                <w:sz w:val="16"/>
-                <w:szCs w:val="18"/>
-                <w:lang w:val="en-CA"/>
-              </w:rPr>
-              <w:t>draggableModal.tsx</w:t>
-            </w:r>
-            <w:proofErr w:type="spellEnd"/>
-            <w:r>
-              <w:rPr>
-                <w:sz w:val="16"/>
-                <w:szCs w:val="18"/>
-                <w:lang w:val="en-CA"/>
-              </w:rPr>
-              <w:t xml:space="preserve">, </w:t>
-            </w:r>
-            <w:proofErr w:type="spellStart"/>
-            <w:r>
-              <w:rPr>
-                <w:sz w:val="16"/>
-                <w:szCs w:val="18"/>
-                <w:lang w:val="en-CA"/>
-              </w:rPr>
-              <w:t>Toast.tsx</w:t>
-            </w:r>
-            <w:proofErr w:type="spellEnd"/>
-            <w:r>
-              <w:rPr>
-                <w:sz w:val="16"/>
-                <w:szCs w:val="18"/>
-                <w:lang w:val="en-CA"/>
-              </w:rPr>
-              <w:t xml:space="preserve">, </w:t>
-            </w:r>
-            <w:proofErr w:type="spellStart"/>
-            <w:r>
-              <w:rPr>
-                <w:sz w:val="16"/>
-                <w:szCs w:val="18"/>
-                <w:lang w:val="en-CA"/>
-              </w:rPr>
-              <w:t>modalManager.ts</w:t>
-            </w:r>
-            <w:proofErr w:type="spellEnd"/>
-            <w:r>
-              <w:rPr>
-                <w:sz w:val="16"/>
-                <w:szCs w:val="18"/>
-                <w:lang w:val="en-CA"/>
-              </w:rPr>
-              <w:t xml:space="preserve">, </w:t>
-            </w:r>
-            <w:proofErr w:type="spellStart"/>
-            <w:r>
-              <w:rPr>
-                <w:sz w:val="16"/>
-                <w:szCs w:val="18"/>
-                <w:lang w:val="en-CA"/>
-              </w:rPr>
-              <w:t>modalPermissions.ts</w:t>
-            </w:r>
-            <w:proofErr w:type="spellEnd"/>
+              <w:t>ettings.tsx, draggableModal.tsx, Toast.tsx, modalManager.ts, modalPermissions.ts</w:t>
+            </w:r>
           </w:p>
         </w:tc>
         <w:tc>
@@ -5648,7 +4879,6 @@
                 <w:lang w:val="en-CA"/>
               </w:rPr>
             </w:pPr>
-            <w:proofErr w:type="spellStart"/>
             <w:r>
               <w:rPr>
                 <w:rFonts w:hint="eastAsia"/>
@@ -5664,81 +4894,8 @@
                 <w:szCs w:val="18"/>
                 <w:lang w:val="en-CA"/>
               </w:rPr>
-              <w:t>ettings.tsx</w:t>
-            </w:r>
-            <w:proofErr w:type="spellEnd"/>
-            <w:r>
-              <w:rPr>
-                <w:sz w:val="16"/>
-                <w:szCs w:val="18"/>
-                <w:lang w:val="en-CA"/>
-              </w:rPr>
-              <w:t xml:space="preserve">, </w:t>
-            </w:r>
-            <w:proofErr w:type="spellStart"/>
-            <w:r>
-              <w:rPr>
-                <w:sz w:val="16"/>
-                <w:szCs w:val="18"/>
-                <w:lang w:val="en-CA"/>
-              </w:rPr>
-              <w:t>draggableModal.tsx</w:t>
-            </w:r>
-            <w:proofErr w:type="spellEnd"/>
-            <w:r>
-              <w:rPr>
-                <w:sz w:val="16"/>
-                <w:szCs w:val="18"/>
-                <w:lang w:val="en-CA"/>
-              </w:rPr>
-              <w:t xml:space="preserve">, </w:t>
-            </w:r>
-            <w:proofErr w:type="spellStart"/>
-            <w:r>
-              <w:rPr>
-                <w:sz w:val="16"/>
-                <w:szCs w:val="18"/>
-                <w:lang w:val="en-CA"/>
-              </w:rPr>
-              <w:t>Toast.tsx</w:t>
-            </w:r>
-            <w:proofErr w:type="spellEnd"/>
-            <w:r>
-              <w:rPr>
-                <w:sz w:val="16"/>
-                <w:szCs w:val="18"/>
-                <w:lang w:val="en-CA"/>
-              </w:rPr>
-              <w:t xml:space="preserve">, </w:t>
-            </w:r>
-            <w:proofErr w:type="spellStart"/>
-            <w:r>
-              <w:rPr>
-                <w:sz w:val="16"/>
-                <w:szCs w:val="18"/>
-                <w:lang w:val="en-CA"/>
-              </w:rPr>
-              <w:t>modalManager.ts</w:t>
-            </w:r>
-            <w:proofErr w:type="spellEnd"/>
-            <w:r>
-              <w:rPr>
-                <w:sz w:val="16"/>
-                <w:szCs w:val="18"/>
-                <w:lang w:val="en-CA"/>
-              </w:rPr>
-              <w:t xml:space="preserve">, </w:t>
-            </w:r>
-            <w:proofErr w:type="spellStart"/>
-            <w:r>
-              <w:rPr>
-                <w:sz w:val="16"/>
-                <w:szCs w:val="18"/>
-                <w:lang w:val="en-CA"/>
-              </w:rPr>
-              <w:t>modalPermissions.ts</w:t>
-            </w:r>
-            <w:proofErr w:type="spellEnd"/>
+              <w:t>ettings.tsx, draggableModal.tsx, Toast.tsx, modalManager.ts, modalPermissions.ts</w:t>
+            </w:r>
           </w:p>
         </w:tc>
         <w:tc>
@@ -5894,7 +5051,6 @@
                 <w:lang w:val="en-CA"/>
               </w:rPr>
             </w:pPr>
-            <w:proofErr w:type="spellStart"/>
             <w:r>
               <w:rPr>
                 <w:rFonts w:hint="eastAsia"/>
@@ -5912,7 +5068,6 @@
               </w:rPr>
               <w:t>ettings.tsx</w:t>
             </w:r>
-            <w:proofErr w:type="spellEnd"/>
           </w:p>
         </w:tc>
         <w:tc>
@@ -6090,7 +5245,6 @@
                 <w:lang w:val="en-CA"/>
               </w:rPr>
             </w:pPr>
-            <w:proofErr w:type="spellStart"/>
             <w:r>
               <w:rPr>
                 <w:rFonts w:hint="eastAsia"/>
@@ -6108,7 +5262,6 @@
               </w:rPr>
               <w:t>ettings.tsx</w:t>
             </w:r>
-            <w:proofErr w:type="spellEnd"/>
           </w:p>
         </w:tc>
         <w:tc>
@@ -6417,7 +5570,6 @@
                 <w:lang w:val="en-CA"/>
               </w:rPr>
             </w:pPr>
-            <w:proofErr w:type="spellStart"/>
             <w:r>
               <w:rPr>
                 <w:rFonts w:hint="eastAsia"/>
@@ -6435,7 +5587,6 @@
               </w:rPr>
               <w:t>ettings.tsx</w:t>
             </w:r>
-            <w:proofErr w:type="spellEnd"/>
           </w:p>
         </w:tc>
         <w:tc>
@@ -6500,25 +5651,7 @@
                 <w:szCs w:val="18"/>
                 <w:lang w:val="en-CA"/>
               </w:rPr>
-              <w:t xml:space="preserve">earch for TAB_NAMES in </w:t>
-            </w:r>
-            <w:proofErr w:type="spellStart"/>
-            <w:r>
-              <w:rPr>
-                <w:sz w:val="16"/>
-                <w:szCs w:val="18"/>
-                <w:lang w:val="en-CA"/>
-              </w:rPr>
-              <w:t>settings.tsx</w:t>
-            </w:r>
-            <w:proofErr w:type="spellEnd"/>
-            <w:r>
-              <w:rPr>
-                <w:sz w:val="16"/>
-                <w:szCs w:val="18"/>
-                <w:lang w:val="en-CA"/>
-              </w:rPr>
-              <w:t xml:space="preserve">. change any one of the names in quotation marks. </w:t>
+              <w:t xml:space="preserve">earch for TAB_NAMES in settings.tsx. change any one of the names in quotation marks. </w:t>
             </w:r>
             <w:r>
               <w:rPr>
@@ -6742,7 +5875,6 @@
                 <w:lang w:val="en-CA"/>
               </w:rPr>
             </w:pPr>
-            <w:proofErr w:type="spellStart"/>
             <w:r>
               <w:rPr>
                 <w:rFonts w:hint="eastAsia"/>
@@ -6758,16 +5890,7 @@
                 <w:szCs w:val="18"/>
                 <w:lang w:val="en-CA"/>
               </w:rPr>
-              <w:t>ettings.tsx</w:t>
-            </w:r>
-            <w:proofErr w:type="spellEnd"/>
-            <w:r>
-              <w:rPr>
-                <w:sz w:val="16"/>
-                <w:szCs w:val="18"/>
-                <w:lang w:val="en-CA"/>
-              </w:rPr>
-              <w:t>, index.css</w:t>
+              <w:t>ettings.tsx, index.css</w:t>
             </w:r>
           </w:p>
         </w:tc>
@@ -6993,7 +6116,6 @@
                 <w:lang w:val="en-CA"/>
               </w:rPr>
             </w:pPr>
-            <w:proofErr w:type="spellStart"/>
             <w:r>
               <w:rPr>
                 <w:rFonts w:hint="eastAsia"/>
@@ -7011,7 +6133,6 @@
               </w:rPr>
               <w:t>ettings.tsx</w:t>
             </w:r>
-            <w:proofErr w:type="spellEnd"/>
           </w:p>
         </w:tc>
         <w:tc>
@@ -7091,25 +6212,7 @@
                 <w:szCs w:val="18"/>
                 <w:lang w:val="en-CA"/>
               </w:rPr>
-              <w:t xml:space="preserve">gh let me just screenshot it </w:t>
-            </w:r>
-            <w:proofErr w:type="gramStart"/>
-            <w:r>
-              <w:rPr>
-                <w:sz w:val="16"/>
-                <w:szCs w:val="18"/>
-                <w:lang w:val="en-CA"/>
-              </w:rPr>
-              <w:t>real</w:t>
-            </w:r>
-            <w:proofErr w:type="gramEnd"/>
-            <w:r>
-              <w:rPr>
-                <w:sz w:val="16"/>
-                <w:szCs w:val="18"/>
-                <w:lang w:val="en-CA"/>
-              </w:rPr>
-              <w:t xml:space="preserve"> quick)</w:t>
+              <w:t>gh let me just screenshot it real quick)</w:t>
             </w:r>
           </w:p>
           <w:p>
@@ -7266,12 +6369,28 @@
           <w:p>
             <w:pPr>
               <w:rPr>
-                <w:rFonts w:hint="eastAsia"/>
-                <w:sz w:val="16"/>
-                <w:szCs w:val="18"/>
-                <w:lang w:val="en-CA"/>
-              </w:rPr>
-            </w:pPr>
+                <w:sz w:val="16"/>
+                <w:szCs w:val="18"/>
+                <w:lang w:val="en-CA"/>
+              </w:rPr>
+            </w:pPr>
+            <w:r>
+              <w:rPr>
+                <w:rFonts w:hint="eastAsia"/>
+                <w:sz w:val="16"/>
+                <w:szCs w:val="18"/>
+                <w:lang w:val="en-CA"/>
+              </w:rPr>
+              <w:t>I</w:t>
+            </w:r>
+            <w:r>
+              <w:rPr>
+                <w:sz w:val="16"/>
+                <w:szCs w:val="18"/>
+                <w:lang w:val="en-CA"/>
+              </w:rPr>
+              <w:t>mplementing…</w:t>
+            </w:r>
           </w:p>
         </w:tc>
       </w:tr>
@@ -7301,7 +6420,6 @@
           <w:lang w:val="en-CA"/>
         </w:rPr>
       </w:pPr>
-      <w:proofErr w:type="spellStart"/>
       <w:r>
         <w:rPr>
           <w:rFonts w:hint="eastAsia"/>
@@ -7323,7 +6441,6 @@
         </w:rPr>
         <w:t>orusMenuEditor.tsx</w:t>
       </w:r>
-      <w:proofErr w:type="spellEnd"/>
     </w:p>
     <w:tbl>
       <w:tblPr>
@@ -7519,7 +6636,6 @@
                 <w:lang w:val="en-CA"/>
               </w:rPr>
             </w:pPr>
-            <w:proofErr w:type="spellStart"/>
             <w:r>
               <w:rPr>
                 <w:rFonts w:hint="eastAsia"/>
@@ -7535,27 +6651,8 @@
                 <w:szCs w:val="18"/>
                 <w:lang w:val="en-CA"/>
               </w:rPr>
-              <w:t>raph.tsx</w:t>
-            </w:r>
-            <w:proofErr w:type="spellEnd"/>
-            <w:r>
-              <w:rPr>
-                <w:sz w:val="16"/>
-                <w:szCs w:val="18"/>
-                <w:lang w:val="en-CA"/>
-              </w:rPr>
-              <w:t xml:space="preserve">, </w:t>
-            </w:r>
-            <w:proofErr w:type="spellStart"/>
-            <w:r>
-              <w:rPr>
-                <w:sz w:val="16"/>
-                <w:szCs w:val="18"/>
-                <w:lang w:val="en-CA"/>
-              </w:rPr>
-              <w:t>TorusMenuEditor.tsx</w:t>
-            </w:r>
-            <w:proofErr w:type="spellEnd"/>
+              <w:t>raph.tsx, TorusMenuEditor.tsx</w:t>
+            </w:r>
           </w:p>
         </w:tc>
         <w:tc>
@@ -7831,7 +6928,6 @@
                 <w:lang w:val="en-CA"/>
               </w:rPr>
             </w:pPr>
-            <w:proofErr w:type="spellStart"/>
             <w:r>
               <w:rPr>
                 <w:rFonts w:hint="eastAsia"/>
@@ -7849,7 +6945,6 @@
               </w:rPr>
               <w:t>raph.tsx</w:t>
             </w:r>
-            <w:proofErr w:type="spellEnd"/>
           </w:p>
         </w:tc>
         <w:tc>
@@ -7929,132 +7024,52 @@
                 <w:sz w:val="16"/>
                 <w:szCs w:val="18"/>
               </w:rPr>
-              <w:t>export const GRAPH_LINE_COLOR = '</w:t>
-            </w:r>
-            <w:proofErr w:type="gramStart"/>
-            <w:r>
-              <w:rPr>
-                <w:sz w:val="16"/>
-                <w:szCs w:val="18"/>
-              </w:rPr>
-              <w:t>var(</w:t>
-            </w:r>
-            <w:proofErr w:type="gramEnd"/>
-            <w:r>
-              <w:rPr>
-                <w:sz w:val="16"/>
-                <w:szCs w:val="18"/>
-              </w:rPr>
-              <w:t>--automation-line)';</w:t>
-            </w:r>
-          </w:p>
-          <w:p>
-            <w:pPr>
-              <w:rPr>
-                <w:sz w:val="16"/>
-                <w:szCs w:val="18"/>
-              </w:rPr>
-            </w:pPr>
-            <w:r>
-              <w:rPr>
-                <w:sz w:val="16"/>
-                <w:szCs w:val="18"/>
-              </w:rPr>
-              <w:t>export const EASE_HANDLE_COLOR = '</w:t>
-            </w:r>
-            <w:proofErr w:type="gramStart"/>
-            <w:r>
-              <w:rPr>
-                <w:sz w:val="16"/>
-                <w:szCs w:val="18"/>
-              </w:rPr>
-              <w:t>var(</w:t>
-            </w:r>
-            <w:proofErr w:type="gramEnd"/>
-            <w:r>
-              <w:rPr>
-                <w:sz w:val="16"/>
-                <w:szCs w:val="18"/>
-              </w:rPr>
-              <w:t>--automation-line)';</w:t>
-            </w:r>
-          </w:p>
-          <w:p>
-            <w:pPr>
-              <w:rPr>
-                <w:sz w:val="16"/>
-                <w:szCs w:val="18"/>
-              </w:rPr>
-            </w:pPr>
-            <w:r>
-              <w:rPr>
-                <w:sz w:val="16"/>
-                <w:szCs w:val="18"/>
-              </w:rPr>
-              <w:t>export const ANCHOR_OUTER_COLOR = '</w:t>
-            </w:r>
-            <w:proofErr w:type="gramStart"/>
-            <w:r>
-              <w:rPr>
-                <w:sz w:val="16"/>
-                <w:szCs w:val="18"/>
-              </w:rPr>
-              <w:t>var(</w:t>
-            </w:r>
-            <w:proofErr w:type="gramEnd"/>
-            <w:r>
-              <w:rPr>
-                <w:sz w:val="16"/>
-                <w:szCs w:val="18"/>
-              </w:rPr>
-              <w:t>--automation-line)';</w:t>
-            </w:r>
-          </w:p>
-          <w:p>
-            <w:pPr>
-              <w:rPr>
-                <w:sz w:val="16"/>
-                <w:szCs w:val="18"/>
-              </w:rPr>
-            </w:pPr>
-            <w:r>
-              <w:rPr>
-                <w:sz w:val="16"/>
-                <w:szCs w:val="18"/>
-              </w:rPr>
-              <w:t>export const ANCHOR_INNER_COLOR = '</w:t>
-            </w:r>
-            <w:proofErr w:type="gramStart"/>
-            <w:r>
-              <w:rPr>
-                <w:sz w:val="16"/>
-                <w:szCs w:val="18"/>
-              </w:rPr>
-              <w:t>var(</w:t>
-            </w:r>
-            <w:proofErr w:type="gramEnd"/>
-            <w:r>
-              <w:rPr>
-                <w:sz w:val="16"/>
-                <w:szCs w:val="18"/>
-              </w:rPr>
-              <w:t>--input-field-</w:t>
-            </w:r>
-            <w:proofErr w:type="spellStart"/>
-            <w:r>
-              <w:rPr>
-                <w:sz w:val="16"/>
-                <w:szCs w:val="18"/>
-              </w:rPr>
-              <w:t>bg</w:t>
-            </w:r>
-            <w:proofErr w:type="spellEnd"/>
-            <w:r>
-              <w:rPr>
-                <w:sz w:val="16"/>
-                <w:szCs w:val="18"/>
-              </w:rPr>
-              <w:t>)';</w:t>
+              <w:t>export const GRAPH_LINE_COLOR = 'var(--automation-line)';</w:t>
+            </w:r>
+          </w:p>
+          <w:p>
+            <w:pPr>
+              <w:rPr>
+                <w:sz w:val="16"/>
+                <w:szCs w:val="18"/>
+              </w:rPr>
+            </w:pPr>
+            <w:r>
+              <w:rPr>
+                <w:sz w:val="16"/>
+                <w:szCs w:val="18"/>
+              </w:rPr>
+              <w:t>export const EASE_HANDLE_COLOR = 'var(--automation-line)';</w:t>
+            </w:r>
+          </w:p>
+          <w:p>
+            <w:pPr>
+              <w:rPr>
+                <w:sz w:val="16"/>
+                <w:szCs w:val="18"/>
+              </w:rPr>
+            </w:pPr>
+            <w:r>
+              <w:rPr>
+                <w:sz w:val="16"/>
+                <w:szCs w:val="18"/>
+              </w:rPr>
+              <w:t>export const ANCHOR_OUTER_COLOR = 'var(--automation-line)';</w:t>
+            </w:r>
+          </w:p>
+          <w:p>
+            <w:pPr>
+              <w:rPr>
+                <w:sz w:val="16"/>
+                <w:szCs w:val="18"/>
+              </w:rPr>
+            </w:pPr>
+            <w:r>
+              <w:rPr>
+                <w:sz w:val="16"/>
+                <w:szCs w:val="18"/>
+              </w:rPr>
+              <w:t>export const ANCHOR_INNER_COLOR = 'var(--input-field-bg)';</w:t>
             </w:r>
           </w:p>
           <w:p>
@@ -8103,12 +7118,28 @@
           <w:p>
             <w:pPr>
               <w:rPr>
-                <w:rFonts w:hint="eastAsia"/>
-                <w:sz w:val="16"/>
-                <w:szCs w:val="18"/>
-                <w:lang w:val="en-CA"/>
-              </w:rPr>
-            </w:pPr>
+                <w:sz w:val="16"/>
+                <w:szCs w:val="18"/>
+                <w:lang w:val="en-CA"/>
+              </w:rPr>
+            </w:pPr>
+            <w:r>
+              <w:rPr>
+                <w:rFonts w:hint="eastAsia"/>
+                <w:sz w:val="16"/>
+                <w:szCs w:val="18"/>
+                <w:lang w:val="en-CA"/>
+              </w:rPr>
+              <w:t>A</w:t>
+            </w:r>
+            <w:r>
+              <w:rPr>
+                <w:sz w:val="16"/>
+                <w:szCs w:val="18"/>
+                <w:lang w:val="en-CA"/>
+              </w:rPr>
+              <w:t>ll of these variables should work</w:t>
+            </w:r>
           </w:p>
         </w:tc>
         <w:tc>
@@ -8140,7 +7171,6 @@
                 <w:lang w:val="en-CA"/>
               </w:rPr>
             </w:pPr>
-            <w:proofErr w:type="spellStart"/>
             <w:r>
               <w:rPr>
                 <w:sz w:val="16"/>
@@ -8149,7 +7179,6 @@
               </w:rPr>
               <w:t>TorusMenuEditor.tsx</w:t>
             </w:r>
-            <w:proofErr w:type="spellEnd"/>
           </w:p>
         </w:tc>
         <w:tc>
@@ -8164,7 +7193,6 @@
                 <w:lang w:val="en-CA"/>
               </w:rPr>
             </w:pPr>
-            <w:proofErr w:type="spellStart"/>
             <w:r>
               <w:rPr>
                 <w:rFonts w:hint="eastAsia"/>
@@ -8180,45 +7208,8 @@
                 <w:szCs w:val="18"/>
                 <w:lang w:val="en-CA"/>
               </w:rPr>
-              <w:t>orusMenuEditor.tsx</w:t>
-            </w:r>
-            <w:proofErr w:type="spellEnd"/>
-            <w:r>
-              <w:rPr>
-                <w:sz w:val="16"/>
-                <w:szCs w:val="18"/>
-                <w:lang w:val="en-CA"/>
-              </w:rPr>
-              <w:t xml:space="preserve">: check component variables </w:t>
-            </w:r>
-            <w:proofErr w:type="gramStart"/>
-            <w:r>
-              <w:rPr>
-                <w:sz w:val="16"/>
-                <w:szCs w:val="18"/>
-                <w:lang w:val="en-CA"/>
-              </w:rPr>
-              <w:t>work:</w:t>
-            </w:r>
-            <w:proofErr w:type="gramEnd"/>
-            <w:r>
-              <w:rPr>
-                <w:sz w:val="16"/>
-                <w:szCs w:val="18"/>
-                <w:lang w:val="en-CA"/>
-              </w:rPr>
-              <w:t xml:space="preserve"> </w:t>
-            </w:r>
-            <w:proofErr w:type="spellStart"/>
-            <w:r>
-              <w:rPr>
-                <w:sz w:val="16"/>
-                <w:szCs w:val="18"/>
-                <w:lang w:val="en-CA"/>
-              </w:rPr>
-              <w:t>graph_height</w:t>
-            </w:r>
-            <w:proofErr w:type="spellEnd"/>
+              <w:t>orusMenuEditor.tsx: check component variables work: graph_height</w:t>
+            </w:r>
           </w:p>
         </w:tc>
         <w:tc>
@@ -8239,25 +7230,7 @@
                 <w:szCs w:val="18"/>
                 <w:lang w:val="en-CA"/>
               </w:rPr>
-              <w:t xml:space="preserve">change or tweak </w:t>
-            </w:r>
-            <w:proofErr w:type="gramStart"/>
-            <w:r>
-              <w:rPr>
-                <w:sz w:val="16"/>
-                <w:szCs w:val="18"/>
-                <w:lang w:val="en-CA"/>
-              </w:rPr>
-              <w:t>all of</w:t>
-            </w:r>
-            <w:proofErr w:type="gramEnd"/>
-            <w:r>
-              <w:rPr>
-                <w:sz w:val="16"/>
-                <w:szCs w:val="18"/>
-                <w:lang w:val="en-CA"/>
-              </w:rPr>
-              <w:t xml:space="preserve"> these variables:</w:t>
+              <w:t>change or tweak all of these variables:</w:t>
             </w:r>
           </w:p>
           <w:p>
@@ -8345,34 +7318,14 @@
                 <w:lang w:val="en-CA"/>
               </w:rPr>
             </w:pPr>
-            <w:proofErr w:type="spellStart"/>
-            <w:r>
-              <w:rPr>
-                <w:sz w:val="16"/>
-                <w:szCs w:val="18"/>
-                <w:lang w:val="en-CA"/>
-              </w:rPr>
-              <w:t>Graph.tsx</w:t>
-            </w:r>
-            <w:proofErr w:type="spellEnd"/>
-            <w:r>
-              <w:rPr>
-                <w:sz w:val="16"/>
-                <w:szCs w:val="18"/>
-                <w:lang w:val="en-CA"/>
-              </w:rPr>
-              <w:t xml:space="preserve">, </w:t>
-            </w:r>
-            <w:proofErr w:type="spellStart"/>
-            <w:r>
-              <w:rPr>
-                <w:sz w:val="16"/>
-                <w:szCs w:val="18"/>
-                <w:lang w:val="en-CA"/>
-              </w:rPr>
-              <w:t>TorusMenuEditor.tsx</w:t>
-            </w:r>
-            <w:proofErr w:type="spellEnd"/>
+            <w:r>
+              <w:rPr>
+                <w:sz w:val="16"/>
+                <w:szCs w:val="18"/>
+                <w:lang w:val="en-CA"/>
+              </w:rPr>
+              <w:t>Graph.tsx, TorusMenuEditor.tsx</w:t>
+            </w:r>
           </w:p>
         </w:tc>
         <w:tc>
@@ -8491,6 +7444,39 @@
                 <w:szCs w:val="18"/>
                 <w:lang w:val="en-CA"/>
               </w:rPr>
+              <w:t>W</w:t>
+            </w:r>
+            <w:r>
+              <w:rPr>
+                <w:sz w:val="16"/>
+                <w:szCs w:val="18"/>
+                <w:lang w:val="en-CA"/>
+              </w:rPr>
+              <w:t xml:space="preserve">orking as of </w:t>
+            </w:r>
+            <w:r>
+              <w:rPr>
+                <w:sz w:val="16"/>
+                <w:szCs w:val="18"/>
+                <w:lang w:val="en-CA"/>
+              </w:rPr>
+              <w:t>063d80a708c67bc6fe6a9cca9280e333523aa0e7</w:t>
+            </w:r>
+            <w:r>
+              <w:rPr>
+                <w:sz w:val="16"/>
+                <w:szCs w:val="18"/>
+                <w:lang w:val="en-CA"/>
+              </w:rPr>
+              <w:t xml:space="preserve"> + 1. </w:t>
+            </w:r>
+            <w:r>
+              <w:rPr>
+                <w:rFonts w:hint="eastAsia"/>
+                <w:sz w:val="16"/>
+                <w:szCs w:val="18"/>
+                <w:lang w:val="en-CA"/>
+              </w:rPr>
               <w:t>N</w:t>
             </w:r>
             <w:r>
@@ -8499,24 +7485,7 @@
                 <w:szCs w:val="18"/>
                 <w:lang w:val="en-CA"/>
               </w:rPr>
-              <w:t xml:space="preserve">o longer working. </w:t>
-            </w:r>
-            <w:r>
-              <w:rPr>
-                <w:rFonts w:hint="eastAsia"/>
-                <w:sz w:val="16"/>
-                <w:szCs w:val="18"/>
-                <w:lang w:val="en-CA"/>
-              </w:rPr>
-              <w:t>H</w:t>
-            </w:r>
-            <w:r>
-              <w:rPr>
-                <w:sz w:val="16"/>
-                <w:szCs w:val="18"/>
-                <w:lang w:val="en-CA"/>
-              </w:rPr>
-              <w:t>itbox is fucked once again.</w:t>
+              <w:t>ow both the cursor hides, is locked, and the hitbox is big</w:t>
             </w:r>
           </w:p>
         </w:tc>
@@ -8536,7 +7505,6 @@
                 <w:lang w:val="en-CA"/>
               </w:rPr>
             </w:pPr>
-            <w:proofErr w:type="spellStart"/>
             <w:r>
               <w:rPr>
                 <w:rFonts w:hint="eastAsia"/>
@@ -8552,27 +7520,8 @@
                 <w:szCs w:val="18"/>
                 <w:lang w:val="en-CA"/>
               </w:rPr>
-              <w:t>raph.tsx</w:t>
-            </w:r>
-            <w:proofErr w:type="spellEnd"/>
-            <w:r>
-              <w:rPr>
-                <w:sz w:val="16"/>
-                <w:szCs w:val="18"/>
-                <w:lang w:val="en-CA"/>
-              </w:rPr>
-              <w:t xml:space="preserve">, </w:t>
-            </w:r>
-            <w:proofErr w:type="spellStart"/>
-            <w:r>
-              <w:rPr>
-                <w:sz w:val="16"/>
-                <w:szCs w:val="18"/>
-                <w:lang w:val="en-CA"/>
-              </w:rPr>
-              <w:t>sensitivity.ts</w:t>
-            </w:r>
-            <w:proofErr w:type="spellEnd"/>
+              <w:t>raph.tsx, sensitivity.ts</w:t>
+            </w:r>
           </w:p>
         </w:tc>
         <w:tc>
@@ -8763,7 +7712,6 @@
                 <w:lang w:val="en-CA"/>
               </w:rPr>
             </w:pPr>
-            <w:proofErr w:type="spellStart"/>
             <w:r>
               <w:rPr>
                 <w:rFonts w:hint="eastAsia"/>
@@ -8779,27 +7727,8 @@
                 <w:szCs w:val="18"/>
                 <w:lang w:val="en-CA"/>
               </w:rPr>
-              <w:t>raph.tsx</w:t>
-            </w:r>
-            <w:proofErr w:type="spellEnd"/>
-            <w:r>
-              <w:rPr>
-                <w:sz w:val="16"/>
-                <w:szCs w:val="18"/>
-                <w:lang w:val="en-CA"/>
-              </w:rPr>
-              <w:t xml:space="preserve">, </w:t>
-            </w:r>
-            <w:proofErr w:type="spellStart"/>
-            <w:r>
-              <w:rPr>
-                <w:sz w:val="16"/>
-                <w:szCs w:val="18"/>
-                <w:lang w:val="en-CA"/>
-              </w:rPr>
-              <w:t>sensitivity.tsx</w:t>
-            </w:r>
-            <w:proofErr w:type="spellEnd"/>
+              <w:t>raph.tsx, sensitivity.tsx</w:t>
+            </w:r>
           </w:p>
         </w:tc>
         <w:tc>
@@ -8831,7 +7760,16 @@
                 <w:szCs w:val="18"/>
                 <w:lang w:val="en-CA"/>
               </w:rPr>
-              <w:t>ettings: components: torus menu editor: graph: anchor/ease cursor stays place</w:t>
+              <w:t xml:space="preserve">ettings: components: torus menu editor: graph: anchor/ease cursor stays </w:t>
+            </w:r>
+            <w:r>
+              <w:rPr>
+                <w:sz w:val="16"/>
+                <w:szCs w:val="18"/>
+                <w:lang w:val="en-CA"/>
+              </w:rPr>
+              <w:lastRenderedPageBreak/>
+              <w:t>place</w:t>
             </w:r>
           </w:p>
         </w:tc>
@@ -8856,6 +7794,7 @@
                 <w:szCs w:val="18"/>
                 <w:lang w:val="en-CA"/>
               </w:rPr>
+              <w:lastRenderedPageBreak/>
               <w:t>D</w:t>
             </w:r>
             <w:r>
@@ -8975,7 +7914,6 @@
                 <w:lang w:val="en-CA"/>
               </w:rPr>
             </w:pPr>
-            <w:proofErr w:type="spellStart"/>
             <w:r>
               <w:rPr>
                 <w:rFonts w:hint="eastAsia"/>
@@ -8991,28 +7929,8 @@
                 <w:szCs w:val="18"/>
                 <w:lang w:val="en-CA"/>
               </w:rPr>
-              <w:t>raph.tsx</w:t>
-            </w:r>
-            <w:proofErr w:type="spellEnd"/>
-            <w:r>
-              <w:rPr>
-                <w:sz w:val="16"/>
-                <w:szCs w:val="18"/>
-                <w:lang w:val="en-CA"/>
-              </w:rPr>
-              <w:t xml:space="preserve">, </w:t>
-            </w:r>
-            <w:proofErr w:type="spellStart"/>
-            <w:r>
-              <w:rPr>
-                <w:sz w:val="16"/>
-                <w:szCs w:val="18"/>
-                <w:lang w:val="en-CA"/>
-              </w:rPr>
-              <w:lastRenderedPageBreak/>
-              <w:t>TorusMenuEditor.tsx</w:t>
-            </w:r>
-            <w:proofErr w:type="spellEnd"/>
+              <w:t>raph.tsx, TorusMenuEditor.tsx</w:t>
+            </w:r>
           </w:p>
         </w:tc>
         <w:tc>
@@ -9036,7 +7954,6 @@
                 <w:szCs w:val="18"/>
                 <w:lang w:val="en-CA"/>
               </w:rPr>
-              <w:lastRenderedPageBreak/>
               <w:t>S</w:t>
             </w:r>
             <w:r>
@@ -9045,16 +7962,7 @@
                 <w:szCs w:val="18"/>
                 <w:lang w:val="en-CA"/>
               </w:rPr>
-              <w:t xml:space="preserve">ettings: components: </w:t>
-            </w:r>
-            <w:r>
-              <w:rPr>
-                <w:sz w:val="16"/>
-                <w:szCs w:val="18"/>
-                <w:lang w:val="en-CA"/>
-              </w:rPr>
-              <w:lastRenderedPageBreak/>
-              <w:t>torus menu editor: graph: multiple anchor points</w:t>
+              <w:t>ettings: components: torus menu editor: graph: multiple anchor points</w:t>
             </w:r>
           </w:p>
         </w:tc>
@@ -9079,7 +7987,6 @@
                 <w:szCs w:val="18"/>
                 <w:lang w:val="en-CA"/>
               </w:rPr>
-              <w:lastRenderedPageBreak/>
               <w:t>C</w:t>
             </w:r>
             <w:r>
@@ -9088,16 +7995,7 @@
                 <w:szCs w:val="18"/>
                 <w:lang w:val="en-CA"/>
               </w:rPr>
-              <w:t xml:space="preserve">lick and drag a point and </w:t>
-            </w:r>
-            <w:r>
-              <w:rPr>
-                <w:sz w:val="16"/>
-                <w:szCs w:val="18"/>
-                <w:lang w:val="en-CA"/>
-              </w:rPr>
-              <w:lastRenderedPageBreak/>
-              <w:t xml:space="preserve">move it up and towards the beginning of the graph. </w:t>
+              <w:t xml:space="preserve">lick and drag a point and move it up and towards the beginning of the graph. </w:t>
             </w:r>
             <w:r>
               <w:rPr>
@@ -9139,7 +8037,6 @@
                 <w:szCs w:val="18"/>
                 <w:lang w:val="en-CA"/>
               </w:rPr>
-              <w:lastRenderedPageBreak/>
               <w:t>T</w:t>
             </w:r>
             <w:r>
@@ -9148,16 +8045,7 @@
                 <w:szCs w:val="18"/>
                 <w:lang w:val="en-CA"/>
               </w:rPr>
-              <w:t xml:space="preserve">he points should be immediately created </w:t>
-            </w:r>
-            <w:r>
-              <w:rPr>
-                <w:sz w:val="16"/>
-                <w:szCs w:val="18"/>
-                <w:lang w:val="en-CA"/>
-              </w:rPr>
-              <w:lastRenderedPageBreak/>
-              <w:t xml:space="preserve">as soon as you clicked your mouse button down, and the anchor point should’ve followed your mouse as you dragged it across the graph. </w:t>
+              <w:t xml:space="preserve">he points should be immediately created as soon as you clicked your mouse button down, and the anchor point should’ve followed your mouse as you dragged it across the graph. </w:t>
             </w:r>
           </w:p>
         </w:tc>
@@ -9182,7 +8070,6 @@
                 <w:szCs w:val="18"/>
                 <w:lang w:val="en-CA"/>
               </w:rPr>
-              <w:lastRenderedPageBreak/>
               <w:t>W</w:t>
             </w:r>
             <w:r>
@@ -9199,7 +8086,6 @@
                 <w:szCs w:val="18"/>
                 <w:lang w:val="en-CA"/>
               </w:rPr>
-              <w:lastRenderedPageBreak/>
               <w:t>5bddf836872611033759d627746d8b4161bba22a</w:t>
             </w:r>
           </w:p>
@@ -9220,15 +8106,13 @@
                 <w:lang w:val="en-CA"/>
               </w:rPr>
             </w:pPr>
-            <w:proofErr w:type="spellStart"/>
-            <w:r>
-              <w:rPr>
-                <w:rFonts w:hint="eastAsia"/>
-                <w:sz w:val="16"/>
-                <w:szCs w:val="18"/>
-                <w:lang w:val="en-CA"/>
-              </w:rPr>
-              <w:lastRenderedPageBreak/>
+            <w:r>
+              <w:rPr>
+                <w:rFonts w:hint="eastAsia"/>
+                <w:sz w:val="16"/>
+                <w:szCs w:val="18"/>
+                <w:lang w:val="en-CA"/>
+              </w:rPr>
               <w:t>G</w:t>
             </w:r>
             <w:r>
@@ -9237,27 +8121,8 @@
                 <w:szCs w:val="18"/>
                 <w:lang w:val="en-CA"/>
               </w:rPr>
-              <w:t>raph.tsx</w:t>
-            </w:r>
-            <w:proofErr w:type="spellEnd"/>
-            <w:r>
-              <w:rPr>
-                <w:sz w:val="16"/>
-                <w:szCs w:val="18"/>
-                <w:lang w:val="en-CA"/>
-              </w:rPr>
-              <w:t xml:space="preserve">, </w:t>
-            </w:r>
-            <w:proofErr w:type="spellStart"/>
-            <w:r>
-              <w:rPr>
-                <w:sz w:val="16"/>
-                <w:szCs w:val="18"/>
-                <w:lang w:val="en-CA"/>
-              </w:rPr>
-              <w:t>TorusMenuEditor.tsx</w:t>
-            </w:r>
-            <w:proofErr w:type="spellEnd"/>
+              <w:t>raph.tsx, TorusMenuEditor.tsx</w:t>
+            </w:r>
           </w:p>
         </w:tc>
         <w:tc>
@@ -9458,7 +8323,6 @@
                 <w:lang w:val="en-CA"/>
               </w:rPr>
             </w:pPr>
-            <w:proofErr w:type="spellStart"/>
             <w:r>
               <w:rPr>
                 <w:sz w:val="16"/>
@@ -9467,7 +8331,6 @@
               </w:rPr>
               <w:t>TorusMenuEditor.tsx</w:t>
             </w:r>
-            <w:proofErr w:type="spellEnd"/>
           </w:p>
         </w:tc>
         <w:tc>
@@ -9805,7 +8668,6 @@
                 <w:lang w:val="en-CA"/>
               </w:rPr>
             </w:pPr>
-            <w:proofErr w:type="spellStart"/>
             <w:r>
               <w:rPr>
                 <w:sz w:val="16"/>
@@ -9814,7 +8676,6 @@
               </w:rPr>
               <w:t>TorusMenuEditor.tsx</w:t>
             </w:r>
-            <w:proofErr w:type="spellEnd"/>
           </w:p>
         </w:tc>
         <w:tc>
@@ -9994,7 +8855,6 @@
                 <w:lang w:val="en-CA"/>
               </w:rPr>
             </w:pPr>
-            <w:proofErr w:type="spellStart"/>
             <w:r>
               <w:rPr>
                 <w:sz w:val="16"/>
@@ -10003,7 +8863,6 @@
               </w:rPr>
               <w:t>TorusMenuEditor.tsx</w:t>
             </w:r>
-            <w:proofErr w:type="spellEnd"/>
           </w:p>
         </w:tc>
         <w:tc>
@@ -10074,25 +8933,7 @@
                 <w:szCs w:val="18"/>
                 <w:lang w:val="en-CA"/>
               </w:rPr>
-              <w:t xml:space="preserve">dd a bunch of anchor points and adjust </w:t>
-            </w:r>
-            <w:proofErr w:type="gramStart"/>
-            <w:r>
-              <w:rPr>
-                <w:sz w:val="16"/>
-                <w:szCs w:val="18"/>
-                <w:lang w:val="en-CA"/>
-              </w:rPr>
-              <w:t>all of</w:t>
-            </w:r>
-            <w:proofErr w:type="gramEnd"/>
-            <w:r>
-              <w:rPr>
-                <w:sz w:val="16"/>
-                <w:szCs w:val="18"/>
-                <w:lang w:val="en-CA"/>
-              </w:rPr>
-              <w:t xml:space="preserve"> the ease handles to a non-default or non-linear position. </w:t>
+              <w:t xml:space="preserve">dd a bunch of anchor points and adjust all of the ease handles to a non-default or non-linear position. </w:t>
             </w:r>
             <w:r>
               <w:rPr>
@@ -10204,7 +9045,6 @@
           <w:lang w:val="en-CA"/>
         </w:rPr>
       </w:pPr>
-      <w:proofErr w:type="spellStart"/>
       <w:r>
         <w:rPr>
           <w:b/>
@@ -10213,10 +9053,8 @@
           <w:szCs w:val="32"/>
           <w:lang w:val="en-CA"/>
         </w:rPr>
-        <w:lastRenderedPageBreak/>
         <w:t>TorusMenu.tsx</w:t>
       </w:r>
-      <w:proofErr w:type="spellEnd"/>
     </w:p>
     <w:tbl>
       <w:tblPr>
@@ -10417,18 +9255,8 @@
                 <w:szCs w:val="18"/>
                 <w:lang w:val="en-CA"/>
               </w:rPr>
-              <w:t xml:space="preserve"> </w:t>
-            </w:r>
-            <w:proofErr w:type="spellStart"/>
-            <w:r>
-              <w:rPr>
-                <w:sz w:val="16"/>
-                <w:szCs w:val="18"/>
-                <w:lang w:val="en-CA"/>
-              </w:rPr>
-              <w:t>TorusMenu.tsx</w:t>
-            </w:r>
-            <w:proofErr w:type="spellEnd"/>
+              <w:t xml:space="preserve"> TorusMenu.tsx</w:t>
+            </w:r>
           </w:p>
         </w:tc>
         <w:tc>
@@ -10499,25 +9327,7 @@
                 <w:szCs w:val="18"/>
                 <w:lang w:val="en-CA"/>
               </w:rPr>
-              <w:t xml:space="preserve">hen, on a </w:t>
-            </w:r>
-            <w:proofErr w:type="gramStart"/>
-            <w:r>
-              <w:rPr>
-                <w:sz w:val="16"/>
-                <w:szCs w:val="18"/>
-                <w:lang w:val="en-CA"/>
-              </w:rPr>
-              <w:t>45 degree</w:t>
-            </w:r>
-            <w:proofErr w:type="gramEnd"/>
-            <w:r>
-              <w:rPr>
-                <w:sz w:val="16"/>
-                <w:szCs w:val="18"/>
-                <w:lang w:val="en-CA"/>
-              </w:rPr>
-              <w:t xml:space="preserve"> angle right outside the circle, click.</w:t>
+              <w:t>hen, on a 45 degree angle right outside the circle, click.</w:t>
             </w:r>
           </w:p>
         </w:tc>
@@ -10634,7 +9444,6 @@
           <w:lang w:val="en-CA"/>
         </w:rPr>
       </w:pPr>
-      <w:proofErr w:type="spellStart"/>
       <w:r>
         <w:rPr>
           <w:b/>
@@ -10645,7 +9454,6 @@
         </w:rPr>
         <w:t>ColorPicker.tsx</w:t>
       </w:r>
-      <w:proofErr w:type="spellEnd"/>
     </w:p>
     <w:tbl>
       <w:tblPr>
@@ -10840,52 +9648,14 @@
                 <w:lang w:val="en-CA"/>
               </w:rPr>
             </w:pPr>
-            <w:proofErr w:type="spellStart"/>
-            <w:r>
-              <w:rPr>
-                <w:sz w:val="16"/>
-                <w:szCs w:val="18"/>
-                <w:lang w:val="en-CA"/>
-              </w:rPr>
-              <w:t>ColorPicker.tsx</w:t>
-            </w:r>
-            <w:proofErr w:type="spellEnd"/>
-            <w:r>
-              <w:rPr>
-                <w:sz w:val="16"/>
-                <w:szCs w:val="18"/>
-                <w:lang w:val="en-CA"/>
-              </w:rPr>
-              <w:t xml:space="preserve">, </w:t>
-            </w:r>
-            <w:proofErr w:type="spellStart"/>
-            <w:r>
-              <w:rPr>
-                <w:sz w:val="16"/>
-                <w:szCs w:val="18"/>
-                <w:lang w:val="en-CA"/>
-              </w:rPr>
-              <w:t>Styles.tsx</w:t>
-            </w:r>
-            <w:proofErr w:type="spellEnd"/>
-            <w:r>
-              <w:rPr>
-                <w:sz w:val="16"/>
-                <w:szCs w:val="18"/>
-                <w:lang w:val="en-CA"/>
-              </w:rPr>
-              <w:t xml:space="preserve">, </w:t>
-            </w:r>
-            <w:proofErr w:type="spellStart"/>
-            <w:r>
-              <w:rPr>
-                <w:sz w:val="16"/>
-                <w:szCs w:val="18"/>
-                <w:lang w:val="en-CA"/>
-              </w:rPr>
-              <w:t>App.tsx</w:t>
-            </w:r>
-            <w:proofErr w:type="spellEnd"/>
+            <w:r>
+              <w:rPr>
+                <w:sz w:val="16"/>
+                <w:szCs w:val="18"/>
+                <w:lang w:val="en-CA"/>
+              </w:rPr>
+              <w:t>ColorPicker.tsx, Styles.tsx, App.tsx</w:t>
+            </w:r>
           </w:p>
         </w:tc>
         <w:tc>
@@ -11159,34 +9929,14 @@
                 <w:lang w:val="en-CA"/>
               </w:rPr>
             </w:pPr>
-            <w:proofErr w:type="spellStart"/>
-            <w:r>
-              <w:rPr>
-                <w:sz w:val="16"/>
-                <w:szCs w:val="18"/>
-                <w:lang w:val="en-CA"/>
-              </w:rPr>
-              <w:t>Styles.tsx</w:t>
-            </w:r>
-            <w:proofErr w:type="spellEnd"/>
-            <w:r>
-              <w:rPr>
-                <w:sz w:val="16"/>
-                <w:szCs w:val="18"/>
-                <w:lang w:val="en-CA"/>
-              </w:rPr>
-              <w:t xml:space="preserve">, </w:t>
-            </w:r>
-            <w:proofErr w:type="spellStart"/>
-            <w:r>
-              <w:rPr>
-                <w:sz w:val="16"/>
-                <w:szCs w:val="18"/>
-                <w:lang w:val="en-CA"/>
-              </w:rPr>
-              <w:t>App.tsx</w:t>
-            </w:r>
-            <w:proofErr w:type="spellEnd"/>
+            <w:r>
+              <w:rPr>
+                <w:sz w:val="16"/>
+                <w:szCs w:val="18"/>
+                <w:lang w:val="en-CA"/>
+              </w:rPr>
+              <w:t>Styles.tsx, App.tsx</w:t>
+            </w:r>
           </w:p>
         </w:tc>
         <w:tc>
@@ -11414,7 +10164,6 @@
                 <w:lang w:val="en-CA"/>
               </w:rPr>
             </w:pPr>
-            <w:proofErr w:type="spellStart"/>
             <w:r>
               <w:rPr>
                 <w:sz w:val="16"/>
@@ -11423,7 +10172,6 @@
               </w:rPr>
               <w:t>ColorPicker.tsx</w:t>
             </w:r>
-            <w:proofErr w:type="spellEnd"/>
           </w:p>
         </w:tc>
         <w:tc>
@@ -11618,7 +10366,6 @@
           <w:lang w:val="en-CA"/>
         </w:rPr>
       </w:pPr>
-      <w:proofErr w:type="spellStart"/>
       <w:r>
         <w:rPr>
           <w:b/>
@@ -11627,7 +10374,6 @@
           <w:szCs w:val="32"/>
           <w:lang w:val="en-CA"/>
         </w:rPr>
-        <w:lastRenderedPageBreak/>
         <w:t>Toast</w:t>
       </w:r>
       <w:r>
@@ -11640,7 +10386,6 @@
         </w:rPr>
         <w:t>.tsx</w:t>
       </w:r>
-      <w:proofErr w:type="spellEnd"/>
     </w:p>
     <w:tbl>
       <w:tblPr>
@@ -11835,7 +10580,6 @@
                 <w:lang w:val="en-CA"/>
               </w:rPr>
             </w:pPr>
-            <w:proofErr w:type="spellStart"/>
             <w:r>
               <w:rPr>
                 <w:rFonts w:hint="eastAsia"/>
@@ -11851,27 +10595,8 @@
                 <w:szCs w:val="18"/>
                 <w:lang w:val="en-CA"/>
               </w:rPr>
-              <w:t>pp.tsx</w:t>
-            </w:r>
-            <w:proofErr w:type="spellEnd"/>
-            <w:r>
-              <w:rPr>
-                <w:sz w:val="16"/>
-                <w:szCs w:val="18"/>
-                <w:lang w:val="en-CA"/>
-              </w:rPr>
-              <w:t xml:space="preserve">, </w:t>
-            </w:r>
-            <w:proofErr w:type="spellStart"/>
-            <w:r>
-              <w:rPr>
-                <w:sz w:val="16"/>
-                <w:szCs w:val="18"/>
-                <w:lang w:val="en-CA"/>
-              </w:rPr>
-              <w:t>toast.tsx</w:t>
-            </w:r>
-            <w:proofErr w:type="spellEnd"/>
+              <w:t>pp.tsx, toast.tsx</w:t>
+            </w:r>
           </w:p>
         </w:tc>
         <w:tc>
@@ -11934,25 +10659,7 @@
                 <w:szCs w:val="18"/>
                 <w:lang w:val="en-CA"/>
               </w:rPr>
-              <w:t xml:space="preserve">o into </w:t>
-            </w:r>
-            <w:proofErr w:type="spellStart"/>
-            <w:r>
-              <w:rPr>
-                <w:sz w:val="16"/>
-                <w:szCs w:val="18"/>
-                <w:lang w:val="en-CA"/>
-              </w:rPr>
-              <w:t>app.tsx</w:t>
-            </w:r>
-            <w:proofErr w:type="spellEnd"/>
-            <w:r>
-              <w:rPr>
-                <w:sz w:val="16"/>
-                <w:szCs w:val="18"/>
-                <w:lang w:val="en-CA"/>
-              </w:rPr>
-              <w:t xml:space="preserve"> wherever there is a toast instantiation. </w:t>
+              <w:t xml:space="preserve">o into app.tsx wherever there is a toast instantiation. </w:t>
             </w:r>
             <w:r>
               <w:rPr>
@@ -12170,7 +10877,6 @@
                 <w:lang w:val="en-CA"/>
               </w:rPr>
             </w:pPr>
-            <w:proofErr w:type="spellStart"/>
             <w:r>
               <w:rPr>
                 <w:rFonts w:hint="eastAsia"/>
@@ -12186,27 +10892,8 @@
                 <w:szCs w:val="18"/>
                 <w:lang w:val="en-CA"/>
               </w:rPr>
-              <w:t>pp.tsx</w:t>
-            </w:r>
-            <w:proofErr w:type="spellEnd"/>
-            <w:r>
-              <w:rPr>
-                <w:sz w:val="16"/>
-                <w:szCs w:val="18"/>
-                <w:lang w:val="en-CA"/>
-              </w:rPr>
-              <w:t xml:space="preserve">, </w:t>
-            </w:r>
-            <w:proofErr w:type="spellStart"/>
-            <w:r>
-              <w:rPr>
-                <w:sz w:val="16"/>
-                <w:szCs w:val="18"/>
-                <w:lang w:val="en-CA"/>
-              </w:rPr>
-              <w:t>toast.tsx</w:t>
-            </w:r>
-            <w:proofErr w:type="spellEnd"/>
+              <w:t>pp.tsx, toast.tsx</w:t>
+            </w:r>
           </w:p>
         </w:tc>
         <w:tc>
@@ -12269,25 +10956,7 @@
                 <w:szCs w:val="18"/>
                 <w:lang w:val="en-CA"/>
               </w:rPr>
-              <w:t xml:space="preserve">rigger the “open multiple menus </w:t>
-            </w:r>
-            <w:proofErr w:type="gramStart"/>
-            <w:r>
-              <w:rPr>
-                <w:sz w:val="16"/>
-                <w:szCs w:val="18"/>
-                <w:lang w:val="en-CA"/>
-              </w:rPr>
-              <w:t>is</w:t>
-            </w:r>
-            <w:proofErr w:type="gramEnd"/>
-            <w:r>
-              <w:rPr>
-                <w:sz w:val="16"/>
-                <w:szCs w:val="18"/>
-                <w:lang w:val="en-CA"/>
-              </w:rPr>
-              <w:t xml:space="preserve"> disabled!” toast by turning off allow open multiple menus and attempting to open multiple menus. </w:t>
+              <w:t xml:space="preserve">rigger the “open multiple menus is disabled!” toast by turning off allow open multiple menus and attempting to open multiple menus. </w:t>
             </w:r>
           </w:p>
         </w:tc>
@@ -12402,7 +11071,6 @@
           <w:lang w:val="en-CA"/>
         </w:rPr>
       </w:pPr>
-      <w:proofErr w:type="spellStart"/>
       <w:r>
         <w:rPr>
           <w:b/>
@@ -12413,7 +11081,6 @@
         </w:rPr>
         <w:t>PlayneedleEditor.tsx</w:t>
       </w:r>
-      <w:proofErr w:type="spellEnd"/>
     </w:p>
     <w:tbl>
       <w:tblPr>
@@ -12608,7 +11275,6 @@
                 <w:lang w:val="en-CA"/>
               </w:rPr>
             </w:pPr>
-            <w:proofErr w:type="spellStart"/>
             <w:r>
               <w:rPr>
                 <w:sz w:val="16"/>
@@ -12617,7 +11283,6 @@
               </w:rPr>
               <w:t>PlayneedleEditor.tsx</w:t>
             </w:r>
-            <w:proofErr w:type="spellEnd"/>
           </w:p>
         </w:tc>
         <w:tc>
@@ -12648,25 +11313,7 @@
                 <w:szCs w:val="18"/>
                 <w:lang w:val="en-CA"/>
               </w:rPr>
-              <w:t xml:space="preserve">ettings: components: </w:t>
-            </w:r>
-            <w:proofErr w:type="spellStart"/>
-            <w:r>
-              <w:rPr>
-                <w:sz w:val="16"/>
-                <w:szCs w:val="18"/>
-                <w:lang w:val="en-CA"/>
-              </w:rPr>
-              <w:t>playneedle</w:t>
-            </w:r>
-            <w:proofErr w:type="spellEnd"/>
-            <w:r>
-              <w:rPr>
-                <w:sz w:val="16"/>
-                <w:szCs w:val="18"/>
-                <w:lang w:val="en-CA"/>
-              </w:rPr>
-              <w:t xml:space="preserve"> editor: width slider</w:t>
+              <w:t>ettings: components: playneedle editor: width slider</w:t>
             </w:r>
           </w:p>
         </w:tc>
@@ -12698,43 +11345,7 @@
                 <w:szCs w:val="18"/>
                 <w:lang w:val="en-CA"/>
               </w:rPr>
-              <w:t xml:space="preserve">hange the </w:t>
-            </w:r>
-            <w:proofErr w:type="spellStart"/>
-            <w:r>
-              <w:rPr>
-                <w:sz w:val="16"/>
-                <w:szCs w:val="18"/>
-                <w:lang w:val="en-CA"/>
-              </w:rPr>
-              <w:t>playneedle</w:t>
-            </w:r>
-            <w:proofErr w:type="spellEnd"/>
-            <w:r>
-              <w:rPr>
-                <w:sz w:val="16"/>
-                <w:szCs w:val="18"/>
-                <w:lang w:val="en-CA"/>
-              </w:rPr>
-              <w:t xml:space="preserve"> width (</w:t>
-            </w:r>
-            <w:proofErr w:type="spellStart"/>
-            <w:r>
-              <w:rPr>
-                <w:sz w:val="16"/>
-                <w:szCs w:val="18"/>
-                <w:lang w:val="en-CA"/>
-              </w:rPr>
-              <w:t>px</w:t>
-            </w:r>
-            <w:proofErr w:type="spellEnd"/>
-            <w:r>
-              <w:rPr>
-                <w:sz w:val="16"/>
-                <w:szCs w:val="18"/>
-                <w:lang w:val="en-CA"/>
-              </w:rPr>
-              <w:t>) slider</w:t>
+              <w:t>hange the playneedle width (px) slider</w:t>
             </w:r>
           </w:p>
         </w:tc>
@@ -12766,25 +11377,7 @@
                 <w:szCs w:val="18"/>
                 <w:lang w:val="en-CA"/>
               </w:rPr>
-              <w:t xml:space="preserve">t should change the width of the </w:t>
-            </w:r>
-            <w:proofErr w:type="spellStart"/>
-            <w:r>
-              <w:rPr>
-                <w:sz w:val="16"/>
-                <w:szCs w:val="18"/>
-                <w:lang w:val="en-CA"/>
-              </w:rPr>
-              <w:t>playneedle</w:t>
-            </w:r>
-            <w:proofErr w:type="spellEnd"/>
-            <w:r>
-              <w:rPr>
-                <w:sz w:val="16"/>
-                <w:szCs w:val="18"/>
-                <w:lang w:val="en-CA"/>
-              </w:rPr>
-              <w:t xml:space="preserve"> both inside the editor and in the timeline.</w:t>
+              <w:t>t should change the width of the playneedle both inside the editor and in the timeline.</w:t>
             </w:r>
           </w:p>
         </w:tc>
@@ -12855,7 +11448,6 @@
           <w:lang w:val="en-CA"/>
         </w:rPr>
       </w:pPr>
-      <w:proofErr w:type="spellStart"/>
       <w:r>
         <w:rPr>
           <w:b/>
@@ -12864,31 +11456,8 @@
           <w:szCs w:val="32"/>
           <w:lang w:val="en-CA"/>
         </w:rPr>
-        <w:t>modalManager.ts</w:t>
+        <w:t>modalManager.ts &amp; modalPermissions.ts</w:t>
       </w:r>
-      <w:proofErr w:type="spellEnd"/>
-      <w:r>
-        <w:rPr>
-          <w:b/>
-          <w:bCs/>
-          <w:sz w:val="28"/>
-          <w:szCs w:val="32"/>
-          <w:lang w:val="en-CA"/>
-        </w:rPr>
-        <w:t xml:space="preserve"> &amp; </w:t>
-      </w:r>
-      <w:proofErr w:type="spellStart"/>
-      <w:r>
-        <w:rPr>
-          <w:b/>
-          <w:bCs/>
-          <w:sz w:val="28"/>
-          <w:szCs w:val="32"/>
-          <w:lang w:val="en-CA"/>
-        </w:rPr>
-        <w:t>modalPermissions.ts</w:t>
-      </w:r>
-      <w:proofErr w:type="spellEnd"/>
     </w:p>
     <w:p>
       <w:pPr>

</xml_diff>

<commit_message>
fixed Settings: components: graph: anchor point deletion: right click. you can now right click to delete an anchor point (was broken ever since the hidden cursor implementation, now fixed)
</commit_message>
<xml_diff>
--- a/test plan.docx
+++ b/test plan.docx
@@ -6369,6 +6369,7 @@
           <w:p>
             <w:pPr>
               <w:rPr>
+                <w:rFonts w:hint="eastAsia"/>
                 <w:sz w:val="16"/>
                 <w:szCs w:val="18"/>
                 <w:lang w:val="en-CA"/>
@@ -6923,6 +6924,7 @@
           <w:p>
             <w:pPr>
               <w:rPr>
+                <w:rFonts w:hint="eastAsia"/>
                 <w:sz w:val="16"/>
                 <w:szCs w:val="18"/>
                 <w:lang w:val="en-CA"/>
@@ -6954,6 +6956,7 @@
           <w:p>
             <w:pPr>
               <w:rPr>
+                <w:rFonts w:hint="eastAsia"/>
                 <w:sz w:val="16"/>
                 <w:szCs w:val="18"/>
                 <w:lang w:val="en-CA"/>
@@ -6985,6 +6988,7 @@
           <w:p>
             <w:pPr>
               <w:rPr>
+                <w:rFonts w:hint="eastAsia"/>
                 <w:sz w:val="16"/>
                 <w:szCs w:val="18"/>
               </w:rPr>
@@ -7000,6 +7004,7 @@
           <w:p>
             <w:pPr>
               <w:rPr>
+                <w:rFonts w:hint="eastAsia"/>
                 <w:sz w:val="16"/>
                 <w:szCs w:val="18"/>
               </w:rPr>
@@ -7015,6 +7020,7 @@
           <w:p>
             <w:pPr>
               <w:rPr>
+                <w:rFonts w:hint="eastAsia"/>
                 <w:sz w:val="16"/>
                 <w:szCs w:val="18"/>
               </w:rPr>
@@ -7030,6 +7036,7 @@
           <w:p>
             <w:pPr>
               <w:rPr>
+                <w:rFonts w:hint="eastAsia"/>
                 <w:sz w:val="16"/>
                 <w:szCs w:val="18"/>
               </w:rPr>
@@ -7045,6 +7052,7 @@
           <w:p>
             <w:pPr>
               <w:rPr>
+                <w:rFonts w:hint="eastAsia"/>
                 <w:sz w:val="16"/>
                 <w:szCs w:val="18"/>
               </w:rPr>
@@ -7060,6 +7068,7 @@
           <w:p>
             <w:pPr>
               <w:rPr>
+                <w:rFonts w:hint="eastAsia"/>
                 <w:sz w:val="16"/>
                 <w:szCs w:val="18"/>
               </w:rPr>
@@ -7075,6 +7084,7 @@
           <w:p>
             <w:pPr>
               <w:rPr>
+                <w:rFonts w:hint="eastAsia"/>
                 <w:sz w:val="16"/>
                 <w:szCs w:val="18"/>
               </w:rPr>
@@ -7090,6 +7100,7 @@
           <w:p>
             <w:pPr>
               <w:rPr>
+                <w:rFonts w:hint="eastAsia"/>
                 <w:sz w:val="16"/>
                 <w:szCs w:val="18"/>
               </w:rPr>
@@ -7105,6 +7116,7 @@
           <w:p>
             <w:pPr>
               <w:rPr>
+                <w:rFonts w:hint="eastAsia"/>
                 <w:sz w:val="16"/>
                 <w:szCs w:val="18"/>
               </w:rPr>
@@ -7118,6 +7130,7 @@
           <w:p>
             <w:pPr>
               <w:rPr>
+                <w:rFonts w:hint="eastAsia"/>
                 <w:sz w:val="16"/>
                 <w:szCs w:val="18"/>
                 <w:lang w:val="en-CA"/>
@@ -7166,6 +7179,7 @@
           <w:p>
             <w:pPr>
               <w:rPr>
+                <w:rFonts w:hint="eastAsia"/>
                 <w:sz w:val="16"/>
                 <w:szCs w:val="18"/>
                 <w:lang w:val="en-CA"/>
@@ -7188,6 +7202,7 @@
           <w:p>
             <w:pPr>
               <w:rPr>
+                <w:rFonts w:hint="eastAsia"/>
                 <w:sz w:val="16"/>
                 <w:szCs w:val="18"/>
                 <w:lang w:val="en-CA"/>
@@ -7219,6 +7234,7 @@
           <w:p>
             <w:pPr>
               <w:rPr>
+                <w:rFonts w:hint="eastAsia"/>
                 <w:sz w:val="16"/>
                 <w:szCs w:val="18"/>
                 <w:lang w:val="en-CA"/>
@@ -7236,6 +7252,7 @@
           <w:p>
             <w:pPr>
               <w:rPr>
+                <w:rFonts w:hint="eastAsia"/>
                 <w:sz w:val="16"/>
                 <w:szCs w:val="18"/>
               </w:rPr>
@@ -7251,6 +7268,7 @@
           <w:p>
             <w:pPr>
               <w:rPr>
+                <w:rFonts w:hint="eastAsia"/>
                 <w:sz w:val="16"/>
                 <w:szCs w:val="18"/>
               </w:rPr>
@@ -7264,6 +7282,7 @@
           <w:p>
             <w:pPr>
               <w:rPr>
+                <w:rFonts w:hint="eastAsia"/>
                 <w:sz w:val="16"/>
                 <w:szCs w:val="18"/>
                 <w:lang w:val="en-CA"/>
@@ -7431,45 +7450,11 @@
           <w:p>
             <w:pPr>
               <w:rPr>
-                <w:rFonts w:hint="eastAsia"/>
-                <w:sz w:val="16"/>
-                <w:szCs w:val="18"/>
-                <w:lang w:val="en-CA"/>
-              </w:rPr>
-            </w:pPr>
-            <w:r>
-              <w:rPr>
-                <w:rFonts w:hint="eastAsia"/>
-                <w:sz w:val="16"/>
-                <w:szCs w:val="18"/>
-                <w:lang w:val="en-CA"/>
-              </w:rPr>
-              <w:t>W</w:t>
-            </w:r>
-            <w:r>
-              <w:rPr>
-                <w:sz w:val="16"/>
-                <w:szCs w:val="18"/>
-                <w:lang w:val="en-CA"/>
-              </w:rPr>
-              <w:t xml:space="preserve">orking as of </w:t>
-            </w:r>
-            <w:r>
-              <w:rPr>
-                <w:sz w:val="16"/>
-                <w:szCs w:val="18"/>
-                <w:lang w:val="en-CA"/>
-              </w:rPr>
-              <w:t>063d80a708c67bc6fe6a9cca9280e333523aa0e7</w:t>
-            </w:r>
-            <w:r>
-              <w:rPr>
-                <w:sz w:val="16"/>
-                <w:szCs w:val="18"/>
-                <w:lang w:val="en-CA"/>
-              </w:rPr>
-              <w:t xml:space="preserve"> + 1. </w:t>
-            </w:r>
+                <w:sz w:val="16"/>
+                <w:szCs w:val="18"/>
+                <w:lang w:val="en-CA"/>
+              </w:rPr>
+            </w:pPr>
             <w:r>
               <w:rPr>
                 <w:rFonts w:hint="eastAsia"/>
@@ -7485,7 +7470,23 @@
                 <w:szCs w:val="18"/>
                 <w:lang w:val="en-CA"/>
               </w:rPr>
-              <w:t>ow both the cursor hides, is locked, and the hitbox is big</w:t>
+              <w:t xml:space="preserve">ot working as of </w:t>
+            </w:r>
+            <w:r>
+              <w:rPr>
+                <w:sz w:val="16"/>
+                <w:szCs w:val="18"/>
+                <w:lang w:val="en-CA"/>
+              </w:rPr>
+              <w:t>e23c4b489f3e11c5fec8e3dd955f1c02ddb932c1</w:t>
+            </w:r>
+            <w:r>
+              <w:rPr>
+                <w:sz w:val="16"/>
+                <w:szCs w:val="18"/>
+                <w:lang w:val="en-CA"/>
+              </w:rPr>
+              <w:t xml:space="preserve"> + 1. I must click and drag around the ease handler to move it up or down.</w:t>
             </w:r>
           </w:p>
         </w:tc>
@@ -7499,7 +7500,6 @@
           <w:p>
             <w:pPr>
               <w:rPr>
-                <w:rFonts w:hint="eastAsia"/>
                 <w:sz w:val="16"/>
                 <w:szCs w:val="18"/>
                 <w:lang w:val="en-CA"/>
@@ -7520,7 +7520,7 @@
                 <w:szCs w:val="18"/>
                 <w:lang w:val="en-CA"/>
               </w:rPr>
-              <w:t>raph.tsx, sensitivity.ts</w:t>
+              <w:t>raph.tsx</w:t>
             </w:r>
           </w:p>
         </w:tc>
@@ -7532,7 +7532,6 @@
           <w:p>
             <w:pPr>
               <w:rPr>
-                <w:rFonts w:hint="eastAsia"/>
                 <w:sz w:val="16"/>
                 <w:szCs w:val="18"/>
                 <w:lang w:val="en-CA"/>
@@ -7553,23 +7552,7 @@
                 <w:szCs w:val="18"/>
                 <w:lang w:val="en-CA"/>
               </w:rPr>
-              <w:t xml:space="preserve">ettings: components: torus menu editor: graph: </w:t>
-            </w:r>
-            <w:r>
-              <w:rPr>
-                <w:sz w:val="16"/>
-                <w:szCs w:val="18"/>
-                <w:lang w:val="en-CA"/>
-              </w:rPr>
-              <w:t xml:space="preserve">anchor/ease </w:t>
-            </w:r>
-            <w:r>
-              <w:rPr>
-                <w:sz w:val="16"/>
-                <w:szCs w:val="18"/>
-                <w:lang w:val="en-CA"/>
-              </w:rPr>
-              <w:t>cursor hidden</w:t>
+              <w:t>ettings: components: graph: anchor point adjustment: cursor hidden and locked</w:t>
             </w:r>
           </w:p>
         </w:tc>
@@ -7581,36 +7564,27 @@
           <w:p>
             <w:pPr>
               <w:rPr>
-                <w:rFonts w:hint="eastAsia"/>
-                <w:sz w:val="16"/>
-                <w:szCs w:val="18"/>
-                <w:lang w:val="en-CA"/>
-              </w:rPr>
-            </w:pPr>
-            <w:r>
-              <w:rPr>
-                <w:rFonts w:hint="eastAsia"/>
-                <w:sz w:val="16"/>
-                <w:szCs w:val="18"/>
-                <w:lang w:val="en-CA"/>
-              </w:rPr>
-              <w:t>D</w:t>
-            </w:r>
-            <w:r>
-              <w:rPr>
-                <w:sz w:val="16"/>
-                <w:szCs w:val="18"/>
-                <w:lang w:val="en-CA"/>
-              </w:rPr>
-              <w:t xml:space="preserve">rag the ease handle and anchor </w:t>
-            </w:r>
-            <w:r>
-              <w:rPr>
-                <w:sz w:val="16"/>
-                <w:szCs w:val="18"/>
-                <w:lang w:val="en-CA"/>
-              </w:rPr>
-              <w:t>points</w:t>
+                <w:sz w:val="16"/>
+                <w:szCs w:val="18"/>
+                <w:lang w:val="en-CA"/>
+              </w:rPr>
+            </w:pPr>
+            <w:r>
+              <w:rPr>
+                <w:rFonts w:hint="eastAsia"/>
+                <w:sz w:val="16"/>
+                <w:szCs w:val="18"/>
+                <w:lang w:val="en-CA"/>
+              </w:rPr>
+              <w:t>A</w:t>
+            </w:r>
+            <w:r>
+              <w:rPr>
+                <w:sz w:val="16"/>
+                <w:szCs w:val="18"/>
+                <w:lang w:val="en-CA"/>
+              </w:rPr>
+              <w:t>djust an anchor point</w:t>
             </w:r>
           </w:p>
         </w:tc>
@@ -7622,28 +7596,27 @@
           <w:p>
             <w:pPr>
               <w:rPr>
-                <w:rFonts w:hint="eastAsia"/>
-                <w:sz w:val="16"/>
-                <w:szCs w:val="18"/>
-                <w:lang w:val="en-CA"/>
-              </w:rPr>
-            </w:pPr>
-            <w:r>
-              <w:rPr>
-                <w:rFonts w:hint="eastAsia"/>
-                <w:sz w:val="16"/>
-                <w:szCs w:val="18"/>
-                <w:lang w:val="en-CA"/>
-              </w:rPr>
-              <w:t>Y</w:t>
-            </w:r>
-            <w:r>
-              <w:rPr>
-                <w:sz w:val="16"/>
-                <w:szCs w:val="18"/>
-                <w:lang w:val="en-CA"/>
-              </w:rPr>
-              <w:t>our cursor should be hidden as you drag for both ease and anchors</w:t>
+                <w:sz w:val="16"/>
+                <w:szCs w:val="18"/>
+                <w:lang w:val="en-CA"/>
+              </w:rPr>
+            </w:pPr>
+            <w:r>
+              <w:rPr>
+                <w:rFonts w:hint="eastAsia"/>
+                <w:sz w:val="16"/>
+                <w:szCs w:val="18"/>
+                <w:lang w:val="en-CA"/>
+              </w:rPr>
+              <w:t>C</w:t>
+            </w:r>
+            <w:r>
+              <w:rPr>
+                <w:sz w:val="16"/>
+                <w:szCs w:val="18"/>
+                <w:lang w:val="en-CA"/>
+              </w:rPr>
+              <w:t>ursor should hide and lock</w:t>
             </w:r>
           </w:p>
         </w:tc>
@@ -7655,7 +7628,6 @@
           <w:p>
             <w:pPr>
               <w:rPr>
-                <w:rFonts w:hint="eastAsia"/>
                 <w:sz w:val="16"/>
                 <w:szCs w:val="18"/>
                 <w:lang w:val="en-CA"/>
@@ -7676,23 +7648,15 @@
                 <w:szCs w:val="18"/>
                 <w:lang w:val="en-CA"/>
               </w:rPr>
-              <w:t xml:space="preserve">orks as of </w:t>
-            </w:r>
-            <w:r>
-              <w:rPr>
-                <w:sz w:val="16"/>
-                <w:szCs w:val="18"/>
-                <w:lang w:val="en-CA"/>
-              </w:rPr>
-              <w:t>778697675ce93244703b4e3b60df72550d490d55</w:t>
-            </w:r>
-            <w:r>
-              <w:rPr>
-                <w:sz w:val="16"/>
-                <w:szCs w:val="18"/>
-                <w:lang w:val="en-CA"/>
-              </w:rPr>
-              <w:t xml:space="preserve"> + 1</w:t>
+              <w:t xml:space="preserve">orking as of </w:t>
+            </w:r>
+            <w:r>
+              <w:rPr>
+                <w:sz w:val="16"/>
+                <w:szCs w:val="18"/>
+                <w:lang w:val="en-CA"/>
+              </w:rPr>
+              <w:t>e23c4b489f3e11c5fec8e3dd955f1c02ddb932c1</w:t>
             </w:r>
           </w:p>
         </w:tc>
@@ -7701,24 +7665,233 @@
         <w:tc>
           <w:tcPr>
             <w:tcW w:w="1701" w:type="dxa"/>
+          </w:tcPr>
+          <w:p>
+            <w:pPr>
+              <w:rPr>
+                <w:sz w:val="16"/>
+                <w:szCs w:val="18"/>
+                <w:lang w:val="en-CA"/>
+              </w:rPr>
+            </w:pPr>
+            <w:r>
+              <w:rPr>
+                <w:rFonts w:hint="eastAsia"/>
+                <w:sz w:val="16"/>
+                <w:szCs w:val="18"/>
+                <w:lang w:val="en-CA"/>
+              </w:rPr>
+              <w:t>G</w:t>
+            </w:r>
+            <w:r>
+              <w:rPr>
+                <w:sz w:val="16"/>
+                <w:szCs w:val="18"/>
+                <w:lang w:val="en-CA"/>
+              </w:rPr>
+              <w:t>raph.tsx</w:t>
+            </w:r>
+          </w:p>
+        </w:tc>
+        <w:tc>
+          <w:tcPr>
+            <w:tcW w:w="1985" w:type="dxa"/>
+          </w:tcPr>
+          <w:p>
+            <w:pPr>
+              <w:rPr>
+                <w:sz w:val="16"/>
+                <w:szCs w:val="18"/>
+                <w:lang w:val="en-CA"/>
+              </w:rPr>
+            </w:pPr>
+            <w:r>
+              <w:rPr>
+                <w:rFonts w:hint="eastAsia"/>
+                <w:sz w:val="16"/>
+                <w:szCs w:val="18"/>
+                <w:lang w:val="en-CA"/>
+              </w:rPr>
+              <w:t>S</w:t>
+            </w:r>
+            <w:r>
+              <w:rPr>
+                <w:sz w:val="16"/>
+                <w:szCs w:val="18"/>
+                <w:lang w:val="en-CA"/>
+              </w:rPr>
+              <w:t xml:space="preserve">ettings: components: graph: anchor point creation: cursor hidden </w:t>
+            </w:r>
+            <w:r>
+              <w:rPr>
+                <w:sz w:val="16"/>
+                <w:szCs w:val="18"/>
+                <w:lang w:val="en-CA"/>
+              </w:rPr>
+              <w:lastRenderedPageBreak/>
+              <w:t>and locked</w:t>
+            </w:r>
+          </w:p>
+        </w:tc>
+        <w:tc>
+          <w:tcPr>
+            <w:tcW w:w="2410" w:type="dxa"/>
+          </w:tcPr>
+          <w:p>
+            <w:pPr>
+              <w:rPr>
+                <w:sz w:val="16"/>
+                <w:szCs w:val="18"/>
+                <w:lang w:val="en-CA"/>
+              </w:rPr>
+            </w:pPr>
+            <w:r>
+              <w:rPr>
+                <w:rFonts w:hint="eastAsia"/>
+                <w:sz w:val="16"/>
+                <w:szCs w:val="18"/>
+                <w:lang w:val="en-CA"/>
+              </w:rPr>
+              <w:lastRenderedPageBreak/>
+              <w:t>C</w:t>
+            </w:r>
+            <w:r>
+              <w:rPr>
+                <w:sz w:val="16"/>
+                <w:szCs w:val="18"/>
+                <w:lang w:val="en-CA"/>
+              </w:rPr>
+              <w:t>reate an anchor point</w:t>
+            </w:r>
+          </w:p>
+        </w:tc>
+        <w:tc>
+          <w:tcPr>
+            <w:tcW w:w="3118" w:type="dxa"/>
+          </w:tcPr>
+          <w:p>
+            <w:pPr>
+              <w:rPr>
+                <w:sz w:val="16"/>
+                <w:szCs w:val="18"/>
+                <w:lang w:val="en-CA"/>
+              </w:rPr>
+            </w:pPr>
+            <w:r>
+              <w:rPr>
+                <w:rFonts w:hint="eastAsia"/>
+                <w:sz w:val="16"/>
+                <w:szCs w:val="18"/>
+                <w:lang w:val="en-CA"/>
+              </w:rPr>
+              <w:t>C</w:t>
+            </w:r>
+            <w:r>
+              <w:rPr>
+                <w:sz w:val="16"/>
+                <w:szCs w:val="18"/>
+                <w:lang w:val="en-CA"/>
+              </w:rPr>
+              <w:t>ursor should hide and lock</w:t>
+            </w:r>
+          </w:p>
+        </w:tc>
+        <w:tc>
+          <w:tcPr>
+            <w:tcW w:w="2410" w:type="dxa"/>
+          </w:tcPr>
+          <w:p>
+            <w:pPr>
+              <w:rPr>
+                <w:sz w:val="16"/>
+                <w:szCs w:val="18"/>
+                <w:lang w:val="en-CA"/>
+              </w:rPr>
+            </w:pPr>
+            <w:r>
+              <w:rPr>
+                <w:rFonts w:hint="eastAsia"/>
+                <w:sz w:val="16"/>
+                <w:szCs w:val="18"/>
+                <w:lang w:val="en-CA"/>
+              </w:rPr>
+              <w:t>N</w:t>
+            </w:r>
+            <w:r>
+              <w:rPr>
+                <w:sz w:val="16"/>
+                <w:szCs w:val="18"/>
+                <w:lang w:val="en-CA"/>
+              </w:rPr>
+              <w:t xml:space="preserve">ot working as of </w:t>
+            </w:r>
+            <w:r>
+              <w:rPr>
+                <w:sz w:val="16"/>
+                <w:szCs w:val="18"/>
+                <w:lang w:val="en-CA"/>
+              </w:rPr>
+              <w:t>e23c4b489f3e11c5fec8e3dd955f1c02ddb932c1</w:t>
+            </w:r>
+            <w:r>
+              <w:rPr>
+                <w:sz w:val="16"/>
+                <w:szCs w:val="18"/>
+                <w:lang w:val="en-CA"/>
+              </w:rPr>
+              <w:t xml:space="preserve">. </w:t>
+            </w:r>
+            <w:r>
+              <w:rPr>
+                <w:rFonts w:hint="eastAsia"/>
+                <w:sz w:val="16"/>
+                <w:szCs w:val="18"/>
+                <w:lang w:val="en-CA"/>
+              </w:rPr>
+              <w:t>W</w:t>
+            </w:r>
+            <w:r>
+              <w:rPr>
+                <w:sz w:val="16"/>
+                <w:szCs w:val="18"/>
+                <w:lang w:val="en-CA"/>
+              </w:rPr>
+              <w:t xml:space="preserve">hen you </w:t>
+            </w:r>
+            <w:r>
+              <w:rPr>
+                <w:sz w:val="16"/>
+                <w:szCs w:val="18"/>
+                <w:lang w:val="en-CA"/>
+              </w:rPr>
+              <w:lastRenderedPageBreak/>
+              <w:t>create an anchor point the cursor doesn’t hide or lock</w:t>
+            </w:r>
+          </w:p>
+        </w:tc>
+      </w:tr>
+      <w:tr>
+        <w:tc>
+          <w:tcPr>
+            <w:tcW w:w="1701" w:type="dxa"/>
             <w:shd w:val="clear" w:color="auto" w:fill="D9F2D0" w:themeFill="accent6" w:themeFillTint="33"/>
           </w:tcPr>
           <w:p>
             <w:pPr>
               <w:rPr>
-                <w:rFonts w:hint="eastAsia"/>
-                <w:sz w:val="16"/>
-                <w:szCs w:val="18"/>
-                <w:lang w:val="en-CA"/>
-              </w:rPr>
-            </w:pPr>
-            <w:r>
-              <w:rPr>
-                <w:rFonts w:hint="eastAsia"/>
-                <w:sz w:val="16"/>
-                <w:szCs w:val="18"/>
-                <w:lang w:val="en-CA"/>
-              </w:rPr>
+                <w:sz w:val="16"/>
+                <w:szCs w:val="18"/>
+                <w:lang w:val="en-CA"/>
+              </w:rPr>
+            </w:pPr>
+            <w:r>
+              <w:rPr>
+                <w:rFonts w:hint="eastAsia"/>
+                <w:sz w:val="16"/>
+                <w:szCs w:val="18"/>
+                <w:lang w:val="en-CA"/>
+              </w:rPr>
+              <w:lastRenderedPageBreak/>
               <w:t>G</w:t>
             </w:r>
             <w:r>
@@ -7727,7 +7900,7 @@
                 <w:szCs w:val="18"/>
                 <w:lang w:val="en-CA"/>
               </w:rPr>
-              <w:t>raph.tsx, sensitivity.tsx</w:t>
+              <w:t>raph.tsx</w:t>
             </w:r>
           </w:p>
         </w:tc>
@@ -7739,7 +7912,6 @@
           <w:p>
             <w:pPr>
               <w:rPr>
-                <w:rFonts w:hint="eastAsia"/>
                 <w:sz w:val="16"/>
                 <w:szCs w:val="18"/>
                 <w:lang w:val="en-CA"/>
@@ -7760,16 +7932,7 @@
                 <w:szCs w:val="18"/>
                 <w:lang w:val="en-CA"/>
               </w:rPr>
-              <w:t xml:space="preserve">ettings: components: torus menu editor: graph: anchor/ease cursor stays </w:t>
-            </w:r>
-            <w:r>
-              <w:rPr>
-                <w:sz w:val="16"/>
-                <w:szCs w:val="18"/>
-                <w:lang w:val="en-CA"/>
-              </w:rPr>
-              <w:lastRenderedPageBreak/>
-              <w:t>place</w:t>
+              <w:t>ettings: components: graph: anchor point deletion: right click</w:t>
             </w:r>
           </w:p>
         </w:tc>
@@ -7781,20 +7944,423 @@
           <w:p>
             <w:pPr>
               <w:rPr>
-                <w:rFonts w:hint="eastAsia"/>
-                <w:sz w:val="16"/>
-                <w:szCs w:val="18"/>
-                <w:lang w:val="en-CA"/>
-              </w:rPr>
-            </w:pPr>
-            <w:r>
-              <w:rPr>
-                <w:rFonts w:hint="eastAsia"/>
-                <w:sz w:val="16"/>
-                <w:szCs w:val="18"/>
-                <w:lang w:val="en-CA"/>
-              </w:rPr>
-              <w:lastRenderedPageBreak/>
+                <w:sz w:val="16"/>
+                <w:szCs w:val="18"/>
+                <w:lang w:val="en-CA"/>
+              </w:rPr>
+            </w:pPr>
+            <w:r>
+              <w:rPr>
+                <w:rFonts w:hint="eastAsia"/>
+                <w:sz w:val="16"/>
+                <w:szCs w:val="18"/>
+                <w:lang w:val="en-CA"/>
+              </w:rPr>
+              <w:t>C</w:t>
+            </w:r>
+            <w:r>
+              <w:rPr>
+                <w:sz w:val="16"/>
+                <w:szCs w:val="18"/>
+                <w:lang w:val="en-CA"/>
+              </w:rPr>
+              <w:t>reate an anchor point, then right click it</w:t>
+            </w:r>
+          </w:p>
+        </w:tc>
+        <w:tc>
+          <w:tcPr>
+            <w:tcW w:w="3118" w:type="dxa"/>
+            <w:shd w:val="clear" w:color="auto" w:fill="D9F2D0" w:themeFill="accent6" w:themeFillTint="33"/>
+          </w:tcPr>
+          <w:p>
+            <w:pPr>
+              <w:rPr>
+                <w:sz w:val="16"/>
+                <w:szCs w:val="18"/>
+                <w:lang w:val="en-CA"/>
+              </w:rPr>
+            </w:pPr>
+            <w:r>
+              <w:rPr>
+                <w:rFonts w:hint="eastAsia"/>
+                <w:sz w:val="16"/>
+                <w:szCs w:val="18"/>
+                <w:lang w:val="en-CA"/>
+              </w:rPr>
+              <w:t>I</w:t>
+            </w:r>
+            <w:r>
+              <w:rPr>
+                <w:sz w:val="16"/>
+                <w:szCs w:val="18"/>
+                <w:lang w:val="en-CA"/>
+              </w:rPr>
+              <w:t>t should delete the anchor point</w:t>
+            </w:r>
+          </w:p>
+        </w:tc>
+        <w:tc>
+          <w:tcPr>
+            <w:tcW w:w="2410" w:type="dxa"/>
+            <w:shd w:val="clear" w:color="auto" w:fill="D9F2D0" w:themeFill="accent6" w:themeFillTint="33"/>
+          </w:tcPr>
+          <w:p>
+            <w:pPr>
+              <w:rPr>
+                <w:sz w:val="16"/>
+                <w:szCs w:val="18"/>
+                <w:lang w:val="en-CA"/>
+              </w:rPr>
+            </w:pPr>
+            <w:r>
+              <w:rPr>
+                <w:rFonts w:hint="eastAsia"/>
+                <w:sz w:val="16"/>
+                <w:szCs w:val="18"/>
+                <w:lang w:val="en-CA"/>
+              </w:rPr>
+              <w:t>W</w:t>
+            </w:r>
+            <w:r>
+              <w:rPr>
+                <w:sz w:val="16"/>
+                <w:szCs w:val="18"/>
+                <w:lang w:val="en-CA"/>
+              </w:rPr>
+              <w:t xml:space="preserve">orking!!! </w:t>
+            </w:r>
+            <w:r>
+              <w:rPr>
+                <w:rFonts w:hint="eastAsia"/>
+                <w:sz w:val="16"/>
+                <w:szCs w:val="18"/>
+                <w:lang w:val="en-CA"/>
+              </w:rPr>
+              <w:t>R</w:t>
+            </w:r>
+            <w:r>
+              <w:rPr>
+                <w:sz w:val="16"/>
+                <w:szCs w:val="18"/>
+                <w:lang w:val="en-CA"/>
+              </w:rPr>
+              <w:t xml:space="preserve">ight clicking now deletes anchor points in </w:t>
+            </w:r>
+            <w:r>
+              <w:rPr>
+                <w:sz w:val="16"/>
+                <w:szCs w:val="18"/>
+                <w:lang w:val="en-CA"/>
+              </w:rPr>
+              <w:t>e23c4b489f3e11c5fec8e3dd955f1c02ddb932c1</w:t>
+            </w:r>
+            <w:r>
+              <w:rPr>
+                <w:sz w:val="16"/>
+                <w:szCs w:val="18"/>
+                <w:lang w:val="en-CA"/>
+              </w:rPr>
+              <w:t xml:space="preserve"> + 1</w:t>
+            </w:r>
+          </w:p>
+        </w:tc>
+      </w:tr>
+      <w:tr>
+        <w:tc>
+          <w:tcPr>
+            <w:tcW w:w="1701" w:type="dxa"/>
+            <w:shd w:val="clear" w:color="auto" w:fill="D9F2D0" w:themeFill="accent6" w:themeFillTint="33"/>
+          </w:tcPr>
+          <w:p>
+            <w:pPr>
+              <w:rPr>
+                <w:rFonts w:hint="eastAsia"/>
+                <w:sz w:val="16"/>
+                <w:szCs w:val="18"/>
+                <w:lang w:val="en-CA"/>
+              </w:rPr>
+            </w:pPr>
+            <w:r>
+              <w:rPr>
+                <w:rFonts w:hint="eastAsia"/>
+                <w:sz w:val="16"/>
+                <w:szCs w:val="18"/>
+                <w:lang w:val="en-CA"/>
+              </w:rPr>
+              <w:t>G</w:t>
+            </w:r>
+            <w:r>
+              <w:rPr>
+                <w:sz w:val="16"/>
+                <w:szCs w:val="18"/>
+                <w:lang w:val="en-CA"/>
+              </w:rPr>
+              <w:t>raph.tsx, sensitivity.ts</w:t>
+            </w:r>
+          </w:p>
+        </w:tc>
+        <w:tc>
+          <w:tcPr>
+            <w:tcW w:w="1985" w:type="dxa"/>
+            <w:shd w:val="clear" w:color="auto" w:fill="D9F2D0" w:themeFill="accent6" w:themeFillTint="33"/>
+          </w:tcPr>
+          <w:p>
+            <w:pPr>
+              <w:rPr>
+                <w:rFonts w:hint="eastAsia"/>
+                <w:sz w:val="16"/>
+                <w:szCs w:val="18"/>
+                <w:lang w:val="en-CA"/>
+              </w:rPr>
+            </w:pPr>
+            <w:r>
+              <w:rPr>
+                <w:rFonts w:hint="eastAsia"/>
+                <w:sz w:val="16"/>
+                <w:szCs w:val="18"/>
+                <w:lang w:val="en-CA"/>
+              </w:rPr>
+              <w:t>S</w:t>
+            </w:r>
+            <w:r>
+              <w:rPr>
+                <w:sz w:val="16"/>
+                <w:szCs w:val="18"/>
+                <w:lang w:val="en-CA"/>
+              </w:rPr>
+              <w:t xml:space="preserve">ettings: components: torus menu editor: graph: </w:t>
+            </w:r>
+            <w:r>
+              <w:rPr>
+                <w:sz w:val="16"/>
+                <w:szCs w:val="18"/>
+                <w:lang w:val="en-CA"/>
+              </w:rPr>
+              <w:t xml:space="preserve">anchor/ease </w:t>
+            </w:r>
+            <w:r>
+              <w:rPr>
+                <w:sz w:val="16"/>
+                <w:szCs w:val="18"/>
+                <w:lang w:val="en-CA"/>
+              </w:rPr>
+              <w:t>cursor hidden</w:t>
+            </w:r>
+          </w:p>
+        </w:tc>
+        <w:tc>
+          <w:tcPr>
+            <w:tcW w:w="2410" w:type="dxa"/>
+            <w:shd w:val="clear" w:color="auto" w:fill="D9F2D0" w:themeFill="accent6" w:themeFillTint="33"/>
+          </w:tcPr>
+          <w:p>
+            <w:pPr>
+              <w:rPr>
+                <w:rFonts w:hint="eastAsia"/>
+                <w:sz w:val="16"/>
+                <w:szCs w:val="18"/>
+                <w:lang w:val="en-CA"/>
+              </w:rPr>
+            </w:pPr>
+            <w:r>
+              <w:rPr>
+                <w:rFonts w:hint="eastAsia"/>
+                <w:sz w:val="16"/>
+                <w:szCs w:val="18"/>
+                <w:lang w:val="en-CA"/>
+              </w:rPr>
+              <w:t>D</w:t>
+            </w:r>
+            <w:r>
+              <w:rPr>
+                <w:sz w:val="16"/>
+                <w:szCs w:val="18"/>
+                <w:lang w:val="en-CA"/>
+              </w:rPr>
+              <w:t xml:space="preserve">rag the ease handle and anchor </w:t>
+            </w:r>
+            <w:r>
+              <w:rPr>
+                <w:sz w:val="16"/>
+                <w:szCs w:val="18"/>
+                <w:lang w:val="en-CA"/>
+              </w:rPr>
+              <w:t>points</w:t>
+            </w:r>
+          </w:p>
+        </w:tc>
+        <w:tc>
+          <w:tcPr>
+            <w:tcW w:w="3118" w:type="dxa"/>
+            <w:shd w:val="clear" w:color="auto" w:fill="D9F2D0" w:themeFill="accent6" w:themeFillTint="33"/>
+          </w:tcPr>
+          <w:p>
+            <w:pPr>
+              <w:rPr>
+                <w:rFonts w:hint="eastAsia"/>
+                <w:sz w:val="16"/>
+                <w:szCs w:val="18"/>
+                <w:lang w:val="en-CA"/>
+              </w:rPr>
+            </w:pPr>
+            <w:r>
+              <w:rPr>
+                <w:rFonts w:hint="eastAsia"/>
+                <w:sz w:val="16"/>
+                <w:szCs w:val="18"/>
+                <w:lang w:val="en-CA"/>
+              </w:rPr>
+              <w:t>Y</w:t>
+            </w:r>
+            <w:r>
+              <w:rPr>
+                <w:sz w:val="16"/>
+                <w:szCs w:val="18"/>
+                <w:lang w:val="en-CA"/>
+              </w:rPr>
+              <w:t>our cursor should be hidden as you drag for both ease and anchors</w:t>
+            </w:r>
+          </w:p>
+        </w:tc>
+        <w:tc>
+          <w:tcPr>
+            <w:tcW w:w="2410" w:type="dxa"/>
+            <w:shd w:val="clear" w:color="auto" w:fill="D9F2D0" w:themeFill="accent6" w:themeFillTint="33"/>
+          </w:tcPr>
+          <w:p>
+            <w:pPr>
+              <w:rPr>
+                <w:rFonts w:hint="eastAsia"/>
+                <w:sz w:val="16"/>
+                <w:szCs w:val="18"/>
+                <w:lang w:val="en-CA"/>
+              </w:rPr>
+            </w:pPr>
+            <w:r>
+              <w:rPr>
+                <w:rFonts w:hint="eastAsia"/>
+                <w:sz w:val="16"/>
+                <w:szCs w:val="18"/>
+                <w:lang w:val="en-CA"/>
+              </w:rPr>
+              <w:t>W</w:t>
+            </w:r>
+            <w:r>
+              <w:rPr>
+                <w:sz w:val="16"/>
+                <w:szCs w:val="18"/>
+                <w:lang w:val="en-CA"/>
+              </w:rPr>
+              <w:t xml:space="preserve">orks as of </w:t>
+            </w:r>
+            <w:r>
+              <w:rPr>
+                <w:sz w:val="16"/>
+                <w:szCs w:val="18"/>
+                <w:lang w:val="en-CA"/>
+              </w:rPr>
+              <w:t>778697675ce93244703b4e3b60df72550d490d55</w:t>
+            </w:r>
+            <w:r>
+              <w:rPr>
+                <w:sz w:val="16"/>
+                <w:szCs w:val="18"/>
+                <w:lang w:val="en-CA"/>
+              </w:rPr>
+              <w:t xml:space="preserve"> + 1</w:t>
+            </w:r>
+          </w:p>
+        </w:tc>
+      </w:tr>
+      <w:tr>
+        <w:tc>
+          <w:tcPr>
+            <w:tcW w:w="1701" w:type="dxa"/>
+            <w:shd w:val="clear" w:color="auto" w:fill="D9F2D0" w:themeFill="accent6" w:themeFillTint="33"/>
+          </w:tcPr>
+          <w:p>
+            <w:pPr>
+              <w:rPr>
+                <w:rFonts w:hint="eastAsia"/>
+                <w:sz w:val="16"/>
+                <w:szCs w:val="18"/>
+                <w:lang w:val="en-CA"/>
+              </w:rPr>
+            </w:pPr>
+            <w:r>
+              <w:rPr>
+                <w:rFonts w:hint="eastAsia"/>
+                <w:sz w:val="16"/>
+                <w:szCs w:val="18"/>
+                <w:lang w:val="en-CA"/>
+              </w:rPr>
+              <w:t>G</w:t>
+            </w:r>
+            <w:r>
+              <w:rPr>
+                <w:sz w:val="16"/>
+                <w:szCs w:val="18"/>
+                <w:lang w:val="en-CA"/>
+              </w:rPr>
+              <w:t>raph.tsx, sensitivity.tsx</w:t>
+            </w:r>
+          </w:p>
+        </w:tc>
+        <w:tc>
+          <w:tcPr>
+            <w:tcW w:w="1985" w:type="dxa"/>
+            <w:shd w:val="clear" w:color="auto" w:fill="D9F2D0" w:themeFill="accent6" w:themeFillTint="33"/>
+          </w:tcPr>
+          <w:p>
+            <w:pPr>
+              <w:rPr>
+                <w:rFonts w:hint="eastAsia"/>
+                <w:sz w:val="16"/>
+                <w:szCs w:val="18"/>
+                <w:lang w:val="en-CA"/>
+              </w:rPr>
+            </w:pPr>
+            <w:r>
+              <w:rPr>
+                <w:rFonts w:hint="eastAsia"/>
+                <w:sz w:val="16"/>
+                <w:szCs w:val="18"/>
+                <w:lang w:val="en-CA"/>
+              </w:rPr>
+              <w:t>S</w:t>
+            </w:r>
+            <w:r>
+              <w:rPr>
+                <w:sz w:val="16"/>
+                <w:szCs w:val="18"/>
+                <w:lang w:val="en-CA"/>
+              </w:rPr>
+              <w:t>ettings: components: torus menu editor: graph: anchor/ease cursor stays place</w:t>
+            </w:r>
+          </w:p>
+        </w:tc>
+        <w:tc>
+          <w:tcPr>
+            <w:tcW w:w="2410" w:type="dxa"/>
+            <w:shd w:val="clear" w:color="auto" w:fill="D9F2D0" w:themeFill="accent6" w:themeFillTint="33"/>
+          </w:tcPr>
+          <w:p>
+            <w:pPr>
+              <w:rPr>
+                <w:rFonts w:hint="eastAsia"/>
+                <w:sz w:val="16"/>
+                <w:szCs w:val="18"/>
+                <w:lang w:val="en-CA"/>
+              </w:rPr>
+            </w:pPr>
+            <w:r>
+              <w:rPr>
+                <w:rFonts w:hint="eastAsia"/>
+                <w:sz w:val="16"/>
+                <w:szCs w:val="18"/>
+                <w:lang w:val="en-CA"/>
+              </w:rPr>
               <w:t>D</w:t>
             </w:r>
             <w:r>
@@ -8608,7 +9174,16 @@
                 <w:szCs w:val="18"/>
                 <w:lang w:val="en-CA"/>
               </w:rPr>
-              <w:t>he annular sectors should open anticlockwise fast when the delay slider is set to a small negative value, and they should open slowly when the delay slider is set to a large negative value.</w:t>
+              <w:t xml:space="preserve">he annular sectors should open anticlockwise fast when the delay slider is set to a small negative value, and they should open slowly when the delay slider is set to a large </w:t>
+            </w:r>
+            <w:r>
+              <w:rPr>
+                <w:sz w:val="16"/>
+                <w:szCs w:val="18"/>
+                <w:lang w:val="en-CA"/>
+              </w:rPr>
+              <w:lastRenderedPageBreak/>
+              <w:t>negative value.</w:t>
             </w:r>
           </w:p>
         </w:tc>
@@ -8633,6 +9208,7 @@
                 <w:szCs w:val="18"/>
                 <w:lang w:val="en-CA"/>
               </w:rPr>
+              <w:lastRenderedPageBreak/>
               <w:t>W</w:t>
             </w:r>
             <w:r>
@@ -10028,6 +10604,7 @@
                 <w:szCs w:val="18"/>
                 <w:lang w:val="en-CA"/>
               </w:rPr>
+              <w:lastRenderedPageBreak/>
               <w:t>C</w:t>
             </w:r>
             <w:r>
@@ -10065,6 +10642,7 @@
                 <w:szCs w:val="18"/>
                 <w:lang w:val="en-CA"/>
               </w:rPr>
+              <w:lastRenderedPageBreak/>
               <w:t>T</w:t>
             </w:r>
             <w:r>
@@ -10073,7 +10651,16 @@
                 <w:szCs w:val="18"/>
                 <w:lang w:val="en-CA"/>
               </w:rPr>
-              <w:t>he first test should create a new reset button next to the color rectangle</w:t>
+              <w:t xml:space="preserve">he first test should create a new reset button next to the color </w:t>
+            </w:r>
+            <w:r>
+              <w:rPr>
+                <w:sz w:val="16"/>
+                <w:szCs w:val="18"/>
+                <w:lang w:val="en-CA"/>
+              </w:rPr>
+              <w:lastRenderedPageBreak/>
+              <w:t>rectangle</w:t>
             </w:r>
           </w:p>
           <w:p>
@@ -10129,6 +10716,7 @@
                 <w:szCs w:val="18"/>
                 <w:lang w:val="en-CA"/>
               </w:rPr>
+              <w:lastRenderedPageBreak/>
               <w:t>W</w:t>
             </w:r>
             <w:r>
@@ -10145,7 +10733,16 @@
                 <w:szCs w:val="18"/>
                 <w:lang w:val="en-CA"/>
               </w:rPr>
-              <w:t>5bddf836872611033759d627746d8b4161bba22a</w:t>
+              <w:t>5bddf836872611033759d62774</w:t>
+            </w:r>
+            <w:r>
+              <w:rPr>
+                <w:sz w:val="16"/>
+                <w:szCs w:val="18"/>
+                <w:lang w:val="en-CA"/>
+              </w:rPr>
+              <w:lastRenderedPageBreak/>
+              <w:t>6d8b4161bba22a</w:t>
             </w:r>
           </w:p>
         </w:tc>
@@ -10170,6 +10767,7 @@
                 <w:szCs w:val="18"/>
                 <w:lang w:val="en-CA"/>
               </w:rPr>
+              <w:lastRenderedPageBreak/>
               <w:t>ColorPicker.tsx</w:t>
             </w:r>
           </w:p>
@@ -12828,6 +13426,7 @@
   <w:style w:type="character" w:default="1" w:styleId="a0">
     <w:name w:val="Default Paragraph Font"/>
     <w:uiPriority w:val="1"/>
+    <w:semiHidden/>
     <w:unhideWhenUsed/>
   </w:style>
   <w:style w:type="table" w:default="1" w:styleId="a1">

</xml_diff>

<commit_message>
fixed Settings: components: torus menu editor: graph: ease handle hitbox for the umpteenth time. The problem was the svg icons was drawn on top of the click and drag hitbox
</commit_message>
<xml_diff>
--- a/test plan.docx
+++ b/test plan.docx
@@ -7470,23 +7470,57 @@
                 <w:szCs w:val="18"/>
                 <w:lang w:val="en-CA"/>
               </w:rPr>
-              <w:t xml:space="preserve">ot working as of </w:t>
-            </w:r>
-            <w:r>
-              <w:rPr>
-                <w:sz w:val="16"/>
-                <w:szCs w:val="18"/>
-                <w:lang w:val="en-CA"/>
-              </w:rPr>
-              <w:t>e23c4b489f3e11c5fec8e3dd955f1c02ddb932c1</w:t>
-            </w:r>
-            <w:r>
-              <w:rPr>
-                <w:sz w:val="16"/>
-                <w:szCs w:val="18"/>
-                <w:lang w:val="en-CA"/>
-              </w:rPr>
-              <w:t xml:space="preserve"> + 1. I must click and drag around the ease handler to move it up or down.</w:t>
+              <w:t xml:space="preserve">ow working again as of </w:t>
+            </w:r>
+            <w:r>
+              <w:rPr>
+                <w:sz w:val="16"/>
+                <w:szCs w:val="18"/>
+                <w:lang w:val="en-CA"/>
+              </w:rPr>
+              <w:t>3b96d1efb69c1c78e04c00c11eb514fbae94f034</w:t>
+            </w:r>
+            <w:r>
+              <w:rPr>
+                <w:sz w:val="16"/>
+                <w:szCs w:val="18"/>
+                <w:lang w:val="en-CA"/>
+              </w:rPr>
+              <w:t xml:space="preserve"> + 1. </w:t>
+            </w:r>
+            <w:r>
+              <w:rPr>
+                <w:rFonts w:hint="eastAsia"/>
+                <w:sz w:val="16"/>
+                <w:szCs w:val="18"/>
+                <w:lang w:val="en-CA"/>
+              </w:rPr>
+              <w:t>F</w:t>
+            </w:r>
+            <w:r>
+              <w:rPr>
+                <w:sz w:val="16"/>
+                <w:szCs w:val="18"/>
+                <w:lang w:val="en-CA"/>
+              </w:rPr>
+              <w:t xml:space="preserve">ixed it for the umpteenth time. </w:t>
+            </w:r>
+            <w:r>
+              <w:rPr>
+                <w:rFonts w:hint="eastAsia"/>
+                <w:sz w:val="16"/>
+                <w:szCs w:val="18"/>
+                <w:lang w:val="en-CA"/>
+              </w:rPr>
+              <w:t>T</w:t>
+            </w:r>
+            <w:r>
+              <w:rPr>
+                <w:sz w:val="16"/>
+                <w:szCs w:val="18"/>
+                <w:lang w:val="en-CA"/>
+              </w:rPr>
+              <w:t>he problem was the svg icons was drawn on top of the click and drag hitbox</w:t>
             </w:r>
           </w:p>
         </w:tc>
@@ -7720,7 +7754,7 @@
                 <w:szCs w:val="18"/>
                 <w:lang w:val="en-CA"/>
               </w:rPr>
-              <w:t xml:space="preserve">ettings: components: graph: anchor point creation: cursor hidden </w:t>
+              <w:t xml:space="preserve">ettings: components: </w:t>
             </w:r>
             <w:r>
               <w:rPr>
@@ -7729,7 +7763,7 @@
                 <w:lang w:val="en-CA"/>
               </w:rPr>
               <w:lastRenderedPageBreak/>
-              <w:t>and locked</w:t>
+              <w:t>graph: anchor point creation: cursor hidden and locked</w:t>
             </w:r>
           </w:p>
         </w:tc>
@@ -7831,6 +7865,7 @@
                 <w:szCs w:val="18"/>
                 <w:lang w:val="en-CA"/>
               </w:rPr>
+              <w:lastRenderedPageBreak/>
               <w:t>e23c4b489f3e11c5fec8e3dd955f1c02ddb932c1</w:t>
             </w:r>
             <w:r>
@@ -7856,16 +7891,7 @@
                 <w:szCs w:val="18"/>
                 <w:lang w:val="en-CA"/>
               </w:rPr>
-              <w:t xml:space="preserve">hen you </w:t>
-            </w:r>
-            <w:r>
-              <w:rPr>
-                <w:sz w:val="16"/>
-                <w:szCs w:val="18"/>
-                <w:lang w:val="en-CA"/>
-              </w:rPr>
-              <w:lastRenderedPageBreak/>
-              <w:t>create an anchor point the cursor doesn’t hide or lock</w:t>
+              <w:t>hen you create an anchor point the cursor doesn’t hide or lock</w:t>
             </w:r>
           </w:p>
         </w:tc>
@@ -9174,7 +9200,7 @@
                 <w:szCs w:val="18"/>
                 <w:lang w:val="en-CA"/>
               </w:rPr>
-              <w:t xml:space="preserve">he annular sectors should open anticlockwise fast when the delay slider is set to a small negative value, and they should open slowly when the delay slider is set to a large </w:t>
+              <w:t xml:space="preserve">he annular sectors should open anticlockwise fast when the delay slider is set to a small negative value, </w:t>
             </w:r>
             <w:r>
               <w:rPr>
@@ -9183,7 +9209,7 @@
                 <w:lang w:val="en-CA"/>
               </w:rPr>
               <w:lastRenderedPageBreak/>
-              <w:t>negative value.</w:t>
+              <w:t>and they should open slowly when the delay slider is set to a large negative value.</w:t>
             </w:r>
           </w:p>
         </w:tc>
@@ -10511,6 +10537,7 @@
                 <w:szCs w:val="18"/>
                 <w:lang w:val="en-CA"/>
               </w:rPr>
+              <w:lastRenderedPageBreak/>
               <w:t>Styles.tsx, App.tsx</w:t>
             </w:r>
           </w:p>
@@ -10604,7 +10631,6 @@
                 <w:szCs w:val="18"/>
                 <w:lang w:val="en-CA"/>
               </w:rPr>
-              <w:lastRenderedPageBreak/>
               <w:t>C</w:t>
             </w:r>
             <w:r>
@@ -10642,7 +10668,6 @@
                 <w:szCs w:val="18"/>
                 <w:lang w:val="en-CA"/>
               </w:rPr>
-              <w:lastRenderedPageBreak/>
               <w:t>T</w:t>
             </w:r>
             <w:r>
@@ -10651,16 +10676,7 @@
                 <w:szCs w:val="18"/>
                 <w:lang w:val="en-CA"/>
               </w:rPr>
-              <w:t xml:space="preserve">he first test should create a new reset button next to the color </w:t>
-            </w:r>
-            <w:r>
-              <w:rPr>
-                <w:sz w:val="16"/>
-                <w:szCs w:val="18"/>
-                <w:lang w:val="en-CA"/>
-              </w:rPr>
-              <w:lastRenderedPageBreak/>
-              <w:t>rectangle</w:t>
+              <w:t>he first test should create a new reset button next to the color rectangle</w:t>
             </w:r>
           </w:p>
           <w:p>
@@ -10716,7 +10732,6 @@
                 <w:szCs w:val="18"/>
                 <w:lang w:val="en-CA"/>
               </w:rPr>
-              <w:lastRenderedPageBreak/>
               <w:t>W</w:t>
             </w:r>
             <w:r>
@@ -10733,16 +10748,7 @@
                 <w:szCs w:val="18"/>
                 <w:lang w:val="en-CA"/>
               </w:rPr>
-              <w:t>5bddf836872611033759d62774</w:t>
-            </w:r>
-            <w:r>
-              <w:rPr>
-                <w:sz w:val="16"/>
-                <w:szCs w:val="18"/>
-                <w:lang w:val="en-CA"/>
-              </w:rPr>
-              <w:lastRenderedPageBreak/>
-              <w:t>6d8b4161bba22a</w:t>
+              <w:t>5bddf836872611033759d627746d8b4161bba22a</w:t>
             </w:r>
           </w:p>
         </w:tc>
@@ -10767,7 +10773,6 @@
                 <w:szCs w:val="18"/>
                 <w:lang w:val="en-CA"/>
               </w:rPr>
-              <w:lastRenderedPageBreak/>
               <w:t>ColorPicker.tsx</w:t>
             </w:r>
           </w:p>

</xml_diff>

<commit_message>
added some christmas particles
</commit_message>
<xml_diff>
--- a/test plan.docx
+++ b/test plan.docx
@@ -6072,6 +6072,23 @@
                 <w:szCs w:val="18"/>
                 <w:lang w:val="en-CA"/>
               </w:rPr>
+              <w:t>P</w:t>
+            </w:r>
+            <w:r>
+              <w:rPr>
+                <w:sz w:val="16"/>
+                <w:szCs w:val="18"/>
+                <w:lang w:val="en-CA"/>
+              </w:rPr>
+              <w:t xml:space="preserve">artially working. </w:t>
+            </w:r>
+            <w:r>
+              <w:rPr>
+                <w:rFonts w:hint="eastAsia"/>
+                <w:sz w:val="16"/>
+                <w:szCs w:val="18"/>
+                <w:lang w:val="en-CA"/>
+              </w:rPr>
               <w:t>N</w:t>
             </w:r>
             <w:r>
@@ -6369,28 +6386,44 @@
           <w:p>
             <w:pPr>
               <w:rPr>
-                <w:rFonts w:hint="eastAsia"/>
-                <w:sz w:val="16"/>
-                <w:szCs w:val="18"/>
-                <w:lang w:val="en-CA"/>
-              </w:rPr>
-            </w:pPr>
-            <w:r>
-              <w:rPr>
-                <w:rFonts w:hint="eastAsia"/>
-                <w:sz w:val="16"/>
-                <w:szCs w:val="18"/>
-                <w:lang w:val="en-CA"/>
-              </w:rPr>
-              <w:t>I</w:t>
-            </w:r>
-            <w:r>
-              <w:rPr>
-                <w:sz w:val="16"/>
-                <w:szCs w:val="18"/>
-                <w:lang w:val="en-CA"/>
-              </w:rPr>
-              <w:t>mplementing…</w:t>
+                <w:sz w:val="16"/>
+                <w:szCs w:val="18"/>
+                <w:lang w:val="en-CA"/>
+              </w:rPr>
+            </w:pPr>
+            <w:r>
+              <w:rPr>
+                <w:rFonts w:hint="eastAsia"/>
+                <w:sz w:val="16"/>
+                <w:szCs w:val="18"/>
+                <w:lang w:val="en-CA"/>
+              </w:rPr>
+              <w:t>N</w:t>
+            </w:r>
+            <w:r>
+              <w:rPr>
+                <w:sz w:val="16"/>
+                <w:szCs w:val="18"/>
+                <w:lang w:val="en-CA"/>
+              </w:rPr>
+              <w:t xml:space="preserve">ot working. </w:t>
+            </w:r>
+            <w:r>
+              <w:rPr>
+                <w:rFonts w:hint="eastAsia"/>
+                <w:sz w:val="16"/>
+                <w:szCs w:val="18"/>
+                <w:lang w:val="en-CA"/>
+              </w:rPr>
+              <w:t>D</w:t>
+            </w:r>
+            <w:r>
+              <w:rPr>
+                <w:sz w:val="16"/>
+                <w:szCs w:val="18"/>
+                <w:lang w:val="en-CA"/>
+              </w:rPr>
+              <w:t>id 3 implementation attempts, all failed</w:t>
             </w:r>
           </w:p>
         </w:tc>
@@ -7327,6 +7360,7 @@
         <w:tc>
           <w:tcPr>
             <w:tcW w:w="1701" w:type="dxa"/>
+            <w:shd w:val="clear" w:color="auto" w:fill="D9F2D0" w:themeFill="accent6" w:themeFillTint="33"/>
           </w:tcPr>
           <w:p>
             <w:pPr>
@@ -7350,6 +7384,7 @@
         <w:tc>
           <w:tcPr>
             <w:tcW w:w="1985" w:type="dxa"/>
+            <w:shd w:val="clear" w:color="auto" w:fill="D9F2D0" w:themeFill="accent6" w:themeFillTint="33"/>
           </w:tcPr>
           <w:p>
             <w:pPr>
@@ -7382,6 +7417,7 @@
         <w:tc>
           <w:tcPr>
             <w:tcW w:w="2410" w:type="dxa"/>
+            <w:shd w:val="clear" w:color="auto" w:fill="D9F2D0" w:themeFill="accent6" w:themeFillTint="33"/>
           </w:tcPr>
           <w:p>
             <w:pPr>
@@ -7414,6 +7450,7 @@
         <w:tc>
           <w:tcPr>
             <w:tcW w:w="3118" w:type="dxa"/>
+            <w:shd w:val="clear" w:color="auto" w:fill="D9F2D0" w:themeFill="accent6" w:themeFillTint="33"/>
           </w:tcPr>
           <w:p>
             <w:pPr>
@@ -7446,6 +7483,7 @@
         <w:tc>
           <w:tcPr>
             <w:tcW w:w="2410" w:type="dxa"/>
+            <w:shd w:val="clear" w:color="auto" w:fill="D9F2D0" w:themeFill="accent6" w:themeFillTint="33"/>
           </w:tcPr>
           <w:p>
             <w:pPr>

</xml_diff>

<commit_message>
added sync_windows config boolean (partially working, windows kinda sync but there are some minor resolution discrepancies)
</commit_message>
<xml_diff>
--- a/test plan.docx
+++ b/test plan.docx
@@ -1071,6 +1071,793 @@
           </w:p>
         </w:tc>
       </w:tr>
+      <w:tr>
+        <w:tc>
+          <w:tcPr>
+            <w:tcW w:w="1843" w:type="dxa"/>
+          </w:tcPr>
+          <w:p>
+            <w:pPr>
+              <w:rPr>
+                <w:sz w:val="16"/>
+                <w:szCs w:val="18"/>
+                <w:lang w:val="en-CA"/>
+              </w:rPr>
+            </w:pPr>
+            <w:r>
+              <w:rPr>
+                <w:rFonts w:hint="eastAsia"/>
+                <w:sz w:val="16"/>
+                <w:szCs w:val="18"/>
+                <w:lang w:val="en-CA"/>
+              </w:rPr>
+              <w:t>C</w:t>
+            </w:r>
+            <w:r>
+              <w:rPr>
+                <w:sz w:val="16"/>
+                <w:szCs w:val="18"/>
+                <w:lang w:val="en-CA"/>
+              </w:rPr>
+              <w:t>onfig.json</w:t>
+            </w:r>
+          </w:p>
+        </w:tc>
+        <w:tc>
+          <w:tcPr>
+            <w:tcW w:w="1843" w:type="dxa"/>
+          </w:tcPr>
+          <w:p>
+            <w:pPr>
+              <w:rPr>
+                <w:sz w:val="16"/>
+                <w:szCs w:val="18"/>
+                <w:lang w:val="en-CA"/>
+              </w:rPr>
+            </w:pPr>
+            <w:r>
+              <w:rPr>
+                <w:rFonts w:hint="eastAsia"/>
+                <w:sz w:val="16"/>
+                <w:szCs w:val="18"/>
+                <w:lang w:val="en-CA"/>
+              </w:rPr>
+              <w:t>C</w:t>
+            </w:r>
+            <w:r>
+              <w:rPr>
+                <w:sz w:val="16"/>
+                <w:szCs w:val="18"/>
+                <w:lang w:val="en-CA"/>
+              </w:rPr>
+              <w:t>onfig.json: base_window_transparency</w:t>
+            </w:r>
+          </w:p>
+        </w:tc>
+        <w:tc>
+          <w:tcPr>
+            <w:tcW w:w="2410" w:type="dxa"/>
+          </w:tcPr>
+          <w:p>
+            <w:pPr>
+              <w:rPr>
+                <w:sz w:val="16"/>
+                <w:szCs w:val="18"/>
+                <w:lang w:val="en-CA"/>
+              </w:rPr>
+            </w:pPr>
+            <w:r>
+              <w:rPr>
+                <w:rFonts w:hint="eastAsia"/>
+                <w:sz w:val="16"/>
+                <w:szCs w:val="18"/>
+                <w:lang w:val="en-CA"/>
+              </w:rPr>
+              <w:t>G</w:t>
+            </w:r>
+            <w:r>
+              <w:rPr>
+                <w:sz w:val="16"/>
+                <w:szCs w:val="18"/>
+                <w:lang w:val="en-CA"/>
+              </w:rPr>
+              <w:t>o to config.json, set “base_window_transparency” to 1 while “shader_window” is true, launch app, set it to 0.5, launch app, set it to 0, launch app</w:t>
+            </w:r>
+          </w:p>
+        </w:tc>
+        <w:tc>
+          <w:tcPr>
+            <w:tcW w:w="3118" w:type="dxa"/>
+          </w:tcPr>
+          <w:p>
+            <w:pPr>
+              <w:rPr>
+                <w:sz w:val="16"/>
+                <w:szCs w:val="18"/>
+                <w:lang w:val="en-CA"/>
+              </w:rPr>
+            </w:pPr>
+            <w:r>
+              <w:rPr>
+                <w:rFonts w:hint="eastAsia"/>
+                <w:sz w:val="16"/>
+                <w:szCs w:val="18"/>
+                <w:lang w:val="en-CA"/>
+              </w:rPr>
+              <w:t>F</w:t>
+            </w:r>
+            <w:r>
+              <w:rPr>
+                <w:sz w:val="16"/>
+                <w:szCs w:val="18"/>
+                <w:lang w:val="en-CA"/>
+              </w:rPr>
+              <w:t xml:space="preserve">irst launch it should be opaque. </w:t>
+            </w:r>
+            <w:r>
+              <w:rPr>
+                <w:rFonts w:hint="eastAsia"/>
+                <w:sz w:val="16"/>
+                <w:szCs w:val="18"/>
+                <w:lang w:val="en-CA"/>
+              </w:rPr>
+              <w:t>S</w:t>
+            </w:r>
+            <w:r>
+              <w:rPr>
+                <w:sz w:val="16"/>
+                <w:szCs w:val="18"/>
+                <w:lang w:val="en-CA"/>
+              </w:rPr>
+              <w:t xml:space="preserve">econd launch it should be half transparent, like tinted glass on your computer screen. </w:t>
+            </w:r>
+            <w:r>
+              <w:rPr>
+                <w:rFonts w:hint="eastAsia"/>
+                <w:sz w:val="16"/>
+                <w:szCs w:val="18"/>
+                <w:lang w:val="en-CA"/>
+              </w:rPr>
+              <w:t>T</w:t>
+            </w:r>
+            <w:r>
+              <w:rPr>
+                <w:sz w:val="16"/>
+                <w:szCs w:val="18"/>
+                <w:lang w:val="en-CA"/>
+              </w:rPr>
+              <w:t>hird launch it should be completely invisible.</w:t>
+            </w:r>
+          </w:p>
+        </w:tc>
+        <w:tc>
+          <w:tcPr>
+            <w:tcW w:w="2410" w:type="dxa"/>
+          </w:tcPr>
+          <w:p>
+            <w:pPr>
+              <w:rPr>
+                <w:sz w:val="16"/>
+                <w:szCs w:val="18"/>
+                <w:lang w:val="en-CA"/>
+              </w:rPr>
+            </w:pPr>
+            <w:r>
+              <w:rPr>
+                <w:rFonts w:hint="eastAsia"/>
+                <w:sz w:val="16"/>
+                <w:szCs w:val="18"/>
+                <w:lang w:val="en-CA"/>
+              </w:rPr>
+              <w:t>W</w:t>
+            </w:r>
+            <w:r>
+              <w:rPr>
+                <w:sz w:val="16"/>
+                <w:szCs w:val="18"/>
+                <w:lang w:val="en-CA"/>
+              </w:rPr>
+              <w:t xml:space="preserve">orks as of </w:t>
+            </w:r>
+            <w:r>
+              <w:rPr>
+                <w:sz w:val="16"/>
+                <w:szCs w:val="18"/>
+                <w:lang w:val="en-CA"/>
+              </w:rPr>
+              <w:t>558391ee3d725b4fdbd14e86a9860bac5a42eb3b</w:t>
+            </w:r>
+          </w:p>
+        </w:tc>
+      </w:tr>
+      <w:tr>
+        <w:tc>
+          <w:tcPr>
+            <w:tcW w:w="1843" w:type="dxa"/>
+          </w:tcPr>
+          <w:p>
+            <w:pPr>
+              <w:rPr>
+                <w:sz w:val="16"/>
+                <w:szCs w:val="18"/>
+                <w:lang w:val="en-CA"/>
+              </w:rPr>
+            </w:pPr>
+            <w:r>
+              <w:rPr>
+                <w:rFonts w:hint="eastAsia"/>
+                <w:sz w:val="16"/>
+                <w:szCs w:val="18"/>
+                <w:lang w:val="en-CA"/>
+              </w:rPr>
+              <w:t>C</w:t>
+            </w:r>
+            <w:r>
+              <w:rPr>
+                <w:sz w:val="16"/>
+                <w:szCs w:val="18"/>
+                <w:lang w:val="en-CA"/>
+              </w:rPr>
+              <w:t>onfig.json</w:t>
+            </w:r>
+            <w:r>
+              <w:rPr>
+                <w:sz w:val="16"/>
+                <w:szCs w:val="18"/>
+                <w:lang w:val="en-CA"/>
+              </w:rPr>
+              <w:t>, main.cjs</w:t>
+            </w:r>
+          </w:p>
+        </w:tc>
+        <w:tc>
+          <w:tcPr>
+            <w:tcW w:w="1843" w:type="dxa"/>
+          </w:tcPr>
+          <w:p>
+            <w:pPr>
+              <w:rPr>
+                <w:sz w:val="16"/>
+                <w:szCs w:val="18"/>
+                <w:lang w:val="en-CA"/>
+              </w:rPr>
+            </w:pPr>
+            <w:r>
+              <w:rPr>
+                <w:rFonts w:hint="eastAsia"/>
+                <w:sz w:val="16"/>
+                <w:szCs w:val="18"/>
+                <w:lang w:val="en-CA"/>
+              </w:rPr>
+              <w:t>C</w:t>
+            </w:r>
+            <w:r>
+              <w:rPr>
+                <w:sz w:val="16"/>
+                <w:szCs w:val="18"/>
+                <w:lang w:val="en-CA"/>
+              </w:rPr>
+              <w:t>onfig.json: shader_window_clickthrough: TRUE</w:t>
+            </w:r>
+          </w:p>
+        </w:tc>
+        <w:tc>
+          <w:tcPr>
+            <w:tcW w:w="2410" w:type="dxa"/>
+          </w:tcPr>
+          <w:p>
+            <w:pPr>
+              <w:rPr>
+                <w:sz w:val="16"/>
+                <w:szCs w:val="18"/>
+                <w:lang w:val="en-CA"/>
+              </w:rPr>
+            </w:pPr>
+            <w:r>
+              <w:rPr>
+                <w:rFonts w:hint="eastAsia"/>
+                <w:sz w:val="16"/>
+                <w:szCs w:val="18"/>
+                <w:lang w:val="en-CA"/>
+              </w:rPr>
+              <w:t>S</w:t>
+            </w:r>
+            <w:r>
+              <w:rPr>
+                <w:sz w:val="16"/>
+                <w:szCs w:val="18"/>
+                <w:lang w:val="en-CA"/>
+              </w:rPr>
+              <w:t>et it to true, launch the app, try clicking through the shader window.</w:t>
+            </w:r>
+          </w:p>
+        </w:tc>
+        <w:tc>
+          <w:tcPr>
+            <w:tcW w:w="3118" w:type="dxa"/>
+          </w:tcPr>
+          <w:p>
+            <w:pPr>
+              <w:rPr>
+                <w:rFonts w:hint="eastAsia"/>
+                <w:sz w:val="16"/>
+                <w:szCs w:val="18"/>
+                <w:lang w:val="en-CA"/>
+              </w:rPr>
+            </w:pPr>
+            <w:r>
+              <w:rPr>
+                <w:rFonts w:hint="eastAsia"/>
+                <w:sz w:val="16"/>
+                <w:szCs w:val="18"/>
+                <w:lang w:val="en-CA"/>
+              </w:rPr>
+              <w:t>I</w:t>
+            </w:r>
+            <w:r>
+              <w:rPr>
+                <w:sz w:val="16"/>
+                <w:szCs w:val="18"/>
+                <w:lang w:val="en-CA"/>
+              </w:rPr>
+              <w:t>f it clicks on the app under it (whatever it is), true works</w:t>
+            </w:r>
+          </w:p>
+        </w:tc>
+        <w:tc>
+          <w:tcPr>
+            <w:tcW w:w="2410" w:type="dxa"/>
+          </w:tcPr>
+          <w:p>
+            <w:pPr>
+              <w:rPr>
+                <w:sz w:val="16"/>
+                <w:szCs w:val="18"/>
+                <w:lang w:val="en-CA"/>
+              </w:rPr>
+            </w:pPr>
+            <w:r>
+              <w:rPr>
+                <w:rFonts w:hint="eastAsia"/>
+                <w:sz w:val="16"/>
+                <w:szCs w:val="18"/>
+                <w:lang w:val="en-CA"/>
+              </w:rPr>
+              <w:t>W</w:t>
+            </w:r>
+            <w:r>
+              <w:rPr>
+                <w:sz w:val="16"/>
+                <w:szCs w:val="18"/>
+                <w:lang w:val="en-CA"/>
+              </w:rPr>
+              <w:t xml:space="preserve">orks as of </w:t>
+            </w:r>
+            <w:r>
+              <w:rPr>
+                <w:sz w:val="16"/>
+                <w:szCs w:val="18"/>
+                <w:lang w:val="en-CA"/>
+              </w:rPr>
+              <w:t>558391ee3d725b4fdbd14e86a9860bac5a42eb3b</w:t>
+            </w:r>
+            <w:r>
+              <w:rPr>
+                <w:sz w:val="16"/>
+                <w:szCs w:val="18"/>
+                <w:lang w:val="en-CA"/>
+              </w:rPr>
+              <w:t xml:space="preserve"> + 1</w:t>
+            </w:r>
+          </w:p>
+        </w:tc>
+      </w:tr>
+      <w:tr>
+        <w:tc>
+          <w:tcPr>
+            <w:tcW w:w="1843" w:type="dxa"/>
+          </w:tcPr>
+          <w:p>
+            <w:pPr>
+              <w:rPr>
+                <w:sz w:val="16"/>
+                <w:szCs w:val="18"/>
+                <w:lang w:val="en-CA"/>
+              </w:rPr>
+            </w:pPr>
+            <w:r>
+              <w:rPr>
+                <w:rFonts w:hint="eastAsia"/>
+                <w:sz w:val="16"/>
+                <w:szCs w:val="18"/>
+                <w:lang w:val="en-CA"/>
+              </w:rPr>
+              <w:t>C</w:t>
+            </w:r>
+            <w:r>
+              <w:rPr>
+                <w:sz w:val="16"/>
+                <w:szCs w:val="18"/>
+                <w:lang w:val="en-CA"/>
+              </w:rPr>
+              <w:t>onfig.json</w:t>
+            </w:r>
+            <w:r>
+              <w:rPr>
+                <w:sz w:val="16"/>
+                <w:szCs w:val="18"/>
+                <w:lang w:val="en-CA"/>
+              </w:rPr>
+              <w:t>, main.cjs</w:t>
+            </w:r>
+          </w:p>
+        </w:tc>
+        <w:tc>
+          <w:tcPr>
+            <w:tcW w:w="1843" w:type="dxa"/>
+          </w:tcPr>
+          <w:p>
+            <w:pPr>
+              <w:rPr>
+                <w:sz w:val="16"/>
+                <w:szCs w:val="18"/>
+                <w:lang w:val="en-CA"/>
+              </w:rPr>
+            </w:pPr>
+            <w:r>
+              <w:rPr>
+                <w:rFonts w:hint="eastAsia"/>
+                <w:sz w:val="16"/>
+                <w:szCs w:val="18"/>
+                <w:lang w:val="en-CA"/>
+              </w:rPr>
+              <w:t>C</w:t>
+            </w:r>
+            <w:r>
+              <w:rPr>
+                <w:sz w:val="16"/>
+                <w:szCs w:val="18"/>
+                <w:lang w:val="en-CA"/>
+              </w:rPr>
+              <w:t>onfig.json: shader_window_clickthrough: FALSE</w:t>
+            </w:r>
+          </w:p>
+        </w:tc>
+        <w:tc>
+          <w:tcPr>
+            <w:tcW w:w="2410" w:type="dxa"/>
+          </w:tcPr>
+          <w:p>
+            <w:pPr>
+              <w:rPr>
+                <w:sz w:val="16"/>
+                <w:szCs w:val="18"/>
+                <w:lang w:val="en-CA"/>
+              </w:rPr>
+            </w:pPr>
+            <w:r>
+              <w:rPr>
+                <w:rFonts w:hint="eastAsia"/>
+                <w:sz w:val="16"/>
+                <w:szCs w:val="18"/>
+                <w:lang w:val="en-CA"/>
+              </w:rPr>
+              <w:t>S</w:t>
+            </w:r>
+            <w:r>
+              <w:rPr>
+                <w:sz w:val="16"/>
+                <w:szCs w:val="18"/>
+                <w:lang w:val="en-CA"/>
+              </w:rPr>
+              <w:t>et it to false, launch the app, click on the shader window</w:t>
+            </w:r>
+          </w:p>
+        </w:tc>
+        <w:tc>
+          <w:tcPr>
+            <w:tcW w:w="3118" w:type="dxa"/>
+          </w:tcPr>
+          <w:p>
+            <w:pPr>
+              <w:rPr>
+                <w:sz w:val="16"/>
+                <w:szCs w:val="18"/>
+                <w:lang w:val="en-CA"/>
+              </w:rPr>
+            </w:pPr>
+            <w:r>
+              <w:rPr>
+                <w:rFonts w:hint="eastAsia"/>
+                <w:sz w:val="16"/>
+                <w:szCs w:val="18"/>
+                <w:lang w:val="en-CA"/>
+              </w:rPr>
+              <w:t>I</w:t>
+            </w:r>
+            <w:r>
+              <w:rPr>
+                <w:sz w:val="16"/>
+                <w:szCs w:val="18"/>
+                <w:lang w:val="en-CA"/>
+              </w:rPr>
+              <w:t xml:space="preserve">t shouldn’t click on the app beneath it. </w:t>
+            </w:r>
+            <w:r>
+              <w:rPr>
+                <w:rFonts w:hint="eastAsia"/>
+                <w:sz w:val="16"/>
+                <w:szCs w:val="18"/>
+                <w:lang w:val="en-CA"/>
+              </w:rPr>
+              <w:t>I</w:t>
+            </w:r>
+            <w:r>
+              <w:rPr>
+                <w:sz w:val="16"/>
+                <w:szCs w:val="18"/>
+                <w:lang w:val="en-CA"/>
+              </w:rPr>
+              <w:t>t should just focus that window and that’s it.</w:t>
+            </w:r>
+          </w:p>
+        </w:tc>
+        <w:tc>
+          <w:tcPr>
+            <w:tcW w:w="2410" w:type="dxa"/>
+          </w:tcPr>
+          <w:p>
+            <w:pPr>
+              <w:rPr>
+                <w:sz w:val="16"/>
+                <w:szCs w:val="18"/>
+                <w:lang w:val="en-CA"/>
+              </w:rPr>
+            </w:pPr>
+            <w:r>
+              <w:rPr>
+                <w:rFonts w:hint="eastAsia"/>
+                <w:sz w:val="16"/>
+                <w:szCs w:val="18"/>
+                <w:lang w:val="en-CA"/>
+              </w:rPr>
+              <w:t>W</w:t>
+            </w:r>
+            <w:r>
+              <w:rPr>
+                <w:sz w:val="16"/>
+                <w:szCs w:val="18"/>
+                <w:lang w:val="en-CA"/>
+              </w:rPr>
+              <w:t xml:space="preserve">orks as of </w:t>
+            </w:r>
+            <w:r>
+              <w:rPr>
+                <w:sz w:val="16"/>
+                <w:szCs w:val="18"/>
+                <w:lang w:val="en-CA"/>
+              </w:rPr>
+              <w:t>558391ee3d725b4fdbd14e86a9860bac5a42eb3b</w:t>
+            </w:r>
+            <w:r>
+              <w:rPr>
+                <w:sz w:val="16"/>
+                <w:szCs w:val="18"/>
+                <w:lang w:val="en-CA"/>
+              </w:rPr>
+              <w:t xml:space="preserve">, although setting it to false makes the </w:t>
+            </w:r>
+            <w:r>
+              <w:rPr>
+                <w:sz w:val="16"/>
+                <w:szCs w:val="18"/>
+                <w:lang w:val="en-CA"/>
+              </w:rPr>
+              <w:lastRenderedPageBreak/>
+              <w:t>shader window always on top</w:t>
+            </w:r>
+          </w:p>
+        </w:tc>
+      </w:tr>
+      <w:tr>
+        <w:tc>
+          <w:tcPr>
+            <w:tcW w:w="1843" w:type="dxa"/>
+          </w:tcPr>
+          <w:p>
+            <w:pPr>
+              <w:rPr>
+                <w:sz w:val="16"/>
+                <w:szCs w:val="18"/>
+                <w:lang w:val="en-CA"/>
+              </w:rPr>
+            </w:pPr>
+            <w:r>
+              <w:rPr>
+                <w:rFonts w:hint="eastAsia"/>
+                <w:sz w:val="16"/>
+                <w:szCs w:val="18"/>
+                <w:lang w:val="en-CA"/>
+              </w:rPr>
+              <w:lastRenderedPageBreak/>
+              <w:t>C</w:t>
+            </w:r>
+            <w:r>
+              <w:rPr>
+                <w:sz w:val="16"/>
+                <w:szCs w:val="18"/>
+                <w:lang w:val="en-CA"/>
+              </w:rPr>
+              <w:t>onfig.json</w:t>
+            </w:r>
+          </w:p>
+        </w:tc>
+        <w:tc>
+          <w:tcPr>
+            <w:tcW w:w="1843" w:type="dxa"/>
+          </w:tcPr>
+          <w:p>
+            <w:pPr>
+              <w:rPr>
+                <w:sz w:val="16"/>
+                <w:szCs w:val="18"/>
+                <w:lang w:val="en-CA"/>
+              </w:rPr>
+            </w:pPr>
+            <w:r>
+              <w:rPr>
+                <w:rFonts w:hint="eastAsia"/>
+                <w:sz w:val="16"/>
+                <w:szCs w:val="18"/>
+                <w:lang w:val="en-CA"/>
+              </w:rPr>
+              <w:t>C</w:t>
+            </w:r>
+            <w:r>
+              <w:rPr>
+                <w:sz w:val="16"/>
+                <w:szCs w:val="18"/>
+                <w:lang w:val="en-CA"/>
+              </w:rPr>
+              <w:t>onfig.json</w:t>
+            </w:r>
+            <w:r>
+              <w:rPr>
+                <w:sz w:val="16"/>
+                <w:szCs w:val="18"/>
+                <w:lang w:val="en-CA"/>
+              </w:rPr>
+              <w:t>: sync_windows: TRUE</w:t>
+            </w:r>
+          </w:p>
+        </w:tc>
+        <w:tc>
+          <w:tcPr>
+            <w:tcW w:w="2410" w:type="dxa"/>
+          </w:tcPr>
+          <w:p>
+            <w:pPr>
+              <w:rPr>
+                <w:sz w:val="16"/>
+                <w:szCs w:val="18"/>
+                <w:lang w:val="en-CA"/>
+              </w:rPr>
+            </w:pPr>
+            <w:r>
+              <w:rPr>
+                <w:rFonts w:hint="eastAsia"/>
+                <w:sz w:val="16"/>
+                <w:szCs w:val="18"/>
+                <w:lang w:val="en-CA"/>
+              </w:rPr>
+              <w:t>O</w:t>
+            </w:r>
+            <w:r>
+              <w:rPr>
+                <w:sz w:val="16"/>
+                <w:szCs w:val="18"/>
+                <w:lang w:val="en-CA"/>
+              </w:rPr>
+              <w:t>pen the window and drag it around</w:t>
+            </w:r>
+          </w:p>
+        </w:tc>
+        <w:tc>
+          <w:tcPr>
+            <w:tcW w:w="3118" w:type="dxa"/>
+          </w:tcPr>
+          <w:p>
+            <w:pPr>
+              <w:rPr>
+                <w:sz w:val="16"/>
+                <w:szCs w:val="18"/>
+                <w:lang w:val="en-CA"/>
+              </w:rPr>
+            </w:pPr>
+            <w:r>
+              <w:rPr>
+                <w:rFonts w:hint="eastAsia"/>
+                <w:sz w:val="16"/>
+                <w:szCs w:val="18"/>
+                <w:lang w:val="en-CA"/>
+              </w:rPr>
+              <w:t>T</w:t>
+            </w:r>
+            <w:r>
+              <w:rPr>
+                <w:sz w:val="16"/>
+                <w:szCs w:val="18"/>
+                <w:lang w:val="en-CA"/>
+              </w:rPr>
+              <w:t>he two windows should stay synced</w:t>
+            </w:r>
+          </w:p>
+        </w:tc>
+        <w:tc>
+          <w:tcPr>
+            <w:tcW w:w="2410" w:type="dxa"/>
+          </w:tcPr>
+          <w:p>
+            <w:pPr>
+              <w:rPr>
+                <w:sz w:val="16"/>
+                <w:szCs w:val="18"/>
+                <w:lang w:val="en-CA"/>
+              </w:rPr>
+            </w:pPr>
+            <w:r>
+              <w:rPr>
+                <w:rFonts w:hint="eastAsia"/>
+                <w:sz w:val="16"/>
+                <w:szCs w:val="18"/>
+                <w:lang w:val="en-CA"/>
+              </w:rPr>
+              <w:t>P</w:t>
+            </w:r>
+            <w:r>
+              <w:rPr>
+                <w:sz w:val="16"/>
+                <w:szCs w:val="18"/>
+                <w:lang w:val="en-CA"/>
+              </w:rPr>
+              <w:t xml:space="preserve">artially working. </w:t>
+            </w:r>
+            <w:r>
+              <w:rPr>
+                <w:rFonts w:hint="eastAsia"/>
+                <w:sz w:val="16"/>
+                <w:szCs w:val="18"/>
+                <w:lang w:val="en-CA"/>
+              </w:rPr>
+              <w:t>S</w:t>
+            </w:r>
+            <w:r>
+              <w:rPr>
+                <w:sz w:val="16"/>
+                <w:szCs w:val="18"/>
+                <w:lang w:val="en-CA"/>
+              </w:rPr>
+              <w:t xml:space="preserve">ome minor inconsistencies in position and scale. </w:t>
+            </w:r>
+            <w:r>
+              <w:rPr>
+                <w:sz w:val="16"/>
+                <w:szCs w:val="18"/>
+                <w:lang w:val="en-CA"/>
+              </w:rPr>
+              <w:t>558391ee3d725b4fdbd14e86a9860bac5a42eb3b</w:t>
+            </w:r>
+            <w:r>
+              <w:rPr>
+                <w:sz w:val="16"/>
+                <w:szCs w:val="18"/>
+                <w:lang w:val="en-CA"/>
+              </w:rPr>
+              <w:t xml:space="preserve"> + 1</w:t>
+            </w:r>
+          </w:p>
+        </w:tc>
+      </w:tr>
     </w:tbl>
     <w:p>
       <w:pPr>
@@ -1649,16 +2436,7 @@
                 <w:szCs w:val="18"/>
                 <w:lang w:val="en-CA"/>
               </w:rPr>
-              <w:t xml:space="preserve">lectron: window buttons (#2): </w:t>
-            </w:r>
-            <w:r>
-              <w:rPr>
-                <w:sz w:val="16"/>
-                <w:szCs w:val="18"/>
-                <w:lang w:val="en-CA"/>
-              </w:rPr>
-              <w:lastRenderedPageBreak/>
-              <w:t>functionality</w:t>
+              <w:t>lectron: window buttons (#2): functionality</w:t>
             </w:r>
           </w:p>
         </w:tc>
@@ -1682,7 +2460,6 @@
                 <w:szCs w:val="18"/>
                 <w:lang w:val="en-CA"/>
               </w:rPr>
-              <w:lastRenderedPageBreak/>
               <w:t>C</w:t>
             </w:r>
             <w:r>
@@ -1732,16 +2509,7 @@
                 <w:szCs w:val="18"/>
                 <w:lang w:val="en-CA"/>
               </w:rPr>
-              <w:t xml:space="preserve">ed should close, green should maximize when unmaximized, and unmaximize to </w:t>
-            </w:r>
-            <w:r>
-              <w:rPr>
-                <w:sz w:val="16"/>
-                <w:szCs w:val="18"/>
-                <w:lang w:val="en-CA"/>
-              </w:rPr>
-              <w:lastRenderedPageBreak/>
-              <w:t>its last previous resolution when already maximized (green should toggle maximize), and yellow should minimize</w:t>
+              <w:t>ed should close, green should maximize when unmaximized, and unmaximize to its last previous resolution when already maximized (green should toggle maximize), and yellow should minimize</w:t>
             </w:r>
           </w:p>
         </w:tc>
@@ -2607,6 +3375,7 @@
                 <w:sz w:val="16"/>
                 <w:szCs w:val="18"/>
               </w:rPr>
+              <w:lastRenderedPageBreak/>
               <w:t>Relevant f</w:t>
             </w:r>
             <w:r>
@@ -3345,7 +4114,6 @@
                 <w:szCs w:val="18"/>
                 <w:lang w:val="en-CA"/>
               </w:rPr>
-              <w:lastRenderedPageBreak/>
               <w:t>S</w:t>
             </w:r>
             <w:r>
@@ -4473,7 +5241,15 @@
                 <w:sz w:val="16"/>
                 <w:szCs w:val="18"/>
               </w:rPr>
-              <w:t>Allow ×, -, and ← buttons in modals' header bar to be draggable</w:t>
+              <w:t xml:space="preserve">Allow ×, -, and ← buttons in modals' header bar to be </w:t>
+            </w:r>
+            <w:r>
+              <w:rPr>
+                <w:sz w:val="16"/>
+                <w:szCs w:val="18"/>
+              </w:rPr>
+              <w:lastRenderedPageBreak/>
+              <w:t>draggable</w:t>
             </w:r>
             <w:r>
               <w:rPr>
@@ -4505,6 +5281,7 @@
                 <w:szCs w:val="18"/>
                 <w:lang w:val="en-CA"/>
               </w:rPr>
+              <w:lastRenderedPageBreak/>
               <w:t>O</w:t>
             </w:r>
             <w:r>
@@ -5296,16 +6073,7 @@
                 <w:szCs w:val="18"/>
                 <w:lang w:val="en-CA"/>
               </w:rPr>
-              <w:t xml:space="preserve">ettings.tsx, </w:t>
-            </w:r>
-            <w:r>
-              <w:rPr>
-                <w:sz w:val="16"/>
-                <w:szCs w:val="18"/>
-                <w:lang w:val="en-CA"/>
-              </w:rPr>
-              <w:lastRenderedPageBreak/>
-              <w:t>draggableModal.tsx, Toast.tsx, modalManager.ts, modalPermissions.ts</w:t>
+              <w:t>ettings.tsx, draggableModal.tsx, Toast.tsx, modalManager.ts, modalPermissions.ts</w:t>
             </w:r>
           </w:p>
         </w:tc>
@@ -5330,7 +6098,6 @@
                 <w:szCs w:val="18"/>
                 <w:lang w:val="en-CA"/>
               </w:rPr>
-              <w:lastRenderedPageBreak/>
               <w:t>S</w:t>
             </w:r>
             <w:r>
@@ -5339,16 +6106,7 @@
                 <w:szCs w:val="18"/>
                 <w:lang w:val="en-CA"/>
               </w:rPr>
-              <w:t xml:space="preserve">ettings: switches: allow </w:t>
-            </w:r>
-            <w:r>
-              <w:rPr>
-                <w:sz w:val="16"/>
-                <w:szCs w:val="18"/>
-                <w:lang w:val="en-CA"/>
-              </w:rPr>
-              <w:lastRenderedPageBreak/>
-              <w:t>open multiple menus: DISABLED (#2)</w:t>
+              <w:t>ettings: switches: allow open multiple menus: DISABLED (#2)</w:t>
             </w:r>
           </w:p>
         </w:tc>
@@ -5373,7 +6131,6 @@
                 <w:szCs w:val="18"/>
                 <w:lang w:val="en-CA"/>
               </w:rPr>
-              <w:lastRenderedPageBreak/>
               <w:t>O</w:t>
             </w:r>
             <w:r>
@@ -5382,16 +6139,7 @@
                 <w:szCs w:val="18"/>
                 <w:lang w:val="en-CA"/>
               </w:rPr>
-              <w:t xml:space="preserve">pen a modal and then close it </w:t>
-            </w:r>
-            <w:r>
-              <w:rPr>
-                <w:sz w:val="16"/>
-                <w:szCs w:val="18"/>
-                <w:lang w:val="en-CA"/>
-              </w:rPr>
-              <w:lastRenderedPageBreak/>
-              <w:t xml:space="preserve">again, then reopen </w:t>
+              <w:t xml:space="preserve">pen a modal and then close it again, then reopen </w:t>
             </w:r>
             <w:r>
               <w:rPr>
@@ -5424,7 +6172,6 @@
                 <w:szCs w:val="18"/>
                 <w:lang w:val="en-CA"/>
               </w:rPr>
-              <w:lastRenderedPageBreak/>
               <w:t>Y</w:t>
             </w:r>
             <w:r>
@@ -5449,16 +6196,7 @@
                 <w:szCs w:val="18"/>
                 <w:lang w:val="en-CA"/>
               </w:rPr>
-              <w:t xml:space="preserve"> </w:t>
-            </w:r>
-            <w:r>
-              <w:rPr>
-                <w:sz w:val="16"/>
-                <w:szCs w:val="18"/>
-                <w:lang w:val="en-CA"/>
-              </w:rPr>
-              <w:lastRenderedPageBreak/>
-              <w:t xml:space="preserve">modal </w:t>
+              <w:t xml:space="preserve"> modal </w:t>
             </w:r>
             <w:r>
               <w:rPr>
@@ -5515,7 +6253,6 @@
                 <w:szCs w:val="18"/>
                 <w:lang w:val="en-CA"/>
               </w:rPr>
-              <w:lastRenderedPageBreak/>
               <w:t>W</w:t>
             </w:r>
             <w:r>
@@ -5532,7 +6269,6 @@
                 <w:szCs w:val="18"/>
                 <w:lang w:val="en-CA"/>
               </w:rPr>
-              <w:lastRenderedPageBreak/>
               <w:t>72353571f3d02393a601e5c151529df37aea6b30</w:t>
             </w:r>
             <w:r>
@@ -5586,7 +6322,6 @@
                 <w:szCs w:val="18"/>
                 <w:lang w:val="en-CA"/>
               </w:rPr>
-              <w:lastRenderedPageBreak/>
               <w:t>S</w:t>
             </w:r>
             <w:r>
@@ -6386,6 +7121,7 @@
                 <w:szCs w:val="18"/>
                 <w:lang w:val="en-CA"/>
               </w:rPr>
+              <w:lastRenderedPageBreak/>
               <w:drawing>
                 <wp:inline distT="0" distB="0" distL="0" distR="0" wp14:anchorId="3CCDCEE8" wp14:editId="6F35D7C6">
                   <wp:extent cx="1370594" cy="442913"/>
@@ -6445,6 +7181,7 @@
                 <w:szCs w:val="18"/>
                 <w:lang w:val="en-CA"/>
               </w:rPr>
+              <w:lastRenderedPageBreak/>
               <w:t>T</w:t>
             </w:r>
             <w:r>
@@ -6472,6 +7209,7 @@
                 <w:szCs w:val="18"/>
                 <w:lang w:val="en-CA"/>
               </w:rPr>
+              <w:lastRenderedPageBreak/>
               <w:drawing>
                 <wp:inline distT="0" distB="0" distL="0" distR="0" wp14:anchorId="1E64C17F" wp14:editId="24B69076">
                   <wp:extent cx="869505" cy="1465897"/>
@@ -6531,6 +7269,7 @@
                 <w:szCs w:val="18"/>
                 <w:lang w:val="en-CA"/>
               </w:rPr>
+              <w:lastRenderedPageBreak/>
               <w:t>W</w:t>
             </w:r>
             <w:r>
@@ -6947,7 +7686,6 @@
                 <w:szCs w:val="18"/>
                 <w:lang w:val="en-CA"/>
               </w:rPr>
-              <w:lastRenderedPageBreak/>
               <w:drawing>
                 <wp:inline distT="0" distB="0" distL="0" distR="0" wp14:anchorId="78D08D55" wp14:editId="73CAFEEB">
                   <wp:extent cx="1393190" cy="1348105"/>
@@ -7050,7 +7788,6 @@
                 <w:szCs w:val="18"/>
                 <w:lang w:val="en-CA"/>
               </w:rPr>
-              <w:lastRenderedPageBreak/>
               <w:t>T</w:t>
             </w:r>
             <w:r>
@@ -7739,6 +8476,7 @@
                 <w:sz w:val="16"/>
                 <w:szCs w:val="18"/>
               </w:rPr>
+              <w:lastRenderedPageBreak/>
               <w:t>export const EASE_HANDLE_RING_THICKNESS_PX = 2;</w:t>
             </w:r>
           </w:p>
@@ -7835,15 +8573,7 @@
                 <w:sz w:val="16"/>
                 <w:szCs w:val="18"/>
               </w:rPr>
-              <w:t>export const ANCHOR_BORDER_THICKNESS</w:t>
-            </w:r>
-            <w:r>
-              <w:rPr>
-                <w:sz w:val="16"/>
-                <w:szCs w:val="18"/>
-              </w:rPr>
-              <w:lastRenderedPageBreak/>
-              <w:t>_PX = 2;</w:t>
+              <w:t>export const ANCHOR_BORDER_THICKNESS_PX = 2;</w:t>
             </w:r>
           </w:p>
           <w:p>
@@ -8698,7 +9428,16 @@
                 <w:szCs w:val="18"/>
                 <w:lang w:val="en-CA"/>
               </w:rPr>
-              <w:t>ettings: components: graph: anchor point deletion: right click</w:t>
+              <w:t xml:space="preserve">ettings: components: </w:t>
+            </w:r>
+            <w:r>
+              <w:rPr>
+                <w:sz w:val="16"/>
+                <w:szCs w:val="18"/>
+                <w:lang w:val="en-CA"/>
+              </w:rPr>
+              <w:lastRenderedPageBreak/>
+              <w:t>graph: anchor point deletion: right click</w:t>
             </w:r>
           </w:p>
         </w:tc>
@@ -8723,6 +9462,7 @@
                 <w:szCs w:val="18"/>
                 <w:lang w:val="en-CA"/>
               </w:rPr>
+              <w:lastRenderedPageBreak/>
               <w:t>C</w:t>
             </w:r>
             <w:r>
@@ -8731,7 +9471,16 @@
                 <w:szCs w:val="18"/>
                 <w:lang w:val="en-CA"/>
               </w:rPr>
-              <w:t>reate an anchor point, then right click it</w:t>
+              <w:t xml:space="preserve">reate an anchor point, then </w:t>
+            </w:r>
+            <w:r>
+              <w:rPr>
+                <w:sz w:val="16"/>
+                <w:szCs w:val="18"/>
+                <w:lang w:val="en-CA"/>
+              </w:rPr>
+              <w:lastRenderedPageBreak/>
+              <w:t>right click it</w:t>
             </w:r>
           </w:p>
         </w:tc>
@@ -8756,6 +9505,7 @@
                 <w:szCs w:val="18"/>
                 <w:lang w:val="en-CA"/>
               </w:rPr>
+              <w:lastRenderedPageBreak/>
               <w:t>I</w:t>
             </w:r>
             <w:r>
@@ -8814,7 +9564,16 @@
                 <w:szCs w:val="18"/>
                 <w:lang w:val="en-CA"/>
               </w:rPr>
-              <w:t xml:space="preserve">ight clicking now deletes anchor points in </w:t>
+              <w:t xml:space="preserve">ight clicking now </w:t>
+            </w:r>
+            <w:r>
+              <w:rPr>
+                <w:sz w:val="16"/>
+                <w:szCs w:val="18"/>
+                <w:lang w:val="en-CA"/>
+              </w:rPr>
+              <w:lastRenderedPageBreak/>
+              <w:t xml:space="preserve">deletes anchor points in </w:t>
             </w:r>
             <w:r>
               <w:rPr>
@@ -8857,6 +9616,7 @@
                 <w:szCs w:val="18"/>
                 <w:lang w:val="en-CA"/>
               </w:rPr>
+              <w:lastRenderedPageBreak/>
               <w:t>G</w:t>
             </w:r>
             <w:r>
@@ -9489,16 +10249,7 @@
                 <w:szCs w:val="18"/>
                 <w:lang w:val="en-CA"/>
               </w:rPr>
-              <w:t xml:space="preserve">ettings: components: torus menu editor: graph: </w:t>
-            </w:r>
-            <w:r>
-              <w:rPr>
-                <w:sz w:val="16"/>
-                <w:szCs w:val="18"/>
-                <w:lang w:val="en-CA"/>
-              </w:rPr>
-              <w:lastRenderedPageBreak/>
-              <w:t>multiple anchor points #2</w:t>
+              <w:t>ettings: components: torus menu editor: graph: multiple anchor points #2</w:t>
             </w:r>
           </w:p>
         </w:tc>
@@ -9523,7 +10274,6 @@
                 <w:szCs w:val="18"/>
                 <w:lang w:val="en-CA"/>
               </w:rPr>
-              <w:lastRenderedPageBreak/>
               <w:t>C</w:t>
             </w:r>
             <w:r>
@@ -9532,16 +10282,7 @@
                 <w:szCs w:val="18"/>
                 <w:lang w:val="en-CA"/>
               </w:rPr>
-              <w:t xml:space="preserve">lick and drag a point and move it up and towards the </w:t>
-            </w:r>
-            <w:r>
-              <w:rPr>
-                <w:sz w:val="16"/>
-                <w:szCs w:val="18"/>
-                <w:lang w:val="en-CA"/>
-              </w:rPr>
-              <w:lastRenderedPageBreak/>
-              <w:t xml:space="preserve">beginning of the graph. </w:t>
+              <w:t xml:space="preserve">lick and drag a point and move it up and towards the beginning of the graph. </w:t>
             </w:r>
             <w:r>
               <w:rPr>
@@ -9600,7 +10341,6 @@
                 <w:szCs w:val="18"/>
                 <w:lang w:val="en-CA"/>
               </w:rPr>
-              <w:lastRenderedPageBreak/>
               <w:t>T</w:t>
             </w:r>
             <w:r>
@@ -9658,16 +10398,7 @@
                 <w:szCs w:val="18"/>
                 <w:lang w:val="en-CA"/>
               </w:rPr>
-              <w:t>5bddf836872611033759d62774</w:t>
-            </w:r>
-            <w:r>
-              <w:rPr>
-                <w:sz w:val="16"/>
-                <w:szCs w:val="18"/>
-                <w:lang w:val="en-CA"/>
-              </w:rPr>
-              <w:lastRenderedPageBreak/>
-              <w:t>6d8b4161bba22a</w:t>
+              <w:t>5bddf836872611033759d627746d8b4161bba22a</w:t>
             </w:r>
           </w:p>
         </w:tc>
@@ -9693,7 +10424,6 @@
                 <w:szCs w:val="18"/>
                 <w:lang w:val="en-CA"/>
               </w:rPr>
-              <w:lastRenderedPageBreak/>
               <w:t>TorusMenuEditor.tsx</w:t>
             </w:r>
           </w:p>
@@ -10071,7 +10801,16 @@
                 <w:szCs w:val="18"/>
                 <w:lang w:val="en-CA"/>
               </w:rPr>
-              <w:t>ettings: components: torus menu editor: graph: save state of ease handles</w:t>
+              <w:t xml:space="preserve">ettings: components: torus menu editor: graph: </w:t>
+            </w:r>
+            <w:r>
+              <w:rPr>
+                <w:sz w:val="16"/>
+                <w:szCs w:val="18"/>
+                <w:lang w:val="en-CA"/>
+              </w:rPr>
+              <w:lastRenderedPageBreak/>
+              <w:t>save state of ease handles</w:t>
             </w:r>
           </w:p>
         </w:tc>
@@ -10095,6 +10834,7 @@
                 <w:szCs w:val="18"/>
                 <w:lang w:val="en-CA"/>
               </w:rPr>
+              <w:lastRenderedPageBreak/>
               <w:t>O</w:t>
             </w:r>
             <w:r>
@@ -10120,7 +10860,16 @@
                 <w:szCs w:val="18"/>
                 <w:lang w:val="en-CA"/>
               </w:rPr>
-              <w:t xml:space="preserve">hange the ease of some of the points. </w:t>
+              <w:t xml:space="preserve">hange the ease </w:t>
+            </w:r>
+            <w:r>
+              <w:rPr>
+                <w:sz w:val="16"/>
+                <w:szCs w:val="18"/>
+                <w:lang w:val="en-CA"/>
+              </w:rPr>
+              <w:lastRenderedPageBreak/>
+              <w:t xml:space="preserve">of some of the points. </w:t>
             </w:r>
             <w:r>
               <w:rPr>
@@ -10161,6 +10910,7 @@
                 <w:szCs w:val="18"/>
                 <w:lang w:val="en-CA"/>
               </w:rPr>
+              <w:lastRenderedPageBreak/>
               <w:t>T</w:t>
             </w:r>
             <w:r>
@@ -11470,7 +12220,16 @@
                 <w:szCs w:val="18"/>
                 <w:lang w:val="en-CA"/>
               </w:rPr>
-              <w:t>he second test should reset the color back to the theme’s default color.</w:t>
+              <w:t xml:space="preserve">he second test should reset the color back to the theme’s default </w:t>
+            </w:r>
+            <w:r>
+              <w:rPr>
+                <w:sz w:val="16"/>
+                <w:szCs w:val="18"/>
+                <w:lang w:val="en-CA"/>
+              </w:rPr>
+              <w:lastRenderedPageBreak/>
+              <w:t>color.</w:t>
             </w:r>
           </w:p>
         </w:tc>
@@ -11494,6 +12253,7 @@
                 <w:szCs w:val="18"/>
                 <w:lang w:val="en-CA"/>
               </w:rPr>
+              <w:lastRenderedPageBreak/>
               <w:t>W</w:t>
             </w:r>
             <w:r>
@@ -12075,16 +12835,7 @@
                 <w:szCs w:val="18"/>
                 <w:lang w:val="en-CA"/>
               </w:rPr>
-              <w:t xml:space="preserve">hen, delete the line </w:t>
-            </w:r>
-            <w:r>
-              <w:rPr>
-                <w:sz w:val="16"/>
-                <w:szCs w:val="18"/>
-                <w:lang w:val="en-CA"/>
-              </w:rPr>
-              <w:lastRenderedPageBreak/>
-              <w:t>break, save the file, and trigger that toast in the editor again</w:t>
+              <w:t>hen, delete the line break, save the file, and trigger that toast in the editor again</w:t>
             </w:r>
           </w:p>
         </w:tc>
@@ -12108,7 +12859,6 @@
                 <w:szCs w:val="18"/>
                 <w:lang w:val="en-CA"/>
               </w:rPr>
-              <w:lastRenderedPageBreak/>
               <w:t>T</w:t>
             </w:r>
             <w:r>
@@ -12151,16 +12901,7 @@
                 <w:szCs w:val="18"/>
                 <w:lang w:val="en-CA"/>
               </w:rPr>
-              <w:t xml:space="preserve">ithout the line </w:t>
-            </w:r>
-            <w:r>
-              <w:rPr>
-                <w:sz w:val="16"/>
-                <w:szCs w:val="18"/>
-                <w:lang w:val="en-CA"/>
-              </w:rPr>
-              <w:lastRenderedPageBreak/>
-              <w:t xml:space="preserve">break, it should be longer. </w:t>
+              <w:t xml:space="preserve">ithout the line break, it should be longer. </w:t>
             </w:r>
             <w:r>
               <w:rPr>
@@ -12201,7 +12942,6 @@
                 <w:szCs w:val="18"/>
                 <w:lang w:val="en-CA"/>
               </w:rPr>
-              <w:lastRenderedPageBreak/>
               <w:t>B</w:t>
             </w:r>
             <w:r>
@@ -12243,16 +12983,7 @@
                 <w:szCs w:val="18"/>
                 <w:lang w:val="en-CA"/>
               </w:rPr>
-              <w:t xml:space="preserve">licking on the settings page gives just one long line of text despite the </w:t>
-            </w:r>
-            <w:r>
-              <w:rPr>
-                <w:sz w:val="16"/>
-                <w:szCs w:val="18"/>
-                <w:lang w:val="en-CA"/>
-              </w:rPr>
-              <w:lastRenderedPageBreak/>
-              <w:t>toast message being declared as being split across two lines</w:t>
+              <w:t>licking on the settings page gives just one long line of text despite the toast message being declared as being split across two lines</w:t>
             </w:r>
           </w:p>
         </w:tc>
@@ -12278,7 +13009,6 @@
                 <w:szCs w:val="18"/>
                 <w:lang w:val="en-CA"/>
               </w:rPr>
-              <w:lastRenderedPageBreak/>
               <w:t>A</w:t>
             </w:r>
             <w:r>

</xml_diff>